<commit_message>
Week 8 L1: two new slides on what pixel numbers are, how a camera makes them, and how colors map to RGB
Co-Authored-By: Claude Opus 5.5 <noreply@anthropic.com>
</commit_message>
<xml_diff>
--- a/第八週(10-29)/Nguyên lý xe tự lái_Tuần 8_Tài liệu học tập.docx
+++ b/第八週(10-29)/Nguyên lý xe tự lái_Tuần 8_Tài liệu học tập.docx
@@ -701,7 +701,7 @@
           <w:sz w:val="24"/>
           <w:szCs w:val="24"/>
         </w:rPr>
-        <w:t xml:space="preserve">Vì sao không viết luật: cùng là xe mà trông khác nhau</w:t>
+        <w:t xml:space="preserve">Những con số này từ đâu ra: ánh sáng → điện → con số</w:t>
       </w:r>
     </w:p>
     <w:p>
@@ -713,7 +713,7 @@
       <w:r>
         <w:drawing>
           <wp:inline distT="0" distB="0" distL="0" distR="0">
-            <wp:extent cx="5905500" cy="2238375"/>
+            <wp:extent cx="6096000" cy="2343150"/>
             <wp:effectExtent t="0" r="0" b="0" l="0"/>
             <wp:docPr id="1" name="" descr="" title=""/>
             <wp:cNvGraphicFramePr>
@@ -738,7 +738,7 @@
                   <pic:spPr bwMode="auto">
                     <a:xfrm>
                       <a:off x="0" y="0"/>
-                      <a:ext cx="5905500" cy="2238375"/>
+                      <a:ext cx="6096000" cy="2343150"/>
                     </a:xfrm>
                     <a:prstGeom prst="rect">
                       <a:avLst/>
@@ -765,7 +765,7 @@
           <w:sz w:val="19"/>
           <w:szCs w:val="19"/>
         </w:rPr>
-        <w:t xml:space="preserve">Xe và người cắt từ nuScenes: góc nhìn, ngày đêm, bị che, xa gần đều khác. «Thấy được» là độ thấy chính thức. Dữ liệu: nuScenes (Motional), CC BY-NC-SA 4.0</w:t>
+        <w:t xml:space="preserve">Cùng 8×8 điểm ảnh: ① ô cảm quang chỉ đo sáng tối ② thêm kính lọc đỏ/xanh lá/xanh dương, mỗi ô một màu ③ bù từ ô bên cạnh, mỗi ô ba số. ①② là minh hoạ tính từ ảnh này. Dữ liệu: nuScenes (Motional), CC BY-NC-SA 4.0</w:t>
       </w:r>
     </w:p>
     <w:p>
@@ -781,7 +781,7 @@
           <w:sz w:val="22"/>
           <w:szCs w:val="22"/>
         </w:rPr>
-        <w:t xml:space="preserve">«Xe = bốn bánh + một thân xe»? Nhìn từ sau không thấy bốn bánh; ban đêm chỉ còn hai đèn; bị che một nửa chỉ thấy nóc. Mỗi tình huống mới phải thêm một luật, viết không bao giờ hết. Em bé nhận ra xe không nhờ học luật, mà nhờ nhìn rất nhiều xe. Máy tính bây giờ cũng vậy: </w:t>
+        <w:t xml:space="preserve">Cảm biến ảnh trong camera như một tấm gồm rất nhiều </w:t>
       </w:r>
       <w:r>
         <w:rPr>
@@ -792,7 +792,7 @@
           <w:sz w:val="22"/>
           <w:szCs w:val="22"/>
         </w:rPr>
-        <w:t xml:space="preserve">cho nó rất nhiều ảnh có đáp án, để nó tự tìm quy luật</w:t>
+        <w:t xml:space="preserve">xô nhỏ</w:t>
       </w:r>
       <w:r>
         <w:rPr>
@@ -801,7 +801,127 @@
           <w:sz w:val="22"/>
           <w:szCs w:val="22"/>
         </w:rPr>
-        <w:t xml:space="preserve"> — gọi là học máy; mô hình có nhiều lớp chồng lên nhau nên gọi là học sâu.</w:t>
+        <w:t xml:space="preserve"> xếp ngay ngắn, mỗi điểm ảnh một xô. Khi phơi sáng, ánh sáng chiếu vào, càng nhiều ánh sáng thì xô hứng càng nhiều điện, chip </w:t>
+      </w:r>
+      <w:r>
+        <w:rPr>
+          <w:rFonts w:ascii="Arial" w:cs="Arial" w:eastAsia="Arial" w:hAnsi="Arial"/>
+          <w:b/>
+          <w:bCs/>
+          <w:color w:val="24405C"/>
+          <w:sz w:val="22"/>
+          <w:szCs w:val="22"/>
+        </w:rPr>
+        <w:t xml:space="preserve">đổi lượng điện thành con số</w:t>
+      </w:r>
+      <w:r>
+        <w:rPr>
+          <w:rFonts w:ascii="Arial" w:cs="Arial" w:eastAsia="Arial" w:hAnsi="Arial"/>
+          <w:color w:val="1B1B1B"/>
+          <w:sz w:val="22"/>
+          <w:szCs w:val="22"/>
+        </w:rPr>
+        <w:t xml:space="preserve">: số lớn là sáng, số nhỏ là tối. Xô chỉ biết nhiều hay ít ánh sáng, không biết màu, nên trên mỗi ô </w:t>
+      </w:r>
+      <w:r>
+        <w:rPr>
+          <w:rFonts w:ascii="Arial" w:cs="Arial" w:eastAsia="Arial" w:hAnsi="Arial"/>
+          <w:b/>
+          <w:bCs/>
+          <w:color w:val="24405C"/>
+          <w:sz w:val="22"/>
+          <w:szCs w:val="22"/>
+        </w:rPr>
+        <w:t xml:space="preserve">dán một kính lọc đỏ, xanh lá hoặc xanh dương</w:t>
+      </w:r>
+      <w:r>
+        <w:rPr>
+          <w:rFonts w:ascii="Arial" w:cs="Arial" w:eastAsia="Arial" w:hAnsi="Arial"/>
+          <w:color w:val="1B1B1B"/>
+          <w:sz w:val="22"/>
+          <w:szCs w:val="22"/>
+        </w:rPr>
+        <w:t xml:space="preserve"> (phổ biến nhất là nhóm 2×2: một đỏ, hai xanh lá, một xanh dương), mỗi ô chỉ đo một màu; hai màu còn thiếu thì chip </w:t>
+      </w:r>
+      <w:r>
+        <w:rPr>
+          <w:rFonts w:ascii="Arial" w:cs="Arial" w:eastAsia="Arial" w:hAnsi="Arial"/>
+          <w:b/>
+          <w:bCs/>
+          <w:color w:val="24405C"/>
+          <w:sz w:val="22"/>
+          <w:szCs w:val="22"/>
+        </w:rPr>
+        <w:t xml:space="preserve">ước lượng từ ô bên cạnh</w:t>
+      </w:r>
+      <w:r>
+        <w:rPr>
+          <w:rFonts w:ascii="Arial" w:cs="Arial" w:eastAsia="Arial" w:hAnsi="Arial"/>
+          <w:color w:val="1B1B1B"/>
+          <w:sz w:val="22"/>
+          <w:szCs w:val="22"/>
+        </w:rPr>
+        <w:t xml:space="preserve">. Lưu JPEG thì mỗi màu dùng </w:t>
+      </w:r>
+      <w:r>
+        <w:rPr>
+          <w:rFonts w:ascii="Arial" w:cs="Arial" w:eastAsia="Arial" w:hAnsi="Arial"/>
+          <w:b/>
+          <w:bCs/>
+          <w:color w:val="24405C"/>
+          <w:sz w:val="22"/>
+          <w:szCs w:val="22"/>
+        </w:rPr>
+        <w:t xml:space="preserve">8 bit</w:t>
+      </w:r>
+      <w:r>
+        <w:rPr>
+          <w:rFonts w:ascii="Arial" w:cs="Arial" w:eastAsia="Arial" w:hAnsi="Arial"/>
+          <w:color w:val="1B1B1B"/>
+          <w:sz w:val="22"/>
+          <w:szCs w:val="22"/>
+        </w:rPr>
+        <w:t xml:space="preserve">, 2⁸ = 256 mức, nên là </w:t>
+      </w:r>
+      <w:r>
+        <w:rPr>
+          <w:rFonts w:ascii="Arial" w:cs="Arial" w:eastAsia="Arial" w:hAnsi="Arial"/>
+          <w:b/>
+          <w:bCs/>
+          <w:color w:val="24405C"/>
+          <w:sz w:val="22"/>
+          <w:szCs w:val="22"/>
+        </w:rPr>
+        <w:t xml:space="preserve">0 đến 255</w:t>
+      </w:r>
+      <w:r>
+        <w:rPr>
+          <w:rFonts w:ascii="Arial" w:cs="Arial" w:eastAsia="Arial" w:hAnsi="Arial"/>
+          <w:color w:val="1B1B1B"/>
+          <w:sz w:val="22"/>
+          <w:szCs w:val="22"/>
+        </w:rPr>
+        <w:t xml:space="preserve">. Camera nuScenes: CMOS 1/1,8 inch, 1600×900, </w:t>
+      </w:r>
+      <w:r>
+        <w:rPr>
+          <w:rFonts w:ascii="Arial" w:cs="Arial" w:eastAsia="Arial" w:hAnsi="Arial"/>
+          <w:b/>
+          <w:bCs/>
+          <w:color w:val="24405C"/>
+          <w:sz w:val="22"/>
+          <w:szCs w:val="22"/>
+        </w:rPr>
+        <w:t xml:space="preserve">tự chỉnh phơi sáng</w:t>
+      </w:r>
+      <w:r>
+        <w:rPr>
+          <w:rFonts w:ascii="Arial" w:cs="Arial" w:eastAsia="Arial" w:hAnsi="Arial"/>
+          <w:color w:val="1B1B1B"/>
+          <w:sz w:val="22"/>
+          <w:szCs w:val="22"/>
+        </w:rPr>
+        <w:t xml:space="preserve">, lưu JPEG (Caesar et al., CVPR 2020). Ánh sáng quá mạnh thì xô tràn, số chạm 255, chỗ đó trắng xoá — gọi là cháy sáng.</w:t>
       </w:r>
     </w:p>
     <w:p>
@@ -819,165 +939,7 @@
           <w:sz w:val="24"/>
           <w:szCs w:val="24"/>
         </w:rPr>
-        <w:t xml:space="preserve">Học sâu học thế nào: đoán, so đáp án, sửa một chút</w:t>
-      </w:r>
-    </w:p>
-    <w:p>
-      <w:pPr>
-        <w:pStyle w:val="ListParagraph"/>
-        <w:widowControl/>
-        <w:numPr>
-          <w:ilvl w:val="0"/>
-          <w:numId w:val="2"/>
-        </w:numPr>
-        <w:spacing w:after="80" w:line="320"/>
-      </w:pPr>
-      <w:r>
-        <w:rPr>
-          <w:rFonts w:ascii="Arial" w:cs="Arial" w:eastAsia="Arial" w:hAnsi="Arial"/>
-          <w:b/>
-          <w:bCs/>
-          <w:color w:val="24405C"/>
-          <w:sz w:val="22"/>
-          <w:szCs w:val="22"/>
-        </w:rPr>
-        <w:t xml:space="preserve">Đoán</w:t>
-      </w:r>
-      <w:r>
-        <w:rPr>
-          <w:rFonts w:ascii="Arial" w:cs="Arial" w:eastAsia="Arial" w:hAnsi="Arial"/>
-          <w:color w:val="1B1B1B"/>
-          <w:sz w:val="22"/>
-          <w:szCs w:val="22"/>
-        </w:rPr>
-        <w:t xml:space="preserve">: đưa một ảnh vào, mô hình đoán «ở đây có một người, khung ở đây».</w:t>
-      </w:r>
-    </w:p>
-    <w:p>
-      <w:pPr>
-        <w:pStyle w:val="ListParagraph"/>
-        <w:widowControl/>
-        <w:numPr>
-          <w:ilvl w:val="0"/>
-          <w:numId w:val="2"/>
-        </w:numPr>
-        <w:spacing w:after="80" w:line="320"/>
-      </w:pPr>
-      <w:r>
-        <w:rPr>
-          <w:rFonts w:ascii="Arial" w:cs="Arial" w:eastAsia="Arial" w:hAnsi="Arial"/>
-          <w:b/>
-          <w:bCs/>
-          <w:color w:val="24405C"/>
-          <w:sz w:val="22"/>
-          <w:szCs w:val="22"/>
-        </w:rPr>
-        <w:t xml:space="preserve">So đáp án</w:t>
-      </w:r>
-      <w:r>
-        <w:rPr>
-          <w:rFonts w:ascii="Arial" w:cs="Arial" w:eastAsia="Arial" w:hAnsi="Arial"/>
-          <w:color w:val="1B1B1B"/>
-          <w:sz w:val="22"/>
-          <w:szCs w:val="22"/>
-        </w:rPr>
-        <w:t xml:space="preserve">: so với đáp án con người gán nhãn, lệch bao nhiêu.</w:t>
-      </w:r>
-    </w:p>
-    <w:p>
-      <w:pPr>
-        <w:pStyle w:val="ListParagraph"/>
-        <w:widowControl/>
-        <w:numPr>
-          <w:ilvl w:val="0"/>
-          <w:numId w:val="2"/>
-        </w:numPr>
-        <w:spacing w:after="80" w:line="320"/>
-      </w:pPr>
-      <w:r>
-        <w:rPr>
-          <w:rFonts w:ascii="Arial" w:cs="Arial" w:eastAsia="Arial" w:hAnsi="Arial"/>
-          <w:b/>
-          <w:bCs/>
-          <w:color w:val="24405C"/>
-          <w:sz w:val="22"/>
-          <w:szCs w:val="22"/>
-        </w:rPr>
-        <w:t xml:space="preserve">Sửa một chút</w:t>
-      </w:r>
-      <w:r>
-        <w:rPr>
-          <w:rFonts w:ascii="Arial" w:cs="Arial" w:eastAsia="Arial" w:hAnsi="Arial"/>
-          <w:color w:val="1B1B1B"/>
-          <w:sz w:val="22"/>
-          <w:szCs w:val="22"/>
-        </w:rPr>
-        <w:t xml:space="preserve">: chỉnh hàng triệu con số bên trong để lần sau lệch ít hơn.</w:t>
-      </w:r>
-    </w:p>
-    <w:p>
-      <w:pPr>
-        <w:pStyle w:val="ListParagraph"/>
-        <w:widowControl/>
-        <w:numPr>
-          <w:ilvl w:val="0"/>
-          <w:numId w:val="2"/>
-        </w:numPr>
-        <w:spacing w:after="80" w:line="320"/>
-      </w:pPr>
-      <w:r>
-        <w:rPr>
-          <w:rFonts w:ascii="Arial" w:cs="Arial" w:eastAsia="Arial" w:hAnsi="Arial"/>
-          <w:b/>
-          <w:bCs/>
-          <w:color w:val="24405C"/>
-          <w:sz w:val="22"/>
-          <w:szCs w:val="22"/>
-        </w:rPr>
-        <w:t xml:space="preserve">Lặp lại</w:t>
-      </w:r>
-      <w:r>
-        <w:rPr>
-          <w:rFonts w:ascii="Arial" w:cs="Arial" w:eastAsia="Arial" w:hAnsi="Arial"/>
-          <w:color w:val="1B1B1B"/>
-          <w:sz w:val="22"/>
-          <w:szCs w:val="22"/>
-        </w:rPr>
-        <w:t xml:space="preserve">: hàng chục nghìn ảnh, nhiều vòng.</w:t>
-      </w:r>
-    </w:p>
-    <w:p>
-      <w:pPr>
-        <w:widowControl/>
-        <w:spacing w:after="100" w:before="0" w:line="312"/>
-        <w:ind w:left="0" w:firstLine="0"/>
-      </w:pPr>
-      <w:r>
-        <w:rPr>
-          <w:rFonts w:ascii="Arial" w:cs="Arial" w:eastAsia="Arial" w:hAnsi="Arial"/>
-          <w:color w:val="1B1B1B"/>
-          <w:sz w:val="22"/>
-          <w:szCs w:val="22"/>
-        </w:rPr>
-        <w:t xml:space="preserve">Giống luyện đề cũ có đáp án: làm xong so đáp án, ghi lại chỗ sai, làm đủ nhiều thì gặp đề lạ cũng làm được. Đáp án ở bước 2 do con người gán, đó là «gán nhãn dữ liệu» ở phần 3. Bên trong mô hình có từng lớp: lớp đầu tìm cạnh và màu, lớp giữa ghép thành bánh xe, chân, lớp cuối nói «đây là người». Không ai bảo nó «cạnh nào là chân», nó tự chỉnh ra khi so đáp án.</w:t>
-      </w:r>
-    </w:p>
-    <w:p>
-      <w:pPr>
-        <w:pStyle w:val="Heading2"/>
-        <w:keepNext/>
-        <w:spacing w:after="130" w:before="300"/>
-      </w:pPr>
-      <w:r>
-        <w:rPr>
-          <w:rFonts w:ascii="Arial" w:cs="Arial" w:eastAsia="Arial" w:hAnsi="Arial"/>
-          <w:b/>
-          <w:bCs/>
-          <w:color w:val="24405C"/>
-          <w:sz w:val="24"/>
-          <w:szCs w:val="24"/>
-        </w:rPr>
-        <w:t xml:space="preserve">Phát hiện vật thể cho ba thứ: khung, loại, điểm</w:t>
+        <w:t xml:space="preserve">Màu và con số</w:t>
       </w:r>
     </w:p>
     <w:p>
@@ -989,7 +951,7 @@
       <w:r>
         <w:drawing>
           <wp:inline distT="0" distB="0" distL="0" distR="0">
-            <wp:extent cx="5905500" cy="2057400"/>
+            <wp:extent cx="5715000" cy="3219450"/>
             <wp:effectExtent t="0" r="0" b="0" l="0"/>
             <wp:docPr id="1" name="" descr="" title=""/>
             <wp:cNvGraphicFramePr>
@@ -1014,6 +976,440 @@
                   <pic:spPr bwMode="auto">
                     <a:xfrm>
                       <a:off x="0" y="0"/>
+                      <a:ext cx="5715000" cy="3219450"/>
+                    </a:xfrm>
+                    <a:prstGeom prst="rect">
+                      <a:avLst/>
+                    </a:prstGeom>
+                  </pic:spPr>
+                </pic:pic>
+              </a:graphicData>
+            </a:graphic>
+          </wp:inline>
+        </w:drawing>
+      </w:r>
+    </w:p>
+    <w:p>
+      <w:pPr>
+        <w:keepNext w:val="false"/>
+        <w:spacing w:after="70" w:before="190"/>
+      </w:pPr>
+      <w:r>
+        <w:rPr>
+          <w:rFonts w:ascii="Arial" w:cs="Arial" w:eastAsia="Arial" w:hAnsi="Arial"/>
+          <w:b/>
+          <w:bCs/>
+          <w:color w:val="24405C"/>
+          <w:sz w:val="19"/>
+          <w:szCs w:val="19"/>
+        </w:rPr>
+        <w:t xml:space="preserve">Trên: ba con số của màu cơ bản; dưới: điểm thật trên ảnh (trung bình 5×5), scene-0553 ban ngày, scene-1100 ban đêm. Dữ liệu: nuScenes (Motional), CC BY-NC-SA 4.0</w:t>
+      </w:r>
+    </w:p>
+    <w:p>
+      <w:pPr>
+        <w:widowControl/>
+        <w:spacing w:after="100" w:before="0" w:line="312"/>
+        <w:ind w:left="0" w:firstLine="0"/>
+      </w:pPr>
+      <w:r>
+        <w:rPr>
+          <w:rFonts w:ascii="Arial" w:cs="Arial" w:eastAsia="Arial" w:hAnsi="Arial"/>
+          <w:color w:val="1B1B1B"/>
+          <w:sz w:val="22"/>
+          <w:szCs w:val="22"/>
+        </w:rPr>
+        <w:t xml:space="preserve">Ba con số như ba đèn pin đỏ, xanh lá, xanh dương chiếu lên tường trắng: chỉ bật đỏ là đỏ (255, 0, 0), đỏ + xanh lá là vàng, cả ba sáng nhất là trắng (255, 255, 255), ba cái bằng nhau là xám (128, 128, 128), tắt hết là đen (0, 0, 0). Đọc số hỏi hai việc: </w:t>
+      </w:r>
+      <w:r>
+        <w:rPr>
+          <w:rFonts w:ascii="Arial" w:cs="Arial" w:eastAsia="Arial" w:hAnsi="Arial"/>
+          <w:b/>
+          <w:bCs/>
+          <w:color w:val="24405C"/>
+          <w:sz w:val="22"/>
+          <w:szCs w:val="22"/>
+        </w:rPr>
+        <w:t xml:space="preserve">số lớn hay nhỏ</w:t>
+      </w:r>
+      <w:r>
+        <w:rPr>
+          <w:rFonts w:ascii="Arial" w:cs="Arial" w:eastAsia="Arial" w:hAnsi="Arial"/>
+          <w:color w:val="1B1B1B"/>
+          <w:sz w:val="22"/>
+          <w:szCs w:val="22"/>
+        </w:rPr>
+        <w:t xml:space="preserve"> (lớn là sáng), </w:t>
+      </w:r>
+      <w:r>
+        <w:rPr>
+          <w:rFonts w:ascii="Arial" w:cs="Arial" w:eastAsia="Arial" w:hAnsi="Arial"/>
+          <w:b/>
+          <w:bCs/>
+          <w:color w:val="24405C"/>
+          <w:sz w:val="22"/>
+          <w:szCs w:val="22"/>
+        </w:rPr>
+        <w:t xml:space="preserve">số nào lớn nhất</w:t>
+      </w:r>
+      <w:r>
+        <w:rPr>
+          <w:rFonts w:ascii="Arial" w:cs="Arial" w:eastAsia="Arial" w:hAnsi="Arial"/>
+          <w:color w:val="1B1B1B"/>
+          <w:sz w:val="22"/>
+          <w:szCs w:val="22"/>
+        </w:rPr>
+        <w:t xml:space="preserve"> (nghiêng về màu đó). Điểm thật trên ảnh: quần đỏ R 123, G 80, B 67, đỏ lớn nhất; vạch trắng chỉ khoảng 138 vì trời âm u, tự chỉnh phơi sáng làm cả ảnh tối đi; áo trong bóng râm chỉ khoảng 20, gần như đen; mặt đường ban đêm có màu xanh dương rất nhỏ, ngả vàng vì đèn đường ánh vàng; đèn đường gần 255. </w:t>
+      </w:r>
+      <w:r>
+        <w:rPr>
+          <w:rFonts w:ascii="Arial" w:cs="Arial" w:eastAsia="Arial" w:hAnsi="Arial"/>
+          <w:b/>
+          <w:bCs/>
+          <w:color w:val="24405C"/>
+          <w:sz w:val="22"/>
+          <w:szCs w:val="22"/>
+        </w:rPr>
+        <w:t xml:space="preserve">Cùng một vật, đổi ánh sáng là con số khác hẳn</w:t>
+      </w:r>
+      <w:r>
+        <w:rPr>
+          <w:rFonts w:ascii="Arial" w:cs="Arial" w:eastAsia="Arial" w:hAnsi="Arial"/>
+          <w:color w:val="1B1B1B"/>
+          <w:sz w:val="22"/>
+          <w:szCs w:val="22"/>
+        </w:rPr>
+        <w:t xml:space="preserve">, nên máy tính không thể tìm người bằng luật «từ bao nhiêu đến bao nhiêu là người».</w:t>
+      </w:r>
+    </w:p>
+    <w:p>
+      <w:pPr>
+        <w:pStyle w:val="Heading2"/>
+        <w:keepNext/>
+        <w:spacing w:after="130" w:before="300"/>
+      </w:pPr>
+      <w:r>
+        <w:rPr>
+          <w:rFonts w:ascii="Arial" w:cs="Arial" w:eastAsia="Arial" w:hAnsi="Arial"/>
+          <w:b/>
+          <w:bCs/>
+          <w:color w:val="24405C"/>
+          <w:sz w:val="24"/>
+          <w:szCs w:val="24"/>
+        </w:rPr>
+        <w:t xml:space="preserve">Vì sao không viết luật: cùng là xe mà trông khác nhau</w:t>
+      </w:r>
+    </w:p>
+    <w:p>
+      <w:pPr>
+        <w:keepNext/>
+        <w:spacing w:after="60" w:before="60"/>
+        <w:jc w:val="center"/>
+      </w:pPr>
+      <w:r>
+        <w:drawing>
+          <wp:inline distT="0" distB="0" distL="0" distR="0">
+            <wp:extent cx="5905500" cy="2238375"/>
+            <wp:effectExtent t="0" r="0" b="0" l="0"/>
+            <wp:docPr id="1" name="" descr="" title=""/>
+            <wp:cNvGraphicFramePr>
+              <a:graphicFrameLocks xmlns:a="http://schemas.openxmlformats.org/drawingml/2006/main" noChangeAspect="1"/>
+            </wp:cNvGraphicFramePr>
+            <a:graphic xmlns:a="http://schemas.openxmlformats.org/drawingml/2006/main">
+              <a:graphicData uri="http://schemas.openxmlformats.org/drawingml/2006/picture">
+                <pic:pic xmlns:pic="http://schemas.openxmlformats.org/drawingml/2006/picture">
+                  <pic:nvPicPr>
+                    <pic:cNvPr id="0" name="" descr=""/>
+                    <pic:cNvPicPr>
+                      <a:picLocks noChangeAspect="1" noChangeArrowheads="1"/>
+                    </pic:cNvPicPr>
+                  </pic:nvPicPr>
+                  <pic:blipFill>
+                    <a:blip r:embed="rId12" cstate="none"/>
+                    <a:srcRect/>
+                    <a:stretch>
+                      <a:fillRect/>
+                    </a:stretch>
+                  </pic:blipFill>
+                  <pic:spPr bwMode="auto">
+                    <a:xfrm>
+                      <a:off x="0" y="0"/>
+                      <a:ext cx="5905500" cy="2238375"/>
+                    </a:xfrm>
+                    <a:prstGeom prst="rect">
+                      <a:avLst/>
+                    </a:prstGeom>
+                  </pic:spPr>
+                </pic:pic>
+              </a:graphicData>
+            </a:graphic>
+          </wp:inline>
+        </w:drawing>
+      </w:r>
+    </w:p>
+    <w:p>
+      <w:pPr>
+        <w:keepNext w:val="false"/>
+        <w:spacing w:after="70" w:before="190"/>
+      </w:pPr>
+      <w:r>
+        <w:rPr>
+          <w:rFonts w:ascii="Arial" w:cs="Arial" w:eastAsia="Arial" w:hAnsi="Arial"/>
+          <w:b/>
+          <w:bCs/>
+          <w:color w:val="24405C"/>
+          <w:sz w:val="19"/>
+          <w:szCs w:val="19"/>
+        </w:rPr>
+        <w:t xml:space="preserve">Xe và người cắt từ nuScenes: góc nhìn, ngày đêm, bị che, xa gần đều khác. «Thấy được» là độ thấy chính thức. Dữ liệu: nuScenes (Motional), CC BY-NC-SA 4.0</w:t>
+      </w:r>
+    </w:p>
+    <w:p>
+      <w:pPr>
+        <w:widowControl/>
+        <w:spacing w:after="100" w:before="0" w:line="312"/>
+        <w:ind w:left="0" w:firstLine="0"/>
+      </w:pPr>
+      <w:r>
+        <w:rPr>
+          <w:rFonts w:ascii="Arial" w:cs="Arial" w:eastAsia="Arial" w:hAnsi="Arial"/>
+          <w:color w:val="1B1B1B"/>
+          <w:sz w:val="22"/>
+          <w:szCs w:val="22"/>
+        </w:rPr>
+        <w:t xml:space="preserve">«Xe = bốn bánh + một thân xe»? Nhìn từ sau không thấy bốn bánh; ban đêm chỉ còn hai đèn; bị che một nửa chỉ thấy nóc. Mỗi tình huống mới phải thêm một luật, viết không bao giờ hết. Em bé nhận ra xe không nhờ học luật, mà nhờ nhìn rất nhiều xe. Máy tính bây giờ cũng vậy: </w:t>
+      </w:r>
+      <w:r>
+        <w:rPr>
+          <w:rFonts w:ascii="Arial" w:cs="Arial" w:eastAsia="Arial" w:hAnsi="Arial"/>
+          <w:b/>
+          <w:bCs/>
+          <w:color w:val="24405C"/>
+          <w:sz w:val="22"/>
+          <w:szCs w:val="22"/>
+        </w:rPr>
+        <w:t xml:space="preserve">cho nó rất nhiều ảnh có đáp án, để nó tự tìm quy luật</w:t>
+      </w:r>
+      <w:r>
+        <w:rPr>
+          <w:rFonts w:ascii="Arial" w:cs="Arial" w:eastAsia="Arial" w:hAnsi="Arial"/>
+          <w:color w:val="1B1B1B"/>
+          <w:sz w:val="22"/>
+          <w:szCs w:val="22"/>
+        </w:rPr>
+        <w:t xml:space="preserve"> — gọi là học máy; mô hình có nhiều lớp chồng lên nhau nên gọi là học sâu.</w:t>
+      </w:r>
+    </w:p>
+    <w:p>
+      <w:pPr>
+        <w:pStyle w:val="Heading2"/>
+        <w:keepNext/>
+        <w:spacing w:after="130" w:before="300"/>
+      </w:pPr>
+      <w:r>
+        <w:rPr>
+          <w:rFonts w:ascii="Arial" w:cs="Arial" w:eastAsia="Arial" w:hAnsi="Arial"/>
+          <w:b/>
+          <w:bCs/>
+          <w:color w:val="24405C"/>
+          <w:sz w:val="24"/>
+          <w:szCs w:val="24"/>
+        </w:rPr>
+        <w:t xml:space="preserve">Học sâu học thế nào: đoán, so đáp án, sửa một chút</w:t>
+      </w:r>
+    </w:p>
+    <w:p>
+      <w:pPr>
+        <w:pStyle w:val="ListParagraph"/>
+        <w:widowControl/>
+        <w:numPr>
+          <w:ilvl w:val="0"/>
+          <w:numId w:val="2"/>
+        </w:numPr>
+        <w:spacing w:after="80" w:line="320"/>
+      </w:pPr>
+      <w:r>
+        <w:rPr>
+          <w:rFonts w:ascii="Arial" w:cs="Arial" w:eastAsia="Arial" w:hAnsi="Arial"/>
+          <w:b/>
+          <w:bCs/>
+          <w:color w:val="24405C"/>
+          <w:sz w:val="22"/>
+          <w:szCs w:val="22"/>
+        </w:rPr>
+        <w:t xml:space="preserve">Đoán</w:t>
+      </w:r>
+      <w:r>
+        <w:rPr>
+          <w:rFonts w:ascii="Arial" w:cs="Arial" w:eastAsia="Arial" w:hAnsi="Arial"/>
+          <w:color w:val="1B1B1B"/>
+          <w:sz w:val="22"/>
+          <w:szCs w:val="22"/>
+        </w:rPr>
+        <w:t xml:space="preserve">: đưa một ảnh vào, mô hình đoán «ở đây có một người, khung ở đây».</w:t>
+      </w:r>
+    </w:p>
+    <w:p>
+      <w:pPr>
+        <w:pStyle w:val="ListParagraph"/>
+        <w:widowControl/>
+        <w:numPr>
+          <w:ilvl w:val="0"/>
+          <w:numId w:val="2"/>
+        </w:numPr>
+        <w:spacing w:after="80" w:line="320"/>
+      </w:pPr>
+      <w:r>
+        <w:rPr>
+          <w:rFonts w:ascii="Arial" w:cs="Arial" w:eastAsia="Arial" w:hAnsi="Arial"/>
+          <w:b/>
+          <w:bCs/>
+          <w:color w:val="24405C"/>
+          <w:sz w:val="22"/>
+          <w:szCs w:val="22"/>
+        </w:rPr>
+        <w:t xml:space="preserve">So đáp án</w:t>
+      </w:r>
+      <w:r>
+        <w:rPr>
+          <w:rFonts w:ascii="Arial" w:cs="Arial" w:eastAsia="Arial" w:hAnsi="Arial"/>
+          <w:color w:val="1B1B1B"/>
+          <w:sz w:val="22"/>
+          <w:szCs w:val="22"/>
+        </w:rPr>
+        <w:t xml:space="preserve">: so với đáp án con người gán nhãn, lệch bao nhiêu.</w:t>
+      </w:r>
+    </w:p>
+    <w:p>
+      <w:pPr>
+        <w:pStyle w:val="ListParagraph"/>
+        <w:widowControl/>
+        <w:numPr>
+          <w:ilvl w:val="0"/>
+          <w:numId w:val="2"/>
+        </w:numPr>
+        <w:spacing w:after="80" w:line="320"/>
+      </w:pPr>
+      <w:r>
+        <w:rPr>
+          <w:rFonts w:ascii="Arial" w:cs="Arial" w:eastAsia="Arial" w:hAnsi="Arial"/>
+          <w:b/>
+          <w:bCs/>
+          <w:color w:val="24405C"/>
+          <w:sz w:val="22"/>
+          <w:szCs w:val="22"/>
+        </w:rPr>
+        <w:t xml:space="preserve">Sửa một chút</w:t>
+      </w:r>
+      <w:r>
+        <w:rPr>
+          <w:rFonts w:ascii="Arial" w:cs="Arial" w:eastAsia="Arial" w:hAnsi="Arial"/>
+          <w:color w:val="1B1B1B"/>
+          <w:sz w:val="22"/>
+          <w:szCs w:val="22"/>
+        </w:rPr>
+        <w:t xml:space="preserve">: chỉnh hàng triệu con số bên trong để lần sau lệch ít hơn.</w:t>
+      </w:r>
+    </w:p>
+    <w:p>
+      <w:pPr>
+        <w:pStyle w:val="ListParagraph"/>
+        <w:widowControl/>
+        <w:numPr>
+          <w:ilvl w:val="0"/>
+          <w:numId w:val="2"/>
+        </w:numPr>
+        <w:spacing w:after="80" w:line="320"/>
+      </w:pPr>
+      <w:r>
+        <w:rPr>
+          <w:rFonts w:ascii="Arial" w:cs="Arial" w:eastAsia="Arial" w:hAnsi="Arial"/>
+          <w:b/>
+          <w:bCs/>
+          <w:color w:val="24405C"/>
+          <w:sz w:val="22"/>
+          <w:szCs w:val="22"/>
+        </w:rPr>
+        <w:t xml:space="preserve">Lặp lại</w:t>
+      </w:r>
+      <w:r>
+        <w:rPr>
+          <w:rFonts w:ascii="Arial" w:cs="Arial" w:eastAsia="Arial" w:hAnsi="Arial"/>
+          <w:color w:val="1B1B1B"/>
+          <w:sz w:val="22"/>
+          <w:szCs w:val="22"/>
+        </w:rPr>
+        <w:t xml:space="preserve">: hàng chục nghìn ảnh, nhiều vòng.</w:t>
+      </w:r>
+    </w:p>
+    <w:p>
+      <w:pPr>
+        <w:widowControl/>
+        <w:spacing w:after="100" w:before="0" w:line="312"/>
+        <w:ind w:left="0" w:firstLine="0"/>
+      </w:pPr>
+      <w:r>
+        <w:rPr>
+          <w:rFonts w:ascii="Arial" w:cs="Arial" w:eastAsia="Arial" w:hAnsi="Arial"/>
+          <w:color w:val="1B1B1B"/>
+          <w:sz w:val="22"/>
+          <w:szCs w:val="22"/>
+        </w:rPr>
+        <w:t xml:space="preserve">Giống luyện đề cũ có đáp án: làm xong so đáp án, ghi lại chỗ sai, làm đủ nhiều thì gặp đề lạ cũng làm được. Đáp án ở bước 2 do con người gán, đó là «gán nhãn dữ liệu» ở phần 3. Bên trong mô hình có từng lớp: lớp đầu tìm cạnh và màu, lớp giữa ghép thành bánh xe, chân, lớp cuối nói «đây là người». Không ai bảo nó «cạnh nào là chân», nó tự chỉnh ra khi so đáp án.</w:t>
+      </w:r>
+    </w:p>
+    <w:p>
+      <w:pPr>
+        <w:pStyle w:val="Heading2"/>
+        <w:keepNext/>
+        <w:spacing w:after="130" w:before="300"/>
+      </w:pPr>
+      <w:r>
+        <w:rPr>
+          <w:rFonts w:ascii="Arial" w:cs="Arial" w:eastAsia="Arial" w:hAnsi="Arial"/>
+          <w:b/>
+          <w:bCs/>
+          <w:color w:val="24405C"/>
+          <w:sz w:val="24"/>
+          <w:szCs w:val="24"/>
+        </w:rPr>
+        <w:t xml:space="preserve">Phát hiện vật thể cho ba thứ: khung, loại, điểm</w:t>
+      </w:r>
+    </w:p>
+    <w:p>
+      <w:pPr>
+        <w:keepNext/>
+        <w:spacing w:after="60" w:before="60"/>
+        <w:jc w:val="center"/>
+      </w:pPr>
+      <w:r>
+        <w:drawing>
+          <wp:inline distT="0" distB="0" distL="0" distR="0">
+            <wp:extent cx="5905500" cy="2057400"/>
+            <wp:effectExtent t="0" r="0" b="0" l="0"/>
+            <wp:docPr id="1" name="" descr="" title=""/>
+            <wp:cNvGraphicFramePr>
+              <a:graphicFrameLocks xmlns:a="http://schemas.openxmlformats.org/drawingml/2006/main" noChangeAspect="1"/>
+            </wp:cNvGraphicFramePr>
+            <a:graphic xmlns:a="http://schemas.openxmlformats.org/drawingml/2006/main">
+              <a:graphicData uri="http://schemas.openxmlformats.org/drawingml/2006/picture">
+                <pic:pic xmlns:pic="http://schemas.openxmlformats.org/drawingml/2006/picture">
+                  <pic:nvPicPr>
+                    <pic:cNvPr id="0" name="" descr=""/>
+                    <pic:cNvPicPr>
+                      <a:picLocks noChangeAspect="1" noChangeArrowheads="1"/>
+                    </pic:cNvPicPr>
+                  </pic:nvPicPr>
+                  <pic:blipFill>
+                    <a:blip r:embed="rId13" cstate="none"/>
+                    <a:srcRect/>
+                    <a:stretch>
+                      <a:fillRect/>
+                    </a:stretch>
+                  </pic:blipFill>
+                  <pic:spPr bwMode="auto">
+                    <a:xfrm>
+                      <a:off x="0" y="0"/>
                       <a:ext cx="5905500" cy="2057400"/>
                     </a:xfrm>
                     <a:prstGeom prst="rect">
@@ -1746,7 +2142,7 @@
                     </pic:cNvPicPr>
                   </pic:nvPicPr>
                   <pic:blipFill>
-                    <a:blip r:embed="rId12" cstate="none"/>
+                    <a:blip r:embed="rId14" cstate="none"/>
                     <a:srcRect/>
                     <a:stretch>
                       <a:fillRect/>
@@ -2986,7 +3382,7 @@
                     </pic:cNvPicPr>
                   </pic:nvPicPr>
                   <pic:blipFill>
-                    <a:blip r:embed="rId13" cstate="none"/>
+                    <a:blip r:embed="rId15" cstate="none"/>
                     <a:srcRect/>
                     <a:stretch>
                       <a:fillRect/>
@@ -3086,843 +3482,6 @@
         <w:drawing>
           <wp:inline distT="0" distB="0" distL="0" distR="0">
             <wp:extent cx="5715000" cy="1990725"/>
-            <wp:effectExtent t="0" r="0" b="0" l="0"/>
-            <wp:docPr id="1" name="" descr="" title=""/>
-            <wp:cNvGraphicFramePr>
-              <a:graphicFrameLocks xmlns:a="http://schemas.openxmlformats.org/drawingml/2006/main" noChangeAspect="1"/>
-            </wp:cNvGraphicFramePr>
-            <a:graphic xmlns:a="http://schemas.openxmlformats.org/drawingml/2006/main">
-              <a:graphicData uri="http://schemas.openxmlformats.org/drawingml/2006/picture">
-                <pic:pic xmlns:pic="http://schemas.openxmlformats.org/drawingml/2006/picture">
-                  <pic:nvPicPr>
-                    <pic:cNvPr id="0" name="" descr=""/>
-                    <pic:cNvPicPr>
-                      <a:picLocks noChangeAspect="1" noChangeArrowheads="1"/>
-                    </pic:cNvPicPr>
-                  </pic:nvPicPr>
-                  <pic:blipFill>
-                    <a:blip r:embed="rId14" cstate="none"/>
-                    <a:srcRect/>
-                    <a:stretch>
-                      <a:fillRect/>
-                    </a:stretch>
-                  </pic:blipFill>
-                  <pic:spPr bwMode="auto">
-                    <a:xfrm>
-                      <a:off x="0" y="0"/>
-                      <a:ext cx="5715000" cy="1990725"/>
-                    </a:xfrm>
-                    <a:prstGeom prst="rect">
-                      <a:avLst/>
-                    </a:prstGeom>
-                  </pic:spPr>
-                </pic:pic>
-              </a:graphicData>
-            </a:graphic>
-          </wp:inline>
-        </w:drawing>
-      </w:r>
-    </w:p>
-    <w:p>
-      <w:pPr>
-        <w:keepNext w:val="false"/>
-        <w:spacing w:after="70" w:before="190"/>
-      </w:pPr>
-      <w:r>
-        <w:rPr>
-          <w:rFonts w:ascii="Arial" w:cs="Arial" w:eastAsia="Arial" w:hAnsi="Arial"/>
-          <w:b/>
-          <w:bCs/>
-          <w:color w:val="24405C"/>
-          <w:sz w:val="19"/>
-          <w:szCs w:val="19"/>
-        </w:rPr>
-        <w:t xml:space="preserve">Khung phát hiện + điểm lidar (vàng). Lấy trung vị 1 m dày điểm nhất trong khung: người 8,9 m (chính thức 9,0 m), xe 21,4 m (22,0 m). Dữ liệu: nuScenes (Motional), CC BY-NC-SA 4.0</w:t>
-      </w:r>
-    </w:p>
-    <w:p>
-      <w:pPr>
-        <w:widowControl/>
-        <w:spacing w:after="100" w:before="0" w:line="312"/>
-        <w:ind w:left="0" w:firstLine="0"/>
-      </w:pPr>
-      <w:r>
-        <w:rPr>
-          <w:rFonts w:ascii="Arial" w:cs="Arial" w:eastAsia="Arial" w:hAnsi="Arial"/>
-          <w:color w:val="1B1B1B"/>
-          <w:sz w:val="22"/>
-          <w:szCs w:val="22"/>
-        </w:rPr>
-        <w:t xml:space="preserve">Camera nói «đây là người», lidar nói «bao xa» — cặp camera + lidar của tuần 7. Khung là hình chữ nhật, góc khung có cả điểm của mặt đường, nhà phía sau, nên phải chọn cụm điểm dày nhất. Xe tự lái cần </w:t>
-      </w:r>
-      <w:r>
-        <w:rPr>
-          <w:rFonts w:ascii="Arial" w:cs="Arial" w:eastAsia="Arial" w:hAnsi="Arial"/>
-          <w:b/>
-          <w:bCs/>
-          <w:color w:val="24405C"/>
-          <w:sz w:val="22"/>
-          <w:szCs w:val="22"/>
-        </w:rPr>
-        <w:t xml:space="preserve">khung 3D</w:t>
-      </w:r>
-      <w:r>
-        <w:rPr>
-          <w:rFonts w:ascii="Arial" w:cs="Arial" w:eastAsia="Arial" w:hAnsi="Arial"/>
-          <w:color w:val="1B1B1B"/>
-          <w:sz w:val="22"/>
-          <w:szCs w:val="22"/>
-        </w:rPr>
-        <w:t xml:space="preserve">: ba số vị trí, ba số kích thước, thêm hướng — bảy con số (tuần 7).</w:t>
-      </w:r>
-    </w:p>
-    <w:p>
-      <w:pPr>
-        <w:pStyle w:val="Heading2"/>
-        <w:keepNext/>
-        <w:spacing w:after="130" w:before="300"/>
-      </w:pPr>
-      <w:r>
-        <w:rPr>
-          <w:rFonts w:ascii="Arial" w:cs="Arial" w:eastAsia="Arial" w:hAnsi="Arial"/>
-          <w:b/>
-          <w:bCs/>
-          <w:color w:val="24405C"/>
-          <w:sz w:val="24"/>
-          <w:szCs w:val="24"/>
-        </w:rPr>
-        <w:t xml:space="preserve">Nhìn từ trên xuống: bản đồ từ trên và lưới chiếm chỗ</w:t>
-      </w:r>
-    </w:p>
-    <w:p>
-      <w:pPr>
-        <w:keepNext/>
-        <w:spacing w:after="60" w:before="60"/>
-        <w:jc w:val="center"/>
-      </w:pPr>
-      <w:r>
-        <w:drawing>
-          <wp:inline distT="0" distB="0" distL="0" distR="0">
-            <wp:extent cx="5905500" cy="3333750"/>
-            <wp:effectExtent t="0" r="0" b="0" l="0"/>
-            <wp:docPr id="1" name="" descr="" title=""/>
-            <wp:cNvGraphicFramePr>
-              <a:graphicFrameLocks xmlns:a="http://schemas.openxmlformats.org/drawingml/2006/main" noChangeAspect="1"/>
-            </wp:cNvGraphicFramePr>
-            <a:graphic xmlns:a="http://schemas.openxmlformats.org/drawingml/2006/main">
-              <a:graphicData uri="http://schemas.openxmlformats.org/drawingml/2006/picture">
-                <pic:pic xmlns:pic="http://schemas.openxmlformats.org/drawingml/2006/picture">
-                  <pic:nvPicPr>
-                    <pic:cNvPr id="0" name="" descr=""/>
-                    <pic:cNvPicPr>
-                      <a:picLocks noChangeAspect="1" noChangeArrowheads="1"/>
-                    </pic:cNvPicPr>
-                  </pic:nvPicPr>
-                  <pic:blipFill>
-                    <a:blip r:embed="rId15" cstate="none"/>
-                    <a:srcRect/>
-                    <a:stretch>
-                      <a:fillRect/>
-                    </a:stretch>
-                  </pic:blipFill>
-                  <pic:spPr bwMode="auto">
-                    <a:xfrm>
-                      <a:off x="0" y="0"/>
-                      <a:ext cx="5905500" cy="3333750"/>
-                    </a:xfrm>
-                    <a:prstGeom prst="rect">
-                      <a:avLst/>
-                    </a:prstGeom>
-                  </pic:spPr>
-                </pic:pic>
-              </a:graphicData>
-            </a:graphic>
-          </wp:inline>
-        </w:drawing>
-      </w:r>
-    </w:p>
-    <w:p>
-      <w:pPr>
-        <w:keepNext w:val="false"/>
-        <w:spacing w:after="70" w:before="190"/>
-      </w:pPr>
-      <w:r>
-        <w:rPr>
-          <w:rFonts w:ascii="Arial" w:cs="Arial" w:eastAsia="Arial" w:hAnsi="Arial"/>
-          <w:b/>
-          <w:bCs/>
-          <w:color w:val="24405C"/>
-          <w:sz w:val="19"/>
-          <w:szCs w:val="19"/>
-        </w:rPr>
-        <w:t xml:space="preserve">Trái: bản đồ từ trên, điểm lidar + khung 3D; phải: lưới chiếm chỗ tính từ cùng khung lidar (ô 0,5 m). scene-0103 (Boston). Dữ liệu: nuScenes (Motional), CC BY-NC-SA 4.0</w:t>
-      </w:r>
-    </w:p>
-    <w:p>
-      <w:pPr>
-        <w:pStyle w:val="ListParagraph"/>
-        <w:widowControl/>
-        <w:numPr>
-          <w:ilvl w:val="0"/>
-          <w:numId w:val="3"/>
-        </w:numPr>
-        <w:spacing w:after="80" w:line="320"/>
-      </w:pPr>
-      <w:r>
-        <w:rPr>
-          <w:rFonts w:ascii="Arial" w:cs="Arial" w:eastAsia="Arial" w:hAnsi="Arial"/>
-          <w:color w:val="1B1B1B"/>
-          <w:sz w:val="22"/>
-          <w:szCs w:val="22"/>
-        </w:rPr>
-        <w:t xml:space="preserve">Ba cái lợi của bản đồ từ trên: các vật </w:t>
-      </w:r>
-      <w:r>
-        <w:rPr>
-          <w:rFonts w:ascii="Arial" w:cs="Arial" w:eastAsia="Arial" w:hAnsi="Arial"/>
-          <w:b/>
-          <w:bCs/>
-          <w:color w:val="24405C"/>
-          <w:sz w:val="22"/>
-          <w:szCs w:val="22"/>
-        </w:rPr>
-        <w:t xml:space="preserve">không che nhau</w:t>
-      </w:r>
-      <w:r>
-        <w:rPr>
-          <w:rFonts w:ascii="Arial" w:cs="Arial" w:eastAsia="Arial" w:hAnsi="Arial"/>
-          <w:color w:val="1B1B1B"/>
-          <w:sz w:val="22"/>
-          <w:szCs w:val="22"/>
-        </w:rPr>
-        <w:t xml:space="preserve">; </w:t>
-      </w:r>
-      <w:r>
-        <w:rPr>
-          <w:rFonts w:ascii="Arial" w:cs="Arial" w:eastAsia="Arial" w:hAnsi="Arial"/>
-          <w:b/>
-          <w:bCs/>
-          <w:color w:val="24405C"/>
-          <w:sz w:val="22"/>
-          <w:szCs w:val="22"/>
-        </w:rPr>
-        <w:t xml:space="preserve">khoảng cách không méo</w:t>
-      </w:r>
-      <w:r>
-        <w:rPr>
-          <w:rFonts w:ascii="Arial" w:cs="Arial" w:eastAsia="Arial" w:hAnsi="Arial"/>
-          <w:color w:val="1B1B1B"/>
-          <w:sz w:val="22"/>
-          <w:szCs w:val="22"/>
-        </w:rPr>
-        <w:t xml:space="preserve">; lái xe vốn là quyết định </w:t>
-      </w:r>
-      <w:r>
-        <w:rPr>
-          <w:rFonts w:ascii="Arial" w:cs="Arial" w:eastAsia="Arial" w:hAnsi="Arial"/>
-          <w:b/>
-          <w:bCs/>
-          <w:color w:val="24405C"/>
-          <w:sz w:val="22"/>
-          <w:szCs w:val="22"/>
-        </w:rPr>
-        <w:t xml:space="preserve">trên mặt đất</w:t>
-      </w:r>
-      <w:r>
-        <w:rPr>
-          <w:rFonts w:ascii="Arial" w:cs="Arial" w:eastAsia="Arial" w:hAnsi="Arial"/>
-          <w:color w:val="1B1B1B"/>
-          <w:sz w:val="22"/>
-          <w:szCs w:val="22"/>
-        </w:rPr>
-        <w:t xml:space="preserve">. Ghép giữa ở tuần 7 là cùng vẽ thành một bản đồ từ trên.</w:t>
-      </w:r>
-    </w:p>
-    <w:p>
-      <w:pPr>
-        <w:pStyle w:val="ListParagraph"/>
-        <w:widowControl/>
-        <w:numPr>
-          <w:ilvl w:val="0"/>
-          <w:numId w:val="3"/>
-        </w:numPr>
-        <w:spacing w:after="80" w:line="320"/>
-      </w:pPr>
-      <w:r>
-        <w:rPr>
-          <w:rFonts w:ascii="Arial" w:cs="Arial" w:eastAsia="Arial" w:hAnsi="Arial"/>
-          <w:color w:val="1B1B1B"/>
-          <w:sz w:val="22"/>
-          <w:szCs w:val="22"/>
-        </w:rPr>
-        <w:t xml:space="preserve">Lưới chiếm chỗ: mỗi ô chỉ hỏi một việc. </w:t>
-      </w:r>
-      <w:r>
-        <w:rPr>
-          <w:rFonts w:ascii="Arial" w:cs="Arial" w:eastAsia="Arial" w:hAnsi="Arial"/>
-          <w:b/>
-          <w:bCs/>
-          <w:color w:val="24405C"/>
-          <w:sz w:val="22"/>
-          <w:szCs w:val="22"/>
-        </w:rPr>
-        <w:t xml:space="preserve">Đỏ = có vật</w:t>
-      </w:r>
-      <w:r>
-        <w:rPr>
-          <w:rFonts w:ascii="Arial" w:cs="Arial" w:eastAsia="Arial" w:hAnsi="Arial"/>
-          <w:color w:val="1B1B1B"/>
-          <w:sz w:val="22"/>
-          <w:szCs w:val="22"/>
-        </w:rPr>
-        <w:t xml:space="preserve">, </w:t>
-      </w:r>
-      <w:r>
-        <w:rPr>
-          <w:rFonts w:ascii="Arial" w:cs="Arial" w:eastAsia="Arial" w:hAnsi="Arial"/>
-          <w:b/>
-          <w:bCs/>
-          <w:color w:val="24405C"/>
-          <w:sz w:val="22"/>
-          <w:szCs w:val="22"/>
-        </w:rPr>
-        <w:t xml:space="preserve">trắng = trống</w:t>
-      </w:r>
-      <w:r>
-        <w:rPr>
-          <w:rFonts w:ascii="Arial" w:cs="Arial" w:eastAsia="Arial" w:hAnsi="Arial"/>
-          <w:color w:val="1B1B1B"/>
-          <w:sz w:val="22"/>
-          <w:szCs w:val="22"/>
-        </w:rPr>
-        <w:t xml:space="preserve"> (tia laser đi qua không chạm gì), </w:t>
-      </w:r>
-      <w:r>
-        <w:rPr>
-          <w:rFonts w:ascii="Arial" w:cs="Arial" w:eastAsia="Arial" w:hAnsi="Arial"/>
-          <w:b/>
-          <w:bCs/>
-          <w:color w:val="24405C"/>
-          <w:sz w:val="22"/>
-          <w:szCs w:val="22"/>
-        </w:rPr>
-        <w:t xml:space="preserve">xám = chưa biết</w:t>
-      </w:r>
-      <w:r>
-        <w:rPr>
-          <w:rFonts w:ascii="Arial" w:cs="Arial" w:eastAsia="Arial" w:hAnsi="Arial"/>
-          <w:color w:val="1B1B1B"/>
-          <w:sz w:val="22"/>
-          <w:szCs w:val="22"/>
-        </w:rPr>
-        <w:t xml:space="preserve"> (bị che, không bắn tới).</w:t>
-      </w:r>
-    </w:p>
-    <w:p>
-      <w:pPr>
-        <w:pStyle w:val="ListParagraph"/>
-        <w:widowControl/>
-        <w:numPr>
-          <w:ilvl w:val="0"/>
-          <w:numId w:val="3"/>
-        </w:numPr>
-        <w:spacing w:after="80" w:line="320"/>
-      </w:pPr>
-      <w:r>
-        <w:rPr>
-          <w:rFonts w:ascii="Arial" w:cs="Arial" w:eastAsia="Arial" w:hAnsi="Arial"/>
-          <w:color w:val="1B1B1B"/>
-          <w:sz w:val="22"/>
-          <w:szCs w:val="22"/>
-        </w:rPr>
-        <w:t xml:space="preserve">Lợi lớn nhất: </w:t>
-      </w:r>
-      <w:r>
-        <w:rPr>
-          <w:rFonts w:ascii="Arial" w:cs="Arial" w:eastAsia="Arial" w:hAnsi="Arial"/>
-          <w:b/>
-          <w:bCs/>
-          <w:color w:val="24405C"/>
-          <w:sz w:val="22"/>
-          <w:szCs w:val="22"/>
-        </w:rPr>
-        <w:t xml:space="preserve">không cần biết là gì</w:t>
-      </w:r>
-      <w:r>
-        <w:rPr>
-          <w:rFonts w:ascii="Arial" w:cs="Arial" w:eastAsia="Arial" w:hAnsi="Arial"/>
-          <w:color w:val="1B1B1B"/>
-          <w:sz w:val="22"/>
-          <w:szCs w:val="22"/>
-        </w:rPr>
-        <w:t xml:space="preserve">. Hàng rơi trên đường, chướng ngại lạ, bộ phát hiện không nhận ra nhưng lưới vẫn tô đỏ. Cẩn thận: «chưa biết» không phải «trống».</w:t>
-      </w:r>
-    </w:p>
-    <w:p>
-      <w:pPr>
-        <w:pStyle w:val="Heading1"/>
-        <w:keepNext/>
-        <w:pageBreakBefore/>
-        <w:spacing w:after="240" w:before="160"/>
-      </w:pPr>
-      <w:r>
-        <w:rPr>
-          <w:rFonts w:ascii="Arial" w:cs="Arial" w:eastAsia="Arial" w:hAnsi="Arial"/>
-          <w:b/>
-          <w:bCs/>
-          <w:color w:val="24405C"/>
-          <w:sz w:val="30"/>
-          <w:szCs w:val="30"/>
-        </w:rPr>
-        <w:t xml:space="preserve">3. Gán nhãn dữ liệu: chuẩn bị đáp án cho máy tính</w:t>
-      </w:r>
-    </w:p>
-    <w:p>
-      <w:pPr>
-        <w:widowControl/>
-        <w:spacing w:after="100" w:before="0" w:line="312"/>
-        <w:ind w:left="0" w:firstLine="0"/>
-      </w:pPr>
-      <w:r>
-        <w:rPr>
-          <w:rFonts w:ascii="Arial" w:cs="Arial" w:eastAsia="Arial" w:hAnsi="Arial"/>
-          <w:color w:val="1B1B1B"/>
-          <w:sz w:val="22"/>
-          <w:szCs w:val="22"/>
-        </w:rPr>
-        <w:t xml:space="preserve">Dữ liệu gán nhãn là sách giáo khoa của mô hình. Ba tình huống làm mô hình học sai: </w:t>
-      </w:r>
-      <w:r>
-        <w:rPr>
-          <w:rFonts w:ascii="Arial" w:cs="Arial" w:eastAsia="Arial" w:hAnsi="Arial"/>
-          <w:b/>
-          <w:bCs/>
-          <w:color w:val="24405C"/>
-          <w:sz w:val="22"/>
-          <w:szCs w:val="22"/>
-        </w:rPr>
-        <w:t xml:space="preserve">thiếu nhãn</w:t>
-      </w:r>
-      <w:r>
-        <w:rPr>
-          <w:rFonts w:ascii="Arial" w:cs="Arial" w:eastAsia="Arial" w:hAnsi="Arial"/>
-          <w:color w:val="1B1B1B"/>
-          <w:sz w:val="22"/>
-          <w:szCs w:val="22"/>
-        </w:rPr>
-        <w:t xml:space="preserve"> (có người mà không khoanh, mô hình học «trông thế này không phải người»), </w:t>
-      </w:r>
-      <w:r>
-        <w:rPr>
-          <w:rFonts w:ascii="Arial" w:cs="Arial" w:eastAsia="Arial" w:hAnsi="Arial"/>
-          <w:b/>
-          <w:bCs/>
-          <w:color w:val="24405C"/>
-          <w:sz w:val="22"/>
-          <w:szCs w:val="22"/>
-        </w:rPr>
-        <w:t xml:space="preserve">sai loại</w:t>
-      </w:r>
-      <w:r>
-        <w:rPr>
-          <w:rFonts w:ascii="Arial" w:cs="Arial" w:eastAsia="Arial" w:hAnsi="Arial"/>
-          <w:color w:val="1B1B1B"/>
-          <w:sz w:val="22"/>
-          <w:szCs w:val="22"/>
-        </w:rPr>
-        <w:t xml:space="preserve"> (xe máy thành xe đạp), </w:t>
-      </w:r>
-      <w:r>
-        <w:rPr>
-          <w:rFonts w:ascii="Arial" w:cs="Arial" w:eastAsia="Arial" w:hAnsi="Arial"/>
-          <w:b/>
-          <w:bCs/>
-          <w:color w:val="24405C"/>
-          <w:sz w:val="22"/>
-          <w:szCs w:val="22"/>
-        </w:rPr>
-        <w:t xml:space="preserve">mỗi người một kiểu</w:t>
-      </w:r>
-      <w:r>
-        <w:rPr>
-          <w:rFonts w:ascii="Arial" w:cs="Arial" w:eastAsia="Arial" w:hAnsi="Arial"/>
-          <w:color w:val="1B1B1B"/>
-          <w:sz w:val="22"/>
-          <w:szCs w:val="22"/>
-        </w:rPr>
-        <w:t xml:space="preserve"> (người khoanh chung người lái với xe máy, người khoanh riêng). Vì vậy gán nhãn chính thức luôn có bộ quy tắc, mọi người theo cùng một bộ, và có kiểm tra.</w:t>
-      </w:r>
-    </w:p>
-    <w:p>
-      <w:pPr>
-        <w:keepNext/>
-        <w:spacing w:after="70" w:before="190"/>
-      </w:pPr>
-      <w:r>
-        <w:rPr>
-          <w:rFonts w:ascii="Arial" w:cs="Arial" w:eastAsia="Arial" w:hAnsi="Arial"/>
-          <w:b/>
-          <w:bCs/>
-          <w:color w:val="24405C"/>
-          <w:sz w:val="19"/>
-          <w:szCs w:val="19"/>
-        </w:rPr>
-        <w:t xml:space="preserve">Bảng 3. nuScenes đã gán nhãn bao nhiêu</w:t>
-      </w:r>
-    </w:p>
-    <w:tbl>
-      <w:tblPr>
-        <w:tblW w:type="dxa" w:w="9360"/>
-        <w:tblBorders>
-          <w:top w:val="single" w:color="8A949C" w:sz="8"/>
-          <w:left w:val="none"/>
-          <w:bottom w:val="single" w:color="8A949C" w:sz="8"/>
-          <w:right w:val="none"/>
-          <w:insideH w:val="single" w:color="BFC7CE" w:sz="2"/>
-          <w:insideV w:val="none"/>
-        </w:tblBorders>
-      </w:tblPr>
-      <w:tblGrid>
-        <w:gridCol w:w="3000"/>
-        <w:gridCol w:w="6360"/>
-      </w:tblGrid>
-      <w:tr>
-        <w:trPr>
-          <w:cantSplit/>
-          <w:tblHeader/>
-        </w:trPr>
-        <w:tc>
-          <w:tcPr>
-            <w:tcW w:type="dxa" w:w="3000"/>
-            <w:shd w:fill="EDF0F3" w:color="auto" w:val="clear"/>
-            <w:tcMar>
-              <w:top w:type="dxa" w:w="60"/>
-              <w:left w:type="dxa" w:w="95"/>
-              <w:bottom w:type="dxa" w:w="60"/>
-              <w:right w:type="dxa" w:w="95"/>
-            </w:tcMar>
-            <w:vAlign w:val="center"/>
-          </w:tcPr>
-          <w:p>
-            <w:pPr>
-              <w:spacing w:after="0" w:line="265"/>
-            </w:pPr>
-            <w:r>
-              <w:rPr>
-                <w:rFonts w:ascii="Arial" w:cs="Arial" w:eastAsia="Arial" w:hAnsi="Arial"/>
-                <w:b/>
-                <w:bCs/>
-                <w:color w:val="1B1B1B"/>
-                <w:sz w:val="18"/>
-                <w:szCs w:val="18"/>
-              </w:rPr>
-              <w:t xml:space="preserve">Hạng mục</w:t>
-            </w:r>
-          </w:p>
-        </w:tc>
-        <w:tc>
-          <w:tcPr>
-            <w:tcW w:type="dxa" w:w="6360"/>
-            <w:shd w:fill="EDF0F3" w:color="auto" w:val="clear"/>
-            <w:tcMar>
-              <w:top w:type="dxa" w:w="60"/>
-              <w:left w:type="dxa" w:w="95"/>
-              <w:bottom w:type="dxa" w:w="60"/>
-              <w:right w:type="dxa" w:w="95"/>
-            </w:tcMar>
-            <w:vAlign w:val="center"/>
-          </w:tcPr>
-          <w:p>
-            <w:pPr>
-              <w:spacing w:after="0" w:line="265"/>
-            </w:pPr>
-            <w:r>
-              <w:rPr>
-                <w:rFonts w:ascii="Arial" w:cs="Arial" w:eastAsia="Arial" w:hAnsi="Arial"/>
-                <w:b/>
-                <w:bCs/>
-                <w:color w:val="1B1B1B"/>
-                <w:sz w:val="18"/>
-                <w:szCs w:val="18"/>
-              </w:rPr>
-              <w:t xml:space="preserve">Con số</w:t>
-            </w:r>
-          </w:p>
-        </w:tc>
-      </w:tr>
-      <w:tr>
-        <w:trPr>
-          <w:cantSplit/>
-          <w:tblHeader w:val="false"/>
-        </w:trPr>
-        <w:tc>
-          <w:tcPr>
-            <w:tcW w:type="dxa" w:w="3000"/>
-            <w:tcMar>
-              <w:top w:type="dxa" w:w="60"/>
-              <w:left w:type="dxa" w:w="95"/>
-              <w:bottom w:type="dxa" w:w="60"/>
-              <w:right w:type="dxa" w:w="95"/>
-            </w:tcMar>
-            <w:vAlign w:val="center"/>
-          </w:tcPr>
-          <w:p>
-            <w:pPr>
-              <w:spacing w:after="0" w:line="265"/>
-            </w:pPr>
-            <w:r>
-              <w:rPr>
-                <w:rFonts w:ascii="Arial" w:cs="Arial" w:eastAsia="Arial" w:hAnsi="Arial"/>
-                <w:b w:val="false"/>
-                <w:bCs w:val="false"/>
-                <w:color w:val="1B1B1B"/>
-                <w:sz w:val="18"/>
-                <w:szCs w:val="18"/>
-              </w:rPr>
-              <w:t xml:space="preserve">Khung hình chính</w:t>
-            </w:r>
-          </w:p>
-        </w:tc>
-        <w:tc>
-          <w:tcPr>
-            <w:tcW w:type="dxa" w:w="6360"/>
-            <w:tcMar>
-              <w:top w:type="dxa" w:w="60"/>
-              <w:left w:type="dxa" w:w="95"/>
-              <w:bottom w:type="dxa" w:w="60"/>
-              <w:right w:type="dxa" w:w="95"/>
-            </w:tcMar>
-            <w:vAlign w:val="center"/>
-          </w:tcPr>
-          <w:p>
-            <w:pPr>
-              <w:spacing w:after="0" w:line="265"/>
-            </w:pPr>
-            <w:r>
-              <w:rPr>
-                <w:rFonts w:ascii="Arial" w:cs="Arial" w:eastAsia="Arial" w:hAnsi="Arial"/>
-                <w:b w:val="false"/>
-                <w:bCs w:val="false"/>
-                <w:color w:val="1B1B1B"/>
-                <w:sz w:val="18"/>
-                <w:szCs w:val="18"/>
-              </w:rPr>
-              <w:t xml:space="preserve">40.000 (1000 cảnh × 20 giây, mỗi 0,5 giây một lần)</w:t>
-            </w:r>
-          </w:p>
-        </w:tc>
-      </w:tr>
-      <w:tr>
-        <w:trPr>
-          <w:cantSplit/>
-          <w:tblHeader w:val="false"/>
-        </w:trPr>
-        <w:tc>
-          <w:tcPr>
-            <w:tcW w:type="dxa" w:w="3000"/>
-            <w:tcMar>
-              <w:top w:type="dxa" w:w="60"/>
-              <w:left w:type="dxa" w:w="95"/>
-              <w:bottom w:type="dxa" w:w="60"/>
-              <w:right w:type="dxa" w:w="95"/>
-            </w:tcMar>
-            <w:vAlign w:val="center"/>
-          </w:tcPr>
-          <w:p>
-            <w:pPr>
-              <w:spacing w:after="0" w:line="265"/>
-            </w:pPr>
-            <w:r>
-              <w:rPr>
-                <w:rFonts w:ascii="Arial" w:cs="Arial" w:eastAsia="Arial" w:hAnsi="Arial"/>
-                <w:b w:val="false"/>
-                <w:bCs w:val="false"/>
-                <w:color w:val="1B1B1B"/>
-                <w:sz w:val="18"/>
-                <w:szCs w:val="18"/>
-              </w:rPr>
-              <w:t xml:space="preserve">Khung 3D</w:t>
-            </w:r>
-          </w:p>
-        </w:tc>
-        <w:tc>
-          <w:tcPr>
-            <w:tcW w:type="dxa" w:w="6360"/>
-            <w:tcMar>
-              <w:top w:type="dxa" w:w="60"/>
-              <w:left w:type="dxa" w:w="95"/>
-              <w:bottom w:type="dxa" w:w="60"/>
-              <w:right w:type="dxa" w:w="95"/>
-            </w:tcMar>
-            <w:vAlign w:val="center"/>
-          </w:tcPr>
-          <w:p>
-            <w:pPr>
-              <w:spacing w:after="0" w:line="265"/>
-            </w:pPr>
-            <w:r>
-              <w:rPr>
-                <w:rFonts w:ascii="Arial" w:cs="Arial" w:eastAsia="Arial" w:hAnsi="Arial"/>
-                <w:b w:val="false"/>
-                <w:bCs w:val="false"/>
-                <w:color w:val="1B1B1B"/>
-                <w:sz w:val="18"/>
-                <w:szCs w:val="18"/>
-              </w:rPr>
-              <w:t xml:space="preserve">1,4 triệu, người gán từng cái</w:t>
-            </w:r>
-          </w:p>
-        </w:tc>
-      </w:tr>
-      <w:tr>
-        <w:trPr>
-          <w:cantSplit/>
-          <w:tblHeader w:val="false"/>
-        </w:trPr>
-        <w:tc>
-          <w:tcPr>
-            <w:tcW w:type="dxa" w:w="3000"/>
-            <w:tcMar>
-              <w:top w:type="dxa" w:w="60"/>
-              <w:left w:type="dxa" w:w="95"/>
-              <w:bottom w:type="dxa" w:w="60"/>
-              <w:right w:type="dxa" w:w="95"/>
-            </w:tcMar>
-            <w:vAlign w:val="center"/>
-          </w:tcPr>
-          <w:p>
-            <w:pPr>
-              <w:spacing w:after="0" w:line="265"/>
-            </w:pPr>
-            <w:r>
-              <w:rPr>
-                <w:rFonts w:ascii="Arial" w:cs="Arial" w:eastAsia="Arial" w:hAnsi="Arial"/>
-                <w:b w:val="false"/>
-                <w:bCs w:val="false"/>
-                <w:color w:val="1B1B1B"/>
-                <w:sz w:val="18"/>
-                <w:szCs w:val="18"/>
-              </w:rPr>
-              <w:t xml:space="preserve">Loại</w:t>
-            </w:r>
-          </w:p>
-        </w:tc>
-        <w:tc>
-          <w:tcPr>
-            <w:tcW w:type="dxa" w:w="6360"/>
-            <w:tcMar>
-              <w:top w:type="dxa" w:w="60"/>
-              <w:left w:type="dxa" w:w="95"/>
-              <w:bottom w:type="dxa" w:w="60"/>
-              <w:right w:type="dxa" w:w="95"/>
-            </w:tcMar>
-            <w:vAlign w:val="center"/>
-          </w:tcPr>
-          <w:p>
-            <w:pPr>
-              <w:spacing w:after="0" w:line="265"/>
-            </w:pPr>
-            <w:r>
-              <w:rPr>
-                <w:rFonts w:ascii="Arial" w:cs="Arial" w:eastAsia="Arial" w:hAnsi="Arial"/>
-                <w:b w:val="false"/>
-                <w:bCs w:val="false"/>
-                <w:color w:val="1B1B1B"/>
-                <w:sz w:val="18"/>
-                <w:szCs w:val="18"/>
-              </w:rPr>
-              <w:t xml:space="preserve">23 loại (người lớn, trẻ em, ô tô, xe buýt, xe máy, cọc tiêu…)</w:t>
-            </w:r>
-          </w:p>
-        </w:tc>
-      </w:tr>
-      <w:tr>
-        <w:trPr>
-          <w:cantSplit/>
-          <w:tblHeader w:val="false"/>
-        </w:trPr>
-        <w:tc>
-          <w:tcPr>
-            <w:tcW w:type="dxa" w:w="3000"/>
-            <w:tcMar>
-              <w:top w:type="dxa" w:w="60"/>
-              <w:left w:type="dxa" w:w="95"/>
-              <w:bottom w:type="dxa" w:w="60"/>
-              <w:right w:type="dxa" w:w="95"/>
-            </w:tcMar>
-            <w:vAlign w:val="center"/>
-          </w:tcPr>
-          <w:p>
-            <w:pPr>
-              <w:spacing w:after="0" w:line="265"/>
-            </w:pPr>
-            <w:r>
-              <w:rPr>
-                <w:rFonts w:ascii="Arial" w:cs="Arial" w:eastAsia="Arial" w:hAnsi="Arial"/>
-                <w:b w:val="false"/>
-                <w:bCs w:val="false"/>
-                <w:color w:val="1B1B1B"/>
-                <w:sz w:val="18"/>
-                <w:szCs w:val="18"/>
-              </w:rPr>
-              <w:t xml:space="preserve">Bản mini: ô tô và xe máy</w:t>
-            </w:r>
-          </w:p>
-        </w:tc>
-        <w:tc>
-          <w:tcPr>
-            <w:tcW w:type="dxa" w:w="6360"/>
-            <w:tcMar>
-              <w:top w:type="dxa" w:w="60"/>
-              <w:left w:type="dxa" w:w="95"/>
-              <w:bottom w:type="dxa" w:w="60"/>
-              <w:right w:type="dxa" w:w="95"/>
-            </w:tcMar>
-            <w:vAlign w:val="center"/>
-          </w:tcPr>
-          <w:p>
-            <w:pPr>
-              <w:spacing w:after="0" w:line="265"/>
-            </w:pPr>
-            <w:r>
-              <w:rPr>
-                <w:rFonts w:ascii="Arial" w:cs="Arial" w:eastAsia="Arial" w:hAnsi="Arial"/>
-                <w:b w:val="false"/>
-                <w:bCs w:val="false"/>
-                <w:color w:val="1B1B1B"/>
-                <w:sz w:val="18"/>
-                <w:szCs w:val="18"/>
-              </w:rPr>
-              <w:t xml:space="preserve">7.619 khung và 471 khung: xe máy ít hơn 16 lần</w:t>
-            </w:r>
-          </w:p>
-        </w:tc>
-      </w:tr>
-    </w:tbl>
-    <w:p>
-      <w:pPr>
-        <w:spacing w:after="0"/>
-      </w:pPr>
-      <w:r>
-        <w:rPr>
-          <w:rFonts w:ascii="Arial" w:cs="Arial" w:eastAsia="Arial" w:hAnsi="Arial"/>
-          <w:color w:val="1B1B1B"/>
-          <w:sz w:val="22"/>
-          <w:szCs w:val="22"/>
-        </w:rPr>
-        <w:t xml:space="preserve"/>
-      </w:r>
-    </w:p>
-    <w:p>
-      <w:pPr>
-        <w:keepNext/>
-        <w:spacing w:after="60" w:before="60"/>
-        <w:jc w:val="center"/>
-      </w:pPr>
-      <w:r>
-        <w:drawing>
-          <wp:inline distT="0" distB="0" distL="0" distR="0">
-            <wp:extent cx="4572000" cy="2638425"/>
             <wp:effectExtent t="0" r="0" b="0" l="0"/>
             <wp:docPr id="1" name="" descr="" title=""/>
             <wp:cNvGraphicFramePr>
@@ -3947,7 +3506,7 @@
                   <pic:spPr bwMode="auto">
                     <a:xfrm>
                       <a:off x="0" y="0"/>
-                      <a:ext cx="4572000" cy="2638425"/>
+                      <a:ext cx="5715000" cy="1990725"/>
                     </a:xfrm>
                     <a:prstGeom prst="rect">
                       <a:avLst/>
@@ -3974,689 +3533,61 @@
           <w:sz w:val="19"/>
           <w:szCs w:val="19"/>
         </w:rPr>
-        <w:t xml:space="preserve">Số khung mỗi loại trong nuScenes mini (tuần 7). Đường Boston, Singapore ít xe máy nên sách này dạy rất ít về xe máy. Dữ liệu: nuScenes (Motional), CC BY-NC-SA 4.0</w:t>
+        <w:t xml:space="preserve">Khung phát hiện + điểm lidar (vàng). Lấy trung vị 1 m dày điểm nhất trong khung: người 8,9 m (chính thức 9,0 m), xe 21,4 m (22,0 m). Dữ liệu: nuScenes (Motional), CC BY-NC-SA 4.0</w:t>
       </w:r>
     </w:p>
     <w:p>
       <w:pPr>
-        <w:keepNext/>
-        <w:spacing w:after="70" w:before="190"/>
+        <w:widowControl/>
+        <w:spacing w:after="100" w:before="0" w:line="312"/>
+        <w:ind w:left="0" w:firstLine="0"/>
       </w:pPr>
+      <w:r>
+        <w:rPr>
+          <w:rFonts w:ascii="Arial" w:cs="Arial" w:eastAsia="Arial" w:hAnsi="Arial"/>
+          <w:color w:val="1B1B1B"/>
+          <w:sz w:val="22"/>
+          <w:szCs w:val="22"/>
+        </w:rPr>
+        <w:t xml:space="preserve">Camera nói «đây là người», lidar nói «bao xa» — cặp camera + lidar của tuần 7. Khung là hình chữ nhật, góc khung có cả điểm của mặt đường, nhà phía sau, nên phải chọn cụm điểm dày nhất. Xe tự lái cần </w:t>
+      </w:r>
       <w:r>
         <w:rPr>
           <w:rFonts w:ascii="Arial" w:cs="Arial" w:eastAsia="Arial" w:hAnsi="Arial"/>
           <w:b/>
           <w:bCs/>
           <w:color w:val="24405C"/>
-          <w:sz w:val="19"/>
-          <w:szCs w:val="19"/>
-        </w:rPr>
-        <w:t xml:space="preserve">Bảng 4. Quy tắc gán nhãn chính thức của nuScenes (trích, nguyên văn từ instructions_nuscenes.md)</w:t>
+          <w:sz w:val="22"/>
+          <w:szCs w:val="22"/>
+        </w:rPr>
+        <w:t xml:space="preserve">khung 3D</w:t>
+      </w:r>
+      <w:r>
+        <w:rPr>
+          <w:rFonts w:ascii="Arial" w:cs="Arial" w:eastAsia="Arial" w:hAnsi="Arial"/>
+          <w:color w:val="1B1B1B"/>
+          <w:sz w:val="22"/>
+          <w:szCs w:val="22"/>
+        </w:rPr>
+        <w:t xml:space="preserve">: ba số vị trí, ba số kích thước, thêm hướng — bảy con số (tuần 7).</w:t>
       </w:r>
     </w:p>
-    <w:tbl>
-      <w:tblPr>
-        <w:tblW w:type="dxa" w:w="9360"/>
-        <w:tblBorders>
-          <w:top w:val="single" w:color="8A949C" w:sz="8"/>
-          <w:left w:val="none"/>
-          <w:bottom w:val="single" w:color="8A949C" w:sz="8"/>
-          <w:right w:val="none"/>
-          <w:insideH w:val="single" w:color="BFC7CE" w:sz="2"/>
-          <w:insideV w:val="none"/>
-        </w:tblBorders>
-      </w:tblPr>
-      <w:tblGrid>
-        <w:gridCol w:w="2900"/>
-        <w:gridCol w:w="3600"/>
-        <w:gridCol w:w="2860"/>
-      </w:tblGrid>
-      <w:tr>
-        <w:trPr>
-          <w:cantSplit/>
-          <w:tblHeader/>
-        </w:trPr>
-        <w:tc>
-          <w:tcPr>
-            <w:tcW w:type="dxa" w:w="2900"/>
-            <w:shd w:fill="EDF0F3" w:color="auto" w:val="clear"/>
-            <w:tcMar>
-              <w:top w:type="dxa" w:w="60"/>
-              <w:left w:type="dxa" w:w="95"/>
-              <w:bottom w:type="dxa" w:w="60"/>
-              <w:right w:type="dxa" w:w="95"/>
-            </w:tcMar>
-            <w:vAlign w:val="center"/>
-          </w:tcPr>
-          <w:p>
-            <w:pPr>
-              <w:spacing w:after="0" w:line="265"/>
-            </w:pPr>
-            <w:r>
-              <w:rPr>
-                <w:rFonts w:ascii="Arial" w:cs="Arial" w:eastAsia="Arial" w:hAnsi="Arial"/>
-                <w:b/>
-                <w:bCs/>
-                <w:color w:val="1B1B1B"/>
-                <w:sz w:val="18"/>
-                <w:szCs w:val="18"/>
-              </w:rPr>
-              <w:t xml:space="preserve">Quy tắc</w:t>
-            </w:r>
-          </w:p>
-        </w:tc>
-        <w:tc>
-          <w:tcPr>
-            <w:tcW w:type="dxa" w:w="3600"/>
-            <w:shd w:fill="EDF0F3" w:color="auto" w:val="clear"/>
-            <w:tcMar>
-              <w:top w:type="dxa" w:w="60"/>
-              <w:left w:type="dxa" w:w="95"/>
-              <w:bottom w:type="dxa" w:w="60"/>
-              <w:right w:type="dxa" w:w="95"/>
-            </w:tcMar>
-            <w:vAlign w:val="center"/>
-          </w:tcPr>
-          <w:p>
-            <w:pPr>
-              <w:spacing w:after="0" w:line="265"/>
-            </w:pPr>
-            <w:r>
-              <w:rPr>
-                <w:rFonts w:ascii="Arial" w:cs="Arial" w:eastAsia="Arial" w:hAnsi="Arial"/>
-                <w:b/>
-                <w:bCs/>
-                <w:color w:val="1B1B1B"/>
-                <w:sz w:val="18"/>
-                <w:szCs w:val="18"/>
-              </w:rPr>
-              <w:t xml:space="preserve">Nguyên văn</w:t>
-            </w:r>
-          </w:p>
-        </w:tc>
-        <w:tc>
-          <w:tcPr>
-            <w:tcW w:type="dxa" w:w="2860"/>
-            <w:shd w:fill="EDF0F3" w:color="auto" w:val="clear"/>
-            <w:tcMar>
-              <w:top w:type="dxa" w:w="60"/>
-              <w:left w:type="dxa" w:w="95"/>
-              <w:bottom w:type="dxa" w:w="60"/>
-              <w:right w:type="dxa" w:w="95"/>
-            </w:tcMar>
-            <w:vAlign w:val="center"/>
-          </w:tcPr>
-          <w:p>
-            <w:pPr>
-              <w:spacing w:after="0" w:line="265"/>
-            </w:pPr>
-            <w:r>
-              <w:rPr>
-                <w:rFonts w:ascii="Arial" w:cs="Arial" w:eastAsia="Arial" w:hAnsi="Arial"/>
-                <w:b/>
-                <w:bCs/>
-                <w:color w:val="1B1B1B"/>
-                <w:sz w:val="18"/>
-                <w:szCs w:val="18"/>
-              </w:rPr>
-              <w:t xml:space="preserve">Vì sao</w:t>
-            </w:r>
-          </w:p>
-        </w:tc>
-      </w:tr>
-      <w:tr>
-        <w:trPr>
-          <w:cantSplit/>
-          <w:tblHeader w:val="false"/>
-        </w:trPr>
-        <w:tc>
-          <w:tcPr>
-            <w:tcW w:type="dxa" w:w="2900"/>
-            <w:tcMar>
-              <w:top w:type="dxa" w:w="60"/>
-              <w:left w:type="dxa" w:w="95"/>
-              <w:bottom w:type="dxa" w:w="60"/>
-              <w:right w:type="dxa" w:w="95"/>
-            </w:tcMar>
-            <w:vAlign w:val="center"/>
-          </w:tcPr>
-          <w:p>
-            <w:pPr>
-              <w:spacing w:after="0" w:line="265"/>
-            </w:pPr>
-            <w:r>
-              <w:rPr>
-                <w:rFonts w:ascii="Arial" w:cs="Arial" w:eastAsia="Arial" w:hAnsi="Arial"/>
-                <w:b w:val="false"/>
-                <w:bCs w:val="false"/>
-                <w:color w:val="1B1B1B"/>
-                <w:sz w:val="18"/>
-                <w:szCs w:val="18"/>
-              </w:rPr>
-              <w:t xml:space="preserve">Có ≥ 1 điểm lidar/radar là phải gán</w:t>
-            </w:r>
-          </w:p>
-        </w:tc>
-        <w:tc>
-          <w:tcPr>
-            <w:tcW w:type="dxa" w:w="3600"/>
-            <w:tcMar>
-              <w:top w:type="dxa" w:w="60"/>
-              <w:left w:type="dxa" w:w="95"/>
-              <w:bottom w:type="dxa" w:w="60"/>
-              <w:right w:type="dxa" w:w="95"/>
-            </w:tcMar>
-            <w:vAlign w:val="center"/>
-          </w:tcPr>
-          <w:p>
-            <w:pPr>
-              <w:spacing w:after="0" w:line="265"/>
-            </w:pPr>
-            <w:r>
-              <w:rPr>
-                <w:rFonts w:ascii="Arial" w:cs="Arial" w:eastAsia="Arial" w:hAnsi="Arial"/>
-                <w:b w:val="false"/>
-                <w:bCs w:val="false"/>
-                <w:color w:val="1B1B1B"/>
-                <w:sz w:val="18"/>
-                <w:szCs w:val="18"/>
-              </w:rPr>
-              <w:t xml:space="preserve">Label any target object containing at least 1 LIDAR or RADAR point</w:t>
-            </w:r>
-          </w:p>
-        </w:tc>
-        <w:tc>
-          <w:tcPr>
-            <w:tcW w:type="dxa" w:w="2860"/>
-            <w:tcMar>
-              <w:top w:type="dxa" w:w="60"/>
-              <w:left w:type="dxa" w:w="95"/>
-              <w:bottom w:type="dxa" w:w="60"/>
-              <w:right w:type="dxa" w:w="95"/>
-            </w:tcMar>
-            <w:vAlign w:val="center"/>
-          </w:tcPr>
-          <w:p>
-            <w:pPr>
-              <w:spacing w:after="0" w:line="265"/>
-            </w:pPr>
-            <w:r>
-              <w:rPr>
-                <w:rFonts w:ascii="Arial" w:cs="Arial" w:eastAsia="Arial" w:hAnsi="Arial"/>
-                <w:b w:val="false"/>
-                <w:bCs w:val="false"/>
-                <w:color w:val="1B1B1B"/>
-                <w:sz w:val="18"/>
-                <w:szCs w:val="18"/>
-              </w:rPr>
-              <w:t xml:space="preserve">Cảm biến thấy thì mô hình phải học</w:t>
-            </w:r>
-          </w:p>
-        </w:tc>
-      </w:tr>
-      <w:tr>
-        <w:trPr>
-          <w:cantSplit/>
-          <w:tblHeader w:val="false"/>
-        </w:trPr>
-        <w:tc>
-          <w:tcPr>
-            <w:tcW w:type="dxa" w:w="2900"/>
-            <w:tcMar>
-              <w:top w:type="dxa" w:w="60"/>
-              <w:left w:type="dxa" w:w="95"/>
-              <w:bottom w:type="dxa" w:w="60"/>
-              <w:right w:type="dxa" w:w="95"/>
-            </w:tcMar>
-            <w:vAlign w:val="center"/>
-          </w:tcPr>
-          <w:p>
-            <w:pPr>
-              <w:spacing w:after="0" w:line="265"/>
-            </w:pPr>
-            <w:r>
-              <w:rPr>
-                <w:rFonts w:ascii="Arial" w:cs="Arial" w:eastAsia="Arial" w:hAnsi="Arial"/>
-                <w:b w:val="false"/>
-                <w:bCs w:val="false"/>
-                <w:color w:val="1B1B1B"/>
-                <w:sz w:val="18"/>
-                <w:szCs w:val="18"/>
-              </w:rPr>
-              <w:t xml:space="preserve">Khung rất sát</w:t>
-            </w:r>
-          </w:p>
-        </w:tc>
-        <w:tc>
-          <w:tcPr>
-            <w:tcW w:type="dxa" w:w="3600"/>
-            <w:tcMar>
-              <w:top w:type="dxa" w:w="60"/>
-              <w:left w:type="dxa" w:w="95"/>
-              <w:bottom w:type="dxa" w:w="60"/>
-              <w:right w:type="dxa" w:w="95"/>
-            </w:tcMar>
-            <w:vAlign w:val="center"/>
-          </w:tcPr>
-          <w:p>
-            <w:pPr>
-              <w:spacing w:after="0" w:line="265"/>
-            </w:pPr>
-            <w:r>
-              <w:rPr>
-                <w:rFonts w:ascii="Arial" w:cs="Arial" w:eastAsia="Arial" w:hAnsi="Arial"/>
-                <w:b w:val="false"/>
-                <w:bCs w:val="false"/>
-                <w:color w:val="1B1B1B"/>
-                <w:sz w:val="18"/>
-                <w:szCs w:val="18"/>
-              </w:rPr>
-              <w:t xml:space="preserve">Cuboids must be very tight.</w:t>
-            </w:r>
-          </w:p>
-        </w:tc>
-        <w:tc>
-          <w:tcPr>
-            <w:tcW w:type="dxa" w:w="2860"/>
-            <w:tcMar>
-              <w:top w:type="dxa" w:w="60"/>
-              <w:left w:type="dxa" w:w="95"/>
-              <w:bottom w:type="dxa" w:w="60"/>
-              <w:right w:type="dxa" w:w="95"/>
-            </w:tcMar>
-            <w:vAlign w:val="center"/>
-          </w:tcPr>
-          <w:p>
-            <w:pPr>
-              <w:spacing w:after="0" w:line="265"/>
-            </w:pPr>
-            <w:r>
-              <w:rPr>
-                <w:rFonts w:ascii="Arial" w:cs="Arial" w:eastAsia="Arial" w:hAnsi="Arial"/>
-                <w:b w:val="false"/>
-                <w:bCs w:val="false"/>
-                <w:color w:val="1B1B1B"/>
-                <w:sz w:val="18"/>
-                <w:szCs w:val="18"/>
-              </w:rPr>
-              <w:t xml:space="preserve">Khung rộng thì sai vị trí, khoảng cách</w:t>
-            </w:r>
-          </w:p>
-        </w:tc>
-      </w:tr>
-      <w:tr>
-        <w:trPr>
-          <w:cantSplit/>
-          <w:tblHeader w:val="false"/>
-        </w:trPr>
-        <w:tc>
-          <w:tcPr>
-            <w:tcW w:type="dxa" w:w="2900"/>
-            <w:tcMar>
-              <w:top w:type="dxa" w:w="60"/>
-              <w:left w:type="dxa" w:w="95"/>
-              <w:bottom w:type="dxa" w:w="60"/>
-              <w:right w:type="dxa" w:w="95"/>
-            </w:tcMar>
-            <w:vAlign w:val="center"/>
-          </w:tcPr>
-          <w:p>
-            <w:pPr>
-              <w:spacing w:after="0" w:line="265"/>
-            </w:pPr>
-            <w:r>
-              <w:rPr>
-                <w:rFonts w:ascii="Arial" w:cs="Arial" w:eastAsia="Arial" w:hAnsi="Arial"/>
-                <w:b w:val="false"/>
-                <w:bCs w:val="false"/>
-                <w:color w:val="1B1B1B"/>
-                <w:sz w:val="18"/>
-                <w:szCs w:val="18"/>
-              </w:rPr>
-              <w:t xml:space="preserve">Gồm cả tay chân</w:t>
-            </w:r>
-          </w:p>
-        </w:tc>
-        <w:tc>
-          <w:tcPr>
-            <w:tcW w:type="dxa" w:w="3600"/>
-            <w:tcMar>
-              <w:top w:type="dxa" w:w="60"/>
-              <w:left w:type="dxa" w:w="95"/>
-              <w:bottom w:type="dxa" w:w="60"/>
-              <w:right w:type="dxa" w:w="95"/>
-            </w:tcMar>
-            <w:vAlign w:val="center"/>
-          </w:tcPr>
-          <w:p>
-            <w:pPr>
-              <w:spacing w:after="0" w:line="265"/>
-            </w:pPr>
-            <w:r>
-              <w:rPr>
-                <w:rFonts w:ascii="Arial" w:cs="Arial" w:eastAsia="Arial" w:hAnsi="Arial"/>
-                <w:b w:val="false"/>
-                <w:bCs w:val="false"/>
-                <w:color w:val="1B1B1B"/>
-                <w:sz w:val="18"/>
-                <w:szCs w:val="18"/>
-              </w:rPr>
-              <w:t xml:space="preserve">…should include the extremities.</w:t>
-            </w:r>
-          </w:p>
-        </w:tc>
-        <w:tc>
-          <w:tcPr>
-            <w:tcW w:type="dxa" w:w="2860"/>
-            <w:tcMar>
-              <w:top w:type="dxa" w:w="60"/>
-              <w:left w:type="dxa" w:w="95"/>
-              <w:bottom w:type="dxa" w:w="60"/>
-              <w:right w:type="dxa" w:w="95"/>
-            </w:tcMar>
-            <w:vAlign w:val="center"/>
-          </w:tcPr>
-          <w:p>
-            <w:pPr>
-              <w:spacing w:after="0" w:line="265"/>
-            </w:pPr>
-            <w:r>
-              <w:rPr>
-                <w:rFonts w:ascii="Arial" w:cs="Arial" w:eastAsia="Arial" w:hAnsi="Arial"/>
-                <w:b w:val="false"/>
-                <w:bCs w:val="false"/>
-                <w:color w:val="1B1B1B"/>
-                <w:sz w:val="18"/>
-                <w:szCs w:val="18"/>
-              </w:rPr>
-              <w:t xml:space="preserve">Tay giơ ra cũng có thể bị đụng</w:t>
-            </w:r>
-          </w:p>
-        </w:tc>
-      </w:tr>
-      <w:tr>
-        <w:trPr>
-          <w:cantSplit/>
-          <w:tblHeader w:val="false"/>
-        </w:trPr>
-        <w:tc>
-          <w:tcPr>
-            <w:tcW w:type="dxa" w:w="2900"/>
-            <w:tcMar>
-              <w:top w:type="dxa" w:w="60"/>
-              <w:left w:type="dxa" w:w="95"/>
-              <w:bottom w:type="dxa" w:w="60"/>
-              <w:right w:type="dxa" w:w="95"/>
-            </w:tcMar>
-            <w:vAlign w:val="center"/>
-          </w:tcPr>
-          <w:p>
-            <w:pPr>
-              <w:spacing w:after="0" w:line="265"/>
-            </w:pPr>
-            <w:r>
-              <w:rPr>
-                <w:rFonts w:ascii="Arial" w:cs="Arial" w:eastAsia="Arial" w:hAnsi="Arial"/>
-                <w:b w:val="false"/>
-                <w:bCs w:val="false"/>
-                <w:color w:val="1B1B1B"/>
-                <w:sz w:val="18"/>
-                <w:szCs w:val="18"/>
-              </w:rPr>
-              <w:t xml:space="preserve">Có người lái: chung khung với xe</w:t>
-            </w:r>
-          </w:p>
-        </w:tc>
-        <w:tc>
-          <w:tcPr>
-            <w:tcW w:type="dxa" w:w="3600"/>
-            <w:tcMar>
-              <w:top w:type="dxa" w:w="60"/>
-              <w:left w:type="dxa" w:w="95"/>
-              <w:bottom w:type="dxa" w:w="60"/>
-              <w:right w:type="dxa" w:w="95"/>
-            </w:tcMar>
-            <w:vAlign w:val="center"/>
-          </w:tcPr>
-          <w:p>
-            <w:pPr>
-              <w:spacing w:after="0" w:line="265"/>
-            </w:pPr>
-            <w:r>
-              <w:rPr>
-                <w:rFonts w:ascii="Arial" w:cs="Arial" w:eastAsia="Arial" w:hAnsi="Arial"/>
-                <w:b w:val="false"/>
-                <w:bCs w:val="false"/>
-                <w:color w:val="1B1B1B"/>
-                <w:sz w:val="18"/>
-                <w:szCs w:val="18"/>
-              </w:rPr>
-              <w:t xml:space="preserve">If there is a rider, include the rider in the box.</w:t>
-            </w:r>
-          </w:p>
-        </w:tc>
-        <w:tc>
-          <w:tcPr>
-            <w:tcW w:type="dxa" w:w="2860"/>
-            <w:tcMar>
-              <w:top w:type="dxa" w:w="60"/>
-              <w:left w:type="dxa" w:w="95"/>
-              <w:bottom w:type="dxa" w:w="60"/>
-              <w:right w:type="dxa" w:w="95"/>
-            </w:tcMar>
-            <w:vAlign w:val="center"/>
-          </w:tcPr>
-          <w:p>
-            <w:pPr>
-              <w:spacing w:after="0" w:line="265"/>
-            </w:pPr>
-            <w:r>
-              <w:rPr>
-                <w:rFonts w:ascii="Arial" w:cs="Arial" w:eastAsia="Arial" w:hAnsi="Arial"/>
-                <w:b w:val="false"/>
-                <w:bCs w:val="false"/>
-                <w:color w:val="1B1B1B"/>
-                <w:sz w:val="18"/>
-                <w:szCs w:val="18"/>
-              </w:rPr>
-              <w:t xml:space="preserve">Người và xe đi cùng nhau</w:t>
-            </w:r>
-          </w:p>
-        </w:tc>
-      </w:tr>
-      <w:tr>
-        <w:trPr>
-          <w:cantSplit/>
-          <w:tblHeader w:val="false"/>
-        </w:trPr>
-        <w:tc>
-          <w:tcPr>
-            <w:tcW w:type="dxa" w:w="2900"/>
-            <w:tcMar>
-              <w:top w:type="dxa" w:w="60"/>
-              <w:left w:type="dxa" w:w="95"/>
-              <w:bottom w:type="dxa" w:w="60"/>
-              <w:right w:type="dxa" w:w="95"/>
-            </w:tcMar>
-            <w:vAlign w:val="center"/>
-          </w:tcPr>
-          <w:p>
-            <w:pPr>
-              <w:spacing w:after="0" w:line="265"/>
-            </w:pPr>
-            <w:r>
-              <w:rPr>
-                <w:rFonts w:ascii="Arial" w:cs="Arial" w:eastAsia="Arial" w:hAnsi="Arial"/>
-                <w:b w:val="false"/>
-                <w:bCs w:val="false"/>
-                <w:color w:val="1B1B1B"/>
-                <w:sz w:val="18"/>
-                <w:szCs w:val="18"/>
-              </w:rPr>
-              <w:t xml:space="preserve">Người đứng cạnh: khoanh riêng</w:t>
-            </w:r>
-          </w:p>
-        </w:tc>
-        <w:tc>
-          <w:tcPr>
-            <w:tcW w:type="dxa" w:w="3600"/>
-            <w:tcMar>
-              <w:top w:type="dxa" w:w="60"/>
-              <w:left w:type="dxa" w:w="95"/>
-              <w:bottom w:type="dxa" w:w="60"/>
-              <w:right w:type="dxa" w:w="95"/>
-            </w:tcMar>
-            <w:vAlign w:val="center"/>
-          </w:tcPr>
-          <w:p>
-            <w:pPr>
-              <w:spacing w:after="0" w:line="265"/>
-            </w:pPr>
-            <w:r>
-              <w:rPr>
-                <w:rFonts w:ascii="Arial" w:cs="Arial" w:eastAsia="Arial" w:hAnsi="Arial"/>
-                <w:b w:val="false"/>
-                <w:bCs w:val="false"/>
-                <w:color w:val="1B1B1B"/>
-                <w:sz w:val="18"/>
-                <w:szCs w:val="18"/>
-              </w:rPr>
-              <w:t xml:space="preserve">…standing next to the motorcycle, do NOT include…</w:t>
-            </w:r>
-          </w:p>
-        </w:tc>
-        <w:tc>
-          <w:tcPr>
-            <w:tcW w:type="dxa" w:w="2860"/>
-            <w:tcMar>
-              <w:top w:type="dxa" w:w="60"/>
-              <w:left w:type="dxa" w:w="95"/>
-              <w:bottom w:type="dxa" w:w="60"/>
-              <w:right w:type="dxa" w:w="95"/>
-            </w:tcMar>
-            <w:vAlign w:val="center"/>
-          </w:tcPr>
-          <w:p>
-            <w:pPr>
-              <w:spacing w:after="0" w:line="265"/>
-            </w:pPr>
-            <w:r>
-              <w:rPr>
-                <w:rFonts w:ascii="Arial" w:cs="Arial" w:eastAsia="Arial" w:hAnsi="Arial"/>
-                <w:b w:val="false"/>
-                <w:bCs w:val="false"/>
-                <w:color w:val="1B1B1B"/>
-                <w:sz w:val="18"/>
-                <w:szCs w:val="18"/>
-              </w:rPr>
-              <w:t xml:space="preserve">Người đó có thể đi chỗ khác</w:t>
-            </w:r>
-          </w:p>
-        </w:tc>
-      </w:tr>
-      <w:tr>
-        <w:trPr>
-          <w:cantSplit/>
-          <w:tblHeader w:val="false"/>
-        </w:trPr>
-        <w:tc>
-          <w:tcPr>
-            <w:tcW w:type="dxa" w:w="2900"/>
-            <w:tcMar>
-              <w:top w:type="dxa" w:w="60"/>
-              <w:left w:type="dxa" w:w="95"/>
-              <w:bottom w:type="dxa" w:w="60"/>
-              <w:right w:type="dxa" w:w="95"/>
-            </w:tcMar>
-            <w:vAlign w:val="center"/>
-          </w:tcPr>
-          <w:p>
-            <w:pPr>
-              <w:spacing w:after="0" w:line="265"/>
-            </w:pPr>
-            <w:r>
-              <w:rPr>
-                <w:rFonts w:ascii="Arial" w:cs="Arial" w:eastAsia="Arial" w:hAnsi="Arial"/>
-                <w:b w:val="false"/>
-                <w:bCs w:val="false"/>
-                <w:color w:val="1B1B1B"/>
-                <w:sz w:val="18"/>
-                <w:szCs w:val="18"/>
-              </w:rPr>
-              <w:t xml:space="preserve">Độ thấy được 4 mức</w:t>
-            </w:r>
-          </w:p>
-        </w:tc>
-        <w:tc>
-          <w:tcPr>
-            <w:tcW w:type="dxa" w:w="3600"/>
-            <w:tcMar>
-              <w:top w:type="dxa" w:w="60"/>
-              <w:left w:type="dxa" w:w="95"/>
-              <w:bottom w:type="dxa" w:w="60"/>
-              <w:right w:type="dxa" w:w="95"/>
-            </w:tcMar>
-            <w:vAlign w:val="center"/>
-          </w:tcPr>
-          <w:p>
-            <w:pPr>
-              <w:spacing w:after="0" w:line="265"/>
-            </w:pPr>
-            <w:r>
-              <w:rPr>
-                <w:rFonts w:ascii="Arial" w:cs="Arial" w:eastAsia="Arial" w:hAnsi="Arial"/>
-                <w:b w:val="false"/>
-                <w:bCs w:val="false"/>
-                <w:color w:val="1B1B1B"/>
-                <w:sz w:val="18"/>
-                <w:szCs w:val="18"/>
-              </w:rPr>
-              <w:t xml:space="preserve">0–40%, 41–60%, 61–80%, 81–100%</w:t>
-            </w:r>
-          </w:p>
-        </w:tc>
-        <w:tc>
-          <w:tcPr>
-            <w:tcW w:type="dxa" w:w="2860"/>
-            <w:tcMar>
-              <w:top w:type="dxa" w:w="60"/>
-              <w:left w:type="dxa" w:w="95"/>
-              <w:bottom w:type="dxa" w:w="60"/>
-              <w:right w:type="dxa" w:w="95"/>
-            </w:tcMar>
-            <w:vAlign w:val="center"/>
-          </w:tcPr>
-          <w:p>
-            <w:pPr>
-              <w:spacing w:after="0" w:line="265"/>
-            </w:pPr>
-            <w:r>
-              <w:rPr>
-                <w:rFonts w:ascii="Arial" w:cs="Arial" w:eastAsia="Arial" w:hAnsi="Arial"/>
-                <w:b w:val="false"/>
-                <w:bCs w:val="false"/>
-                <w:color w:val="1B1B1B"/>
-                <w:sz w:val="18"/>
-                <w:szCs w:val="18"/>
-              </w:rPr>
-              <w:t xml:space="preserve">Biết vật nào bị che nhiều</w:t>
-            </w:r>
-          </w:p>
-        </w:tc>
-      </w:tr>
-    </w:tbl>
     <w:p>
       <w:pPr>
-        <w:spacing w:after="0"/>
+        <w:pStyle w:val="Heading2"/>
+        <w:keepNext/>
+        <w:spacing w:after="130" w:before="300"/>
       </w:pPr>
       <w:r>
         <w:rPr>
           <w:rFonts w:ascii="Arial" w:cs="Arial" w:eastAsia="Arial" w:hAnsi="Arial"/>
-          <w:color w:val="1B1B1B"/>
-          <w:sz w:val="22"/>
-          <w:szCs w:val="22"/>
-        </w:rPr>
-        <w:t xml:space="preserve"/>
+          <w:b/>
+          <w:bCs/>
+          <w:color w:val="24405C"/>
+          <w:sz w:val="24"/>
+          <w:szCs w:val="24"/>
+        </w:rPr>
+        <w:t xml:space="preserve">Nhìn từ trên xuống: bản đồ từ trên và lưới chiếm chỗ</w:t>
       </w:r>
     </w:p>
     <w:p>
@@ -4668,7 +3599,7 @@
       <w:r>
         <w:drawing>
           <wp:inline distT="0" distB="0" distL="0" distR="0">
-            <wp:extent cx="5334000" cy="1990725"/>
+            <wp:extent cx="5905500" cy="3333750"/>
             <wp:effectExtent t="0" r="0" b="0" l="0"/>
             <wp:docPr id="1" name="" descr="" title=""/>
             <wp:cNvGraphicFramePr>
@@ -4693,7 +3624,7 @@
                   <pic:spPr bwMode="auto">
                     <a:xfrm>
                       <a:off x="0" y="0"/>
-                      <a:ext cx="5334000" cy="1990725"/>
+                      <a:ext cx="5905500" cy="3333750"/>
                     </a:xfrm>
                     <a:prstGeom prst="rect">
                       <a:avLst/>
@@ -4720,7 +3651,226 @@
           <w:sz w:val="19"/>
           <w:szCs w:val="19"/>
         </w:rPr>
-        <w:t xml:space="preserve">Người lái nằm trong khung của xe: trái xe đạp scene-0103, phải xe máy scene-1100 (khung chính thức). Dữ liệu: nuScenes (Motional), CC BY-NC-SA 4.0</w:t>
+        <w:t xml:space="preserve">Trái: bản đồ từ trên, điểm lidar + khung 3D; phải: lưới chiếm chỗ tính từ cùng khung lidar (ô 0,5 m). scene-0103 (Boston). Dữ liệu: nuScenes (Motional), CC BY-NC-SA 4.0</w:t>
+      </w:r>
+    </w:p>
+    <w:p>
+      <w:pPr>
+        <w:pStyle w:val="ListParagraph"/>
+        <w:widowControl/>
+        <w:numPr>
+          <w:ilvl w:val="0"/>
+          <w:numId w:val="3"/>
+        </w:numPr>
+        <w:spacing w:after="80" w:line="320"/>
+      </w:pPr>
+      <w:r>
+        <w:rPr>
+          <w:rFonts w:ascii="Arial" w:cs="Arial" w:eastAsia="Arial" w:hAnsi="Arial"/>
+          <w:color w:val="1B1B1B"/>
+          <w:sz w:val="22"/>
+          <w:szCs w:val="22"/>
+        </w:rPr>
+        <w:t xml:space="preserve">Ba cái lợi của bản đồ từ trên: các vật </w:t>
+      </w:r>
+      <w:r>
+        <w:rPr>
+          <w:rFonts w:ascii="Arial" w:cs="Arial" w:eastAsia="Arial" w:hAnsi="Arial"/>
+          <w:b/>
+          <w:bCs/>
+          <w:color w:val="24405C"/>
+          <w:sz w:val="22"/>
+          <w:szCs w:val="22"/>
+        </w:rPr>
+        <w:t xml:space="preserve">không che nhau</w:t>
+      </w:r>
+      <w:r>
+        <w:rPr>
+          <w:rFonts w:ascii="Arial" w:cs="Arial" w:eastAsia="Arial" w:hAnsi="Arial"/>
+          <w:color w:val="1B1B1B"/>
+          <w:sz w:val="22"/>
+          <w:szCs w:val="22"/>
+        </w:rPr>
+        <w:t xml:space="preserve">; </w:t>
+      </w:r>
+      <w:r>
+        <w:rPr>
+          <w:rFonts w:ascii="Arial" w:cs="Arial" w:eastAsia="Arial" w:hAnsi="Arial"/>
+          <w:b/>
+          <w:bCs/>
+          <w:color w:val="24405C"/>
+          <w:sz w:val="22"/>
+          <w:szCs w:val="22"/>
+        </w:rPr>
+        <w:t xml:space="preserve">khoảng cách không méo</w:t>
+      </w:r>
+      <w:r>
+        <w:rPr>
+          <w:rFonts w:ascii="Arial" w:cs="Arial" w:eastAsia="Arial" w:hAnsi="Arial"/>
+          <w:color w:val="1B1B1B"/>
+          <w:sz w:val="22"/>
+          <w:szCs w:val="22"/>
+        </w:rPr>
+        <w:t xml:space="preserve">; lái xe vốn là quyết định </w:t>
+      </w:r>
+      <w:r>
+        <w:rPr>
+          <w:rFonts w:ascii="Arial" w:cs="Arial" w:eastAsia="Arial" w:hAnsi="Arial"/>
+          <w:b/>
+          <w:bCs/>
+          <w:color w:val="24405C"/>
+          <w:sz w:val="22"/>
+          <w:szCs w:val="22"/>
+        </w:rPr>
+        <w:t xml:space="preserve">trên mặt đất</w:t>
+      </w:r>
+      <w:r>
+        <w:rPr>
+          <w:rFonts w:ascii="Arial" w:cs="Arial" w:eastAsia="Arial" w:hAnsi="Arial"/>
+          <w:color w:val="1B1B1B"/>
+          <w:sz w:val="22"/>
+          <w:szCs w:val="22"/>
+        </w:rPr>
+        <w:t xml:space="preserve">. Ghép giữa ở tuần 7 là cùng vẽ thành một bản đồ từ trên.</w:t>
+      </w:r>
+    </w:p>
+    <w:p>
+      <w:pPr>
+        <w:pStyle w:val="ListParagraph"/>
+        <w:widowControl/>
+        <w:numPr>
+          <w:ilvl w:val="0"/>
+          <w:numId w:val="3"/>
+        </w:numPr>
+        <w:spacing w:after="80" w:line="320"/>
+      </w:pPr>
+      <w:r>
+        <w:rPr>
+          <w:rFonts w:ascii="Arial" w:cs="Arial" w:eastAsia="Arial" w:hAnsi="Arial"/>
+          <w:color w:val="1B1B1B"/>
+          <w:sz w:val="22"/>
+          <w:szCs w:val="22"/>
+        </w:rPr>
+        <w:t xml:space="preserve">Lưới chiếm chỗ: mỗi ô chỉ hỏi một việc. </w:t>
+      </w:r>
+      <w:r>
+        <w:rPr>
+          <w:rFonts w:ascii="Arial" w:cs="Arial" w:eastAsia="Arial" w:hAnsi="Arial"/>
+          <w:b/>
+          <w:bCs/>
+          <w:color w:val="24405C"/>
+          <w:sz w:val="22"/>
+          <w:szCs w:val="22"/>
+        </w:rPr>
+        <w:t xml:space="preserve">Đỏ = có vật</w:t>
+      </w:r>
+      <w:r>
+        <w:rPr>
+          <w:rFonts w:ascii="Arial" w:cs="Arial" w:eastAsia="Arial" w:hAnsi="Arial"/>
+          <w:color w:val="1B1B1B"/>
+          <w:sz w:val="22"/>
+          <w:szCs w:val="22"/>
+        </w:rPr>
+        <w:t xml:space="preserve">, </w:t>
+      </w:r>
+      <w:r>
+        <w:rPr>
+          <w:rFonts w:ascii="Arial" w:cs="Arial" w:eastAsia="Arial" w:hAnsi="Arial"/>
+          <w:b/>
+          <w:bCs/>
+          <w:color w:val="24405C"/>
+          <w:sz w:val="22"/>
+          <w:szCs w:val="22"/>
+        </w:rPr>
+        <w:t xml:space="preserve">trắng = trống</w:t>
+      </w:r>
+      <w:r>
+        <w:rPr>
+          <w:rFonts w:ascii="Arial" w:cs="Arial" w:eastAsia="Arial" w:hAnsi="Arial"/>
+          <w:color w:val="1B1B1B"/>
+          <w:sz w:val="22"/>
+          <w:szCs w:val="22"/>
+        </w:rPr>
+        <w:t xml:space="preserve"> (tia laser đi qua không chạm gì), </w:t>
+      </w:r>
+      <w:r>
+        <w:rPr>
+          <w:rFonts w:ascii="Arial" w:cs="Arial" w:eastAsia="Arial" w:hAnsi="Arial"/>
+          <w:b/>
+          <w:bCs/>
+          <w:color w:val="24405C"/>
+          <w:sz w:val="22"/>
+          <w:szCs w:val="22"/>
+        </w:rPr>
+        <w:t xml:space="preserve">xám = chưa biết</w:t>
+      </w:r>
+      <w:r>
+        <w:rPr>
+          <w:rFonts w:ascii="Arial" w:cs="Arial" w:eastAsia="Arial" w:hAnsi="Arial"/>
+          <w:color w:val="1B1B1B"/>
+          <w:sz w:val="22"/>
+          <w:szCs w:val="22"/>
+        </w:rPr>
+        <w:t xml:space="preserve"> (bị che, không bắn tới).</w:t>
+      </w:r>
+    </w:p>
+    <w:p>
+      <w:pPr>
+        <w:pStyle w:val="ListParagraph"/>
+        <w:widowControl/>
+        <w:numPr>
+          <w:ilvl w:val="0"/>
+          <w:numId w:val="3"/>
+        </w:numPr>
+        <w:spacing w:after="80" w:line="320"/>
+      </w:pPr>
+      <w:r>
+        <w:rPr>
+          <w:rFonts w:ascii="Arial" w:cs="Arial" w:eastAsia="Arial" w:hAnsi="Arial"/>
+          <w:color w:val="1B1B1B"/>
+          <w:sz w:val="22"/>
+          <w:szCs w:val="22"/>
+        </w:rPr>
+        <w:t xml:space="preserve">Lợi lớn nhất: </w:t>
+      </w:r>
+      <w:r>
+        <w:rPr>
+          <w:rFonts w:ascii="Arial" w:cs="Arial" w:eastAsia="Arial" w:hAnsi="Arial"/>
+          <w:b/>
+          <w:bCs/>
+          <w:color w:val="24405C"/>
+          <w:sz w:val="22"/>
+          <w:szCs w:val="22"/>
+        </w:rPr>
+        <w:t xml:space="preserve">không cần biết là gì</w:t>
+      </w:r>
+      <w:r>
+        <w:rPr>
+          <w:rFonts w:ascii="Arial" w:cs="Arial" w:eastAsia="Arial" w:hAnsi="Arial"/>
+          <w:color w:val="1B1B1B"/>
+          <w:sz w:val="22"/>
+          <w:szCs w:val="22"/>
+        </w:rPr>
+        <w:t xml:space="preserve">. Hàng rơi trên đường, chướng ngại lạ, bộ phát hiện không nhận ra nhưng lưới vẫn tô đỏ. Cẩn thận: «chưa biết» không phải «trống».</w:t>
+      </w:r>
+    </w:p>
+    <w:p>
+      <w:pPr>
+        <w:pStyle w:val="Heading1"/>
+        <w:keepNext/>
+        <w:pageBreakBefore/>
+        <w:spacing w:after="240" w:before="160"/>
+      </w:pPr>
+      <w:r>
+        <w:rPr>
+          <w:rFonts w:ascii="Arial" w:cs="Arial" w:eastAsia="Arial" w:hAnsi="Arial"/>
+          <w:b/>
+          <w:bCs/>
+          <w:color w:val="24405C"/>
+          <w:sz w:val="30"/>
+          <w:szCs w:val="30"/>
+        </w:rPr>
+        <w:t xml:space="preserve">3. Gán nhãn dữ liệu: chuẩn bị đáp án cho máy tính</w:t>
       </w:r>
     </w:p>
     <w:p>
@@ -4736,7 +3886,7 @@
           <w:sz w:val="22"/>
           <w:szCs w:val="22"/>
         </w:rPr>
-        <w:t xml:space="preserve">Ở Hà Nội, một xe máy chở ba người, theo quy tắc nuScenes là </w:t>
+        <w:t xml:space="preserve">Dữ liệu gán nhãn là sách giáo khoa của mô hình. Ba tình huống làm mô hình học sai: </w:t>
       </w:r>
       <w:r>
         <w:rPr>
@@ -4747,7 +3897,7 @@
           <w:sz w:val="22"/>
           <w:szCs w:val="22"/>
         </w:rPr>
-        <w:t xml:space="preserve">một khung</w:t>
+        <w:t xml:space="preserve">thiếu nhãn</w:t>
       </w:r>
       <w:r>
         <w:rPr>
@@ -4756,7 +3906,7 @@
           <w:sz w:val="22"/>
           <w:szCs w:val="22"/>
         </w:rPr>
-        <w:t xml:space="preserve">, loại xe máy. Đổi sang quy tắc khoanh riêng từng người cũng được, quan trọng là </w:t>
+        <w:t xml:space="preserve"> (có người mà không khoanh, mô hình học «trông thế này không phải người»), </w:t>
       </w:r>
       <w:r>
         <w:rPr>
@@ -4767,7 +3917,7 @@
           <w:sz w:val="22"/>
           <w:szCs w:val="22"/>
         </w:rPr>
-        <w:t xml:space="preserve">cả bộ dữ liệu dùng cùng một quy tắc</w:t>
+        <w:t xml:space="preserve">sai loại</w:t>
       </w:r>
       <w:r>
         <w:rPr>
@@ -4776,14 +3926,33 @@
           <w:sz w:val="22"/>
           <w:szCs w:val="22"/>
         </w:rPr>
-        <w:t xml:space="preserve">.</w:t>
+        <w:t xml:space="preserve"> (xe máy thành xe đạp), </w:t>
+      </w:r>
+      <w:r>
+        <w:rPr>
+          <w:rFonts w:ascii="Arial" w:cs="Arial" w:eastAsia="Arial" w:hAnsi="Arial"/>
+          <w:b/>
+          <w:bCs/>
+          <w:color w:val="24405C"/>
+          <w:sz w:val="22"/>
+          <w:szCs w:val="22"/>
+        </w:rPr>
+        <w:t xml:space="preserve">mỗi người một kiểu</w:t>
+      </w:r>
+      <w:r>
+        <w:rPr>
+          <w:rFonts w:ascii="Arial" w:cs="Arial" w:eastAsia="Arial" w:hAnsi="Arial"/>
+          <w:color w:val="1B1B1B"/>
+          <w:sz w:val="22"/>
+          <w:szCs w:val="22"/>
+        </w:rPr>
+        <w:t xml:space="preserve"> (người khoanh chung người lái với xe máy, người khoanh riêng). Vì vậy gán nhãn chính thức luôn có bộ quy tắc, mọi người theo cùng một bộ, và có kiểm tra.</w:t>
       </w:r>
     </w:p>
     <w:p>
       <w:pPr>
-        <w:pStyle w:val="Heading2"/>
         <w:keepNext/>
-        <w:spacing w:after="130" w:before="300"/>
+        <w:spacing w:after="70" w:before="190"/>
       </w:pPr>
       <w:r>
         <w:rPr>
@@ -4791,10 +3960,353 @@
           <w:b/>
           <w:bCs/>
           <w:color w:val="24405C"/>
-          <w:sz w:val="24"/>
-          <w:szCs w:val="24"/>
-        </w:rPr>
-        <w:t xml:space="preserve">IoU: hai khung giống nhau bao nhiêu</w:t>
+          <w:sz w:val="19"/>
+          <w:szCs w:val="19"/>
+        </w:rPr>
+        <w:t xml:space="preserve">Bảng 3. nuScenes đã gán nhãn bao nhiêu</w:t>
+      </w:r>
+    </w:p>
+    <w:tbl>
+      <w:tblPr>
+        <w:tblW w:type="dxa" w:w="9360"/>
+        <w:tblBorders>
+          <w:top w:val="single" w:color="8A949C" w:sz="8"/>
+          <w:left w:val="none"/>
+          <w:bottom w:val="single" w:color="8A949C" w:sz="8"/>
+          <w:right w:val="none"/>
+          <w:insideH w:val="single" w:color="BFC7CE" w:sz="2"/>
+          <w:insideV w:val="none"/>
+        </w:tblBorders>
+      </w:tblPr>
+      <w:tblGrid>
+        <w:gridCol w:w="3000"/>
+        <w:gridCol w:w="6360"/>
+      </w:tblGrid>
+      <w:tr>
+        <w:trPr>
+          <w:cantSplit/>
+          <w:tblHeader/>
+        </w:trPr>
+        <w:tc>
+          <w:tcPr>
+            <w:tcW w:type="dxa" w:w="3000"/>
+            <w:shd w:fill="EDF0F3" w:color="auto" w:val="clear"/>
+            <w:tcMar>
+              <w:top w:type="dxa" w:w="60"/>
+              <w:left w:type="dxa" w:w="95"/>
+              <w:bottom w:type="dxa" w:w="60"/>
+              <w:right w:type="dxa" w:w="95"/>
+            </w:tcMar>
+            <w:vAlign w:val="center"/>
+          </w:tcPr>
+          <w:p>
+            <w:pPr>
+              <w:spacing w:after="0" w:line="265"/>
+            </w:pPr>
+            <w:r>
+              <w:rPr>
+                <w:rFonts w:ascii="Arial" w:cs="Arial" w:eastAsia="Arial" w:hAnsi="Arial"/>
+                <w:b/>
+                <w:bCs/>
+                <w:color w:val="1B1B1B"/>
+                <w:sz w:val="18"/>
+                <w:szCs w:val="18"/>
+              </w:rPr>
+              <w:t xml:space="preserve">Hạng mục</w:t>
+            </w:r>
+          </w:p>
+        </w:tc>
+        <w:tc>
+          <w:tcPr>
+            <w:tcW w:type="dxa" w:w="6360"/>
+            <w:shd w:fill="EDF0F3" w:color="auto" w:val="clear"/>
+            <w:tcMar>
+              <w:top w:type="dxa" w:w="60"/>
+              <w:left w:type="dxa" w:w="95"/>
+              <w:bottom w:type="dxa" w:w="60"/>
+              <w:right w:type="dxa" w:w="95"/>
+            </w:tcMar>
+            <w:vAlign w:val="center"/>
+          </w:tcPr>
+          <w:p>
+            <w:pPr>
+              <w:spacing w:after="0" w:line="265"/>
+            </w:pPr>
+            <w:r>
+              <w:rPr>
+                <w:rFonts w:ascii="Arial" w:cs="Arial" w:eastAsia="Arial" w:hAnsi="Arial"/>
+                <w:b/>
+                <w:bCs/>
+                <w:color w:val="1B1B1B"/>
+                <w:sz w:val="18"/>
+                <w:szCs w:val="18"/>
+              </w:rPr>
+              <w:t xml:space="preserve">Con số</w:t>
+            </w:r>
+          </w:p>
+        </w:tc>
+      </w:tr>
+      <w:tr>
+        <w:trPr>
+          <w:cantSplit/>
+          <w:tblHeader w:val="false"/>
+        </w:trPr>
+        <w:tc>
+          <w:tcPr>
+            <w:tcW w:type="dxa" w:w="3000"/>
+            <w:tcMar>
+              <w:top w:type="dxa" w:w="60"/>
+              <w:left w:type="dxa" w:w="95"/>
+              <w:bottom w:type="dxa" w:w="60"/>
+              <w:right w:type="dxa" w:w="95"/>
+            </w:tcMar>
+            <w:vAlign w:val="center"/>
+          </w:tcPr>
+          <w:p>
+            <w:pPr>
+              <w:spacing w:after="0" w:line="265"/>
+            </w:pPr>
+            <w:r>
+              <w:rPr>
+                <w:rFonts w:ascii="Arial" w:cs="Arial" w:eastAsia="Arial" w:hAnsi="Arial"/>
+                <w:b w:val="false"/>
+                <w:bCs w:val="false"/>
+                <w:color w:val="1B1B1B"/>
+                <w:sz w:val="18"/>
+                <w:szCs w:val="18"/>
+              </w:rPr>
+              <w:t xml:space="preserve">Khung hình chính</w:t>
+            </w:r>
+          </w:p>
+        </w:tc>
+        <w:tc>
+          <w:tcPr>
+            <w:tcW w:type="dxa" w:w="6360"/>
+            <w:tcMar>
+              <w:top w:type="dxa" w:w="60"/>
+              <w:left w:type="dxa" w:w="95"/>
+              <w:bottom w:type="dxa" w:w="60"/>
+              <w:right w:type="dxa" w:w="95"/>
+            </w:tcMar>
+            <w:vAlign w:val="center"/>
+          </w:tcPr>
+          <w:p>
+            <w:pPr>
+              <w:spacing w:after="0" w:line="265"/>
+            </w:pPr>
+            <w:r>
+              <w:rPr>
+                <w:rFonts w:ascii="Arial" w:cs="Arial" w:eastAsia="Arial" w:hAnsi="Arial"/>
+                <w:b w:val="false"/>
+                <w:bCs w:val="false"/>
+                <w:color w:val="1B1B1B"/>
+                <w:sz w:val="18"/>
+                <w:szCs w:val="18"/>
+              </w:rPr>
+              <w:t xml:space="preserve">40.000 (1000 cảnh × 20 giây, mỗi 0,5 giây một lần)</w:t>
+            </w:r>
+          </w:p>
+        </w:tc>
+      </w:tr>
+      <w:tr>
+        <w:trPr>
+          <w:cantSplit/>
+          <w:tblHeader w:val="false"/>
+        </w:trPr>
+        <w:tc>
+          <w:tcPr>
+            <w:tcW w:type="dxa" w:w="3000"/>
+            <w:tcMar>
+              <w:top w:type="dxa" w:w="60"/>
+              <w:left w:type="dxa" w:w="95"/>
+              <w:bottom w:type="dxa" w:w="60"/>
+              <w:right w:type="dxa" w:w="95"/>
+            </w:tcMar>
+            <w:vAlign w:val="center"/>
+          </w:tcPr>
+          <w:p>
+            <w:pPr>
+              <w:spacing w:after="0" w:line="265"/>
+            </w:pPr>
+            <w:r>
+              <w:rPr>
+                <w:rFonts w:ascii="Arial" w:cs="Arial" w:eastAsia="Arial" w:hAnsi="Arial"/>
+                <w:b w:val="false"/>
+                <w:bCs w:val="false"/>
+                <w:color w:val="1B1B1B"/>
+                <w:sz w:val="18"/>
+                <w:szCs w:val="18"/>
+              </w:rPr>
+              <w:t xml:space="preserve">Khung 3D</w:t>
+            </w:r>
+          </w:p>
+        </w:tc>
+        <w:tc>
+          <w:tcPr>
+            <w:tcW w:type="dxa" w:w="6360"/>
+            <w:tcMar>
+              <w:top w:type="dxa" w:w="60"/>
+              <w:left w:type="dxa" w:w="95"/>
+              <w:bottom w:type="dxa" w:w="60"/>
+              <w:right w:type="dxa" w:w="95"/>
+            </w:tcMar>
+            <w:vAlign w:val="center"/>
+          </w:tcPr>
+          <w:p>
+            <w:pPr>
+              <w:spacing w:after="0" w:line="265"/>
+            </w:pPr>
+            <w:r>
+              <w:rPr>
+                <w:rFonts w:ascii="Arial" w:cs="Arial" w:eastAsia="Arial" w:hAnsi="Arial"/>
+                <w:b w:val="false"/>
+                <w:bCs w:val="false"/>
+                <w:color w:val="1B1B1B"/>
+                <w:sz w:val="18"/>
+                <w:szCs w:val="18"/>
+              </w:rPr>
+              <w:t xml:space="preserve">1,4 triệu, người gán từng cái</w:t>
+            </w:r>
+          </w:p>
+        </w:tc>
+      </w:tr>
+      <w:tr>
+        <w:trPr>
+          <w:cantSplit/>
+          <w:tblHeader w:val="false"/>
+        </w:trPr>
+        <w:tc>
+          <w:tcPr>
+            <w:tcW w:type="dxa" w:w="3000"/>
+            <w:tcMar>
+              <w:top w:type="dxa" w:w="60"/>
+              <w:left w:type="dxa" w:w="95"/>
+              <w:bottom w:type="dxa" w:w="60"/>
+              <w:right w:type="dxa" w:w="95"/>
+            </w:tcMar>
+            <w:vAlign w:val="center"/>
+          </w:tcPr>
+          <w:p>
+            <w:pPr>
+              <w:spacing w:after="0" w:line="265"/>
+            </w:pPr>
+            <w:r>
+              <w:rPr>
+                <w:rFonts w:ascii="Arial" w:cs="Arial" w:eastAsia="Arial" w:hAnsi="Arial"/>
+                <w:b w:val="false"/>
+                <w:bCs w:val="false"/>
+                <w:color w:val="1B1B1B"/>
+                <w:sz w:val="18"/>
+                <w:szCs w:val="18"/>
+              </w:rPr>
+              <w:t xml:space="preserve">Loại</w:t>
+            </w:r>
+          </w:p>
+        </w:tc>
+        <w:tc>
+          <w:tcPr>
+            <w:tcW w:type="dxa" w:w="6360"/>
+            <w:tcMar>
+              <w:top w:type="dxa" w:w="60"/>
+              <w:left w:type="dxa" w:w="95"/>
+              <w:bottom w:type="dxa" w:w="60"/>
+              <w:right w:type="dxa" w:w="95"/>
+            </w:tcMar>
+            <w:vAlign w:val="center"/>
+          </w:tcPr>
+          <w:p>
+            <w:pPr>
+              <w:spacing w:after="0" w:line="265"/>
+            </w:pPr>
+            <w:r>
+              <w:rPr>
+                <w:rFonts w:ascii="Arial" w:cs="Arial" w:eastAsia="Arial" w:hAnsi="Arial"/>
+                <w:b w:val="false"/>
+                <w:bCs w:val="false"/>
+                <w:color w:val="1B1B1B"/>
+                <w:sz w:val="18"/>
+                <w:szCs w:val="18"/>
+              </w:rPr>
+              <w:t xml:space="preserve">23 loại (người lớn, trẻ em, ô tô, xe buýt, xe máy, cọc tiêu…)</w:t>
+            </w:r>
+          </w:p>
+        </w:tc>
+      </w:tr>
+      <w:tr>
+        <w:trPr>
+          <w:cantSplit/>
+          <w:tblHeader w:val="false"/>
+        </w:trPr>
+        <w:tc>
+          <w:tcPr>
+            <w:tcW w:type="dxa" w:w="3000"/>
+            <w:tcMar>
+              <w:top w:type="dxa" w:w="60"/>
+              <w:left w:type="dxa" w:w="95"/>
+              <w:bottom w:type="dxa" w:w="60"/>
+              <w:right w:type="dxa" w:w="95"/>
+            </w:tcMar>
+            <w:vAlign w:val="center"/>
+          </w:tcPr>
+          <w:p>
+            <w:pPr>
+              <w:spacing w:after="0" w:line="265"/>
+            </w:pPr>
+            <w:r>
+              <w:rPr>
+                <w:rFonts w:ascii="Arial" w:cs="Arial" w:eastAsia="Arial" w:hAnsi="Arial"/>
+                <w:b w:val="false"/>
+                <w:bCs w:val="false"/>
+                <w:color w:val="1B1B1B"/>
+                <w:sz w:val="18"/>
+                <w:szCs w:val="18"/>
+              </w:rPr>
+              <w:t xml:space="preserve">Bản mini: ô tô và xe máy</w:t>
+            </w:r>
+          </w:p>
+        </w:tc>
+        <w:tc>
+          <w:tcPr>
+            <w:tcW w:type="dxa" w:w="6360"/>
+            <w:tcMar>
+              <w:top w:type="dxa" w:w="60"/>
+              <w:left w:type="dxa" w:w="95"/>
+              <w:bottom w:type="dxa" w:w="60"/>
+              <w:right w:type="dxa" w:w="95"/>
+            </w:tcMar>
+            <w:vAlign w:val="center"/>
+          </w:tcPr>
+          <w:p>
+            <w:pPr>
+              <w:spacing w:after="0" w:line="265"/>
+            </w:pPr>
+            <w:r>
+              <w:rPr>
+                <w:rFonts w:ascii="Arial" w:cs="Arial" w:eastAsia="Arial" w:hAnsi="Arial"/>
+                <w:b w:val="false"/>
+                <w:bCs w:val="false"/>
+                <w:color w:val="1B1B1B"/>
+                <w:sz w:val="18"/>
+                <w:szCs w:val="18"/>
+              </w:rPr>
+              <w:t xml:space="preserve">7.619 khung và 471 khung: xe máy ít hơn 16 lần</w:t>
+            </w:r>
+          </w:p>
+        </w:tc>
+      </w:tr>
+    </w:tbl>
+    <w:p>
+      <w:pPr>
+        <w:spacing w:after="0"/>
+      </w:pPr>
+      <w:r>
+        <w:rPr>
+          <w:rFonts w:ascii="Arial" w:cs="Arial" w:eastAsia="Arial" w:hAnsi="Arial"/>
+          <w:color w:val="1B1B1B"/>
+          <w:sz w:val="22"/>
+          <w:szCs w:val="22"/>
+        </w:rPr>
+        <w:t xml:space="preserve"/>
       </w:r>
     </w:p>
     <w:p>
@@ -4806,7 +4318,7 @@
       <w:r>
         <w:drawing>
           <wp:inline distT="0" distB="0" distL="0" distR="0">
-            <wp:extent cx="5334000" cy="2038350"/>
+            <wp:extent cx="4572000" cy="2638425"/>
             <wp:effectExtent t="0" r="0" b="0" l="0"/>
             <wp:docPr id="1" name="" descr="" title=""/>
             <wp:cNvGraphicFramePr>
@@ -4831,6 +4343,890 @@
                   <pic:spPr bwMode="auto">
                     <a:xfrm>
                       <a:off x="0" y="0"/>
+                      <a:ext cx="4572000" cy="2638425"/>
+                    </a:xfrm>
+                    <a:prstGeom prst="rect">
+                      <a:avLst/>
+                    </a:prstGeom>
+                  </pic:spPr>
+                </pic:pic>
+              </a:graphicData>
+            </a:graphic>
+          </wp:inline>
+        </w:drawing>
+      </w:r>
+    </w:p>
+    <w:p>
+      <w:pPr>
+        <w:keepNext w:val="false"/>
+        <w:spacing w:after="70" w:before="190"/>
+      </w:pPr>
+      <w:r>
+        <w:rPr>
+          <w:rFonts w:ascii="Arial" w:cs="Arial" w:eastAsia="Arial" w:hAnsi="Arial"/>
+          <w:b/>
+          <w:bCs/>
+          <w:color w:val="24405C"/>
+          <w:sz w:val="19"/>
+          <w:szCs w:val="19"/>
+        </w:rPr>
+        <w:t xml:space="preserve">Số khung mỗi loại trong nuScenes mini (tuần 7). Đường Boston, Singapore ít xe máy nên sách này dạy rất ít về xe máy. Dữ liệu: nuScenes (Motional), CC BY-NC-SA 4.0</w:t>
+      </w:r>
+    </w:p>
+    <w:p>
+      <w:pPr>
+        <w:keepNext/>
+        <w:spacing w:after="70" w:before="190"/>
+      </w:pPr>
+      <w:r>
+        <w:rPr>
+          <w:rFonts w:ascii="Arial" w:cs="Arial" w:eastAsia="Arial" w:hAnsi="Arial"/>
+          <w:b/>
+          <w:bCs/>
+          <w:color w:val="24405C"/>
+          <w:sz w:val="19"/>
+          <w:szCs w:val="19"/>
+        </w:rPr>
+        <w:t xml:space="preserve">Bảng 4. Quy tắc gán nhãn chính thức của nuScenes (trích, nguyên văn từ instructions_nuscenes.md)</w:t>
+      </w:r>
+    </w:p>
+    <w:tbl>
+      <w:tblPr>
+        <w:tblW w:type="dxa" w:w="9360"/>
+        <w:tblBorders>
+          <w:top w:val="single" w:color="8A949C" w:sz="8"/>
+          <w:left w:val="none"/>
+          <w:bottom w:val="single" w:color="8A949C" w:sz="8"/>
+          <w:right w:val="none"/>
+          <w:insideH w:val="single" w:color="BFC7CE" w:sz="2"/>
+          <w:insideV w:val="none"/>
+        </w:tblBorders>
+      </w:tblPr>
+      <w:tblGrid>
+        <w:gridCol w:w="2900"/>
+        <w:gridCol w:w="3600"/>
+        <w:gridCol w:w="2860"/>
+      </w:tblGrid>
+      <w:tr>
+        <w:trPr>
+          <w:cantSplit/>
+          <w:tblHeader/>
+        </w:trPr>
+        <w:tc>
+          <w:tcPr>
+            <w:tcW w:type="dxa" w:w="2900"/>
+            <w:shd w:fill="EDF0F3" w:color="auto" w:val="clear"/>
+            <w:tcMar>
+              <w:top w:type="dxa" w:w="60"/>
+              <w:left w:type="dxa" w:w="95"/>
+              <w:bottom w:type="dxa" w:w="60"/>
+              <w:right w:type="dxa" w:w="95"/>
+            </w:tcMar>
+            <w:vAlign w:val="center"/>
+          </w:tcPr>
+          <w:p>
+            <w:pPr>
+              <w:spacing w:after="0" w:line="265"/>
+            </w:pPr>
+            <w:r>
+              <w:rPr>
+                <w:rFonts w:ascii="Arial" w:cs="Arial" w:eastAsia="Arial" w:hAnsi="Arial"/>
+                <w:b/>
+                <w:bCs/>
+                <w:color w:val="1B1B1B"/>
+                <w:sz w:val="18"/>
+                <w:szCs w:val="18"/>
+              </w:rPr>
+              <w:t xml:space="preserve">Quy tắc</w:t>
+            </w:r>
+          </w:p>
+        </w:tc>
+        <w:tc>
+          <w:tcPr>
+            <w:tcW w:type="dxa" w:w="3600"/>
+            <w:shd w:fill="EDF0F3" w:color="auto" w:val="clear"/>
+            <w:tcMar>
+              <w:top w:type="dxa" w:w="60"/>
+              <w:left w:type="dxa" w:w="95"/>
+              <w:bottom w:type="dxa" w:w="60"/>
+              <w:right w:type="dxa" w:w="95"/>
+            </w:tcMar>
+            <w:vAlign w:val="center"/>
+          </w:tcPr>
+          <w:p>
+            <w:pPr>
+              <w:spacing w:after="0" w:line="265"/>
+            </w:pPr>
+            <w:r>
+              <w:rPr>
+                <w:rFonts w:ascii="Arial" w:cs="Arial" w:eastAsia="Arial" w:hAnsi="Arial"/>
+                <w:b/>
+                <w:bCs/>
+                <w:color w:val="1B1B1B"/>
+                <w:sz w:val="18"/>
+                <w:szCs w:val="18"/>
+              </w:rPr>
+              <w:t xml:space="preserve">Nguyên văn</w:t>
+            </w:r>
+          </w:p>
+        </w:tc>
+        <w:tc>
+          <w:tcPr>
+            <w:tcW w:type="dxa" w:w="2860"/>
+            <w:shd w:fill="EDF0F3" w:color="auto" w:val="clear"/>
+            <w:tcMar>
+              <w:top w:type="dxa" w:w="60"/>
+              <w:left w:type="dxa" w:w="95"/>
+              <w:bottom w:type="dxa" w:w="60"/>
+              <w:right w:type="dxa" w:w="95"/>
+            </w:tcMar>
+            <w:vAlign w:val="center"/>
+          </w:tcPr>
+          <w:p>
+            <w:pPr>
+              <w:spacing w:after="0" w:line="265"/>
+            </w:pPr>
+            <w:r>
+              <w:rPr>
+                <w:rFonts w:ascii="Arial" w:cs="Arial" w:eastAsia="Arial" w:hAnsi="Arial"/>
+                <w:b/>
+                <w:bCs/>
+                <w:color w:val="1B1B1B"/>
+                <w:sz w:val="18"/>
+                <w:szCs w:val="18"/>
+              </w:rPr>
+              <w:t xml:space="preserve">Vì sao</w:t>
+            </w:r>
+          </w:p>
+        </w:tc>
+      </w:tr>
+      <w:tr>
+        <w:trPr>
+          <w:cantSplit/>
+          <w:tblHeader w:val="false"/>
+        </w:trPr>
+        <w:tc>
+          <w:tcPr>
+            <w:tcW w:type="dxa" w:w="2900"/>
+            <w:tcMar>
+              <w:top w:type="dxa" w:w="60"/>
+              <w:left w:type="dxa" w:w="95"/>
+              <w:bottom w:type="dxa" w:w="60"/>
+              <w:right w:type="dxa" w:w="95"/>
+            </w:tcMar>
+            <w:vAlign w:val="center"/>
+          </w:tcPr>
+          <w:p>
+            <w:pPr>
+              <w:spacing w:after="0" w:line="265"/>
+            </w:pPr>
+            <w:r>
+              <w:rPr>
+                <w:rFonts w:ascii="Arial" w:cs="Arial" w:eastAsia="Arial" w:hAnsi="Arial"/>
+                <w:b w:val="false"/>
+                <w:bCs w:val="false"/>
+                <w:color w:val="1B1B1B"/>
+                <w:sz w:val="18"/>
+                <w:szCs w:val="18"/>
+              </w:rPr>
+              <w:t xml:space="preserve">Có ≥ 1 điểm lidar/radar là phải gán</w:t>
+            </w:r>
+          </w:p>
+        </w:tc>
+        <w:tc>
+          <w:tcPr>
+            <w:tcW w:type="dxa" w:w="3600"/>
+            <w:tcMar>
+              <w:top w:type="dxa" w:w="60"/>
+              <w:left w:type="dxa" w:w="95"/>
+              <w:bottom w:type="dxa" w:w="60"/>
+              <w:right w:type="dxa" w:w="95"/>
+            </w:tcMar>
+            <w:vAlign w:val="center"/>
+          </w:tcPr>
+          <w:p>
+            <w:pPr>
+              <w:spacing w:after="0" w:line="265"/>
+            </w:pPr>
+            <w:r>
+              <w:rPr>
+                <w:rFonts w:ascii="Arial" w:cs="Arial" w:eastAsia="Arial" w:hAnsi="Arial"/>
+                <w:b w:val="false"/>
+                <w:bCs w:val="false"/>
+                <w:color w:val="1B1B1B"/>
+                <w:sz w:val="18"/>
+                <w:szCs w:val="18"/>
+              </w:rPr>
+              <w:t xml:space="preserve">Label any target object containing at least 1 LIDAR or RADAR point</w:t>
+            </w:r>
+          </w:p>
+        </w:tc>
+        <w:tc>
+          <w:tcPr>
+            <w:tcW w:type="dxa" w:w="2860"/>
+            <w:tcMar>
+              <w:top w:type="dxa" w:w="60"/>
+              <w:left w:type="dxa" w:w="95"/>
+              <w:bottom w:type="dxa" w:w="60"/>
+              <w:right w:type="dxa" w:w="95"/>
+            </w:tcMar>
+            <w:vAlign w:val="center"/>
+          </w:tcPr>
+          <w:p>
+            <w:pPr>
+              <w:spacing w:after="0" w:line="265"/>
+            </w:pPr>
+            <w:r>
+              <w:rPr>
+                <w:rFonts w:ascii="Arial" w:cs="Arial" w:eastAsia="Arial" w:hAnsi="Arial"/>
+                <w:b w:val="false"/>
+                <w:bCs w:val="false"/>
+                <w:color w:val="1B1B1B"/>
+                <w:sz w:val="18"/>
+                <w:szCs w:val="18"/>
+              </w:rPr>
+              <w:t xml:space="preserve">Cảm biến thấy thì mô hình phải học</w:t>
+            </w:r>
+          </w:p>
+        </w:tc>
+      </w:tr>
+      <w:tr>
+        <w:trPr>
+          <w:cantSplit/>
+          <w:tblHeader w:val="false"/>
+        </w:trPr>
+        <w:tc>
+          <w:tcPr>
+            <w:tcW w:type="dxa" w:w="2900"/>
+            <w:tcMar>
+              <w:top w:type="dxa" w:w="60"/>
+              <w:left w:type="dxa" w:w="95"/>
+              <w:bottom w:type="dxa" w:w="60"/>
+              <w:right w:type="dxa" w:w="95"/>
+            </w:tcMar>
+            <w:vAlign w:val="center"/>
+          </w:tcPr>
+          <w:p>
+            <w:pPr>
+              <w:spacing w:after="0" w:line="265"/>
+            </w:pPr>
+            <w:r>
+              <w:rPr>
+                <w:rFonts w:ascii="Arial" w:cs="Arial" w:eastAsia="Arial" w:hAnsi="Arial"/>
+                <w:b w:val="false"/>
+                <w:bCs w:val="false"/>
+                <w:color w:val="1B1B1B"/>
+                <w:sz w:val="18"/>
+                <w:szCs w:val="18"/>
+              </w:rPr>
+              <w:t xml:space="preserve">Khung rất sát</w:t>
+            </w:r>
+          </w:p>
+        </w:tc>
+        <w:tc>
+          <w:tcPr>
+            <w:tcW w:type="dxa" w:w="3600"/>
+            <w:tcMar>
+              <w:top w:type="dxa" w:w="60"/>
+              <w:left w:type="dxa" w:w="95"/>
+              <w:bottom w:type="dxa" w:w="60"/>
+              <w:right w:type="dxa" w:w="95"/>
+            </w:tcMar>
+            <w:vAlign w:val="center"/>
+          </w:tcPr>
+          <w:p>
+            <w:pPr>
+              <w:spacing w:after="0" w:line="265"/>
+            </w:pPr>
+            <w:r>
+              <w:rPr>
+                <w:rFonts w:ascii="Arial" w:cs="Arial" w:eastAsia="Arial" w:hAnsi="Arial"/>
+                <w:b w:val="false"/>
+                <w:bCs w:val="false"/>
+                <w:color w:val="1B1B1B"/>
+                <w:sz w:val="18"/>
+                <w:szCs w:val="18"/>
+              </w:rPr>
+              <w:t xml:space="preserve">Cuboids must be very tight.</w:t>
+            </w:r>
+          </w:p>
+        </w:tc>
+        <w:tc>
+          <w:tcPr>
+            <w:tcW w:type="dxa" w:w="2860"/>
+            <w:tcMar>
+              <w:top w:type="dxa" w:w="60"/>
+              <w:left w:type="dxa" w:w="95"/>
+              <w:bottom w:type="dxa" w:w="60"/>
+              <w:right w:type="dxa" w:w="95"/>
+            </w:tcMar>
+            <w:vAlign w:val="center"/>
+          </w:tcPr>
+          <w:p>
+            <w:pPr>
+              <w:spacing w:after="0" w:line="265"/>
+            </w:pPr>
+            <w:r>
+              <w:rPr>
+                <w:rFonts w:ascii="Arial" w:cs="Arial" w:eastAsia="Arial" w:hAnsi="Arial"/>
+                <w:b w:val="false"/>
+                <w:bCs w:val="false"/>
+                <w:color w:val="1B1B1B"/>
+                <w:sz w:val="18"/>
+                <w:szCs w:val="18"/>
+              </w:rPr>
+              <w:t xml:space="preserve">Khung rộng thì sai vị trí, khoảng cách</w:t>
+            </w:r>
+          </w:p>
+        </w:tc>
+      </w:tr>
+      <w:tr>
+        <w:trPr>
+          <w:cantSplit/>
+          <w:tblHeader w:val="false"/>
+        </w:trPr>
+        <w:tc>
+          <w:tcPr>
+            <w:tcW w:type="dxa" w:w="2900"/>
+            <w:tcMar>
+              <w:top w:type="dxa" w:w="60"/>
+              <w:left w:type="dxa" w:w="95"/>
+              <w:bottom w:type="dxa" w:w="60"/>
+              <w:right w:type="dxa" w:w="95"/>
+            </w:tcMar>
+            <w:vAlign w:val="center"/>
+          </w:tcPr>
+          <w:p>
+            <w:pPr>
+              <w:spacing w:after="0" w:line="265"/>
+            </w:pPr>
+            <w:r>
+              <w:rPr>
+                <w:rFonts w:ascii="Arial" w:cs="Arial" w:eastAsia="Arial" w:hAnsi="Arial"/>
+                <w:b w:val="false"/>
+                <w:bCs w:val="false"/>
+                <w:color w:val="1B1B1B"/>
+                <w:sz w:val="18"/>
+                <w:szCs w:val="18"/>
+              </w:rPr>
+              <w:t xml:space="preserve">Gồm cả tay chân</w:t>
+            </w:r>
+          </w:p>
+        </w:tc>
+        <w:tc>
+          <w:tcPr>
+            <w:tcW w:type="dxa" w:w="3600"/>
+            <w:tcMar>
+              <w:top w:type="dxa" w:w="60"/>
+              <w:left w:type="dxa" w:w="95"/>
+              <w:bottom w:type="dxa" w:w="60"/>
+              <w:right w:type="dxa" w:w="95"/>
+            </w:tcMar>
+            <w:vAlign w:val="center"/>
+          </w:tcPr>
+          <w:p>
+            <w:pPr>
+              <w:spacing w:after="0" w:line="265"/>
+            </w:pPr>
+            <w:r>
+              <w:rPr>
+                <w:rFonts w:ascii="Arial" w:cs="Arial" w:eastAsia="Arial" w:hAnsi="Arial"/>
+                <w:b w:val="false"/>
+                <w:bCs w:val="false"/>
+                <w:color w:val="1B1B1B"/>
+                <w:sz w:val="18"/>
+                <w:szCs w:val="18"/>
+              </w:rPr>
+              <w:t xml:space="preserve">…should include the extremities.</w:t>
+            </w:r>
+          </w:p>
+        </w:tc>
+        <w:tc>
+          <w:tcPr>
+            <w:tcW w:type="dxa" w:w="2860"/>
+            <w:tcMar>
+              <w:top w:type="dxa" w:w="60"/>
+              <w:left w:type="dxa" w:w="95"/>
+              <w:bottom w:type="dxa" w:w="60"/>
+              <w:right w:type="dxa" w:w="95"/>
+            </w:tcMar>
+            <w:vAlign w:val="center"/>
+          </w:tcPr>
+          <w:p>
+            <w:pPr>
+              <w:spacing w:after="0" w:line="265"/>
+            </w:pPr>
+            <w:r>
+              <w:rPr>
+                <w:rFonts w:ascii="Arial" w:cs="Arial" w:eastAsia="Arial" w:hAnsi="Arial"/>
+                <w:b w:val="false"/>
+                <w:bCs w:val="false"/>
+                <w:color w:val="1B1B1B"/>
+                <w:sz w:val="18"/>
+                <w:szCs w:val="18"/>
+              </w:rPr>
+              <w:t xml:space="preserve">Tay giơ ra cũng có thể bị đụng</w:t>
+            </w:r>
+          </w:p>
+        </w:tc>
+      </w:tr>
+      <w:tr>
+        <w:trPr>
+          <w:cantSplit/>
+          <w:tblHeader w:val="false"/>
+        </w:trPr>
+        <w:tc>
+          <w:tcPr>
+            <w:tcW w:type="dxa" w:w="2900"/>
+            <w:tcMar>
+              <w:top w:type="dxa" w:w="60"/>
+              <w:left w:type="dxa" w:w="95"/>
+              <w:bottom w:type="dxa" w:w="60"/>
+              <w:right w:type="dxa" w:w="95"/>
+            </w:tcMar>
+            <w:vAlign w:val="center"/>
+          </w:tcPr>
+          <w:p>
+            <w:pPr>
+              <w:spacing w:after="0" w:line="265"/>
+            </w:pPr>
+            <w:r>
+              <w:rPr>
+                <w:rFonts w:ascii="Arial" w:cs="Arial" w:eastAsia="Arial" w:hAnsi="Arial"/>
+                <w:b w:val="false"/>
+                <w:bCs w:val="false"/>
+                <w:color w:val="1B1B1B"/>
+                <w:sz w:val="18"/>
+                <w:szCs w:val="18"/>
+              </w:rPr>
+              <w:t xml:space="preserve">Có người lái: chung khung với xe</w:t>
+            </w:r>
+          </w:p>
+        </w:tc>
+        <w:tc>
+          <w:tcPr>
+            <w:tcW w:type="dxa" w:w="3600"/>
+            <w:tcMar>
+              <w:top w:type="dxa" w:w="60"/>
+              <w:left w:type="dxa" w:w="95"/>
+              <w:bottom w:type="dxa" w:w="60"/>
+              <w:right w:type="dxa" w:w="95"/>
+            </w:tcMar>
+            <w:vAlign w:val="center"/>
+          </w:tcPr>
+          <w:p>
+            <w:pPr>
+              <w:spacing w:after="0" w:line="265"/>
+            </w:pPr>
+            <w:r>
+              <w:rPr>
+                <w:rFonts w:ascii="Arial" w:cs="Arial" w:eastAsia="Arial" w:hAnsi="Arial"/>
+                <w:b w:val="false"/>
+                <w:bCs w:val="false"/>
+                <w:color w:val="1B1B1B"/>
+                <w:sz w:val="18"/>
+                <w:szCs w:val="18"/>
+              </w:rPr>
+              <w:t xml:space="preserve">If there is a rider, include the rider in the box.</w:t>
+            </w:r>
+          </w:p>
+        </w:tc>
+        <w:tc>
+          <w:tcPr>
+            <w:tcW w:type="dxa" w:w="2860"/>
+            <w:tcMar>
+              <w:top w:type="dxa" w:w="60"/>
+              <w:left w:type="dxa" w:w="95"/>
+              <w:bottom w:type="dxa" w:w="60"/>
+              <w:right w:type="dxa" w:w="95"/>
+            </w:tcMar>
+            <w:vAlign w:val="center"/>
+          </w:tcPr>
+          <w:p>
+            <w:pPr>
+              <w:spacing w:after="0" w:line="265"/>
+            </w:pPr>
+            <w:r>
+              <w:rPr>
+                <w:rFonts w:ascii="Arial" w:cs="Arial" w:eastAsia="Arial" w:hAnsi="Arial"/>
+                <w:b w:val="false"/>
+                <w:bCs w:val="false"/>
+                <w:color w:val="1B1B1B"/>
+                <w:sz w:val="18"/>
+                <w:szCs w:val="18"/>
+              </w:rPr>
+              <w:t xml:space="preserve">Người và xe đi cùng nhau</w:t>
+            </w:r>
+          </w:p>
+        </w:tc>
+      </w:tr>
+      <w:tr>
+        <w:trPr>
+          <w:cantSplit/>
+          <w:tblHeader w:val="false"/>
+        </w:trPr>
+        <w:tc>
+          <w:tcPr>
+            <w:tcW w:type="dxa" w:w="2900"/>
+            <w:tcMar>
+              <w:top w:type="dxa" w:w="60"/>
+              <w:left w:type="dxa" w:w="95"/>
+              <w:bottom w:type="dxa" w:w="60"/>
+              <w:right w:type="dxa" w:w="95"/>
+            </w:tcMar>
+            <w:vAlign w:val="center"/>
+          </w:tcPr>
+          <w:p>
+            <w:pPr>
+              <w:spacing w:after="0" w:line="265"/>
+            </w:pPr>
+            <w:r>
+              <w:rPr>
+                <w:rFonts w:ascii="Arial" w:cs="Arial" w:eastAsia="Arial" w:hAnsi="Arial"/>
+                <w:b w:val="false"/>
+                <w:bCs w:val="false"/>
+                <w:color w:val="1B1B1B"/>
+                <w:sz w:val="18"/>
+                <w:szCs w:val="18"/>
+              </w:rPr>
+              <w:t xml:space="preserve">Người đứng cạnh: khoanh riêng</w:t>
+            </w:r>
+          </w:p>
+        </w:tc>
+        <w:tc>
+          <w:tcPr>
+            <w:tcW w:type="dxa" w:w="3600"/>
+            <w:tcMar>
+              <w:top w:type="dxa" w:w="60"/>
+              <w:left w:type="dxa" w:w="95"/>
+              <w:bottom w:type="dxa" w:w="60"/>
+              <w:right w:type="dxa" w:w="95"/>
+            </w:tcMar>
+            <w:vAlign w:val="center"/>
+          </w:tcPr>
+          <w:p>
+            <w:pPr>
+              <w:spacing w:after="0" w:line="265"/>
+            </w:pPr>
+            <w:r>
+              <w:rPr>
+                <w:rFonts w:ascii="Arial" w:cs="Arial" w:eastAsia="Arial" w:hAnsi="Arial"/>
+                <w:b w:val="false"/>
+                <w:bCs w:val="false"/>
+                <w:color w:val="1B1B1B"/>
+                <w:sz w:val="18"/>
+                <w:szCs w:val="18"/>
+              </w:rPr>
+              <w:t xml:space="preserve">…standing next to the motorcycle, do NOT include…</w:t>
+            </w:r>
+          </w:p>
+        </w:tc>
+        <w:tc>
+          <w:tcPr>
+            <w:tcW w:type="dxa" w:w="2860"/>
+            <w:tcMar>
+              <w:top w:type="dxa" w:w="60"/>
+              <w:left w:type="dxa" w:w="95"/>
+              <w:bottom w:type="dxa" w:w="60"/>
+              <w:right w:type="dxa" w:w="95"/>
+            </w:tcMar>
+            <w:vAlign w:val="center"/>
+          </w:tcPr>
+          <w:p>
+            <w:pPr>
+              <w:spacing w:after="0" w:line="265"/>
+            </w:pPr>
+            <w:r>
+              <w:rPr>
+                <w:rFonts w:ascii="Arial" w:cs="Arial" w:eastAsia="Arial" w:hAnsi="Arial"/>
+                <w:b w:val="false"/>
+                <w:bCs w:val="false"/>
+                <w:color w:val="1B1B1B"/>
+                <w:sz w:val="18"/>
+                <w:szCs w:val="18"/>
+              </w:rPr>
+              <w:t xml:space="preserve">Người đó có thể đi chỗ khác</w:t>
+            </w:r>
+          </w:p>
+        </w:tc>
+      </w:tr>
+      <w:tr>
+        <w:trPr>
+          <w:cantSplit/>
+          <w:tblHeader w:val="false"/>
+        </w:trPr>
+        <w:tc>
+          <w:tcPr>
+            <w:tcW w:type="dxa" w:w="2900"/>
+            <w:tcMar>
+              <w:top w:type="dxa" w:w="60"/>
+              <w:left w:type="dxa" w:w="95"/>
+              <w:bottom w:type="dxa" w:w="60"/>
+              <w:right w:type="dxa" w:w="95"/>
+            </w:tcMar>
+            <w:vAlign w:val="center"/>
+          </w:tcPr>
+          <w:p>
+            <w:pPr>
+              <w:spacing w:after="0" w:line="265"/>
+            </w:pPr>
+            <w:r>
+              <w:rPr>
+                <w:rFonts w:ascii="Arial" w:cs="Arial" w:eastAsia="Arial" w:hAnsi="Arial"/>
+                <w:b w:val="false"/>
+                <w:bCs w:val="false"/>
+                <w:color w:val="1B1B1B"/>
+                <w:sz w:val="18"/>
+                <w:szCs w:val="18"/>
+              </w:rPr>
+              <w:t xml:space="preserve">Độ thấy được 4 mức</w:t>
+            </w:r>
+          </w:p>
+        </w:tc>
+        <w:tc>
+          <w:tcPr>
+            <w:tcW w:type="dxa" w:w="3600"/>
+            <w:tcMar>
+              <w:top w:type="dxa" w:w="60"/>
+              <w:left w:type="dxa" w:w="95"/>
+              <w:bottom w:type="dxa" w:w="60"/>
+              <w:right w:type="dxa" w:w="95"/>
+            </w:tcMar>
+            <w:vAlign w:val="center"/>
+          </w:tcPr>
+          <w:p>
+            <w:pPr>
+              <w:spacing w:after="0" w:line="265"/>
+            </w:pPr>
+            <w:r>
+              <w:rPr>
+                <w:rFonts w:ascii="Arial" w:cs="Arial" w:eastAsia="Arial" w:hAnsi="Arial"/>
+                <w:b w:val="false"/>
+                <w:bCs w:val="false"/>
+                <w:color w:val="1B1B1B"/>
+                <w:sz w:val="18"/>
+                <w:szCs w:val="18"/>
+              </w:rPr>
+              <w:t xml:space="preserve">0–40%, 41–60%, 61–80%, 81–100%</w:t>
+            </w:r>
+          </w:p>
+        </w:tc>
+        <w:tc>
+          <w:tcPr>
+            <w:tcW w:type="dxa" w:w="2860"/>
+            <w:tcMar>
+              <w:top w:type="dxa" w:w="60"/>
+              <w:left w:type="dxa" w:w="95"/>
+              <w:bottom w:type="dxa" w:w="60"/>
+              <w:right w:type="dxa" w:w="95"/>
+            </w:tcMar>
+            <w:vAlign w:val="center"/>
+          </w:tcPr>
+          <w:p>
+            <w:pPr>
+              <w:spacing w:after="0" w:line="265"/>
+            </w:pPr>
+            <w:r>
+              <w:rPr>
+                <w:rFonts w:ascii="Arial" w:cs="Arial" w:eastAsia="Arial" w:hAnsi="Arial"/>
+                <w:b w:val="false"/>
+                <w:bCs w:val="false"/>
+                <w:color w:val="1B1B1B"/>
+                <w:sz w:val="18"/>
+                <w:szCs w:val="18"/>
+              </w:rPr>
+              <w:t xml:space="preserve">Biết vật nào bị che nhiều</w:t>
+            </w:r>
+          </w:p>
+        </w:tc>
+      </w:tr>
+    </w:tbl>
+    <w:p>
+      <w:pPr>
+        <w:spacing w:after="0"/>
+      </w:pPr>
+      <w:r>
+        <w:rPr>
+          <w:rFonts w:ascii="Arial" w:cs="Arial" w:eastAsia="Arial" w:hAnsi="Arial"/>
+          <w:color w:val="1B1B1B"/>
+          <w:sz w:val="22"/>
+          <w:szCs w:val="22"/>
+        </w:rPr>
+        <w:t xml:space="preserve"/>
+      </w:r>
+    </w:p>
+    <w:p>
+      <w:pPr>
+        <w:keepNext/>
+        <w:spacing w:after="60" w:before="60"/>
+        <w:jc w:val="center"/>
+      </w:pPr>
+      <w:r>
+        <w:drawing>
+          <wp:inline distT="0" distB="0" distL="0" distR="0">
+            <wp:extent cx="5334000" cy="1990725"/>
+            <wp:effectExtent t="0" r="0" b="0" l="0"/>
+            <wp:docPr id="1" name="" descr="" title=""/>
+            <wp:cNvGraphicFramePr>
+              <a:graphicFrameLocks xmlns:a="http://schemas.openxmlformats.org/drawingml/2006/main" noChangeAspect="1"/>
+            </wp:cNvGraphicFramePr>
+            <a:graphic xmlns:a="http://schemas.openxmlformats.org/drawingml/2006/main">
+              <a:graphicData uri="http://schemas.openxmlformats.org/drawingml/2006/picture">
+                <pic:pic xmlns:pic="http://schemas.openxmlformats.org/drawingml/2006/picture">
+                  <pic:nvPicPr>
+                    <pic:cNvPr id="0" name="" descr=""/>
+                    <pic:cNvPicPr>
+                      <a:picLocks noChangeAspect="1" noChangeArrowheads="1"/>
+                    </pic:cNvPicPr>
+                  </pic:nvPicPr>
+                  <pic:blipFill>
+                    <a:blip r:embed="rId19" cstate="none"/>
+                    <a:srcRect/>
+                    <a:stretch>
+                      <a:fillRect/>
+                    </a:stretch>
+                  </pic:blipFill>
+                  <pic:spPr bwMode="auto">
+                    <a:xfrm>
+                      <a:off x="0" y="0"/>
+                      <a:ext cx="5334000" cy="1990725"/>
+                    </a:xfrm>
+                    <a:prstGeom prst="rect">
+                      <a:avLst/>
+                    </a:prstGeom>
+                  </pic:spPr>
+                </pic:pic>
+              </a:graphicData>
+            </a:graphic>
+          </wp:inline>
+        </w:drawing>
+      </w:r>
+    </w:p>
+    <w:p>
+      <w:pPr>
+        <w:keepNext w:val="false"/>
+        <w:spacing w:after="70" w:before="190"/>
+      </w:pPr>
+      <w:r>
+        <w:rPr>
+          <w:rFonts w:ascii="Arial" w:cs="Arial" w:eastAsia="Arial" w:hAnsi="Arial"/>
+          <w:b/>
+          <w:bCs/>
+          <w:color w:val="24405C"/>
+          <w:sz w:val="19"/>
+          <w:szCs w:val="19"/>
+        </w:rPr>
+        <w:t xml:space="preserve">Người lái nằm trong khung của xe: trái xe đạp scene-0103, phải xe máy scene-1100 (khung chính thức). Dữ liệu: nuScenes (Motional), CC BY-NC-SA 4.0</w:t>
+      </w:r>
+    </w:p>
+    <w:p>
+      <w:pPr>
+        <w:widowControl/>
+        <w:spacing w:after="100" w:before="0" w:line="312"/>
+        <w:ind w:left="0" w:firstLine="0"/>
+      </w:pPr>
+      <w:r>
+        <w:rPr>
+          <w:rFonts w:ascii="Arial" w:cs="Arial" w:eastAsia="Arial" w:hAnsi="Arial"/>
+          <w:color w:val="1B1B1B"/>
+          <w:sz w:val="22"/>
+          <w:szCs w:val="22"/>
+        </w:rPr>
+        <w:t xml:space="preserve">Ở Hà Nội, một xe máy chở ba người, theo quy tắc nuScenes là </w:t>
+      </w:r>
+      <w:r>
+        <w:rPr>
+          <w:rFonts w:ascii="Arial" w:cs="Arial" w:eastAsia="Arial" w:hAnsi="Arial"/>
+          <w:b/>
+          <w:bCs/>
+          <w:color w:val="24405C"/>
+          <w:sz w:val="22"/>
+          <w:szCs w:val="22"/>
+        </w:rPr>
+        <w:t xml:space="preserve">một khung</w:t>
+      </w:r>
+      <w:r>
+        <w:rPr>
+          <w:rFonts w:ascii="Arial" w:cs="Arial" w:eastAsia="Arial" w:hAnsi="Arial"/>
+          <w:color w:val="1B1B1B"/>
+          <w:sz w:val="22"/>
+          <w:szCs w:val="22"/>
+        </w:rPr>
+        <w:t xml:space="preserve">, loại xe máy. Đổi sang quy tắc khoanh riêng từng người cũng được, quan trọng là </w:t>
+      </w:r>
+      <w:r>
+        <w:rPr>
+          <w:rFonts w:ascii="Arial" w:cs="Arial" w:eastAsia="Arial" w:hAnsi="Arial"/>
+          <w:b/>
+          <w:bCs/>
+          <w:color w:val="24405C"/>
+          <w:sz w:val="22"/>
+          <w:szCs w:val="22"/>
+        </w:rPr>
+        <w:t xml:space="preserve">cả bộ dữ liệu dùng cùng một quy tắc</w:t>
+      </w:r>
+      <w:r>
+        <w:rPr>
+          <w:rFonts w:ascii="Arial" w:cs="Arial" w:eastAsia="Arial" w:hAnsi="Arial"/>
+          <w:color w:val="1B1B1B"/>
+          <w:sz w:val="22"/>
+          <w:szCs w:val="22"/>
+        </w:rPr>
+        <w:t xml:space="preserve">.</w:t>
+      </w:r>
+    </w:p>
+    <w:p>
+      <w:pPr>
+        <w:pStyle w:val="Heading2"/>
+        <w:keepNext/>
+        <w:spacing w:after="130" w:before="300"/>
+      </w:pPr>
+      <w:r>
+        <w:rPr>
+          <w:rFonts w:ascii="Arial" w:cs="Arial" w:eastAsia="Arial" w:hAnsi="Arial"/>
+          <w:b/>
+          <w:bCs/>
+          <w:color w:val="24405C"/>
+          <w:sz w:val="24"/>
+          <w:szCs w:val="24"/>
+        </w:rPr>
+        <w:t xml:space="preserve">IoU: hai khung giống nhau bao nhiêu</w:t>
+      </w:r>
+    </w:p>
+    <w:p>
+      <w:pPr>
+        <w:keepNext/>
+        <w:spacing w:after="60" w:before="60"/>
+        <w:jc w:val="center"/>
+      </w:pPr>
+      <w:r>
+        <w:drawing>
+          <wp:inline distT="0" distB="0" distL="0" distR="0">
+            <wp:extent cx="5334000" cy="2038350"/>
+            <wp:effectExtent t="0" r="0" b="0" l="0"/>
+            <wp:docPr id="1" name="" descr="" title=""/>
+            <wp:cNvGraphicFramePr>
+              <a:graphicFrameLocks xmlns:a="http://schemas.openxmlformats.org/drawingml/2006/main" noChangeAspect="1"/>
+            </wp:cNvGraphicFramePr>
+            <a:graphic xmlns:a="http://schemas.openxmlformats.org/drawingml/2006/main">
+              <a:graphicData uri="http://schemas.openxmlformats.org/drawingml/2006/picture">
+                <pic:pic xmlns:pic="http://schemas.openxmlformats.org/drawingml/2006/picture">
+                  <pic:nvPicPr>
+                    <pic:cNvPr id="0" name="" descr=""/>
+                    <pic:cNvPicPr>
+                      <a:picLocks noChangeAspect="1" noChangeArrowheads="1"/>
+                    </pic:cNvPicPr>
+                  </pic:nvPicPr>
+                  <pic:blipFill>
+                    <a:blip r:embed="rId20" cstate="none"/>
+                    <a:srcRect/>
+                    <a:stretch>
+                      <a:fillRect/>
+                    </a:stretch>
+                  </pic:blipFill>
+                  <pic:spPr bwMode="auto">
+                    <a:xfrm>
+                      <a:off x="0" y="0"/>
                       <a:ext cx="5334000" cy="2038350"/>
                     </a:xfrm>
                     <a:prstGeom prst="rect">
@@ -4957,7 +5353,7 @@
                     </pic:cNvPicPr>
                   </pic:nvPicPr>
                   <pic:blipFill>
-                    <a:blip r:embed="rId19" cstate="none"/>
+                    <a:blip r:embed="rId21" cstate="none"/>
                     <a:srcRect/>
                     <a:stretch>
                       <a:fillRect/>

</xml_diff>

<commit_message>
Week 8 L1: new slide on how demosaicing fills in the missing colors (neighbor averaging, worked example)
Co-Authored-By: Claude Opus 5.5 <noreply@anthropic.com>
</commit_message>
<xml_diff>
--- a/第八週(10-29)/Nguyên lý xe tự lái_Tuần 8_Tài liệu học tập.docx
+++ b/第八週(10-29)/Nguyên lý xe tự lái_Tuần 8_Tài liệu học tập.docx
@@ -926,24 +926,6 @@
     </w:p>
     <w:p>
       <w:pPr>
-        <w:pStyle w:val="Heading2"/>
-        <w:keepNext/>
-        <w:spacing w:after="130" w:before="300"/>
-      </w:pPr>
-      <w:r>
-        <w:rPr>
-          <w:rFonts w:ascii="Arial" w:cs="Arial" w:eastAsia="Arial" w:hAnsi="Arial"/>
-          <w:b/>
-          <w:bCs/>
-          <w:color w:val="24405C"/>
-          <w:sz w:val="24"/>
-          <w:szCs w:val="24"/>
-        </w:rPr>
-        <w:t xml:space="preserve">Màu và con số</w:t>
-      </w:r>
-    </w:p>
-    <w:p>
-      <w:pPr>
         <w:keepNext/>
         <w:spacing w:after="60" w:before="60"/>
         <w:jc w:val="center"/>
@@ -951,7 +933,7 @@
       <w:r>
         <w:drawing>
           <wp:inline distT="0" distB="0" distL="0" distR="0">
-            <wp:extent cx="5715000" cy="3219450"/>
+            <wp:extent cx="5715000" cy="2990850"/>
             <wp:effectExtent t="0" r="0" b="0" l="0"/>
             <wp:docPr id="1" name="" descr="" title=""/>
             <wp:cNvGraphicFramePr>
@@ -976,7 +958,7 @@
                   <pic:spPr bwMode="auto">
                     <a:xfrm>
                       <a:off x="0" y="0"/>
-                      <a:ext cx="5715000" cy="3219450"/>
+                      <a:ext cx="5715000" cy="2990850"/>
                     </a:xfrm>
                     <a:prstGeom prst="rect">
                       <a:avLst/>
@@ -1003,7 +985,7 @@
           <w:sz w:val="19"/>
           <w:szCs w:val="19"/>
         </w:rPr>
-        <w:t xml:space="preserve">Trên: ba con số của màu cơ bản; dưới: điểm thật trên ảnh (trung bình 5×5), scene-0553 ban ngày, scene-1100 ban đêm. Dữ liệu: nuScenes (Motional), CC BY-NC-SA 4.0</w:t>
+        <w:t xml:space="preserve">Bù màu thế nào (trung bình hàng xóm đơn giản nhất): màu thiếu = trung bình các ô cùng màu bên cạnh. Số của mỗi ô lấy từ JPEG, minh hoạ. Dữ liệu: nuScenes (Motional), CC BY-NC-SA 4.0</w:t>
       </w:r>
     </w:p>
     <w:p>
@@ -1019,7 +1001,7 @@
           <w:sz w:val="22"/>
           <w:szCs w:val="22"/>
         </w:rPr>
-        <w:t xml:space="preserve">Ba con số như ba đèn pin đỏ, xanh lá, xanh dương chiếu lên tường trắng: chỉ bật đỏ là đỏ (255, 0, 0), đỏ + xanh lá là vàng, cả ba sáng nhất là trắng (255, 255, 255), ba cái bằng nhau là xám (128, 128, 128), tắt hết là đen (0, 0, 0). Đọc số hỏi hai việc: </w:t>
+        <w:t xml:space="preserve">Cách bù đơn giản nhất là </w:t>
       </w:r>
       <w:r>
         <w:rPr>
@@ -1030,7 +1012,7 @@
           <w:sz w:val="22"/>
           <w:szCs w:val="22"/>
         </w:rPr>
-        <w:t xml:space="preserve">số lớn hay nhỏ</w:t>
+        <w:t xml:space="preserve">trung bình hàng xóm</w:t>
       </w:r>
       <w:r>
         <w:rPr>
@@ -1039,47 +1021,7 @@
           <w:sz w:val="22"/>
           <w:szCs w:val="22"/>
         </w:rPr>
-        <w:t xml:space="preserve"> (lớn là sáng), </w:t>
-      </w:r>
-      <w:r>
-        <w:rPr>
-          <w:rFonts w:ascii="Arial" w:cs="Arial" w:eastAsia="Arial" w:hAnsi="Arial"/>
-          <w:b/>
-          <w:bCs/>
-          <w:color w:val="24405C"/>
-          <w:sz w:val="22"/>
-          <w:szCs w:val="22"/>
-        </w:rPr>
-        <w:t xml:space="preserve">số nào lớn nhất</w:t>
-      </w:r>
-      <w:r>
-        <w:rPr>
-          <w:rFonts w:ascii="Arial" w:cs="Arial" w:eastAsia="Arial" w:hAnsi="Arial"/>
-          <w:color w:val="1B1B1B"/>
-          <w:sz w:val="22"/>
-          <w:szCs w:val="22"/>
-        </w:rPr>
-        <w:t xml:space="preserve"> (nghiêng về màu đó). Điểm thật trên ảnh: quần đỏ R 123, G 80, B 67, đỏ lớn nhất; vạch trắng chỉ khoảng 138 vì trời âm u, tự chỉnh phơi sáng làm cả ảnh tối đi; áo trong bóng râm chỉ khoảng 20, gần như đen; mặt đường ban đêm có màu xanh dương rất nhỏ, ngả vàng vì đèn đường ánh vàng; đèn đường gần 255. </w:t>
-      </w:r>
-      <w:r>
-        <w:rPr>
-          <w:rFonts w:ascii="Arial" w:cs="Arial" w:eastAsia="Arial" w:hAnsi="Arial"/>
-          <w:b/>
-          <w:bCs/>
-          <w:color w:val="24405C"/>
-          <w:sz w:val="22"/>
-          <w:szCs w:val="22"/>
-        </w:rPr>
-        <w:t xml:space="preserve">Cùng một vật, đổi ánh sáng là con số khác hẳn</w:t>
-      </w:r>
-      <w:r>
-        <w:rPr>
-          <w:rFonts w:ascii="Arial" w:cs="Arial" w:eastAsia="Arial" w:hAnsi="Arial"/>
-          <w:color w:val="1B1B1B"/>
-          <w:sz w:val="22"/>
-          <w:szCs w:val="22"/>
-        </w:rPr>
-        <w:t xml:space="preserve">, nên máy tính không thể tìm người bằng luật «từ bao nhiêu đến bao nhiêu là người».</w:t>
+        <w:t xml:space="preserve">: ô đỏ tự có R; G của nó là trung bình bốn ô xanh lá trên dưới trái phải, ví dụ (41 + 45 + 48 + 36) ÷ 4 = 42,5; B là trung bình bốn ô xanh dương ở góc chéo. Ô xanh lá thì R, B mỗi màu dùng hai ô trái phải hoặc trên dưới. Camera thật sẽ xem hướng nào thay đổi ít hơn rồi lấy trung bình theo hướng đó, để không trộn màu hai bên mép (trộn sẽ sinh ra «màu giả»); bù xong còn chỉnh cân bằng trắng, màu, độ sáng rồi nén JPEG, nên khác vài đơn vị so với cách trung bình đơn giản.</w:t>
       </w:r>
     </w:p>
     <w:p>
@@ -1097,7 +1039,7 @@
           <w:sz w:val="24"/>
           <w:szCs w:val="24"/>
         </w:rPr>
-        <w:t xml:space="preserve">Vì sao không viết luật: cùng là xe mà trông khác nhau</w:t>
+        <w:t xml:space="preserve">Màu và con số</w:t>
       </w:r>
     </w:p>
     <w:p>
@@ -1109,7 +1051,7 @@
       <w:r>
         <w:drawing>
           <wp:inline distT="0" distB="0" distL="0" distR="0">
-            <wp:extent cx="5905500" cy="2238375"/>
+            <wp:extent cx="5715000" cy="3219450"/>
             <wp:effectExtent t="0" r="0" b="0" l="0"/>
             <wp:docPr id="1" name="" descr="" title=""/>
             <wp:cNvGraphicFramePr>
@@ -1134,7 +1076,7 @@
                   <pic:spPr bwMode="auto">
                     <a:xfrm>
                       <a:off x="0" y="0"/>
-                      <a:ext cx="5905500" cy="2238375"/>
+                      <a:ext cx="5715000" cy="3219450"/>
                     </a:xfrm>
                     <a:prstGeom prst="rect">
                       <a:avLst/>
@@ -1161,7 +1103,7 @@
           <w:sz w:val="19"/>
           <w:szCs w:val="19"/>
         </w:rPr>
-        <w:t xml:space="preserve">Xe và người cắt từ nuScenes: góc nhìn, ngày đêm, bị che, xa gần đều khác. «Thấy được» là độ thấy chính thức. Dữ liệu: nuScenes (Motional), CC BY-NC-SA 4.0</w:t>
+        <w:t xml:space="preserve">Trên: ba con số của màu cơ bản; dưới: điểm thật trên ảnh (trung bình 5×5), scene-0553 ban ngày, scene-1100 ban đêm. Dữ liệu: nuScenes (Motional), CC BY-NC-SA 4.0</w:t>
       </w:r>
     </w:p>
     <w:p>
@@ -1177,7 +1119,7 @@
           <w:sz w:val="22"/>
           <w:szCs w:val="22"/>
         </w:rPr>
-        <w:t xml:space="preserve">«Xe = bốn bánh + một thân xe»? Nhìn từ sau không thấy bốn bánh; ban đêm chỉ còn hai đèn; bị che một nửa chỉ thấy nóc. Mỗi tình huống mới phải thêm một luật, viết không bao giờ hết. Em bé nhận ra xe không nhờ học luật, mà nhờ nhìn rất nhiều xe. Máy tính bây giờ cũng vậy: </w:t>
+        <w:t xml:space="preserve">Ba con số như ba đèn pin đỏ, xanh lá, xanh dương chiếu lên tường trắng: chỉ bật đỏ là đỏ (255, 0, 0), đỏ + xanh lá là vàng, cả ba sáng nhất là trắng (255, 255, 255), ba cái bằng nhau là xám (128, 128, 128), tắt hết là đen (0, 0, 0). Đọc số hỏi hai việc: </w:t>
       </w:r>
       <w:r>
         <w:rPr>
@@ -1188,7 +1130,7 @@
           <w:sz w:val="22"/>
           <w:szCs w:val="22"/>
         </w:rPr>
-        <w:t xml:space="preserve">cho nó rất nhiều ảnh có đáp án, để nó tự tìm quy luật</w:t>
+        <w:t xml:space="preserve">số lớn hay nhỏ</w:t>
       </w:r>
       <w:r>
         <w:rPr>
@@ -1197,7 +1139,47 @@
           <w:sz w:val="22"/>
           <w:szCs w:val="22"/>
         </w:rPr>
-        <w:t xml:space="preserve"> — gọi là học máy; mô hình có nhiều lớp chồng lên nhau nên gọi là học sâu.</w:t>
+        <w:t xml:space="preserve"> (lớn là sáng), </w:t>
+      </w:r>
+      <w:r>
+        <w:rPr>
+          <w:rFonts w:ascii="Arial" w:cs="Arial" w:eastAsia="Arial" w:hAnsi="Arial"/>
+          <w:b/>
+          <w:bCs/>
+          <w:color w:val="24405C"/>
+          <w:sz w:val="22"/>
+          <w:szCs w:val="22"/>
+        </w:rPr>
+        <w:t xml:space="preserve">số nào lớn nhất</w:t>
+      </w:r>
+      <w:r>
+        <w:rPr>
+          <w:rFonts w:ascii="Arial" w:cs="Arial" w:eastAsia="Arial" w:hAnsi="Arial"/>
+          <w:color w:val="1B1B1B"/>
+          <w:sz w:val="22"/>
+          <w:szCs w:val="22"/>
+        </w:rPr>
+        <w:t xml:space="preserve"> (nghiêng về màu đó). Điểm thật trên ảnh: quần đỏ R 123, G 80, B 67, đỏ lớn nhất; vạch trắng chỉ khoảng 138 vì trời âm u, tự chỉnh phơi sáng làm cả ảnh tối đi; áo trong bóng râm chỉ khoảng 20, gần như đen; mặt đường ban đêm có màu xanh dương rất nhỏ, ngả vàng vì đèn đường ánh vàng; đèn đường gần 255. </w:t>
+      </w:r>
+      <w:r>
+        <w:rPr>
+          <w:rFonts w:ascii="Arial" w:cs="Arial" w:eastAsia="Arial" w:hAnsi="Arial"/>
+          <w:b/>
+          <w:bCs/>
+          <w:color w:val="24405C"/>
+          <w:sz w:val="22"/>
+          <w:szCs w:val="22"/>
+        </w:rPr>
+        <w:t xml:space="preserve">Cùng một vật, đổi ánh sáng là con số khác hẳn</w:t>
+      </w:r>
+      <w:r>
+        <w:rPr>
+          <w:rFonts w:ascii="Arial" w:cs="Arial" w:eastAsia="Arial" w:hAnsi="Arial"/>
+          <w:color w:val="1B1B1B"/>
+          <w:sz w:val="22"/>
+          <w:szCs w:val="22"/>
+        </w:rPr>
+        <w:t xml:space="preserve">, nên máy tính không thể tìm người bằng luật «từ bao nhiêu đến bao nhiêu là người».</w:t>
       </w:r>
     </w:p>
     <w:p>
@@ -1215,165 +1197,7 @@
           <w:sz w:val="24"/>
           <w:szCs w:val="24"/>
         </w:rPr>
-        <w:t xml:space="preserve">Học sâu học thế nào: đoán, so đáp án, sửa một chút</w:t>
-      </w:r>
-    </w:p>
-    <w:p>
-      <w:pPr>
-        <w:pStyle w:val="ListParagraph"/>
-        <w:widowControl/>
-        <w:numPr>
-          <w:ilvl w:val="0"/>
-          <w:numId w:val="2"/>
-        </w:numPr>
-        <w:spacing w:after="80" w:line="320"/>
-      </w:pPr>
-      <w:r>
-        <w:rPr>
-          <w:rFonts w:ascii="Arial" w:cs="Arial" w:eastAsia="Arial" w:hAnsi="Arial"/>
-          <w:b/>
-          <w:bCs/>
-          <w:color w:val="24405C"/>
-          <w:sz w:val="22"/>
-          <w:szCs w:val="22"/>
-        </w:rPr>
-        <w:t xml:space="preserve">Đoán</w:t>
-      </w:r>
-      <w:r>
-        <w:rPr>
-          <w:rFonts w:ascii="Arial" w:cs="Arial" w:eastAsia="Arial" w:hAnsi="Arial"/>
-          <w:color w:val="1B1B1B"/>
-          <w:sz w:val="22"/>
-          <w:szCs w:val="22"/>
-        </w:rPr>
-        <w:t xml:space="preserve">: đưa một ảnh vào, mô hình đoán «ở đây có một người, khung ở đây».</w:t>
-      </w:r>
-    </w:p>
-    <w:p>
-      <w:pPr>
-        <w:pStyle w:val="ListParagraph"/>
-        <w:widowControl/>
-        <w:numPr>
-          <w:ilvl w:val="0"/>
-          <w:numId w:val="2"/>
-        </w:numPr>
-        <w:spacing w:after="80" w:line="320"/>
-      </w:pPr>
-      <w:r>
-        <w:rPr>
-          <w:rFonts w:ascii="Arial" w:cs="Arial" w:eastAsia="Arial" w:hAnsi="Arial"/>
-          <w:b/>
-          <w:bCs/>
-          <w:color w:val="24405C"/>
-          <w:sz w:val="22"/>
-          <w:szCs w:val="22"/>
-        </w:rPr>
-        <w:t xml:space="preserve">So đáp án</w:t>
-      </w:r>
-      <w:r>
-        <w:rPr>
-          <w:rFonts w:ascii="Arial" w:cs="Arial" w:eastAsia="Arial" w:hAnsi="Arial"/>
-          <w:color w:val="1B1B1B"/>
-          <w:sz w:val="22"/>
-          <w:szCs w:val="22"/>
-        </w:rPr>
-        <w:t xml:space="preserve">: so với đáp án con người gán nhãn, lệch bao nhiêu.</w:t>
-      </w:r>
-    </w:p>
-    <w:p>
-      <w:pPr>
-        <w:pStyle w:val="ListParagraph"/>
-        <w:widowControl/>
-        <w:numPr>
-          <w:ilvl w:val="0"/>
-          <w:numId w:val="2"/>
-        </w:numPr>
-        <w:spacing w:after="80" w:line="320"/>
-      </w:pPr>
-      <w:r>
-        <w:rPr>
-          <w:rFonts w:ascii="Arial" w:cs="Arial" w:eastAsia="Arial" w:hAnsi="Arial"/>
-          <w:b/>
-          <w:bCs/>
-          <w:color w:val="24405C"/>
-          <w:sz w:val="22"/>
-          <w:szCs w:val="22"/>
-        </w:rPr>
-        <w:t xml:space="preserve">Sửa một chút</w:t>
-      </w:r>
-      <w:r>
-        <w:rPr>
-          <w:rFonts w:ascii="Arial" w:cs="Arial" w:eastAsia="Arial" w:hAnsi="Arial"/>
-          <w:color w:val="1B1B1B"/>
-          <w:sz w:val="22"/>
-          <w:szCs w:val="22"/>
-        </w:rPr>
-        <w:t xml:space="preserve">: chỉnh hàng triệu con số bên trong để lần sau lệch ít hơn.</w:t>
-      </w:r>
-    </w:p>
-    <w:p>
-      <w:pPr>
-        <w:pStyle w:val="ListParagraph"/>
-        <w:widowControl/>
-        <w:numPr>
-          <w:ilvl w:val="0"/>
-          <w:numId w:val="2"/>
-        </w:numPr>
-        <w:spacing w:after="80" w:line="320"/>
-      </w:pPr>
-      <w:r>
-        <w:rPr>
-          <w:rFonts w:ascii="Arial" w:cs="Arial" w:eastAsia="Arial" w:hAnsi="Arial"/>
-          <w:b/>
-          <w:bCs/>
-          <w:color w:val="24405C"/>
-          <w:sz w:val="22"/>
-          <w:szCs w:val="22"/>
-        </w:rPr>
-        <w:t xml:space="preserve">Lặp lại</w:t>
-      </w:r>
-      <w:r>
-        <w:rPr>
-          <w:rFonts w:ascii="Arial" w:cs="Arial" w:eastAsia="Arial" w:hAnsi="Arial"/>
-          <w:color w:val="1B1B1B"/>
-          <w:sz w:val="22"/>
-          <w:szCs w:val="22"/>
-        </w:rPr>
-        <w:t xml:space="preserve">: hàng chục nghìn ảnh, nhiều vòng.</w:t>
-      </w:r>
-    </w:p>
-    <w:p>
-      <w:pPr>
-        <w:widowControl/>
-        <w:spacing w:after="100" w:before="0" w:line="312"/>
-        <w:ind w:left="0" w:firstLine="0"/>
-      </w:pPr>
-      <w:r>
-        <w:rPr>
-          <w:rFonts w:ascii="Arial" w:cs="Arial" w:eastAsia="Arial" w:hAnsi="Arial"/>
-          <w:color w:val="1B1B1B"/>
-          <w:sz w:val="22"/>
-          <w:szCs w:val="22"/>
-        </w:rPr>
-        <w:t xml:space="preserve">Giống luyện đề cũ có đáp án: làm xong so đáp án, ghi lại chỗ sai, làm đủ nhiều thì gặp đề lạ cũng làm được. Đáp án ở bước 2 do con người gán, đó là «gán nhãn dữ liệu» ở phần 3. Bên trong mô hình có từng lớp: lớp đầu tìm cạnh và màu, lớp giữa ghép thành bánh xe, chân, lớp cuối nói «đây là người». Không ai bảo nó «cạnh nào là chân», nó tự chỉnh ra khi so đáp án.</w:t>
-      </w:r>
-    </w:p>
-    <w:p>
-      <w:pPr>
-        <w:pStyle w:val="Heading2"/>
-        <w:keepNext/>
-        <w:spacing w:after="130" w:before="300"/>
-      </w:pPr>
-      <w:r>
-        <w:rPr>
-          <w:rFonts w:ascii="Arial" w:cs="Arial" w:eastAsia="Arial" w:hAnsi="Arial"/>
-          <w:b/>
-          <w:bCs/>
-          <w:color w:val="24405C"/>
-          <w:sz w:val="24"/>
-          <w:szCs w:val="24"/>
-        </w:rPr>
-        <w:t xml:space="preserve">Phát hiện vật thể cho ba thứ: khung, loại, điểm</w:t>
+        <w:t xml:space="preserve">Vì sao không viết luật: cùng là xe mà trông khác nhau</w:t>
       </w:r>
     </w:p>
     <w:p>
@@ -1385,7 +1209,7 @@
       <w:r>
         <w:drawing>
           <wp:inline distT="0" distB="0" distL="0" distR="0">
-            <wp:extent cx="5905500" cy="2057400"/>
+            <wp:extent cx="5905500" cy="2238375"/>
             <wp:effectExtent t="0" r="0" b="0" l="0"/>
             <wp:docPr id="1" name="" descr="" title=""/>
             <wp:cNvGraphicFramePr>
@@ -1410,6 +1234,282 @@
                   <pic:spPr bwMode="auto">
                     <a:xfrm>
                       <a:off x="0" y="0"/>
+                      <a:ext cx="5905500" cy="2238375"/>
+                    </a:xfrm>
+                    <a:prstGeom prst="rect">
+                      <a:avLst/>
+                    </a:prstGeom>
+                  </pic:spPr>
+                </pic:pic>
+              </a:graphicData>
+            </a:graphic>
+          </wp:inline>
+        </w:drawing>
+      </w:r>
+    </w:p>
+    <w:p>
+      <w:pPr>
+        <w:keepNext w:val="false"/>
+        <w:spacing w:after="70" w:before="190"/>
+      </w:pPr>
+      <w:r>
+        <w:rPr>
+          <w:rFonts w:ascii="Arial" w:cs="Arial" w:eastAsia="Arial" w:hAnsi="Arial"/>
+          <w:b/>
+          <w:bCs/>
+          <w:color w:val="24405C"/>
+          <w:sz w:val="19"/>
+          <w:szCs w:val="19"/>
+        </w:rPr>
+        <w:t xml:space="preserve">Xe và người cắt từ nuScenes: góc nhìn, ngày đêm, bị che, xa gần đều khác. «Thấy được» là độ thấy chính thức. Dữ liệu: nuScenes (Motional), CC BY-NC-SA 4.0</w:t>
+      </w:r>
+    </w:p>
+    <w:p>
+      <w:pPr>
+        <w:widowControl/>
+        <w:spacing w:after="100" w:before="0" w:line="312"/>
+        <w:ind w:left="0" w:firstLine="0"/>
+      </w:pPr>
+      <w:r>
+        <w:rPr>
+          <w:rFonts w:ascii="Arial" w:cs="Arial" w:eastAsia="Arial" w:hAnsi="Arial"/>
+          <w:color w:val="1B1B1B"/>
+          <w:sz w:val="22"/>
+          <w:szCs w:val="22"/>
+        </w:rPr>
+        <w:t xml:space="preserve">«Xe = bốn bánh + một thân xe»? Nhìn từ sau không thấy bốn bánh; ban đêm chỉ còn hai đèn; bị che một nửa chỉ thấy nóc. Mỗi tình huống mới phải thêm một luật, viết không bao giờ hết. Em bé nhận ra xe không nhờ học luật, mà nhờ nhìn rất nhiều xe. Máy tính bây giờ cũng vậy: </w:t>
+      </w:r>
+      <w:r>
+        <w:rPr>
+          <w:rFonts w:ascii="Arial" w:cs="Arial" w:eastAsia="Arial" w:hAnsi="Arial"/>
+          <w:b/>
+          <w:bCs/>
+          <w:color w:val="24405C"/>
+          <w:sz w:val="22"/>
+          <w:szCs w:val="22"/>
+        </w:rPr>
+        <w:t xml:space="preserve">cho nó rất nhiều ảnh có đáp án, để nó tự tìm quy luật</w:t>
+      </w:r>
+      <w:r>
+        <w:rPr>
+          <w:rFonts w:ascii="Arial" w:cs="Arial" w:eastAsia="Arial" w:hAnsi="Arial"/>
+          <w:color w:val="1B1B1B"/>
+          <w:sz w:val="22"/>
+          <w:szCs w:val="22"/>
+        </w:rPr>
+        <w:t xml:space="preserve"> — gọi là học máy; mô hình có nhiều lớp chồng lên nhau nên gọi là học sâu.</w:t>
+      </w:r>
+    </w:p>
+    <w:p>
+      <w:pPr>
+        <w:pStyle w:val="Heading2"/>
+        <w:keepNext/>
+        <w:spacing w:after="130" w:before="300"/>
+      </w:pPr>
+      <w:r>
+        <w:rPr>
+          <w:rFonts w:ascii="Arial" w:cs="Arial" w:eastAsia="Arial" w:hAnsi="Arial"/>
+          <w:b/>
+          <w:bCs/>
+          <w:color w:val="24405C"/>
+          <w:sz w:val="24"/>
+          <w:szCs w:val="24"/>
+        </w:rPr>
+        <w:t xml:space="preserve">Học sâu học thế nào: đoán, so đáp án, sửa một chút</w:t>
+      </w:r>
+    </w:p>
+    <w:p>
+      <w:pPr>
+        <w:pStyle w:val="ListParagraph"/>
+        <w:widowControl/>
+        <w:numPr>
+          <w:ilvl w:val="0"/>
+          <w:numId w:val="2"/>
+        </w:numPr>
+        <w:spacing w:after="80" w:line="320"/>
+      </w:pPr>
+      <w:r>
+        <w:rPr>
+          <w:rFonts w:ascii="Arial" w:cs="Arial" w:eastAsia="Arial" w:hAnsi="Arial"/>
+          <w:b/>
+          <w:bCs/>
+          <w:color w:val="24405C"/>
+          <w:sz w:val="22"/>
+          <w:szCs w:val="22"/>
+        </w:rPr>
+        <w:t xml:space="preserve">Đoán</w:t>
+      </w:r>
+      <w:r>
+        <w:rPr>
+          <w:rFonts w:ascii="Arial" w:cs="Arial" w:eastAsia="Arial" w:hAnsi="Arial"/>
+          <w:color w:val="1B1B1B"/>
+          <w:sz w:val="22"/>
+          <w:szCs w:val="22"/>
+        </w:rPr>
+        <w:t xml:space="preserve">: đưa một ảnh vào, mô hình đoán «ở đây có một người, khung ở đây».</w:t>
+      </w:r>
+    </w:p>
+    <w:p>
+      <w:pPr>
+        <w:pStyle w:val="ListParagraph"/>
+        <w:widowControl/>
+        <w:numPr>
+          <w:ilvl w:val="0"/>
+          <w:numId w:val="2"/>
+        </w:numPr>
+        <w:spacing w:after="80" w:line="320"/>
+      </w:pPr>
+      <w:r>
+        <w:rPr>
+          <w:rFonts w:ascii="Arial" w:cs="Arial" w:eastAsia="Arial" w:hAnsi="Arial"/>
+          <w:b/>
+          <w:bCs/>
+          <w:color w:val="24405C"/>
+          <w:sz w:val="22"/>
+          <w:szCs w:val="22"/>
+        </w:rPr>
+        <w:t xml:space="preserve">So đáp án</w:t>
+      </w:r>
+      <w:r>
+        <w:rPr>
+          <w:rFonts w:ascii="Arial" w:cs="Arial" w:eastAsia="Arial" w:hAnsi="Arial"/>
+          <w:color w:val="1B1B1B"/>
+          <w:sz w:val="22"/>
+          <w:szCs w:val="22"/>
+        </w:rPr>
+        <w:t xml:space="preserve">: so với đáp án con người gán nhãn, lệch bao nhiêu.</w:t>
+      </w:r>
+    </w:p>
+    <w:p>
+      <w:pPr>
+        <w:pStyle w:val="ListParagraph"/>
+        <w:widowControl/>
+        <w:numPr>
+          <w:ilvl w:val="0"/>
+          <w:numId w:val="2"/>
+        </w:numPr>
+        <w:spacing w:after="80" w:line="320"/>
+      </w:pPr>
+      <w:r>
+        <w:rPr>
+          <w:rFonts w:ascii="Arial" w:cs="Arial" w:eastAsia="Arial" w:hAnsi="Arial"/>
+          <w:b/>
+          <w:bCs/>
+          <w:color w:val="24405C"/>
+          <w:sz w:val="22"/>
+          <w:szCs w:val="22"/>
+        </w:rPr>
+        <w:t xml:space="preserve">Sửa một chút</w:t>
+      </w:r>
+      <w:r>
+        <w:rPr>
+          <w:rFonts w:ascii="Arial" w:cs="Arial" w:eastAsia="Arial" w:hAnsi="Arial"/>
+          <w:color w:val="1B1B1B"/>
+          <w:sz w:val="22"/>
+          <w:szCs w:val="22"/>
+        </w:rPr>
+        <w:t xml:space="preserve">: chỉnh hàng triệu con số bên trong để lần sau lệch ít hơn.</w:t>
+      </w:r>
+    </w:p>
+    <w:p>
+      <w:pPr>
+        <w:pStyle w:val="ListParagraph"/>
+        <w:widowControl/>
+        <w:numPr>
+          <w:ilvl w:val="0"/>
+          <w:numId w:val="2"/>
+        </w:numPr>
+        <w:spacing w:after="80" w:line="320"/>
+      </w:pPr>
+      <w:r>
+        <w:rPr>
+          <w:rFonts w:ascii="Arial" w:cs="Arial" w:eastAsia="Arial" w:hAnsi="Arial"/>
+          <w:b/>
+          <w:bCs/>
+          <w:color w:val="24405C"/>
+          <w:sz w:val="22"/>
+          <w:szCs w:val="22"/>
+        </w:rPr>
+        <w:t xml:space="preserve">Lặp lại</w:t>
+      </w:r>
+      <w:r>
+        <w:rPr>
+          <w:rFonts w:ascii="Arial" w:cs="Arial" w:eastAsia="Arial" w:hAnsi="Arial"/>
+          <w:color w:val="1B1B1B"/>
+          <w:sz w:val="22"/>
+          <w:szCs w:val="22"/>
+        </w:rPr>
+        <w:t xml:space="preserve">: hàng chục nghìn ảnh, nhiều vòng.</w:t>
+      </w:r>
+    </w:p>
+    <w:p>
+      <w:pPr>
+        <w:widowControl/>
+        <w:spacing w:after="100" w:before="0" w:line="312"/>
+        <w:ind w:left="0" w:firstLine="0"/>
+      </w:pPr>
+      <w:r>
+        <w:rPr>
+          <w:rFonts w:ascii="Arial" w:cs="Arial" w:eastAsia="Arial" w:hAnsi="Arial"/>
+          <w:color w:val="1B1B1B"/>
+          <w:sz w:val="22"/>
+          <w:szCs w:val="22"/>
+        </w:rPr>
+        <w:t xml:space="preserve">Giống luyện đề cũ có đáp án: làm xong so đáp án, ghi lại chỗ sai, làm đủ nhiều thì gặp đề lạ cũng làm được. Đáp án ở bước 2 do con người gán, đó là «gán nhãn dữ liệu» ở phần 3. Bên trong mô hình có từng lớp: lớp đầu tìm cạnh và màu, lớp giữa ghép thành bánh xe, chân, lớp cuối nói «đây là người». Không ai bảo nó «cạnh nào là chân», nó tự chỉnh ra khi so đáp án.</w:t>
+      </w:r>
+    </w:p>
+    <w:p>
+      <w:pPr>
+        <w:pStyle w:val="Heading2"/>
+        <w:keepNext/>
+        <w:spacing w:after="130" w:before="300"/>
+      </w:pPr>
+      <w:r>
+        <w:rPr>
+          <w:rFonts w:ascii="Arial" w:cs="Arial" w:eastAsia="Arial" w:hAnsi="Arial"/>
+          <w:b/>
+          <w:bCs/>
+          <w:color w:val="24405C"/>
+          <w:sz w:val="24"/>
+          <w:szCs w:val="24"/>
+        </w:rPr>
+        <w:t xml:space="preserve">Phát hiện vật thể cho ba thứ: khung, loại, điểm</w:t>
+      </w:r>
+    </w:p>
+    <w:p>
+      <w:pPr>
+        <w:keepNext/>
+        <w:spacing w:after="60" w:before="60"/>
+        <w:jc w:val="center"/>
+      </w:pPr>
+      <w:r>
+        <w:drawing>
+          <wp:inline distT="0" distB="0" distL="0" distR="0">
+            <wp:extent cx="5905500" cy="2057400"/>
+            <wp:effectExtent t="0" r="0" b="0" l="0"/>
+            <wp:docPr id="1" name="" descr="" title=""/>
+            <wp:cNvGraphicFramePr>
+              <a:graphicFrameLocks xmlns:a="http://schemas.openxmlformats.org/drawingml/2006/main" noChangeAspect="1"/>
+            </wp:cNvGraphicFramePr>
+            <a:graphic xmlns:a="http://schemas.openxmlformats.org/drawingml/2006/main">
+              <a:graphicData uri="http://schemas.openxmlformats.org/drawingml/2006/picture">
+                <pic:pic xmlns:pic="http://schemas.openxmlformats.org/drawingml/2006/picture">
+                  <pic:nvPicPr>
+                    <pic:cNvPr id="0" name="" descr=""/>
+                    <pic:cNvPicPr>
+                      <a:picLocks noChangeAspect="1" noChangeArrowheads="1"/>
+                    </pic:cNvPicPr>
+                  </pic:nvPicPr>
+                  <pic:blipFill>
+                    <a:blip r:embed="rId14" cstate="none"/>
+                    <a:srcRect/>
+                    <a:stretch>
+                      <a:fillRect/>
+                    </a:stretch>
+                  </pic:blipFill>
+                  <pic:spPr bwMode="auto">
+                    <a:xfrm>
+                      <a:off x="0" y="0"/>
                       <a:ext cx="5905500" cy="2057400"/>
                     </a:xfrm>
                     <a:prstGeom prst="rect">
@@ -2142,7 +2242,7 @@
                     </pic:cNvPicPr>
                   </pic:nvPicPr>
                   <pic:blipFill>
-                    <a:blip r:embed="rId14" cstate="none"/>
+                    <a:blip r:embed="rId15" cstate="none"/>
                     <a:srcRect/>
                     <a:stretch>
                       <a:fillRect/>
@@ -3382,7 +3482,7 @@
                     </pic:cNvPicPr>
                   </pic:nvPicPr>
                   <pic:blipFill>
-                    <a:blip r:embed="rId15" cstate="none"/>
+                    <a:blip r:embed="rId16" cstate="none"/>
                     <a:srcRect/>
                     <a:stretch>
                       <a:fillRect/>
@@ -3482,124 +3582,6 @@
         <w:drawing>
           <wp:inline distT="0" distB="0" distL="0" distR="0">
             <wp:extent cx="5715000" cy="1990725"/>
-            <wp:effectExtent t="0" r="0" b="0" l="0"/>
-            <wp:docPr id="1" name="" descr="" title=""/>
-            <wp:cNvGraphicFramePr>
-              <a:graphicFrameLocks xmlns:a="http://schemas.openxmlformats.org/drawingml/2006/main" noChangeAspect="1"/>
-            </wp:cNvGraphicFramePr>
-            <a:graphic xmlns:a="http://schemas.openxmlformats.org/drawingml/2006/main">
-              <a:graphicData uri="http://schemas.openxmlformats.org/drawingml/2006/picture">
-                <pic:pic xmlns:pic="http://schemas.openxmlformats.org/drawingml/2006/picture">
-                  <pic:nvPicPr>
-                    <pic:cNvPr id="0" name="" descr=""/>
-                    <pic:cNvPicPr>
-                      <a:picLocks noChangeAspect="1" noChangeArrowheads="1"/>
-                    </pic:cNvPicPr>
-                  </pic:nvPicPr>
-                  <pic:blipFill>
-                    <a:blip r:embed="rId16" cstate="none"/>
-                    <a:srcRect/>
-                    <a:stretch>
-                      <a:fillRect/>
-                    </a:stretch>
-                  </pic:blipFill>
-                  <pic:spPr bwMode="auto">
-                    <a:xfrm>
-                      <a:off x="0" y="0"/>
-                      <a:ext cx="5715000" cy="1990725"/>
-                    </a:xfrm>
-                    <a:prstGeom prst="rect">
-                      <a:avLst/>
-                    </a:prstGeom>
-                  </pic:spPr>
-                </pic:pic>
-              </a:graphicData>
-            </a:graphic>
-          </wp:inline>
-        </w:drawing>
-      </w:r>
-    </w:p>
-    <w:p>
-      <w:pPr>
-        <w:keepNext w:val="false"/>
-        <w:spacing w:after="70" w:before="190"/>
-      </w:pPr>
-      <w:r>
-        <w:rPr>
-          <w:rFonts w:ascii="Arial" w:cs="Arial" w:eastAsia="Arial" w:hAnsi="Arial"/>
-          <w:b/>
-          <w:bCs/>
-          <w:color w:val="24405C"/>
-          <w:sz w:val="19"/>
-          <w:szCs w:val="19"/>
-        </w:rPr>
-        <w:t xml:space="preserve">Khung phát hiện + điểm lidar (vàng). Lấy trung vị 1 m dày điểm nhất trong khung: người 8,9 m (chính thức 9,0 m), xe 21,4 m (22,0 m). Dữ liệu: nuScenes (Motional), CC BY-NC-SA 4.0</w:t>
-      </w:r>
-    </w:p>
-    <w:p>
-      <w:pPr>
-        <w:widowControl/>
-        <w:spacing w:after="100" w:before="0" w:line="312"/>
-        <w:ind w:left="0" w:firstLine="0"/>
-      </w:pPr>
-      <w:r>
-        <w:rPr>
-          <w:rFonts w:ascii="Arial" w:cs="Arial" w:eastAsia="Arial" w:hAnsi="Arial"/>
-          <w:color w:val="1B1B1B"/>
-          <w:sz w:val="22"/>
-          <w:szCs w:val="22"/>
-        </w:rPr>
-        <w:t xml:space="preserve">Camera nói «đây là người», lidar nói «bao xa» — cặp camera + lidar của tuần 7. Khung là hình chữ nhật, góc khung có cả điểm của mặt đường, nhà phía sau, nên phải chọn cụm điểm dày nhất. Xe tự lái cần </w:t>
-      </w:r>
-      <w:r>
-        <w:rPr>
-          <w:rFonts w:ascii="Arial" w:cs="Arial" w:eastAsia="Arial" w:hAnsi="Arial"/>
-          <w:b/>
-          <w:bCs/>
-          <w:color w:val="24405C"/>
-          <w:sz w:val="22"/>
-          <w:szCs w:val="22"/>
-        </w:rPr>
-        <w:t xml:space="preserve">khung 3D</w:t>
-      </w:r>
-      <w:r>
-        <w:rPr>
-          <w:rFonts w:ascii="Arial" w:cs="Arial" w:eastAsia="Arial" w:hAnsi="Arial"/>
-          <w:color w:val="1B1B1B"/>
-          <w:sz w:val="22"/>
-          <w:szCs w:val="22"/>
-        </w:rPr>
-        <w:t xml:space="preserve">: ba số vị trí, ba số kích thước, thêm hướng — bảy con số (tuần 7).</w:t>
-      </w:r>
-    </w:p>
-    <w:p>
-      <w:pPr>
-        <w:pStyle w:val="Heading2"/>
-        <w:keepNext/>
-        <w:spacing w:after="130" w:before="300"/>
-      </w:pPr>
-      <w:r>
-        <w:rPr>
-          <w:rFonts w:ascii="Arial" w:cs="Arial" w:eastAsia="Arial" w:hAnsi="Arial"/>
-          <w:b/>
-          <w:bCs/>
-          <w:color w:val="24405C"/>
-          <w:sz w:val="24"/>
-          <w:szCs w:val="24"/>
-        </w:rPr>
-        <w:t xml:space="preserve">Nhìn từ trên xuống: bản đồ từ trên và lưới chiếm chỗ</w:t>
-      </w:r>
-    </w:p>
-    <w:p>
-      <w:pPr>
-        <w:keepNext/>
-        <w:spacing w:after="60" w:before="60"/>
-        <w:jc w:val="center"/>
-      </w:pPr>
-      <w:r>
-        <w:drawing>
-          <wp:inline distT="0" distB="0" distL="0" distR="0">
-            <wp:extent cx="5905500" cy="3333750"/>
             <wp:effectExtent t="0" r="0" b="0" l="0"/>
             <wp:docPr id="1" name="" descr="" title=""/>
             <wp:cNvGraphicFramePr>
@@ -3624,7 +3606,7 @@
                   <pic:spPr bwMode="auto">
                     <a:xfrm>
                       <a:off x="0" y="0"/>
-                      <a:ext cx="5905500" cy="3333750"/>
+                      <a:ext cx="5715000" cy="1990725"/>
                     </a:xfrm>
                     <a:prstGeom prst="rect">
                       <a:avLst/>
@@ -3651,18 +3633,14 @@
           <w:sz w:val="19"/>
           <w:szCs w:val="19"/>
         </w:rPr>
-        <w:t xml:space="preserve">Trái: bản đồ từ trên, điểm lidar + khung 3D; phải: lưới chiếm chỗ tính từ cùng khung lidar (ô 0,5 m). scene-0103 (Boston). Dữ liệu: nuScenes (Motional), CC BY-NC-SA 4.0</w:t>
+        <w:t xml:space="preserve">Khung phát hiện + điểm lidar (vàng). Lấy trung vị 1 m dày điểm nhất trong khung: người 8,9 m (chính thức 9,0 m), xe 21,4 m (22,0 m). Dữ liệu: nuScenes (Motional), CC BY-NC-SA 4.0</w:t>
       </w:r>
     </w:p>
     <w:p>
       <w:pPr>
-        <w:pStyle w:val="ListParagraph"/>
         <w:widowControl/>
-        <w:numPr>
-          <w:ilvl w:val="0"/>
-          <w:numId w:val="3"/>
-        </w:numPr>
-        <w:spacing w:after="80" w:line="320"/>
+        <w:spacing w:after="100" w:before="0" w:line="312"/>
+        <w:ind w:left="0" w:firstLine="0"/>
       </w:pPr>
       <w:r>
         <w:rPr>
@@ -3671,7 +3649,7 @@
           <w:sz w:val="22"/>
           <w:szCs w:val="22"/>
         </w:rPr>
-        <w:t xml:space="preserve">Ba cái lợi của bản đồ từ trên: các vật </w:t>
+        <w:t xml:space="preserve">Camera nói «đây là người», lidar nói «bao xa» — cặp camera + lidar của tuần 7. Khung là hình chữ nhật, góc khung có cả điểm của mặt đường, nhà phía sau, nên phải chọn cụm điểm dày nhất. Xe tự lái cần </w:t>
       </w:r>
       <w:r>
         <w:rPr>
@@ -3682,7 +3660,7 @@
           <w:sz w:val="22"/>
           <w:szCs w:val="22"/>
         </w:rPr>
-        <w:t xml:space="preserve">không che nhau</w:t>
+        <w:t xml:space="preserve">khung 3D</w:t>
       </w:r>
       <w:r>
         <w:rPr>
@@ -3691,622 +3669,25 @@
           <w:sz w:val="22"/>
           <w:szCs w:val="22"/>
         </w:rPr>
-        <w:t xml:space="preserve">; </w:t>
-      </w:r>
+        <w:t xml:space="preserve">: ba số vị trí, ba số kích thước, thêm hướng — bảy con số (tuần 7).</w:t>
+      </w:r>
+    </w:p>
+    <w:p>
+      <w:pPr>
+        <w:pStyle w:val="Heading2"/>
+        <w:keepNext/>
+        <w:spacing w:after="130" w:before="300"/>
+      </w:pPr>
       <w:r>
         <w:rPr>
           <w:rFonts w:ascii="Arial" w:cs="Arial" w:eastAsia="Arial" w:hAnsi="Arial"/>
           <w:b/>
           <w:bCs/>
           <w:color w:val="24405C"/>
-          <w:sz w:val="22"/>
-          <w:szCs w:val="22"/>
-        </w:rPr>
-        <w:t xml:space="preserve">khoảng cách không méo</w:t>
-      </w:r>
-      <w:r>
-        <w:rPr>
-          <w:rFonts w:ascii="Arial" w:cs="Arial" w:eastAsia="Arial" w:hAnsi="Arial"/>
-          <w:color w:val="1B1B1B"/>
-          <w:sz w:val="22"/>
-          <w:szCs w:val="22"/>
-        </w:rPr>
-        <w:t xml:space="preserve">; lái xe vốn là quyết định </w:t>
-      </w:r>
-      <w:r>
-        <w:rPr>
-          <w:rFonts w:ascii="Arial" w:cs="Arial" w:eastAsia="Arial" w:hAnsi="Arial"/>
-          <w:b/>
-          <w:bCs/>
-          <w:color w:val="24405C"/>
-          <w:sz w:val="22"/>
-          <w:szCs w:val="22"/>
-        </w:rPr>
-        <w:t xml:space="preserve">trên mặt đất</w:t>
-      </w:r>
-      <w:r>
-        <w:rPr>
-          <w:rFonts w:ascii="Arial" w:cs="Arial" w:eastAsia="Arial" w:hAnsi="Arial"/>
-          <w:color w:val="1B1B1B"/>
-          <w:sz w:val="22"/>
-          <w:szCs w:val="22"/>
-        </w:rPr>
-        <w:t xml:space="preserve">. Ghép giữa ở tuần 7 là cùng vẽ thành một bản đồ từ trên.</w:t>
-      </w:r>
-    </w:p>
-    <w:p>
-      <w:pPr>
-        <w:pStyle w:val="ListParagraph"/>
-        <w:widowControl/>
-        <w:numPr>
-          <w:ilvl w:val="0"/>
-          <w:numId w:val="3"/>
-        </w:numPr>
-        <w:spacing w:after="80" w:line="320"/>
-      </w:pPr>
-      <w:r>
-        <w:rPr>
-          <w:rFonts w:ascii="Arial" w:cs="Arial" w:eastAsia="Arial" w:hAnsi="Arial"/>
-          <w:color w:val="1B1B1B"/>
-          <w:sz w:val="22"/>
-          <w:szCs w:val="22"/>
-        </w:rPr>
-        <w:t xml:space="preserve">Lưới chiếm chỗ: mỗi ô chỉ hỏi một việc. </w:t>
-      </w:r>
-      <w:r>
-        <w:rPr>
-          <w:rFonts w:ascii="Arial" w:cs="Arial" w:eastAsia="Arial" w:hAnsi="Arial"/>
-          <w:b/>
-          <w:bCs/>
-          <w:color w:val="24405C"/>
-          <w:sz w:val="22"/>
-          <w:szCs w:val="22"/>
-        </w:rPr>
-        <w:t xml:space="preserve">Đỏ = có vật</w:t>
-      </w:r>
-      <w:r>
-        <w:rPr>
-          <w:rFonts w:ascii="Arial" w:cs="Arial" w:eastAsia="Arial" w:hAnsi="Arial"/>
-          <w:color w:val="1B1B1B"/>
-          <w:sz w:val="22"/>
-          <w:szCs w:val="22"/>
-        </w:rPr>
-        <w:t xml:space="preserve">, </w:t>
-      </w:r>
-      <w:r>
-        <w:rPr>
-          <w:rFonts w:ascii="Arial" w:cs="Arial" w:eastAsia="Arial" w:hAnsi="Arial"/>
-          <w:b/>
-          <w:bCs/>
-          <w:color w:val="24405C"/>
-          <w:sz w:val="22"/>
-          <w:szCs w:val="22"/>
-        </w:rPr>
-        <w:t xml:space="preserve">trắng = trống</w:t>
-      </w:r>
-      <w:r>
-        <w:rPr>
-          <w:rFonts w:ascii="Arial" w:cs="Arial" w:eastAsia="Arial" w:hAnsi="Arial"/>
-          <w:color w:val="1B1B1B"/>
-          <w:sz w:val="22"/>
-          <w:szCs w:val="22"/>
-        </w:rPr>
-        <w:t xml:space="preserve"> (tia laser đi qua không chạm gì), </w:t>
-      </w:r>
-      <w:r>
-        <w:rPr>
-          <w:rFonts w:ascii="Arial" w:cs="Arial" w:eastAsia="Arial" w:hAnsi="Arial"/>
-          <w:b/>
-          <w:bCs/>
-          <w:color w:val="24405C"/>
-          <w:sz w:val="22"/>
-          <w:szCs w:val="22"/>
-        </w:rPr>
-        <w:t xml:space="preserve">xám = chưa biết</w:t>
-      </w:r>
-      <w:r>
-        <w:rPr>
-          <w:rFonts w:ascii="Arial" w:cs="Arial" w:eastAsia="Arial" w:hAnsi="Arial"/>
-          <w:color w:val="1B1B1B"/>
-          <w:sz w:val="22"/>
-          <w:szCs w:val="22"/>
-        </w:rPr>
-        <w:t xml:space="preserve"> (bị che, không bắn tới).</w:t>
-      </w:r>
-    </w:p>
-    <w:p>
-      <w:pPr>
-        <w:pStyle w:val="ListParagraph"/>
-        <w:widowControl/>
-        <w:numPr>
-          <w:ilvl w:val="0"/>
-          <w:numId w:val="3"/>
-        </w:numPr>
-        <w:spacing w:after="80" w:line="320"/>
-      </w:pPr>
-      <w:r>
-        <w:rPr>
-          <w:rFonts w:ascii="Arial" w:cs="Arial" w:eastAsia="Arial" w:hAnsi="Arial"/>
-          <w:color w:val="1B1B1B"/>
-          <w:sz w:val="22"/>
-          <w:szCs w:val="22"/>
-        </w:rPr>
-        <w:t xml:space="preserve">Lợi lớn nhất: </w:t>
-      </w:r>
-      <w:r>
-        <w:rPr>
-          <w:rFonts w:ascii="Arial" w:cs="Arial" w:eastAsia="Arial" w:hAnsi="Arial"/>
-          <w:b/>
-          <w:bCs/>
-          <w:color w:val="24405C"/>
-          <w:sz w:val="22"/>
-          <w:szCs w:val="22"/>
-        </w:rPr>
-        <w:t xml:space="preserve">không cần biết là gì</w:t>
-      </w:r>
-      <w:r>
-        <w:rPr>
-          <w:rFonts w:ascii="Arial" w:cs="Arial" w:eastAsia="Arial" w:hAnsi="Arial"/>
-          <w:color w:val="1B1B1B"/>
-          <w:sz w:val="22"/>
-          <w:szCs w:val="22"/>
-        </w:rPr>
-        <w:t xml:space="preserve">. Hàng rơi trên đường, chướng ngại lạ, bộ phát hiện không nhận ra nhưng lưới vẫn tô đỏ. Cẩn thận: «chưa biết» không phải «trống».</w:t>
-      </w:r>
-    </w:p>
-    <w:p>
-      <w:pPr>
-        <w:pStyle w:val="Heading1"/>
-        <w:keepNext/>
-        <w:pageBreakBefore/>
-        <w:spacing w:after="240" w:before="160"/>
-      </w:pPr>
-      <w:r>
-        <w:rPr>
-          <w:rFonts w:ascii="Arial" w:cs="Arial" w:eastAsia="Arial" w:hAnsi="Arial"/>
-          <w:b/>
-          <w:bCs/>
-          <w:color w:val="24405C"/>
-          <w:sz w:val="30"/>
-          <w:szCs w:val="30"/>
-        </w:rPr>
-        <w:t xml:space="preserve">3. Gán nhãn dữ liệu: chuẩn bị đáp án cho máy tính</w:t>
-      </w:r>
-    </w:p>
-    <w:p>
-      <w:pPr>
-        <w:widowControl/>
-        <w:spacing w:after="100" w:before="0" w:line="312"/>
-        <w:ind w:left="0" w:firstLine="0"/>
-      </w:pPr>
-      <w:r>
-        <w:rPr>
-          <w:rFonts w:ascii="Arial" w:cs="Arial" w:eastAsia="Arial" w:hAnsi="Arial"/>
-          <w:color w:val="1B1B1B"/>
-          <w:sz w:val="22"/>
-          <w:szCs w:val="22"/>
-        </w:rPr>
-        <w:t xml:space="preserve">Dữ liệu gán nhãn là sách giáo khoa của mô hình. Ba tình huống làm mô hình học sai: </w:t>
-      </w:r>
-      <w:r>
-        <w:rPr>
-          <w:rFonts w:ascii="Arial" w:cs="Arial" w:eastAsia="Arial" w:hAnsi="Arial"/>
-          <w:b/>
-          <w:bCs/>
-          <w:color w:val="24405C"/>
-          <w:sz w:val="22"/>
-          <w:szCs w:val="22"/>
-        </w:rPr>
-        <w:t xml:space="preserve">thiếu nhãn</w:t>
-      </w:r>
-      <w:r>
-        <w:rPr>
-          <w:rFonts w:ascii="Arial" w:cs="Arial" w:eastAsia="Arial" w:hAnsi="Arial"/>
-          <w:color w:val="1B1B1B"/>
-          <w:sz w:val="22"/>
-          <w:szCs w:val="22"/>
-        </w:rPr>
-        <w:t xml:space="preserve"> (có người mà không khoanh, mô hình học «trông thế này không phải người»), </w:t>
-      </w:r>
-      <w:r>
-        <w:rPr>
-          <w:rFonts w:ascii="Arial" w:cs="Arial" w:eastAsia="Arial" w:hAnsi="Arial"/>
-          <w:b/>
-          <w:bCs/>
-          <w:color w:val="24405C"/>
-          <w:sz w:val="22"/>
-          <w:szCs w:val="22"/>
-        </w:rPr>
-        <w:t xml:space="preserve">sai loại</w:t>
-      </w:r>
-      <w:r>
-        <w:rPr>
-          <w:rFonts w:ascii="Arial" w:cs="Arial" w:eastAsia="Arial" w:hAnsi="Arial"/>
-          <w:color w:val="1B1B1B"/>
-          <w:sz w:val="22"/>
-          <w:szCs w:val="22"/>
-        </w:rPr>
-        <w:t xml:space="preserve"> (xe máy thành xe đạp), </w:t>
-      </w:r>
-      <w:r>
-        <w:rPr>
-          <w:rFonts w:ascii="Arial" w:cs="Arial" w:eastAsia="Arial" w:hAnsi="Arial"/>
-          <w:b/>
-          <w:bCs/>
-          <w:color w:val="24405C"/>
-          <w:sz w:val="22"/>
-          <w:szCs w:val="22"/>
-        </w:rPr>
-        <w:t xml:space="preserve">mỗi người một kiểu</w:t>
-      </w:r>
-      <w:r>
-        <w:rPr>
-          <w:rFonts w:ascii="Arial" w:cs="Arial" w:eastAsia="Arial" w:hAnsi="Arial"/>
-          <w:color w:val="1B1B1B"/>
-          <w:sz w:val="22"/>
-          <w:szCs w:val="22"/>
-        </w:rPr>
-        <w:t xml:space="preserve"> (người khoanh chung người lái với xe máy, người khoanh riêng). Vì vậy gán nhãn chính thức luôn có bộ quy tắc, mọi người theo cùng một bộ, và có kiểm tra.</w:t>
-      </w:r>
-    </w:p>
-    <w:p>
-      <w:pPr>
-        <w:keepNext/>
-        <w:spacing w:after="70" w:before="190"/>
-      </w:pPr>
-      <w:r>
-        <w:rPr>
-          <w:rFonts w:ascii="Arial" w:cs="Arial" w:eastAsia="Arial" w:hAnsi="Arial"/>
-          <w:b/>
-          <w:bCs/>
-          <w:color w:val="24405C"/>
-          <w:sz w:val="19"/>
-          <w:szCs w:val="19"/>
-        </w:rPr>
-        <w:t xml:space="preserve">Bảng 3. nuScenes đã gán nhãn bao nhiêu</w:t>
-      </w:r>
-    </w:p>
-    <w:tbl>
-      <w:tblPr>
-        <w:tblW w:type="dxa" w:w="9360"/>
-        <w:tblBorders>
-          <w:top w:val="single" w:color="8A949C" w:sz="8"/>
-          <w:left w:val="none"/>
-          <w:bottom w:val="single" w:color="8A949C" w:sz="8"/>
-          <w:right w:val="none"/>
-          <w:insideH w:val="single" w:color="BFC7CE" w:sz="2"/>
-          <w:insideV w:val="none"/>
-        </w:tblBorders>
-      </w:tblPr>
-      <w:tblGrid>
-        <w:gridCol w:w="3000"/>
-        <w:gridCol w:w="6360"/>
-      </w:tblGrid>
-      <w:tr>
-        <w:trPr>
-          <w:cantSplit/>
-          <w:tblHeader/>
-        </w:trPr>
-        <w:tc>
-          <w:tcPr>
-            <w:tcW w:type="dxa" w:w="3000"/>
-            <w:shd w:fill="EDF0F3" w:color="auto" w:val="clear"/>
-            <w:tcMar>
-              <w:top w:type="dxa" w:w="60"/>
-              <w:left w:type="dxa" w:w="95"/>
-              <w:bottom w:type="dxa" w:w="60"/>
-              <w:right w:type="dxa" w:w="95"/>
-            </w:tcMar>
-            <w:vAlign w:val="center"/>
-          </w:tcPr>
-          <w:p>
-            <w:pPr>
-              <w:spacing w:after="0" w:line="265"/>
-            </w:pPr>
-            <w:r>
-              <w:rPr>
-                <w:rFonts w:ascii="Arial" w:cs="Arial" w:eastAsia="Arial" w:hAnsi="Arial"/>
-                <w:b/>
-                <w:bCs/>
-                <w:color w:val="1B1B1B"/>
-                <w:sz w:val="18"/>
-                <w:szCs w:val="18"/>
-              </w:rPr>
-              <w:t xml:space="preserve">Hạng mục</w:t>
-            </w:r>
-          </w:p>
-        </w:tc>
-        <w:tc>
-          <w:tcPr>
-            <w:tcW w:type="dxa" w:w="6360"/>
-            <w:shd w:fill="EDF0F3" w:color="auto" w:val="clear"/>
-            <w:tcMar>
-              <w:top w:type="dxa" w:w="60"/>
-              <w:left w:type="dxa" w:w="95"/>
-              <w:bottom w:type="dxa" w:w="60"/>
-              <w:right w:type="dxa" w:w="95"/>
-            </w:tcMar>
-            <w:vAlign w:val="center"/>
-          </w:tcPr>
-          <w:p>
-            <w:pPr>
-              <w:spacing w:after="0" w:line="265"/>
-            </w:pPr>
-            <w:r>
-              <w:rPr>
-                <w:rFonts w:ascii="Arial" w:cs="Arial" w:eastAsia="Arial" w:hAnsi="Arial"/>
-                <w:b/>
-                <w:bCs/>
-                <w:color w:val="1B1B1B"/>
-                <w:sz w:val="18"/>
-                <w:szCs w:val="18"/>
-              </w:rPr>
-              <w:t xml:space="preserve">Con số</w:t>
-            </w:r>
-          </w:p>
-        </w:tc>
-      </w:tr>
-      <w:tr>
-        <w:trPr>
-          <w:cantSplit/>
-          <w:tblHeader w:val="false"/>
-        </w:trPr>
-        <w:tc>
-          <w:tcPr>
-            <w:tcW w:type="dxa" w:w="3000"/>
-            <w:tcMar>
-              <w:top w:type="dxa" w:w="60"/>
-              <w:left w:type="dxa" w:w="95"/>
-              <w:bottom w:type="dxa" w:w="60"/>
-              <w:right w:type="dxa" w:w="95"/>
-            </w:tcMar>
-            <w:vAlign w:val="center"/>
-          </w:tcPr>
-          <w:p>
-            <w:pPr>
-              <w:spacing w:after="0" w:line="265"/>
-            </w:pPr>
-            <w:r>
-              <w:rPr>
-                <w:rFonts w:ascii="Arial" w:cs="Arial" w:eastAsia="Arial" w:hAnsi="Arial"/>
-                <w:b w:val="false"/>
-                <w:bCs w:val="false"/>
-                <w:color w:val="1B1B1B"/>
-                <w:sz w:val="18"/>
-                <w:szCs w:val="18"/>
-              </w:rPr>
-              <w:t xml:space="preserve">Khung hình chính</w:t>
-            </w:r>
-          </w:p>
-        </w:tc>
-        <w:tc>
-          <w:tcPr>
-            <w:tcW w:type="dxa" w:w="6360"/>
-            <w:tcMar>
-              <w:top w:type="dxa" w:w="60"/>
-              <w:left w:type="dxa" w:w="95"/>
-              <w:bottom w:type="dxa" w:w="60"/>
-              <w:right w:type="dxa" w:w="95"/>
-            </w:tcMar>
-            <w:vAlign w:val="center"/>
-          </w:tcPr>
-          <w:p>
-            <w:pPr>
-              <w:spacing w:after="0" w:line="265"/>
-            </w:pPr>
-            <w:r>
-              <w:rPr>
-                <w:rFonts w:ascii="Arial" w:cs="Arial" w:eastAsia="Arial" w:hAnsi="Arial"/>
-                <w:b w:val="false"/>
-                <w:bCs w:val="false"/>
-                <w:color w:val="1B1B1B"/>
-                <w:sz w:val="18"/>
-                <w:szCs w:val="18"/>
-              </w:rPr>
-              <w:t xml:space="preserve">40.000 (1000 cảnh × 20 giây, mỗi 0,5 giây một lần)</w:t>
-            </w:r>
-          </w:p>
-        </w:tc>
-      </w:tr>
-      <w:tr>
-        <w:trPr>
-          <w:cantSplit/>
-          <w:tblHeader w:val="false"/>
-        </w:trPr>
-        <w:tc>
-          <w:tcPr>
-            <w:tcW w:type="dxa" w:w="3000"/>
-            <w:tcMar>
-              <w:top w:type="dxa" w:w="60"/>
-              <w:left w:type="dxa" w:w="95"/>
-              <w:bottom w:type="dxa" w:w="60"/>
-              <w:right w:type="dxa" w:w="95"/>
-            </w:tcMar>
-            <w:vAlign w:val="center"/>
-          </w:tcPr>
-          <w:p>
-            <w:pPr>
-              <w:spacing w:after="0" w:line="265"/>
-            </w:pPr>
-            <w:r>
-              <w:rPr>
-                <w:rFonts w:ascii="Arial" w:cs="Arial" w:eastAsia="Arial" w:hAnsi="Arial"/>
-                <w:b w:val="false"/>
-                <w:bCs w:val="false"/>
-                <w:color w:val="1B1B1B"/>
-                <w:sz w:val="18"/>
-                <w:szCs w:val="18"/>
-              </w:rPr>
-              <w:t xml:space="preserve">Khung 3D</w:t>
-            </w:r>
-          </w:p>
-        </w:tc>
-        <w:tc>
-          <w:tcPr>
-            <w:tcW w:type="dxa" w:w="6360"/>
-            <w:tcMar>
-              <w:top w:type="dxa" w:w="60"/>
-              <w:left w:type="dxa" w:w="95"/>
-              <w:bottom w:type="dxa" w:w="60"/>
-              <w:right w:type="dxa" w:w="95"/>
-            </w:tcMar>
-            <w:vAlign w:val="center"/>
-          </w:tcPr>
-          <w:p>
-            <w:pPr>
-              <w:spacing w:after="0" w:line="265"/>
-            </w:pPr>
-            <w:r>
-              <w:rPr>
-                <w:rFonts w:ascii="Arial" w:cs="Arial" w:eastAsia="Arial" w:hAnsi="Arial"/>
-                <w:b w:val="false"/>
-                <w:bCs w:val="false"/>
-                <w:color w:val="1B1B1B"/>
-                <w:sz w:val="18"/>
-                <w:szCs w:val="18"/>
-              </w:rPr>
-              <w:t xml:space="preserve">1,4 triệu, người gán từng cái</w:t>
-            </w:r>
-          </w:p>
-        </w:tc>
-      </w:tr>
-      <w:tr>
-        <w:trPr>
-          <w:cantSplit/>
-          <w:tblHeader w:val="false"/>
-        </w:trPr>
-        <w:tc>
-          <w:tcPr>
-            <w:tcW w:type="dxa" w:w="3000"/>
-            <w:tcMar>
-              <w:top w:type="dxa" w:w="60"/>
-              <w:left w:type="dxa" w:w="95"/>
-              <w:bottom w:type="dxa" w:w="60"/>
-              <w:right w:type="dxa" w:w="95"/>
-            </w:tcMar>
-            <w:vAlign w:val="center"/>
-          </w:tcPr>
-          <w:p>
-            <w:pPr>
-              <w:spacing w:after="0" w:line="265"/>
-            </w:pPr>
-            <w:r>
-              <w:rPr>
-                <w:rFonts w:ascii="Arial" w:cs="Arial" w:eastAsia="Arial" w:hAnsi="Arial"/>
-                <w:b w:val="false"/>
-                <w:bCs w:val="false"/>
-                <w:color w:val="1B1B1B"/>
-                <w:sz w:val="18"/>
-                <w:szCs w:val="18"/>
-              </w:rPr>
-              <w:t xml:space="preserve">Loại</w:t>
-            </w:r>
-          </w:p>
-        </w:tc>
-        <w:tc>
-          <w:tcPr>
-            <w:tcW w:type="dxa" w:w="6360"/>
-            <w:tcMar>
-              <w:top w:type="dxa" w:w="60"/>
-              <w:left w:type="dxa" w:w="95"/>
-              <w:bottom w:type="dxa" w:w="60"/>
-              <w:right w:type="dxa" w:w="95"/>
-            </w:tcMar>
-            <w:vAlign w:val="center"/>
-          </w:tcPr>
-          <w:p>
-            <w:pPr>
-              <w:spacing w:after="0" w:line="265"/>
-            </w:pPr>
-            <w:r>
-              <w:rPr>
-                <w:rFonts w:ascii="Arial" w:cs="Arial" w:eastAsia="Arial" w:hAnsi="Arial"/>
-                <w:b w:val="false"/>
-                <w:bCs w:val="false"/>
-                <w:color w:val="1B1B1B"/>
-                <w:sz w:val="18"/>
-                <w:szCs w:val="18"/>
-              </w:rPr>
-              <w:t xml:space="preserve">23 loại (người lớn, trẻ em, ô tô, xe buýt, xe máy, cọc tiêu…)</w:t>
-            </w:r>
-          </w:p>
-        </w:tc>
-      </w:tr>
-      <w:tr>
-        <w:trPr>
-          <w:cantSplit/>
-          <w:tblHeader w:val="false"/>
-        </w:trPr>
-        <w:tc>
-          <w:tcPr>
-            <w:tcW w:type="dxa" w:w="3000"/>
-            <w:tcMar>
-              <w:top w:type="dxa" w:w="60"/>
-              <w:left w:type="dxa" w:w="95"/>
-              <w:bottom w:type="dxa" w:w="60"/>
-              <w:right w:type="dxa" w:w="95"/>
-            </w:tcMar>
-            <w:vAlign w:val="center"/>
-          </w:tcPr>
-          <w:p>
-            <w:pPr>
-              <w:spacing w:after="0" w:line="265"/>
-            </w:pPr>
-            <w:r>
-              <w:rPr>
-                <w:rFonts w:ascii="Arial" w:cs="Arial" w:eastAsia="Arial" w:hAnsi="Arial"/>
-                <w:b w:val="false"/>
-                <w:bCs w:val="false"/>
-                <w:color w:val="1B1B1B"/>
-                <w:sz w:val="18"/>
-                <w:szCs w:val="18"/>
-              </w:rPr>
-              <w:t xml:space="preserve">Bản mini: ô tô và xe máy</w:t>
-            </w:r>
-          </w:p>
-        </w:tc>
-        <w:tc>
-          <w:tcPr>
-            <w:tcW w:type="dxa" w:w="6360"/>
-            <w:tcMar>
-              <w:top w:type="dxa" w:w="60"/>
-              <w:left w:type="dxa" w:w="95"/>
-              <w:bottom w:type="dxa" w:w="60"/>
-              <w:right w:type="dxa" w:w="95"/>
-            </w:tcMar>
-            <w:vAlign w:val="center"/>
-          </w:tcPr>
-          <w:p>
-            <w:pPr>
-              <w:spacing w:after="0" w:line="265"/>
-            </w:pPr>
-            <w:r>
-              <w:rPr>
-                <w:rFonts w:ascii="Arial" w:cs="Arial" w:eastAsia="Arial" w:hAnsi="Arial"/>
-                <w:b w:val="false"/>
-                <w:bCs w:val="false"/>
-                <w:color w:val="1B1B1B"/>
-                <w:sz w:val="18"/>
-                <w:szCs w:val="18"/>
-              </w:rPr>
-              <w:t xml:space="preserve">7.619 khung và 471 khung: xe máy ít hơn 16 lần</w:t>
-            </w:r>
-          </w:p>
-        </w:tc>
-      </w:tr>
-    </w:tbl>
-    <w:p>
-      <w:pPr>
-        <w:spacing w:after="0"/>
-      </w:pPr>
-      <w:r>
-        <w:rPr>
-          <w:rFonts w:ascii="Arial" w:cs="Arial" w:eastAsia="Arial" w:hAnsi="Arial"/>
-          <w:color w:val="1B1B1B"/>
-          <w:sz w:val="22"/>
-          <w:szCs w:val="22"/>
-        </w:rPr>
-        <w:t xml:space="preserve"/>
+          <w:sz w:val="24"/>
+          <w:szCs w:val="24"/>
+        </w:rPr>
+        <w:t xml:space="preserve">Nhìn từ trên xuống: bản đồ từ trên và lưới chiếm chỗ</w:t>
       </w:r>
     </w:p>
     <w:p>
@@ -4318,7 +3699,7 @@
       <w:r>
         <w:drawing>
           <wp:inline distT="0" distB="0" distL="0" distR="0">
-            <wp:extent cx="4572000" cy="2638425"/>
+            <wp:extent cx="5905500" cy="3333750"/>
             <wp:effectExtent t="0" r="0" b="0" l="0"/>
             <wp:docPr id="1" name="" descr="" title=""/>
             <wp:cNvGraphicFramePr>
@@ -4343,7 +3724,7 @@
                   <pic:spPr bwMode="auto">
                     <a:xfrm>
                       <a:off x="0" y="0"/>
-                      <a:ext cx="4572000" cy="2638425"/>
+                      <a:ext cx="5905500" cy="3333750"/>
                     </a:xfrm>
                     <a:prstGeom prst="rect">
                       <a:avLst/>
@@ -4370,7 +3751,302 @@
           <w:sz w:val="19"/>
           <w:szCs w:val="19"/>
         </w:rPr>
-        <w:t xml:space="preserve">Số khung mỗi loại trong nuScenes mini (tuần 7). Đường Boston, Singapore ít xe máy nên sách này dạy rất ít về xe máy. Dữ liệu: nuScenes (Motional), CC BY-NC-SA 4.0</w:t>
+        <w:t xml:space="preserve">Trái: bản đồ từ trên, điểm lidar + khung 3D; phải: lưới chiếm chỗ tính từ cùng khung lidar (ô 0,5 m). scene-0103 (Boston). Dữ liệu: nuScenes (Motional), CC BY-NC-SA 4.0</w:t>
+      </w:r>
+    </w:p>
+    <w:p>
+      <w:pPr>
+        <w:pStyle w:val="ListParagraph"/>
+        <w:widowControl/>
+        <w:numPr>
+          <w:ilvl w:val="0"/>
+          <w:numId w:val="3"/>
+        </w:numPr>
+        <w:spacing w:after="80" w:line="320"/>
+      </w:pPr>
+      <w:r>
+        <w:rPr>
+          <w:rFonts w:ascii="Arial" w:cs="Arial" w:eastAsia="Arial" w:hAnsi="Arial"/>
+          <w:color w:val="1B1B1B"/>
+          <w:sz w:val="22"/>
+          <w:szCs w:val="22"/>
+        </w:rPr>
+        <w:t xml:space="preserve">Ba cái lợi của bản đồ từ trên: các vật </w:t>
+      </w:r>
+      <w:r>
+        <w:rPr>
+          <w:rFonts w:ascii="Arial" w:cs="Arial" w:eastAsia="Arial" w:hAnsi="Arial"/>
+          <w:b/>
+          <w:bCs/>
+          <w:color w:val="24405C"/>
+          <w:sz w:val="22"/>
+          <w:szCs w:val="22"/>
+        </w:rPr>
+        <w:t xml:space="preserve">không che nhau</w:t>
+      </w:r>
+      <w:r>
+        <w:rPr>
+          <w:rFonts w:ascii="Arial" w:cs="Arial" w:eastAsia="Arial" w:hAnsi="Arial"/>
+          <w:color w:val="1B1B1B"/>
+          <w:sz w:val="22"/>
+          <w:szCs w:val="22"/>
+        </w:rPr>
+        <w:t xml:space="preserve">; </w:t>
+      </w:r>
+      <w:r>
+        <w:rPr>
+          <w:rFonts w:ascii="Arial" w:cs="Arial" w:eastAsia="Arial" w:hAnsi="Arial"/>
+          <w:b/>
+          <w:bCs/>
+          <w:color w:val="24405C"/>
+          <w:sz w:val="22"/>
+          <w:szCs w:val="22"/>
+        </w:rPr>
+        <w:t xml:space="preserve">khoảng cách không méo</w:t>
+      </w:r>
+      <w:r>
+        <w:rPr>
+          <w:rFonts w:ascii="Arial" w:cs="Arial" w:eastAsia="Arial" w:hAnsi="Arial"/>
+          <w:color w:val="1B1B1B"/>
+          <w:sz w:val="22"/>
+          <w:szCs w:val="22"/>
+        </w:rPr>
+        <w:t xml:space="preserve">; lái xe vốn là quyết định </w:t>
+      </w:r>
+      <w:r>
+        <w:rPr>
+          <w:rFonts w:ascii="Arial" w:cs="Arial" w:eastAsia="Arial" w:hAnsi="Arial"/>
+          <w:b/>
+          <w:bCs/>
+          <w:color w:val="24405C"/>
+          <w:sz w:val="22"/>
+          <w:szCs w:val="22"/>
+        </w:rPr>
+        <w:t xml:space="preserve">trên mặt đất</w:t>
+      </w:r>
+      <w:r>
+        <w:rPr>
+          <w:rFonts w:ascii="Arial" w:cs="Arial" w:eastAsia="Arial" w:hAnsi="Arial"/>
+          <w:color w:val="1B1B1B"/>
+          <w:sz w:val="22"/>
+          <w:szCs w:val="22"/>
+        </w:rPr>
+        <w:t xml:space="preserve">. Ghép giữa ở tuần 7 là cùng vẽ thành một bản đồ từ trên.</w:t>
+      </w:r>
+    </w:p>
+    <w:p>
+      <w:pPr>
+        <w:pStyle w:val="ListParagraph"/>
+        <w:widowControl/>
+        <w:numPr>
+          <w:ilvl w:val="0"/>
+          <w:numId w:val="3"/>
+        </w:numPr>
+        <w:spacing w:after="80" w:line="320"/>
+      </w:pPr>
+      <w:r>
+        <w:rPr>
+          <w:rFonts w:ascii="Arial" w:cs="Arial" w:eastAsia="Arial" w:hAnsi="Arial"/>
+          <w:color w:val="1B1B1B"/>
+          <w:sz w:val="22"/>
+          <w:szCs w:val="22"/>
+        </w:rPr>
+        <w:t xml:space="preserve">Lưới chiếm chỗ: mỗi ô chỉ hỏi một việc. </w:t>
+      </w:r>
+      <w:r>
+        <w:rPr>
+          <w:rFonts w:ascii="Arial" w:cs="Arial" w:eastAsia="Arial" w:hAnsi="Arial"/>
+          <w:b/>
+          <w:bCs/>
+          <w:color w:val="24405C"/>
+          <w:sz w:val="22"/>
+          <w:szCs w:val="22"/>
+        </w:rPr>
+        <w:t xml:space="preserve">Đỏ = có vật</w:t>
+      </w:r>
+      <w:r>
+        <w:rPr>
+          <w:rFonts w:ascii="Arial" w:cs="Arial" w:eastAsia="Arial" w:hAnsi="Arial"/>
+          <w:color w:val="1B1B1B"/>
+          <w:sz w:val="22"/>
+          <w:szCs w:val="22"/>
+        </w:rPr>
+        <w:t xml:space="preserve">, </w:t>
+      </w:r>
+      <w:r>
+        <w:rPr>
+          <w:rFonts w:ascii="Arial" w:cs="Arial" w:eastAsia="Arial" w:hAnsi="Arial"/>
+          <w:b/>
+          <w:bCs/>
+          <w:color w:val="24405C"/>
+          <w:sz w:val="22"/>
+          <w:szCs w:val="22"/>
+        </w:rPr>
+        <w:t xml:space="preserve">trắng = trống</w:t>
+      </w:r>
+      <w:r>
+        <w:rPr>
+          <w:rFonts w:ascii="Arial" w:cs="Arial" w:eastAsia="Arial" w:hAnsi="Arial"/>
+          <w:color w:val="1B1B1B"/>
+          <w:sz w:val="22"/>
+          <w:szCs w:val="22"/>
+        </w:rPr>
+        <w:t xml:space="preserve"> (tia laser đi qua không chạm gì), </w:t>
+      </w:r>
+      <w:r>
+        <w:rPr>
+          <w:rFonts w:ascii="Arial" w:cs="Arial" w:eastAsia="Arial" w:hAnsi="Arial"/>
+          <w:b/>
+          <w:bCs/>
+          <w:color w:val="24405C"/>
+          <w:sz w:val="22"/>
+          <w:szCs w:val="22"/>
+        </w:rPr>
+        <w:t xml:space="preserve">xám = chưa biết</w:t>
+      </w:r>
+      <w:r>
+        <w:rPr>
+          <w:rFonts w:ascii="Arial" w:cs="Arial" w:eastAsia="Arial" w:hAnsi="Arial"/>
+          <w:color w:val="1B1B1B"/>
+          <w:sz w:val="22"/>
+          <w:szCs w:val="22"/>
+        </w:rPr>
+        <w:t xml:space="preserve"> (bị che, không bắn tới).</w:t>
+      </w:r>
+    </w:p>
+    <w:p>
+      <w:pPr>
+        <w:pStyle w:val="ListParagraph"/>
+        <w:widowControl/>
+        <w:numPr>
+          <w:ilvl w:val="0"/>
+          <w:numId w:val="3"/>
+        </w:numPr>
+        <w:spacing w:after="80" w:line="320"/>
+      </w:pPr>
+      <w:r>
+        <w:rPr>
+          <w:rFonts w:ascii="Arial" w:cs="Arial" w:eastAsia="Arial" w:hAnsi="Arial"/>
+          <w:color w:val="1B1B1B"/>
+          <w:sz w:val="22"/>
+          <w:szCs w:val="22"/>
+        </w:rPr>
+        <w:t xml:space="preserve">Lợi lớn nhất: </w:t>
+      </w:r>
+      <w:r>
+        <w:rPr>
+          <w:rFonts w:ascii="Arial" w:cs="Arial" w:eastAsia="Arial" w:hAnsi="Arial"/>
+          <w:b/>
+          <w:bCs/>
+          <w:color w:val="24405C"/>
+          <w:sz w:val="22"/>
+          <w:szCs w:val="22"/>
+        </w:rPr>
+        <w:t xml:space="preserve">không cần biết là gì</w:t>
+      </w:r>
+      <w:r>
+        <w:rPr>
+          <w:rFonts w:ascii="Arial" w:cs="Arial" w:eastAsia="Arial" w:hAnsi="Arial"/>
+          <w:color w:val="1B1B1B"/>
+          <w:sz w:val="22"/>
+          <w:szCs w:val="22"/>
+        </w:rPr>
+        <w:t xml:space="preserve">. Hàng rơi trên đường, chướng ngại lạ, bộ phát hiện không nhận ra nhưng lưới vẫn tô đỏ. Cẩn thận: «chưa biết» không phải «trống».</w:t>
+      </w:r>
+    </w:p>
+    <w:p>
+      <w:pPr>
+        <w:pStyle w:val="Heading1"/>
+        <w:keepNext/>
+        <w:pageBreakBefore/>
+        <w:spacing w:after="240" w:before="160"/>
+      </w:pPr>
+      <w:r>
+        <w:rPr>
+          <w:rFonts w:ascii="Arial" w:cs="Arial" w:eastAsia="Arial" w:hAnsi="Arial"/>
+          <w:b/>
+          <w:bCs/>
+          <w:color w:val="24405C"/>
+          <w:sz w:val="30"/>
+          <w:szCs w:val="30"/>
+        </w:rPr>
+        <w:t xml:space="preserve">3. Gán nhãn dữ liệu: chuẩn bị đáp án cho máy tính</w:t>
+      </w:r>
+    </w:p>
+    <w:p>
+      <w:pPr>
+        <w:widowControl/>
+        <w:spacing w:after="100" w:before="0" w:line="312"/>
+        <w:ind w:left="0" w:firstLine="0"/>
+      </w:pPr>
+      <w:r>
+        <w:rPr>
+          <w:rFonts w:ascii="Arial" w:cs="Arial" w:eastAsia="Arial" w:hAnsi="Arial"/>
+          <w:color w:val="1B1B1B"/>
+          <w:sz w:val="22"/>
+          <w:szCs w:val="22"/>
+        </w:rPr>
+        <w:t xml:space="preserve">Dữ liệu gán nhãn là sách giáo khoa của mô hình. Ba tình huống làm mô hình học sai: </w:t>
+      </w:r>
+      <w:r>
+        <w:rPr>
+          <w:rFonts w:ascii="Arial" w:cs="Arial" w:eastAsia="Arial" w:hAnsi="Arial"/>
+          <w:b/>
+          <w:bCs/>
+          <w:color w:val="24405C"/>
+          <w:sz w:val="22"/>
+          <w:szCs w:val="22"/>
+        </w:rPr>
+        <w:t xml:space="preserve">thiếu nhãn</w:t>
+      </w:r>
+      <w:r>
+        <w:rPr>
+          <w:rFonts w:ascii="Arial" w:cs="Arial" w:eastAsia="Arial" w:hAnsi="Arial"/>
+          <w:color w:val="1B1B1B"/>
+          <w:sz w:val="22"/>
+          <w:szCs w:val="22"/>
+        </w:rPr>
+        <w:t xml:space="preserve"> (có người mà không khoanh, mô hình học «trông thế này không phải người»), </w:t>
+      </w:r>
+      <w:r>
+        <w:rPr>
+          <w:rFonts w:ascii="Arial" w:cs="Arial" w:eastAsia="Arial" w:hAnsi="Arial"/>
+          <w:b/>
+          <w:bCs/>
+          <w:color w:val="24405C"/>
+          <w:sz w:val="22"/>
+          <w:szCs w:val="22"/>
+        </w:rPr>
+        <w:t xml:space="preserve">sai loại</w:t>
+      </w:r>
+      <w:r>
+        <w:rPr>
+          <w:rFonts w:ascii="Arial" w:cs="Arial" w:eastAsia="Arial" w:hAnsi="Arial"/>
+          <w:color w:val="1B1B1B"/>
+          <w:sz w:val="22"/>
+          <w:szCs w:val="22"/>
+        </w:rPr>
+        <w:t xml:space="preserve"> (xe máy thành xe đạp), </w:t>
+      </w:r>
+      <w:r>
+        <w:rPr>
+          <w:rFonts w:ascii="Arial" w:cs="Arial" w:eastAsia="Arial" w:hAnsi="Arial"/>
+          <w:b/>
+          <w:bCs/>
+          <w:color w:val="24405C"/>
+          <w:sz w:val="22"/>
+          <w:szCs w:val="22"/>
+        </w:rPr>
+        <w:t xml:space="preserve">mỗi người một kiểu</w:t>
+      </w:r>
+      <w:r>
+        <w:rPr>
+          <w:rFonts w:ascii="Arial" w:cs="Arial" w:eastAsia="Arial" w:hAnsi="Arial"/>
+          <w:color w:val="1B1B1B"/>
+          <w:sz w:val="22"/>
+          <w:szCs w:val="22"/>
+        </w:rPr>
+        <w:t xml:space="preserve"> (người khoanh chung người lái với xe máy, người khoanh riêng). Vì vậy gán nhãn chính thức luôn có bộ quy tắc, mọi người theo cùng một bộ, và có kiểm tra.</w:t>
       </w:r>
     </w:p>
     <w:p>
@@ -4387,7 +4063,7 @@
           <w:sz w:val="19"/>
           <w:szCs w:val="19"/>
         </w:rPr>
-        <w:t xml:space="preserve">Bảng 4. Quy tắc gán nhãn chính thức của nuScenes (trích, nguyên văn từ instructions_nuscenes.md)</w:t>
+        <w:t xml:space="preserve">Bảng 3. nuScenes đã gán nhãn bao nhiêu</w:t>
       </w:r>
     </w:p>
     <w:tbl>
@@ -4403,9 +4079,8 @@
         </w:tblBorders>
       </w:tblPr>
       <w:tblGrid>
-        <w:gridCol w:w="2900"/>
-        <w:gridCol w:w="3600"/>
-        <w:gridCol w:w="2860"/>
+        <w:gridCol w:w="3000"/>
+        <w:gridCol w:w="6360"/>
       </w:tblGrid>
       <w:tr>
         <w:trPr>
@@ -4414,7 +4089,7 @@
         </w:trPr>
         <w:tc>
           <w:tcPr>
-            <w:tcW w:type="dxa" w:w="2900"/>
+            <w:tcW w:type="dxa" w:w="3000"/>
             <w:shd w:fill="EDF0F3" w:color="auto" w:val="clear"/>
             <w:tcMar>
               <w:top w:type="dxa" w:w="60"/>
@@ -4437,13 +4112,13 @@
                 <w:sz w:val="18"/>
                 <w:szCs w:val="18"/>
               </w:rPr>
-              <w:t xml:space="preserve">Quy tắc</w:t>
-            </w:r>
-          </w:p>
-        </w:tc>
-        <w:tc>
-          <w:tcPr>
-            <w:tcW w:type="dxa" w:w="3600"/>
+              <w:t xml:space="preserve">Hạng mục</w:t>
+            </w:r>
+          </w:p>
+        </w:tc>
+        <w:tc>
+          <w:tcPr>
+            <w:tcW w:type="dxa" w:w="6360"/>
             <w:shd w:fill="EDF0F3" w:color="auto" w:val="clear"/>
             <w:tcMar>
               <w:top w:type="dxa" w:w="60"/>
@@ -4466,36 +4141,7 @@
                 <w:sz w:val="18"/>
                 <w:szCs w:val="18"/>
               </w:rPr>
-              <w:t xml:space="preserve">Nguyên văn</w:t>
-            </w:r>
-          </w:p>
-        </w:tc>
-        <w:tc>
-          <w:tcPr>
-            <w:tcW w:type="dxa" w:w="2860"/>
-            <w:shd w:fill="EDF0F3" w:color="auto" w:val="clear"/>
-            <w:tcMar>
-              <w:top w:type="dxa" w:w="60"/>
-              <w:left w:type="dxa" w:w="95"/>
-              <w:bottom w:type="dxa" w:w="60"/>
-              <w:right w:type="dxa" w:w="95"/>
-            </w:tcMar>
-            <w:vAlign w:val="center"/>
-          </w:tcPr>
-          <w:p>
-            <w:pPr>
-              <w:spacing w:after="0" w:line="265"/>
-            </w:pPr>
-            <w:r>
-              <w:rPr>
-                <w:rFonts w:ascii="Arial" w:cs="Arial" w:eastAsia="Arial" w:hAnsi="Arial"/>
-                <w:b/>
-                <w:bCs/>
-                <w:color w:val="1B1B1B"/>
-                <w:sz w:val="18"/>
-                <w:szCs w:val="18"/>
-              </w:rPr>
-              <w:t xml:space="preserve">Vì sao</w:t>
+              <w:t xml:space="preserve">Con số</w:t>
             </w:r>
           </w:p>
         </w:tc>
@@ -4507,85 +4153,57 @@
         </w:trPr>
         <w:tc>
           <w:tcPr>
-            <w:tcW w:type="dxa" w:w="2900"/>
-            <w:tcMar>
-              <w:top w:type="dxa" w:w="60"/>
-              <w:left w:type="dxa" w:w="95"/>
-              <w:bottom w:type="dxa" w:w="60"/>
-              <w:right w:type="dxa" w:w="95"/>
-            </w:tcMar>
-            <w:vAlign w:val="center"/>
-          </w:tcPr>
-          <w:p>
-            <w:pPr>
-              <w:spacing w:after="0" w:line="265"/>
-            </w:pPr>
-            <w:r>
-              <w:rPr>
-                <w:rFonts w:ascii="Arial" w:cs="Arial" w:eastAsia="Arial" w:hAnsi="Arial"/>
-                <w:b w:val="false"/>
-                <w:bCs w:val="false"/>
-                <w:color w:val="1B1B1B"/>
-                <w:sz w:val="18"/>
-                <w:szCs w:val="18"/>
-              </w:rPr>
-              <w:t xml:space="preserve">Có ≥ 1 điểm lidar/radar là phải gán</w:t>
-            </w:r>
-          </w:p>
-        </w:tc>
-        <w:tc>
-          <w:tcPr>
-            <w:tcW w:type="dxa" w:w="3600"/>
-            <w:tcMar>
-              <w:top w:type="dxa" w:w="60"/>
-              <w:left w:type="dxa" w:w="95"/>
-              <w:bottom w:type="dxa" w:w="60"/>
-              <w:right w:type="dxa" w:w="95"/>
-            </w:tcMar>
-            <w:vAlign w:val="center"/>
-          </w:tcPr>
-          <w:p>
-            <w:pPr>
-              <w:spacing w:after="0" w:line="265"/>
-            </w:pPr>
-            <w:r>
-              <w:rPr>
-                <w:rFonts w:ascii="Arial" w:cs="Arial" w:eastAsia="Arial" w:hAnsi="Arial"/>
-                <w:b w:val="false"/>
-                <w:bCs w:val="false"/>
-                <w:color w:val="1B1B1B"/>
-                <w:sz w:val="18"/>
-                <w:szCs w:val="18"/>
-              </w:rPr>
-              <w:t xml:space="preserve">Label any target object containing at least 1 LIDAR or RADAR point</w:t>
-            </w:r>
-          </w:p>
-        </w:tc>
-        <w:tc>
-          <w:tcPr>
-            <w:tcW w:type="dxa" w:w="2860"/>
-            <w:tcMar>
-              <w:top w:type="dxa" w:w="60"/>
-              <w:left w:type="dxa" w:w="95"/>
-              <w:bottom w:type="dxa" w:w="60"/>
-              <w:right w:type="dxa" w:w="95"/>
-            </w:tcMar>
-            <w:vAlign w:val="center"/>
-          </w:tcPr>
-          <w:p>
-            <w:pPr>
-              <w:spacing w:after="0" w:line="265"/>
-            </w:pPr>
-            <w:r>
-              <w:rPr>
-                <w:rFonts w:ascii="Arial" w:cs="Arial" w:eastAsia="Arial" w:hAnsi="Arial"/>
-                <w:b w:val="false"/>
-                <w:bCs w:val="false"/>
-                <w:color w:val="1B1B1B"/>
-                <w:sz w:val="18"/>
-                <w:szCs w:val="18"/>
-              </w:rPr>
-              <w:t xml:space="preserve">Cảm biến thấy thì mô hình phải học</w:t>
+            <w:tcW w:type="dxa" w:w="3000"/>
+            <w:tcMar>
+              <w:top w:type="dxa" w:w="60"/>
+              <w:left w:type="dxa" w:w="95"/>
+              <w:bottom w:type="dxa" w:w="60"/>
+              <w:right w:type="dxa" w:w="95"/>
+            </w:tcMar>
+            <w:vAlign w:val="center"/>
+          </w:tcPr>
+          <w:p>
+            <w:pPr>
+              <w:spacing w:after="0" w:line="265"/>
+            </w:pPr>
+            <w:r>
+              <w:rPr>
+                <w:rFonts w:ascii="Arial" w:cs="Arial" w:eastAsia="Arial" w:hAnsi="Arial"/>
+                <w:b w:val="false"/>
+                <w:bCs w:val="false"/>
+                <w:color w:val="1B1B1B"/>
+                <w:sz w:val="18"/>
+                <w:szCs w:val="18"/>
+              </w:rPr>
+              <w:t xml:space="preserve">Khung hình chính</w:t>
+            </w:r>
+          </w:p>
+        </w:tc>
+        <w:tc>
+          <w:tcPr>
+            <w:tcW w:type="dxa" w:w="6360"/>
+            <w:tcMar>
+              <w:top w:type="dxa" w:w="60"/>
+              <w:left w:type="dxa" w:w="95"/>
+              <w:bottom w:type="dxa" w:w="60"/>
+              <w:right w:type="dxa" w:w="95"/>
+            </w:tcMar>
+            <w:vAlign w:val="center"/>
+          </w:tcPr>
+          <w:p>
+            <w:pPr>
+              <w:spacing w:after="0" w:line="265"/>
+            </w:pPr>
+            <w:r>
+              <w:rPr>
+                <w:rFonts w:ascii="Arial" w:cs="Arial" w:eastAsia="Arial" w:hAnsi="Arial"/>
+                <w:b w:val="false"/>
+                <w:bCs w:val="false"/>
+                <w:color w:val="1B1B1B"/>
+                <w:sz w:val="18"/>
+                <w:szCs w:val="18"/>
+              </w:rPr>
+              <w:t xml:space="preserve">40.000 (1000 cảnh × 20 giây, mỗi 0,5 giây một lần)</w:t>
             </w:r>
           </w:p>
         </w:tc>
@@ -4597,85 +4215,57 @@
         </w:trPr>
         <w:tc>
           <w:tcPr>
-            <w:tcW w:type="dxa" w:w="2900"/>
-            <w:tcMar>
-              <w:top w:type="dxa" w:w="60"/>
-              <w:left w:type="dxa" w:w="95"/>
-              <w:bottom w:type="dxa" w:w="60"/>
-              <w:right w:type="dxa" w:w="95"/>
-            </w:tcMar>
-            <w:vAlign w:val="center"/>
-          </w:tcPr>
-          <w:p>
-            <w:pPr>
-              <w:spacing w:after="0" w:line="265"/>
-            </w:pPr>
-            <w:r>
-              <w:rPr>
-                <w:rFonts w:ascii="Arial" w:cs="Arial" w:eastAsia="Arial" w:hAnsi="Arial"/>
-                <w:b w:val="false"/>
-                <w:bCs w:val="false"/>
-                <w:color w:val="1B1B1B"/>
-                <w:sz w:val="18"/>
-                <w:szCs w:val="18"/>
-              </w:rPr>
-              <w:t xml:space="preserve">Khung rất sát</w:t>
-            </w:r>
-          </w:p>
-        </w:tc>
-        <w:tc>
-          <w:tcPr>
-            <w:tcW w:type="dxa" w:w="3600"/>
-            <w:tcMar>
-              <w:top w:type="dxa" w:w="60"/>
-              <w:left w:type="dxa" w:w="95"/>
-              <w:bottom w:type="dxa" w:w="60"/>
-              <w:right w:type="dxa" w:w="95"/>
-            </w:tcMar>
-            <w:vAlign w:val="center"/>
-          </w:tcPr>
-          <w:p>
-            <w:pPr>
-              <w:spacing w:after="0" w:line="265"/>
-            </w:pPr>
-            <w:r>
-              <w:rPr>
-                <w:rFonts w:ascii="Arial" w:cs="Arial" w:eastAsia="Arial" w:hAnsi="Arial"/>
-                <w:b w:val="false"/>
-                <w:bCs w:val="false"/>
-                <w:color w:val="1B1B1B"/>
-                <w:sz w:val="18"/>
-                <w:szCs w:val="18"/>
-              </w:rPr>
-              <w:t xml:space="preserve">Cuboids must be very tight.</w:t>
-            </w:r>
-          </w:p>
-        </w:tc>
-        <w:tc>
-          <w:tcPr>
-            <w:tcW w:type="dxa" w:w="2860"/>
-            <w:tcMar>
-              <w:top w:type="dxa" w:w="60"/>
-              <w:left w:type="dxa" w:w="95"/>
-              <w:bottom w:type="dxa" w:w="60"/>
-              <w:right w:type="dxa" w:w="95"/>
-            </w:tcMar>
-            <w:vAlign w:val="center"/>
-          </w:tcPr>
-          <w:p>
-            <w:pPr>
-              <w:spacing w:after="0" w:line="265"/>
-            </w:pPr>
-            <w:r>
-              <w:rPr>
-                <w:rFonts w:ascii="Arial" w:cs="Arial" w:eastAsia="Arial" w:hAnsi="Arial"/>
-                <w:b w:val="false"/>
-                <w:bCs w:val="false"/>
-                <w:color w:val="1B1B1B"/>
-                <w:sz w:val="18"/>
-                <w:szCs w:val="18"/>
-              </w:rPr>
-              <w:t xml:space="preserve">Khung rộng thì sai vị trí, khoảng cách</w:t>
+            <w:tcW w:type="dxa" w:w="3000"/>
+            <w:tcMar>
+              <w:top w:type="dxa" w:w="60"/>
+              <w:left w:type="dxa" w:w="95"/>
+              <w:bottom w:type="dxa" w:w="60"/>
+              <w:right w:type="dxa" w:w="95"/>
+            </w:tcMar>
+            <w:vAlign w:val="center"/>
+          </w:tcPr>
+          <w:p>
+            <w:pPr>
+              <w:spacing w:after="0" w:line="265"/>
+            </w:pPr>
+            <w:r>
+              <w:rPr>
+                <w:rFonts w:ascii="Arial" w:cs="Arial" w:eastAsia="Arial" w:hAnsi="Arial"/>
+                <w:b w:val="false"/>
+                <w:bCs w:val="false"/>
+                <w:color w:val="1B1B1B"/>
+                <w:sz w:val="18"/>
+                <w:szCs w:val="18"/>
+              </w:rPr>
+              <w:t xml:space="preserve">Khung 3D</w:t>
+            </w:r>
+          </w:p>
+        </w:tc>
+        <w:tc>
+          <w:tcPr>
+            <w:tcW w:type="dxa" w:w="6360"/>
+            <w:tcMar>
+              <w:top w:type="dxa" w:w="60"/>
+              <w:left w:type="dxa" w:w="95"/>
+              <w:bottom w:type="dxa" w:w="60"/>
+              <w:right w:type="dxa" w:w="95"/>
+            </w:tcMar>
+            <w:vAlign w:val="center"/>
+          </w:tcPr>
+          <w:p>
+            <w:pPr>
+              <w:spacing w:after="0" w:line="265"/>
+            </w:pPr>
+            <w:r>
+              <w:rPr>
+                <w:rFonts w:ascii="Arial" w:cs="Arial" w:eastAsia="Arial" w:hAnsi="Arial"/>
+                <w:b w:val="false"/>
+                <w:bCs w:val="false"/>
+                <w:color w:val="1B1B1B"/>
+                <w:sz w:val="18"/>
+                <w:szCs w:val="18"/>
+              </w:rPr>
+              <w:t xml:space="preserve">1,4 triệu, người gán từng cái</w:t>
             </w:r>
           </w:p>
         </w:tc>
@@ -4687,85 +4277,57 @@
         </w:trPr>
         <w:tc>
           <w:tcPr>
-            <w:tcW w:type="dxa" w:w="2900"/>
-            <w:tcMar>
-              <w:top w:type="dxa" w:w="60"/>
-              <w:left w:type="dxa" w:w="95"/>
-              <w:bottom w:type="dxa" w:w="60"/>
-              <w:right w:type="dxa" w:w="95"/>
-            </w:tcMar>
-            <w:vAlign w:val="center"/>
-          </w:tcPr>
-          <w:p>
-            <w:pPr>
-              <w:spacing w:after="0" w:line="265"/>
-            </w:pPr>
-            <w:r>
-              <w:rPr>
-                <w:rFonts w:ascii="Arial" w:cs="Arial" w:eastAsia="Arial" w:hAnsi="Arial"/>
-                <w:b w:val="false"/>
-                <w:bCs w:val="false"/>
-                <w:color w:val="1B1B1B"/>
-                <w:sz w:val="18"/>
-                <w:szCs w:val="18"/>
-              </w:rPr>
-              <w:t xml:space="preserve">Gồm cả tay chân</w:t>
-            </w:r>
-          </w:p>
-        </w:tc>
-        <w:tc>
-          <w:tcPr>
-            <w:tcW w:type="dxa" w:w="3600"/>
-            <w:tcMar>
-              <w:top w:type="dxa" w:w="60"/>
-              <w:left w:type="dxa" w:w="95"/>
-              <w:bottom w:type="dxa" w:w="60"/>
-              <w:right w:type="dxa" w:w="95"/>
-            </w:tcMar>
-            <w:vAlign w:val="center"/>
-          </w:tcPr>
-          <w:p>
-            <w:pPr>
-              <w:spacing w:after="0" w:line="265"/>
-            </w:pPr>
-            <w:r>
-              <w:rPr>
-                <w:rFonts w:ascii="Arial" w:cs="Arial" w:eastAsia="Arial" w:hAnsi="Arial"/>
-                <w:b w:val="false"/>
-                <w:bCs w:val="false"/>
-                <w:color w:val="1B1B1B"/>
-                <w:sz w:val="18"/>
-                <w:szCs w:val="18"/>
-              </w:rPr>
-              <w:t xml:space="preserve">…should include the extremities.</w:t>
-            </w:r>
-          </w:p>
-        </w:tc>
-        <w:tc>
-          <w:tcPr>
-            <w:tcW w:type="dxa" w:w="2860"/>
-            <w:tcMar>
-              <w:top w:type="dxa" w:w="60"/>
-              <w:left w:type="dxa" w:w="95"/>
-              <w:bottom w:type="dxa" w:w="60"/>
-              <w:right w:type="dxa" w:w="95"/>
-            </w:tcMar>
-            <w:vAlign w:val="center"/>
-          </w:tcPr>
-          <w:p>
-            <w:pPr>
-              <w:spacing w:after="0" w:line="265"/>
-            </w:pPr>
-            <w:r>
-              <w:rPr>
-                <w:rFonts w:ascii="Arial" w:cs="Arial" w:eastAsia="Arial" w:hAnsi="Arial"/>
-                <w:b w:val="false"/>
-                <w:bCs w:val="false"/>
-                <w:color w:val="1B1B1B"/>
-                <w:sz w:val="18"/>
-                <w:szCs w:val="18"/>
-              </w:rPr>
-              <w:t xml:space="preserve">Tay giơ ra cũng có thể bị đụng</w:t>
+            <w:tcW w:type="dxa" w:w="3000"/>
+            <w:tcMar>
+              <w:top w:type="dxa" w:w="60"/>
+              <w:left w:type="dxa" w:w="95"/>
+              <w:bottom w:type="dxa" w:w="60"/>
+              <w:right w:type="dxa" w:w="95"/>
+            </w:tcMar>
+            <w:vAlign w:val="center"/>
+          </w:tcPr>
+          <w:p>
+            <w:pPr>
+              <w:spacing w:after="0" w:line="265"/>
+            </w:pPr>
+            <w:r>
+              <w:rPr>
+                <w:rFonts w:ascii="Arial" w:cs="Arial" w:eastAsia="Arial" w:hAnsi="Arial"/>
+                <w:b w:val="false"/>
+                <w:bCs w:val="false"/>
+                <w:color w:val="1B1B1B"/>
+                <w:sz w:val="18"/>
+                <w:szCs w:val="18"/>
+              </w:rPr>
+              <w:t xml:space="preserve">Loại</w:t>
+            </w:r>
+          </w:p>
+        </w:tc>
+        <w:tc>
+          <w:tcPr>
+            <w:tcW w:type="dxa" w:w="6360"/>
+            <w:tcMar>
+              <w:top w:type="dxa" w:w="60"/>
+              <w:left w:type="dxa" w:w="95"/>
+              <w:bottom w:type="dxa" w:w="60"/>
+              <w:right w:type="dxa" w:w="95"/>
+            </w:tcMar>
+            <w:vAlign w:val="center"/>
+          </w:tcPr>
+          <w:p>
+            <w:pPr>
+              <w:spacing w:after="0" w:line="265"/>
+            </w:pPr>
+            <w:r>
+              <w:rPr>
+                <w:rFonts w:ascii="Arial" w:cs="Arial" w:eastAsia="Arial" w:hAnsi="Arial"/>
+                <w:b w:val="false"/>
+                <w:bCs w:val="false"/>
+                <w:color w:val="1B1B1B"/>
+                <w:sz w:val="18"/>
+                <w:szCs w:val="18"/>
+              </w:rPr>
+              <w:t xml:space="preserve">23 loại (người lớn, trẻ em, ô tô, xe buýt, xe máy, cọc tiêu…)</w:t>
             </w:r>
           </w:p>
         </w:tc>
@@ -4777,265 +4339,57 @@
         </w:trPr>
         <w:tc>
           <w:tcPr>
-            <w:tcW w:type="dxa" w:w="2900"/>
-            <w:tcMar>
-              <w:top w:type="dxa" w:w="60"/>
-              <w:left w:type="dxa" w:w="95"/>
-              <w:bottom w:type="dxa" w:w="60"/>
-              <w:right w:type="dxa" w:w="95"/>
-            </w:tcMar>
-            <w:vAlign w:val="center"/>
-          </w:tcPr>
-          <w:p>
-            <w:pPr>
-              <w:spacing w:after="0" w:line="265"/>
-            </w:pPr>
-            <w:r>
-              <w:rPr>
-                <w:rFonts w:ascii="Arial" w:cs="Arial" w:eastAsia="Arial" w:hAnsi="Arial"/>
-                <w:b w:val="false"/>
-                <w:bCs w:val="false"/>
-                <w:color w:val="1B1B1B"/>
-                <w:sz w:val="18"/>
-                <w:szCs w:val="18"/>
-              </w:rPr>
-              <w:t xml:space="preserve">Có người lái: chung khung với xe</w:t>
-            </w:r>
-          </w:p>
-        </w:tc>
-        <w:tc>
-          <w:tcPr>
-            <w:tcW w:type="dxa" w:w="3600"/>
-            <w:tcMar>
-              <w:top w:type="dxa" w:w="60"/>
-              <w:left w:type="dxa" w:w="95"/>
-              <w:bottom w:type="dxa" w:w="60"/>
-              <w:right w:type="dxa" w:w="95"/>
-            </w:tcMar>
-            <w:vAlign w:val="center"/>
-          </w:tcPr>
-          <w:p>
-            <w:pPr>
-              <w:spacing w:after="0" w:line="265"/>
-            </w:pPr>
-            <w:r>
-              <w:rPr>
-                <w:rFonts w:ascii="Arial" w:cs="Arial" w:eastAsia="Arial" w:hAnsi="Arial"/>
-                <w:b w:val="false"/>
-                <w:bCs w:val="false"/>
-                <w:color w:val="1B1B1B"/>
-                <w:sz w:val="18"/>
-                <w:szCs w:val="18"/>
-              </w:rPr>
-              <w:t xml:space="preserve">If there is a rider, include the rider in the box.</w:t>
-            </w:r>
-          </w:p>
-        </w:tc>
-        <w:tc>
-          <w:tcPr>
-            <w:tcW w:type="dxa" w:w="2860"/>
-            <w:tcMar>
-              <w:top w:type="dxa" w:w="60"/>
-              <w:left w:type="dxa" w:w="95"/>
-              <w:bottom w:type="dxa" w:w="60"/>
-              <w:right w:type="dxa" w:w="95"/>
-            </w:tcMar>
-            <w:vAlign w:val="center"/>
-          </w:tcPr>
-          <w:p>
-            <w:pPr>
-              <w:spacing w:after="0" w:line="265"/>
-            </w:pPr>
-            <w:r>
-              <w:rPr>
-                <w:rFonts w:ascii="Arial" w:cs="Arial" w:eastAsia="Arial" w:hAnsi="Arial"/>
-                <w:b w:val="false"/>
-                <w:bCs w:val="false"/>
-                <w:color w:val="1B1B1B"/>
-                <w:sz w:val="18"/>
-                <w:szCs w:val="18"/>
-              </w:rPr>
-              <w:t xml:space="preserve">Người và xe đi cùng nhau</w:t>
-            </w:r>
-          </w:p>
-        </w:tc>
-      </w:tr>
-      <w:tr>
-        <w:trPr>
-          <w:cantSplit/>
-          <w:tblHeader w:val="false"/>
-        </w:trPr>
-        <w:tc>
-          <w:tcPr>
-            <w:tcW w:type="dxa" w:w="2900"/>
-            <w:tcMar>
-              <w:top w:type="dxa" w:w="60"/>
-              <w:left w:type="dxa" w:w="95"/>
-              <w:bottom w:type="dxa" w:w="60"/>
-              <w:right w:type="dxa" w:w="95"/>
-            </w:tcMar>
-            <w:vAlign w:val="center"/>
-          </w:tcPr>
-          <w:p>
-            <w:pPr>
-              <w:spacing w:after="0" w:line="265"/>
-            </w:pPr>
-            <w:r>
-              <w:rPr>
-                <w:rFonts w:ascii="Arial" w:cs="Arial" w:eastAsia="Arial" w:hAnsi="Arial"/>
-                <w:b w:val="false"/>
-                <w:bCs w:val="false"/>
-                <w:color w:val="1B1B1B"/>
-                <w:sz w:val="18"/>
-                <w:szCs w:val="18"/>
-              </w:rPr>
-              <w:t xml:space="preserve">Người đứng cạnh: khoanh riêng</w:t>
-            </w:r>
-          </w:p>
-        </w:tc>
-        <w:tc>
-          <w:tcPr>
-            <w:tcW w:type="dxa" w:w="3600"/>
-            <w:tcMar>
-              <w:top w:type="dxa" w:w="60"/>
-              <w:left w:type="dxa" w:w="95"/>
-              <w:bottom w:type="dxa" w:w="60"/>
-              <w:right w:type="dxa" w:w="95"/>
-            </w:tcMar>
-            <w:vAlign w:val="center"/>
-          </w:tcPr>
-          <w:p>
-            <w:pPr>
-              <w:spacing w:after="0" w:line="265"/>
-            </w:pPr>
-            <w:r>
-              <w:rPr>
-                <w:rFonts w:ascii="Arial" w:cs="Arial" w:eastAsia="Arial" w:hAnsi="Arial"/>
-                <w:b w:val="false"/>
-                <w:bCs w:val="false"/>
-                <w:color w:val="1B1B1B"/>
-                <w:sz w:val="18"/>
-                <w:szCs w:val="18"/>
-              </w:rPr>
-              <w:t xml:space="preserve">…standing next to the motorcycle, do NOT include…</w:t>
-            </w:r>
-          </w:p>
-        </w:tc>
-        <w:tc>
-          <w:tcPr>
-            <w:tcW w:type="dxa" w:w="2860"/>
-            <w:tcMar>
-              <w:top w:type="dxa" w:w="60"/>
-              <w:left w:type="dxa" w:w="95"/>
-              <w:bottom w:type="dxa" w:w="60"/>
-              <w:right w:type="dxa" w:w="95"/>
-            </w:tcMar>
-            <w:vAlign w:val="center"/>
-          </w:tcPr>
-          <w:p>
-            <w:pPr>
-              <w:spacing w:after="0" w:line="265"/>
-            </w:pPr>
-            <w:r>
-              <w:rPr>
-                <w:rFonts w:ascii="Arial" w:cs="Arial" w:eastAsia="Arial" w:hAnsi="Arial"/>
-                <w:b w:val="false"/>
-                <w:bCs w:val="false"/>
-                <w:color w:val="1B1B1B"/>
-                <w:sz w:val="18"/>
-                <w:szCs w:val="18"/>
-              </w:rPr>
-              <w:t xml:space="preserve">Người đó có thể đi chỗ khác</w:t>
-            </w:r>
-          </w:p>
-        </w:tc>
-      </w:tr>
-      <w:tr>
-        <w:trPr>
-          <w:cantSplit/>
-          <w:tblHeader w:val="false"/>
-        </w:trPr>
-        <w:tc>
-          <w:tcPr>
-            <w:tcW w:type="dxa" w:w="2900"/>
-            <w:tcMar>
-              <w:top w:type="dxa" w:w="60"/>
-              <w:left w:type="dxa" w:w="95"/>
-              <w:bottom w:type="dxa" w:w="60"/>
-              <w:right w:type="dxa" w:w="95"/>
-            </w:tcMar>
-            <w:vAlign w:val="center"/>
-          </w:tcPr>
-          <w:p>
-            <w:pPr>
-              <w:spacing w:after="0" w:line="265"/>
-            </w:pPr>
-            <w:r>
-              <w:rPr>
-                <w:rFonts w:ascii="Arial" w:cs="Arial" w:eastAsia="Arial" w:hAnsi="Arial"/>
-                <w:b w:val="false"/>
-                <w:bCs w:val="false"/>
-                <w:color w:val="1B1B1B"/>
-                <w:sz w:val="18"/>
-                <w:szCs w:val="18"/>
-              </w:rPr>
-              <w:t xml:space="preserve">Độ thấy được 4 mức</w:t>
-            </w:r>
-          </w:p>
-        </w:tc>
-        <w:tc>
-          <w:tcPr>
-            <w:tcW w:type="dxa" w:w="3600"/>
-            <w:tcMar>
-              <w:top w:type="dxa" w:w="60"/>
-              <w:left w:type="dxa" w:w="95"/>
-              <w:bottom w:type="dxa" w:w="60"/>
-              <w:right w:type="dxa" w:w="95"/>
-            </w:tcMar>
-            <w:vAlign w:val="center"/>
-          </w:tcPr>
-          <w:p>
-            <w:pPr>
-              <w:spacing w:after="0" w:line="265"/>
-            </w:pPr>
-            <w:r>
-              <w:rPr>
-                <w:rFonts w:ascii="Arial" w:cs="Arial" w:eastAsia="Arial" w:hAnsi="Arial"/>
-                <w:b w:val="false"/>
-                <w:bCs w:val="false"/>
-                <w:color w:val="1B1B1B"/>
-                <w:sz w:val="18"/>
-                <w:szCs w:val="18"/>
-              </w:rPr>
-              <w:t xml:space="preserve">0–40%, 41–60%, 61–80%, 81–100%</w:t>
-            </w:r>
-          </w:p>
-        </w:tc>
-        <w:tc>
-          <w:tcPr>
-            <w:tcW w:type="dxa" w:w="2860"/>
-            <w:tcMar>
-              <w:top w:type="dxa" w:w="60"/>
-              <w:left w:type="dxa" w:w="95"/>
-              <w:bottom w:type="dxa" w:w="60"/>
-              <w:right w:type="dxa" w:w="95"/>
-            </w:tcMar>
-            <w:vAlign w:val="center"/>
-          </w:tcPr>
-          <w:p>
-            <w:pPr>
-              <w:spacing w:after="0" w:line="265"/>
-            </w:pPr>
-            <w:r>
-              <w:rPr>
-                <w:rFonts w:ascii="Arial" w:cs="Arial" w:eastAsia="Arial" w:hAnsi="Arial"/>
-                <w:b w:val="false"/>
-                <w:bCs w:val="false"/>
-                <w:color w:val="1B1B1B"/>
-                <w:sz w:val="18"/>
-                <w:szCs w:val="18"/>
-              </w:rPr>
-              <w:t xml:space="preserve">Biết vật nào bị che nhiều</w:t>
+            <w:tcW w:type="dxa" w:w="3000"/>
+            <w:tcMar>
+              <w:top w:type="dxa" w:w="60"/>
+              <w:left w:type="dxa" w:w="95"/>
+              <w:bottom w:type="dxa" w:w="60"/>
+              <w:right w:type="dxa" w:w="95"/>
+            </w:tcMar>
+            <w:vAlign w:val="center"/>
+          </w:tcPr>
+          <w:p>
+            <w:pPr>
+              <w:spacing w:after="0" w:line="265"/>
+            </w:pPr>
+            <w:r>
+              <w:rPr>
+                <w:rFonts w:ascii="Arial" w:cs="Arial" w:eastAsia="Arial" w:hAnsi="Arial"/>
+                <w:b w:val="false"/>
+                <w:bCs w:val="false"/>
+                <w:color w:val="1B1B1B"/>
+                <w:sz w:val="18"/>
+                <w:szCs w:val="18"/>
+              </w:rPr>
+              <w:t xml:space="preserve">Bản mini: ô tô và xe máy</w:t>
+            </w:r>
+          </w:p>
+        </w:tc>
+        <w:tc>
+          <w:tcPr>
+            <w:tcW w:type="dxa" w:w="6360"/>
+            <w:tcMar>
+              <w:top w:type="dxa" w:w="60"/>
+              <w:left w:type="dxa" w:w="95"/>
+              <w:bottom w:type="dxa" w:w="60"/>
+              <w:right w:type="dxa" w:w="95"/>
+            </w:tcMar>
+            <w:vAlign w:val="center"/>
+          </w:tcPr>
+          <w:p>
+            <w:pPr>
+              <w:spacing w:after="0" w:line="265"/>
+            </w:pPr>
+            <w:r>
+              <w:rPr>
+                <w:rFonts w:ascii="Arial" w:cs="Arial" w:eastAsia="Arial" w:hAnsi="Arial"/>
+                <w:b w:val="false"/>
+                <w:bCs w:val="false"/>
+                <w:color w:val="1B1B1B"/>
+                <w:sz w:val="18"/>
+                <w:szCs w:val="18"/>
+              </w:rPr>
+              <w:t xml:space="preserve">7.619 khung và 471 khung: xe máy ít hơn 16 lần</w:t>
             </w:r>
           </w:p>
         </w:tc>
@@ -5064,7 +4418,7 @@
       <w:r>
         <w:drawing>
           <wp:inline distT="0" distB="0" distL="0" distR="0">
-            <wp:extent cx="5334000" cy="1990725"/>
+            <wp:extent cx="4572000" cy="2638425"/>
             <wp:effectExtent t="0" r="0" b="0" l="0"/>
             <wp:docPr id="1" name="" descr="" title=""/>
             <wp:cNvGraphicFramePr>
@@ -5089,7 +4443,7 @@
                   <pic:spPr bwMode="auto">
                     <a:xfrm>
                       <a:off x="0" y="0"/>
-                      <a:ext cx="5334000" cy="1990725"/>
+                      <a:ext cx="4572000" cy="2638425"/>
                     </a:xfrm>
                     <a:prstGeom prst="rect">
                       <a:avLst/>
@@ -5116,35 +4470,681 @@
           <w:sz w:val="19"/>
           <w:szCs w:val="19"/>
         </w:rPr>
-        <w:t xml:space="preserve">Người lái nằm trong khung của xe: trái xe đạp scene-0103, phải xe máy scene-1100 (khung chính thức). Dữ liệu: nuScenes (Motional), CC BY-NC-SA 4.0</w:t>
+        <w:t xml:space="preserve">Số khung mỗi loại trong nuScenes mini (tuần 7). Đường Boston, Singapore ít xe máy nên sách này dạy rất ít về xe máy. Dữ liệu: nuScenes (Motional), CC BY-NC-SA 4.0</w:t>
       </w:r>
     </w:p>
     <w:p>
       <w:pPr>
-        <w:widowControl/>
-        <w:spacing w:after="100" w:before="0" w:line="312"/>
-        <w:ind w:left="0" w:firstLine="0"/>
-      </w:pPr>
-      <w:r>
-        <w:rPr>
-          <w:rFonts w:ascii="Arial" w:cs="Arial" w:eastAsia="Arial" w:hAnsi="Arial"/>
-          <w:color w:val="1B1B1B"/>
-          <w:sz w:val="22"/>
-          <w:szCs w:val="22"/>
-        </w:rPr>
-        <w:t xml:space="preserve">Ở Hà Nội, một xe máy chở ba người, theo quy tắc nuScenes là </w:t>
-      </w:r>
+        <w:keepNext/>
+        <w:spacing w:after="70" w:before="190"/>
+      </w:pPr>
       <w:r>
         <w:rPr>
           <w:rFonts w:ascii="Arial" w:cs="Arial" w:eastAsia="Arial" w:hAnsi="Arial"/>
           <w:b/>
           <w:bCs/>
           <w:color w:val="24405C"/>
-          <w:sz w:val="22"/>
-          <w:szCs w:val="22"/>
-        </w:rPr>
-        <w:t xml:space="preserve">một khung</w:t>
-      </w:r>
+          <w:sz w:val="19"/>
+          <w:szCs w:val="19"/>
+        </w:rPr>
+        <w:t xml:space="preserve">Bảng 4. Quy tắc gán nhãn chính thức của nuScenes (trích, nguyên văn từ instructions_nuscenes.md)</w:t>
+      </w:r>
+    </w:p>
+    <w:tbl>
+      <w:tblPr>
+        <w:tblW w:type="dxa" w:w="9360"/>
+        <w:tblBorders>
+          <w:top w:val="single" w:color="8A949C" w:sz="8"/>
+          <w:left w:val="none"/>
+          <w:bottom w:val="single" w:color="8A949C" w:sz="8"/>
+          <w:right w:val="none"/>
+          <w:insideH w:val="single" w:color="BFC7CE" w:sz="2"/>
+          <w:insideV w:val="none"/>
+        </w:tblBorders>
+      </w:tblPr>
+      <w:tblGrid>
+        <w:gridCol w:w="2900"/>
+        <w:gridCol w:w="3600"/>
+        <w:gridCol w:w="2860"/>
+      </w:tblGrid>
+      <w:tr>
+        <w:trPr>
+          <w:cantSplit/>
+          <w:tblHeader/>
+        </w:trPr>
+        <w:tc>
+          <w:tcPr>
+            <w:tcW w:type="dxa" w:w="2900"/>
+            <w:shd w:fill="EDF0F3" w:color="auto" w:val="clear"/>
+            <w:tcMar>
+              <w:top w:type="dxa" w:w="60"/>
+              <w:left w:type="dxa" w:w="95"/>
+              <w:bottom w:type="dxa" w:w="60"/>
+              <w:right w:type="dxa" w:w="95"/>
+            </w:tcMar>
+            <w:vAlign w:val="center"/>
+          </w:tcPr>
+          <w:p>
+            <w:pPr>
+              <w:spacing w:after="0" w:line="265"/>
+            </w:pPr>
+            <w:r>
+              <w:rPr>
+                <w:rFonts w:ascii="Arial" w:cs="Arial" w:eastAsia="Arial" w:hAnsi="Arial"/>
+                <w:b/>
+                <w:bCs/>
+                <w:color w:val="1B1B1B"/>
+                <w:sz w:val="18"/>
+                <w:szCs w:val="18"/>
+              </w:rPr>
+              <w:t xml:space="preserve">Quy tắc</w:t>
+            </w:r>
+          </w:p>
+        </w:tc>
+        <w:tc>
+          <w:tcPr>
+            <w:tcW w:type="dxa" w:w="3600"/>
+            <w:shd w:fill="EDF0F3" w:color="auto" w:val="clear"/>
+            <w:tcMar>
+              <w:top w:type="dxa" w:w="60"/>
+              <w:left w:type="dxa" w:w="95"/>
+              <w:bottom w:type="dxa" w:w="60"/>
+              <w:right w:type="dxa" w:w="95"/>
+            </w:tcMar>
+            <w:vAlign w:val="center"/>
+          </w:tcPr>
+          <w:p>
+            <w:pPr>
+              <w:spacing w:after="0" w:line="265"/>
+            </w:pPr>
+            <w:r>
+              <w:rPr>
+                <w:rFonts w:ascii="Arial" w:cs="Arial" w:eastAsia="Arial" w:hAnsi="Arial"/>
+                <w:b/>
+                <w:bCs/>
+                <w:color w:val="1B1B1B"/>
+                <w:sz w:val="18"/>
+                <w:szCs w:val="18"/>
+              </w:rPr>
+              <w:t xml:space="preserve">Nguyên văn</w:t>
+            </w:r>
+          </w:p>
+        </w:tc>
+        <w:tc>
+          <w:tcPr>
+            <w:tcW w:type="dxa" w:w="2860"/>
+            <w:shd w:fill="EDF0F3" w:color="auto" w:val="clear"/>
+            <w:tcMar>
+              <w:top w:type="dxa" w:w="60"/>
+              <w:left w:type="dxa" w:w="95"/>
+              <w:bottom w:type="dxa" w:w="60"/>
+              <w:right w:type="dxa" w:w="95"/>
+            </w:tcMar>
+            <w:vAlign w:val="center"/>
+          </w:tcPr>
+          <w:p>
+            <w:pPr>
+              <w:spacing w:after="0" w:line="265"/>
+            </w:pPr>
+            <w:r>
+              <w:rPr>
+                <w:rFonts w:ascii="Arial" w:cs="Arial" w:eastAsia="Arial" w:hAnsi="Arial"/>
+                <w:b/>
+                <w:bCs/>
+                <w:color w:val="1B1B1B"/>
+                <w:sz w:val="18"/>
+                <w:szCs w:val="18"/>
+              </w:rPr>
+              <w:t xml:space="preserve">Vì sao</w:t>
+            </w:r>
+          </w:p>
+        </w:tc>
+      </w:tr>
+      <w:tr>
+        <w:trPr>
+          <w:cantSplit/>
+          <w:tblHeader w:val="false"/>
+        </w:trPr>
+        <w:tc>
+          <w:tcPr>
+            <w:tcW w:type="dxa" w:w="2900"/>
+            <w:tcMar>
+              <w:top w:type="dxa" w:w="60"/>
+              <w:left w:type="dxa" w:w="95"/>
+              <w:bottom w:type="dxa" w:w="60"/>
+              <w:right w:type="dxa" w:w="95"/>
+            </w:tcMar>
+            <w:vAlign w:val="center"/>
+          </w:tcPr>
+          <w:p>
+            <w:pPr>
+              <w:spacing w:after="0" w:line="265"/>
+            </w:pPr>
+            <w:r>
+              <w:rPr>
+                <w:rFonts w:ascii="Arial" w:cs="Arial" w:eastAsia="Arial" w:hAnsi="Arial"/>
+                <w:b w:val="false"/>
+                <w:bCs w:val="false"/>
+                <w:color w:val="1B1B1B"/>
+                <w:sz w:val="18"/>
+                <w:szCs w:val="18"/>
+              </w:rPr>
+              <w:t xml:space="preserve">Có ≥ 1 điểm lidar/radar là phải gán</w:t>
+            </w:r>
+          </w:p>
+        </w:tc>
+        <w:tc>
+          <w:tcPr>
+            <w:tcW w:type="dxa" w:w="3600"/>
+            <w:tcMar>
+              <w:top w:type="dxa" w:w="60"/>
+              <w:left w:type="dxa" w:w="95"/>
+              <w:bottom w:type="dxa" w:w="60"/>
+              <w:right w:type="dxa" w:w="95"/>
+            </w:tcMar>
+            <w:vAlign w:val="center"/>
+          </w:tcPr>
+          <w:p>
+            <w:pPr>
+              <w:spacing w:after="0" w:line="265"/>
+            </w:pPr>
+            <w:r>
+              <w:rPr>
+                <w:rFonts w:ascii="Arial" w:cs="Arial" w:eastAsia="Arial" w:hAnsi="Arial"/>
+                <w:b w:val="false"/>
+                <w:bCs w:val="false"/>
+                <w:color w:val="1B1B1B"/>
+                <w:sz w:val="18"/>
+                <w:szCs w:val="18"/>
+              </w:rPr>
+              <w:t xml:space="preserve">Label any target object containing at least 1 LIDAR or RADAR point</w:t>
+            </w:r>
+          </w:p>
+        </w:tc>
+        <w:tc>
+          <w:tcPr>
+            <w:tcW w:type="dxa" w:w="2860"/>
+            <w:tcMar>
+              <w:top w:type="dxa" w:w="60"/>
+              <w:left w:type="dxa" w:w="95"/>
+              <w:bottom w:type="dxa" w:w="60"/>
+              <w:right w:type="dxa" w:w="95"/>
+            </w:tcMar>
+            <w:vAlign w:val="center"/>
+          </w:tcPr>
+          <w:p>
+            <w:pPr>
+              <w:spacing w:after="0" w:line="265"/>
+            </w:pPr>
+            <w:r>
+              <w:rPr>
+                <w:rFonts w:ascii="Arial" w:cs="Arial" w:eastAsia="Arial" w:hAnsi="Arial"/>
+                <w:b w:val="false"/>
+                <w:bCs w:val="false"/>
+                <w:color w:val="1B1B1B"/>
+                <w:sz w:val="18"/>
+                <w:szCs w:val="18"/>
+              </w:rPr>
+              <w:t xml:space="preserve">Cảm biến thấy thì mô hình phải học</w:t>
+            </w:r>
+          </w:p>
+        </w:tc>
+      </w:tr>
+      <w:tr>
+        <w:trPr>
+          <w:cantSplit/>
+          <w:tblHeader w:val="false"/>
+        </w:trPr>
+        <w:tc>
+          <w:tcPr>
+            <w:tcW w:type="dxa" w:w="2900"/>
+            <w:tcMar>
+              <w:top w:type="dxa" w:w="60"/>
+              <w:left w:type="dxa" w:w="95"/>
+              <w:bottom w:type="dxa" w:w="60"/>
+              <w:right w:type="dxa" w:w="95"/>
+            </w:tcMar>
+            <w:vAlign w:val="center"/>
+          </w:tcPr>
+          <w:p>
+            <w:pPr>
+              <w:spacing w:after="0" w:line="265"/>
+            </w:pPr>
+            <w:r>
+              <w:rPr>
+                <w:rFonts w:ascii="Arial" w:cs="Arial" w:eastAsia="Arial" w:hAnsi="Arial"/>
+                <w:b w:val="false"/>
+                <w:bCs w:val="false"/>
+                <w:color w:val="1B1B1B"/>
+                <w:sz w:val="18"/>
+                <w:szCs w:val="18"/>
+              </w:rPr>
+              <w:t xml:space="preserve">Khung rất sát</w:t>
+            </w:r>
+          </w:p>
+        </w:tc>
+        <w:tc>
+          <w:tcPr>
+            <w:tcW w:type="dxa" w:w="3600"/>
+            <w:tcMar>
+              <w:top w:type="dxa" w:w="60"/>
+              <w:left w:type="dxa" w:w="95"/>
+              <w:bottom w:type="dxa" w:w="60"/>
+              <w:right w:type="dxa" w:w="95"/>
+            </w:tcMar>
+            <w:vAlign w:val="center"/>
+          </w:tcPr>
+          <w:p>
+            <w:pPr>
+              <w:spacing w:after="0" w:line="265"/>
+            </w:pPr>
+            <w:r>
+              <w:rPr>
+                <w:rFonts w:ascii="Arial" w:cs="Arial" w:eastAsia="Arial" w:hAnsi="Arial"/>
+                <w:b w:val="false"/>
+                <w:bCs w:val="false"/>
+                <w:color w:val="1B1B1B"/>
+                <w:sz w:val="18"/>
+                <w:szCs w:val="18"/>
+              </w:rPr>
+              <w:t xml:space="preserve">Cuboids must be very tight.</w:t>
+            </w:r>
+          </w:p>
+        </w:tc>
+        <w:tc>
+          <w:tcPr>
+            <w:tcW w:type="dxa" w:w="2860"/>
+            <w:tcMar>
+              <w:top w:type="dxa" w:w="60"/>
+              <w:left w:type="dxa" w:w="95"/>
+              <w:bottom w:type="dxa" w:w="60"/>
+              <w:right w:type="dxa" w:w="95"/>
+            </w:tcMar>
+            <w:vAlign w:val="center"/>
+          </w:tcPr>
+          <w:p>
+            <w:pPr>
+              <w:spacing w:after="0" w:line="265"/>
+            </w:pPr>
+            <w:r>
+              <w:rPr>
+                <w:rFonts w:ascii="Arial" w:cs="Arial" w:eastAsia="Arial" w:hAnsi="Arial"/>
+                <w:b w:val="false"/>
+                <w:bCs w:val="false"/>
+                <w:color w:val="1B1B1B"/>
+                <w:sz w:val="18"/>
+                <w:szCs w:val="18"/>
+              </w:rPr>
+              <w:t xml:space="preserve">Khung rộng thì sai vị trí, khoảng cách</w:t>
+            </w:r>
+          </w:p>
+        </w:tc>
+      </w:tr>
+      <w:tr>
+        <w:trPr>
+          <w:cantSplit/>
+          <w:tblHeader w:val="false"/>
+        </w:trPr>
+        <w:tc>
+          <w:tcPr>
+            <w:tcW w:type="dxa" w:w="2900"/>
+            <w:tcMar>
+              <w:top w:type="dxa" w:w="60"/>
+              <w:left w:type="dxa" w:w="95"/>
+              <w:bottom w:type="dxa" w:w="60"/>
+              <w:right w:type="dxa" w:w="95"/>
+            </w:tcMar>
+            <w:vAlign w:val="center"/>
+          </w:tcPr>
+          <w:p>
+            <w:pPr>
+              <w:spacing w:after="0" w:line="265"/>
+            </w:pPr>
+            <w:r>
+              <w:rPr>
+                <w:rFonts w:ascii="Arial" w:cs="Arial" w:eastAsia="Arial" w:hAnsi="Arial"/>
+                <w:b w:val="false"/>
+                <w:bCs w:val="false"/>
+                <w:color w:val="1B1B1B"/>
+                <w:sz w:val="18"/>
+                <w:szCs w:val="18"/>
+              </w:rPr>
+              <w:t xml:space="preserve">Gồm cả tay chân</w:t>
+            </w:r>
+          </w:p>
+        </w:tc>
+        <w:tc>
+          <w:tcPr>
+            <w:tcW w:type="dxa" w:w="3600"/>
+            <w:tcMar>
+              <w:top w:type="dxa" w:w="60"/>
+              <w:left w:type="dxa" w:w="95"/>
+              <w:bottom w:type="dxa" w:w="60"/>
+              <w:right w:type="dxa" w:w="95"/>
+            </w:tcMar>
+            <w:vAlign w:val="center"/>
+          </w:tcPr>
+          <w:p>
+            <w:pPr>
+              <w:spacing w:after="0" w:line="265"/>
+            </w:pPr>
+            <w:r>
+              <w:rPr>
+                <w:rFonts w:ascii="Arial" w:cs="Arial" w:eastAsia="Arial" w:hAnsi="Arial"/>
+                <w:b w:val="false"/>
+                <w:bCs w:val="false"/>
+                <w:color w:val="1B1B1B"/>
+                <w:sz w:val="18"/>
+                <w:szCs w:val="18"/>
+              </w:rPr>
+              <w:t xml:space="preserve">…should include the extremities.</w:t>
+            </w:r>
+          </w:p>
+        </w:tc>
+        <w:tc>
+          <w:tcPr>
+            <w:tcW w:type="dxa" w:w="2860"/>
+            <w:tcMar>
+              <w:top w:type="dxa" w:w="60"/>
+              <w:left w:type="dxa" w:w="95"/>
+              <w:bottom w:type="dxa" w:w="60"/>
+              <w:right w:type="dxa" w:w="95"/>
+            </w:tcMar>
+            <w:vAlign w:val="center"/>
+          </w:tcPr>
+          <w:p>
+            <w:pPr>
+              <w:spacing w:after="0" w:line="265"/>
+            </w:pPr>
+            <w:r>
+              <w:rPr>
+                <w:rFonts w:ascii="Arial" w:cs="Arial" w:eastAsia="Arial" w:hAnsi="Arial"/>
+                <w:b w:val="false"/>
+                <w:bCs w:val="false"/>
+                <w:color w:val="1B1B1B"/>
+                <w:sz w:val="18"/>
+                <w:szCs w:val="18"/>
+              </w:rPr>
+              <w:t xml:space="preserve">Tay giơ ra cũng có thể bị đụng</w:t>
+            </w:r>
+          </w:p>
+        </w:tc>
+      </w:tr>
+      <w:tr>
+        <w:trPr>
+          <w:cantSplit/>
+          <w:tblHeader w:val="false"/>
+        </w:trPr>
+        <w:tc>
+          <w:tcPr>
+            <w:tcW w:type="dxa" w:w="2900"/>
+            <w:tcMar>
+              <w:top w:type="dxa" w:w="60"/>
+              <w:left w:type="dxa" w:w="95"/>
+              <w:bottom w:type="dxa" w:w="60"/>
+              <w:right w:type="dxa" w:w="95"/>
+            </w:tcMar>
+            <w:vAlign w:val="center"/>
+          </w:tcPr>
+          <w:p>
+            <w:pPr>
+              <w:spacing w:after="0" w:line="265"/>
+            </w:pPr>
+            <w:r>
+              <w:rPr>
+                <w:rFonts w:ascii="Arial" w:cs="Arial" w:eastAsia="Arial" w:hAnsi="Arial"/>
+                <w:b w:val="false"/>
+                <w:bCs w:val="false"/>
+                <w:color w:val="1B1B1B"/>
+                <w:sz w:val="18"/>
+                <w:szCs w:val="18"/>
+              </w:rPr>
+              <w:t xml:space="preserve">Có người lái: chung khung với xe</w:t>
+            </w:r>
+          </w:p>
+        </w:tc>
+        <w:tc>
+          <w:tcPr>
+            <w:tcW w:type="dxa" w:w="3600"/>
+            <w:tcMar>
+              <w:top w:type="dxa" w:w="60"/>
+              <w:left w:type="dxa" w:w="95"/>
+              <w:bottom w:type="dxa" w:w="60"/>
+              <w:right w:type="dxa" w:w="95"/>
+            </w:tcMar>
+            <w:vAlign w:val="center"/>
+          </w:tcPr>
+          <w:p>
+            <w:pPr>
+              <w:spacing w:after="0" w:line="265"/>
+            </w:pPr>
+            <w:r>
+              <w:rPr>
+                <w:rFonts w:ascii="Arial" w:cs="Arial" w:eastAsia="Arial" w:hAnsi="Arial"/>
+                <w:b w:val="false"/>
+                <w:bCs w:val="false"/>
+                <w:color w:val="1B1B1B"/>
+                <w:sz w:val="18"/>
+                <w:szCs w:val="18"/>
+              </w:rPr>
+              <w:t xml:space="preserve">If there is a rider, include the rider in the box.</w:t>
+            </w:r>
+          </w:p>
+        </w:tc>
+        <w:tc>
+          <w:tcPr>
+            <w:tcW w:type="dxa" w:w="2860"/>
+            <w:tcMar>
+              <w:top w:type="dxa" w:w="60"/>
+              <w:left w:type="dxa" w:w="95"/>
+              <w:bottom w:type="dxa" w:w="60"/>
+              <w:right w:type="dxa" w:w="95"/>
+            </w:tcMar>
+            <w:vAlign w:val="center"/>
+          </w:tcPr>
+          <w:p>
+            <w:pPr>
+              <w:spacing w:after="0" w:line="265"/>
+            </w:pPr>
+            <w:r>
+              <w:rPr>
+                <w:rFonts w:ascii="Arial" w:cs="Arial" w:eastAsia="Arial" w:hAnsi="Arial"/>
+                <w:b w:val="false"/>
+                <w:bCs w:val="false"/>
+                <w:color w:val="1B1B1B"/>
+                <w:sz w:val="18"/>
+                <w:szCs w:val="18"/>
+              </w:rPr>
+              <w:t xml:space="preserve">Người và xe đi cùng nhau</w:t>
+            </w:r>
+          </w:p>
+        </w:tc>
+      </w:tr>
+      <w:tr>
+        <w:trPr>
+          <w:cantSplit/>
+          <w:tblHeader w:val="false"/>
+        </w:trPr>
+        <w:tc>
+          <w:tcPr>
+            <w:tcW w:type="dxa" w:w="2900"/>
+            <w:tcMar>
+              <w:top w:type="dxa" w:w="60"/>
+              <w:left w:type="dxa" w:w="95"/>
+              <w:bottom w:type="dxa" w:w="60"/>
+              <w:right w:type="dxa" w:w="95"/>
+            </w:tcMar>
+            <w:vAlign w:val="center"/>
+          </w:tcPr>
+          <w:p>
+            <w:pPr>
+              <w:spacing w:after="0" w:line="265"/>
+            </w:pPr>
+            <w:r>
+              <w:rPr>
+                <w:rFonts w:ascii="Arial" w:cs="Arial" w:eastAsia="Arial" w:hAnsi="Arial"/>
+                <w:b w:val="false"/>
+                <w:bCs w:val="false"/>
+                <w:color w:val="1B1B1B"/>
+                <w:sz w:val="18"/>
+                <w:szCs w:val="18"/>
+              </w:rPr>
+              <w:t xml:space="preserve">Người đứng cạnh: khoanh riêng</w:t>
+            </w:r>
+          </w:p>
+        </w:tc>
+        <w:tc>
+          <w:tcPr>
+            <w:tcW w:type="dxa" w:w="3600"/>
+            <w:tcMar>
+              <w:top w:type="dxa" w:w="60"/>
+              <w:left w:type="dxa" w:w="95"/>
+              <w:bottom w:type="dxa" w:w="60"/>
+              <w:right w:type="dxa" w:w="95"/>
+            </w:tcMar>
+            <w:vAlign w:val="center"/>
+          </w:tcPr>
+          <w:p>
+            <w:pPr>
+              <w:spacing w:after="0" w:line="265"/>
+            </w:pPr>
+            <w:r>
+              <w:rPr>
+                <w:rFonts w:ascii="Arial" w:cs="Arial" w:eastAsia="Arial" w:hAnsi="Arial"/>
+                <w:b w:val="false"/>
+                <w:bCs w:val="false"/>
+                <w:color w:val="1B1B1B"/>
+                <w:sz w:val="18"/>
+                <w:szCs w:val="18"/>
+              </w:rPr>
+              <w:t xml:space="preserve">…standing next to the motorcycle, do NOT include…</w:t>
+            </w:r>
+          </w:p>
+        </w:tc>
+        <w:tc>
+          <w:tcPr>
+            <w:tcW w:type="dxa" w:w="2860"/>
+            <w:tcMar>
+              <w:top w:type="dxa" w:w="60"/>
+              <w:left w:type="dxa" w:w="95"/>
+              <w:bottom w:type="dxa" w:w="60"/>
+              <w:right w:type="dxa" w:w="95"/>
+            </w:tcMar>
+            <w:vAlign w:val="center"/>
+          </w:tcPr>
+          <w:p>
+            <w:pPr>
+              <w:spacing w:after="0" w:line="265"/>
+            </w:pPr>
+            <w:r>
+              <w:rPr>
+                <w:rFonts w:ascii="Arial" w:cs="Arial" w:eastAsia="Arial" w:hAnsi="Arial"/>
+                <w:b w:val="false"/>
+                <w:bCs w:val="false"/>
+                <w:color w:val="1B1B1B"/>
+                <w:sz w:val="18"/>
+                <w:szCs w:val="18"/>
+              </w:rPr>
+              <w:t xml:space="preserve">Người đó có thể đi chỗ khác</w:t>
+            </w:r>
+          </w:p>
+        </w:tc>
+      </w:tr>
+      <w:tr>
+        <w:trPr>
+          <w:cantSplit/>
+          <w:tblHeader w:val="false"/>
+        </w:trPr>
+        <w:tc>
+          <w:tcPr>
+            <w:tcW w:type="dxa" w:w="2900"/>
+            <w:tcMar>
+              <w:top w:type="dxa" w:w="60"/>
+              <w:left w:type="dxa" w:w="95"/>
+              <w:bottom w:type="dxa" w:w="60"/>
+              <w:right w:type="dxa" w:w="95"/>
+            </w:tcMar>
+            <w:vAlign w:val="center"/>
+          </w:tcPr>
+          <w:p>
+            <w:pPr>
+              <w:spacing w:after="0" w:line="265"/>
+            </w:pPr>
+            <w:r>
+              <w:rPr>
+                <w:rFonts w:ascii="Arial" w:cs="Arial" w:eastAsia="Arial" w:hAnsi="Arial"/>
+                <w:b w:val="false"/>
+                <w:bCs w:val="false"/>
+                <w:color w:val="1B1B1B"/>
+                <w:sz w:val="18"/>
+                <w:szCs w:val="18"/>
+              </w:rPr>
+              <w:t xml:space="preserve">Độ thấy được 4 mức</w:t>
+            </w:r>
+          </w:p>
+        </w:tc>
+        <w:tc>
+          <w:tcPr>
+            <w:tcW w:type="dxa" w:w="3600"/>
+            <w:tcMar>
+              <w:top w:type="dxa" w:w="60"/>
+              <w:left w:type="dxa" w:w="95"/>
+              <w:bottom w:type="dxa" w:w="60"/>
+              <w:right w:type="dxa" w:w="95"/>
+            </w:tcMar>
+            <w:vAlign w:val="center"/>
+          </w:tcPr>
+          <w:p>
+            <w:pPr>
+              <w:spacing w:after="0" w:line="265"/>
+            </w:pPr>
+            <w:r>
+              <w:rPr>
+                <w:rFonts w:ascii="Arial" w:cs="Arial" w:eastAsia="Arial" w:hAnsi="Arial"/>
+                <w:b w:val="false"/>
+                <w:bCs w:val="false"/>
+                <w:color w:val="1B1B1B"/>
+                <w:sz w:val="18"/>
+                <w:szCs w:val="18"/>
+              </w:rPr>
+              <w:t xml:space="preserve">0–40%, 41–60%, 61–80%, 81–100%</w:t>
+            </w:r>
+          </w:p>
+        </w:tc>
+        <w:tc>
+          <w:tcPr>
+            <w:tcW w:type="dxa" w:w="2860"/>
+            <w:tcMar>
+              <w:top w:type="dxa" w:w="60"/>
+              <w:left w:type="dxa" w:w="95"/>
+              <w:bottom w:type="dxa" w:w="60"/>
+              <w:right w:type="dxa" w:w="95"/>
+            </w:tcMar>
+            <w:vAlign w:val="center"/>
+          </w:tcPr>
+          <w:p>
+            <w:pPr>
+              <w:spacing w:after="0" w:line="265"/>
+            </w:pPr>
+            <w:r>
+              <w:rPr>
+                <w:rFonts w:ascii="Arial" w:cs="Arial" w:eastAsia="Arial" w:hAnsi="Arial"/>
+                <w:b w:val="false"/>
+                <w:bCs w:val="false"/>
+                <w:color w:val="1B1B1B"/>
+                <w:sz w:val="18"/>
+                <w:szCs w:val="18"/>
+              </w:rPr>
+              <w:t xml:space="preserve">Biết vật nào bị che nhiều</w:t>
+            </w:r>
+          </w:p>
+        </w:tc>
+      </w:tr>
+    </w:tbl>
+    <w:p>
+      <w:pPr>
+        <w:spacing w:after="0"/>
+      </w:pPr>
       <w:r>
         <w:rPr>
           <w:rFonts w:ascii="Arial" w:cs="Arial" w:eastAsia="Arial" w:hAnsi="Arial"/>
@@ -5152,45 +5152,7 @@
           <w:sz w:val="22"/>
           <w:szCs w:val="22"/>
         </w:rPr>
-        <w:t xml:space="preserve">, loại xe máy. Đổi sang quy tắc khoanh riêng từng người cũng được, quan trọng là </w:t>
-      </w:r>
-      <w:r>
-        <w:rPr>
-          <w:rFonts w:ascii="Arial" w:cs="Arial" w:eastAsia="Arial" w:hAnsi="Arial"/>
-          <w:b/>
-          <w:bCs/>
-          <w:color w:val="24405C"/>
-          <w:sz w:val="22"/>
-          <w:szCs w:val="22"/>
-        </w:rPr>
-        <w:t xml:space="preserve">cả bộ dữ liệu dùng cùng một quy tắc</w:t>
-      </w:r>
-      <w:r>
-        <w:rPr>
-          <w:rFonts w:ascii="Arial" w:cs="Arial" w:eastAsia="Arial" w:hAnsi="Arial"/>
-          <w:color w:val="1B1B1B"/>
-          <w:sz w:val="22"/>
-          <w:szCs w:val="22"/>
-        </w:rPr>
-        <w:t xml:space="preserve">.</w:t>
-      </w:r>
-    </w:p>
-    <w:p>
-      <w:pPr>
-        <w:pStyle w:val="Heading2"/>
-        <w:keepNext/>
-        <w:spacing w:after="130" w:before="300"/>
-      </w:pPr>
-      <w:r>
-        <w:rPr>
-          <w:rFonts w:ascii="Arial" w:cs="Arial" w:eastAsia="Arial" w:hAnsi="Arial"/>
-          <w:b/>
-          <w:bCs/>
-          <w:color w:val="24405C"/>
-          <w:sz w:val="24"/>
-          <w:szCs w:val="24"/>
-        </w:rPr>
-        <w:t xml:space="preserve">IoU: hai khung giống nhau bao nhiêu</w:t>
+        <w:t xml:space="preserve"/>
       </w:r>
     </w:p>
     <w:p>
@@ -5202,7 +5164,7 @@
       <w:r>
         <w:drawing>
           <wp:inline distT="0" distB="0" distL="0" distR="0">
-            <wp:extent cx="5334000" cy="2038350"/>
+            <wp:extent cx="5334000" cy="1990725"/>
             <wp:effectExtent t="0" r="0" b="0" l="0"/>
             <wp:docPr id="1" name="" descr="" title=""/>
             <wp:cNvGraphicFramePr>
@@ -5227,6 +5189,144 @@
                   <pic:spPr bwMode="auto">
                     <a:xfrm>
                       <a:off x="0" y="0"/>
+                      <a:ext cx="5334000" cy="1990725"/>
+                    </a:xfrm>
+                    <a:prstGeom prst="rect">
+                      <a:avLst/>
+                    </a:prstGeom>
+                  </pic:spPr>
+                </pic:pic>
+              </a:graphicData>
+            </a:graphic>
+          </wp:inline>
+        </w:drawing>
+      </w:r>
+    </w:p>
+    <w:p>
+      <w:pPr>
+        <w:keepNext w:val="false"/>
+        <w:spacing w:after="70" w:before="190"/>
+      </w:pPr>
+      <w:r>
+        <w:rPr>
+          <w:rFonts w:ascii="Arial" w:cs="Arial" w:eastAsia="Arial" w:hAnsi="Arial"/>
+          <w:b/>
+          <w:bCs/>
+          <w:color w:val="24405C"/>
+          <w:sz w:val="19"/>
+          <w:szCs w:val="19"/>
+        </w:rPr>
+        <w:t xml:space="preserve">Người lái nằm trong khung của xe: trái xe đạp scene-0103, phải xe máy scene-1100 (khung chính thức). Dữ liệu: nuScenes (Motional), CC BY-NC-SA 4.0</w:t>
+      </w:r>
+    </w:p>
+    <w:p>
+      <w:pPr>
+        <w:widowControl/>
+        <w:spacing w:after="100" w:before="0" w:line="312"/>
+        <w:ind w:left="0" w:firstLine="0"/>
+      </w:pPr>
+      <w:r>
+        <w:rPr>
+          <w:rFonts w:ascii="Arial" w:cs="Arial" w:eastAsia="Arial" w:hAnsi="Arial"/>
+          <w:color w:val="1B1B1B"/>
+          <w:sz w:val="22"/>
+          <w:szCs w:val="22"/>
+        </w:rPr>
+        <w:t xml:space="preserve">Ở Hà Nội, một xe máy chở ba người, theo quy tắc nuScenes là </w:t>
+      </w:r>
+      <w:r>
+        <w:rPr>
+          <w:rFonts w:ascii="Arial" w:cs="Arial" w:eastAsia="Arial" w:hAnsi="Arial"/>
+          <w:b/>
+          <w:bCs/>
+          <w:color w:val="24405C"/>
+          <w:sz w:val="22"/>
+          <w:szCs w:val="22"/>
+        </w:rPr>
+        <w:t xml:space="preserve">một khung</w:t>
+      </w:r>
+      <w:r>
+        <w:rPr>
+          <w:rFonts w:ascii="Arial" w:cs="Arial" w:eastAsia="Arial" w:hAnsi="Arial"/>
+          <w:color w:val="1B1B1B"/>
+          <w:sz w:val="22"/>
+          <w:szCs w:val="22"/>
+        </w:rPr>
+        <w:t xml:space="preserve">, loại xe máy. Đổi sang quy tắc khoanh riêng từng người cũng được, quan trọng là </w:t>
+      </w:r>
+      <w:r>
+        <w:rPr>
+          <w:rFonts w:ascii="Arial" w:cs="Arial" w:eastAsia="Arial" w:hAnsi="Arial"/>
+          <w:b/>
+          <w:bCs/>
+          <w:color w:val="24405C"/>
+          <w:sz w:val="22"/>
+          <w:szCs w:val="22"/>
+        </w:rPr>
+        <w:t xml:space="preserve">cả bộ dữ liệu dùng cùng một quy tắc</w:t>
+      </w:r>
+      <w:r>
+        <w:rPr>
+          <w:rFonts w:ascii="Arial" w:cs="Arial" w:eastAsia="Arial" w:hAnsi="Arial"/>
+          <w:color w:val="1B1B1B"/>
+          <w:sz w:val="22"/>
+          <w:szCs w:val="22"/>
+        </w:rPr>
+        <w:t xml:space="preserve">.</w:t>
+      </w:r>
+    </w:p>
+    <w:p>
+      <w:pPr>
+        <w:pStyle w:val="Heading2"/>
+        <w:keepNext/>
+        <w:spacing w:after="130" w:before="300"/>
+      </w:pPr>
+      <w:r>
+        <w:rPr>
+          <w:rFonts w:ascii="Arial" w:cs="Arial" w:eastAsia="Arial" w:hAnsi="Arial"/>
+          <w:b/>
+          <w:bCs/>
+          <w:color w:val="24405C"/>
+          <w:sz w:val="24"/>
+          <w:szCs w:val="24"/>
+        </w:rPr>
+        <w:t xml:space="preserve">IoU: hai khung giống nhau bao nhiêu</w:t>
+      </w:r>
+    </w:p>
+    <w:p>
+      <w:pPr>
+        <w:keepNext/>
+        <w:spacing w:after="60" w:before="60"/>
+        <w:jc w:val="center"/>
+      </w:pPr>
+      <w:r>
+        <w:drawing>
+          <wp:inline distT="0" distB="0" distL="0" distR="0">
+            <wp:extent cx="5334000" cy="2038350"/>
+            <wp:effectExtent t="0" r="0" b="0" l="0"/>
+            <wp:docPr id="1" name="" descr="" title=""/>
+            <wp:cNvGraphicFramePr>
+              <a:graphicFrameLocks xmlns:a="http://schemas.openxmlformats.org/drawingml/2006/main" noChangeAspect="1"/>
+            </wp:cNvGraphicFramePr>
+            <a:graphic xmlns:a="http://schemas.openxmlformats.org/drawingml/2006/main">
+              <a:graphicData uri="http://schemas.openxmlformats.org/drawingml/2006/picture">
+                <pic:pic xmlns:pic="http://schemas.openxmlformats.org/drawingml/2006/picture">
+                  <pic:nvPicPr>
+                    <pic:cNvPr id="0" name="" descr=""/>
+                    <pic:cNvPicPr>
+                      <a:picLocks noChangeAspect="1" noChangeArrowheads="1"/>
+                    </pic:cNvPicPr>
+                  </pic:nvPicPr>
+                  <pic:blipFill>
+                    <a:blip r:embed="rId21" cstate="none"/>
+                    <a:srcRect/>
+                    <a:stretch>
+                      <a:fillRect/>
+                    </a:stretch>
+                  </pic:blipFill>
+                  <pic:spPr bwMode="auto">
+                    <a:xfrm>
+                      <a:off x="0" y="0"/>
                       <a:ext cx="5334000" cy="2038350"/>
                     </a:xfrm>
                     <a:prstGeom prst="rect">
@@ -5353,7 +5453,7 @@
                     </pic:cNvPicPr>
                   </pic:nvPicPr>
                   <pic:blipFill>
-                    <a:blip r:embed="rId21" cstate="none"/>
+                    <a:blip r:embed="rId22" cstate="none"/>
                     <a:srcRect/>
                     <a:stretch>
                       <a:fillRect/>

</xml_diff>

<commit_message>
Week 8 L1: explain rules vs machine learning vs deep learning with real data (aspect-ratio ML demo, YOLOX first-layer filters, real feature maps)
Co-Authored-By: Claude Opus 5.5 <noreply@anthropic.com>
</commit_message>
<xml_diff>
--- a/第八週(10-29)/Nguyên lý xe tự lái_Tuần 8_Tài liệu học tập.docx
+++ b/第八週(10-29)/Nguyên lý xe tự lái_Tuần 8_Tài liệu học tập.docx
@@ -1315,19 +1315,24 @@
           <w:sz w:val="24"/>
           <w:szCs w:val="24"/>
         </w:rPr>
-        <w:t xml:space="preserve">Học sâu học thế nào: đoán, so đáp án, sửa một chút</w:t>
+        <w:t xml:space="preserve">Viết luật, học máy, học sâu: khác ở chỗ ai quyết định «nhìn cái gì»</w:t>
       </w:r>
     </w:p>
     <w:p>
       <w:pPr>
-        <w:pStyle w:val="ListParagraph"/>
         <w:widowControl/>
-        <w:numPr>
-          <w:ilvl w:val="0"/>
-          <w:numId w:val="2"/>
-        </w:numPr>
-        <w:spacing w:after="80" w:line="320"/>
-      </w:pPr>
+        <w:spacing w:after="100" w:before="0" w:line="312"/>
+        <w:ind w:left="0" w:firstLine="0"/>
+      </w:pPr>
+      <w:r>
+        <w:rPr>
+          <w:rFonts w:ascii="Arial" w:cs="Arial" w:eastAsia="Arial" w:hAnsi="Arial"/>
+          <w:color w:val="1B1B1B"/>
+          <w:sz w:val="22"/>
+          <w:szCs w:val="22"/>
+        </w:rPr>
+        <w:t xml:space="preserve">Để nhận ra một vật có hai câu hỏi: </w:t>
+      </w:r>
       <w:r>
         <w:rPr>
           <w:rFonts w:ascii="Arial" w:cs="Arial" w:eastAsia="Arial" w:hAnsi="Arial"/>
@@ -1337,7 +1342,7 @@
           <w:sz w:val="22"/>
           <w:szCs w:val="22"/>
         </w:rPr>
-        <w:t xml:space="preserve">Đoán</w:t>
+        <w:t xml:space="preserve">nhìn cái gì</w:t>
       </w:r>
       <w:r>
         <w:rPr>
@@ -1346,19 +1351,8 @@
           <w:sz w:val="22"/>
           <w:szCs w:val="22"/>
         </w:rPr>
-        <w:t xml:space="preserve">: đưa một ảnh vào, mô hình đoán «ở đây có một người, khung ở đây».</w:t>
-      </w:r>
-    </w:p>
-    <w:p>
-      <w:pPr>
-        <w:pStyle w:val="ListParagraph"/>
-        <w:widowControl/>
-        <w:numPr>
-          <w:ilvl w:val="0"/>
-          <w:numId w:val="2"/>
-        </w:numPr>
-        <w:spacing w:after="80" w:line="320"/>
-      </w:pPr>
+        <w:t xml:space="preserve"> (tính chất nào của ảnh, gọi là «đặc trưng», ví dụ khung cao gầy hay thấp rộng, màu, hướng của cạnh) và </w:t>
+      </w:r>
       <w:r>
         <w:rPr>
           <w:rFonts w:ascii="Arial" w:cs="Arial" w:eastAsia="Arial" w:hAnsi="Arial"/>
@@ -1368,7 +1362,7 @@
           <w:sz w:val="22"/>
           <w:szCs w:val="22"/>
         </w:rPr>
-        <w:t xml:space="preserve">So đáp án</w:t>
+        <w:t xml:space="preserve">phán thế nào</w:t>
       </w:r>
       <w:r>
         <w:rPr>
@@ -1377,18 +1371,13 @@
           <w:sz w:val="22"/>
           <w:szCs w:val="22"/>
         </w:rPr>
-        <w:t xml:space="preserve">: so với đáp án con người gán nhãn, lệch bao nhiêu.</w:t>
+        <w:t xml:space="preserve"> (bao nhiêu trở lên là người). Ba cách khác nhau ở chỗ ai trả lời hai câu này.</w:t>
       </w:r>
     </w:p>
     <w:p>
       <w:pPr>
-        <w:pStyle w:val="ListParagraph"/>
-        <w:widowControl/>
-        <w:numPr>
-          <w:ilvl w:val="0"/>
-          <w:numId w:val="2"/>
-        </w:numPr>
-        <w:spacing w:after="80" w:line="320"/>
+        <w:keepNext/>
+        <w:spacing w:after="70" w:before="190"/>
       </w:pPr>
       <w:r>
         <w:rPr>
@@ -1396,11 +1385,865 @@
           <w:b/>
           <w:bCs/>
           <w:color w:val="24405C"/>
-          <w:sz w:val="22"/>
-          <w:szCs w:val="22"/>
-        </w:rPr>
-        <w:t xml:space="preserve">Sửa một chút</w:t>
-      </w:r>
+          <w:sz w:val="19"/>
+          <w:szCs w:val="19"/>
+        </w:rPr>
+        <w:t xml:space="preserve">Bảng 1. So sánh ba cách</w:t>
+      </w:r>
+    </w:p>
+    <w:tbl>
+      <w:tblPr>
+        <w:tblW w:type="dxa" w:w="9360"/>
+        <w:tblBorders>
+          <w:top w:val="single" w:color="8A949C" w:sz="8"/>
+          <w:left w:val="none"/>
+          <w:bottom w:val="single" w:color="8A949C" w:sz="8"/>
+          <w:right w:val="none"/>
+          <w:insideH w:val="single" w:color="BFC7CE" w:sz="2"/>
+          <w:insideV w:val="none"/>
+        </w:tblBorders>
+      </w:tblPr>
+      <w:tblGrid>
+        <w:gridCol w:w="1900"/>
+        <w:gridCol w:w="2400"/>
+        <w:gridCol w:w="2500"/>
+        <w:gridCol w:w="2560"/>
+      </w:tblGrid>
+      <w:tr>
+        <w:trPr>
+          <w:cantSplit/>
+          <w:tblHeader/>
+        </w:trPr>
+        <w:tc>
+          <w:tcPr>
+            <w:tcW w:type="dxa" w:w="1900"/>
+            <w:shd w:fill="EDF0F3" w:color="auto" w:val="clear"/>
+            <w:tcMar>
+              <w:top w:type="dxa" w:w="60"/>
+              <w:left w:type="dxa" w:w="95"/>
+              <w:bottom w:type="dxa" w:w="60"/>
+              <w:right w:type="dxa" w:w="95"/>
+            </w:tcMar>
+            <w:vAlign w:val="center"/>
+          </w:tcPr>
+          <w:p>
+            <w:pPr>
+              <w:spacing w:after="0" w:line="265"/>
+            </w:pPr>
+            <w:r>
+              <w:rPr>
+                <w:rFonts w:ascii="Arial" w:cs="Arial" w:eastAsia="Arial" w:hAnsi="Arial"/>
+                <w:b/>
+                <w:bCs/>
+                <w:color w:val="1B1B1B"/>
+                <w:sz w:val="18"/>
+                <w:szCs w:val="18"/>
+              </w:rPr>
+              <w:t xml:space="preserve"/>
+            </w:r>
+          </w:p>
+        </w:tc>
+        <w:tc>
+          <w:tcPr>
+            <w:tcW w:type="dxa" w:w="2400"/>
+            <w:shd w:fill="EDF0F3" w:color="auto" w:val="clear"/>
+            <w:tcMar>
+              <w:top w:type="dxa" w:w="60"/>
+              <w:left w:type="dxa" w:w="95"/>
+              <w:bottom w:type="dxa" w:w="60"/>
+              <w:right w:type="dxa" w:w="95"/>
+            </w:tcMar>
+            <w:vAlign w:val="center"/>
+          </w:tcPr>
+          <w:p>
+            <w:pPr>
+              <w:spacing w:after="0" w:line="265"/>
+            </w:pPr>
+            <w:r>
+              <w:rPr>
+                <w:rFonts w:ascii="Arial" w:cs="Arial" w:eastAsia="Arial" w:hAnsi="Arial"/>
+                <w:b/>
+                <w:bCs/>
+                <w:color w:val="1B1B1B"/>
+                <w:sz w:val="18"/>
+                <w:szCs w:val="18"/>
+              </w:rPr>
+              <w:t xml:space="preserve">Viết luật</w:t>
+            </w:r>
+          </w:p>
+        </w:tc>
+        <w:tc>
+          <w:tcPr>
+            <w:tcW w:type="dxa" w:w="2500"/>
+            <w:shd w:fill="EDF0F3" w:color="auto" w:val="clear"/>
+            <w:tcMar>
+              <w:top w:type="dxa" w:w="60"/>
+              <w:left w:type="dxa" w:w="95"/>
+              <w:bottom w:type="dxa" w:w="60"/>
+              <w:right w:type="dxa" w:w="95"/>
+            </w:tcMar>
+            <w:vAlign w:val="center"/>
+          </w:tcPr>
+          <w:p>
+            <w:pPr>
+              <w:spacing w:after="0" w:line="265"/>
+            </w:pPr>
+            <w:r>
+              <w:rPr>
+                <w:rFonts w:ascii="Arial" w:cs="Arial" w:eastAsia="Arial" w:hAnsi="Arial"/>
+                <w:b/>
+                <w:bCs/>
+                <w:color w:val="1B1B1B"/>
+                <w:sz w:val="18"/>
+                <w:szCs w:val="18"/>
+              </w:rPr>
+              <w:t xml:space="preserve">Học máy (truyền thống)</w:t>
+            </w:r>
+          </w:p>
+        </w:tc>
+        <w:tc>
+          <w:tcPr>
+            <w:tcW w:type="dxa" w:w="2560"/>
+            <w:shd w:fill="EDF0F3" w:color="auto" w:val="clear"/>
+            <w:tcMar>
+              <w:top w:type="dxa" w:w="60"/>
+              <w:left w:type="dxa" w:w="95"/>
+              <w:bottom w:type="dxa" w:w="60"/>
+              <w:right w:type="dxa" w:w="95"/>
+            </w:tcMar>
+            <w:vAlign w:val="center"/>
+          </w:tcPr>
+          <w:p>
+            <w:pPr>
+              <w:spacing w:after="0" w:line="265"/>
+            </w:pPr>
+            <w:r>
+              <w:rPr>
+                <w:rFonts w:ascii="Arial" w:cs="Arial" w:eastAsia="Arial" w:hAnsi="Arial"/>
+                <w:b/>
+                <w:bCs/>
+                <w:color w:val="1B1B1B"/>
+                <w:sz w:val="18"/>
+                <w:szCs w:val="18"/>
+              </w:rPr>
+              <w:t xml:space="preserve">Học sâu</w:t>
+            </w:r>
+          </w:p>
+        </w:tc>
+      </w:tr>
+      <w:tr>
+        <w:trPr>
+          <w:cantSplit/>
+          <w:tblHeader w:val="false"/>
+        </w:trPr>
+        <w:tc>
+          <w:tcPr>
+            <w:tcW w:type="dxa" w:w="1900"/>
+            <w:tcMar>
+              <w:top w:type="dxa" w:w="60"/>
+              <w:left w:type="dxa" w:w="95"/>
+              <w:bottom w:type="dxa" w:w="60"/>
+              <w:right w:type="dxa" w:w="95"/>
+            </w:tcMar>
+            <w:vAlign w:val="center"/>
+          </w:tcPr>
+          <w:p>
+            <w:pPr>
+              <w:spacing w:after="0" w:line="265"/>
+            </w:pPr>
+            <w:r>
+              <w:rPr>
+                <w:rFonts w:ascii="Arial" w:cs="Arial" w:eastAsia="Arial" w:hAnsi="Arial"/>
+                <w:b w:val="false"/>
+                <w:bCs w:val="false"/>
+                <w:color w:val="1B1B1B"/>
+                <w:sz w:val="18"/>
+                <w:szCs w:val="18"/>
+              </w:rPr>
+              <w:t xml:space="preserve">Ai chọn «nhìn gì»</w:t>
+            </w:r>
+          </w:p>
+        </w:tc>
+        <w:tc>
+          <w:tcPr>
+            <w:tcW w:type="dxa" w:w="2400"/>
+            <w:tcMar>
+              <w:top w:type="dxa" w:w="60"/>
+              <w:left w:type="dxa" w:w="95"/>
+              <w:bottom w:type="dxa" w:w="60"/>
+              <w:right w:type="dxa" w:w="95"/>
+            </w:tcMar>
+            <w:vAlign w:val="center"/>
+          </w:tcPr>
+          <w:p>
+            <w:pPr>
+              <w:spacing w:after="0" w:line="265"/>
+            </w:pPr>
+            <w:r>
+              <w:rPr>
+                <w:rFonts w:ascii="Arial" w:cs="Arial" w:eastAsia="Arial" w:hAnsi="Arial"/>
+                <w:b w:val="false"/>
+                <w:bCs w:val="false"/>
+                <w:color w:val="1B1B1B"/>
+                <w:sz w:val="18"/>
+                <w:szCs w:val="18"/>
+              </w:rPr>
+              <w:t xml:space="preserve">Người</w:t>
+            </w:r>
+          </w:p>
+        </w:tc>
+        <w:tc>
+          <w:tcPr>
+            <w:tcW w:type="dxa" w:w="2500"/>
+            <w:tcMar>
+              <w:top w:type="dxa" w:w="60"/>
+              <w:left w:type="dxa" w:w="95"/>
+              <w:bottom w:type="dxa" w:w="60"/>
+              <w:right w:type="dxa" w:w="95"/>
+            </w:tcMar>
+            <w:vAlign w:val="center"/>
+          </w:tcPr>
+          <w:p>
+            <w:pPr>
+              <w:spacing w:after="0" w:line="265"/>
+            </w:pPr>
+            <w:r>
+              <w:rPr>
+                <w:rFonts w:ascii="Arial" w:cs="Arial" w:eastAsia="Arial" w:hAnsi="Arial"/>
+                <w:b w:val="false"/>
+                <w:bCs w:val="false"/>
+                <w:color w:val="1B1B1B"/>
+                <w:sz w:val="18"/>
+                <w:szCs w:val="18"/>
+              </w:rPr>
+              <w:t xml:space="preserve">Người</w:t>
+            </w:r>
+          </w:p>
+        </w:tc>
+        <w:tc>
+          <w:tcPr>
+            <w:tcW w:type="dxa" w:w="2560"/>
+            <w:tcMar>
+              <w:top w:type="dxa" w:w="60"/>
+              <w:left w:type="dxa" w:w="95"/>
+              <w:bottom w:type="dxa" w:w="60"/>
+              <w:right w:type="dxa" w:w="95"/>
+            </w:tcMar>
+            <w:vAlign w:val="center"/>
+          </w:tcPr>
+          <w:p>
+            <w:pPr>
+              <w:spacing w:after="0" w:line="265"/>
+            </w:pPr>
+            <w:r>
+              <w:rPr>
+                <w:rFonts w:ascii="Arial" w:cs="Arial" w:eastAsia="Arial" w:hAnsi="Arial"/>
+                <w:b w:val="false"/>
+                <w:bCs w:val="false"/>
+                <w:color w:val="1B1B1B"/>
+                <w:sz w:val="18"/>
+                <w:szCs w:val="18"/>
+              </w:rPr>
+              <w:t xml:space="preserve">Máy tự học từ điểm ảnh</w:t>
+            </w:r>
+          </w:p>
+        </w:tc>
+      </w:tr>
+      <w:tr>
+        <w:trPr>
+          <w:cantSplit/>
+          <w:tblHeader w:val="false"/>
+        </w:trPr>
+        <w:tc>
+          <w:tcPr>
+            <w:tcW w:type="dxa" w:w="1900"/>
+            <w:tcMar>
+              <w:top w:type="dxa" w:w="60"/>
+              <w:left w:type="dxa" w:w="95"/>
+              <w:bottom w:type="dxa" w:w="60"/>
+              <w:right w:type="dxa" w:w="95"/>
+            </w:tcMar>
+            <w:vAlign w:val="center"/>
+          </w:tcPr>
+          <w:p>
+            <w:pPr>
+              <w:spacing w:after="0" w:line="265"/>
+            </w:pPr>
+            <w:r>
+              <w:rPr>
+                <w:rFonts w:ascii="Arial" w:cs="Arial" w:eastAsia="Arial" w:hAnsi="Arial"/>
+                <w:b w:val="false"/>
+                <w:bCs w:val="false"/>
+                <w:color w:val="1B1B1B"/>
+                <w:sz w:val="18"/>
+                <w:szCs w:val="18"/>
+              </w:rPr>
+              <w:t xml:space="preserve">Ai chọn «phán thế nào»</w:t>
+            </w:r>
+          </w:p>
+        </w:tc>
+        <w:tc>
+          <w:tcPr>
+            <w:tcW w:type="dxa" w:w="2400"/>
+            <w:tcMar>
+              <w:top w:type="dxa" w:w="60"/>
+              <w:left w:type="dxa" w:w="95"/>
+              <w:bottom w:type="dxa" w:w="60"/>
+              <w:right w:type="dxa" w:w="95"/>
+            </w:tcMar>
+            <w:vAlign w:val="center"/>
+          </w:tcPr>
+          <w:p>
+            <w:pPr>
+              <w:spacing w:after="0" w:line="265"/>
+            </w:pPr>
+            <w:r>
+              <w:rPr>
+                <w:rFonts w:ascii="Arial" w:cs="Arial" w:eastAsia="Arial" w:hAnsi="Arial"/>
+                <w:b w:val="false"/>
+                <w:bCs w:val="false"/>
+                <w:color w:val="1B1B1B"/>
+                <w:sz w:val="18"/>
+                <w:szCs w:val="18"/>
+              </w:rPr>
+              <w:t xml:space="preserve">Người viết ngưỡng</w:t>
+            </w:r>
+          </w:p>
+        </w:tc>
+        <w:tc>
+          <w:tcPr>
+            <w:tcW w:type="dxa" w:w="2500"/>
+            <w:tcMar>
+              <w:top w:type="dxa" w:w="60"/>
+              <w:left w:type="dxa" w:w="95"/>
+              <w:bottom w:type="dxa" w:w="60"/>
+              <w:right w:type="dxa" w:w="95"/>
+            </w:tcMar>
+            <w:vAlign w:val="center"/>
+          </w:tcPr>
+          <w:p>
+            <w:pPr>
+              <w:spacing w:after="0" w:line="265"/>
+            </w:pPr>
+            <w:r>
+              <w:rPr>
+                <w:rFonts w:ascii="Arial" w:cs="Arial" w:eastAsia="Arial" w:hAnsi="Arial"/>
+                <w:b w:val="false"/>
+                <w:bCs w:val="false"/>
+                <w:color w:val="1B1B1B"/>
+                <w:sz w:val="18"/>
+                <w:szCs w:val="18"/>
+              </w:rPr>
+              <w:t xml:space="preserve">Máy học từ ví dụ</w:t>
+            </w:r>
+          </w:p>
+        </w:tc>
+        <w:tc>
+          <w:tcPr>
+            <w:tcW w:type="dxa" w:w="2560"/>
+            <w:tcMar>
+              <w:top w:type="dxa" w:w="60"/>
+              <w:left w:type="dxa" w:w="95"/>
+              <w:bottom w:type="dxa" w:w="60"/>
+              <w:right w:type="dxa" w:w="95"/>
+            </w:tcMar>
+            <w:vAlign w:val="center"/>
+          </w:tcPr>
+          <w:p>
+            <w:pPr>
+              <w:spacing w:after="0" w:line="265"/>
+            </w:pPr>
+            <w:r>
+              <w:rPr>
+                <w:rFonts w:ascii="Arial" w:cs="Arial" w:eastAsia="Arial" w:hAnsi="Arial"/>
+                <w:b w:val="false"/>
+                <w:bCs w:val="false"/>
+                <w:color w:val="1B1B1B"/>
+                <w:sz w:val="18"/>
+                <w:szCs w:val="18"/>
+              </w:rPr>
+              <w:t xml:space="preserve">Máy học từ ví dụ</w:t>
+            </w:r>
+          </w:p>
+        </w:tc>
+      </w:tr>
+      <w:tr>
+        <w:trPr>
+          <w:cantSplit/>
+          <w:tblHeader w:val="false"/>
+        </w:trPr>
+        <w:tc>
+          <w:tcPr>
+            <w:tcW w:type="dxa" w:w="1900"/>
+            <w:tcMar>
+              <w:top w:type="dxa" w:w="60"/>
+              <w:left w:type="dxa" w:w="95"/>
+              <w:bottom w:type="dxa" w:w="60"/>
+              <w:right w:type="dxa" w:w="95"/>
+            </w:tcMar>
+            <w:vAlign w:val="center"/>
+          </w:tcPr>
+          <w:p>
+            <w:pPr>
+              <w:spacing w:after="0" w:line="265"/>
+            </w:pPr>
+            <w:r>
+              <w:rPr>
+                <w:rFonts w:ascii="Arial" w:cs="Arial" w:eastAsia="Arial" w:hAnsi="Arial"/>
+                <w:b w:val="false"/>
+                <w:bCs w:val="false"/>
+                <w:color w:val="1B1B1B"/>
+                <w:sz w:val="18"/>
+                <w:szCs w:val="18"/>
+              </w:rPr>
+              <w:t xml:space="preserve">Ví dụ tìm người</w:t>
+            </w:r>
+          </w:p>
+        </w:tc>
+        <w:tc>
+          <w:tcPr>
+            <w:tcW w:type="dxa" w:w="2400"/>
+            <w:tcMar>
+              <w:top w:type="dxa" w:w="60"/>
+              <w:left w:type="dxa" w:w="95"/>
+              <w:bottom w:type="dxa" w:w="60"/>
+              <w:right w:type="dxa" w:w="95"/>
+            </w:tcMar>
+            <w:vAlign w:val="center"/>
+          </w:tcPr>
+          <w:p>
+            <w:pPr>
+              <w:spacing w:after="0" w:line="265"/>
+            </w:pPr>
+            <w:r>
+              <w:rPr>
+                <w:rFonts w:ascii="Arial" w:cs="Arial" w:eastAsia="Arial" w:hAnsi="Arial"/>
+                <w:b w:val="false"/>
+                <w:bCs w:val="false"/>
+                <w:color w:val="1B1B1B"/>
+                <w:sz w:val="18"/>
+                <w:szCs w:val="18"/>
+              </w:rPr>
+              <w:t xml:space="preserve">«Cao ÷ rộng &gt; 1 là người»</w:t>
+            </w:r>
+          </w:p>
+        </w:tc>
+        <w:tc>
+          <w:tcPr>
+            <w:tcW w:type="dxa" w:w="2500"/>
+            <w:tcMar>
+              <w:top w:type="dxa" w:w="60"/>
+              <w:left w:type="dxa" w:w="95"/>
+              <w:bottom w:type="dxa" w:w="60"/>
+              <w:right w:type="dxa" w:w="95"/>
+            </w:tcMar>
+            <w:vAlign w:val="center"/>
+          </w:tcPr>
+          <w:p>
+            <w:pPr>
+              <w:spacing w:after="0" w:line="265"/>
+            </w:pPr>
+            <w:r>
+              <w:rPr>
+                <w:rFonts w:ascii="Arial" w:cs="Arial" w:eastAsia="Arial" w:hAnsi="Arial"/>
+                <w:b w:val="false"/>
+                <w:bCs w:val="false"/>
+                <w:color w:val="1B1B1B"/>
+                <w:sz w:val="18"/>
+                <w:szCs w:val="18"/>
+              </w:rPr>
+              <w:t xml:space="preserve">Người chọn «cao ÷ rộng», máy học ra 1,03; HOG năm 2005</w:t>
+            </w:r>
+          </w:p>
+        </w:tc>
+        <w:tc>
+          <w:tcPr>
+            <w:tcW w:type="dxa" w:w="2560"/>
+            <w:tcMar>
+              <w:top w:type="dxa" w:w="60"/>
+              <w:left w:type="dxa" w:w="95"/>
+              <w:bottom w:type="dxa" w:w="60"/>
+              <w:right w:type="dxa" w:w="95"/>
+            </w:tcMar>
+            <w:vAlign w:val="center"/>
+          </w:tcPr>
+          <w:p>
+            <w:pPr>
+              <w:spacing w:after="0" w:line="265"/>
+            </w:pPr>
+            <w:r>
+              <w:rPr>
+                <w:rFonts w:ascii="Arial" w:cs="Arial" w:eastAsia="Arial" w:hAnsi="Arial"/>
+                <w:b w:val="false"/>
+                <w:bCs w:val="false"/>
+                <w:color w:val="1B1B1B"/>
+                <w:sz w:val="18"/>
+                <w:szCs w:val="18"/>
+              </w:rPr>
+              <w:t xml:space="preserve">YOLOX: khoảng 9 triệu số, tự học hết</w:t>
+            </w:r>
+          </w:p>
+        </w:tc>
+      </w:tr>
+      <w:tr>
+        <w:trPr>
+          <w:cantSplit/>
+          <w:tblHeader w:val="false"/>
+        </w:trPr>
+        <w:tc>
+          <w:tcPr>
+            <w:tcW w:type="dxa" w:w="1900"/>
+            <w:tcMar>
+              <w:top w:type="dxa" w:w="60"/>
+              <w:left w:type="dxa" w:w="95"/>
+              <w:bottom w:type="dxa" w:w="60"/>
+              <w:right w:type="dxa" w:w="95"/>
+            </w:tcMar>
+            <w:vAlign w:val="center"/>
+          </w:tcPr>
+          <w:p>
+            <w:pPr>
+              <w:spacing w:after="0" w:line="265"/>
+            </w:pPr>
+            <w:r>
+              <w:rPr>
+                <w:rFonts w:ascii="Arial" w:cs="Arial" w:eastAsia="Arial" w:hAnsi="Arial"/>
+                <w:b w:val="false"/>
+                <w:bCs w:val="false"/>
+                <w:color w:val="1B1B1B"/>
+                <w:sz w:val="18"/>
+                <w:szCs w:val="18"/>
+              </w:rPr>
+              <w:t xml:space="preserve">Dữ liệu có đáp án</w:t>
+            </w:r>
+          </w:p>
+        </w:tc>
+        <w:tc>
+          <w:tcPr>
+            <w:tcW w:type="dxa" w:w="2400"/>
+            <w:tcMar>
+              <w:top w:type="dxa" w:w="60"/>
+              <w:left w:type="dxa" w:w="95"/>
+              <w:bottom w:type="dxa" w:w="60"/>
+              <w:right w:type="dxa" w:w="95"/>
+            </w:tcMar>
+            <w:vAlign w:val="center"/>
+          </w:tcPr>
+          <w:p>
+            <w:pPr>
+              <w:spacing w:after="0" w:line="265"/>
+            </w:pPr>
+            <w:r>
+              <w:rPr>
+                <w:rFonts w:ascii="Arial" w:cs="Arial" w:eastAsia="Arial" w:hAnsi="Arial"/>
+                <w:b w:val="false"/>
+                <w:bCs w:val="false"/>
+                <w:color w:val="1B1B1B"/>
+                <w:sz w:val="18"/>
+                <w:szCs w:val="18"/>
+              </w:rPr>
+              <w:t xml:space="preserve">Không cần</w:t>
+            </w:r>
+          </w:p>
+        </w:tc>
+        <w:tc>
+          <w:tcPr>
+            <w:tcW w:type="dxa" w:w="2500"/>
+            <w:tcMar>
+              <w:top w:type="dxa" w:w="60"/>
+              <w:left w:type="dxa" w:w="95"/>
+              <w:bottom w:type="dxa" w:w="60"/>
+              <w:right w:type="dxa" w:w="95"/>
+            </w:tcMar>
+            <w:vAlign w:val="center"/>
+          </w:tcPr>
+          <w:p>
+            <w:pPr>
+              <w:spacing w:after="0" w:line="265"/>
+            </w:pPr>
+            <w:r>
+              <w:rPr>
+                <w:rFonts w:ascii="Arial" w:cs="Arial" w:eastAsia="Arial" w:hAnsi="Arial"/>
+                <w:b w:val="false"/>
+                <w:bCs w:val="false"/>
+                <w:color w:val="1B1B1B"/>
+                <w:sz w:val="18"/>
+                <w:szCs w:val="18"/>
+              </w:rPr>
+              <w:t xml:space="preserve">Vài trăm đến vài nghìn</w:t>
+            </w:r>
+          </w:p>
+        </w:tc>
+        <w:tc>
+          <w:tcPr>
+            <w:tcW w:type="dxa" w:w="2560"/>
+            <w:tcMar>
+              <w:top w:type="dxa" w:w="60"/>
+              <w:left w:type="dxa" w:w="95"/>
+              <w:bottom w:type="dxa" w:w="60"/>
+              <w:right w:type="dxa" w:w="95"/>
+            </w:tcMar>
+            <w:vAlign w:val="center"/>
+          </w:tcPr>
+          <w:p>
+            <w:pPr>
+              <w:spacing w:after="0" w:line="265"/>
+            </w:pPr>
+            <w:r>
+              <w:rPr>
+                <w:rFonts w:ascii="Arial" w:cs="Arial" w:eastAsia="Arial" w:hAnsi="Arial"/>
+                <w:b w:val="false"/>
+                <w:bCs w:val="false"/>
+                <w:color w:val="1B1B1B"/>
+                <w:sz w:val="18"/>
+                <w:szCs w:val="18"/>
+              </w:rPr>
+              <w:t xml:space="preserve">Hàng chục nghìn trở lên (COCO ~ 120.000 ảnh)</w:t>
+            </w:r>
+          </w:p>
+        </w:tc>
+      </w:tr>
+      <w:tr>
+        <w:trPr>
+          <w:cantSplit/>
+          <w:tblHeader w:val="false"/>
+        </w:trPr>
+        <w:tc>
+          <w:tcPr>
+            <w:tcW w:type="dxa" w:w="1900"/>
+            <w:tcMar>
+              <w:top w:type="dxa" w:w="60"/>
+              <w:left w:type="dxa" w:w="95"/>
+              <w:bottom w:type="dxa" w:w="60"/>
+              <w:right w:type="dxa" w:w="95"/>
+            </w:tcMar>
+            <w:vAlign w:val="center"/>
+          </w:tcPr>
+          <w:p>
+            <w:pPr>
+              <w:spacing w:after="0" w:line="265"/>
+            </w:pPr>
+            <w:r>
+              <w:rPr>
+                <w:rFonts w:ascii="Arial" w:cs="Arial" w:eastAsia="Arial" w:hAnsi="Arial"/>
+                <w:b w:val="false"/>
+                <w:bCs w:val="false"/>
+                <w:color w:val="1B1B1B"/>
+                <w:sz w:val="18"/>
+                <w:szCs w:val="18"/>
+              </w:rPr>
+              <w:t xml:space="preserve">Ưu điểm</w:t>
+            </w:r>
+          </w:p>
+        </w:tc>
+        <w:tc>
+          <w:tcPr>
+            <w:tcW w:type="dxa" w:w="2400"/>
+            <w:tcMar>
+              <w:top w:type="dxa" w:w="60"/>
+              <w:left w:type="dxa" w:w="95"/>
+              <w:bottom w:type="dxa" w:w="60"/>
+              <w:right w:type="dxa" w:w="95"/>
+            </w:tcMar>
+            <w:vAlign w:val="center"/>
+          </w:tcPr>
+          <w:p>
+            <w:pPr>
+              <w:spacing w:after="0" w:line="265"/>
+            </w:pPr>
+            <w:r>
+              <w:rPr>
+                <w:rFonts w:ascii="Arial" w:cs="Arial" w:eastAsia="Arial" w:hAnsi="Arial"/>
+                <w:b w:val="false"/>
+                <w:bCs w:val="false"/>
+                <w:color w:val="1B1B1B"/>
+                <w:sz w:val="18"/>
+                <w:szCs w:val="18"/>
+              </w:rPr>
+              <w:t xml:space="preserve">Dễ hiểu, dễ kiểm tra</w:t>
+            </w:r>
+          </w:p>
+        </w:tc>
+        <w:tc>
+          <w:tcPr>
+            <w:tcW w:type="dxa" w:w="2500"/>
+            <w:tcMar>
+              <w:top w:type="dxa" w:w="60"/>
+              <w:left w:type="dxa" w:w="95"/>
+              <w:bottom w:type="dxa" w:w="60"/>
+              <w:right w:type="dxa" w:w="95"/>
+            </w:tcMar>
+            <w:vAlign w:val="center"/>
+          </w:tcPr>
+          <w:p>
+            <w:pPr>
+              <w:spacing w:after="0" w:line="265"/>
+            </w:pPr>
+            <w:r>
+              <w:rPr>
+                <w:rFonts w:ascii="Arial" w:cs="Arial" w:eastAsia="Arial" w:hAnsi="Arial"/>
+                <w:b w:val="false"/>
+                <w:bCs w:val="false"/>
+                <w:color w:val="1B1B1B"/>
+                <w:sz w:val="18"/>
+                <w:szCs w:val="18"/>
+              </w:rPr>
+              <w:t xml:space="preserve">Ít dữ liệu, tính nhanh</w:t>
+            </w:r>
+          </w:p>
+        </w:tc>
+        <w:tc>
+          <w:tcPr>
+            <w:tcW w:type="dxa" w:w="2560"/>
+            <w:tcMar>
+              <w:top w:type="dxa" w:w="60"/>
+              <w:left w:type="dxa" w:w="95"/>
+              <w:bottom w:type="dxa" w:w="60"/>
+              <w:right w:type="dxa" w:w="95"/>
+            </w:tcMar>
+            <w:vAlign w:val="center"/>
+          </w:tcPr>
+          <w:p>
+            <w:pPr>
+              <w:spacing w:after="0" w:line="265"/>
+            </w:pPr>
+            <w:r>
+              <w:rPr>
+                <w:rFonts w:ascii="Arial" w:cs="Arial" w:eastAsia="Arial" w:hAnsi="Arial"/>
+                <w:b w:val="false"/>
+                <w:bCs w:val="false"/>
+                <w:color w:val="1B1B1B"/>
+                <w:sz w:val="18"/>
+                <w:szCs w:val="18"/>
+              </w:rPr>
+              <w:t xml:space="preserve">Chính xác nhất, học cả thứ người không nghĩ ra</w:t>
+            </w:r>
+          </w:p>
+        </w:tc>
+      </w:tr>
+      <w:tr>
+        <w:trPr>
+          <w:cantSplit/>
+          <w:tblHeader w:val="false"/>
+        </w:trPr>
+        <w:tc>
+          <w:tcPr>
+            <w:tcW w:type="dxa" w:w="1900"/>
+            <w:tcMar>
+              <w:top w:type="dxa" w:w="60"/>
+              <w:left w:type="dxa" w:w="95"/>
+              <w:bottom w:type="dxa" w:w="60"/>
+              <w:right w:type="dxa" w:w="95"/>
+            </w:tcMar>
+            <w:vAlign w:val="center"/>
+          </w:tcPr>
+          <w:p>
+            <w:pPr>
+              <w:spacing w:after="0" w:line="265"/>
+            </w:pPr>
+            <w:r>
+              <w:rPr>
+                <w:rFonts w:ascii="Arial" w:cs="Arial" w:eastAsia="Arial" w:hAnsi="Arial"/>
+                <w:b w:val="false"/>
+                <w:bCs w:val="false"/>
+                <w:color w:val="1B1B1B"/>
+                <w:sz w:val="18"/>
+                <w:szCs w:val="18"/>
+              </w:rPr>
+              <w:t xml:space="preserve">Nhược điểm</w:t>
+            </w:r>
+          </w:p>
+        </w:tc>
+        <w:tc>
+          <w:tcPr>
+            <w:tcW w:type="dxa" w:w="2400"/>
+            <w:tcMar>
+              <w:top w:type="dxa" w:w="60"/>
+              <w:left w:type="dxa" w:w="95"/>
+              <w:bottom w:type="dxa" w:w="60"/>
+              <w:right w:type="dxa" w:w="95"/>
+            </w:tcMar>
+            <w:vAlign w:val="center"/>
+          </w:tcPr>
+          <w:p>
+            <w:pPr>
+              <w:spacing w:after="0" w:line="265"/>
+            </w:pPr>
+            <w:r>
+              <w:rPr>
+                <w:rFonts w:ascii="Arial" w:cs="Arial" w:eastAsia="Arial" w:hAnsi="Arial"/>
+                <w:b w:val="false"/>
+                <w:bCs w:val="false"/>
+                <w:color w:val="1B1B1B"/>
+                <w:sz w:val="18"/>
+                <w:szCs w:val="18"/>
+              </w:rPr>
+              <w:t xml:space="preserve">Nhiều tình huống thì viết không hết</w:t>
+            </w:r>
+          </w:p>
+        </w:tc>
+        <w:tc>
+          <w:tcPr>
+            <w:tcW w:type="dxa" w:w="2500"/>
+            <w:tcMar>
+              <w:top w:type="dxa" w:w="60"/>
+              <w:left w:type="dxa" w:w="95"/>
+              <w:bottom w:type="dxa" w:w="60"/>
+              <w:right w:type="dxa" w:w="95"/>
+            </w:tcMar>
+            <w:vAlign w:val="center"/>
+          </w:tcPr>
+          <w:p>
+            <w:pPr>
+              <w:spacing w:after="0" w:line="265"/>
+            </w:pPr>
+            <w:r>
+              <w:rPr>
+                <w:rFonts w:ascii="Arial" w:cs="Arial" w:eastAsia="Arial" w:hAnsi="Arial"/>
+                <w:b w:val="false"/>
+                <w:bCs w:val="false"/>
+                <w:color w:val="1B1B1B"/>
+                <w:sz w:val="18"/>
+                <w:szCs w:val="18"/>
+              </w:rPr>
+              <w:t xml:space="preserve">Chọn sai đặc trưng thì học không tốt</w:t>
+            </w:r>
+          </w:p>
+        </w:tc>
+        <w:tc>
+          <w:tcPr>
+            <w:tcW w:type="dxa" w:w="2560"/>
+            <w:tcMar>
+              <w:top w:type="dxa" w:w="60"/>
+              <w:left w:type="dxa" w:w="95"/>
+              <w:bottom w:type="dxa" w:w="60"/>
+              <w:right w:type="dxa" w:w="95"/>
+            </w:tcMar>
+            <w:vAlign w:val="center"/>
+          </w:tcPr>
+          <w:p>
+            <w:pPr>
+              <w:spacing w:after="0" w:line="265"/>
+            </w:pPr>
+            <w:r>
+              <w:rPr>
+                <w:rFonts w:ascii="Arial" w:cs="Arial" w:eastAsia="Arial" w:hAnsi="Arial"/>
+                <w:b w:val="false"/>
+                <w:bCs w:val="false"/>
+                <w:color w:val="1B1B1B"/>
+                <w:sz w:val="18"/>
+                <w:szCs w:val="18"/>
+              </w:rPr>
+              <w:t xml:space="preserve">Cần nhiều dữ liệu, máy mạnh; khó biết nó «nghĩ» gì</w:t>
+            </w:r>
+          </w:p>
+        </w:tc>
+      </w:tr>
+    </w:tbl>
+    <w:p>
+      <w:pPr>
+        <w:spacing w:after="0"/>
+      </w:pPr>
       <w:r>
         <w:rPr>
           <w:rFonts w:ascii="Arial" w:cs="Arial" w:eastAsia="Arial" w:hAnsi="Arial"/>
@@ -1408,72 +2251,7 @@
           <w:sz w:val="22"/>
           <w:szCs w:val="22"/>
         </w:rPr>
-        <w:t xml:space="preserve">: chỉnh hàng triệu con số bên trong để lần sau lệch ít hơn.</w:t>
-      </w:r>
-    </w:p>
-    <w:p>
-      <w:pPr>
-        <w:pStyle w:val="ListParagraph"/>
-        <w:widowControl/>
-        <w:numPr>
-          <w:ilvl w:val="0"/>
-          <w:numId w:val="2"/>
-        </w:numPr>
-        <w:spacing w:after="80" w:line="320"/>
-      </w:pPr>
-      <w:r>
-        <w:rPr>
-          <w:rFonts w:ascii="Arial" w:cs="Arial" w:eastAsia="Arial" w:hAnsi="Arial"/>
-          <w:b/>
-          <w:bCs/>
-          <w:color w:val="24405C"/>
-          <w:sz w:val="22"/>
-          <w:szCs w:val="22"/>
-        </w:rPr>
-        <w:t xml:space="preserve">Lặp lại</w:t>
-      </w:r>
-      <w:r>
-        <w:rPr>
-          <w:rFonts w:ascii="Arial" w:cs="Arial" w:eastAsia="Arial" w:hAnsi="Arial"/>
-          <w:color w:val="1B1B1B"/>
-          <w:sz w:val="22"/>
-          <w:szCs w:val="22"/>
-        </w:rPr>
-        <w:t xml:space="preserve">: hàng chục nghìn ảnh, nhiều vòng.</w:t>
-      </w:r>
-    </w:p>
-    <w:p>
-      <w:pPr>
-        <w:widowControl/>
-        <w:spacing w:after="100" w:before="0" w:line="312"/>
-        <w:ind w:left="0" w:firstLine="0"/>
-      </w:pPr>
-      <w:r>
-        <w:rPr>
-          <w:rFonts w:ascii="Arial" w:cs="Arial" w:eastAsia="Arial" w:hAnsi="Arial"/>
-          <w:color w:val="1B1B1B"/>
-          <w:sz w:val="22"/>
-          <w:szCs w:val="22"/>
-        </w:rPr>
-        <w:t xml:space="preserve">Giống luyện đề cũ có đáp án: làm xong so đáp án, ghi lại chỗ sai, làm đủ nhiều thì gặp đề lạ cũng làm được. Đáp án ở bước 2 do con người gán, đó là «gán nhãn dữ liệu» ở phần 3. Bên trong mô hình có từng lớp: lớp đầu tìm cạnh và màu, lớp giữa ghép thành bánh xe, chân, lớp cuối nói «đây là người». Không ai bảo nó «cạnh nào là chân», nó tự chỉnh ra khi so đáp án.</w:t>
-      </w:r>
-    </w:p>
-    <w:p>
-      <w:pPr>
-        <w:pStyle w:val="Heading2"/>
-        <w:keepNext/>
-        <w:spacing w:after="130" w:before="300"/>
-      </w:pPr>
-      <w:r>
-        <w:rPr>
-          <w:rFonts w:ascii="Arial" w:cs="Arial" w:eastAsia="Arial" w:hAnsi="Arial"/>
-          <w:b/>
-          <w:bCs/>
-          <w:color w:val="24405C"/>
-          <w:sz w:val="24"/>
-          <w:szCs w:val="24"/>
-        </w:rPr>
-        <w:t xml:space="preserve">Phát hiện vật thể cho ba thứ: khung, loại, điểm</w:t>
+        <w:t xml:space="preserve"/>
       </w:r>
     </w:p>
     <w:p>
@@ -1485,7 +2263,7 @@
       <w:r>
         <w:drawing>
           <wp:inline distT="0" distB="0" distL="0" distR="0">
-            <wp:extent cx="5905500" cy="2057400"/>
+            <wp:extent cx="5715000" cy="3076575"/>
             <wp:effectExtent t="0" r="0" b="0" l="0"/>
             <wp:docPr id="1" name="" descr="" title=""/>
             <wp:cNvGraphicFramePr>
@@ -1510,6 +2288,410 @@
                   <pic:spPr bwMode="auto">
                     <a:xfrm>
                       <a:off x="0" y="0"/>
+                      <a:ext cx="5715000" cy="3076575"/>
+                    </a:xfrm>
+                    <a:prstGeom prst="rect">
+                      <a:avLst/>
+                    </a:prstGeom>
+                  </pic:spPr>
+                </pic:pic>
+              </a:graphicData>
+            </a:graphic>
+          </wp:inline>
+        </w:drawing>
+      </w:r>
+    </w:p>
+    <w:p>
+      <w:pPr>
+        <w:keepNext w:val="false"/>
+        <w:spacing w:after="70" w:before="190"/>
+      </w:pPr>
+      <w:r>
+        <w:rPr>
+          <w:rFonts w:ascii="Arial" w:cs="Arial" w:eastAsia="Arial" w:hAnsi="Arial"/>
+          <w:b/>
+          <w:bCs/>
+          <w:color w:val="24405C"/>
+          <w:sz w:val="19"/>
+          <w:szCs w:val="19"/>
+        </w:rPr>
+        <w:t xml:space="preserve">Ví dụ học máy truyền thống: người chọn «cao ÷ rộng», máy học từ 627 ví dụ ra ngưỡng 1,03, 407 ví dụ chưa gặp đúng hết; cùng ngưỡng đó gặp xe máy, xe đạp thì 51% bị coi là người, ô tô bị cắt ở mép ảnh 44%. Dữ liệu: nuScenes (Motional), CC BY-NC-SA 4.0</w:t>
+      </w:r>
+    </w:p>
+    <w:p>
+      <w:pPr>
+        <w:widowControl/>
+        <w:spacing w:after="100" w:before="0" w:line="312"/>
+        <w:ind w:left="0" w:firstLine="0"/>
+      </w:pPr>
+      <w:r>
+        <w:rPr>
+          <w:rFonts w:ascii="Arial" w:cs="Arial" w:eastAsia="Arial" w:hAnsi="Arial"/>
+          <w:color w:val="1B1B1B"/>
+          <w:sz w:val="22"/>
+          <w:szCs w:val="22"/>
+        </w:rPr>
+        <w:t xml:space="preserve">Ví dụ này cho thấy học máy truyền thống vướng ở đâu: máy đã học ngưỡng tốt nhất rồi, vấn đề là </w:t>
+      </w:r>
+      <w:r>
+        <w:rPr>
+          <w:rFonts w:ascii="Arial" w:cs="Arial" w:eastAsia="Arial" w:hAnsi="Arial"/>
+          <w:b/>
+          <w:bCs/>
+          <w:color w:val="24405C"/>
+          <w:sz w:val="22"/>
+          <w:szCs w:val="22"/>
+        </w:rPr>
+        <w:t xml:space="preserve">đặc trưng người chọn không đủ</w:t>
+      </w:r>
+      <w:r>
+        <w:rPr>
+          <w:rFonts w:ascii="Arial" w:cs="Arial" w:eastAsia="Arial" w:hAnsi="Arial"/>
+          <w:color w:val="1B1B1B"/>
+          <w:sz w:val="22"/>
+          <w:szCs w:val="22"/>
+        </w:rPr>
+        <w:t xml:space="preserve">, chỉ nhìn cao ÷ rộng thì không phân biệt được xe máy có người lái và người đi bộ. Đặc trưng người nghĩ ra có hạn. Học sâu giao luôn bước này cho máy.</w:t>
+      </w:r>
+    </w:p>
+    <w:p>
+      <w:pPr>
+        <w:keepNext/>
+        <w:spacing w:after="60" w:before="60"/>
+        <w:jc w:val="center"/>
+      </w:pPr>
+      <w:r>
+        <w:drawing>
+          <wp:inline distT="0" distB="0" distL="0" distR="0">
+            <wp:extent cx="4000500" cy="2038350"/>
+            <wp:effectExtent t="0" r="0" b="0" l="0"/>
+            <wp:docPr id="1" name="" descr="" title=""/>
+            <wp:cNvGraphicFramePr>
+              <a:graphicFrameLocks xmlns:a="http://schemas.openxmlformats.org/drawingml/2006/main" noChangeAspect="1"/>
+            </wp:cNvGraphicFramePr>
+            <a:graphic xmlns:a="http://schemas.openxmlformats.org/drawingml/2006/main">
+              <a:graphicData uri="http://schemas.openxmlformats.org/drawingml/2006/picture">
+                <pic:pic xmlns:pic="http://schemas.openxmlformats.org/drawingml/2006/picture">
+                  <pic:nvPicPr>
+                    <pic:cNvPr id="0" name="" descr=""/>
+                    <pic:cNvPicPr>
+                      <a:picLocks noChangeAspect="1" noChangeArrowheads="1"/>
+                    </pic:cNvPicPr>
+                  </pic:nvPicPr>
+                  <pic:blipFill>
+                    <a:blip r:embed="rId15" cstate="none"/>
+                    <a:srcRect/>
+                    <a:stretch>
+                      <a:fillRect/>
+                    </a:stretch>
+                  </pic:blipFill>
+                  <pic:spPr bwMode="auto">
+                    <a:xfrm>
+                      <a:off x="0" y="0"/>
+                      <a:ext cx="4000500" cy="2038350"/>
+                    </a:xfrm>
+                    <a:prstGeom prst="rect">
+                      <a:avLst/>
+                    </a:prstGeom>
+                  </pic:spPr>
+                </pic:pic>
+              </a:graphicData>
+            </a:graphic>
+          </wp:inline>
+        </w:drawing>
+      </w:r>
+    </w:p>
+    <w:p>
+      <w:pPr>
+        <w:keepNext w:val="false"/>
+        <w:spacing w:after="70" w:before="190"/>
+      </w:pPr>
+      <w:r>
+        <w:rPr>
+          <w:rFonts w:ascii="Arial" w:cs="Arial" w:eastAsia="Arial" w:hAnsi="Arial"/>
+          <w:b/>
+          <w:bCs/>
+          <w:color w:val="24405C"/>
+          <w:sz w:val="19"/>
+          <w:szCs w:val="19"/>
+        </w:rPr>
+        <w:t xml:space="preserve">Đặc trưng học sâu tự học ra: 32 kính lọc lớp đầu của YOLOX-s (số thật, mỗi cái nhìn 6×6 điểm ảnh): mảng màu, ranh giới sáng tối (cạnh), chấm nhỏ. Không cái nào do người vẽ.</w:t>
+      </w:r>
+    </w:p>
+    <w:p>
+      <w:pPr>
+        <w:keepNext/>
+        <w:spacing w:after="60" w:before="60"/>
+        <w:jc w:val="center"/>
+      </w:pPr>
+      <w:r>
+        <w:drawing>
+          <wp:inline distT="0" distB="0" distL="0" distR="0">
+            <wp:extent cx="6096000" cy="1114425"/>
+            <wp:effectExtent t="0" r="0" b="0" l="0"/>
+            <wp:docPr id="1" name="" descr="" title=""/>
+            <wp:cNvGraphicFramePr>
+              <a:graphicFrameLocks xmlns:a="http://schemas.openxmlformats.org/drawingml/2006/main" noChangeAspect="1"/>
+            </wp:cNvGraphicFramePr>
+            <a:graphic xmlns:a="http://schemas.openxmlformats.org/drawingml/2006/main">
+              <a:graphicData uri="http://schemas.openxmlformats.org/drawingml/2006/picture">
+                <pic:pic xmlns:pic="http://schemas.openxmlformats.org/drawingml/2006/picture">
+                  <pic:nvPicPr>
+                    <pic:cNvPr id="0" name="" descr=""/>
+                    <pic:cNvPicPr>
+                      <a:picLocks noChangeAspect="1" noChangeArrowheads="1"/>
+                    </pic:cNvPicPr>
+                  </pic:nvPicPr>
+                  <pic:blipFill>
+                    <a:blip r:embed="rId16" cstate="none"/>
+                    <a:srcRect/>
+                    <a:stretch>
+                      <a:fillRect/>
+                    </a:stretch>
+                  </pic:blipFill>
+                  <pic:spPr bwMode="auto">
+                    <a:xfrm>
+                      <a:off x="0" y="0"/>
+                      <a:ext cx="6096000" cy="1114425"/>
+                    </a:xfrm>
+                    <a:prstGeom prst="rect">
+                      <a:avLst/>
+                    </a:prstGeom>
+                  </pic:spPr>
+                </pic:pic>
+              </a:graphicData>
+            </a:graphic>
+          </wp:inline>
+        </w:drawing>
+      </w:r>
+    </w:p>
+    <w:p>
+      <w:pPr>
+        <w:keepNext w:val="false"/>
+        <w:spacing w:after="70" w:before="190"/>
+      </w:pPr>
+      <w:r>
+        <w:rPr>
+          <w:rFonts w:ascii="Arial" w:cs="Arial" w:eastAsia="Arial" w:hAnsi="Arial"/>
+          <w:b/>
+          <w:bCs/>
+          <w:color w:val="24405C"/>
+          <w:sz w:val="19"/>
+          <w:szCs w:val="19"/>
+        </w:rPr>
+        <w:t xml:space="preserve">Cùng ảnh đưa vào YOLOX-s, kết quả thật ở ba độ sâu (sáng = có phản ứng): lớp 1 là đường nét, đoạn 2 là hoa văn, đoạn sau chỉ còn vị trí năm người sáng lên. Ảnh: nuScenes (Motional), CC BY-NC-SA 4.0</w:t>
+      </w:r>
+    </w:p>
+    <w:p>
+      <w:pPr>
+        <w:pStyle w:val="Heading2"/>
+        <w:keepNext/>
+        <w:spacing w:after="130" w:before="300"/>
+      </w:pPr>
+      <w:r>
+        <w:rPr>
+          <w:rFonts w:ascii="Arial" w:cs="Arial" w:eastAsia="Arial" w:hAnsi="Arial"/>
+          <w:b/>
+          <w:bCs/>
+          <w:color w:val="24405C"/>
+          <w:sz w:val="24"/>
+          <w:szCs w:val="24"/>
+        </w:rPr>
+        <w:t xml:space="preserve">«Học» là gì: đoán, so đáp án, sửa một chút</w:t>
+      </w:r>
+    </w:p>
+    <w:p>
+      <w:pPr>
+        <w:pStyle w:val="ListParagraph"/>
+        <w:widowControl/>
+        <w:numPr>
+          <w:ilvl w:val="0"/>
+          <w:numId w:val="2"/>
+        </w:numPr>
+        <w:spacing w:after="80" w:line="320"/>
+      </w:pPr>
+      <w:r>
+        <w:rPr>
+          <w:rFonts w:ascii="Arial" w:cs="Arial" w:eastAsia="Arial" w:hAnsi="Arial"/>
+          <w:b/>
+          <w:bCs/>
+          <w:color w:val="24405C"/>
+          <w:sz w:val="22"/>
+          <w:szCs w:val="22"/>
+        </w:rPr>
+        <w:t xml:space="preserve">Đoán</w:t>
+      </w:r>
+      <w:r>
+        <w:rPr>
+          <w:rFonts w:ascii="Arial" w:cs="Arial" w:eastAsia="Arial" w:hAnsi="Arial"/>
+          <w:color w:val="1B1B1B"/>
+          <w:sz w:val="22"/>
+          <w:szCs w:val="22"/>
+        </w:rPr>
+        <w:t xml:space="preserve">: đưa một ảnh vào, mô hình đoán «ở đây có một người, khung ở đây».</w:t>
+      </w:r>
+    </w:p>
+    <w:p>
+      <w:pPr>
+        <w:pStyle w:val="ListParagraph"/>
+        <w:widowControl/>
+        <w:numPr>
+          <w:ilvl w:val="0"/>
+          <w:numId w:val="2"/>
+        </w:numPr>
+        <w:spacing w:after="80" w:line="320"/>
+      </w:pPr>
+      <w:r>
+        <w:rPr>
+          <w:rFonts w:ascii="Arial" w:cs="Arial" w:eastAsia="Arial" w:hAnsi="Arial"/>
+          <w:b/>
+          <w:bCs/>
+          <w:color w:val="24405C"/>
+          <w:sz w:val="22"/>
+          <w:szCs w:val="22"/>
+        </w:rPr>
+        <w:t xml:space="preserve">So đáp án</w:t>
+      </w:r>
+      <w:r>
+        <w:rPr>
+          <w:rFonts w:ascii="Arial" w:cs="Arial" w:eastAsia="Arial" w:hAnsi="Arial"/>
+          <w:color w:val="1B1B1B"/>
+          <w:sz w:val="22"/>
+          <w:szCs w:val="22"/>
+        </w:rPr>
+        <w:t xml:space="preserve">: so với đáp án con người gán nhãn, lệch bao nhiêu.</w:t>
+      </w:r>
+    </w:p>
+    <w:p>
+      <w:pPr>
+        <w:pStyle w:val="ListParagraph"/>
+        <w:widowControl/>
+        <w:numPr>
+          <w:ilvl w:val="0"/>
+          <w:numId w:val="2"/>
+        </w:numPr>
+        <w:spacing w:after="80" w:line="320"/>
+      </w:pPr>
+      <w:r>
+        <w:rPr>
+          <w:rFonts w:ascii="Arial" w:cs="Arial" w:eastAsia="Arial" w:hAnsi="Arial"/>
+          <w:b/>
+          <w:bCs/>
+          <w:color w:val="24405C"/>
+          <w:sz w:val="22"/>
+          <w:szCs w:val="22"/>
+        </w:rPr>
+        <w:t xml:space="preserve">Sửa một chút</w:t>
+      </w:r>
+      <w:r>
+        <w:rPr>
+          <w:rFonts w:ascii="Arial" w:cs="Arial" w:eastAsia="Arial" w:hAnsi="Arial"/>
+          <w:color w:val="1B1B1B"/>
+          <w:sz w:val="22"/>
+          <w:szCs w:val="22"/>
+        </w:rPr>
+        <w:t xml:space="preserve">: chỉnh các con số bên trong (ngưỡng ở trên chỉ 1 số; YOLOX khoảng 9 triệu số) để lần sau lệch ít hơn.</w:t>
+      </w:r>
+    </w:p>
+    <w:p>
+      <w:pPr>
+        <w:pStyle w:val="ListParagraph"/>
+        <w:widowControl/>
+        <w:numPr>
+          <w:ilvl w:val="0"/>
+          <w:numId w:val="2"/>
+        </w:numPr>
+        <w:spacing w:after="80" w:line="320"/>
+      </w:pPr>
+      <w:r>
+        <w:rPr>
+          <w:rFonts w:ascii="Arial" w:cs="Arial" w:eastAsia="Arial" w:hAnsi="Arial"/>
+          <w:b/>
+          <w:bCs/>
+          <w:color w:val="24405C"/>
+          <w:sz w:val="22"/>
+          <w:szCs w:val="22"/>
+        </w:rPr>
+        <w:t xml:space="preserve">Lặp lại</w:t>
+      </w:r>
+      <w:r>
+        <w:rPr>
+          <w:rFonts w:ascii="Arial" w:cs="Arial" w:eastAsia="Arial" w:hAnsi="Arial"/>
+          <w:color w:val="1B1B1B"/>
+          <w:sz w:val="22"/>
+          <w:szCs w:val="22"/>
+        </w:rPr>
+        <w:t xml:space="preserve">: hàng chục nghìn ảnh, nhiều vòng.</w:t>
+      </w:r>
+    </w:p>
+    <w:p>
+      <w:pPr>
+        <w:widowControl/>
+        <w:spacing w:after="100" w:before="0" w:line="312"/>
+        <w:ind w:left="0" w:firstLine="0"/>
+      </w:pPr>
+      <w:r>
+        <w:rPr>
+          <w:rFonts w:ascii="Arial" w:cs="Arial" w:eastAsia="Arial" w:hAnsi="Arial"/>
+          <w:color w:val="1B1B1B"/>
+          <w:sz w:val="22"/>
+          <w:szCs w:val="22"/>
+        </w:rPr>
+        <w:t xml:space="preserve">Giống luyện đề cũ có đáp án: làm xong so đáp án, ghi lại chỗ sai, làm đủ nhiều thì gặp đề lạ cũng làm được. Đáp án ở bước 2 do con người gán, đó là «gán nhãn dữ liệu» ở phần 3. Bên trong mô hình có từng lớp: lớp đầu tìm cạnh và màu, lớp giữa ghép thành bánh xe, chân, lớp cuối nói «đây là người». Không ai bảo nó «cạnh nào là chân», nó tự chỉnh ra khi so đáp án.</w:t>
+      </w:r>
+    </w:p>
+    <w:p>
+      <w:pPr>
+        <w:pStyle w:val="Heading2"/>
+        <w:keepNext/>
+        <w:spacing w:after="130" w:before="300"/>
+      </w:pPr>
+      <w:r>
+        <w:rPr>
+          <w:rFonts w:ascii="Arial" w:cs="Arial" w:eastAsia="Arial" w:hAnsi="Arial"/>
+          <w:b/>
+          <w:bCs/>
+          <w:color w:val="24405C"/>
+          <w:sz w:val="24"/>
+          <w:szCs w:val="24"/>
+        </w:rPr>
+        <w:t xml:space="preserve">Phát hiện vật thể cho ba thứ: khung, loại, điểm</w:t>
+      </w:r>
+    </w:p>
+    <w:p>
+      <w:pPr>
+        <w:keepNext/>
+        <w:spacing w:after="60" w:before="60"/>
+        <w:jc w:val="center"/>
+      </w:pPr>
+      <w:r>
+        <w:drawing>
+          <wp:inline distT="0" distB="0" distL="0" distR="0">
+            <wp:extent cx="5905500" cy="2057400"/>
+            <wp:effectExtent t="0" r="0" b="0" l="0"/>
+            <wp:docPr id="1" name="" descr="" title=""/>
+            <wp:cNvGraphicFramePr>
+              <a:graphicFrameLocks xmlns:a="http://schemas.openxmlformats.org/drawingml/2006/main" noChangeAspect="1"/>
+            </wp:cNvGraphicFramePr>
+            <a:graphic xmlns:a="http://schemas.openxmlformats.org/drawingml/2006/main">
+              <a:graphicData uri="http://schemas.openxmlformats.org/drawingml/2006/picture">
+                <pic:pic xmlns:pic="http://schemas.openxmlformats.org/drawingml/2006/picture">
+                  <pic:nvPicPr>
+                    <pic:cNvPr id="0" name="" descr=""/>
+                    <pic:cNvPicPr>
+                      <a:picLocks noChangeAspect="1" noChangeArrowheads="1"/>
+                    </pic:cNvPicPr>
+                  </pic:nvPicPr>
+                  <pic:blipFill>
+                    <a:blip r:embed="rId17" cstate="none"/>
+                    <a:srcRect/>
+                    <a:stretch>
+                      <a:fillRect/>
+                    </a:stretch>
+                  </pic:blipFill>
+                  <pic:spPr bwMode="auto">
+                    <a:xfrm>
+                      <a:off x="0" y="0"/>
                       <a:ext cx="5905500" cy="2057400"/>
                     </a:xfrm>
                     <a:prstGeom prst="rect">
@@ -1687,7 +2869,7 @@
           <w:sz w:val="19"/>
           <w:szCs w:val="19"/>
         </w:rPr>
-        <w:t xml:space="preserve">Bảng 1. Ba việc thường gặp</w:t>
+        <w:t xml:space="preserve">Bảng 2. Ba việc thường gặp</w:t>
       </w:r>
     </w:p>
     <w:tbl>
@@ -2242,7 +3424,7 @@
                     </pic:cNvPicPr>
                   </pic:nvPicPr>
                   <pic:blipFill>
-                    <a:blip r:embed="rId15" cstate="none"/>
+                    <a:blip r:embed="rId18" cstate="none"/>
                     <a:srcRect/>
                     <a:stretch>
                       <a:fillRect/>
@@ -2295,7 +3477,7 @@
           <w:sz w:val="19"/>
           <w:szCs w:val="19"/>
         </w:rPr>
-        <w:t xml:space="preserve">Bảng 2. 404 ảnh camera trước nuScenes mini: kéo ngưỡng từ 0,1 đến 0,9 (thấy ≥ 60%, trong 50 m)</w:t>
+        <w:t xml:space="preserve">Bảng 3. 404 ảnh camera trước nuScenes mini: kéo ngưỡng từ 0,1 đến 0,9 (thấy ≥ 60%, trong 50 m)</w:t>
       </w:r>
     </w:p>
     <w:tbl>
@@ -3482,7 +4664,7 @@
                     </pic:cNvPicPr>
                   </pic:nvPicPr>
                   <pic:blipFill>
-                    <a:blip r:embed="rId16" cstate="none"/>
+                    <a:blip r:embed="rId19" cstate="none"/>
                     <a:srcRect/>
                     <a:stretch>
                       <a:fillRect/>
@@ -3582,1589 +4764,6 @@
         <w:drawing>
           <wp:inline distT="0" distB="0" distL="0" distR="0">
             <wp:extent cx="5715000" cy="1990725"/>
-            <wp:effectExtent t="0" r="0" b="0" l="0"/>
-            <wp:docPr id="1" name="" descr="" title=""/>
-            <wp:cNvGraphicFramePr>
-              <a:graphicFrameLocks xmlns:a="http://schemas.openxmlformats.org/drawingml/2006/main" noChangeAspect="1"/>
-            </wp:cNvGraphicFramePr>
-            <a:graphic xmlns:a="http://schemas.openxmlformats.org/drawingml/2006/main">
-              <a:graphicData uri="http://schemas.openxmlformats.org/drawingml/2006/picture">
-                <pic:pic xmlns:pic="http://schemas.openxmlformats.org/drawingml/2006/picture">
-                  <pic:nvPicPr>
-                    <pic:cNvPr id="0" name="" descr=""/>
-                    <pic:cNvPicPr>
-                      <a:picLocks noChangeAspect="1" noChangeArrowheads="1"/>
-                    </pic:cNvPicPr>
-                  </pic:nvPicPr>
-                  <pic:blipFill>
-                    <a:blip r:embed="rId17" cstate="none"/>
-                    <a:srcRect/>
-                    <a:stretch>
-                      <a:fillRect/>
-                    </a:stretch>
-                  </pic:blipFill>
-                  <pic:spPr bwMode="auto">
-                    <a:xfrm>
-                      <a:off x="0" y="0"/>
-                      <a:ext cx="5715000" cy="1990725"/>
-                    </a:xfrm>
-                    <a:prstGeom prst="rect">
-                      <a:avLst/>
-                    </a:prstGeom>
-                  </pic:spPr>
-                </pic:pic>
-              </a:graphicData>
-            </a:graphic>
-          </wp:inline>
-        </w:drawing>
-      </w:r>
-    </w:p>
-    <w:p>
-      <w:pPr>
-        <w:keepNext w:val="false"/>
-        <w:spacing w:after="70" w:before="190"/>
-      </w:pPr>
-      <w:r>
-        <w:rPr>
-          <w:rFonts w:ascii="Arial" w:cs="Arial" w:eastAsia="Arial" w:hAnsi="Arial"/>
-          <w:b/>
-          <w:bCs/>
-          <w:color w:val="24405C"/>
-          <w:sz w:val="19"/>
-          <w:szCs w:val="19"/>
-        </w:rPr>
-        <w:t xml:space="preserve">Khung phát hiện + điểm lidar (vàng). Lấy trung vị 1 m dày điểm nhất trong khung: người 8,9 m (chính thức 9,0 m), xe 21,4 m (22,0 m). Dữ liệu: nuScenes (Motional), CC BY-NC-SA 4.0</w:t>
-      </w:r>
-    </w:p>
-    <w:p>
-      <w:pPr>
-        <w:widowControl/>
-        <w:spacing w:after="100" w:before="0" w:line="312"/>
-        <w:ind w:left="0" w:firstLine="0"/>
-      </w:pPr>
-      <w:r>
-        <w:rPr>
-          <w:rFonts w:ascii="Arial" w:cs="Arial" w:eastAsia="Arial" w:hAnsi="Arial"/>
-          <w:color w:val="1B1B1B"/>
-          <w:sz w:val="22"/>
-          <w:szCs w:val="22"/>
-        </w:rPr>
-        <w:t xml:space="preserve">Camera nói «đây là người», lidar nói «bao xa» — cặp camera + lidar của tuần 7. Khung là hình chữ nhật, góc khung có cả điểm của mặt đường, nhà phía sau, nên phải chọn cụm điểm dày nhất. Xe tự lái cần </w:t>
-      </w:r>
-      <w:r>
-        <w:rPr>
-          <w:rFonts w:ascii="Arial" w:cs="Arial" w:eastAsia="Arial" w:hAnsi="Arial"/>
-          <w:b/>
-          <w:bCs/>
-          <w:color w:val="24405C"/>
-          <w:sz w:val="22"/>
-          <w:szCs w:val="22"/>
-        </w:rPr>
-        <w:t xml:space="preserve">khung 3D</w:t>
-      </w:r>
-      <w:r>
-        <w:rPr>
-          <w:rFonts w:ascii="Arial" w:cs="Arial" w:eastAsia="Arial" w:hAnsi="Arial"/>
-          <w:color w:val="1B1B1B"/>
-          <w:sz w:val="22"/>
-          <w:szCs w:val="22"/>
-        </w:rPr>
-        <w:t xml:space="preserve">: ba số vị trí, ba số kích thước, thêm hướng — bảy con số (tuần 7).</w:t>
-      </w:r>
-    </w:p>
-    <w:p>
-      <w:pPr>
-        <w:pStyle w:val="Heading2"/>
-        <w:keepNext/>
-        <w:spacing w:after="130" w:before="300"/>
-      </w:pPr>
-      <w:r>
-        <w:rPr>
-          <w:rFonts w:ascii="Arial" w:cs="Arial" w:eastAsia="Arial" w:hAnsi="Arial"/>
-          <w:b/>
-          <w:bCs/>
-          <w:color w:val="24405C"/>
-          <w:sz w:val="24"/>
-          <w:szCs w:val="24"/>
-        </w:rPr>
-        <w:t xml:space="preserve">Nhìn từ trên xuống: bản đồ từ trên và lưới chiếm chỗ</w:t>
-      </w:r>
-    </w:p>
-    <w:p>
-      <w:pPr>
-        <w:keepNext/>
-        <w:spacing w:after="60" w:before="60"/>
-        <w:jc w:val="center"/>
-      </w:pPr>
-      <w:r>
-        <w:drawing>
-          <wp:inline distT="0" distB="0" distL="0" distR="0">
-            <wp:extent cx="5905500" cy="3333750"/>
-            <wp:effectExtent t="0" r="0" b="0" l="0"/>
-            <wp:docPr id="1" name="" descr="" title=""/>
-            <wp:cNvGraphicFramePr>
-              <a:graphicFrameLocks xmlns:a="http://schemas.openxmlformats.org/drawingml/2006/main" noChangeAspect="1"/>
-            </wp:cNvGraphicFramePr>
-            <a:graphic xmlns:a="http://schemas.openxmlformats.org/drawingml/2006/main">
-              <a:graphicData uri="http://schemas.openxmlformats.org/drawingml/2006/picture">
-                <pic:pic xmlns:pic="http://schemas.openxmlformats.org/drawingml/2006/picture">
-                  <pic:nvPicPr>
-                    <pic:cNvPr id="0" name="" descr=""/>
-                    <pic:cNvPicPr>
-                      <a:picLocks noChangeAspect="1" noChangeArrowheads="1"/>
-                    </pic:cNvPicPr>
-                  </pic:nvPicPr>
-                  <pic:blipFill>
-                    <a:blip r:embed="rId18" cstate="none"/>
-                    <a:srcRect/>
-                    <a:stretch>
-                      <a:fillRect/>
-                    </a:stretch>
-                  </pic:blipFill>
-                  <pic:spPr bwMode="auto">
-                    <a:xfrm>
-                      <a:off x="0" y="0"/>
-                      <a:ext cx="5905500" cy="3333750"/>
-                    </a:xfrm>
-                    <a:prstGeom prst="rect">
-                      <a:avLst/>
-                    </a:prstGeom>
-                  </pic:spPr>
-                </pic:pic>
-              </a:graphicData>
-            </a:graphic>
-          </wp:inline>
-        </w:drawing>
-      </w:r>
-    </w:p>
-    <w:p>
-      <w:pPr>
-        <w:keepNext w:val="false"/>
-        <w:spacing w:after="70" w:before="190"/>
-      </w:pPr>
-      <w:r>
-        <w:rPr>
-          <w:rFonts w:ascii="Arial" w:cs="Arial" w:eastAsia="Arial" w:hAnsi="Arial"/>
-          <w:b/>
-          <w:bCs/>
-          <w:color w:val="24405C"/>
-          <w:sz w:val="19"/>
-          <w:szCs w:val="19"/>
-        </w:rPr>
-        <w:t xml:space="preserve">Trái: bản đồ từ trên, điểm lidar + khung 3D; phải: lưới chiếm chỗ tính từ cùng khung lidar (ô 0,5 m). scene-0103 (Boston). Dữ liệu: nuScenes (Motional), CC BY-NC-SA 4.0</w:t>
-      </w:r>
-    </w:p>
-    <w:p>
-      <w:pPr>
-        <w:pStyle w:val="ListParagraph"/>
-        <w:widowControl/>
-        <w:numPr>
-          <w:ilvl w:val="0"/>
-          <w:numId w:val="3"/>
-        </w:numPr>
-        <w:spacing w:after="80" w:line="320"/>
-      </w:pPr>
-      <w:r>
-        <w:rPr>
-          <w:rFonts w:ascii="Arial" w:cs="Arial" w:eastAsia="Arial" w:hAnsi="Arial"/>
-          <w:color w:val="1B1B1B"/>
-          <w:sz w:val="22"/>
-          <w:szCs w:val="22"/>
-        </w:rPr>
-        <w:t xml:space="preserve">Ba cái lợi của bản đồ từ trên: các vật </w:t>
-      </w:r>
-      <w:r>
-        <w:rPr>
-          <w:rFonts w:ascii="Arial" w:cs="Arial" w:eastAsia="Arial" w:hAnsi="Arial"/>
-          <w:b/>
-          <w:bCs/>
-          <w:color w:val="24405C"/>
-          <w:sz w:val="22"/>
-          <w:szCs w:val="22"/>
-        </w:rPr>
-        <w:t xml:space="preserve">không che nhau</w:t>
-      </w:r>
-      <w:r>
-        <w:rPr>
-          <w:rFonts w:ascii="Arial" w:cs="Arial" w:eastAsia="Arial" w:hAnsi="Arial"/>
-          <w:color w:val="1B1B1B"/>
-          <w:sz w:val="22"/>
-          <w:szCs w:val="22"/>
-        </w:rPr>
-        <w:t xml:space="preserve">; </w:t>
-      </w:r>
-      <w:r>
-        <w:rPr>
-          <w:rFonts w:ascii="Arial" w:cs="Arial" w:eastAsia="Arial" w:hAnsi="Arial"/>
-          <w:b/>
-          <w:bCs/>
-          <w:color w:val="24405C"/>
-          <w:sz w:val="22"/>
-          <w:szCs w:val="22"/>
-        </w:rPr>
-        <w:t xml:space="preserve">khoảng cách không méo</w:t>
-      </w:r>
-      <w:r>
-        <w:rPr>
-          <w:rFonts w:ascii="Arial" w:cs="Arial" w:eastAsia="Arial" w:hAnsi="Arial"/>
-          <w:color w:val="1B1B1B"/>
-          <w:sz w:val="22"/>
-          <w:szCs w:val="22"/>
-        </w:rPr>
-        <w:t xml:space="preserve">; lái xe vốn là quyết định </w:t>
-      </w:r>
-      <w:r>
-        <w:rPr>
-          <w:rFonts w:ascii="Arial" w:cs="Arial" w:eastAsia="Arial" w:hAnsi="Arial"/>
-          <w:b/>
-          <w:bCs/>
-          <w:color w:val="24405C"/>
-          <w:sz w:val="22"/>
-          <w:szCs w:val="22"/>
-        </w:rPr>
-        <w:t xml:space="preserve">trên mặt đất</w:t>
-      </w:r>
-      <w:r>
-        <w:rPr>
-          <w:rFonts w:ascii="Arial" w:cs="Arial" w:eastAsia="Arial" w:hAnsi="Arial"/>
-          <w:color w:val="1B1B1B"/>
-          <w:sz w:val="22"/>
-          <w:szCs w:val="22"/>
-        </w:rPr>
-        <w:t xml:space="preserve">. Ghép giữa ở tuần 7 là cùng vẽ thành một bản đồ từ trên.</w:t>
-      </w:r>
-    </w:p>
-    <w:p>
-      <w:pPr>
-        <w:pStyle w:val="ListParagraph"/>
-        <w:widowControl/>
-        <w:numPr>
-          <w:ilvl w:val="0"/>
-          <w:numId w:val="3"/>
-        </w:numPr>
-        <w:spacing w:after="80" w:line="320"/>
-      </w:pPr>
-      <w:r>
-        <w:rPr>
-          <w:rFonts w:ascii="Arial" w:cs="Arial" w:eastAsia="Arial" w:hAnsi="Arial"/>
-          <w:color w:val="1B1B1B"/>
-          <w:sz w:val="22"/>
-          <w:szCs w:val="22"/>
-        </w:rPr>
-        <w:t xml:space="preserve">Lưới chiếm chỗ: mỗi ô chỉ hỏi một việc. </w:t>
-      </w:r>
-      <w:r>
-        <w:rPr>
-          <w:rFonts w:ascii="Arial" w:cs="Arial" w:eastAsia="Arial" w:hAnsi="Arial"/>
-          <w:b/>
-          <w:bCs/>
-          <w:color w:val="24405C"/>
-          <w:sz w:val="22"/>
-          <w:szCs w:val="22"/>
-        </w:rPr>
-        <w:t xml:space="preserve">Đỏ = có vật</w:t>
-      </w:r>
-      <w:r>
-        <w:rPr>
-          <w:rFonts w:ascii="Arial" w:cs="Arial" w:eastAsia="Arial" w:hAnsi="Arial"/>
-          <w:color w:val="1B1B1B"/>
-          <w:sz w:val="22"/>
-          <w:szCs w:val="22"/>
-        </w:rPr>
-        <w:t xml:space="preserve">, </w:t>
-      </w:r>
-      <w:r>
-        <w:rPr>
-          <w:rFonts w:ascii="Arial" w:cs="Arial" w:eastAsia="Arial" w:hAnsi="Arial"/>
-          <w:b/>
-          <w:bCs/>
-          <w:color w:val="24405C"/>
-          <w:sz w:val="22"/>
-          <w:szCs w:val="22"/>
-        </w:rPr>
-        <w:t xml:space="preserve">trắng = trống</w:t>
-      </w:r>
-      <w:r>
-        <w:rPr>
-          <w:rFonts w:ascii="Arial" w:cs="Arial" w:eastAsia="Arial" w:hAnsi="Arial"/>
-          <w:color w:val="1B1B1B"/>
-          <w:sz w:val="22"/>
-          <w:szCs w:val="22"/>
-        </w:rPr>
-        <w:t xml:space="preserve"> (tia laser đi qua không chạm gì), </w:t>
-      </w:r>
-      <w:r>
-        <w:rPr>
-          <w:rFonts w:ascii="Arial" w:cs="Arial" w:eastAsia="Arial" w:hAnsi="Arial"/>
-          <w:b/>
-          <w:bCs/>
-          <w:color w:val="24405C"/>
-          <w:sz w:val="22"/>
-          <w:szCs w:val="22"/>
-        </w:rPr>
-        <w:t xml:space="preserve">xám = chưa biết</w:t>
-      </w:r>
-      <w:r>
-        <w:rPr>
-          <w:rFonts w:ascii="Arial" w:cs="Arial" w:eastAsia="Arial" w:hAnsi="Arial"/>
-          <w:color w:val="1B1B1B"/>
-          <w:sz w:val="22"/>
-          <w:szCs w:val="22"/>
-        </w:rPr>
-        <w:t xml:space="preserve"> (bị che, không bắn tới).</w:t>
-      </w:r>
-    </w:p>
-    <w:p>
-      <w:pPr>
-        <w:pStyle w:val="ListParagraph"/>
-        <w:widowControl/>
-        <w:numPr>
-          <w:ilvl w:val="0"/>
-          <w:numId w:val="3"/>
-        </w:numPr>
-        <w:spacing w:after="80" w:line="320"/>
-      </w:pPr>
-      <w:r>
-        <w:rPr>
-          <w:rFonts w:ascii="Arial" w:cs="Arial" w:eastAsia="Arial" w:hAnsi="Arial"/>
-          <w:color w:val="1B1B1B"/>
-          <w:sz w:val="22"/>
-          <w:szCs w:val="22"/>
-        </w:rPr>
-        <w:t xml:space="preserve">Lợi lớn nhất: </w:t>
-      </w:r>
-      <w:r>
-        <w:rPr>
-          <w:rFonts w:ascii="Arial" w:cs="Arial" w:eastAsia="Arial" w:hAnsi="Arial"/>
-          <w:b/>
-          <w:bCs/>
-          <w:color w:val="24405C"/>
-          <w:sz w:val="22"/>
-          <w:szCs w:val="22"/>
-        </w:rPr>
-        <w:t xml:space="preserve">không cần biết là gì</w:t>
-      </w:r>
-      <w:r>
-        <w:rPr>
-          <w:rFonts w:ascii="Arial" w:cs="Arial" w:eastAsia="Arial" w:hAnsi="Arial"/>
-          <w:color w:val="1B1B1B"/>
-          <w:sz w:val="22"/>
-          <w:szCs w:val="22"/>
-        </w:rPr>
-        <w:t xml:space="preserve">. Hàng rơi trên đường, chướng ngại lạ, bộ phát hiện không nhận ra nhưng lưới vẫn tô đỏ. Cẩn thận: «chưa biết» không phải «trống».</w:t>
-      </w:r>
-    </w:p>
-    <w:p>
-      <w:pPr>
-        <w:pStyle w:val="Heading1"/>
-        <w:keepNext/>
-        <w:pageBreakBefore/>
-        <w:spacing w:after="240" w:before="160"/>
-      </w:pPr>
-      <w:r>
-        <w:rPr>
-          <w:rFonts w:ascii="Arial" w:cs="Arial" w:eastAsia="Arial" w:hAnsi="Arial"/>
-          <w:b/>
-          <w:bCs/>
-          <w:color w:val="24405C"/>
-          <w:sz w:val="30"/>
-          <w:szCs w:val="30"/>
-        </w:rPr>
-        <w:t xml:space="preserve">3. Gán nhãn dữ liệu: chuẩn bị đáp án cho máy tính</w:t>
-      </w:r>
-    </w:p>
-    <w:p>
-      <w:pPr>
-        <w:widowControl/>
-        <w:spacing w:after="100" w:before="0" w:line="312"/>
-        <w:ind w:left="0" w:firstLine="0"/>
-      </w:pPr>
-      <w:r>
-        <w:rPr>
-          <w:rFonts w:ascii="Arial" w:cs="Arial" w:eastAsia="Arial" w:hAnsi="Arial"/>
-          <w:color w:val="1B1B1B"/>
-          <w:sz w:val="22"/>
-          <w:szCs w:val="22"/>
-        </w:rPr>
-        <w:t xml:space="preserve">Dữ liệu gán nhãn là sách giáo khoa của mô hình. Ba tình huống làm mô hình học sai: </w:t>
-      </w:r>
-      <w:r>
-        <w:rPr>
-          <w:rFonts w:ascii="Arial" w:cs="Arial" w:eastAsia="Arial" w:hAnsi="Arial"/>
-          <w:b/>
-          <w:bCs/>
-          <w:color w:val="24405C"/>
-          <w:sz w:val="22"/>
-          <w:szCs w:val="22"/>
-        </w:rPr>
-        <w:t xml:space="preserve">thiếu nhãn</w:t>
-      </w:r>
-      <w:r>
-        <w:rPr>
-          <w:rFonts w:ascii="Arial" w:cs="Arial" w:eastAsia="Arial" w:hAnsi="Arial"/>
-          <w:color w:val="1B1B1B"/>
-          <w:sz w:val="22"/>
-          <w:szCs w:val="22"/>
-        </w:rPr>
-        <w:t xml:space="preserve"> (có người mà không khoanh, mô hình học «trông thế này không phải người»), </w:t>
-      </w:r>
-      <w:r>
-        <w:rPr>
-          <w:rFonts w:ascii="Arial" w:cs="Arial" w:eastAsia="Arial" w:hAnsi="Arial"/>
-          <w:b/>
-          <w:bCs/>
-          <w:color w:val="24405C"/>
-          <w:sz w:val="22"/>
-          <w:szCs w:val="22"/>
-        </w:rPr>
-        <w:t xml:space="preserve">sai loại</w:t>
-      </w:r>
-      <w:r>
-        <w:rPr>
-          <w:rFonts w:ascii="Arial" w:cs="Arial" w:eastAsia="Arial" w:hAnsi="Arial"/>
-          <w:color w:val="1B1B1B"/>
-          <w:sz w:val="22"/>
-          <w:szCs w:val="22"/>
-        </w:rPr>
-        <w:t xml:space="preserve"> (xe máy thành xe đạp), </w:t>
-      </w:r>
-      <w:r>
-        <w:rPr>
-          <w:rFonts w:ascii="Arial" w:cs="Arial" w:eastAsia="Arial" w:hAnsi="Arial"/>
-          <w:b/>
-          <w:bCs/>
-          <w:color w:val="24405C"/>
-          <w:sz w:val="22"/>
-          <w:szCs w:val="22"/>
-        </w:rPr>
-        <w:t xml:space="preserve">mỗi người một kiểu</w:t>
-      </w:r>
-      <w:r>
-        <w:rPr>
-          <w:rFonts w:ascii="Arial" w:cs="Arial" w:eastAsia="Arial" w:hAnsi="Arial"/>
-          <w:color w:val="1B1B1B"/>
-          <w:sz w:val="22"/>
-          <w:szCs w:val="22"/>
-        </w:rPr>
-        <w:t xml:space="preserve"> (người khoanh chung người lái với xe máy, người khoanh riêng). Vì vậy gán nhãn chính thức luôn có bộ quy tắc, mọi người theo cùng một bộ, và có kiểm tra.</w:t>
-      </w:r>
-    </w:p>
-    <w:p>
-      <w:pPr>
-        <w:keepNext/>
-        <w:spacing w:after="70" w:before="190"/>
-      </w:pPr>
-      <w:r>
-        <w:rPr>
-          <w:rFonts w:ascii="Arial" w:cs="Arial" w:eastAsia="Arial" w:hAnsi="Arial"/>
-          <w:b/>
-          <w:bCs/>
-          <w:color w:val="24405C"/>
-          <w:sz w:val="19"/>
-          <w:szCs w:val="19"/>
-        </w:rPr>
-        <w:t xml:space="preserve">Bảng 3. nuScenes đã gán nhãn bao nhiêu</w:t>
-      </w:r>
-    </w:p>
-    <w:tbl>
-      <w:tblPr>
-        <w:tblW w:type="dxa" w:w="9360"/>
-        <w:tblBorders>
-          <w:top w:val="single" w:color="8A949C" w:sz="8"/>
-          <w:left w:val="none"/>
-          <w:bottom w:val="single" w:color="8A949C" w:sz="8"/>
-          <w:right w:val="none"/>
-          <w:insideH w:val="single" w:color="BFC7CE" w:sz="2"/>
-          <w:insideV w:val="none"/>
-        </w:tblBorders>
-      </w:tblPr>
-      <w:tblGrid>
-        <w:gridCol w:w="3000"/>
-        <w:gridCol w:w="6360"/>
-      </w:tblGrid>
-      <w:tr>
-        <w:trPr>
-          <w:cantSplit/>
-          <w:tblHeader/>
-        </w:trPr>
-        <w:tc>
-          <w:tcPr>
-            <w:tcW w:type="dxa" w:w="3000"/>
-            <w:shd w:fill="EDF0F3" w:color="auto" w:val="clear"/>
-            <w:tcMar>
-              <w:top w:type="dxa" w:w="60"/>
-              <w:left w:type="dxa" w:w="95"/>
-              <w:bottom w:type="dxa" w:w="60"/>
-              <w:right w:type="dxa" w:w="95"/>
-            </w:tcMar>
-            <w:vAlign w:val="center"/>
-          </w:tcPr>
-          <w:p>
-            <w:pPr>
-              <w:spacing w:after="0" w:line="265"/>
-            </w:pPr>
-            <w:r>
-              <w:rPr>
-                <w:rFonts w:ascii="Arial" w:cs="Arial" w:eastAsia="Arial" w:hAnsi="Arial"/>
-                <w:b/>
-                <w:bCs/>
-                <w:color w:val="1B1B1B"/>
-                <w:sz w:val="18"/>
-                <w:szCs w:val="18"/>
-              </w:rPr>
-              <w:t xml:space="preserve">Hạng mục</w:t>
-            </w:r>
-          </w:p>
-        </w:tc>
-        <w:tc>
-          <w:tcPr>
-            <w:tcW w:type="dxa" w:w="6360"/>
-            <w:shd w:fill="EDF0F3" w:color="auto" w:val="clear"/>
-            <w:tcMar>
-              <w:top w:type="dxa" w:w="60"/>
-              <w:left w:type="dxa" w:w="95"/>
-              <w:bottom w:type="dxa" w:w="60"/>
-              <w:right w:type="dxa" w:w="95"/>
-            </w:tcMar>
-            <w:vAlign w:val="center"/>
-          </w:tcPr>
-          <w:p>
-            <w:pPr>
-              <w:spacing w:after="0" w:line="265"/>
-            </w:pPr>
-            <w:r>
-              <w:rPr>
-                <w:rFonts w:ascii="Arial" w:cs="Arial" w:eastAsia="Arial" w:hAnsi="Arial"/>
-                <w:b/>
-                <w:bCs/>
-                <w:color w:val="1B1B1B"/>
-                <w:sz w:val="18"/>
-                <w:szCs w:val="18"/>
-              </w:rPr>
-              <w:t xml:space="preserve">Con số</w:t>
-            </w:r>
-          </w:p>
-        </w:tc>
-      </w:tr>
-      <w:tr>
-        <w:trPr>
-          <w:cantSplit/>
-          <w:tblHeader w:val="false"/>
-        </w:trPr>
-        <w:tc>
-          <w:tcPr>
-            <w:tcW w:type="dxa" w:w="3000"/>
-            <w:tcMar>
-              <w:top w:type="dxa" w:w="60"/>
-              <w:left w:type="dxa" w:w="95"/>
-              <w:bottom w:type="dxa" w:w="60"/>
-              <w:right w:type="dxa" w:w="95"/>
-            </w:tcMar>
-            <w:vAlign w:val="center"/>
-          </w:tcPr>
-          <w:p>
-            <w:pPr>
-              <w:spacing w:after="0" w:line="265"/>
-            </w:pPr>
-            <w:r>
-              <w:rPr>
-                <w:rFonts w:ascii="Arial" w:cs="Arial" w:eastAsia="Arial" w:hAnsi="Arial"/>
-                <w:b w:val="false"/>
-                <w:bCs w:val="false"/>
-                <w:color w:val="1B1B1B"/>
-                <w:sz w:val="18"/>
-                <w:szCs w:val="18"/>
-              </w:rPr>
-              <w:t xml:space="preserve">Khung hình chính</w:t>
-            </w:r>
-          </w:p>
-        </w:tc>
-        <w:tc>
-          <w:tcPr>
-            <w:tcW w:type="dxa" w:w="6360"/>
-            <w:tcMar>
-              <w:top w:type="dxa" w:w="60"/>
-              <w:left w:type="dxa" w:w="95"/>
-              <w:bottom w:type="dxa" w:w="60"/>
-              <w:right w:type="dxa" w:w="95"/>
-            </w:tcMar>
-            <w:vAlign w:val="center"/>
-          </w:tcPr>
-          <w:p>
-            <w:pPr>
-              <w:spacing w:after="0" w:line="265"/>
-            </w:pPr>
-            <w:r>
-              <w:rPr>
-                <w:rFonts w:ascii="Arial" w:cs="Arial" w:eastAsia="Arial" w:hAnsi="Arial"/>
-                <w:b w:val="false"/>
-                <w:bCs w:val="false"/>
-                <w:color w:val="1B1B1B"/>
-                <w:sz w:val="18"/>
-                <w:szCs w:val="18"/>
-              </w:rPr>
-              <w:t xml:space="preserve">40.000 (1000 cảnh × 20 giây, mỗi 0,5 giây một lần)</w:t>
-            </w:r>
-          </w:p>
-        </w:tc>
-      </w:tr>
-      <w:tr>
-        <w:trPr>
-          <w:cantSplit/>
-          <w:tblHeader w:val="false"/>
-        </w:trPr>
-        <w:tc>
-          <w:tcPr>
-            <w:tcW w:type="dxa" w:w="3000"/>
-            <w:tcMar>
-              <w:top w:type="dxa" w:w="60"/>
-              <w:left w:type="dxa" w:w="95"/>
-              <w:bottom w:type="dxa" w:w="60"/>
-              <w:right w:type="dxa" w:w="95"/>
-            </w:tcMar>
-            <w:vAlign w:val="center"/>
-          </w:tcPr>
-          <w:p>
-            <w:pPr>
-              <w:spacing w:after="0" w:line="265"/>
-            </w:pPr>
-            <w:r>
-              <w:rPr>
-                <w:rFonts w:ascii="Arial" w:cs="Arial" w:eastAsia="Arial" w:hAnsi="Arial"/>
-                <w:b w:val="false"/>
-                <w:bCs w:val="false"/>
-                <w:color w:val="1B1B1B"/>
-                <w:sz w:val="18"/>
-                <w:szCs w:val="18"/>
-              </w:rPr>
-              <w:t xml:space="preserve">Khung 3D</w:t>
-            </w:r>
-          </w:p>
-        </w:tc>
-        <w:tc>
-          <w:tcPr>
-            <w:tcW w:type="dxa" w:w="6360"/>
-            <w:tcMar>
-              <w:top w:type="dxa" w:w="60"/>
-              <w:left w:type="dxa" w:w="95"/>
-              <w:bottom w:type="dxa" w:w="60"/>
-              <w:right w:type="dxa" w:w="95"/>
-            </w:tcMar>
-            <w:vAlign w:val="center"/>
-          </w:tcPr>
-          <w:p>
-            <w:pPr>
-              <w:spacing w:after="0" w:line="265"/>
-            </w:pPr>
-            <w:r>
-              <w:rPr>
-                <w:rFonts w:ascii="Arial" w:cs="Arial" w:eastAsia="Arial" w:hAnsi="Arial"/>
-                <w:b w:val="false"/>
-                <w:bCs w:val="false"/>
-                <w:color w:val="1B1B1B"/>
-                <w:sz w:val="18"/>
-                <w:szCs w:val="18"/>
-              </w:rPr>
-              <w:t xml:space="preserve">1,4 triệu, người gán từng cái</w:t>
-            </w:r>
-          </w:p>
-        </w:tc>
-      </w:tr>
-      <w:tr>
-        <w:trPr>
-          <w:cantSplit/>
-          <w:tblHeader w:val="false"/>
-        </w:trPr>
-        <w:tc>
-          <w:tcPr>
-            <w:tcW w:type="dxa" w:w="3000"/>
-            <w:tcMar>
-              <w:top w:type="dxa" w:w="60"/>
-              <w:left w:type="dxa" w:w="95"/>
-              <w:bottom w:type="dxa" w:w="60"/>
-              <w:right w:type="dxa" w:w="95"/>
-            </w:tcMar>
-            <w:vAlign w:val="center"/>
-          </w:tcPr>
-          <w:p>
-            <w:pPr>
-              <w:spacing w:after="0" w:line="265"/>
-            </w:pPr>
-            <w:r>
-              <w:rPr>
-                <w:rFonts w:ascii="Arial" w:cs="Arial" w:eastAsia="Arial" w:hAnsi="Arial"/>
-                <w:b w:val="false"/>
-                <w:bCs w:val="false"/>
-                <w:color w:val="1B1B1B"/>
-                <w:sz w:val="18"/>
-                <w:szCs w:val="18"/>
-              </w:rPr>
-              <w:t xml:space="preserve">Loại</w:t>
-            </w:r>
-          </w:p>
-        </w:tc>
-        <w:tc>
-          <w:tcPr>
-            <w:tcW w:type="dxa" w:w="6360"/>
-            <w:tcMar>
-              <w:top w:type="dxa" w:w="60"/>
-              <w:left w:type="dxa" w:w="95"/>
-              <w:bottom w:type="dxa" w:w="60"/>
-              <w:right w:type="dxa" w:w="95"/>
-            </w:tcMar>
-            <w:vAlign w:val="center"/>
-          </w:tcPr>
-          <w:p>
-            <w:pPr>
-              <w:spacing w:after="0" w:line="265"/>
-            </w:pPr>
-            <w:r>
-              <w:rPr>
-                <w:rFonts w:ascii="Arial" w:cs="Arial" w:eastAsia="Arial" w:hAnsi="Arial"/>
-                <w:b w:val="false"/>
-                <w:bCs w:val="false"/>
-                <w:color w:val="1B1B1B"/>
-                <w:sz w:val="18"/>
-                <w:szCs w:val="18"/>
-              </w:rPr>
-              <w:t xml:space="preserve">23 loại (người lớn, trẻ em, ô tô, xe buýt, xe máy, cọc tiêu…)</w:t>
-            </w:r>
-          </w:p>
-        </w:tc>
-      </w:tr>
-      <w:tr>
-        <w:trPr>
-          <w:cantSplit/>
-          <w:tblHeader w:val="false"/>
-        </w:trPr>
-        <w:tc>
-          <w:tcPr>
-            <w:tcW w:type="dxa" w:w="3000"/>
-            <w:tcMar>
-              <w:top w:type="dxa" w:w="60"/>
-              <w:left w:type="dxa" w:w="95"/>
-              <w:bottom w:type="dxa" w:w="60"/>
-              <w:right w:type="dxa" w:w="95"/>
-            </w:tcMar>
-            <w:vAlign w:val="center"/>
-          </w:tcPr>
-          <w:p>
-            <w:pPr>
-              <w:spacing w:after="0" w:line="265"/>
-            </w:pPr>
-            <w:r>
-              <w:rPr>
-                <w:rFonts w:ascii="Arial" w:cs="Arial" w:eastAsia="Arial" w:hAnsi="Arial"/>
-                <w:b w:val="false"/>
-                <w:bCs w:val="false"/>
-                <w:color w:val="1B1B1B"/>
-                <w:sz w:val="18"/>
-                <w:szCs w:val="18"/>
-              </w:rPr>
-              <w:t xml:space="preserve">Bản mini: ô tô và xe máy</w:t>
-            </w:r>
-          </w:p>
-        </w:tc>
-        <w:tc>
-          <w:tcPr>
-            <w:tcW w:type="dxa" w:w="6360"/>
-            <w:tcMar>
-              <w:top w:type="dxa" w:w="60"/>
-              <w:left w:type="dxa" w:w="95"/>
-              <w:bottom w:type="dxa" w:w="60"/>
-              <w:right w:type="dxa" w:w="95"/>
-            </w:tcMar>
-            <w:vAlign w:val="center"/>
-          </w:tcPr>
-          <w:p>
-            <w:pPr>
-              <w:spacing w:after="0" w:line="265"/>
-            </w:pPr>
-            <w:r>
-              <w:rPr>
-                <w:rFonts w:ascii="Arial" w:cs="Arial" w:eastAsia="Arial" w:hAnsi="Arial"/>
-                <w:b w:val="false"/>
-                <w:bCs w:val="false"/>
-                <w:color w:val="1B1B1B"/>
-                <w:sz w:val="18"/>
-                <w:szCs w:val="18"/>
-              </w:rPr>
-              <w:t xml:space="preserve">7.619 khung và 471 khung: xe máy ít hơn 16 lần</w:t>
-            </w:r>
-          </w:p>
-        </w:tc>
-      </w:tr>
-    </w:tbl>
-    <w:p>
-      <w:pPr>
-        <w:spacing w:after="0"/>
-      </w:pPr>
-      <w:r>
-        <w:rPr>
-          <w:rFonts w:ascii="Arial" w:cs="Arial" w:eastAsia="Arial" w:hAnsi="Arial"/>
-          <w:color w:val="1B1B1B"/>
-          <w:sz w:val="22"/>
-          <w:szCs w:val="22"/>
-        </w:rPr>
-        <w:t xml:space="preserve"/>
-      </w:r>
-    </w:p>
-    <w:p>
-      <w:pPr>
-        <w:keepNext/>
-        <w:spacing w:after="60" w:before="60"/>
-        <w:jc w:val="center"/>
-      </w:pPr>
-      <w:r>
-        <w:drawing>
-          <wp:inline distT="0" distB="0" distL="0" distR="0">
-            <wp:extent cx="4572000" cy="2638425"/>
-            <wp:effectExtent t="0" r="0" b="0" l="0"/>
-            <wp:docPr id="1" name="" descr="" title=""/>
-            <wp:cNvGraphicFramePr>
-              <a:graphicFrameLocks xmlns:a="http://schemas.openxmlformats.org/drawingml/2006/main" noChangeAspect="1"/>
-            </wp:cNvGraphicFramePr>
-            <a:graphic xmlns:a="http://schemas.openxmlformats.org/drawingml/2006/main">
-              <a:graphicData uri="http://schemas.openxmlformats.org/drawingml/2006/picture">
-                <pic:pic xmlns:pic="http://schemas.openxmlformats.org/drawingml/2006/picture">
-                  <pic:nvPicPr>
-                    <pic:cNvPr id="0" name="" descr=""/>
-                    <pic:cNvPicPr>
-                      <a:picLocks noChangeAspect="1" noChangeArrowheads="1"/>
-                    </pic:cNvPicPr>
-                  </pic:nvPicPr>
-                  <pic:blipFill>
-                    <a:blip r:embed="rId19" cstate="none"/>
-                    <a:srcRect/>
-                    <a:stretch>
-                      <a:fillRect/>
-                    </a:stretch>
-                  </pic:blipFill>
-                  <pic:spPr bwMode="auto">
-                    <a:xfrm>
-                      <a:off x="0" y="0"/>
-                      <a:ext cx="4572000" cy="2638425"/>
-                    </a:xfrm>
-                    <a:prstGeom prst="rect">
-                      <a:avLst/>
-                    </a:prstGeom>
-                  </pic:spPr>
-                </pic:pic>
-              </a:graphicData>
-            </a:graphic>
-          </wp:inline>
-        </w:drawing>
-      </w:r>
-    </w:p>
-    <w:p>
-      <w:pPr>
-        <w:keepNext w:val="false"/>
-        <w:spacing w:after="70" w:before="190"/>
-      </w:pPr>
-      <w:r>
-        <w:rPr>
-          <w:rFonts w:ascii="Arial" w:cs="Arial" w:eastAsia="Arial" w:hAnsi="Arial"/>
-          <w:b/>
-          <w:bCs/>
-          <w:color w:val="24405C"/>
-          <w:sz w:val="19"/>
-          <w:szCs w:val="19"/>
-        </w:rPr>
-        <w:t xml:space="preserve">Số khung mỗi loại trong nuScenes mini (tuần 7). Đường Boston, Singapore ít xe máy nên sách này dạy rất ít về xe máy. Dữ liệu: nuScenes (Motional), CC BY-NC-SA 4.0</w:t>
-      </w:r>
-    </w:p>
-    <w:p>
-      <w:pPr>
-        <w:keepNext/>
-        <w:spacing w:after="70" w:before="190"/>
-      </w:pPr>
-      <w:r>
-        <w:rPr>
-          <w:rFonts w:ascii="Arial" w:cs="Arial" w:eastAsia="Arial" w:hAnsi="Arial"/>
-          <w:b/>
-          <w:bCs/>
-          <w:color w:val="24405C"/>
-          <w:sz w:val="19"/>
-          <w:szCs w:val="19"/>
-        </w:rPr>
-        <w:t xml:space="preserve">Bảng 4. Quy tắc gán nhãn chính thức của nuScenes (trích, nguyên văn từ instructions_nuscenes.md)</w:t>
-      </w:r>
-    </w:p>
-    <w:tbl>
-      <w:tblPr>
-        <w:tblW w:type="dxa" w:w="9360"/>
-        <w:tblBorders>
-          <w:top w:val="single" w:color="8A949C" w:sz="8"/>
-          <w:left w:val="none"/>
-          <w:bottom w:val="single" w:color="8A949C" w:sz="8"/>
-          <w:right w:val="none"/>
-          <w:insideH w:val="single" w:color="BFC7CE" w:sz="2"/>
-          <w:insideV w:val="none"/>
-        </w:tblBorders>
-      </w:tblPr>
-      <w:tblGrid>
-        <w:gridCol w:w="2900"/>
-        <w:gridCol w:w="3600"/>
-        <w:gridCol w:w="2860"/>
-      </w:tblGrid>
-      <w:tr>
-        <w:trPr>
-          <w:cantSplit/>
-          <w:tblHeader/>
-        </w:trPr>
-        <w:tc>
-          <w:tcPr>
-            <w:tcW w:type="dxa" w:w="2900"/>
-            <w:shd w:fill="EDF0F3" w:color="auto" w:val="clear"/>
-            <w:tcMar>
-              <w:top w:type="dxa" w:w="60"/>
-              <w:left w:type="dxa" w:w="95"/>
-              <w:bottom w:type="dxa" w:w="60"/>
-              <w:right w:type="dxa" w:w="95"/>
-            </w:tcMar>
-            <w:vAlign w:val="center"/>
-          </w:tcPr>
-          <w:p>
-            <w:pPr>
-              <w:spacing w:after="0" w:line="265"/>
-            </w:pPr>
-            <w:r>
-              <w:rPr>
-                <w:rFonts w:ascii="Arial" w:cs="Arial" w:eastAsia="Arial" w:hAnsi="Arial"/>
-                <w:b/>
-                <w:bCs/>
-                <w:color w:val="1B1B1B"/>
-                <w:sz w:val="18"/>
-                <w:szCs w:val="18"/>
-              </w:rPr>
-              <w:t xml:space="preserve">Quy tắc</w:t>
-            </w:r>
-          </w:p>
-        </w:tc>
-        <w:tc>
-          <w:tcPr>
-            <w:tcW w:type="dxa" w:w="3600"/>
-            <w:shd w:fill="EDF0F3" w:color="auto" w:val="clear"/>
-            <w:tcMar>
-              <w:top w:type="dxa" w:w="60"/>
-              <w:left w:type="dxa" w:w="95"/>
-              <w:bottom w:type="dxa" w:w="60"/>
-              <w:right w:type="dxa" w:w="95"/>
-            </w:tcMar>
-            <w:vAlign w:val="center"/>
-          </w:tcPr>
-          <w:p>
-            <w:pPr>
-              <w:spacing w:after="0" w:line="265"/>
-            </w:pPr>
-            <w:r>
-              <w:rPr>
-                <w:rFonts w:ascii="Arial" w:cs="Arial" w:eastAsia="Arial" w:hAnsi="Arial"/>
-                <w:b/>
-                <w:bCs/>
-                <w:color w:val="1B1B1B"/>
-                <w:sz w:val="18"/>
-                <w:szCs w:val="18"/>
-              </w:rPr>
-              <w:t xml:space="preserve">Nguyên văn</w:t>
-            </w:r>
-          </w:p>
-        </w:tc>
-        <w:tc>
-          <w:tcPr>
-            <w:tcW w:type="dxa" w:w="2860"/>
-            <w:shd w:fill="EDF0F3" w:color="auto" w:val="clear"/>
-            <w:tcMar>
-              <w:top w:type="dxa" w:w="60"/>
-              <w:left w:type="dxa" w:w="95"/>
-              <w:bottom w:type="dxa" w:w="60"/>
-              <w:right w:type="dxa" w:w="95"/>
-            </w:tcMar>
-            <w:vAlign w:val="center"/>
-          </w:tcPr>
-          <w:p>
-            <w:pPr>
-              <w:spacing w:after="0" w:line="265"/>
-            </w:pPr>
-            <w:r>
-              <w:rPr>
-                <w:rFonts w:ascii="Arial" w:cs="Arial" w:eastAsia="Arial" w:hAnsi="Arial"/>
-                <w:b/>
-                <w:bCs/>
-                <w:color w:val="1B1B1B"/>
-                <w:sz w:val="18"/>
-                <w:szCs w:val="18"/>
-              </w:rPr>
-              <w:t xml:space="preserve">Vì sao</w:t>
-            </w:r>
-          </w:p>
-        </w:tc>
-      </w:tr>
-      <w:tr>
-        <w:trPr>
-          <w:cantSplit/>
-          <w:tblHeader w:val="false"/>
-        </w:trPr>
-        <w:tc>
-          <w:tcPr>
-            <w:tcW w:type="dxa" w:w="2900"/>
-            <w:tcMar>
-              <w:top w:type="dxa" w:w="60"/>
-              <w:left w:type="dxa" w:w="95"/>
-              <w:bottom w:type="dxa" w:w="60"/>
-              <w:right w:type="dxa" w:w="95"/>
-            </w:tcMar>
-            <w:vAlign w:val="center"/>
-          </w:tcPr>
-          <w:p>
-            <w:pPr>
-              <w:spacing w:after="0" w:line="265"/>
-            </w:pPr>
-            <w:r>
-              <w:rPr>
-                <w:rFonts w:ascii="Arial" w:cs="Arial" w:eastAsia="Arial" w:hAnsi="Arial"/>
-                <w:b w:val="false"/>
-                <w:bCs w:val="false"/>
-                <w:color w:val="1B1B1B"/>
-                <w:sz w:val="18"/>
-                <w:szCs w:val="18"/>
-              </w:rPr>
-              <w:t xml:space="preserve">Có ≥ 1 điểm lidar/radar là phải gán</w:t>
-            </w:r>
-          </w:p>
-        </w:tc>
-        <w:tc>
-          <w:tcPr>
-            <w:tcW w:type="dxa" w:w="3600"/>
-            <w:tcMar>
-              <w:top w:type="dxa" w:w="60"/>
-              <w:left w:type="dxa" w:w="95"/>
-              <w:bottom w:type="dxa" w:w="60"/>
-              <w:right w:type="dxa" w:w="95"/>
-            </w:tcMar>
-            <w:vAlign w:val="center"/>
-          </w:tcPr>
-          <w:p>
-            <w:pPr>
-              <w:spacing w:after="0" w:line="265"/>
-            </w:pPr>
-            <w:r>
-              <w:rPr>
-                <w:rFonts w:ascii="Arial" w:cs="Arial" w:eastAsia="Arial" w:hAnsi="Arial"/>
-                <w:b w:val="false"/>
-                <w:bCs w:val="false"/>
-                <w:color w:val="1B1B1B"/>
-                <w:sz w:val="18"/>
-                <w:szCs w:val="18"/>
-              </w:rPr>
-              <w:t xml:space="preserve">Label any target object containing at least 1 LIDAR or RADAR point</w:t>
-            </w:r>
-          </w:p>
-        </w:tc>
-        <w:tc>
-          <w:tcPr>
-            <w:tcW w:type="dxa" w:w="2860"/>
-            <w:tcMar>
-              <w:top w:type="dxa" w:w="60"/>
-              <w:left w:type="dxa" w:w="95"/>
-              <w:bottom w:type="dxa" w:w="60"/>
-              <w:right w:type="dxa" w:w="95"/>
-            </w:tcMar>
-            <w:vAlign w:val="center"/>
-          </w:tcPr>
-          <w:p>
-            <w:pPr>
-              <w:spacing w:after="0" w:line="265"/>
-            </w:pPr>
-            <w:r>
-              <w:rPr>
-                <w:rFonts w:ascii="Arial" w:cs="Arial" w:eastAsia="Arial" w:hAnsi="Arial"/>
-                <w:b w:val="false"/>
-                <w:bCs w:val="false"/>
-                <w:color w:val="1B1B1B"/>
-                <w:sz w:val="18"/>
-                <w:szCs w:val="18"/>
-              </w:rPr>
-              <w:t xml:space="preserve">Cảm biến thấy thì mô hình phải học</w:t>
-            </w:r>
-          </w:p>
-        </w:tc>
-      </w:tr>
-      <w:tr>
-        <w:trPr>
-          <w:cantSplit/>
-          <w:tblHeader w:val="false"/>
-        </w:trPr>
-        <w:tc>
-          <w:tcPr>
-            <w:tcW w:type="dxa" w:w="2900"/>
-            <w:tcMar>
-              <w:top w:type="dxa" w:w="60"/>
-              <w:left w:type="dxa" w:w="95"/>
-              <w:bottom w:type="dxa" w:w="60"/>
-              <w:right w:type="dxa" w:w="95"/>
-            </w:tcMar>
-            <w:vAlign w:val="center"/>
-          </w:tcPr>
-          <w:p>
-            <w:pPr>
-              <w:spacing w:after="0" w:line="265"/>
-            </w:pPr>
-            <w:r>
-              <w:rPr>
-                <w:rFonts w:ascii="Arial" w:cs="Arial" w:eastAsia="Arial" w:hAnsi="Arial"/>
-                <w:b w:val="false"/>
-                <w:bCs w:val="false"/>
-                <w:color w:val="1B1B1B"/>
-                <w:sz w:val="18"/>
-                <w:szCs w:val="18"/>
-              </w:rPr>
-              <w:t xml:space="preserve">Khung rất sát</w:t>
-            </w:r>
-          </w:p>
-        </w:tc>
-        <w:tc>
-          <w:tcPr>
-            <w:tcW w:type="dxa" w:w="3600"/>
-            <w:tcMar>
-              <w:top w:type="dxa" w:w="60"/>
-              <w:left w:type="dxa" w:w="95"/>
-              <w:bottom w:type="dxa" w:w="60"/>
-              <w:right w:type="dxa" w:w="95"/>
-            </w:tcMar>
-            <w:vAlign w:val="center"/>
-          </w:tcPr>
-          <w:p>
-            <w:pPr>
-              <w:spacing w:after="0" w:line="265"/>
-            </w:pPr>
-            <w:r>
-              <w:rPr>
-                <w:rFonts w:ascii="Arial" w:cs="Arial" w:eastAsia="Arial" w:hAnsi="Arial"/>
-                <w:b w:val="false"/>
-                <w:bCs w:val="false"/>
-                <w:color w:val="1B1B1B"/>
-                <w:sz w:val="18"/>
-                <w:szCs w:val="18"/>
-              </w:rPr>
-              <w:t xml:space="preserve">Cuboids must be very tight.</w:t>
-            </w:r>
-          </w:p>
-        </w:tc>
-        <w:tc>
-          <w:tcPr>
-            <w:tcW w:type="dxa" w:w="2860"/>
-            <w:tcMar>
-              <w:top w:type="dxa" w:w="60"/>
-              <w:left w:type="dxa" w:w="95"/>
-              <w:bottom w:type="dxa" w:w="60"/>
-              <w:right w:type="dxa" w:w="95"/>
-            </w:tcMar>
-            <w:vAlign w:val="center"/>
-          </w:tcPr>
-          <w:p>
-            <w:pPr>
-              <w:spacing w:after="0" w:line="265"/>
-            </w:pPr>
-            <w:r>
-              <w:rPr>
-                <w:rFonts w:ascii="Arial" w:cs="Arial" w:eastAsia="Arial" w:hAnsi="Arial"/>
-                <w:b w:val="false"/>
-                <w:bCs w:val="false"/>
-                <w:color w:val="1B1B1B"/>
-                <w:sz w:val="18"/>
-                <w:szCs w:val="18"/>
-              </w:rPr>
-              <w:t xml:space="preserve">Khung rộng thì sai vị trí, khoảng cách</w:t>
-            </w:r>
-          </w:p>
-        </w:tc>
-      </w:tr>
-      <w:tr>
-        <w:trPr>
-          <w:cantSplit/>
-          <w:tblHeader w:val="false"/>
-        </w:trPr>
-        <w:tc>
-          <w:tcPr>
-            <w:tcW w:type="dxa" w:w="2900"/>
-            <w:tcMar>
-              <w:top w:type="dxa" w:w="60"/>
-              <w:left w:type="dxa" w:w="95"/>
-              <w:bottom w:type="dxa" w:w="60"/>
-              <w:right w:type="dxa" w:w="95"/>
-            </w:tcMar>
-            <w:vAlign w:val="center"/>
-          </w:tcPr>
-          <w:p>
-            <w:pPr>
-              <w:spacing w:after="0" w:line="265"/>
-            </w:pPr>
-            <w:r>
-              <w:rPr>
-                <w:rFonts w:ascii="Arial" w:cs="Arial" w:eastAsia="Arial" w:hAnsi="Arial"/>
-                <w:b w:val="false"/>
-                <w:bCs w:val="false"/>
-                <w:color w:val="1B1B1B"/>
-                <w:sz w:val="18"/>
-                <w:szCs w:val="18"/>
-              </w:rPr>
-              <w:t xml:space="preserve">Gồm cả tay chân</w:t>
-            </w:r>
-          </w:p>
-        </w:tc>
-        <w:tc>
-          <w:tcPr>
-            <w:tcW w:type="dxa" w:w="3600"/>
-            <w:tcMar>
-              <w:top w:type="dxa" w:w="60"/>
-              <w:left w:type="dxa" w:w="95"/>
-              <w:bottom w:type="dxa" w:w="60"/>
-              <w:right w:type="dxa" w:w="95"/>
-            </w:tcMar>
-            <w:vAlign w:val="center"/>
-          </w:tcPr>
-          <w:p>
-            <w:pPr>
-              <w:spacing w:after="0" w:line="265"/>
-            </w:pPr>
-            <w:r>
-              <w:rPr>
-                <w:rFonts w:ascii="Arial" w:cs="Arial" w:eastAsia="Arial" w:hAnsi="Arial"/>
-                <w:b w:val="false"/>
-                <w:bCs w:val="false"/>
-                <w:color w:val="1B1B1B"/>
-                <w:sz w:val="18"/>
-                <w:szCs w:val="18"/>
-              </w:rPr>
-              <w:t xml:space="preserve">…should include the extremities.</w:t>
-            </w:r>
-          </w:p>
-        </w:tc>
-        <w:tc>
-          <w:tcPr>
-            <w:tcW w:type="dxa" w:w="2860"/>
-            <w:tcMar>
-              <w:top w:type="dxa" w:w="60"/>
-              <w:left w:type="dxa" w:w="95"/>
-              <w:bottom w:type="dxa" w:w="60"/>
-              <w:right w:type="dxa" w:w="95"/>
-            </w:tcMar>
-            <w:vAlign w:val="center"/>
-          </w:tcPr>
-          <w:p>
-            <w:pPr>
-              <w:spacing w:after="0" w:line="265"/>
-            </w:pPr>
-            <w:r>
-              <w:rPr>
-                <w:rFonts w:ascii="Arial" w:cs="Arial" w:eastAsia="Arial" w:hAnsi="Arial"/>
-                <w:b w:val="false"/>
-                <w:bCs w:val="false"/>
-                <w:color w:val="1B1B1B"/>
-                <w:sz w:val="18"/>
-                <w:szCs w:val="18"/>
-              </w:rPr>
-              <w:t xml:space="preserve">Tay giơ ra cũng có thể bị đụng</w:t>
-            </w:r>
-          </w:p>
-        </w:tc>
-      </w:tr>
-      <w:tr>
-        <w:trPr>
-          <w:cantSplit/>
-          <w:tblHeader w:val="false"/>
-        </w:trPr>
-        <w:tc>
-          <w:tcPr>
-            <w:tcW w:type="dxa" w:w="2900"/>
-            <w:tcMar>
-              <w:top w:type="dxa" w:w="60"/>
-              <w:left w:type="dxa" w:w="95"/>
-              <w:bottom w:type="dxa" w:w="60"/>
-              <w:right w:type="dxa" w:w="95"/>
-            </w:tcMar>
-            <w:vAlign w:val="center"/>
-          </w:tcPr>
-          <w:p>
-            <w:pPr>
-              <w:spacing w:after="0" w:line="265"/>
-            </w:pPr>
-            <w:r>
-              <w:rPr>
-                <w:rFonts w:ascii="Arial" w:cs="Arial" w:eastAsia="Arial" w:hAnsi="Arial"/>
-                <w:b w:val="false"/>
-                <w:bCs w:val="false"/>
-                <w:color w:val="1B1B1B"/>
-                <w:sz w:val="18"/>
-                <w:szCs w:val="18"/>
-              </w:rPr>
-              <w:t xml:space="preserve">Có người lái: chung khung với xe</w:t>
-            </w:r>
-          </w:p>
-        </w:tc>
-        <w:tc>
-          <w:tcPr>
-            <w:tcW w:type="dxa" w:w="3600"/>
-            <w:tcMar>
-              <w:top w:type="dxa" w:w="60"/>
-              <w:left w:type="dxa" w:w="95"/>
-              <w:bottom w:type="dxa" w:w="60"/>
-              <w:right w:type="dxa" w:w="95"/>
-            </w:tcMar>
-            <w:vAlign w:val="center"/>
-          </w:tcPr>
-          <w:p>
-            <w:pPr>
-              <w:spacing w:after="0" w:line="265"/>
-            </w:pPr>
-            <w:r>
-              <w:rPr>
-                <w:rFonts w:ascii="Arial" w:cs="Arial" w:eastAsia="Arial" w:hAnsi="Arial"/>
-                <w:b w:val="false"/>
-                <w:bCs w:val="false"/>
-                <w:color w:val="1B1B1B"/>
-                <w:sz w:val="18"/>
-                <w:szCs w:val="18"/>
-              </w:rPr>
-              <w:t xml:space="preserve">If there is a rider, include the rider in the box.</w:t>
-            </w:r>
-          </w:p>
-        </w:tc>
-        <w:tc>
-          <w:tcPr>
-            <w:tcW w:type="dxa" w:w="2860"/>
-            <w:tcMar>
-              <w:top w:type="dxa" w:w="60"/>
-              <w:left w:type="dxa" w:w="95"/>
-              <w:bottom w:type="dxa" w:w="60"/>
-              <w:right w:type="dxa" w:w="95"/>
-            </w:tcMar>
-            <w:vAlign w:val="center"/>
-          </w:tcPr>
-          <w:p>
-            <w:pPr>
-              <w:spacing w:after="0" w:line="265"/>
-            </w:pPr>
-            <w:r>
-              <w:rPr>
-                <w:rFonts w:ascii="Arial" w:cs="Arial" w:eastAsia="Arial" w:hAnsi="Arial"/>
-                <w:b w:val="false"/>
-                <w:bCs w:val="false"/>
-                <w:color w:val="1B1B1B"/>
-                <w:sz w:val="18"/>
-                <w:szCs w:val="18"/>
-              </w:rPr>
-              <w:t xml:space="preserve">Người và xe đi cùng nhau</w:t>
-            </w:r>
-          </w:p>
-        </w:tc>
-      </w:tr>
-      <w:tr>
-        <w:trPr>
-          <w:cantSplit/>
-          <w:tblHeader w:val="false"/>
-        </w:trPr>
-        <w:tc>
-          <w:tcPr>
-            <w:tcW w:type="dxa" w:w="2900"/>
-            <w:tcMar>
-              <w:top w:type="dxa" w:w="60"/>
-              <w:left w:type="dxa" w:w="95"/>
-              <w:bottom w:type="dxa" w:w="60"/>
-              <w:right w:type="dxa" w:w="95"/>
-            </w:tcMar>
-            <w:vAlign w:val="center"/>
-          </w:tcPr>
-          <w:p>
-            <w:pPr>
-              <w:spacing w:after="0" w:line="265"/>
-            </w:pPr>
-            <w:r>
-              <w:rPr>
-                <w:rFonts w:ascii="Arial" w:cs="Arial" w:eastAsia="Arial" w:hAnsi="Arial"/>
-                <w:b w:val="false"/>
-                <w:bCs w:val="false"/>
-                <w:color w:val="1B1B1B"/>
-                <w:sz w:val="18"/>
-                <w:szCs w:val="18"/>
-              </w:rPr>
-              <w:t xml:space="preserve">Người đứng cạnh: khoanh riêng</w:t>
-            </w:r>
-          </w:p>
-        </w:tc>
-        <w:tc>
-          <w:tcPr>
-            <w:tcW w:type="dxa" w:w="3600"/>
-            <w:tcMar>
-              <w:top w:type="dxa" w:w="60"/>
-              <w:left w:type="dxa" w:w="95"/>
-              <w:bottom w:type="dxa" w:w="60"/>
-              <w:right w:type="dxa" w:w="95"/>
-            </w:tcMar>
-            <w:vAlign w:val="center"/>
-          </w:tcPr>
-          <w:p>
-            <w:pPr>
-              <w:spacing w:after="0" w:line="265"/>
-            </w:pPr>
-            <w:r>
-              <w:rPr>
-                <w:rFonts w:ascii="Arial" w:cs="Arial" w:eastAsia="Arial" w:hAnsi="Arial"/>
-                <w:b w:val="false"/>
-                <w:bCs w:val="false"/>
-                <w:color w:val="1B1B1B"/>
-                <w:sz w:val="18"/>
-                <w:szCs w:val="18"/>
-              </w:rPr>
-              <w:t xml:space="preserve">…standing next to the motorcycle, do NOT include…</w:t>
-            </w:r>
-          </w:p>
-        </w:tc>
-        <w:tc>
-          <w:tcPr>
-            <w:tcW w:type="dxa" w:w="2860"/>
-            <w:tcMar>
-              <w:top w:type="dxa" w:w="60"/>
-              <w:left w:type="dxa" w:w="95"/>
-              <w:bottom w:type="dxa" w:w="60"/>
-              <w:right w:type="dxa" w:w="95"/>
-            </w:tcMar>
-            <w:vAlign w:val="center"/>
-          </w:tcPr>
-          <w:p>
-            <w:pPr>
-              <w:spacing w:after="0" w:line="265"/>
-            </w:pPr>
-            <w:r>
-              <w:rPr>
-                <w:rFonts w:ascii="Arial" w:cs="Arial" w:eastAsia="Arial" w:hAnsi="Arial"/>
-                <w:b w:val="false"/>
-                <w:bCs w:val="false"/>
-                <w:color w:val="1B1B1B"/>
-                <w:sz w:val="18"/>
-                <w:szCs w:val="18"/>
-              </w:rPr>
-              <w:t xml:space="preserve">Người đó có thể đi chỗ khác</w:t>
-            </w:r>
-          </w:p>
-        </w:tc>
-      </w:tr>
-      <w:tr>
-        <w:trPr>
-          <w:cantSplit/>
-          <w:tblHeader w:val="false"/>
-        </w:trPr>
-        <w:tc>
-          <w:tcPr>
-            <w:tcW w:type="dxa" w:w="2900"/>
-            <w:tcMar>
-              <w:top w:type="dxa" w:w="60"/>
-              <w:left w:type="dxa" w:w="95"/>
-              <w:bottom w:type="dxa" w:w="60"/>
-              <w:right w:type="dxa" w:w="95"/>
-            </w:tcMar>
-            <w:vAlign w:val="center"/>
-          </w:tcPr>
-          <w:p>
-            <w:pPr>
-              <w:spacing w:after="0" w:line="265"/>
-            </w:pPr>
-            <w:r>
-              <w:rPr>
-                <w:rFonts w:ascii="Arial" w:cs="Arial" w:eastAsia="Arial" w:hAnsi="Arial"/>
-                <w:b w:val="false"/>
-                <w:bCs w:val="false"/>
-                <w:color w:val="1B1B1B"/>
-                <w:sz w:val="18"/>
-                <w:szCs w:val="18"/>
-              </w:rPr>
-              <w:t xml:space="preserve">Độ thấy được 4 mức</w:t>
-            </w:r>
-          </w:p>
-        </w:tc>
-        <w:tc>
-          <w:tcPr>
-            <w:tcW w:type="dxa" w:w="3600"/>
-            <w:tcMar>
-              <w:top w:type="dxa" w:w="60"/>
-              <w:left w:type="dxa" w:w="95"/>
-              <w:bottom w:type="dxa" w:w="60"/>
-              <w:right w:type="dxa" w:w="95"/>
-            </w:tcMar>
-            <w:vAlign w:val="center"/>
-          </w:tcPr>
-          <w:p>
-            <w:pPr>
-              <w:spacing w:after="0" w:line="265"/>
-            </w:pPr>
-            <w:r>
-              <w:rPr>
-                <w:rFonts w:ascii="Arial" w:cs="Arial" w:eastAsia="Arial" w:hAnsi="Arial"/>
-                <w:b w:val="false"/>
-                <w:bCs w:val="false"/>
-                <w:color w:val="1B1B1B"/>
-                <w:sz w:val="18"/>
-                <w:szCs w:val="18"/>
-              </w:rPr>
-              <w:t xml:space="preserve">0–40%, 41–60%, 61–80%, 81–100%</w:t>
-            </w:r>
-          </w:p>
-        </w:tc>
-        <w:tc>
-          <w:tcPr>
-            <w:tcW w:type="dxa" w:w="2860"/>
-            <w:tcMar>
-              <w:top w:type="dxa" w:w="60"/>
-              <w:left w:type="dxa" w:w="95"/>
-              <w:bottom w:type="dxa" w:w="60"/>
-              <w:right w:type="dxa" w:w="95"/>
-            </w:tcMar>
-            <w:vAlign w:val="center"/>
-          </w:tcPr>
-          <w:p>
-            <w:pPr>
-              <w:spacing w:after="0" w:line="265"/>
-            </w:pPr>
-            <w:r>
-              <w:rPr>
-                <w:rFonts w:ascii="Arial" w:cs="Arial" w:eastAsia="Arial" w:hAnsi="Arial"/>
-                <w:b w:val="false"/>
-                <w:bCs w:val="false"/>
-                <w:color w:val="1B1B1B"/>
-                <w:sz w:val="18"/>
-                <w:szCs w:val="18"/>
-              </w:rPr>
-              <w:t xml:space="preserve">Biết vật nào bị che nhiều</w:t>
-            </w:r>
-          </w:p>
-        </w:tc>
-      </w:tr>
-    </w:tbl>
-    <w:p>
-      <w:pPr>
-        <w:spacing w:after="0"/>
-      </w:pPr>
-      <w:r>
-        <w:rPr>
-          <w:rFonts w:ascii="Arial" w:cs="Arial" w:eastAsia="Arial" w:hAnsi="Arial"/>
-          <w:color w:val="1B1B1B"/>
-          <w:sz w:val="22"/>
-          <w:szCs w:val="22"/>
-        </w:rPr>
-        <w:t xml:space="preserve"/>
-      </w:r>
-    </w:p>
-    <w:p>
-      <w:pPr>
-        <w:keepNext/>
-        <w:spacing w:after="60" w:before="60"/>
-        <w:jc w:val="center"/>
-      </w:pPr>
-      <w:r>
-        <w:drawing>
-          <wp:inline distT="0" distB="0" distL="0" distR="0">
-            <wp:extent cx="5334000" cy="1990725"/>
             <wp:effectExtent t="0" r="0" b="0" l="0"/>
             <wp:docPr id="1" name="" descr="" title=""/>
             <wp:cNvGraphicFramePr>
@@ -5189,7 +4788,7 @@
                   <pic:spPr bwMode="auto">
                     <a:xfrm>
                       <a:off x="0" y="0"/>
-                      <a:ext cx="5334000" cy="1990725"/>
+                      <a:ext cx="5715000" cy="1990725"/>
                     </a:xfrm>
                     <a:prstGeom prst="rect">
                       <a:avLst/>
@@ -5216,7 +4815,7 @@
           <w:sz w:val="19"/>
           <w:szCs w:val="19"/>
         </w:rPr>
-        <w:t xml:space="preserve">Người lái nằm trong khung của xe: trái xe đạp scene-0103, phải xe máy scene-1100 (khung chính thức). Dữ liệu: nuScenes (Motional), CC BY-NC-SA 4.0</w:t>
+        <w:t xml:space="preserve">Khung phát hiện + điểm lidar (vàng). Lấy trung vị 1 m dày điểm nhất trong khung: người 8,9 m (chính thức 9,0 m), xe 21,4 m (22,0 m). Dữ liệu: nuScenes (Motional), CC BY-NC-SA 4.0</w:t>
       </w:r>
     </w:p>
     <w:p>
@@ -5232,7 +4831,7 @@
           <w:sz w:val="22"/>
           <w:szCs w:val="22"/>
         </w:rPr>
-        <w:t xml:space="preserve">Ở Hà Nội, một xe máy chở ba người, theo quy tắc nuScenes là </w:t>
+        <w:t xml:space="preserve">Camera nói «đây là người», lidar nói «bao xa» — cặp camera + lidar của tuần 7. Khung là hình chữ nhật, góc khung có cả điểm của mặt đường, nhà phía sau, nên phải chọn cụm điểm dày nhất. Xe tự lái cần </w:t>
       </w:r>
       <w:r>
         <w:rPr>
@@ -5243,7 +4842,7 @@
           <w:sz w:val="22"/>
           <w:szCs w:val="22"/>
         </w:rPr>
-        <w:t xml:space="preserve">một khung</w:t>
+        <w:t xml:space="preserve">khung 3D</w:t>
       </w:r>
       <w:r>
         <w:rPr>
@@ -5252,27 +4851,7 @@
           <w:sz w:val="22"/>
           <w:szCs w:val="22"/>
         </w:rPr>
-        <w:t xml:space="preserve">, loại xe máy. Đổi sang quy tắc khoanh riêng từng người cũng được, quan trọng là </w:t>
-      </w:r>
-      <w:r>
-        <w:rPr>
-          <w:rFonts w:ascii="Arial" w:cs="Arial" w:eastAsia="Arial" w:hAnsi="Arial"/>
-          <w:b/>
-          <w:bCs/>
-          <w:color w:val="24405C"/>
-          <w:sz w:val="22"/>
-          <w:szCs w:val="22"/>
-        </w:rPr>
-        <w:t xml:space="preserve">cả bộ dữ liệu dùng cùng một quy tắc</w:t>
-      </w:r>
-      <w:r>
-        <w:rPr>
-          <w:rFonts w:ascii="Arial" w:cs="Arial" w:eastAsia="Arial" w:hAnsi="Arial"/>
-          <w:color w:val="1B1B1B"/>
-          <w:sz w:val="22"/>
-          <w:szCs w:val="22"/>
-        </w:rPr>
-        <w:t xml:space="preserve">.</w:t>
+        <w:t xml:space="preserve">: ba số vị trí, ba số kích thước, thêm hướng — bảy con số (tuần 7).</w:t>
       </w:r>
     </w:p>
     <w:p>
@@ -5290,7 +4869,7 @@
           <w:sz w:val="24"/>
           <w:szCs w:val="24"/>
         </w:rPr>
-        <w:t xml:space="preserve">IoU: hai khung giống nhau bao nhiêu</w:t>
+        <w:t xml:space="preserve">Nhìn từ trên xuống: bản đồ từ trên và lưới chiếm chỗ</w:t>
       </w:r>
     </w:p>
     <w:p>
@@ -5302,7 +4881,7 @@
       <w:r>
         <w:drawing>
           <wp:inline distT="0" distB="0" distL="0" distR="0">
-            <wp:extent cx="5334000" cy="2038350"/>
+            <wp:extent cx="5905500" cy="3333750"/>
             <wp:effectExtent t="0" r="0" b="0" l="0"/>
             <wp:docPr id="1" name="" descr="" title=""/>
             <wp:cNvGraphicFramePr>
@@ -5327,7 +4906,7 @@
                   <pic:spPr bwMode="auto">
                     <a:xfrm>
                       <a:off x="0" y="0"/>
-                      <a:ext cx="5334000" cy="2038350"/>
+                      <a:ext cx="5905500" cy="3333750"/>
                     </a:xfrm>
                     <a:prstGeom prst="rect">
                       <a:avLst/>
@@ -5354,24 +4933,226 @@
           <w:sz w:val="19"/>
           <w:szCs w:val="19"/>
         </w:rPr>
-        <w:t xml:space="preserve">Khung trắng = đáp án, khung màu = khung học sinh minh hoạ (cùng một khung dịch xuống phải). Dữ liệu: nuScenes (Motional), CC BY-NC-SA 4.0</w:t>
+        <w:t xml:space="preserve">Trái: bản đồ từ trên, điểm lidar + khung 3D; phải: lưới chiếm chỗ tính từ cùng khung lidar (ô 0,5 m). scene-0103 (Boston). Dữ liệu: nuScenes (Motional), CC BY-NC-SA 4.0</w:t>
       </w:r>
     </w:p>
     <w:p>
       <w:pPr>
-        <w:spacing w:after="150" w:before="130" w:line="320"/>
-        <w:jc w:val="center"/>
-      </w:pPr>
+        <w:pStyle w:val="ListParagraph"/>
+        <w:widowControl/>
+        <w:numPr>
+          <w:ilvl w:val="0"/>
+          <w:numId w:val="3"/>
+        </w:numPr>
+        <w:spacing w:after="80" w:line="320"/>
+      </w:pPr>
+      <w:r>
+        <w:rPr>
+          <w:rFonts w:ascii="Arial" w:cs="Arial" w:eastAsia="Arial" w:hAnsi="Arial"/>
+          <w:color w:val="1B1B1B"/>
+          <w:sz w:val="22"/>
+          <w:szCs w:val="22"/>
+        </w:rPr>
+        <w:t xml:space="preserve">Ba cái lợi của bản đồ từ trên: các vật </w:t>
+      </w:r>
       <w:r>
         <w:rPr>
           <w:rFonts w:ascii="Arial" w:cs="Arial" w:eastAsia="Arial" w:hAnsi="Arial"/>
           <w:b/>
           <w:bCs/>
           <w:color w:val="24405C"/>
-          <w:sz w:val="23"/>
-          <w:szCs w:val="23"/>
-        </w:rPr>
-        <w:t xml:space="preserve">IoU = diện tích chồng lên ÷ diện tích gộp lại (1 = trùng khít, 0 = không chạm)</w:t>
+          <w:sz w:val="22"/>
+          <w:szCs w:val="22"/>
+        </w:rPr>
+        <w:t xml:space="preserve">không che nhau</w:t>
+      </w:r>
+      <w:r>
+        <w:rPr>
+          <w:rFonts w:ascii="Arial" w:cs="Arial" w:eastAsia="Arial" w:hAnsi="Arial"/>
+          <w:color w:val="1B1B1B"/>
+          <w:sz w:val="22"/>
+          <w:szCs w:val="22"/>
+        </w:rPr>
+        <w:t xml:space="preserve">; </w:t>
+      </w:r>
+      <w:r>
+        <w:rPr>
+          <w:rFonts w:ascii="Arial" w:cs="Arial" w:eastAsia="Arial" w:hAnsi="Arial"/>
+          <w:b/>
+          <w:bCs/>
+          <w:color w:val="24405C"/>
+          <w:sz w:val="22"/>
+          <w:szCs w:val="22"/>
+        </w:rPr>
+        <w:t xml:space="preserve">khoảng cách không méo</w:t>
+      </w:r>
+      <w:r>
+        <w:rPr>
+          <w:rFonts w:ascii="Arial" w:cs="Arial" w:eastAsia="Arial" w:hAnsi="Arial"/>
+          <w:color w:val="1B1B1B"/>
+          <w:sz w:val="22"/>
+          <w:szCs w:val="22"/>
+        </w:rPr>
+        <w:t xml:space="preserve">; lái xe vốn là quyết định </w:t>
+      </w:r>
+      <w:r>
+        <w:rPr>
+          <w:rFonts w:ascii="Arial" w:cs="Arial" w:eastAsia="Arial" w:hAnsi="Arial"/>
+          <w:b/>
+          <w:bCs/>
+          <w:color w:val="24405C"/>
+          <w:sz w:val="22"/>
+          <w:szCs w:val="22"/>
+        </w:rPr>
+        <w:t xml:space="preserve">trên mặt đất</w:t>
+      </w:r>
+      <w:r>
+        <w:rPr>
+          <w:rFonts w:ascii="Arial" w:cs="Arial" w:eastAsia="Arial" w:hAnsi="Arial"/>
+          <w:color w:val="1B1B1B"/>
+          <w:sz w:val="22"/>
+          <w:szCs w:val="22"/>
+        </w:rPr>
+        <w:t xml:space="preserve">. Ghép giữa ở tuần 7 là cùng vẽ thành một bản đồ từ trên.</w:t>
+      </w:r>
+    </w:p>
+    <w:p>
+      <w:pPr>
+        <w:pStyle w:val="ListParagraph"/>
+        <w:widowControl/>
+        <w:numPr>
+          <w:ilvl w:val="0"/>
+          <w:numId w:val="3"/>
+        </w:numPr>
+        <w:spacing w:after="80" w:line="320"/>
+      </w:pPr>
+      <w:r>
+        <w:rPr>
+          <w:rFonts w:ascii="Arial" w:cs="Arial" w:eastAsia="Arial" w:hAnsi="Arial"/>
+          <w:color w:val="1B1B1B"/>
+          <w:sz w:val="22"/>
+          <w:szCs w:val="22"/>
+        </w:rPr>
+        <w:t xml:space="preserve">Lưới chiếm chỗ: mỗi ô chỉ hỏi một việc. </w:t>
+      </w:r>
+      <w:r>
+        <w:rPr>
+          <w:rFonts w:ascii="Arial" w:cs="Arial" w:eastAsia="Arial" w:hAnsi="Arial"/>
+          <w:b/>
+          <w:bCs/>
+          <w:color w:val="24405C"/>
+          <w:sz w:val="22"/>
+          <w:szCs w:val="22"/>
+        </w:rPr>
+        <w:t xml:space="preserve">Đỏ = có vật</w:t>
+      </w:r>
+      <w:r>
+        <w:rPr>
+          <w:rFonts w:ascii="Arial" w:cs="Arial" w:eastAsia="Arial" w:hAnsi="Arial"/>
+          <w:color w:val="1B1B1B"/>
+          <w:sz w:val="22"/>
+          <w:szCs w:val="22"/>
+        </w:rPr>
+        <w:t xml:space="preserve">, </w:t>
+      </w:r>
+      <w:r>
+        <w:rPr>
+          <w:rFonts w:ascii="Arial" w:cs="Arial" w:eastAsia="Arial" w:hAnsi="Arial"/>
+          <w:b/>
+          <w:bCs/>
+          <w:color w:val="24405C"/>
+          <w:sz w:val="22"/>
+          <w:szCs w:val="22"/>
+        </w:rPr>
+        <w:t xml:space="preserve">trắng = trống</w:t>
+      </w:r>
+      <w:r>
+        <w:rPr>
+          <w:rFonts w:ascii="Arial" w:cs="Arial" w:eastAsia="Arial" w:hAnsi="Arial"/>
+          <w:color w:val="1B1B1B"/>
+          <w:sz w:val="22"/>
+          <w:szCs w:val="22"/>
+        </w:rPr>
+        <w:t xml:space="preserve"> (tia laser đi qua không chạm gì), </w:t>
+      </w:r>
+      <w:r>
+        <w:rPr>
+          <w:rFonts w:ascii="Arial" w:cs="Arial" w:eastAsia="Arial" w:hAnsi="Arial"/>
+          <w:b/>
+          <w:bCs/>
+          <w:color w:val="24405C"/>
+          <w:sz w:val="22"/>
+          <w:szCs w:val="22"/>
+        </w:rPr>
+        <w:t xml:space="preserve">xám = chưa biết</w:t>
+      </w:r>
+      <w:r>
+        <w:rPr>
+          <w:rFonts w:ascii="Arial" w:cs="Arial" w:eastAsia="Arial" w:hAnsi="Arial"/>
+          <w:color w:val="1B1B1B"/>
+          <w:sz w:val="22"/>
+          <w:szCs w:val="22"/>
+        </w:rPr>
+        <w:t xml:space="preserve"> (bị che, không bắn tới).</w:t>
+      </w:r>
+    </w:p>
+    <w:p>
+      <w:pPr>
+        <w:pStyle w:val="ListParagraph"/>
+        <w:widowControl/>
+        <w:numPr>
+          <w:ilvl w:val="0"/>
+          <w:numId w:val="3"/>
+        </w:numPr>
+        <w:spacing w:after="80" w:line="320"/>
+      </w:pPr>
+      <w:r>
+        <w:rPr>
+          <w:rFonts w:ascii="Arial" w:cs="Arial" w:eastAsia="Arial" w:hAnsi="Arial"/>
+          <w:color w:val="1B1B1B"/>
+          <w:sz w:val="22"/>
+          <w:szCs w:val="22"/>
+        </w:rPr>
+        <w:t xml:space="preserve">Lợi lớn nhất: </w:t>
+      </w:r>
+      <w:r>
+        <w:rPr>
+          <w:rFonts w:ascii="Arial" w:cs="Arial" w:eastAsia="Arial" w:hAnsi="Arial"/>
+          <w:b/>
+          <w:bCs/>
+          <w:color w:val="24405C"/>
+          <w:sz w:val="22"/>
+          <w:szCs w:val="22"/>
+        </w:rPr>
+        <w:t xml:space="preserve">không cần biết là gì</w:t>
+      </w:r>
+      <w:r>
+        <w:rPr>
+          <w:rFonts w:ascii="Arial" w:cs="Arial" w:eastAsia="Arial" w:hAnsi="Arial"/>
+          <w:color w:val="1B1B1B"/>
+          <w:sz w:val="22"/>
+          <w:szCs w:val="22"/>
+        </w:rPr>
+        <w:t xml:space="preserve">. Hàng rơi trên đường, chướng ngại lạ, bộ phát hiện không nhận ra nhưng lưới vẫn tô đỏ. Cẩn thận: «chưa biết» không phải «trống».</w:t>
+      </w:r>
+    </w:p>
+    <w:p>
+      <w:pPr>
+        <w:pStyle w:val="Heading1"/>
+        <w:keepNext/>
+        <w:pageBreakBefore/>
+        <w:spacing w:after="240" w:before="160"/>
+      </w:pPr>
+      <w:r>
+        <w:rPr>
+          <w:rFonts w:ascii="Arial" w:cs="Arial" w:eastAsia="Arial" w:hAnsi="Arial"/>
+          <w:b/>
+          <w:bCs/>
+          <w:color w:val="24405C"/>
+          <w:sz w:val="30"/>
+          <w:szCs w:val="30"/>
+        </w:rPr>
+        <w:t xml:space="preserve">3. Gán nhãn dữ liệu: chuẩn bị đáp án cho máy tính</w:t>
       </w:r>
     </w:p>
     <w:p>
@@ -5387,7 +5168,7 @@
           <w:sz w:val="22"/>
           <w:szCs w:val="22"/>
         </w:rPr>
-        <w:t xml:space="preserve">Như hai tờ giấy chồng trên bàn: phần chồng lên chia cho diện tích hai tờ gộp lại. Lệch một chút, IoU từ 0,9 rơi xuống 0,6. Bàn tập gán nhãn tính </w:t>
+        <w:t xml:space="preserve">Dữ liệu gán nhãn là sách giáo khoa của mô hình. Ba tình huống làm mô hình học sai: </w:t>
       </w:r>
       <w:r>
         <w:rPr>
@@ -5398,7 +5179,7 @@
           <w:sz w:val="22"/>
           <w:szCs w:val="22"/>
         </w:rPr>
-        <w:t xml:space="preserve">IoU ≥ 0,3 và đúng loại</w:t>
+        <w:t xml:space="preserve">thiếu nhãn</w:t>
       </w:r>
       <w:r>
         <w:rPr>
@@ -5407,25 +5188,407 @@
           <w:sz w:val="22"/>
           <w:szCs w:val="22"/>
         </w:rPr>
-        <w:t xml:space="preserve"> là «khoanh trúng», vì đáp án tính từ khung 3D nên vốn lệch một chút so với mép trên ảnh; thi đấu chính thức thường dùng 0,5 hoặc 0,7.</w:t>
-      </w:r>
-    </w:p>
-    <w:p>
-      <w:pPr>
-        <w:pStyle w:val="Heading2"/>
-        <w:keepNext/>
-        <w:spacing w:after="130" w:before="300"/>
-      </w:pPr>
+        <w:t xml:space="preserve"> (có người mà không khoanh, mô hình học «trông thế này không phải người»), </w:t>
+      </w:r>
       <w:r>
         <w:rPr>
           <w:rFonts w:ascii="Arial" w:cs="Arial" w:eastAsia="Arial" w:hAnsi="Arial"/>
           <w:b/>
           <w:bCs/>
           <w:color w:val="24405C"/>
-          <w:sz w:val="24"/>
-          <w:szCs w:val="24"/>
-        </w:rPr>
-        <w:t xml:space="preserve">Thực hành: bàn tập gán nhãn</w:t>
+          <w:sz w:val="22"/>
+          <w:szCs w:val="22"/>
+        </w:rPr>
+        <w:t xml:space="preserve">sai loại</w:t>
+      </w:r>
+      <w:r>
+        <w:rPr>
+          <w:rFonts w:ascii="Arial" w:cs="Arial" w:eastAsia="Arial" w:hAnsi="Arial"/>
+          <w:color w:val="1B1B1B"/>
+          <w:sz w:val="22"/>
+          <w:szCs w:val="22"/>
+        </w:rPr>
+        <w:t xml:space="preserve"> (xe máy thành xe đạp), </w:t>
+      </w:r>
+      <w:r>
+        <w:rPr>
+          <w:rFonts w:ascii="Arial" w:cs="Arial" w:eastAsia="Arial" w:hAnsi="Arial"/>
+          <w:b/>
+          <w:bCs/>
+          <w:color w:val="24405C"/>
+          <w:sz w:val="22"/>
+          <w:szCs w:val="22"/>
+        </w:rPr>
+        <w:t xml:space="preserve">mỗi người một kiểu</w:t>
+      </w:r>
+      <w:r>
+        <w:rPr>
+          <w:rFonts w:ascii="Arial" w:cs="Arial" w:eastAsia="Arial" w:hAnsi="Arial"/>
+          <w:color w:val="1B1B1B"/>
+          <w:sz w:val="22"/>
+          <w:szCs w:val="22"/>
+        </w:rPr>
+        <w:t xml:space="preserve"> (người khoanh chung người lái với xe máy, người khoanh riêng). Vì vậy gán nhãn chính thức luôn có bộ quy tắc, mọi người theo cùng một bộ, và có kiểm tra.</w:t>
+      </w:r>
+    </w:p>
+    <w:p>
+      <w:pPr>
+        <w:keepNext/>
+        <w:spacing w:after="70" w:before="190"/>
+      </w:pPr>
+      <w:r>
+        <w:rPr>
+          <w:rFonts w:ascii="Arial" w:cs="Arial" w:eastAsia="Arial" w:hAnsi="Arial"/>
+          <w:b/>
+          <w:bCs/>
+          <w:color w:val="24405C"/>
+          <w:sz w:val="19"/>
+          <w:szCs w:val="19"/>
+        </w:rPr>
+        <w:t xml:space="preserve">Bảng 4. nuScenes đã gán nhãn bao nhiêu</w:t>
+      </w:r>
+    </w:p>
+    <w:tbl>
+      <w:tblPr>
+        <w:tblW w:type="dxa" w:w="9360"/>
+        <w:tblBorders>
+          <w:top w:val="single" w:color="8A949C" w:sz="8"/>
+          <w:left w:val="none"/>
+          <w:bottom w:val="single" w:color="8A949C" w:sz="8"/>
+          <w:right w:val="none"/>
+          <w:insideH w:val="single" w:color="BFC7CE" w:sz="2"/>
+          <w:insideV w:val="none"/>
+        </w:tblBorders>
+      </w:tblPr>
+      <w:tblGrid>
+        <w:gridCol w:w="3000"/>
+        <w:gridCol w:w="6360"/>
+      </w:tblGrid>
+      <w:tr>
+        <w:trPr>
+          <w:cantSplit/>
+          <w:tblHeader/>
+        </w:trPr>
+        <w:tc>
+          <w:tcPr>
+            <w:tcW w:type="dxa" w:w="3000"/>
+            <w:shd w:fill="EDF0F3" w:color="auto" w:val="clear"/>
+            <w:tcMar>
+              <w:top w:type="dxa" w:w="60"/>
+              <w:left w:type="dxa" w:w="95"/>
+              <w:bottom w:type="dxa" w:w="60"/>
+              <w:right w:type="dxa" w:w="95"/>
+            </w:tcMar>
+            <w:vAlign w:val="center"/>
+          </w:tcPr>
+          <w:p>
+            <w:pPr>
+              <w:spacing w:after="0" w:line="265"/>
+            </w:pPr>
+            <w:r>
+              <w:rPr>
+                <w:rFonts w:ascii="Arial" w:cs="Arial" w:eastAsia="Arial" w:hAnsi="Arial"/>
+                <w:b/>
+                <w:bCs/>
+                <w:color w:val="1B1B1B"/>
+                <w:sz w:val="18"/>
+                <w:szCs w:val="18"/>
+              </w:rPr>
+              <w:t xml:space="preserve">Hạng mục</w:t>
+            </w:r>
+          </w:p>
+        </w:tc>
+        <w:tc>
+          <w:tcPr>
+            <w:tcW w:type="dxa" w:w="6360"/>
+            <w:shd w:fill="EDF0F3" w:color="auto" w:val="clear"/>
+            <w:tcMar>
+              <w:top w:type="dxa" w:w="60"/>
+              <w:left w:type="dxa" w:w="95"/>
+              <w:bottom w:type="dxa" w:w="60"/>
+              <w:right w:type="dxa" w:w="95"/>
+            </w:tcMar>
+            <w:vAlign w:val="center"/>
+          </w:tcPr>
+          <w:p>
+            <w:pPr>
+              <w:spacing w:after="0" w:line="265"/>
+            </w:pPr>
+            <w:r>
+              <w:rPr>
+                <w:rFonts w:ascii="Arial" w:cs="Arial" w:eastAsia="Arial" w:hAnsi="Arial"/>
+                <w:b/>
+                <w:bCs/>
+                <w:color w:val="1B1B1B"/>
+                <w:sz w:val="18"/>
+                <w:szCs w:val="18"/>
+              </w:rPr>
+              <w:t xml:space="preserve">Con số</w:t>
+            </w:r>
+          </w:p>
+        </w:tc>
+      </w:tr>
+      <w:tr>
+        <w:trPr>
+          <w:cantSplit/>
+          <w:tblHeader w:val="false"/>
+        </w:trPr>
+        <w:tc>
+          <w:tcPr>
+            <w:tcW w:type="dxa" w:w="3000"/>
+            <w:tcMar>
+              <w:top w:type="dxa" w:w="60"/>
+              <w:left w:type="dxa" w:w="95"/>
+              <w:bottom w:type="dxa" w:w="60"/>
+              <w:right w:type="dxa" w:w="95"/>
+            </w:tcMar>
+            <w:vAlign w:val="center"/>
+          </w:tcPr>
+          <w:p>
+            <w:pPr>
+              <w:spacing w:after="0" w:line="265"/>
+            </w:pPr>
+            <w:r>
+              <w:rPr>
+                <w:rFonts w:ascii="Arial" w:cs="Arial" w:eastAsia="Arial" w:hAnsi="Arial"/>
+                <w:b w:val="false"/>
+                <w:bCs w:val="false"/>
+                <w:color w:val="1B1B1B"/>
+                <w:sz w:val="18"/>
+                <w:szCs w:val="18"/>
+              </w:rPr>
+              <w:t xml:space="preserve">Khung hình chính</w:t>
+            </w:r>
+          </w:p>
+        </w:tc>
+        <w:tc>
+          <w:tcPr>
+            <w:tcW w:type="dxa" w:w="6360"/>
+            <w:tcMar>
+              <w:top w:type="dxa" w:w="60"/>
+              <w:left w:type="dxa" w:w="95"/>
+              <w:bottom w:type="dxa" w:w="60"/>
+              <w:right w:type="dxa" w:w="95"/>
+            </w:tcMar>
+            <w:vAlign w:val="center"/>
+          </w:tcPr>
+          <w:p>
+            <w:pPr>
+              <w:spacing w:after="0" w:line="265"/>
+            </w:pPr>
+            <w:r>
+              <w:rPr>
+                <w:rFonts w:ascii="Arial" w:cs="Arial" w:eastAsia="Arial" w:hAnsi="Arial"/>
+                <w:b w:val="false"/>
+                <w:bCs w:val="false"/>
+                <w:color w:val="1B1B1B"/>
+                <w:sz w:val="18"/>
+                <w:szCs w:val="18"/>
+              </w:rPr>
+              <w:t xml:space="preserve">40.000 (1000 cảnh × 20 giây, mỗi 0,5 giây một lần)</w:t>
+            </w:r>
+          </w:p>
+        </w:tc>
+      </w:tr>
+      <w:tr>
+        <w:trPr>
+          <w:cantSplit/>
+          <w:tblHeader w:val="false"/>
+        </w:trPr>
+        <w:tc>
+          <w:tcPr>
+            <w:tcW w:type="dxa" w:w="3000"/>
+            <w:tcMar>
+              <w:top w:type="dxa" w:w="60"/>
+              <w:left w:type="dxa" w:w="95"/>
+              <w:bottom w:type="dxa" w:w="60"/>
+              <w:right w:type="dxa" w:w="95"/>
+            </w:tcMar>
+            <w:vAlign w:val="center"/>
+          </w:tcPr>
+          <w:p>
+            <w:pPr>
+              <w:spacing w:after="0" w:line="265"/>
+            </w:pPr>
+            <w:r>
+              <w:rPr>
+                <w:rFonts w:ascii="Arial" w:cs="Arial" w:eastAsia="Arial" w:hAnsi="Arial"/>
+                <w:b w:val="false"/>
+                <w:bCs w:val="false"/>
+                <w:color w:val="1B1B1B"/>
+                <w:sz w:val="18"/>
+                <w:szCs w:val="18"/>
+              </w:rPr>
+              <w:t xml:space="preserve">Khung 3D</w:t>
+            </w:r>
+          </w:p>
+        </w:tc>
+        <w:tc>
+          <w:tcPr>
+            <w:tcW w:type="dxa" w:w="6360"/>
+            <w:tcMar>
+              <w:top w:type="dxa" w:w="60"/>
+              <w:left w:type="dxa" w:w="95"/>
+              <w:bottom w:type="dxa" w:w="60"/>
+              <w:right w:type="dxa" w:w="95"/>
+            </w:tcMar>
+            <w:vAlign w:val="center"/>
+          </w:tcPr>
+          <w:p>
+            <w:pPr>
+              <w:spacing w:after="0" w:line="265"/>
+            </w:pPr>
+            <w:r>
+              <w:rPr>
+                <w:rFonts w:ascii="Arial" w:cs="Arial" w:eastAsia="Arial" w:hAnsi="Arial"/>
+                <w:b w:val="false"/>
+                <w:bCs w:val="false"/>
+                <w:color w:val="1B1B1B"/>
+                <w:sz w:val="18"/>
+                <w:szCs w:val="18"/>
+              </w:rPr>
+              <w:t xml:space="preserve">1,4 triệu, người gán từng cái</w:t>
+            </w:r>
+          </w:p>
+        </w:tc>
+      </w:tr>
+      <w:tr>
+        <w:trPr>
+          <w:cantSplit/>
+          <w:tblHeader w:val="false"/>
+        </w:trPr>
+        <w:tc>
+          <w:tcPr>
+            <w:tcW w:type="dxa" w:w="3000"/>
+            <w:tcMar>
+              <w:top w:type="dxa" w:w="60"/>
+              <w:left w:type="dxa" w:w="95"/>
+              <w:bottom w:type="dxa" w:w="60"/>
+              <w:right w:type="dxa" w:w="95"/>
+            </w:tcMar>
+            <w:vAlign w:val="center"/>
+          </w:tcPr>
+          <w:p>
+            <w:pPr>
+              <w:spacing w:after="0" w:line="265"/>
+            </w:pPr>
+            <w:r>
+              <w:rPr>
+                <w:rFonts w:ascii="Arial" w:cs="Arial" w:eastAsia="Arial" w:hAnsi="Arial"/>
+                <w:b w:val="false"/>
+                <w:bCs w:val="false"/>
+                <w:color w:val="1B1B1B"/>
+                <w:sz w:val="18"/>
+                <w:szCs w:val="18"/>
+              </w:rPr>
+              <w:t xml:space="preserve">Loại</w:t>
+            </w:r>
+          </w:p>
+        </w:tc>
+        <w:tc>
+          <w:tcPr>
+            <w:tcW w:type="dxa" w:w="6360"/>
+            <w:tcMar>
+              <w:top w:type="dxa" w:w="60"/>
+              <w:left w:type="dxa" w:w="95"/>
+              <w:bottom w:type="dxa" w:w="60"/>
+              <w:right w:type="dxa" w:w="95"/>
+            </w:tcMar>
+            <w:vAlign w:val="center"/>
+          </w:tcPr>
+          <w:p>
+            <w:pPr>
+              <w:spacing w:after="0" w:line="265"/>
+            </w:pPr>
+            <w:r>
+              <w:rPr>
+                <w:rFonts w:ascii="Arial" w:cs="Arial" w:eastAsia="Arial" w:hAnsi="Arial"/>
+                <w:b w:val="false"/>
+                <w:bCs w:val="false"/>
+                <w:color w:val="1B1B1B"/>
+                <w:sz w:val="18"/>
+                <w:szCs w:val="18"/>
+              </w:rPr>
+              <w:t xml:space="preserve">23 loại (người lớn, trẻ em, ô tô, xe buýt, xe máy, cọc tiêu…)</w:t>
+            </w:r>
+          </w:p>
+        </w:tc>
+      </w:tr>
+      <w:tr>
+        <w:trPr>
+          <w:cantSplit/>
+          <w:tblHeader w:val="false"/>
+        </w:trPr>
+        <w:tc>
+          <w:tcPr>
+            <w:tcW w:type="dxa" w:w="3000"/>
+            <w:tcMar>
+              <w:top w:type="dxa" w:w="60"/>
+              <w:left w:type="dxa" w:w="95"/>
+              <w:bottom w:type="dxa" w:w="60"/>
+              <w:right w:type="dxa" w:w="95"/>
+            </w:tcMar>
+            <w:vAlign w:val="center"/>
+          </w:tcPr>
+          <w:p>
+            <w:pPr>
+              <w:spacing w:after="0" w:line="265"/>
+            </w:pPr>
+            <w:r>
+              <w:rPr>
+                <w:rFonts w:ascii="Arial" w:cs="Arial" w:eastAsia="Arial" w:hAnsi="Arial"/>
+                <w:b w:val="false"/>
+                <w:bCs w:val="false"/>
+                <w:color w:val="1B1B1B"/>
+                <w:sz w:val="18"/>
+                <w:szCs w:val="18"/>
+              </w:rPr>
+              <w:t xml:space="preserve">Bản mini: ô tô và xe máy</w:t>
+            </w:r>
+          </w:p>
+        </w:tc>
+        <w:tc>
+          <w:tcPr>
+            <w:tcW w:type="dxa" w:w="6360"/>
+            <w:tcMar>
+              <w:top w:type="dxa" w:w="60"/>
+              <w:left w:type="dxa" w:w="95"/>
+              <w:bottom w:type="dxa" w:w="60"/>
+              <w:right w:type="dxa" w:w="95"/>
+            </w:tcMar>
+            <w:vAlign w:val="center"/>
+          </w:tcPr>
+          <w:p>
+            <w:pPr>
+              <w:spacing w:after="0" w:line="265"/>
+            </w:pPr>
+            <w:r>
+              <w:rPr>
+                <w:rFonts w:ascii="Arial" w:cs="Arial" w:eastAsia="Arial" w:hAnsi="Arial"/>
+                <w:b w:val="false"/>
+                <w:bCs w:val="false"/>
+                <w:color w:val="1B1B1B"/>
+                <w:sz w:val="18"/>
+                <w:szCs w:val="18"/>
+              </w:rPr>
+              <w:t xml:space="preserve">7.619 khung và 471 khung: xe máy ít hơn 16 lần</w:t>
+            </w:r>
+          </w:p>
+        </w:tc>
+      </w:tr>
+    </w:tbl>
+    <w:p>
+      <w:pPr>
+        <w:spacing w:after="0"/>
+      </w:pPr>
+      <w:r>
+        <w:rPr>
+          <w:rFonts w:ascii="Arial" w:cs="Arial" w:eastAsia="Arial" w:hAnsi="Arial"/>
+          <w:color w:val="1B1B1B"/>
+          <w:sz w:val="22"/>
+          <w:szCs w:val="22"/>
+        </w:rPr>
+        <w:t xml:space="preserve"/>
       </w:r>
     </w:p>
     <w:p>
@@ -5437,7 +5600,7 @@
       <w:r>
         <w:drawing>
           <wp:inline distT="0" distB="0" distL="0" distR="0">
-            <wp:extent cx="4762500" cy="3476625"/>
+            <wp:extent cx="4572000" cy="2638425"/>
             <wp:effectExtent t="0" r="0" b="0" l="0"/>
             <wp:docPr id="1" name="" descr="" title=""/>
             <wp:cNvGraphicFramePr>
@@ -5462,6 +5625,1025 @@
                   <pic:spPr bwMode="auto">
                     <a:xfrm>
                       <a:off x="0" y="0"/>
+                      <a:ext cx="4572000" cy="2638425"/>
+                    </a:xfrm>
+                    <a:prstGeom prst="rect">
+                      <a:avLst/>
+                    </a:prstGeom>
+                  </pic:spPr>
+                </pic:pic>
+              </a:graphicData>
+            </a:graphic>
+          </wp:inline>
+        </w:drawing>
+      </w:r>
+    </w:p>
+    <w:p>
+      <w:pPr>
+        <w:keepNext w:val="false"/>
+        <w:spacing w:after="70" w:before="190"/>
+      </w:pPr>
+      <w:r>
+        <w:rPr>
+          <w:rFonts w:ascii="Arial" w:cs="Arial" w:eastAsia="Arial" w:hAnsi="Arial"/>
+          <w:b/>
+          <w:bCs/>
+          <w:color w:val="24405C"/>
+          <w:sz w:val="19"/>
+          <w:szCs w:val="19"/>
+        </w:rPr>
+        <w:t xml:space="preserve">Số khung mỗi loại trong nuScenes mini (tuần 7). Đường Boston, Singapore ít xe máy nên sách này dạy rất ít về xe máy. Dữ liệu: nuScenes (Motional), CC BY-NC-SA 4.0</w:t>
+      </w:r>
+    </w:p>
+    <w:p>
+      <w:pPr>
+        <w:keepNext/>
+        <w:spacing w:after="70" w:before="190"/>
+      </w:pPr>
+      <w:r>
+        <w:rPr>
+          <w:rFonts w:ascii="Arial" w:cs="Arial" w:eastAsia="Arial" w:hAnsi="Arial"/>
+          <w:b/>
+          <w:bCs/>
+          <w:color w:val="24405C"/>
+          <w:sz w:val="19"/>
+          <w:szCs w:val="19"/>
+        </w:rPr>
+        <w:t xml:space="preserve">Bảng 5. Quy tắc gán nhãn chính thức của nuScenes (trích, nguyên văn từ instructions_nuscenes.md)</w:t>
+      </w:r>
+    </w:p>
+    <w:tbl>
+      <w:tblPr>
+        <w:tblW w:type="dxa" w:w="9360"/>
+        <w:tblBorders>
+          <w:top w:val="single" w:color="8A949C" w:sz="8"/>
+          <w:left w:val="none"/>
+          <w:bottom w:val="single" w:color="8A949C" w:sz="8"/>
+          <w:right w:val="none"/>
+          <w:insideH w:val="single" w:color="BFC7CE" w:sz="2"/>
+          <w:insideV w:val="none"/>
+        </w:tblBorders>
+      </w:tblPr>
+      <w:tblGrid>
+        <w:gridCol w:w="2900"/>
+        <w:gridCol w:w="3600"/>
+        <w:gridCol w:w="2860"/>
+      </w:tblGrid>
+      <w:tr>
+        <w:trPr>
+          <w:cantSplit/>
+          <w:tblHeader/>
+        </w:trPr>
+        <w:tc>
+          <w:tcPr>
+            <w:tcW w:type="dxa" w:w="2900"/>
+            <w:shd w:fill="EDF0F3" w:color="auto" w:val="clear"/>
+            <w:tcMar>
+              <w:top w:type="dxa" w:w="60"/>
+              <w:left w:type="dxa" w:w="95"/>
+              <w:bottom w:type="dxa" w:w="60"/>
+              <w:right w:type="dxa" w:w="95"/>
+            </w:tcMar>
+            <w:vAlign w:val="center"/>
+          </w:tcPr>
+          <w:p>
+            <w:pPr>
+              <w:spacing w:after="0" w:line="265"/>
+            </w:pPr>
+            <w:r>
+              <w:rPr>
+                <w:rFonts w:ascii="Arial" w:cs="Arial" w:eastAsia="Arial" w:hAnsi="Arial"/>
+                <w:b/>
+                <w:bCs/>
+                <w:color w:val="1B1B1B"/>
+                <w:sz w:val="18"/>
+                <w:szCs w:val="18"/>
+              </w:rPr>
+              <w:t xml:space="preserve">Quy tắc</w:t>
+            </w:r>
+          </w:p>
+        </w:tc>
+        <w:tc>
+          <w:tcPr>
+            <w:tcW w:type="dxa" w:w="3600"/>
+            <w:shd w:fill="EDF0F3" w:color="auto" w:val="clear"/>
+            <w:tcMar>
+              <w:top w:type="dxa" w:w="60"/>
+              <w:left w:type="dxa" w:w="95"/>
+              <w:bottom w:type="dxa" w:w="60"/>
+              <w:right w:type="dxa" w:w="95"/>
+            </w:tcMar>
+            <w:vAlign w:val="center"/>
+          </w:tcPr>
+          <w:p>
+            <w:pPr>
+              <w:spacing w:after="0" w:line="265"/>
+            </w:pPr>
+            <w:r>
+              <w:rPr>
+                <w:rFonts w:ascii="Arial" w:cs="Arial" w:eastAsia="Arial" w:hAnsi="Arial"/>
+                <w:b/>
+                <w:bCs/>
+                <w:color w:val="1B1B1B"/>
+                <w:sz w:val="18"/>
+                <w:szCs w:val="18"/>
+              </w:rPr>
+              <w:t xml:space="preserve">Nguyên văn</w:t>
+            </w:r>
+          </w:p>
+        </w:tc>
+        <w:tc>
+          <w:tcPr>
+            <w:tcW w:type="dxa" w:w="2860"/>
+            <w:shd w:fill="EDF0F3" w:color="auto" w:val="clear"/>
+            <w:tcMar>
+              <w:top w:type="dxa" w:w="60"/>
+              <w:left w:type="dxa" w:w="95"/>
+              <w:bottom w:type="dxa" w:w="60"/>
+              <w:right w:type="dxa" w:w="95"/>
+            </w:tcMar>
+            <w:vAlign w:val="center"/>
+          </w:tcPr>
+          <w:p>
+            <w:pPr>
+              <w:spacing w:after="0" w:line="265"/>
+            </w:pPr>
+            <w:r>
+              <w:rPr>
+                <w:rFonts w:ascii="Arial" w:cs="Arial" w:eastAsia="Arial" w:hAnsi="Arial"/>
+                <w:b/>
+                <w:bCs/>
+                <w:color w:val="1B1B1B"/>
+                <w:sz w:val="18"/>
+                <w:szCs w:val="18"/>
+              </w:rPr>
+              <w:t xml:space="preserve">Vì sao</w:t>
+            </w:r>
+          </w:p>
+        </w:tc>
+      </w:tr>
+      <w:tr>
+        <w:trPr>
+          <w:cantSplit/>
+          <w:tblHeader w:val="false"/>
+        </w:trPr>
+        <w:tc>
+          <w:tcPr>
+            <w:tcW w:type="dxa" w:w="2900"/>
+            <w:tcMar>
+              <w:top w:type="dxa" w:w="60"/>
+              <w:left w:type="dxa" w:w="95"/>
+              <w:bottom w:type="dxa" w:w="60"/>
+              <w:right w:type="dxa" w:w="95"/>
+            </w:tcMar>
+            <w:vAlign w:val="center"/>
+          </w:tcPr>
+          <w:p>
+            <w:pPr>
+              <w:spacing w:after="0" w:line="265"/>
+            </w:pPr>
+            <w:r>
+              <w:rPr>
+                <w:rFonts w:ascii="Arial" w:cs="Arial" w:eastAsia="Arial" w:hAnsi="Arial"/>
+                <w:b w:val="false"/>
+                <w:bCs w:val="false"/>
+                <w:color w:val="1B1B1B"/>
+                <w:sz w:val="18"/>
+                <w:szCs w:val="18"/>
+              </w:rPr>
+              <w:t xml:space="preserve">Có ≥ 1 điểm lidar/radar là phải gán</w:t>
+            </w:r>
+          </w:p>
+        </w:tc>
+        <w:tc>
+          <w:tcPr>
+            <w:tcW w:type="dxa" w:w="3600"/>
+            <w:tcMar>
+              <w:top w:type="dxa" w:w="60"/>
+              <w:left w:type="dxa" w:w="95"/>
+              <w:bottom w:type="dxa" w:w="60"/>
+              <w:right w:type="dxa" w:w="95"/>
+            </w:tcMar>
+            <w:vAlign w:val="center"/>
+          </w:tcPr>
+          <w:p>
+            <w:pPr>
+              <w:spacing w:after="0" w:line="265"/>
+            </w:pPr>
+            <w:r>
+              <w:rPr>
+                <w:rFonts w:ascii="Arial" w:cs="Arial" w:eastAsia="Arial" w:hAnsi="Arial"/>
+                <w:b w:val="false"/>
+                <w:bCs w:val="false"/>
+                <w:color w:val="1B1B1B"/>
+                <w:sz w:val="18"/>
+                <w:szCs w:val="18"/>
+              </w:rPr>
+              <w:t xml:space="preserve">Label any target object containing at least 1 LIDAR or RADAR point</w:t>
+            </w:r>
+          </w:p>
+        </w:tc>
+        <w:tc>
+          <w:tcPr>
+            <w:tcW w:type="dxa" w:w="2860"/>
+            <w:tcMar>
+              <w:top w:type="dxa" w:w="60"/>
+              <w:left w:type="dxa" w:w="95"/>
+              <w:bottom w:type="dxa" w:w="60"/>
+              <w:right w:type="dxa" w:w="95"/>
+            </w:tcMar>
+            <w:vAlign w:val="center"/>
+          </w:tcPr>
+          <w:p>
+            <w:pPr>
+              <w:spacing w:after="0" w:line="265"/>
+            </w:pPr>
+            <w:r>
+              <w:rPr>
+                <w:rFonts w:ascii="Arial" w:cs="Arial" w:eastAsia="Arial" w:hAnsi="Arial"/>
+                <w:b w:val="false"/>
+                <w:bCs w:val="false"/>
+                <w:color w:val="1B1B1B"/>
+                <w:sz w:val="18"/>
+                <w:szCs w:val="18"/>
+              </w:rPr>
+              <w:t xml:space="preserve">Cảm biến thấy thì mô hình phải học</w:t>
+            </w:r>
+          </w:p>
+        </w:tc>
+      </w:tr>
+      <w:tr>
+        <w:trPr>
+          <w:cantSplit/>
+          <w:tblHeader w:val="false"/>
+        </w:trPr>
+        <w:tc>
+          <w:tcPr>
+            <w:tcW w:type="dxa" w:w="2900"/>
+            <w:tcMar>
+              <w:top w:type="dxa" w:w="60"/>
+              <w:left w:type="dxa" w:w="95"/>
+              <w:bottom w:type="dxa" w:w="60"/>
+              <w:right w:type="dxa" w:w="95"/>
+            </w:tcMar>
+            <w:vAlign w:val="center"/>
+          </w:tcPr>
+          <w:p>
+            <w:pPr>
+              <w:spacing w:after="0" w:line="265"/>
+            </w:pPr>
+            <w:r>
+              <w:rPr>
+                <w:rFonts w:ascii="Arial" w:cs="Arial" w:eastAsia="Arial" w:hAnsi="Arial"/>
+                <w:b w:val="false"/>
+                <w:bCs w:val="false"/>
+                <w:color w:val="1B1B1B"/>
+                <w:sz w:val="18"/>
+                <w:szCs w:val="18"/>
+              </w:rPr>
+              <w:t xml:space="preserve">Khung rất sát</w:t>
+            </w:r>
+          </w:p>
+        </w:tc>
+        <w:tc>
+          <w:tcPr>
+            <w:tcW w:type="dxa" w:w="3600"/>
+            <w:tcMar>
+              <w:top w:type="dxa" w:w="60"/>
+              <w:left w:type="dxa" w:w="95"/>
+              <w:bottom w:type="dxa" w:w="60"/>
+              <w:right w:type="dxa" w:w="95"/>
+            </w:tcMar>
+            <w:vAlign w:val="center"/>
+          </w:tcPr>
+          <w:p>
+            <w:pPr>
+              <w:spacing w:after="0" w:line="265"/>
+            </w:pPr>
+            <w:r>
+              <w:rPr>
+                <w:rFonts w:ascii="Arial" w:cs="Arial" w:eastAsia="Arial" w:hAnsi="Arial"/>
+                <w:b w:val="false"/>
+                <w:bCs w:val="false"/>
+                <w:color w:val="1B1B1B"/>
+                <w:sz w:val="18"/>
+                <w:szCs w:val="18"/>
+              </w:rPr>
+              <w:t xml:space="preserve">Cuboids must be very tight.</w:t>
+            </w:r>
+          </w:p>
+        </w:tc>
+        <w:tc>
+          <w:tcPr>
+            <w:tcW w:type="dxa" w:w="2860"/>
+            <w:tcMar>
+              <w:top w:type="dxa" w:w="60"/>
+              <w:left w:type="dxa" w:w="95"/>
+              <w:bottom w:type="dxa" w:w="60"/>
+              <w:right w:type="dxa" w:w="95"/>
+            </w:tcMar>
+            <w:vAlign w:val="center"/>
+          </w:tcPr>
+          <w:p>
+            <w:pPr>
+              <w:spacing w:after="0" w:line="265"/>
+            </w:pPr>
+            <w:r>
+              <w:rPr>
+                <w:rFonts w:ascii="Arial" w:cs="Arial" w:eastAsia="Arial" w:hAnsi="Arial"/>
+                <w:b w:val="false"/>
+                <w:bCs w:val="false"/>
+                <w:color w:val="1B1B1B"/>
+                <w:sz w:val="18"/>
+                <w:szCs w:val="18"/>
+              </w:rPr>
+              <w:t xml:space="preserve">Khung rộng thì sai vị trí, khoảng cách</w:t>
+            </w:r>
+          </w:p>
+        </w:tc>
+      </w:tr>
+      <w:tr>
+        <w:trPr>
+          <w:cantSplit/>
+          <w:tblHeader w:val="false"/>
+        </w:trPr>
+        <w:tc>
+          <w:tcPr>
+            <w:tcW w:type="dxa" w:w="2900"/>
+            <w:tcMar>
+              <w:top w:type="dxa" w:w="60"/>
+              <w:left w:type="dxa" w:w="95"/>
+              <w:bottom w:type="dxa" w:w="60"/>
+              <w:right w:type="dxa" w:w="95"/>
+            </w:tcMar>
+            <w:vAlign w:val="center"/>
+          </w:tcPr>
+          <w:p>
+            <w:pPr>
+              <w:spacing w:after="0" w:line="265"/>
+            </w:pPr>
+            <w:r>
+              <w:rPr>
+                <w:rFonts w:ascii="Arial" w:cs="Arial" w:eastAsia="Arial" w:hAnsi="Arial"/>
+                <w:b w:val="false"/>
+                <w:bCs w:val="false"/>
+                <w:color w:val="1B1B1B"/>
+                <w:sz w:val="18"/>
+                <w:szCs w:val="18"/>
+              </w:rPr>
+              <w:t xml:space="preserve">Gồm cả tay chân</w:t>
+            </w:r>
+          </w:p>
+        </w:tc>
+        <w:tc>
+          <w:tcPr>
+            <w:tcW w:type="dxa" w:w="3600"/>
+            <w:tcMar>
+              <w:top w:type="dxa" w:w="60"/>
+              <w:left w:type="dxa" w:w="95"/>
+              <w:bottom w:type="dxa" w:w="60"/>
+              <w:right w:type="dxa" w:w="95"/>
+            </w:tcMar>
+            <w:vAlign w:val="center"/>
+          </w:tcPr>
+          <w:p>
+            <w:pPr>
+              <w:spacing w:after="0" w:line="265"/>
+            </w:pPr>
+            <w:r>
+              <w:rPr>
+                <w:rFonts w:ascii="Arial" w:cs="Arial" w:eastAsia="Arial" w:hAnsi="Arial"/>
+                <w:b w:val="false"/>
+                <w:bCs w:val="false"/>
+                <w:color w:val="1B1B1B"/>
+                <w:sz w:val="18"/>
+                <w:szCs w:val="18"/>
+              </w:rPr>
+              <w:t xml:space="preserve">…should include the extremities.</w:t>
+            </w:r>
+          </w:p>
+        </w:tc>
+        <w:tc>
+          <w:tcPr>
+            <w:tcW w:type="dxa" w:w="2860"/>
+            <w:tcMar>
+              <w:top w:type="dxa" w:w="60"/>
+              <w:left w:type="dxa" w:w="95"/>
+              <w:bottom w:type="dxa" w:w="60"/>
+              <w:right w:type="dxa" w:w="95"/>
+            </w:tcMar>
+            <w:vAlign w:val="center"/>
+          </w:tcPr>
+          <w:p>
+            <w:pPr>
+              <w:spacing w:after="0" w:line="265"/>
+            </w:pPr>
+            <w:r>
+              <w:rPr>
+                <w:rFonts w:ascii="Arial" w:cs="Arial" w:eastAsia="Arial" w:hAnsi="Arial"/>
+                <w:b w:val="false"/>
+                <w:bCs w:val="false"/>
+                <w:color w:val="1B1B1B"/>
+                <w:sz w:val="18"/>
+                <w:szCs w:val="18"/>
+              </w:rPr>
+              <w:t xml:space="preserve">Tay giơ ra cũng có thể bị đụng</w:t>
+            </w:r>
+          </w:p>
+        </w:tc>
+      </w:tr>
+      <w:tr>
+        <w:trPr>
+          <w:cantSplit/>
+          <w:tblHeader w:val="false"/>
+        </w:trPr>
+        <w:tc>
+          <w:tcPr>
+            <w:tcW w:type="dxa" w:w="2900"/>
+            <w:tcMar>
+              <w:top w:type="dxa" w:w="60"/>
+              <w:left w:type="dxa" w:w="95"/>
+              <w:bottom w:type="dxa" w:w="60"/>
+              <w:right w:type="dxa" w:w="95"/>
+            </w:tcMar>
+            <w:vAlign w:val="center"/>
+          </w:tcPr>
+          <w:p>
+            <w:pPr>
+              <w:spacing w:after="0" w:line="265"/>
+            </w:pPr>
+            <w:r>
+              <w:rPr>
+                <w:rFonts w:ascii="Arial" w:cs="Arial" w:eastAsia="Arial" w:hAnsi="Arial"/>
+                <w:b w:val="false"/>
+                <w:bCs w:val="false"/>
+                <w:color w:val="1B1B1B"/>
+                <w:sz w:val="18"/>
+                <w:szCs w:val="18"/>
+              </w:rPr>
+              <w:t xml:space="preserve">Có người lái: chung khung với xe</w:t>
+            </w:r>
+          </w:p>
+        </w:tc>
+        <w:tc>
+          <w:tcPr>
+            <w:tcW w:type="dxa" w:w="3600"/>
+            <w:tcMar>
+              <w:top w:type="dxa" w:w="60"/>
+              <w:left w:type="dxa" w:w="95"/>
+              <w:bottom w:type="dxa" w:w="60"/>
+              <w:right w:type="dxa" w:w="95"/>
+            </w:tcMar>
+            <w:vAlign w:val="center"/>
+          </w:tcPr>
+          <w:p>
+            <w:pPr>
+              <w:spacing w:after="0" w:line="265"/>
+            </w:pPr>
+            <w:r>
+              <w:rPr>
+                <w:rFonts w:ascii="Arial" w:cs="Arial" w:eastAsia="Arial" w:hAnsi="Arial"/>
+                <w:b w:val="false"/>
+                <w:bCs w:val="false"/>
+                <w:color w:val="1B1B1B"/>
+                <w:sz w:val="18"/>
+                <w:szCs w:val="18"/>
+              </w:rPr>
+              <w:t xml:space="preserve">If there is a rider, include the rider in the box.</w:t>
+            </w:r>
+          </w:p>
+        </w:tc>
+        <w:tc>
+          <w:tcPr>
+            <w:tcW w:type="dxa" w:w="2860"/>
+            <w:tcMar>
+              <w:top w:type="dxa" w:w="60"/>
+              <w:left w:type="dxa" w:w="95"/>
+              <w:bottom w:type="dxa" w:w="60"/>
+              <w:right w:type="dxa" w:w="95"/>
+            </w:tcMar>
+            <w:vAlign w:val="center"/>
+          </w:tcPr>
+          <w:p>
+            <w:pPr>
+              <w:spacing w:after="0" w:line="265"/>
+            </w:pPr>
+            <w:r>
+              <w:rPr>
+                <w:rFonts w:ascii="Arial" w:cs="Arial" w:eastAsia="Arial" w:hAnsi="Arial"/>
+                <w:b w:val="false"/>
+                <w:bCs w:val="false"/>
+                <w:color w:val="1B1B1B"/>
+                <w:sz w:val="18"/>
+                <w:szCs w:val="18"/>
+              </w:rPr>
+              <w:t xml:space="preserve">Người và xe đi cùng nhau</w:t>
+            </w:r>
+          </w:p>
+        </w:tc>
+      </w:tr>
+      <w:tr>
+        <w:trPr>
+          <w:cantSplit/>
+          <w:tblHeader w:val="false"/>
+        </w:trPr>
+        <w:tc>
+          <w:tcPr>
+            <w:tcW w:type="dxa" w:w="2900"/>
+            <w:tcMar>
+              <w:top w:type="dxa" w:w="60"/>
+              <w:left w:type="dxa" w:w="95"/>
+              <w:bottom w:type="dxa" w:w="60"/>
+              <w:right w:type="dxa" w:w="95"/>
+            </w:tcMar>
+            <w:vAlign w:val="center"/>
+          </w:tcPr>
+          <w:p>
+            <w:pPr>
+              <w:spacing w:after="0" w:line="265"/>
+            </w:pPr>
+            <w:r>
+              <w:rPr>
+                <w:rFonts w:ascii="Arial" w:cs="Arial" w:eastAsia="Arial" w:hAnsi="Arial"/>
+                <w:b w:val="false"/>
+                <w:bCs w:val="false"/>
+                <w:color w:val="1B1B1B"/>
+                <w:sz w:val="18"/>
+                <w:szCs w:val="18"/>
+              </w:rPr>
+              <w:t xml:space="preserve">Người đứng cạnh: khoanh riêng</w:t>
+            </w:r>
+          </w:p>
+        </w:tc>
+        <w:tc>
+          <w:tcPr>
+            <w:tcW w:type="dxa" w:w="3600"/>
+            <w:tcMar>
+              <w:top w:type="dxa" w:w="60"/>
+              <w:left w:type="dxa" w:w="95"/>
+              <w:bottom w:type="dxa" w:w="60"/>
+              <w:right w:type="dxa" w:w="95"/>
+            </w:tcMar>
+            <w:vAlign w:val="center"/>
+          </w:tcPr>
+          <w:p>
+            <w:pPr>
+              <w:spacing w:after="0" w:line="265"/>
+            </w:pPr>
+            <w:r>
+              <w:rPr>
+                <w:rFonts w:ascii="Arial" w:cs="Arial" w:eastAsia="Arial" w:hAnsi="Arial"/>
+                <w:b w:val="false"/>
+                <w:bCs w:val="false"/>
+                <w:color w:val="1B1B1B"/>
+                <w:sz w:val="18"/>
+                <w:szCs w:val="18"/>
+              </w:rPr>
+              <w:t xml:space="preserve">…standing next to the motorcycle, do NOT include…</w:t>
+            </w:r>
+          </w:p>
+        </w:tc>
+        <w:tc>
+          <w:tcPr>
+            <w:tcW w:type="dxa" w:w="2860"/>
+            <w:tcMar>
+              <w:top w:type="dxa" w:w="60"/>
+              <w:left w:type="dxa" w:w="95"/>
+              <w:bottom w:type="dxa" w:w="60"/>
+              <w:right w:type="dxa" w:w="95"/>
+            </w:tcMar>
+            <w:vAlign w:val="center"/>
+          </w:tcPr>
+          <w:p>
+            <w:pPr>
+              <w:spacing w:after="0" w:line="265"/>
+            </w:pPr>
+            <w:r>
+              <w:rPr>
+                <w:rFonts w:ascii="Arial" w:cs="Arial" w:eastAsia="Arial" w:hAnsi="Arial"/>
+                <w:b w:val="false"/>
+                <w:bCs w:val="false"/>
+                <w:color w:val="1B1B1B"/>
+                <w:sz w:val="18"/>
+                <w:szCs w:val="18"/>
+              </w:rPr>
+              <w:t xml:space="preserve">Người đó có thể đi chỗ khác</w:t>
+            </w:r>
+          </w:p>
+        </w:tc>
+      </w:tr>
+      <w:tr>
+        <w:trPr>
+          <w:cantSplit/>
+          <w:tblHeader w:val="false"/>
+        </w:trPr>
+        <w:tc>
+          <w:tcPr>
+            <w:tcW w:type="dxa" w:w="2900"/>
+            <w:tcMar>
+              <w:top w:type="dxa" w:w="60"/>
+              <w:left w:type="dxa" w:w="95"/>
+              <w:bottom w:type="dxa" w:w="60"/>
+              <w:right w:type="dxa" w:w="95"/>
+            </w:tcMar>
+            <w:vAlign w:val="center"/>
+          </w:tcPr>
+          <w:p>
+            <w:pPr>
+              <w:spacing w:after="0" w:line="265"/>
+            </w:pPr>
+            <w:r>
+              <w:rPr>
+                <w:rFonts w:ascii="Arial" w:cs="Arial" w:eastAsia="Arial" w:hAnsi="Arial"/>
+                <w:b w:val="false"/>
+                <w:bCs w:val="false"/>
+                <w:color w:val="1B1B1B"/>
+                <w:sz w:val="18"/>
+                <w:szCs w:val="18"/>
+              </w:rPr>
+              <w:t xml:space="preserve">Độ thấy được 4 mức</w:t>
+            </w:r>
+          </w:p>
+        </w:tc>
+        <w:tc>
+          <w:tcPr>
+            <w:tcW w:type="dxa" w:w="3600"/>
+            <w:tcMar>
+              <w:top w:type="dxa" w:w="60"/>
+              <w:left w:type="dxa" w:w="95"/>
+              <w:bottom w:type="dxa" w:w="60"/>
+              <w:right w:type="dxa" w:w="95"/>
+            </w:tcMar>
+            <w:vAlign w:val="center"/>
+          </w:tcPr>
+          <w:p>
+            <w:pPr>
+              <w:spacing w:after="0" w:line="265"/>
+            </w:pPr>
+            <w:r>
+              <w:rPr>
+                <w:rFonts w:ascii="Arial" w:cs="Arial" w:eastAsia="Arial" w:hAnsi="Arial"/>
+                <w:b w:val="false"/>
+                <w:bCs w:val="false"/>
+                <w:color w:val="1B1B1B"/>
+                <w:sz w:val="18"/>
+                <w:szCs w:val="18"/>
+              </w:rPr>
+              <w:t xml:space="preserve">0–40%, 41–60%, 61–80%, 81–100%</w:t>
+            </w:r>
+          </w:p>
+        </w:tc>
+        <w:tc>
+          <w:tcPr>
+            <w:tcW w:type="dxa" w:w="2860"/>
+            <w:tcMar>
+              <w:top w:type="dxa" w:w="60"/>
+              <w:left w:type="dxa" w:w="95"/>
+              <w:bottom w:type="dxa" w:w="60"/>
+              <w:right w:type="dxa" w:w="95"/>
+            </w:tcMar>
+            <w:vAlign w:val="center"/>
+          </w:tcPr>
+          <w:p>
+            <w:pPr>
+              <w:spacing w:after="0" w:line="265"/>
+            </w:pPr>
+            <w:r>
+              <w:rPr>
+                <w:rFonts w:ascii="Arial" w:cs="Arial" w:eastAsia="Arial" w:hAnsi="Arial"/>
+                <w:b w:val="false"/>
+                <w:bCs w:val="false"/>
+                <w:color w:val="1B1B1B"/>
+                <w:sz w:val="18"/>
+                <w:szCs w:val="18"/>
+              </w:rPr>
+              <w:t xml:space="preserve">Biết vật nào bị che nhiều</w:t>
+            </w:r>
+          </w:p>
+        </w:tc>
+      </w:tr>
+    </w:tbl>
+    <w:p>
+      <w:pPr>
+        <w:spacing w:after="0"/>
+      </w:pPr>
+      <w:r>
+        <w:rPr>
+          <w:rFonts w:ascii="Arial" w:cs="Arial" w:eastAsia="Arial" w:hAnsi="Arial"/>
+          <w:color w:val="1B1B1B"/>
+          <w:sz w:val="22"/>
+          <w:szCs w:val="22"/>
+        </w:rPr>
+        <w:t xml:space="preserve"/>
+      </w:r>
+    </w:p>
+    <w:p>
+      <w:pPr>
+        <w:keepNext/>
+        <w:spacing w:after="60" w:before="60"/>
+        <w:jc w:val="center"/>
+      </w:pPr>
+      <w:r>
+        <w:drawing>
+          <wp:inline distT="0" distB="0" distL="0" distR="0">
+            <wp:extent cx="5334000" cy="1990725"/>
+            <wp:effectExtent t="0" r="0" b="0" l="0"/>
+            <wp:docPr id="1" name="" descr="" title=""/>
+            <wp:cNvGraphicFramePr>
+              <a:graphicFrameLocks xmlns:a="http://schemas.openxmlformats.org/drawingml/2006/main" noChangeAspect="1"/>
+            </wp:cNvGraphicFramePr>
+            <a:graphic xmlns:a="http://schemas.openxmlformats.org/drawingml/2006/main">
+              <a:graphicData uri="http://schemas.openxmlformats.org/drawingml/2006/picture">
+                <pic:pic xmlns:pic="http://schemas.openxmlformats.org/drawingml/2006/picture">
+                  <pic:nvPicPr>
+                    <pic:cNvPr id="0" name="" descr=""/>
+                    <pic:cNvPicPr>
+                      <a:picLocks noChangeAspect="1" noChangeArrowheads="1"/>
+                    </pic:cNvPicPr>
+                  </pic:nvPicPr>
+                  <pic:blipFill>
+                    <a:blip r:embed="rId23" cstate="none"/>
+                    <a:srcRect/>
+                    <a:stretch>
+                      <a:fillRect/>
+                    </a:stretch>
+                  </pic:blipFill>
+                  <pic:spPr bwMode="auto">
+                    <a:xfrm>
+                      <a:off x="0" y="0"/>
+                      <a:ext cx="5334000" cy="1990725"/>
+                    </a:xfrm>
+                    <a:prstGeom prst="rect">
+                      <a:avLst/>
+                    </a:prstGeom>
+                  </pic:spPr>
+                </pic:pic>
+              </a:graphicData>
+            </a:graphic>
+          </wp:inline>
+        </w:drawing>
+      </w:r>
+    </w:p>
+    <w:p>
+      <w:pPr>
+        <w:keepNext w:val="false"/>
+        <w:spacing w:after="70" w:before="190"/>
+      </w:pPr>
+      <w:r>
+        <w:rPr>
+          <w:rFonts w:ascii="Arial" w:cs="Arial" w:eastAsia="Arial" w:hAnsi="Arial"/>
+          <w:b/>
+          <w:bCs/>
+          <w:color w:val="24405C"/>
+          <w:sz w:val="19"/>
+          <w:szCs w:val="19"/>
+        </w:rPr>
+        <w:t xml:space="preserve">Người lái nằm trong khung của xe: trái xe đạp scene-0103, phải xe máy scene-1100 (khung chính thức). Dữ liệu: nuScenes (Motional), CC BY-NC-SA 4.0</w:t>
+      </w:r>
+    </w:p>
+    <w:p>
+      <w:pPr>
+        <w:widowControl/>
+        <w:spacing w:after="100" w:before="0" w:line="312"/>
+        <w:ind w:left="0" w:firstLine="0"/>
+      </w:pPr>
+      <w:r>
+        <w:rPr>
+          <w:rFonts w:ascii="Arial" w:cs="Arial" w:eastAsia="Arial" w:hAnsi="Arial"/>
+          <w:color w:val="1B1B1B"/>
+          <w:sz w:val="22"/>
+          <w:szCs w:val="22"/>
+        </w:rPr>
+        <w:t xml:space="preserve">Ở Hà Nội, một xe máy chở ba người, theo quy tắc nuScenes là </w:t>
+      </w:r>
+      <w:r>
+        <w:rPr>
+          <w:rFonts w:ascii="Arial" w:cs="Arial" w:eastAsia="Arial" w:hAnsi="Arial"/>
+          <w:b/>
+          <w:bCs/>
+          <w:color w:val="24405C"/>
+          <w:sz w:val="22"/>
+          <w:szCs w:val="22"/>
+        </w:rPr>
+        <w:t xml:space="preserve">một khung</w:t>
+      </w:r>
+      <w:r>
+        <w:rPr>
+          <w:rFonts w:ascii="Arial" w:cs="Arial" w:eastAsia="Arial" w:hAnsi="Arial"/>
+          <w:color w:val="1B1B1B"/>
+          <w:sz w:val="22"/>
+          <w:szCs w:val="22"/>
+        </w:rPr>
+        <w:t xml:space="preserve">, loại xe máy. Đổi sang quy tắc khoanh riêng từng người cũng được, quan trọng là </w:t>
+      </w:r>
+      <w:r>
+        <w:rPr>
+          <w:rFonts w:ascii="Arial" w:cs="Arial" w:eastAsia="Arial" w:hAnsi="Arial"/>
+          <w:b/>
+          <w:bCs/>
+          <w:color w:val="24405C"/>
+          <w:sz w:val="22"/>
+          <w:szCs w:val="22"/>
+        </w:rPr>
+        <w:t xml:space="preserve">cả bộ dữ liệu dùng cùng một quy tắc</w:t>
+      </w:r>
+      <w:r>
+        <w:rPr>
+          <w:rFonts w:ascii="Arial" w:cs="Arial" w:eastAsia="Arial" w:hAnsi="Arial"/>
+          <w:color w:val="1B1B1B"/>
+          <w:sz w:val="22"/>
+          <w:szCs w:val="22"/>
+        </w:rPr>
+        <w:t xml:space="preserve">.</w:t>
+      </w:r>
+    </w:p>
+    <w:p>
+      <w:pPr>
+        <w:pStyle w:val="Heading2"/>
+        <w:keepNext/>
+        <w:spacing w:after="130" w:before="300"/>
+      </w:pPr>
+      <w:r>
+        <w:rPr>
+          <w:rFonts w:ascii="Arial" w:cs="Arial" w:eastAsia="Arial" w:hAnsi="Arial"/>
+          <w:b/>
+          <w:bCs/>
+          <w:color w:val="24405C"/>
+          <w:sz w:val="24"/>
+          <w:szCs w:val="24"/>
+        </w:rPr>
+        <w:t xml:space="preserve">IoU: hai khung giống nhau bao nhiêu</w:t>
+      </w:r>
+    </w:p>
+    <w:p>
+      <w:pPr>
+        <w:keepNext/>
+        <w:spacing w:after="60" w:before="60"/>
+        <w:jc w:val="center"/>
+      </w:pPr>
+      <w:r>
+        <w:drawing>
+          <wp:inline distT="0" distB="0" distL="0" distR="0">
+            <wp:extent cx="5334000" cy="2038350"/>
+            <wp:effectExtent t="0" r="0" b="0" l="0"/>
+            <wp:docPr id="1" name="" descr="" title=""/>
+            <wp:cNvGraphicFramePr>
+              <a:graphicFrameLocks xmlns:a="http://schemas.openxmlformats.org/drawingml/2006/main" noChangeAspect="1"/>
+            </wp:cNvGraphicFramePr>
+            <a:graphic xmlns:a="http://schemas.openxmlformats.org/drawingml/2006/main">
+              <a:graphicData uri="http://schemas.openxmlformats.org/drawingml/2006/picture">
+                <pic:pic xmlns:pic="http://schemas.openxmlformats.org/drawingml/2006/picture">
+                  <pic:nvPicPr>
+                    <pic:cNvPr id="0" name="" descr=""/>
+                    <pic:cNvPicPr>
+                      <a:picLocks noChangeAspect="1" noChangeArrowheads="1"/>
+                    </pic:cNvPicPr>
+                  </pic:nvPicPr>
+                  <pic:blipFill>
+                    <a:blip r:embed="rId24" cstate="none"/>
+                    <a:srcRect/>
+                    <a:stretch>
+                      <a:fillRect/>
+                    </a:stretch>
+                  </pic:blipFill>
+                  <pic:spPr bwMode="auto">
+                    <a:xfrm>
+                      <a:off x="0" y="0"/>
+                      <a:ext cx="5334000" cy="2038350"/>
+                    </a:xfrm>
+                    <a:prstGeom prst="rect">
+                      <a:avLst/>
+                    </a:prstGeom>
+                  </pic:spPr>
+                </pic:pic>
+              </a:graphicData>
+            </a:graphic>
+          </wp:inline>
+        </w:drawing>
+      </w:r>
+    </w:p>
+    <w:p>
+      <w:pPr>
+        <w:keepNext w:val="false"/>
+        <w:spacing w:after="70" w:before="190"/>
+      </w:pPr>
+      <w:r>
+        <w:rPr>
+          <w:rFonts w:ascii="Arial" w:cs="Arial" w:eastAsia="Arial" w:hAnsi="Arial"/>
+          <w:b/>
+          <w:bCs/>
+          <w:color w:val="24405C"/>
+          <w:sz w:val="19"/>
+          <w:szCs w:val="19"/>
+        </w:rPr>
+        <w:t xml:space="preserve">Khung trắng = đáp án, khung màu = khung học sinh minh hoạ (cùng một khung dịch xuống phải). Dữ liệu: nuScenes (Motional), CC BY-NC-SA 4.0</w:t>
+      </w:r>
+    </w:p>
+    <w:p>
+      <w:pPr>
+        <w:spacing w:after="150" w:before="130" w:line="320"/>
+        <w:jc w:val="center"/>
+      </w:pPr>
+      <w:r>
+        <w:rPr>
+          <w:rFonts w:ascii="Arial" w:cs="Arial" w:eastAsia="Arial" w:hAnsi="Arial"/>
+          <w:b/>
+          <w:bCs/>
+          <w:color w:val="24405C"/>
+          <w:sz w:val="23"/>
+          <w:szCs w:val="23"/>
+        </w:rPr>
+        <w:t xml:space="preserve">IoU = diện tích chồng lên ÷ diện tích gộp lại (1 = trùng khít, 0 = không chạm)</w:t>
+      </w:r>
+    </w:p>
+    <w:p>
+      <w:pPr>
+        <w:widowControl/>
+        <w:spacing w:after="100" w:before="0" w:line="312"/>
+        <w:ind w:left="0" w:firstLine="0"/>
+      </w:pPr>
+      <w:r>
+        <w:rPr>
+          <w:rFonts w:ascii="Arial" w:cs="Arial" w:eastAsia="Arial" w:hAnsi="Arial"/>
+          <w:color w:val="1B1B1B"/>
+          <w:sz w:val="22"/>
+          <w:szCs w:val="22"/>
+        </w:rPr>
+        <w:t xml:space="preserve">Như hai tờ giấy chồng trên bàn: phần chồng lên chia cho diện tích hai tờ gộp lại. Lệch một chút, IoU từ 0,9 rơi xuống 0,6. Bàn tập gán nhãn tính </w:t>
+      </w:r>
+      <w:r>
+        <w:rPr>
+          <w:rFonts w:ascii="Arial" w:cs="Arial" w:eastAsia="Arial" w:hAnsi="Arial"/>
+          <w:b/>
+          <w:bCs/>
+          <w:color w:val="24405C"/>
+          <w:sz w:val="22"/>
+          <w:szCs w:val="22"/>
+        </w:rPr>
+        <w:t xml:space="preserve">IoU ≥ 0,3 và đúng loại</w:t>
+      </w:r>
+      <w:r>
+        <w:rPr>
+          <w:rFonts w:ascii="Arial" w:cs="Arial" w:eastAsia="Arial" w:hAnsi="Arial"/>
+          <w:color w:val="1B1B1B"/>
+          <w:sz w:val="22"/>
+          <w:szCs w:val="22"/>
+        </w:rPr>
+        <w:t xml:space="preserve"> là «khoanh trúng», vì đáp án tính từ khung 3D nên vốn lệch một chút so với mép trên ảnh; thi đấu chính thức thường dùng 0,5 hoặc 0,7.</w:t>
+      </w:r>
+    </w:p>
+    <w:p>
+      <w:pPr>
+        <w:pStyle w:val="Heading2"/>
+        <w:keepNext/>
+        <w:spacing w:after="130" w:before="300"/>
+      </w:pPr>
+      <w:r>
+        <w:rPr>
+          <w:rFonts w:ascii="Arial" w:cs="Arial" w:eastAsia="Arial" w:hAnsi="Arial"/>
+          <w:b/>
+          <w:bCs/>
+          <w:color w:val="24405C"/>
+          <w:sz w:val="24"/>
+          <w:szCs w:val="24"/>
+        </w:rPr>
+        <w:t xml:space="preserve">Thực hành: bàn tập gán nhãn</w:t>
+      </w:r>
+    </w:p>
+    <w:p>
+      <w:pPr>
+        <w:keepNext/>
+        <w:spacing w:after="60" w:before="60"/>
+        <w:jc w:val="center"/>
+      </w:pPr>
+      <w:r>
+        <w:drawing>
+          <wp:inline distT="0" distB="0" distL="0" distR="0">
+            <wp:extent cx="4762500" cy="3476625"/>
+            <wp:effectExtent t="0" r="0" b="0" l="0"/>
+            <wp:docPr id="1" name="" descr="" title=""/>
+            <wp:cNvGraphicFramePr>
+              <a:graphicFrameLocks xmlns:a="http://schemas.openxmlformats.org/drawingml/2006/main" noChangeAspect="1"/>
+            </wp:cNvGraphicFramePr>
+            <a:graphic xmlns:a="http://schemas.openxmlformats.org/drawingml/2006/main">
+              <a:graphicData uri="http://schemas.openxmlformats.org/drawingml/2006/picture">
+                <pic:pic xmlns:pic="http://schemas.openxmlformats.org/drawingml/2006/picture">
+                  <pic:nvPicPr>
+                    <pic:cNvPr id="0" name="" descr=""/>
+                    <pic:cNvPicPr>
+                      <a:picLocks noChangeAspect="1" noChangeArrowheads="1"/>
+                    </pic:cNvPicPr>
+                  </pic:nvPicPr>
+                  <pic:blipFill>
+                    <a:blip r:embed="rId25" cstate="none"/>
+                    <a:srcRect/>
+                    <a:stretch>
+                      <a:fillRect/>
+                    </a:stretch>
+                  </pic:blipFill>
+                  <pic:spPr bwMode="auto">
+                    <a:xfrm>
+                      <a:off x="0" y="0"/>
                       <a:ext cx="4762500" cy="3476625"/>
                     </a:xfrm>
                     <a:prstGeom prst="rect">
@@ -5586,7 +6768,7 @@
           <w:sz w:val="19"/>
           <w:szCs w:val="19"/>
         </w:rPr>
-        <w:t xml:space="preserve">Bảng 5. Bốn nhiệm vụ: cần khoanh mấy cái, mô hình khoanh trúng mấy cái</w:t>
+        <w:t xml:space="preserve">Bảng 6. Bốn nhiệm vụ: cần khoanh mấy cái, mô hình khoanh trúng mấy cái</w:t>
       </w:r>
     </w:p>
     <w:tbl>
@@ -6308,7 +7490,7 @@
           <w:sz w:val="19"/>
           <w:szCs w:val="19"/>
         </w:rPr>
-        <w:t xml:space="preserve">Bảng 6. Tám tuần, mỗi tuần một câu</w:t>
+        <w:t xml:space="preserve">Bảng 7. Tám tuần, mỗi tuần một câu</w:t>
       </w:r>
     </w:p>
     <w:tbl>
@@ -7170,7 +8352,7 @@
           <w:sz w:val="19"/>
           <w:szCs w:val="19"/>
         </w:rPr>
-        <w:t xml:space="preserve">Bảng 7. Tuần 1–2: sáu cấp</w:t>
+        <w:t xml:space="preserve">Bảng 8. Tuần 1–2: sáu cấp</w:t>
       </w:r>
     </w:p>
     <w:tbl>
@@ -8086,7 +9268,7 @@
           <w:sz w:val="19"/>
           <w:szCs w:val="19"/>
         </w:rPr>
-        <w:t xml:space="preserve">Bảng 8. Tuần 3: sáu cảm biến đo trực tiếp cái gì (tầm là giá trị lớp học, trời nắng)</w:t>
+        <w:t xml:space="preserve">Bảng 9. Tuần 3: sáu cảm biến đo trực tiếp cái gì (tầm là giá trị lớp học, trời nắng)</w:t>
       </w:r>
     </w:p>
     <w:tbl>
@@ -8966,7 +10148,7 @@
           <w:sz w:val="19"/>
           <w:szCs w:val="19"/>
         </w:rPr>
-        <w:t xml:space="preserve">Bảng 9. Tuần 4: quãng dừng (phản ứng 0,3 s, giảm tốc 6 m/s²) và tia tối thiểu</w:t>
+        <w:t xml:space="preserve">Bảng 10. Tuần 4: quãng dừng (phản ứng 0,3 s, giảm tốc 6 m/s²) và tia tối thiểu</w:t>
       </w:r>
     </w:p>
     <w:tbl>
@@ -9665,7 +10847,7 @@
           <w:sz w:val="19"/>
           <w:szCs w:val="19"/>
         </w:rPr>
-        <w:t xml:space="preserve">Bảng 10. Tuần 5–6: sáu con số hay thi khi đọc bảng thông số</w:t>
+        <w:t xml:space="preserve">Bảng 11. Tuần 5–6: sáu con số hay thi khi đọc bảng thông số</w:t>
       </w:r>
     </w:p>
     <w:tbl>
@@ -10149,7 +11331,7 @@
           <w:sz w:val="19"/>
           <w:szCs w:val="19"/>
         </w:rPr>
-        <w:t xml:space="preserve">Bảng 11. Tuần 7: bảng điều kiện hỏng (✓ bình thường, ▲ kém đi, ✗ hỏng, — không liên quan)</w:t>
+        <w:t xml:space="preserve">Bảng 12. Tuần 7: bảng điều kiện hỏng (✓ bình thường, ▲ kém đi, ✗ hỏng, — không liên quan)</w:t>
       </w:r>
     </w:p>
     <w:tbl>
@@ -12147,7 +13329,7 @@
           <w:sz w:val="19"/>
           <w:szCs w:val="19"/>
         </w:rPr>
-        <w:t xml:space="preserve">Bảng 12. Tám câu hay nói sai</w:t>
+        <w:t xml:space="preserve">Bảng 13. Tám câu hay nói sai</w:t>
       </w:r>
     </w:p>
     <w:tbl>

</xml_diff>

<commit_message>
Week 8 L1: new slide on why each update is small (learning-rate demo on real data)
Co-Authored-By: Claude Opus 5.5 <noreply@anthropic.com>
</commit_message>
<xml_diff>
--- a/第八週(10-29)/Nguyên lý xe tự lái_Tuần 8_Tài liệu học tập.docx
+++ b/第八週(10-29)/Nguyên lý xe tự lái_Tuần 8_Tài liệu học tập.docx
@@ -2642,20 +2642,19 @@
     </w:p>
     <w:p>
       <w:pPr>
-        <w:pStyle w:val="Heading2"/>
         <w:keepNext/>
-        <w:spacing w:after="130" w:before="300"/>
+        <w:spacing w:after="90" w:before="210"/>
       </w:pPr>
       <w:r>
         <w:rPr>
           <w:rFonts w:ascii="Arial" w:cs="Arial" w:eastAsia="Arial" w:hAnsi="Arial"/>
           <w:b/>
           <w:bCs/>
-          <w:color w:val="24405C"/>
-          <w:sz w:val="24"/>
-          <w:szCs w:val="24"/>
-        </w:rPr>
-        <w:t xml:space="preserve">Phát hiện vật thể cho ba thứ: khung, loại, điểm</w:t>
+          <w:color w:val="1B1B1B"/>
+          <w:sz w:val="22"/>
+          <w:szCs w:val="22"/>
+        </w:rPr>
+        <w:t xml:space="preserve">Vì sao chỉ sửa một chút</w:t>
       </w:r>
     </w:p>
     <w:p>
@@ -2667,7 +2666,7 @@
       <w:r>
         <w:drawing>
           <wp:inline distT="0" distB="0" distL="0" distR="0">
-            <wp:extent cx="5905500" cy="2057400"/>
+            <wp:extent cx="5715000" cy="2933700"/>
             <wp:effectExtent t="0" r="0" b="0" l="0"/>
             <wp:docPr id="1" name="" descr="" title=""/>
             <wp:cNvGraphicFramePr>
@@ -2692,6 +2691,164 @@
                   <pic:spPr bwMode="auto">
                     <a:xfrm>
                       <a:off x="0" y="0"/>
+                      <a:ext cx="5715000" cy="2933700"/>
+                    </a:xfrm>
+                    <a:prstGeom prst="rect">
+                      <a:avLst/>
+                    </a:prstGeom>
+                  </pic:spPr>
+                </pic:pic>
+              </a:graphicData>
+            </a:graphic>
+          </wp:inline>
+        </w:drawing>
+      </w:r>
+    </w:p>
+    <w:p>
+      <w:pPr>
+        <w:keepNext w:val="false"/>
+        <w:spacing w:after="70" w:before="190"/>
+      </w:pPr>
+      <w:r>
+        <w:rPr>
+          <w:rFonts w:ascii="Arial" w:cs="Arial" w:eastAsia="Arial" w:hAnsi="Arial"/>
+          <w:b/>
+          <w:bCs/>
+          <w:color w:val="24405C"/>
+          <w:sz w:val="19"/>
+          <w:szCs w:val="19"/>
+        </w:rPr>
+        <w:t xml:space="preserve">Dùng 627 ví dụ ở trên, cho máy học ngưỡng kiểu «xem dốc, bước xuống một bước», so sánh ba độ dài bước (tốc độ học). Dải xanh nhạt là khoảng phân loại đúng.</w:t>
+      </w:r>
+    </w:p>
+    <w:p>
+      <w:pPr>
+        <w:widowControl/>
+        <w:spacing w:after="100" w:before="0" w:line="312"/>
+        <w:ind w:left="0" w:firstLine="0"/>
+      </w:pPr>
+      <w:r>
+        <w:rPr>
+          <w:rFonts w:ascii="Arial" w:cs="Arial" w:eastAsia="Arial" w:hAnsi="Arial"/>
+          <w:color w:val="1B1B1B"/>
+          <w:sz w:val="22"/>
+          <w:szCs w:val="22"/>
+        </w:rPr>
+        <w:t xml:space="preserve">Hai lý do. Một, so đáp án xong máy chỉ tính được </w:t>
+      </w:r>
+      <w:r>
+        <w:rPr>
+          <w:rFonts w:ascii="Arial" w:cs="Arial" w:eastAsia="Arial" w:hAnsi="Arial"/>
+          <w:b/>
+          <w:bCs/>
+          <w:color w:val="24405C"/>
+          <w:sz w:val="22"/>
+          <w:szCs w:val="22"/>
+        </w:rPr>
+        <w:t xml:space="preserve">nên sửa theo hướng nào</w:t>
+      </w:r>
+      <w:r>
+        <w:rPr>
+          <w:rFonts w:ascii="Arial" w:cs="Arial" w:eastAsia="Arial" w:hAnsi="Arial"/>
+          <w:color w:val="1B1B1B"/>
+          <w:sz w:val="22"/>
+          <w:szCs w:val="22"/>
+        </w:rPr>
+        <w:t xml:space="preserve">, không tính được </w:t>
+      </w:r>
+      <w:r>
+        <w:rPr>
+          <w:rFonts w:ascii="Arial" w:cs="Arial" w:eastAsia="Arial" w:hAnsi="Arial"/>
+          <w:b/>
+          <w:bCs/>
+          <w:color w:val="24405C"/>
+          <w:sz w:val="22"/>
+          <w:szCs w:val="22"/>
+        </w:rPr>
+        <w:t xml:space="preserve">sửa bao nhiêu</w:t>
+      </w:r>
+      <w:r>
+        <w:rPr>
+          <w:rFonts w:ascii="Arial" w:cs="Arial" w:eastAsia="Arial" w:hAnsi="Arial"/>
+          <w:color w:val="1B1B1B"/>
+          <w:sz w:val="22"/>
+          <w:szCs w:val="22"/>
+        </w:rPr>
+        <w:t xml:space="preserve">, như xuống núi trong sương mù chỉ biết dưới chân dốc về phía nào. Mỗi bước dài bao nhiêu do người đặt, gọi là «</w:t>
+      </w:r>
+      <w:r>
+        <w:rPr>
+          <w:rFonts w:ascii="Arial" w:cs="Arial" w:eastAsia="Arial" w:hAnsi="Arial"/>
+          <w:b/>
+          <w:bCs/>
+          <w:color w:val="24405C"/>
+          <w:sz w:val="22"/>
+          <w:szCs w:val="22"/>
+        </w:rPr>
+        <w:t xml:space="preserve">tốc độ học</w:t>
+      </w:r>
+      <w:r>
+        <w:rPr>
+          <w:rFonts w:ascii="Arial" w:cs="Arial" w:eastAsia="Arial" w:hAnsi="Arial"/>
+          <w:color w:val="1B1B1B"/>
+          <w:sz w:val="22"/>
+          <w:szCs w:val="22"/>
+        </w:rPr>
+        <w:t xml:space="preserve">»: quá nhỏ thì đi chậm (0,05 sửa 30 lần ngưỡng mới tới 1,32); quá lớn thì nhảy quá đà, nhảy qua lại (2,5 nhảy giữa −2,5 và 3,3, chỉ đúng một nửa); vừa phải (0,6) thì lần thứ ba đã vào khoảng đúng. Hai, khi huấn luyện thật mỗi lần chỉ xem vài đến vài chục ảnh; mỗi lần sửa nhiều thì những gì học từ ảnh khác bị xoá mất; mỗi lần chỉ sửa một chút, xem đủ nhiều ảnh mới dùng tốt cho mọi ảnh.</w:t>
+      </w:r>
+    </w:p>
+    <w:p>
+      <w:pPr>
+        <w:pStyle w:val="Heading2"/>
+        <w:keepNext/>
+        <w:spacing w:after="130" w:before="300"/>
+      </w:pPr>
+      <w:r>
+        <w:rPr>
+          <w:rFonts w:ascii="Arial" w:cs="Arial" w:eastAsia="Arial" w:hAnsi="Arial"/>
+          <w:b/>
+          <w:bCs/>
+          <w:color w:val="24405C"/>
+          <w:sz w:val="24"/>
+          <w:szCs w:val="24"/>
+        </w:rPr>
+        <w:t xml:space="preserve">Phát hiện vật thể cho ba thứ: khung, loại, điểm</w:t>
+      </w:r>
+    </w:p>
+    <w:p>
+      <w:pPr>
+        <w:keepNext/>
+        <w:spacing w:after="60" w:before="60"/>
+        <w:jc w:val="center"/>
+      </w:pPr>
+      <w:r>
+        <w:drawing>
+          <wp:inline distT="0" distB="0" distL="0" distR="0">
+            <wp:extent cx="5905500" cy="2057400"/>
+            <wp:effectExtent t="0" r="0" b="0" l="0"/>
+            <wp:docPr id="1" name="" descr="" title=""/>
+            <wp:cNvGraphicFramePr>
+              <a:graphicFrameLocks xmlns:a="http://schemas.openxmlformats.org/drawingml/2006/main" noChangeAspect="1"/>
+            </wp:cNvGraphicFramePr>
+            <a:graphic xmlns:a="http://schemas.openxmlformats.org/drawingml/2006/main">
+              <a:graphicData uri="http://schemas.openxmlformats.org/drawingml/2006/picture">
+                <pic:pic xmlns:pic="http://schemas.openxmlformats.org/drawingml/2006/picture">
+                  <pic:nvPicPr>
+                    <pic:cNvPr id="0" name="" descr=""/>
+                    <pic:cNvPicPr>
+                      <a:picLocks noChangeAspect="1" noChangeArrowheads="1"/>
+                    </pic:cNvPicPr>
+                  </pic:nvPicPr>
+                  <pic:blipFill>
+                    <a:blip r:embed="rId18" cstate="none"/>
+                    <a:srcRect/>
+                    <a:stretch>
+                      <a:fillRect/>
+                    </a:stretch>
+                  </pic:blipFill>
+                  <pic:spPr bwMode="auto">
+                    <a:xfrm>
+                      <a:off x="0" y="0"/>
                       <a:ext cx="5905500" cy="2057400"/>
                     </a:xfrm>
                     <a:prstGeom prst="rect">
@@ -3424,7 +3581,7 @@
                     </pic:cNvPicPr>
                   </pic:nvPicPr>
                   <pic:blipFill>
-                    <a:blip r:embed="rId18" cstate="none"/>
+                    <a:blip r:embed="rId19" cstate="none"/>
                     <a:srcRect/>
                     <a:stretch>
                       <a:fillRect/>
@@ -4664,7 +4821,7 @@
                     </pic:cNvPicPr>
                   </pic:nvPicPr>
                   <pic:blipFill>
-                    <a:blip r:embed="rId19" cstate="none"/>
+                    <a:blip r:embed="rId20" cstate="none"/>
                     <a:srcRect/>
                     <a:stretch>
                       <a:fillRect/>
@@ -4764,124 +4921,6 @@
         <w:drawing>
           <wp:inline distT="0" distB="0" distL="0" distR="0">
             <wp:extent cx="5715000" cy="1990725"/>
-            <wp:effectExtent t="0" r="0" b="0" l="0"/>
-            <wp:docPr id="1" name="" descr="" title=""/>
-            <wp:cNvGraphicFramePr>
-              <a:graphicFrameLocks xmlns:a="http://schemas.openxmlformats.org/drawingml/2006/main" noChangeAspect="1"/>
-            </wp:cNvGraphicFramePr>
-            <a:graphic xmlns:a="http://schemas.openxmlformats.org/drawingml/2006/main">
-              <a:graphicData uri="http://schemas.openxmlformats.org/drawingml/2006/picture">
-                <pic:pic xmlns:pic="http://schemas.openxmlformats.org/drawingml/2006/picture">
-                  <pic:nvPicPr>
-                    <pic:cNvPr id="0" name="" descr=""/>
-                    <pic:cNvPicPr>
-                      <a:picLocks noChangeAspect="1" noChangeArrowheads="1"/>
-                    </pic:cNvPicPr>
-                  </pic:nvPicPr>
-                  <pic:blipFill>
-                    <a:blip r:embed="rId20" cstate="none"/>
-                    <a:srcRect/>
-                    <a:stretch>
-                      <a:fillRect/>
-                    </a:stretch>
-                  </pic:blipFill>
-                  <pic:spPr bwMode="auto">
-                    <a:xfrm>
-                      <a:off x="0" y="0"/>
-                      <a:ext cx="5715000" cy="1990725"/>
-                    </a:xfrm>
-                    <a:prstGeom prst="rect">
-                      <a:avLst/>
-                    </a:prstGeom>
-                  </pic:spPr>
-                </pic:pic>
-              </a:graphicData>
-            </a:graphic>
-          </wp:inline>
-        </w:drawing>
-      </w:r>
-    </w:p>
-    <w:p>
-      <w:pPr>
-        <w:keepNext w:val="false"/>
-        <w:spacing w:after="70" w:before="190"/>
-      </w:pPr>
-      <w:r>
-        <w:rPr>
-          <w:rFonts w:ascii="Arial" w:cs="Arial" w:eastAsia="Arial" w:hAnsi="Arial"/>
-          <w:b/>
-          <w:bCs/>
-          <w:color w:val="24405C"/>
-          <w:sz w:val="19"/>
-          <w:szCs w:val="19"/>
-        </w:rPr>
-        <w:t xml:space="preserve">Khung phát hiện + điểm lidar (vàng). Lấy trung vị 1 m dày điểm nhất trong khung: người 8,9 m (chính thức 9,0 m), xe 21,4 m (22,0 m). Dữ liệu: nuScenes (Motional), CC BY-NC-SA 4.0</w:t>
-      </w:r>
-    </w:p>
-    <w:p>
-      <w:pPr>
-        <w:widowControl/>
-        <w:spacing w:after="100" w:before="0" w:line="312"/>
-        <w:ind w:left="0" w:firstLine="0"/>
-      </w:pPr>
-      <w:r>
-        <w:rPr>
-          <w:rFonts w:ascii="Arial" w:cs="Arial" w:eastAsia="Arial" w:hAnsi="Arial"/>
-          <w:color w:val="1B1B1B"/>
-          <w:sz w:val="22"/>
-          <w:szCs w:val="22"/>
-        </w:rPr>
-        <w:t xml:space="preserve">Camera nói «đây là người», lidar nói «bao xa» — cặp camera + lidar của tuần 7. Khung là hình chữ nhật, góc khung có cả điểm của mặt đường, nhà phía sau, nên phải chọn cụm điểm dày nhất. Xe tự lái cần </w:t>
-      </w:r>
-      <w:r>
-        <w:rPr>
-          <w:rFonts w:ascii="Arial" w:cs="Arial" w:eastAsia="Arial" w:hAnsi="Arial"/>
-          <w:b/>
-          <w:bCs/>
-          <w:color w:val="24405C"/>
-          <w:sz w:val="22"/>
-          <w:szCs w:val="22"/>
-        </w:rPr>
-        <w:t xml:space="preserve">khung 3D</w:t>
-      </w:r>
-      <w:r>
-        <w:rPr>
-          <w:rFonts w:ascii="Arial" w:cs="Arial" w:eastAsia="Arial" w:hAnsi="Arial"/>
-          <w:color w:val="1B1B1B"/>
-          <w:sz w:val="22"/>
-          <w:szCs w:val="22"/>
-        </w:rPr>
-        <w:t xml:space="preserve">: ba số vị trí, ba số kích thước, thêm hướng — bảy con số (tuần 7).</w:t>
-      </w:r>
-    </w:p>
-    <w:p>
-      <w:pPr>
-        <w:pStyle w:val="Heading2"/>
-        <w:keepNext/>
-        <w:spacing w:after="130" w:before="300"/>
-      </w:pPr>
-      <w:r>
-        <w:rPr>
-          <w:rFonts w:ascii="Arial" w:cs="Arial" w:eastAsia="Arial" w:hAnsi="Arial"/>
-          <w:b/>
-          <w:bCs/>
-          <w:color w:val="24405C"/>
-          <w:sz w:val="24"/>
-          <w:szCs w:val="24"/>
-        </w:rPr>
-        <w:t xml:space="preserve">Nhìn từ trên xuống: bản đồ từ trên và lưới chiếm chỗ</w:t>
-      </w:r>
-    </w:p>
-    <w:p>
-      <w:pPr>
-        <w:keepNext/>
-        <w:spacing w:after="60" w:before="60"/>
-        <w:jc w:val="center"/>
-      </w:pPr>
-      <w:r>
-        <w:drawing>
-          <wp:inline distT="0" distB="0" distL="0" distR="0">
-            <wp:extent cx="5905500" cy="3333750"/>
             <wp:effectExtent t="0" r="0" b="0" l="0"/>
             <wp:docPr id="1" name="" descr="" title=""/>
             <wp:cNvGraphicFramePr>
@@ -4906,7 +4945,7 @@
                   <pic:spPr bwMode="auto">
                     <a:xfrm>
                       <a:off x="0" y="0"/>
-                      <a:ext cx="5905500" cy="3333750"/>
+                      <a:ext cx="5715000" cy="1990725"/>
                     </a:xfrm>
                     <a:prstGeom prst="rect">
                       <a:avLst/>
@@ -4933,18 +4972,14 @@
           <w:sz w:val="19"/>
           <w:szCs w:val="19"/>
         </w:rPr>
-        <w:t xml:space="preserve">Trái: bản đồ từ trên, điểm lidar + khung 3D; phải: lưới chiếm chỗ tính từ cùng khung lidar (ô 0,5 m). scene-0103 (Boston). Dữ liệu: nuScenes (Motional), CC BY-NC-SA 4.0</w:t>
+        <w:t xml:space="preserve">Khung phát hiện + điểm lidar (vàng). Lấy trung vị 1 m dày điểm nhất trong khung: người 8,9 m (chính thức 9,0 m), xe 21,4 m (22,0 m). Dữ liệu: nuScenes (Motional), CC BY-NC-SA 4.0</w:t>
       </w:r>
     </w:p>
     <w:p>
       <w:pPr>
-        <w:pStyle w:val="ListParagraph"/>
         <w:widowControl/>
-        <w:numPr>
-          <w:ilvl w:val="0"/>
-          <w:numId w:val="3"/>
-        </w:numPr>
-        <w:spacing w:after="80" w:line="320"/>
+        <w:spacing w:after="100" w:before="0" w:line="312"/>
+        <w:ind w:left="0" w:firstLine="0"/>
       </w:pPr>
       <w:r>
         <w:rPr>
@@ -4953,7 +4988,7 @@
           <w:sz w:val="22"/>
           <w:szCs w:val="22"/>
         </w:rPr>
-        <w:t xml:space="preserve">Ba cái lợi của bản đồ từ trên: các vật </w:t>
+        <w:t xml:space="preserve">Camera nói «đây là người», lidar nói «bao xa» — cặp camera + lidar của tuần 7. Khung là hình chữ nhật, góc khung có cả điểm của mặt đường, nhà phía sau, nên phải chọn cụm điểm dày nhất. Xe tự lái cần </w:t>
       </w:r>
       <w:r>
         <w:rPr>
@@ -4964,7 +4999,7 @@
           <w:sz w:val="22"/>
           <w:szCs w:val="22"/>
         </w:rPr>
-        <w:t xml:space="preserve">không che nhau</w:t>
+        <w:t xml:space="preserve">khung 3D</w:t>
       </w:r>
       <w:r>
         <w:rPr>
@@ -4973,622 +5008,25 @@
           <w:sz w:val="22"/>
           <w:szCs w:val="22"/>
         </w:rPr>
-        <w:t xml:space="preserve">; </w:t>
-      </w:r>
+        <w:t xml:space="preserve">: ba số vị trí, ba số kích thước, thêm hướng — bảy con số (tuần 7).</w:t>
+      </w:r>
+    </w:p>
+    <w:p>
+      <w:pPr>
+        <w:pStyle w:val="Heading2"/>
+        <w:keepNext/>
+        <w:spacing w:after="130" w:before="300"/>
+      </w:pPr>
       <w:r>
         <w:rPr>
           <w:rFonts w:ascii="Arial" w:cs="Arial" w:eastAsia="Arial" w:hAnsi="Arial"/>
           <w:b/>
           <w:bCs/>
           <w:color w:val="24405C"/>
-          <w:sz w:val="22"/>
-          <w:szCs w:val="22"/>
-        </w:rPr>
-        <w:t xml:space="preserve">khoảng cách không méo</w:t>
-      </w:r>
-      <w:r>
-        <w:rPr>
-          <w:rFonts w:ascii="Arial" w:cs="Arial" w:eastAsia="Arial" w:hAnsi="Arial"/>
-          <w:color w:val="1B1B1B"/>
-          <w:sz w:val="22"/>
-          <w:szCs w:val="22"/>
-        </w:rPr>
-        <w:t xml:space="preserve">; lái xe vốn là quyết định </w:t>
-      </w:r>
-      <w:r>
-        <w:rPr>
-          <w:rFonts w:ascii="Arial" w:cs="Arial" w:eastAsia="Arial" w:hAnsi="Arial"/>
-          <w:b/>
-          <w:bCs/>
-          <w:color w:val="24405C"/>
-          <w:sz w:val="22"/>
-          <w:szCs w:val="22"/>
-        </w:rPr>
-        <w:t xml:space="preserve">trên mặt đất</w:t>
-      </w:r>
-      <w:r>
-        <w:rPr>
-          <w:rFonts w:ascii="Arial" w:cs="Arial" w:eastAsia="Arial" w:hAnsi="Arial"/>
-          <w:color w:val="1B1B1B"/>
-          <w:sz w:val="22"/>
-          <w:szCs w:val="22"/>
-        </w:rPr>
-        <w:t xml:space="preserve">. Ghép giữa ở tuần 7 là cùng vẽ thành một bản đồ từ trên.</w:t>
-      </w:r>
-    </w:p>
-    <w:p>
-      <w:pPr>
-        <w:pStyle w:val="ListParagraph"/>
-        <w:widowControl/>
-        <w:numPr>
-          <w:ilvl w:val="0"/>
-          <w:numId w:val="3"/>
-        </w:numPr>
-        <w:spacing w:after="80" w:line="320"/>
-      </w:pPr>
-      <w:r>
-        <w:rPr>
-          <w:rFonts w:ascii="Arial" w:cs="Arial" w:eastAsia="Arial" w:hAnsi="Arial"/>
-          <w:color w:val="1B1B1B"/>
-          <w:sz w:val="22"/>
-          <w:szCs w:val="22"/>
-        </w:rPr>
-        <w:t xml:space="preserve">Lưới chiếm chỗ: mỗi ô chỉ hỏi một việc. </w:t>
-      </w:r>
-      <w:r>
-        <w:rPr>
-          <w:rFonts w:ascii="Arial" w:cs="Arial" w:eastAsia="Arial" w:hAnsi="Arial"/>
-          <w:b/>
-          <w:bCs/>
-          <w:color w:val="24405C"/>
-          <w:sz w:val="22"/>
-          <w:szCs w:val="22"/>
-        </w:rPr>
-        <w:t xml:space="preserve">Đỏ = có vật</w:t>
-      </w:r>
-      <w:r>
-        <w:rPr>
-          <w:rFonts w:ascii="Arial" w:cs="Arial" w:eastAsia="Arial" w:hAnsi="Arial"/>
-          <w:color w:val="1B1B1B"/>
-          <w:sz w:val="22"/>
-          <w:szCs w:val="22"/>
-        </w:rPr>
-        <w:t xml:space="preserve">, </w:t>
-      </w:r>
-      <w:r>
-        <w:rPr>
-          <w:rFonts w:ascii="Arial" w:cs="Arial" w:eastAsia="Arial" w:hAnsi="Arial"/>
-          <w:b/>
-          <w:bCs/>
-          <w:color w:val="24405C"/>
-          <w:sz w:val="22"/>
-          <w:szCs w:val="22"/>
-        </w:rPr>
-        <w:t xml:space="preserve">trắng = trống</w:t>
-      </w:r>
-      <w:r>
-        <w:rPr>
-          <w:rFonts w:ascii="Arial" w:cs="Arial" w:eastAsia="Arial" w:hAnsi="Arial"/>
-          <w:color w:val="1B1B1B"/>
-          <w:sz w:val="22"/>
-          <w:szCs w:val="22"/>
-        </w:rPr>
-        <w:t xml:space="preserve"> (tia laser đi qua không chạm gì), </w:t>
-      </w:r>
-      <w:r>
-        <w:rPr>
-          <w:rFonts w:ascii="Arial" w:cs="Arial" w:eastAsia="Arial" w:hAnsi="Arial"/>
-          <w:b/>
-          <w:bCs/>
-          <w:color w:val="24405C"/>
-          <w:sz w:val="22"/>
-          <w:szCs w:val="22"/>
-        </w:rPr>
-        <w:t xml:space="preserve">xám = chưa biết</w:t>
-      </w:r>
-      <w:r>
-        <w:rPr>
-          <w:rFonts w:ascii="Arial" w:cs="Arial" w:eastAsia="Arial" w:hAnsi="Arial"/>
-          <w:color w:val="1B1B1B"/>
-          <w:sz w:val="22"/>
-          <w:szCs w:val="22"/>
-        </w:rPr>
-        <w:t xml:space="preserve"> (bị che, không bắn tới).</w:t>
-      </w:r>
-    </w:p>
-    <w:p>
-      <w:pPr>
-        <w:pStyle w:val="ListParagraph"/>
-        <w:widowControl/>
-        <w:numPr>
-          <w:ilvl w:val="0"/>
-          <w:numId w:val="3"/>
-        </w:numPr>
-        <w:spacing w:after="80" w:line="320"/>
-      </w:pPr>
-      <w:r>
-        <w:rPr>
-          <w:rFonts w:ascii="Arial" w:cs="Arial" w:eastAsia="Arial" w:hAnsi="Arial"/>
-          <w:color w:val="1B1B1B"/>
-          <w:sz w:val="22"/>
-          <w:szCs w:val="22"/>
-        </w:rPr>
-        <w:t xml:space="preserve">Lợi lớn nhất: </w:t>
-      </w:r>
-      <w:r>
-        <w:rPr>
-          <w:rFonts w:ascii="Arial" w:cs="Arial" w:eastAsia="Arial" w:hAnsi="Arial"/>
-          <w:b/>
-          <w:bCs/>
-          <w:color w:val="24405C"/>
-          <w:sz w:val="22"/>
-          <w:szCs w:val="22"/>
-        </w:rPr>
-        <w:t xml:space="preserve">không cần biết là gì</w:t>
-      </w:r>
-      <w:r>
-        <w:rPr>
-          <w:rFonts w:ascii="Arial" w:cs="Arial" w:eastAsia="Arial" w:hAnsi="Arial"/>
-          <w:color w:val="1B1B1B"/>
-          <w:sz w:val="22"/>
-          <w:szCs w:val="22"/>
-        </w:rPr>
-        <w:t xml:space="preserve">. Hàng rơi trên đường, chướng ngại lạ, bộ phát hiện không nhận ra nhưng lưới vẫn tô đỏ. Cẩn thận: «chưa biết» không phải «trống».</w:t>
-      </w:r>
-    </w:p>
-    <w:p>
-      <w:pPr>
-        <w:pStyle w:val="Heading1"/>
-        <w:keepNext/>
-        <w:pageBreakBefore/>
-        <w:spacing w:after="240" w:before="160"/>
-      </w:pPr>
-      <w:r>
-        <w:rPr>
-          <w:rFonts w:ascii="Arial" w:cs="Arial" w:eastAsia="Arial" w:hAnsi="Arial"/>
-          <w:b/>
-          <w:bCs/>
-          <w:color w:val="24405C"/>
-          <w:sz w:val="30"/>
-          <w:szCs w:val="30"/>
-        </w:rPr>
-        <w:t xml:space="preserve">3. Gán nhãn dữ liệu: chuẩn bị đáp án cho máy tính</w:t>
-      </w:r>
-    </w:p>
-    <w:p>
-      <w:pPr>
-        <w:widowControl/>
-        <w:spacing w:after="100" w:before="0" w:line="312"/>
-        <w:ind w:left="0" w:firstLine="0"/>
-      </w:pPr>
-      <w:r>
-        <w:rPr>
-          <w:rFonts w:ascii="Arial" w:cs="Arial" w:eastAsia="Arial" w:hAnsi="Arial"/>
-          <w:color w:val="1B1B1B"/>
-          <w:sz w:val="22"/>
-          <w:szCs w:val="22"/>
-        </w:rPr>
-        <w:t xml:space="preserve">Dữ liệu gán nhãn là sách giáo khoa của mô hình. Ba tình huống làm mô hình học sai: </w:t>
-      </w:r>
-      <w:r>
-        <w:rPr>
-          <w:rFonts w:ascii="Arial" w:cs="Arial" w:eastAsia="Arial" w:hAnsi="Arial"/>
-          <w:b/>
-          <w:bCs/>
-          <w:color w:val="24405C"/>
-          <w:sz w:val="22"/>
-          <w:szCs w:val="22"/>
-        </w:rPr>
-        <w:t xml:space="preserve">thiếu nhãn</w:t>
-      </w:r>
-      <w:r>
-        <w:rPr>
-          <w:rFonts w:ascii="Arial" w:cs="Arial" w:eastAsia="Arial" w:hAnsi="Arial"/>
-          <w:color w:val="1B1B1B"/>
-          <w:sz w:val="22"/>
-          <w:szCs w:val="22"/>
-        </w:rPr>
-        <w:t xml:space="preserve"> (có người mà không khoanh, mô hình học «trông thế này không phải người»), </w:t>
-      </w:r>
-      <w:r>
-        <w:rPr>
-          <w:rFonts w:ascii="Arial" w:cs="Arial" w:eastAsia="Arial" w:hAnsi="Arial"/>
-          <w:b/>
-          <w:bCs/>
-          <w:color w:val="24405C"/>
-          <w:sz w:val="22"/>
-          <w:szCs w:val="22"/>
-        </w:rPr>
-        <w:t xml:space="preserve">sai loại</w:t>
-      </w:r>
-      <w:r>
-        <w:rPr>
-          <w:rFonts w:ascii="Arial" w:cs="Arial" w:eastAsia="Arial" w:hAnsi="Arial"/>
-          <w:color w:val="1B1B1B"/>
-          <w:sz w:val="22"/>
-          <w:szCs w:val="22"/>
-        </w:rPr>
-        <w:t xml:space="preserve"> (xe máy thành xe đạp), </w:t>
-      </w:r>
-      <w:r>
-        <w:rPr>
-          <w:rFonts w:ascii="Arial" w:cs="Arial" w:eastAsia="Arial" w:hAnsi="Arial"/>
-          <w:b/>
-          <w:bCs/>
-          <w:color w:val="24405C"/>
-          <w:sz w:val="22"/>
-          <w:szCs w:val="22"/>
-        </w:rPr>
-        <w:t xml:space="preserve">mỗi người một kiểu</w:t>
-      </w:r>
-      <w:r>
-        <w:rPr>
-          <w:rFonts w:ascii="Arial" w:cs="Arial" w:eastAsia="Arial" w:hAnsi="Arial"/>
-          <w:color w:val="1B1B1B"/>
-          <w:sz w:val="22"/>
-          <w:szCs w:val="22"/>
-        </w:rPr>
-        <w:t xml:space="preserve"> (người khoanh chung người lái với xe máy, người khoanh riêng). Vì vậy gán nhãn chính thức luôn có bộ quy tắc, mọi người theo cùng một bộ, và có kiểm tra.</w:t>
-      </w:r>
-    </w:p>
-    <w:p>
-      <w:pPr>
-        <w:keepNext/>
-        <w:spacing w:after="70" w:before="190"/>
-      </w:pPr>
-      <w:r>
-        <w:rPr>
-          <w:rFonts w:ascii="Arial" w:cs="Arial" w:eastAsia="Arial" w:hAnsi="Arial"/>
-          <w:b/>
-          <w:bCs/>
-          <w:color w:val="24405C"/>
-          <w:sz w:val="19"/>
-          <w:szCs w:val="19"/>
-        </w:rPr>
-        <w:t xml:space="preserve">Bảng 4. nuScenes đã gán nhãn bao nhiêu</w:t>
-      </w:r>
-    </w:p>
-    <w:tbl>
-      <w:tblPr>
-        <w:tblW w:type="dxa" w:w="9360"/>
-        <w:tblBorders>
-          <w:top w:val="single" w:color="8A949C" w:sz="8"/>
-          <w:left w:val="none"/>
-          <w:bottom w:val="single" w:color="8A949C" w:sz="8"/>
-          <w:right w:val="none"/>
-          <w:insideH w:val="single" w:color="BFC7CE" w:sz="2"/>
-          <w:insideV w:val="none"/>
-        </w:tblBorders>
-      </w:tblPr>
-      <w:tblGrid>
-        <w:gridCol w:w="3000"/>
-        <w:gridCol w:w="6360"/>
-      </w:tblGrid>
-      <w:tr>
-        <w:trPr>
-          <w:cantSplit/>
-          <w:tblHeader/>
-        </w:trPr>
-        <w:tc>
-          <w:tcPr>
-            <w:tcW w:type="dxa" w:w="3000"/>
-            <w:shd w:fill="EDF0F3" w:color="auto" w:val="clear"/>
-            <w:tcMar>
-              <w:top w:type="dxa" w:w="60"/>
-              <w:left w:type="dxa" w:w="95"/>
-              <w:bottom w:type="dxa" w:w="60"/>
-              <w:right w:type="dxa" w:w="95"/>
-            </w:tcMar>
-            <w:vAlign w:val="center"/>
-          </w:tcPr>
-          <w:p>
-            <w:pPr>
-              <w:spacing w:after="0" w:line="265"/>
-            </w:pPr>
-            <w:r>
-              <w:rPr>
-                <w:rFonts w:ascii="Arial" w:cs="Arial" w:eastAsia="Arial" w:hAnsi="Arial"/>
-                <w:b/>
-                <w:bCs/>
-                <w:color w:val="1B1B1B"/>
-                <w:sz w:val="18"/>
-                <w:szCs w:val="18"/>
-              </w:rPr>
-              <w:t xml:space="preserve">Hạng mục</w:t>
-            </w:r>
-          </w:p>
-        </w:tc>
-        <w:tc>
-          <w:tcPr>
-            <w:tcW w:type="dxa" w:w="6360"/>
-            <w:shd w:fill="EDF0F3" w:color="auto" w:val="clear"/>
-            <w:tcMar>
-              <w:top w:type="dxa" w:w="60"/>
-              <w:left w:type="dxa" w:w="95"/>
-              <w:bottom w:type="dxa" w:w="60"/>
-              <w:right w:type="dxa" w:w="95"/>
-            </w:tcMar>
-            <w:vAlign w:val="center"/>
-          </w:tcPr>
-          <w:p>
-            <w:pPr>
-              <w:spacing w:after="0" w:line="265"/>
-            </w:pPr>
-            <w:r>
-              <w:rPr>
-                <w:rFonts w:ascii="Arial" w:cs="Arial" w:eastAsia="Arial" w:hAnsi="Arial"/>
-                <w:b/>
-                <w:bCs/>
-                <w:color w:val="1B1B1B"/>
-                <w:sz w:val="18"/>
-                <w:szCs w:val="18"/>
-              </w:rPr>
-              <w:t xml:space="preserve">Con số</w:t>
-            </w:r>
-          </w:p>
-        </w:tc>
-      </w:tr>
-      <w:tr>
-        <w:trPr>
-          <w:cantSplit/>
-          <w:tblHeader w:val="false"/>
-        </w:trPr>
-        <w:tc>
-          <w:tcPr>
-            <w:tcW w:type="dxa" w:w="3000"/>
-            <w:tcMar>
-              <w:top w:type="dxa" w:w="60"/>
-              <w:left w:type="dxa" w:w="95"/>
-              <w:bottom w:type="dxa" w:w="60"/>
-              <w:right w:type="dxa" w:w="95"/>
-            </w:tcMar>
-            <w:vAlign w:val="center"/>
-          </w:tcPr>
-          <w:p>
-            <w:pPr>
-              <w:spacing w:after="0" w:line="265"/>
-            </w:pPr>
-            <w:r>
-              <w:rPr>
-                <w:rFonts w:ascii="Arial" w:cs="Arial" w:eastAsia="Arial" w:hAnsi="Arial"/>
-                <w:b w:val="false"/>
-                <w:bCs w:val="false"/>
-                <w:color w:val="1B1B1B"/>
-                <w:sz w:val="18"/>
-                <w:szCs w:val="18"/>
-              </w:rPr>
-              <w:t xml:space="preserve">Khung hình chính</w:t>
-            </w:r>
-          </w:p>
-        </w:tc>
-        <w:tc>
-          <w:tcPr>
-            <w:tcW w:type="dxa" w:w="6360"/>
-            <w:tcMar>
-              <w:top w:type="dxa" w:w="60"/>
-              <w:left w:type="dxa" w:w="95"/>
-              <w:bottom w:type="dxa" w:w="60"/>
-              <w:right w:type="dxa" w:w="95"/>
-            </w:tcMar>
-            <w:vAlign w:val="center"/>
-          </w:tcPr>
-          <w:p>
-            <w:pPr>
-              <w:spacing w:after="0" w:line="265"/>
-            </w:pPr>
-            <w:r>
-              <w:rPr>
-                <w:rFonts w:ascii="Arial" w:cs="Arial" w:eastAsia="Arial" w:hAnsi="Arial"/>
-                <w:b w:val="false"/>
-                <w:bCs w:val="false"/>
-                <w:color w:val="1B1B1B"/>
-                <w:sz w:val="18"/>
-                <w:szCs w:val="18"/>
-              </w:rPr>
-              <w:t xml:space="preserve">40.000 (1000 cảnh × 20 giây, mỗi 0,5 giây một lần)</w:t>
-            </w:r>
-          </w:p>
-        </w:tc>
-      </w:tr>
-      <w:tr>
-        <w:trPr>
-          <w:cantSplit/>
-          <w:tblHeader w:val="false"/>
-        </w:trPr>
-        <w:tc>
-          <w:tcPr>
-            <w:tcW w:type="dxa" w:w="3000"/>
-            <w:tcMar>
-              <w:top w:type="dxa" w:w="60"/>
-              <w:left w:type="dxa" w:w="95"/>
-              <w:bottom w:type="dxa" w:w="60"/>
-              <w:right w:type="dxa" w:w="95"/>
-            </w:tcMar>
-            <w:vAlign w:val="center"/>
-          </w:tcPr>
-          <w:p>
-            <w:pPr>
-              <w:spacing w:after="0" w:line="265"/>
-            </w:pPr>
-            <w:r>
-              <w:rPr>
-                <w:rFonts w:ascii="Arial" w:cs="Arial" w:eastAsia="Arial" w:hAnsi="Arial"/>
-                <w:b w:val="false"/>
-                <w:bCs w:val="false"/>
-                <w:color w:val="1B1B1B"/>
-                <w:sz w:val="18"/>
-                <w:szCs w:val="18"/>
-              </w:rPr>
-              <w:t xml:space="preserve">Khung 3D</w:t>
-            </w:r>
-          </w:p>
-        </w:tc>
-        <w:tc>
-          <w:tcPr>
-            <w:tcW w:type="dxa" w:w="6360"/>
-            <w:tcMar>
-              <w:top w:type="dxa" w:w="60"/>
-              <w:left w:type="dxa" w:w="95"/>
-              <w:bottom w:type="dxa" w:w="60"/>
-              <w:right w:type="dxa" w:w="95"/>
-            </w:tcMar>
-            <w:vAlign w:val="center"/>
-          </w:tcPr>
-          <w:p>
-            <w:pPr>
-              <w:spacing w:after="0" w:line="265"/>
-            </w:pPr>
-            <w:r>
-              <w:rPr>
-                <w:rFonts w:ascii="Arial" w:cs="Arial" w:eastAsia="Arial" w:hAnsi="Arial"/>
-                <w:b w:val="false"/>
-                <w:bCs w:val="false"/>
-                <w:color w:val="1B1B1B"/>
-                <w:sz w:val="18"/>
-                <w:szCs w:val="18"/>
-              </w:rPr>
-              <w:t xml:space="preserve">1,4 triệu, người gán từng cái</w:t>
-            </w:r>
-          </w:p>
-        </w:tc>
-      </w:tr>
-      <w:tr>
-        <w:trPr>
-          <w:cantSplit/>
-          <w:tblHeader w:val="false"/>
-        </w:trPr>
-        <w:tc>
-          <w:tcPr>
-            <w:tcW w:type="dxa" w:w="3000"/>
-            <w:tcMar>
-              <w:top w:type="dxa" w:w="60"/>
-              <w:left w:type="dxa" w:w="95"/>
-              <w:bottom w:type="dxa" w:w="60"/>
-              <w:right w:type="dxa" w:w="95"/>
-            </w:tcMar>
-            <w:vAlign w:val="center"/>
-          </w:tcPr>
-          <w:p>
-            <w:pPr>
-              <w:spacing w:after="0" w:line="265"/>
-            </w:pPr>
-            <w:r>
-              <w:rPr>
-                <w:rFonts w:ascii="Arial" w:cs="Arial" w:eastAsia="Arial" w:hAnsi="Arial"/>
-                <w:b w:val="false"/>
-                <w:bCs w:val="false"/>
-                <w:color w:val="1B1B1B"/>
-                <w:sz w:val="18"/>
-                <w:szCs w:val="18"/>
-              </w:rPr>
-              <w:t xml:space="preserve">Loại</w:t>
-            </w:r>
-          </w:p>
-        </w:tc>
-        <w:tc>
-          <w:tcPr>
-            <w:tcW w:type="dxa" w:w="6360"/>
-            <w:tcMar>
-              <w:top w:type="dxa" w:w="60"/>
-              <w:left w:type="dxa" w:w="95"/>
-              <w:bottom w:type="dxa" w:w="60"/>
-              <w:right w:type="dxa" w:w="95"/>
-            </w:tcMar>
-            <w:vAlign w:val="center"/>
-          </w:tcPr>
-          <w:p>
-            <w:pPr>
-              <w:spacing w:after="0" w:line="265"/>
-            </w:pPr>
-            <w:r>
-              <w:rPr>
-                <w:rFonts w:ascii="Arial" w:cs="Arial" w:eastAsia="Arial" w:hAnsi="Arial"/>
-                <w:b w:val="false"/>
-                <w:bCs w:val="false"/>
-                <w:color w:val="1B1B1B"/>
-                <w:sz w:val="18"/>
-                <w:szCs w:val="18"/>
-              </w:rPr>
-              <w:t xml:space="preserve">23 loại (người lớn, trẻ em, ô tô, xe buýt, xe máy, cọc tiêu…)</w:t>
-            </w:r>
-          </w:p>
-        </w:tc>
-      </w:tr>
-      <w:tr>
-        <w:trPr>
-          <w:cantSplit/>
-          <w:tblHeader w:val="false"/>
-        </w:trPr>
-        <w:tc>
-          <w:tcPr>
-            <w:tcW w:type="dxa" w:w="3000"/>
-            <w:tcMar>
-              <w:top w:type="dxa" w:w="60"/>
-              <w:left w:type="dxa" w:w="95"/>
-              <w:bottom w:type="dxa" w:w="60"/>
-              <w:right w:type="dxa" w:w="95"/>
-            </w:tcMar>
-            <w:vAlign w:val="center"/>
-          </w:tcPr>
-          <w:p>
-            <w:pPr>
-              <w:spacing w:after="0" w:line="265"/>
-            </w:pPr>
-            <w:r>
-              <w:rPr>
-                <w:rFonts w:ascii="Arial" w:cs="Arial" w:eastAsia="Arial" w:hAnsi="Arial"/>
-                <w:b w:val="false"/>
-                <w:bCs w:val="false"/>
-                <w:color w:val="1B1B1B"/>
-                <w:sz w:val="18"/>
-                <w:szCs w:val="18"/>
-              </w:rPr>
-              <w:t xml:space="preserve">Bản mini: ô tô và xe máy</w:t>
-            </w:r>
-          </w:p>
-        </w:tc>
-        <w:tc>
-          <w:tcPr>
-            <w:tcW w:type="dxa" w:w="6360"/>
-            <w:tcMar>
-              <w:top w:type="dxa" w:w="60"/>
-              <w:left w:type="dxa" w:w="95"/>
-              <w:bottom w:type="dxa" w:w="60"/>
-              <w:right w:type="dxa" w:w="95"/>
-            </w:tcMar>
-            <w:vAlign w:val="center"/>
-          </w:tcPr>
-          <w:p>
-            <w:pPr>
-              <w:spacing w:after="0" w:line="265"/>
-            </w:pPr>
-            <w:r>
-              <w:rPr>
-                <w:rFonts w:ascii="Arial" w:cs="Arial" w:eastAsia="Arial" w:hAnsi="Arial"/>
-                <w:b w:val="false"/>
-                <w:bCs w:val="false"/>
-                <w:color w:val="1B1B1B"/>
-                <w:sz w:val="18"/>
-                <w:szCs w:val="18"/>
-              </w:rPr>
-              <w:t xml:space="preserve">7.619 khung và 471 khung: xe máy ít hơn 16 lần</w:t>
-            </w:r>
-          </w:p>
-        </w:tc>
-      </w:tr>
-    </w:tbl>
-    <w:p>
-      <w:pPr>
-        <w:spacing w:after="0"/>
-      </w:pPr>
-      <w:r>
-        <w:rPr>
-          <w:rFonts w:ascii="Arial" w:cs="Arial" w:eastAsia="Arial" w:hAnsi="Arial"/>
-          <w:color w:val="1B1B1B"/>
-          <w:sz w:val="22"/>
-          <w:szCs w:val="22"/>
-        </w:rPr>
-        <w:t xml:space="preserve"/>
+          <w:sz w:val="24"/>
+          <w:szCs w:val="24"/>
+        </w:rPr>
+        <w:t xml:space="preserve">Nhìn từ trên xuống: bản đồ từ trên và lưới chiếm chỗ</w:t>
       </w:r>
     </w:p>
     <w:p>
@@ -5600,7 +5038,7 @@
       <w:r>
         <w:drawing>
           <wp:inline distT="0" distB="0" distL="0" distR="0">
-            <wp:extent cx="4572000" cy="2638425"/>
+            <wp:extent cx="5905500" cy="3333750"/>
             <wp:effectExtent t="0" r="0" b="0" l="0"/>
             <wp:docPr id="1" name="" descr="" title=""/>
             <wp:cNvGraphicFramePr>
@@ -5625,7 +5063,7 @@
                   <pic:spPr bwMode="auto">
                     <a:xfrm>
                       <a:off x="0" y="0"/>
-                      <a:ext cx="4572000" cy="2638425"/>
+                      <a:ext cx="5905500" cy="3333750"/>
                     </a:xfrm>
                     <a:prstGeom prst="rect">
                       <a:avLst/>
@@ -5652,7 +5090,302 @@
           <w:sz w:val="19"/>
           <w:szCs w:val="19"/>
         </w:rPr>
-        <w:t xml:space="preserve">Số khung mỗi loại trong nuScenes mini (tuần 7). Đường Boston, Singapore ít xe máy nên sách này dạy rất ít về xe máy. Dữ liệu: nuScenes (Motional), CC BY-NC-SA 4.0</w:t>
+        <w:t xml:space="preserve">Trái: bản đồ từ trên, điểm lidar + khung 3D; phải: lưới chiếm chỗ tính từ cùng khung lidar (ô 0,5 m). scene-0103 (Boston). Dữ liệu: nuScenes (Motional), CC BY-NC-SA 4.0</w:t>
+      </w:r>
+    </w:p>
+    <w:p>
+      <w:pPr>
+        <w:pStyle w:val="ListParagraph"/>
+        <w:widowControl/>
+        <w:numPr>
+          <w:ilvl w:val="0"/>
+          <w:numId w:val="3"/>
+        </w:numPr>
+        <w:spacing w:after="80" w:line="320"/>
+      </w:pPr>
+      <w:r>
+        <w:rPr>
+          <w:rFonts w:ascii="Arial" w:cs="Arial" w:eastAsia="Arial" w:hAnsi="Arial"/>
+          <w:color w:val="1B1B1B"/>
+          <w:sz w:val="22"/>
+          <w:szCs w:val="22"/>
+        </w:rPr>
+        <w:t xml:space="preserve">Ba cái lợi của bản đồ từ trên: các vật </w:t>
+      </w:r>
+      <w:r>
+        <w:rPr>
+          <w:rFonts w:ascii="Arial" w:cs="Arial" w:eastAsia="Arial" w:hAnsi="Arial"/>
+          <w:b/>
+          <w:bCs/>
+          <w:color w:val="24405C"/>
+          <w:sz w:val="22"/>
+          <w:szCs w:val="22"/>
+        </w:rPr>
+        <w:t xml:space="preserve">không che nhau</w:t>
+      </w:r>
+      <w:r>
+        <w:rPr>
+          <w:rFonts w:ascii="Arial" w:cs="Arial" w:eastAsia="Arial" w:hAnsi="Arial"/>
+          <w:color w:val="1B1B1B"/>
+          <w:sz w:val="22"/>
+          <w:szCs w:val="22"/>
+        </w:rPr>
+        <w:t xml:space="preserve">; </w:t>
+      </w:r>
+      <w:r>
+        <w:rPr>
+          <w:rFonts w:ascii="Arial" w:cs="Arial" w:eastAsia="Arial" w:hAnsi="Arial"/>
+          <w:b/>
+          <w:bCs/>
+          <w:color w:val="24405C"/>
+          <w:sz w:val="22"/>
+          <w:szCs w:val="22"/>
+        </w:rPr>
+        <w:t xml:space="preserve">khoảng cách không méo</w:t>
+      </w:r>
+      <w:r>
+        <w:rPr>
+          <w:rFonts w:ascii="Arial" w:cs="Arial" w:eastAsia="Arial" w:hAnsi="Arial"/>
+          <w:color w:val="1B1B1B"/>
+          <w:sz w:val="22"/>
+          <w:szCs w:val="22"/>
+        </w:rPr>
+        <w:t xml:space="preserve">; lái xe vốn là quyết định </w:t>
+      </w:r>
+      <w:r>
+        <w:rPr>
+          <w:rFonts w:ascii="Arial" w:cs="Arial" w:eastAsia="Arial" w:hAnsi="Arial"/>
+          <w:b/>
+          <w:bCs/>
+          <w:color w:val="24405C"/>
+          <w:sz w:val="22"/>
+          <w:szCs w:val="22"/>
+        </w:rPr>
+        <w:t xml:space="preserve">trên mặt đất</w:t>
+      </w:r>
+      <w:r>
+        <w:rPr>
+          <w:rFonts w:ascii="Arial" w:cs="Arial" w:eastAsia="Arial" w:hAnsi="Arial"/>
+          <w:color w:val="1B1B1B"/>
+          <w:sz w:val="22"/>
+          <w:szCs w:val="22"/>
+        </w:rPr>
+        <w:t xml:space="preserve">. Ghép giữa ở tuần 7 là cùng vẽ thành một bản đồ từ trên.</w:t>
+      </w:r>
+    </w:p>
+    <w:p>
+      <w:pPr>
+        <w:pStyle w:val="ListParagraph"/>
+        <w:widowControl/>
+        <w:numPr>
+          <w:ilvl w:val="0"/>
+          <w:numId w:val="3"/>
+        </w:numPr>
+        <w:spacing w:after="80" w:line="320"/>
+      </w:pPr>
+      <w:r>
+        <w:rPr>
+          <w:rFonts w:ascii="Arial" w:cs="Arial" w:eastAsia="Arial" w:hAnsi="Arial"/>
+          <w:color w:val="1B1B1B"/>
+          <w:sz w:val="22"/>
+          <w:szCs w:val="22"/>
+        </w:rPr>
+        <w:t xml:space="preserve">Lưới chiếm chỗ: mỗi ô chỉ hỏi một việc. </w:t>
+      </w:r>
+      <w:r>
+        <w:rPr>
+          <w:rFonts w:ascii="Arial" w:cs="Arial" w:eastAsia="Arial" w:hAnsi="Arial"/>
+          <w:b/>
+          <w:bCs/>
+          <w:color w:val="24405C"/>
+          <w:sz w:val="22"/>
+          <w:szCs w:val="22"/>
+        </w:rPr>
+        <w:t xml:space="preserve">Đỏ = có vật</w:t>
+      </w:r>
+      <w:r>
+        <w:rPr>
+          <w:rFonts w:ascii="Arial" w:cs="Arial" w:eastAsia="Arial" w:hAnsi="Arial"/>
+          <w:color w:val="1B1B1B"/>
+          <w:sz w:val="22"/>
+          <w:szCs w:val="22"/>
+        </w:rPr>
+        <w:t xml:space="preserve">, </w:t>
+      </w:r>
+      <w:r>
+        <w:rPr>
+          <w:rFonts w:ascii="Arial" w:cs="Arial" w:eastAsia="Arial" w:hAnsi="Arial"/>
+          <w:b/>
+          <w:bCs/>
+          <w:color w:val="24405C"/>
+          <w:sz w:val="22"/>
+          <w:szCs w:val="22"/>
+        </w:rPr>
+        <w:t xml:space="preserve">trắng = trống</w:t>
+      </w:r>
+      <w:r>
+        <w:rPr>
+          <w:rFonts w:ascii="Arial" w:cs="Arial" w:eastAsia="Arial" w:hAnsi="Arial"/>
+          <w:color w:val="1B1B1B"/>
+          <w:sz w:val="22"/>
+          <w:szCs w:val="22"/>
+        </w:rPr>
+        <w:t xml:space="preserve"> (tia laser đi qua không chạm gì), </w:t>
+      </w:r>
+      <w:r>
+        <w:rPr>
+          <w:rFonts w:ascii="Arial" w:cs="Arial" w:eastAsia="Arial" w:hAnsi="Arial"/>
+          <w:b/>
+          <w:bCs/>
+          <w:color w:val="24405C"/>
+          <w:sz w:val="22"/>
+          <w:szCs w:val="22"/>
+        </w:rPr>
+        <w:t xml:space="preserve">xám = chưa biết</w:t>
+      </w:r>
+      <w:r>
+        <w:rPr>
+          <w:rFonts w:ascii="Arial" w:cs="Arial" w:eastAsia="Arial" w:hAnsi="Arial"/>
+          <w:color w:val="1B1B1B"/>
+          <w:sz w:val="22"/>
+          <w:szCs w:val="22"/>
+        </w:rPr>
+        <w:t xml:space="preserve"> (bị che, không bắn tới).</w:t>
+      </w:r>
+    </w:p>
+    <w:p>
+      <w:pPr>
+        <w:pStyle w:val="ListParagraph"/>
+        <w:widowControl/>
+        <w:numPr>
+          <w:ilvl w:val="0"/>
+          <w:numId w:val="3"/>
+        </w:numPr>
+        <w:spacing w:after="80" w:line="320"/>
+      </w:pPr>
+      <w:r>
+        <w:rPr>
+          <w:rFonts w:ascii="Arial" w:cs="Arial" w:eastAsia="Arial" w:hAnsi="Arial"/>
+          <w:color w:val="1B1B1B"/>
+          <w:sz w:val="22"/>
+          <w:szCs w:val="22"/>
+        </w:rPr>
+        <w:t xml:space="preserve">Lợi lớn nhất: </w:t>
+      </w:r>
+      <w:r>
+        <w:rPr>
+          <w:rFonts w:ascii="Arial" w:cs="Arial" w:eastAsia="Arial" w:hAnsi="Arial"/>
+          <w:b/>
+          <w:bCs/>
+          <w:color w:val="24405C"/>
+          <w:sz w:val="22"/>
+          <w:szCs w:val="22"/>
+        </w:rPr>
+        <w:t xml:space="preserve">không cần biết là gì</w:t>
+      </w:r>
+      <w:r>
+        <w:rPr>
+          <w:rFonts w:ascii="Arial" w:cs="Arial" w:eastAsia="Arial" w:hAnsi="Arial"/>
+          <w:color w:val="1B1B1B"/>
+          <w:sz w:val="22"/>
+          <w:szCs w:val="22"/>
+        </w:rPr>
+        <w:t xml:space="preserve">. Hàng rơi trên đường, chướng ngại lạ, bộ phát hiện không nhận ra nhưng lưới vẫn tô đỏ. Cẩn thận: «chưa biết» không phải «trống».</w:t>
+      </w:r>
+    </w:p>
+    <w:p>
+      <w:pPr>
+        <w:pStyle w:val="Heading1"/>
+        <w:keepNext/>
+        <w:pageBreakBefore/>
+        <w:spacing w:after="240" w:before="160"/>
+      </w:pPr>
+      <w:r>
+        <w:rPr>
+          <w:rFonts w:ascii="Arial" w:cs="Arial" w:eastAsia="Arial" w:hAnsi="Arial"/>
+          <w:b/>
+          <w:bCs/>
+          <w:color w:val="24405C"/>
+          <w:sz w:val="30"/>
+          <w:szCs w:val="30"/>
+        </w:rPr>
+        <w:t xml:space="preserve">3. Gán nhãn dữ liệu: chuẩn bị đáp án cho máy tính</w:t>
+      </w:r>
+    </w:p>
+    <w:p>
+      <w:pPr>
+        <w:widowControl/>
+        <w:spacing w:after="100" w:before="0" w:line="312"/>
+        <w:ind w:left="0" w:firstLine="0"/>
+      </w:pPr>
+      <w:r>
+        <w:rPr>
+          <w:rFonts w:ascii="Arial" w:cs="Arial" w:eastAsia="Arial" w:hAnsi="Arial"/>
+          <w:color w:val="1B1B1B"/>
+          <w:sz w:val="22"/>
+          <w:szCs w:val="22"/>
+        </w:rPr>
+        <w:t xml:space="preserve">Dữ liệu gán nhãn là sách giáo khoa của mô hình. Ba tình huống làm mô hình học sai: </w:t>
+      </w:r>
+      <w:r>
+        <w:rPr>
+          <w:rFonts w:ascii="Arial" w:cs="Arial" w:eastAsia="Arial" w:hAnsi="Arial"/>
+          <w:b/>
+          <w:bCs/>
+          <w:color w:val="24405C"/>
+          <w:sz w:val="22"/>
+          <w:szCs w:val="22"/>
+        </w:rPr>
+        <w:t xml:space="preserve">thiếu nhãn</w:t>
+      </w:r>
+      <w:r>
+        <w:rPr>
+          <w:rFonts w:ascii="Arial" w:cs="Arial" w:eastAsia="Arial" w:hAnsi="Arial"/>
+          <w:color w:val="1B1B1B"/>
+          <w:sz w:val="22"/>
+          <w:szCs w:val="22"/>
+        </w:rPr>
+        <w:t xml:space="preserve"> (có người mà không khoanh, mô hình học «trông thế này không phải người»), </w:t>
+      </w:r>
+      <w:r>
+        <w:rPr>
+          <w:rFonts w:ascii="Arial" w:cs="Arial" w:eastAsia="Arial" w:hAnsi="Arial"/>
+          <w:b/>
+          <w:bCs/>
+          <w:color w:val="24405C"/>
+          <w:sz w:val="22"/>
+          <w:szCs w:val="22"/>
+        </w:rPr>
+        <w:t xml:space="preserve">sai loại</w:t>
+      </w:r>
+      <w:r>
+        <w:rPr>
+          <w:rFonts w:ascii="Arial" w:cs="Arial" w:eastAsia="Arial" w:hAnsi="Arial"/>
+          <w:color w:val="1B1B1B"/>
+          <w:sz w:val="22"/>
+          <w:szCs w:val="22"/>
+        </w:rPr>
+        <w:t xml:space="preserve"> (xe máy thành xe đạp), </w:t>
+      </w:r>
+      <w:r>
+        <w:rPr>
+          <w:rFonts w:ascii="Arial" w:cs="Arial" w:eastAsia="Arial" w:hAnsi="Arial"/>
+          <w:b/>
+          <w:bCs/>
+          <w:color w:val="24405C"/>
+          <w:sz w:val="22"/>
+          <w:szCs w:val="22"/>
+        </w:rPr>
+        <w:t xml:space="preserve">mỗi người một kiểu</w:t>
+      </w:r>
+      <w:r>
+        <w:rPr>
+          <w:rFonts w:ascii="Arial" w:cs="Arial" w:eastAsia="Arial" w:hAnsi="Arial"/>
+          <w:color w:val="1B1B1B"/>
+          <w:sz w:val="22"/>
+          <w:szCs w:val="22"/>
+        </w:rPr>
+        <w:t xml:space="preserve"> (người khoanh chung người lái với xe máy, người khoanh riêng). Vì vậy gán nhãn chính thức luôn có bộ quy tắc, mọi người theo cùng một bộ, và có kiểm tra.</w:t>
       </w:r>
     </w:p>
     <w:p>
@@ -5669,7 +5402,7 @@
           <w:sz w:val="19"/>
           <w:szCs w:val="19"/>
         </w:rPr>
-        <w:t xml:space="preserve">Bảng 5. Quy tắc gán nhãn chính thức của nuScenes (trích, nguyên văn từ instructions_nuscenes.md)</w:t>
+        <w:t xml:space="preserve">Bảng 4. nuScenes đã gán nhãn bao nhiêu</w:t>
       </w:r>
     </w:p>
     <w:tbl>
@@ -5685,9 +5418,8 @@
         </w:tblBorders>
       </w:tblPr>
       <w:tblGrid>
-        <w:gridCol w:w="2900"/>
-        <w:gridCol w:w="3600"/>
-        <w:gridCol w:w="2860"/>
+        <w:gridCol w:w="3000"/>
+        <w:gridCol w:w="6360"/>
       </w:tblGrid>
       <w:tr>
         <w:trPr>
@@ -5696,7 +5428,7 @@
         </w:trPr>
         <w:tc>
           <w:tcPr>
-            <w:tcW w:type="dxa" w:w="2900"/>
+            <w:tcW w:type="dxa" w:w="3000"/>
             <w:shd w:fill="EDF0F3" w:color="auto" w:val="clear"/>
             <w:tcMar>
               <w:top w:type="dxa" w:w="60"/>
@@ -5719,13 +5451,13 @@
                 <w:sz w:val="18"/>
                 <w:szCs w:val="18"/>
               </w:rPr>
-              <w:t xml:space="preserve">Quy tắc</w:t>
-            </w:r>
-          </w:p>
-        </w:tc>
-        <w:tc>
-          <w:tcPr>
-            <w:tcW w:type="dxa" w:w="3600"/>
+              <w:t xml:space="preserve">Hạng mục</w:t>
+            </w:r>
+          </w:p>
+        </w:tc>
+        <w:tc>
+          <w:tcPr>
+            <w:tcW w:type="dxa" w:w="6360"/>
             <w:shd w:fill="EDF0F3" w:color="auto" w:val="clear"/>
             <w:tcMar>
               <w:top w:type="dxa" w:w="60"/>
@@ -5748,36 +5480,7 @@
                 <w:sz w:val="18"/>
                 <w:szCs w:val="18"/>
               </w:rPr>
-              <w:t xml:space="preserve">Nguyên văn</w:t>
-            </w:r>
-          </w:p>
-        </w:tc>
-        <w:tc>
-          <w:tcPr>
-            <w:tcW w:type="dxa" w:w="2860"/>
-            <w:shd w:fill="EDF0F3" w:color="auto" w:val="clear"/>
-            <w:tcMar>
-              <w:top w:type="dxa" w:w="60"/>
-              <w:left w:type="dxa" w:w="95"/>
-              <w:bottom w:type="dxa" w:w="60"/>
-              <w:right w:type="dxa" w:w="95"/>
-            </w:tcMar>
-            <w:vAlign w:val="center"/>
-          </w:tcPr>
-          <w:p>
-            <w:pPr>
-              <w:spacing w:after="0" w:line="265"/>
-            </w:pPr>
-            <w:r>
-              <w:rPr>
-                <w:rFonts w:ascii="Arial" w:cs="Arial" w:eastAsia="Arial" w:hAnsi="Arial"/>
-                <w:b/>
-                <w:bCs/>
-                <w:color w:val="1B1B1B"/>
-                <w:sz w:val="18"/>
-                <w:szCs w:val="18"/>
-              </w:rPr>
-              <w:t xml:space="preserve">Vì sao</w:t>
+              <w:t xml:space="preserve">Con số</w:t>
             </w:r>
           </w:p>
         </w:tc>
@@ -5789,85 +5492,57 @@
         </w:trPr>
         <w:tc>
           <w:tcPr>
-            <w:tcW w:type="dxa" w:w="2900"/>
-            <w:tcMar>
-              <w:top w:type="dxa" w:w="60"/>
-              <w:left w:type="dxa" w:w="95"/>
-              <w:bottom w:type="dxa" w:w="60"/>
-              <w:right w:type="dxa" w:w="95"/>
-            </w:tcMar>
-            <w:vAlign w:val="center"/>
-          </w:tcPr>
-          <w:p>
-            <w:pPr>
-              <w:spacing w:after="0" w:line="265"/>
-            </w:pPr>
-            <w:r>
-              <w:rPr>
-                <w:rFonts w:ascii="Arial" w:cs="Arial" w:eastAsia="Arial" w:hAnsi="Arial"/>
-                <w:b w:val="false"/>
-                <w:bCs w:val="false"/>
-                <w:color w:val="1B1B1B"/>
-                <w:sz w:val="18"/>
-                <w:szCs w:val="18"/>
-              </w:rPr>
-              <w:t xml:space="preserve">Có ≥ 1 điểm lidar/radar là phải gán</w:t>
-            </w:r>
-          </w:p>
-        </w:tc>
-        <w:tc>
-          <w:tcPr>
-            <w:tcW w:type="dxa" w:w="3600"/>
-            <w:tcMar>
-              <w:top w:type="dxa" w:w="60"/>
-              <w:left w:type="dxa" w:w="95"/>
-              <w:bottom w:type="dxa" w:w="60"/>
-              <w:right w:type="dxa" w:w="95"/>
-            </w:tcMar>
-            <w:vAlign w:val="center"/>
-          </w:tcPr>
-          <w:p>
-            <w:pPr>
-              <w:spacing w:after="0" w:line="265"/>
-            </w:pPr>
-            <w:r>
-              <w:rPr>
-                <w:rFonts w:ascii="Arial" w:cs="Arial" w:eastAsia="Arial" w:hAnsi="Arial"/>
-                <w:b w:val="false"/>
-                <w:bCs w:val="false"/>
-                <w:color w:val="1B1B1B"/>
-                <w:sz w:val="18"/>
-                <w:szCs w:val="18"/>
-              </w:rPr>
-              <w:t xml:space="preserve">Label any target object containing at least 1 LIDAR or RADAR point</w:t>
-            </w:r>
-          </w:p>
-        </w:tc>
-        <w:tc>
-          <w:tcPr>
-            <w:tcW w:type="dxa" w:w="2860"/>
-            <w:tcMar>
-              <w:top w:type="dxa" w:w="60"/>
-              <w:left w:type="dxa" w:w="95"/>
-              <w:bottom w:type="dxa" w:w="60"/>
-              <w:right w:type="dxa" w:w="95"/>
-            </w:tcMar>
-            <w:vAlign w:val="center"/>
-          </w:tcPr>
-          <w:p>
-            <w:pPr>
-              <w:spacing w:after="0" w:line="265"/>
-            </w:pPr>
-            <w:r>
-              <w:rPr>
-                <w:rFonts w:ascii="Arial" w:cs="Arial" w:eastAsia="Arial" w:hAnsi="Arial"/>
-                <w:b w:val="false"/>
-                <w:bCs w:val="false"/>
-                <w:color w:val="1B1B1B"/>
-                <w:sz w:val="18"/>
-                <w:szCs w:val="18"/>
-              </w:rPr>
-              <w:t xml:space="preserve">Cảm biến thấy thì mô hình phải học</w:t>
+            <w:tcW w:type="dxa" w:w="3000"/>
+            <w:tcMar>
+              <w:top w:type="dxa" w:w="60"/>
+              <w:left w:type="dxa" w:w="95"/>
+              <w:bottom w:type="dxa" w:w="60"/>
+              <w:right w:type="dxa" w:w="95"/>
+            </w:tcMar>
+            <w:vAlign w:val="center"/>
+          </w:tcPr>
+          <w:p>
+            <w:pPr>
+              <w:spacing w:after="0" w:line="265"/>
+            </w:pPr>
+            <w:r>
+              <w:rPr>
+                <w:rFonts w:ascii="Arial" w:cs="Arial" w:eastAsia="Arial" w:hAnsi="Arial"/>
+                <w:b w:val="false"/>
+                <w:bCs w:val="false"/>
+                <w:color w:val="1B1B1B"/>
+                <w:sz w:val="18"/>
+                <w:szCs w:val="18"/>
+              </w:rPr>
+              <w:t xml:space="preserve">Khung hình chính</w:t>
+            </w:r>
+          </w:p>
+        </w:tc>
+        <w:tc>
+          <w:tcPr>
+            <w:tcW w:type="dxa" w:w="6360"/>
+            <w:tcMar>
+              <w:top w:type="dxa" w:w="60"/>
+              <w:left w:type="dxa" w:w="95"/>
+              <w:bottom w:type="dxa" w:w="60"/>
+              <w:right w:type="dxa" w:w="95"/>
+            </w:tcMar>
+            <w:vAlign w:val="center"/>
+          </w:tcPr>
+          <w:p>
+            <w:pPr>
+              <w:spacing w:after="0" w:line="265"/>
+            </w:pPr>
+            <w:r>
+              <w:rPr>
+                <w:rFonts w:ascii="Arial" w:cs="Arial" w:eastAsia="Arial" w:hAnsi="Arial"/>
+                <w:b w:val="false"/>
+                <w:bCs w:val="false"/>
+                <w:color w:val="1B1B1B"/>
+                <w:sz w:val="18"/>
+                <w:szCs w:val="18"/>
+              </w:rPr>
+              <w:t xml:space="preserve">40.000 (1000 cảnh × 20 giây, mỗi 0,5 giây một lần)</w:t>
             </w:r>
           </w:p>
         </w:tc>
@@ -5879,85 +5554,57 @@
         </w:trPr>
         <w:tc>
           <w:tcPr>
-            <w:tcW w:type="dxa" w:w="2900"/>
-            <w:tcMar>
-              <w:top w:type="dxa" w:w="60"/>
-              <w:left w:type="dxa" w:w="95"/>
-              <w:bottom w:type="dxa" w:w="60"/>
-              <w:right w:type="dxa" w:w="95"/>
-            </w:tcMar>
-            <w:vAlign w:val="center"/>
-          </w:tcPr>
-          <w:p>
-            <w:pPr>
-              <w:spacing w:after="0" w:line="265"/>
-            </w:pPr>
-            <w:r>
-              <w:rPr>
-                <w:rFonts w:ascii="Arial" w:cs="Arial" w:eastAsia="Arial" w:hAnsi="Arial"/>
-                <w:b w:val="false"/>
-                <w:bCs w:val="false"/>
-                <w:color w:val="1B1B1B"/>
-                <w:sz w:val="18"/>
-                <w:szCs w:val="18"/>
-              </w:rPr>
-              <w:t xml:space="preserve">Khung rất sát</w:t>
-            </w:r>
-          </w:p>
-        </w:tc>
-        <w:tc>
-          <w:tcPr>
-            <w:tcW w:type="dxa" w:w="3600"/>
-            <w:tcMar>
-              <w:top w:type="dxa" w:w="60"/>
-              <w:left w:type="dxa" w:w="95"/>
-              <w:bottom w:type="dxa" w:w="60"/>
-              <w:right w:type="dxa" w:w="95"/>
-            </w:tcMar>
-            <w:vAlign w:val="center"/>
-          </w:tcPr>
-          <w:p>
-            <w:pPr>
-              <w:spacing w:after="0" w:line="265"/>
-            </w:pPr>
-            <w:r>
-              <w:rPr>
-                <w:rFonts w:ascii="Arial" w:cs="Arial" w:eastAsia="Arial" w:hAnsi="Arial"/>
-                <w:b w:val="false"/>
-                <w:bCs w:val="false"/>
-                <w:color w:val="1B1B1B"/>
-                <w:sz w:val="18"/>
-                <w:szCs w:val="18"/>
-              </w:rPr>
-              <w:t xml:space="preserve">Cuboids must be very tight.</w:t>
-            </w:r>
-          </w:p>
-        </w:tc>
-        <w:tc>
-          <w:tcPr>
-            <w:tcW w:type="dxa" w:w="2860"/>
-            <w:tcMar>
-              <w:top w:type="dxa" w:w="60"/>
-              <w:left w:type="dxa" w:w="95"/>
-              <w:bottom w:type="dxa" w:w="60"/>
-              <w:right w:type="dxa" w:w="95"/>
-            </w:tcMar>
-            <w:vAlign w:val="center"/>
-          </w:tcPr>
-          <w:p>
-            <w:pPr>
-              <w:spacing w:after="0" w:line="265"/>
-            </w:pPr>
-            <w:r>
-              <w:rPr>
-                <w:rFonts w:ascii="Arial" w:cs="Arial" w:eastAsia="Arial" w:hAnsi="Arial"/>
-                <w:b w:val="false"/>
-                <w:bCs w:val="false"/>
-                <w:color w:val="1B1B1B"/>
-                <w:sz w:val="18"/>
-                <w:szCs w:val="18"/>
-              </w:rPr>
-              <w:t xml:space="preserve">Khung rộng thì sai vị trí, khoảng cách</w:t>
+            <w:tcW w:type="dxa" w:w="3000"/>
+            <w:tcMar>
+              <w:top w:type="dxa" w:w="60"/>
+              <w:left w:type="dxa" w:w="95"/>
+              <w:bottom w:type="dxa" w:w="60"/>
+              <w:right w:type="dxa" w:w="95"/>
+            </w:tcMar>
+            <w:vAlign w:val="center"/>
+          </w:tcPr>
+          <w:p>
+            <w:pPr>
+              <w:spacing w:after="0" w:line="265"/>
+            </w:pPr>
+            <w:r>
+              <w:rPr>
+                <w:rFonts w:ascii="Arial" w:cs="Arial" w:eastAsia="Arial" w:hAnsi="Arial"/>
+                <w:b w:val="false"/>
+                <w:bCs w:val="false"/>
+                <w:color w:val="1B1B1B"/>
+                <w:sz w:val="18"/>
+                <w:szCs w:val="18"/>
+              </w:rPr>
+              <w:t xml:space="preserve">Khung 3D</w:t>
+            </w:r>
+          </w:p>
+        </w:tc>
+        <w:tc>
+          <w:tcPr>
+            <w:tcW w:type="dxa" w:w="6360"/>
+            <w:tcMar>
+              <w:top w:type="dxa" w:w="60"/>
+              <w:left w:type="dxa" w:w="95"/>
+              <w:bottom w:type="dxa" w:w="60"/>
+              <w:right w:type="dxa" w:w="95"/>
+            </w:tcMar>
+            <w:vAlign w:val="center"/>
+          </w:tcPr>
+          <w:p>
+            <w:pPr>
+              <w:spacing w:after="0" w:line="265"/>
+            </w:pPr>
+            <w:r>
+              <w:rPr>
+                <w:rFonts w:ascii="Arial" w:cs="Arial" w:eastAsia="Arial" w:hAnsi="Arial"/>
+                <w:b w:val="false"/>
+                <w:bCs w:val="false"/>
+                <w:color w:val="1B1B1B"/>
+                <w:sz w:val="18"/>
+                <w:szCs w:val="18"/>
+              </w:rPr>
+              <w:t xml:space="preserve">1,4 triệu, người gán từng cái</w:t>
             </w:r>
           </w:p>
         </w:tc>
@@ -5969,85 +5616,57 @@
         </w:trPr>
         <w:tc>
           <w:tcPr>
-            <w:tcW w:type="dxa" w:w="2900"/>
-            <w:tcMar>
-              <w:top w:type="dxa" w:w="60"/>
-              <w:left w:type="dxa" w:w="95"/>
-              <w:bottom w:type="dxa" w:w="60"/>
-              <w:right w:type="dxa" w:w="95"/>
-            </w:tcMar>
-            <w:vAlign w:val="center"/>
-          </w:tcPr>
-          <w:p>
-            <w:pPr>
-              <w:spacing w:after="0" w:line="265"/>
-            </w:pPr>
-            <w:r>
-              <w:rPr>
-                <w:rFonts w:ascii="Arial" w:cs="Arial" w:eastAsia="Arial" w:hAnsi="Arial"/>
-                <w:b w:val="false"/>
-                <w:bCs w:val="false"/>
-                <w:color w:val="1B1B1B"/>
-                <w:sz w:val="18"/>
-                <w:szCs w:val="18"/>
-              </w:rPr>
-              <w:t xml:space="preserve">Gồm cả tay chân</w:t>
-            </w:r>
-          </w:p>
-        </w:tc>
-        <w:tc>
-          <w:tcPr>
-            <w:tcW w:type="dxa" w:w="3600"/>
-            <w:tcMar>
-              <w:top w:type="dxa" w:w="60"/>
-              <w:left w:type="dxa" w:w="95"/>
-              <w:bottom w:type="dxa" w:w="60"/>
-              <w:right w:type="dxa" w:w="95"/>
-            </w:tcMar>
-            <w:vAlign w:val="center"/>
-          </w:tcPr>
-          <w:p>
-            <w:pPr>
-              <w:spacing w:after="0" w:line="265"/>
-            </w:pPr>
-            <w:r>
-              <w:rPr>
-                <w:rFonts w:ascii="Arial" w:cs="Arial" w:eastAsia="Arial" w:hAnsi="Arial"/>
-                <w:b w:val="false"/>
-                <w:bCs w:val="false"/>
-                <w:color w:val="1B1B1B"/>
-                <w:sz w:val="18"/>
-                <w:szCs w:val="18"/>
-              </w:rPr>
-              <w:t xml:space="preserve">…should include the extremities.</w:t>
-            </w:r>
-          </w:p>
-        </w:tc>
-        <w:tc>
-          <w:tcPr>
-            <w:tcW w:type="dxa" w:w="2860"/>
-            <w:tcMar>
-              <w:top w:type="dxa" w:w="60"/>
-              <w:left w:type="dxa" w:w="95"/>
-              <w:bottom w:type="dxa" w:w="60"/>
-              <w:right w:type="dxa" w:w="95"/>
-            </w:tcMar>
-            <w:vAlign w:val="center"/>
-          </w:tcPr>
-          <w:p>
-            <w:pPr>
-              <w:spacing w:after="0" w:line="265"/>
-            </w:pPr>
-            <w:r>
-              <w:rPr>
-                <w:rFonts w:ascii="Arial" w:cs="Arial" w:eastAsia="Arial" w:hAnsi="Arial"/>
-                <w:b w:val="false"/>
-                <w:bCs w:val="false"/>
-                <w:color w:val="1B1B1B"/>
-                <w:sz w:val="18"/>
-                <w:szCs w:val="18"/>
-              </w:rPr>
-              <w:t xml:space="preserve">Tay giơ ra cũng có thể bị đụng</w:t>
+            <w:tcW w:type="dxa" w:w="3000"/>
+            <w:tcMar>
+              <w:top w:type="dxa" w:w="60"/>
+              <w:left w:type="dxa" w:w="95"/>
+              <w:bottom w:type="dxa" w:w="60"/>
+              <w:right w:type="dxa" w:w="95"/>
+            </w:tcMar>
+            <w:vAlign w:val="center"/>
+          </w:tcPr>
+          <w:p>
+            <w:pPr>
+              <w:spacing w:after="0" w:line="265"/>
+            </w:pPr>
+            <w:r>
+              <w:rPr>
+                <w:rFonts w:ascii="Arial" w:cs="Arial" w:eastAsia="Arial" w:hAnsi="Arial"/>
+                <w:b w:val="false"/>
+                <w:bCs w:val="false"/>
+                <w:color w:val="1B1B1B"/>
+                <w:sz w:val="18"/>
+                <w:szCs w:val="18"/>
+              </w:rPr>
+              <w:t xml:space="preserve">Loại</w:t>
+            </w:r>
+          </w:p>
+        </w:tc>
+        <w:tc>
+          <w:tcPr>
+            <w:tcW w:type="dxa" w:w="6360"/>
+            <w:tcMar>
+              <w:top w:type="dxa" w:w="60"/>
+              <w:left w:type="dxa" w:w="95"/>
+              <w:bottom w:type="dxa" w:w="60"/>
+              <w:right w:type="dxa" w:w="95"/>
+            </w:tcMar>
+            <w:vAlign w:val="center"/>
+          </w:tcPr>
+          <w:p>
+            <w:pPr>
+              <w:spacing w:after="0" w:line="265"/>
+            </w:pPr>
+            <w:r>
+              <w:rPr>
+                <w:rFonts w:ascii="Arial" w:cs="Arial" w:eastAsia="Arial" w:hAnsi="Arial"/>
+                <w:b w:val="false"/>
+                <w:bCs w:val="false"/>
+                <w:color w:val="1B1B1B"/>
+                <w:sz w:val="18"/>
+                <w:szCs w:val="18"/>
+              </w:rPr>
+              <w:t xml:space="preserve">23 loại (người lớn, trẻ em, ô tô, xe buýt, xe máy, cọc tiêu…)</w:t>
             </w:r>
           </w:p>
         </w:tc>
@@ -6059,265 +5678,57 @@
         </w:trPr>
         <w:tc>
           <w:tcPr>
-            <w:tcW w:type="dxa" w:w="2900"/>
-            <w:tcMar>
-              <w:top w:type="dxa" w:w="60"/>
-              <w:left w:type="dxa" w:w="95"/>
-              <w:bottom w:type="dxa" w:w="60"/>
-              <w:right w:type="dxa" w:w="95"/>
-            </w:tcMar>
-            <w:vAlign w:val="center"/>
-          </w:tcPr>
-          <w:p>
-            <w:pPr>
-              <w:spacing w:after="0" w:line="265"/>
-            </w:pPr>
-            <w:r>
-              <w:rPr>
-                <w:rFonts w:ascii="Arial" w:cs="Arial" w:eastAsia="Arial" w:hAnsi="Arial"/>
-                <w:b w:val="false"/>
-                <w:bCs w:val="false"/>
-                <w:color w:val="1B1B1B"/>
-                <w:sz w:val="18"/>
-                <w:szCs w:val="18"/>
-              </w:rPr>
-              <w:t xml:space="preserve">Có người lái: chung khung với xe</w:t>
-            </w:r>
-          </w:p>
-        </w:tc>
-        <w:tc>
-          <w:tcPr>
-            <w:tcW w:type="dxa" w:w="3600"/>
-            <w:tcMar>
-              <w:top w:type="dxa" w:w="60"/>
-              <w:left w:type="dxa" w:w="95"/>
-              <w:bottom w:type="dxa" w:w="60"/>
-              <w:right w:type="dxa" w:w="95"/>
-            </w:tcMar>
-            <w:vAlign w:val="center"/>
-          </w:tcPr>
-          <w:p>
-            <w:pPr>
-              <w:spacing w:after="0" w:line="265"/>
-            </w:pPr>
-            <w:r>
-              <w:rPr>
-                <w:rFonts w:ascii="Arial" w:cs="Arial" w:eastAsia="Arial" w:hAnsi="Arial"/>
-                <w:b w:val="false"/>
-                <w:bCs w:val="false"/>
-                <w:color w:val="1B1B1B"/>
-                <w:sz w:val="18"/>
-                <w:szCs w:val="18"/>
-              </w:rPr>
-              <w:t xml:space="preserve">If there is a rider, include the rider in the box.</w:t>
-            </w:r>
-          </w:p>
-        </w:tc>
-        <w:tc>
-          <w:tcPr>
-            <w:tcW w:type="dxa" w:w="2860"/>
-            <w:tcMar>
-              <w:top w:type="dxa" w:w="60"/>
-              <w:left w:type="dxa" w:w="95"/>
-              <w:bottom w:type="dxa" w:w="60"/>
-              <w:right w:type="dxa" w:w="95"/>
-            </w:tcMar>
-            <w:vAlign w:val="center"/>
-          </w:tcPr>
-          <w:p>
-            <w:pPr>
-              <w:spacing w:after="0" w:line="265"/>
-            </w:pPr>
-            <w:r>
-              <w:rPr>
-                <w:rFonts w:ascii="Arial" w:cs="Arial" w:eastAsia="Arial" w:hAnsi="Arial"/>
-                <w:b w:val="false"/>
-                <w:bCs w:val="false"/>
-                <w:color w:val="1B1B1B"/>
-                <w:sz w:val="18"/>
-                <w:szCs w:val="18"/>
-              </w:rPr>
-              <w:t xml:space="preserve">Người và xe đi cùng nhau</w:t>
-            </w:r>
-          </w:p>
-        </w:tc>
-      </w:tr>
-      <w:tr>
-        <w:trPr>
-          <w:cantSplit/>
-          <w:tblHeader w:val="false"/>
-        </w:trPr>
-        <w:tc>
-          <w:tcPr>
-            <w:tcW w:type="dxa" w:w="2900"/>
-            <w:tcMar>
-              <w:top w:type="dxa" w:w="60"/>
-              <w:left w:type="dxa" w:w="95"/>
-              <w:bottom w:type="dxa" w:w="60"/>
-              <w:right w:type="dxa" w:w="95"/>
-            </w:tcMar>
-            <w:vAlign w:val="center"/>
-          </w:tcPr>
-          <w:p>
-            <w:pPr>
-              <w:spacing w:after="0" w:line="265"/>
-            </w:pPr>
-            <w:r>
-              <w:rPr>
-                <w:rFonts w:ascii="Arial" w:cs="Arial" w:eastAsia="Arial" w:hAnsi="Arial"/>
-                <w:b w:val="false"/>
-                <w:bCs w:val="false"/>
-                <w:color w:val="1B1B1B"/>
-                <w:sz w:val="18"/>
-                <w:szCs w:val="18"/>
-              </w:rPr>
-              <w:t xml:space="preserve">Người đứng cạnh: khoanh riêng</w:t>
-            </w:r>
-          </w:p>
-        </w:tc>
-        <w:tc>
-          <w:tcPr>
-            <w:tcW w:type="dxa" w:w="3600"/>
-            <w:tcMar>
-              <w:top w:type="dxa" w:w="60"/>
-              <w:left w:type="dxa" w:w="95"/>
-              <w:bottom w:type="dxa" w:w="60"/>
-              <w:right w:type="dxa" w:w="95"/>
-            </w:tcMar>
-            <w:vAlign w:val="center"/>
-          </w:tcPr>
-          <w:p>
-            <w:pPr>
-              <w:spacing w:after="0" w:line="265"/>
-            </w:pPr>
-            <w:r>
-              <w:rPr>
-                <w:rFonts w:ascii="Arial" w:cs="Arial" w:eastAsia="Arial" w:hAnsi="Arial"/>
-                <w:b w:val="false"/>
-                <w:bCs w:val="false"/>
-                <w:color w:val="1B1B1B"/>
-                <w:sz w:val="18"/>
-                <w:szCs w:val="18"/>
-              </w:rPr>
-              <w:t xml:space="preserve">…standing next to the motorcycle, do NOT include…</w:t>
-            </w:r>
-          </w:p>
-        </w:tc>
-        <w:tc>
-          <w:tcPr>
-            <w:tcW w:type="dxa" w:w="2860"/>
-            <w:tcMar>
-              <w:top w:type="dxa" w:w="60"/>
-              <w:left w:type="dxa" w:w="95"/>
-              <w:bottom w:type="dxa" w:w="60"/>
-              <w:right w:type="dxa" w:w="95"/>
-            </w:tcMar>
-            <w:vAlign w:val="center"/>
-          </w:tcPr>
-          <w:p>
-            <w:pPr>
-              <w:spacing w:after="0" w:line="265"/>
-            </w:pPr>
-            <w:r>
-              <w:rPr>
-                <w:rFonts w:ascii="Arial" w:cs="Arial" w:eastAsia="Arial" w:hAnsi="Arial"/>
-                <w:b w:val="false"/>
-                <w:bCs w:val="false"/>
-                <w:color w:val="1B1B1B"/>
-                <w:sz w:val="18"/>
-                <w:szCs w:val="18"/>
-              </w:rPr>
-              <w:t xml:space="preserve">Người đó có thể đi chỗ khác</w:t>
-            </w:r>
-          </w:p>
-        </w:tc>
-      </w:tr>
-      <w:tr>
-        <w:trPr>
-          <w:cantSplit/>
-          <w:tblHeader w:val="false"/>
-        </w:trPr>
-        <w:tc>
-          <w:tcPr>
-            <w:tcW w:type="dxa" w:w="2900"/>
-            <w:tcMar>
-              <w:top w:type="dxa" w:w="60"/>
-              <w:left w:type="dxa" w:w="95"/>
-              <w:bottom w:type="dxa" w:w="60"/>
-              <w:right w:type="dxa" w:w="95"/>
-            </w:tcMar>
-            <w:vAlign w:val="center"/>
-          </w:tcPr>
-          <w:p>
-            <w:pPr>
-              <w:spacing w:after="0" w:line="265"/>
-            </w:pPr>
-            <w:r>
-              <w:rPr>
-                <w:rFonts w:ascii="Arial" w:cs="Arial" w:eastAsia="Arial" w:hAnsi="Arial"/>
-                <w:b w:val="false"/>
-                <w:bCs w:val="false"/>
-                <w:color w:val="1B1B1B"/>
-                <w:sz w:val="18"/>
-                <w:szCs w:val="18"/>
-              </w:rPr>
-              <w:t xml:space="preserve">Độ thấy được 4 mức</w:t>
-            </w:r>
-          </w:p>
-        </w:tc>
-        <w:tc>
-          <w:tcPr>
-            <w:tcW w:type="dxa" w:w="3600"/>
-            <w:tcMar>
-              <w:top w:type="dxa" w:w="60"/>
-              <w:left w:type="dxa" w:w="95"/>
-              <w:bottom w:type="dxa" w:w="60"/>
-              <w:right w:type="dxa" w:w="95"/>
-            </w:tcMar>
-            <w:vAlign w:val="center"/>
-          </w:tcPr>
-          <w:p>
-            <w:pPr>
-              <w:spacing w:after="0" w:line="265"/>
-            </w:pPr>
-            <w:r>
-              <w:rPr>
-                <w:rFonts w:ascii="Arial" w:cs="Arial" w:eastAsia="Arial" w:hAnsi="Arial"/>
-                <w:b w:val="false"/>
-                <w:bCs w:val="false"/>
-                <w:color w:val="1B1B1B"/>
-                <w:sz w:val="18"/>
-                <w:szCs w:val="18"/>
-              </w:rPr>
-              <w:t xml:space="preserve">0–40%, 41–60%, 61–80%, 81–100%</w:t>
-            </w:r>
-          </w:p>
-        </w:tc>
-        <w:tc>
-          <w:tcPr>
-            <w:tcW w:type="dxa" w:w="2860"/>
-            <w:tcMar>
-              <w:top w:type="dxa" w:w="60"/>
-              <w:left w:type="dxa" w:w="95"/>
-              <w:bottom w:type="dxa" w:w="60"/>
-              <w:right w:type="dxa" w:w="95"/>
-            </w:tcMar>
-            <w:vAlign w:val="center"/>
-          </w:tcPr>
-          <w:p>
-            <w:pPr>
-              <w:spacing w:after="0" w:line="265"/>
-            </w:pPr>
-            <w:r>
-              <w:rPr>
-                <w:rFonts w:ascii="Arial" w:cs="Arial" w:eastAsia="Arial" w:hAnsi="Arial"/>
-                <w:b w:val="false"/>
-                <w:bCs w:val="false"/>
-                <w:color w:val="1B1B1B"/>
-                <w:sz w:val="18"/>
-                <w:szCs w:val="18"/>
-              </w:rPr>
-              <w:t xml:space="preserve">Biết vật nào bị che nhiều</w:t>
+            <w:tcW w:type="dxa" w:w="3000"/>
+            <w:tcMar>
+              <w:top w:type="dxa" w:w="60"/>
+              <w:left w:type="dxa" w:w="95"/>
+              <w:bottom w:type="dxa" w:w="60"/>
+              <w:right w:type="dxa" w:w="95"/>
+            </w:tcMar>
+            <w:vAlign w:val="center"/>
+          </w:tcPr>
+          <w:p>
+            <w:pPr>
+              <w:spacing w:after="0" w:line="265"/>
+            </w:pPr>
+            <w:r>
+              <w:rPr>
+                <w:rFonts w:ascii="Arial" w:cs="Arial" w:eastAsia="Arial" w:hAnsi="Arial"/>
+                <w:b w:val="false"/>
+                <w:bCs w:val="false"/>
+                <w:color w:val="1B1B1B"/>
+                <w:sz w:val="18"/>
+                <w:szCs w:val="18"/>
+              </w:rPr>
+              <w:t xml:space="preserve">Bản mini: ô tô và xe máy</w:t>
+            </w:r>
+          </w:p>
+        </w:tc>
+        <w:tc>
+          <w:tcPr>
+            <w:tcW w:type="dxa" w:w="6360"/>
+            <w:tcMar>
+              <w:top w:type="dxa" w:w="60"/>
+              <w:left w:type="dxa" w:w="95"/>
+              <w:bottom w:type="dxa" w:w="60"/>
+              <w:right w:type="dxa" w:w="95"/>
+            </w:tcMar>
+            <w:vAlign w:val="center"/>
+          </w:tcPr>
+          <w:p>
+            <w:pPr>
+              <w:spacing w:after="0" w:line="265"/>
+            </w:pPr>
+            <w:r>
+              <w:rPr>
+                <w:rFonts w:ascii="Arial" w:cs="Arial" w:eastAsia="Arial" w:hAnsi="Arial"/>
+                <w:b w:val="false"/>
+                <w:bCs w:val="false"/>
+                <w:color w:val="1B1B1B"/>
+                <w:sz w:val="18"/>
+                <w:szCs w:val="18"/>
+              </w:rPr>
+              <w:t xml:space="preserve">7.619 khung và 471 khung: xe máy ít hơn 16 lần</w:t>
             </w:r>
           </w:p>
         </w:tc>
@@ -6346,7 +5757,7 @@
       <w:r>
         <w:drawing>
           <wp:inline distT="0" distB="0" distL="0" distR="0">
-            <wp:extent cx="5334000" cy="1990725"/>
+            <wp:extent cx="4572000" cy="2638425"/>
             <wp:effectExtent t="0" r="0" b="0" l="0"/>
             <wp:docPr id="1" name="" descr="" title=""/>
             <wp:cNvGraphicFramePr>
@@ -6371,7 +5782,7 @@
                   <pic:spPr bwMode="auto">
                     <a:xfrm>
                       <a:off x="0" y="0"/>
-                      <a:ext cx="5334000" cy="1990725"/>
+                      <a:ext cx="4572000" cy="2638425"/>
                     </a:xfrm>
                     <a:prstGeom prst="rect">
                       <a:avLst/>
@@ -6398,35 +5809,681 @@
           <w:sz w:val="19"/>
           <w:szCs w:val="19"/>
         </w:rPr>
-        <w:t xml:space="preserve">Người lái nằm trong khung của xe: trái xe đạp scene-0103, phải xe máy scene-1100 (khung chính thức). Dữ liệu: nuScenes (Motional), CC BY-NC-SA 4.0</w:t>
+        <w:t xml:space="preserve">Số khung mỗi loại trong nuScenes mini (tuần 7). Đường Boston, Singapore ít xe máy nên sách này dạy rất ít về xe máy. Dữ liệu: nuScenes (Motional), CC BY-NC-SA 4.0</w:t>
       </w:r>
     </w:p>
     <w:p>
       <w:pPr>
-        <w:widowControl/>
-        <w:spacing w:after="100" w:before="0" w:line="312"/>
-        <w:ind w:left="0" w:firstLine="0"/>
-      </w:pPr>
-      <w:r>
-        <w:rPr>
-          <w:rFonts w:ascii="Arial" w:cs="Arial" w:eastAsia="Arial" w:hAnsi="Arial"/>
-          <w:color w:val="1B1B1B"/>
-          <w:sz w:val="22"/>
-          <w:szCs w:val="22"/>
-        </w:rPr>
-        <w:t xml:space="preserve">Ở Hà Nội, một xe máy chở ba người, theo quy tắc nuScenes là </w:t>
-      </w:r>
+        <w:keepNext/>
+        <w:spacing w:after="70" w:before="190"/>
+      </w:pPr>
       <w:r>
         <w:rPr>
           <w:rFonts w:ascii="Arial" w:cs="Arial" w:eastAsia="Arial" w:hAnsi="Arial"/>
           <w:b/>
           <w:bCs/>
           <w:color w:val="24405C"/>
-          <w:sz w:val="22"/>
-          <w:szCs w:val="22"/>
-        </w:rPr>
-        <w:t xml:space="preserve">một khung</w:t>
-      </w:r>
+          <w:sz w:val="19"/>
+          <w:szCs w:val="19"/>
+        </w:rPr>
+        <w:t xml:space="preserve">Bảng 5. Quy tắc gán nhãn chính thức của nuScenes (trích, nguyên văn từ instructions_nuscenes.md)</w:t>
+      </w:r>
+    </w:p>
+    <w:tbl>
+      <w:tblPr>
+        <w:tblW w:type="dxa" w:w="9360"/>
+        <w:tblBorders>
+          <w:top w:val="single" w:color="8A949C" w:sz="8"/>
+          <w:left w:val="none"/>
+          <w:bottom w:val="single" w:color="8A949C" w:sz="8"/>
+          <w:right w:val="none"/>
+          <w:insideH w:val="single" w:color="BFC7CE" w:sz="2"/>
+          <w:insideV w:val="none"/>
+        </w:tblBorders>
+      </w:tblPr>
+      <w:tblGrid>
+        <w:gridCol w:w="2900"/>
+        <w:gridCol w:w="3600"/>
+        <w:gridCol w:w="2860"/>
+      </w:tblGrid>
+      <w:tr>
+        <w:trPr>
+          <w:cantSplit/>
+          <w:tblHeader/>
+        </w:trPr>
+        <w:tc>
+          <w:tcPr>
+            <w:tcW w:type="dxa" w:w="2900"/>
+            <w:shd w:fill="EDF0F3" w:color="auto" w:val="clear"/>
+            <w:tcMar>
+              <w:top w:type="dxa" w:w="60"/>
+              <w:left w:type="dxa" w:w="95"/>
+              <w:bottom w:type="dxa" w:w="60"/>
+              <w:right w:type="dxa" w:w="95"/>
+            </w:tcMar>
+            <w:vAlign w:val="center"/>
+          </w:tcPr>
+          <w:p>
+            <w:pPr>
+              <w:spacing w:after="0" w:line="265"/>
+            </w:pPr>
+            <w:r>
+              <w:rPr>
+                <w:rFonts w:ascii="Arial" w:cs="Arial" w:eastAsia="Arial" w:hAnsi="Arial"/>
+                <w:b/>
+                <w:bCs/>
+                <w:color w:val="1B1B1B"/>
+                <w:sz w:val="18"/>
+                <w:szCs w:val="18"/>
+              </w:rPr>
+              <w:t xml:space="preserve">Quy tắc</w:t>
+            </w:r>
+          </w:p>
+        </w:tc>
+        <w:tc>
+          <w:tcPr>
+            <w:tcW w:type="dxa" w:w="3600"/>
+            <w:shd w:fill="EDF0F3" w:color="auto" w:val="clear"/>
+            <w:tcMar>
+              <w:top w:type="dxa" w:w="60"/>
+              <w:left w:type="dxa" w:w="95"/>
+              <w:bottom w:type="dxa" w:w="60"/>
+              <w:right w:type="dxa" w:w="95"/>
+            </w:tcMar>
+            <w:vAlign w:val="center"/>
+          </w:tcPr>
+          <w:p>
+            <w:pPr>
+              <w:spacing w:after="0" w:line="265"/>
+            </w:pPr>
+            <w:r>
+              <w:rPr>
+                <w:rFonts w:ascii="Arial" w:cs="Arial" w:eastAsia="Arial" w:hAnsi="Arial"/>
+                <w:b/>
+                <w:bCs/>
+                <w:color w:val="1B1B1B"/>
+                <w:sz w:val="18"/>
+                <w:szCs w:val="18"/>
+              </w:rPr>
+              <w:t xml:space="preserve">Nguyên văn</w:t>
+            </w:r>
+          </w:p>
+        </w:tc>
+        <w:tc>
+          <w:tcPr>
+            <w:tcW w:type="dxa" w:w="2860"/>
+            <w:shd w:fill="EDF0F3" w:color="auto" w:val="clear"/>
+            <w:tcMar>
+              <w:top w:type="dxa" w:w="60"/>
+              <w:left w:type="dxa" w:w="95"/>
+              <w:bottom w:type="dxa" w:w="60"/>
+              <w:right w:type="dxa" w:w="95"/>
+            </w:tcMar>
+            <w:vAlign w:val="center"/>
+          </w:tcPr>
+          <w:p>
+            <w:pPr>
+              <w:spacing w:after="0" w:line="265"/>
+            </w:pPr>
+            <w:r>
+              <w:rPr>
+                <w:rFonts w:ascii="Arial" w:cs="Arial" w:eastAsia="Arial" w:hAnsi="Arial"/>
+                <w:b/>
+                <w:bCs/>
+                <w:color w:val="1B1B1B"/>
+                <w:sz w:val="18"/>
+                <w:szCs w:val="18"/>
+              </w:rPr>
+              <w:t xml:space="preserve">Vì sao</w:t>
+            </w:r>
+          </w:p>
+        </w:tc>
+      </w:tr>
+      <w:tr>
+        <w:trPr>
+          <w:cantSplit/>
+          <w:tblHeader w:val="false"/>
+        </w:trPr>
+        <w:tc>
+          <w:tcPr>
+            <w:tcW w:type="dxa" w:w="2900"/>
+            <w:tcMar>
+              <w:top w:type="dxa" w:w="60"/>
+              <w:left w:type="dxa" w:w="95"/>
+              <w:bottom w:type="dxa" w:w="60"/>
+              <w:right w:type="dxa" w:w="95"/>
+            </w:tcMar>
+            <w:vAlign w:val="center"/>
+          </w:tcPr>
+          <w:p>
+            <w:pPr>
+              <w:spacing w:after="0" w:line="265"/>
+            </w:pPr>
+            <w:r>
+              <w:rPr>
+                <w:rFonts w:ascii="Arial" w:cs="Arial" w:eastAsia="Arial" w:hAnsi="Arial"/>
+                <w:b w:val="false"/>
+                <w:bCs w:val="false"/>
+                <w:color w:val="1B1B1B"/>
+                <w:sz w:val="18"/>
+                <w:szCs w:val="18"/>
+              </w:rPr>
+              <w:t xml:space="preserve">Có ≥ 1 điểm lidar/radar là phải gán</w:t>
+            </w:r>
+          </w:p>
+        </w:tc>
+        <w:tc>
+          <w:tcPr>
+            <w:tcW w:type="dxa" w:w="3600"/>
+            <w:tcMar>
+              <w:top w:type="dxa" w:w="60"/>
+              <w:left w:type="dxa" w:w="95"/>
+              <w:bottom w:type="dxa" w:w="60"/>
+              <w:right w:type="dxa" w:w="95"/>
+            </w:tcMar>
+            <w:vAlign w:val="center"/>
+          </w:tcPr>
+          <w:p>
+            <w:pPr>
+              <w:spacing w:after="0" w:line="265"/>
+            </w:pPr>
+            <w:r>
+              <w:rPr>
+                <w:rFonts w:ascii="Arial" w:cs="Arial" w:eastAsia="Arial" w:hAnsi="Arial"/>
+                <w:b w:val="false"/>
+                <w:bCs w:val="false"/>
+                <w:color w:val="1B1B1B"/>
+                <w:sz w:val="18"/>
+                <w:szCs w:val="18"/>
+              </w:rPr>
+              <w:t xml:space="preserve">Label any target object containing at least 1 LIDAR or RADAR point</w:t>
+            </w:r>
+          </w:p>
+        </w:tc>
+        <w:tc>
+          <w:tcPr>
+            <w:tcW w:type="dxa" w:w="2860"/>
+            <w:tcMar>
+              <w:top w:type="dxa" w:w="60"/>
+              <w:left w:type="dxa" w:w="95"/>
+              <w:bottom w:type="dxa" w:w="60"/>
+              <w:right w:type="dxa" w:w="95"/>
+            </w:tcMar>
+            <w:vAlign w:val="center"/>
+          </w:tcPr>
+          <w:p>
+            <w:pPr>
+              <w:spacing w:after="0" w:line="265"/>
+            </w:pPr>
+            <w:r>
+              <w:rPr>
+                <w:rFonts w:ascii="Arial" w:cs="Arial" w:eastAsia="Arial" w:hAnsi="Arial"/>
+                <w:b w:val="false"/>
+                <w:bCs w:val="false"/>
+                <w:color w:val="1B1B1B"/>
+                <w:sz w:val="18"/>
+                <w:szCs w:val="18"/>
+              </w:rPr>
+              <w:t xml:space="preserve">Cảm biến thấy thì mô hình phải học</w:t>
+            </w:r>
+          </w:p>
+        </w:tc>
+      </w:tr>
+      <w:tr>
+        <w:trPr>
+          <w:cantSplit/>
+          <w:tblHeader w:val="false"/>
+        </w:trPr>
+        <w:tc>
+          <w:tcPr>
+            <w:tcW w:type="dxa" w:w="2900"/>
+            <w:tcMar>
+              <w:top w:type="dxa" w:w="60"/>
+              <w:left w:type="dxa" w:w="95"/>
+              <w:bottom w:type="dxa" w:w="60"/>
+              <w:right w:type="dxa" w:w="95"/>
+            </w:tcMar>
+            <w:vAlign w:val="center"/>
+          </w:tcPr>
+          <w:p>
+            <w:pPr>
+              <w:spacing w:after="0" w:line="265"/>
+            </w:pPr>
+            <w:r>
+              <w:rPr>
+                <w:rFonts w:ascii="Arial" w:cs="Arial" w:eastAsia="Arial" w:hAnsi="Arial"/>
+                <w:b w:val="false"/>
+                <w:bCs w:val="false"/>
+                <w:color w:val="1B1B1B"/>
+                <w:sz w:val="18"/>
+                <w:szCs w:val="18"/>
+              </w:rPr>
+              <w:t xml:space="preserve">Khung rất sát</w:t>
+            </w:r>
+          </w:p>
+        </w:tc>
+        <w:tc>
+          <w:tcPr>
+            <w:tcW w:type="dxa" w:w="3600"/>
+            <w:tcMar>
+              <w:top w:type="dxa" w:w="60"/>
+              <w:left w:type="dxa" w:w="95"/>
+              <w:bottom w:type="dxa" w:w="60"/>
+              <w:right w:type="dxa" w:w="95"/>
+            </w:tcMar>
+            <w:vAlign w:val="center"/>
+          </w:tcPr>
+          <w:p>
+            <w:pPr>
+              <w:spacing w:after="0" w:line="265"/>
+            </w:pPr>
+            <w:r>
+              <w:rPr>
+                <w:rFonts w:ascii="Arial" w:cs="Arial" w:eastAsia="Arial" w:hAnsi="Arial"/>
+                <w:b w:val="false"/>
+                <w:bCs w:val="false"/>
+                <w:color w:val="1B1B1B"/>
+                <w:sz w:val="18"/>
+                <w:szCs w:val="18"/>
+              </w:rPr>
+              <w:t xml:space="preserve">Cuboids must be very tight.</w:t>
+            </w:r>
+          </w:p>
+        </w:tc>
+        <w:tc>
+          <w:tcPr>
+            <w:tcW w:type="dxa" w:w="2860"/>
+            <w:tcMar>
+              <w:top w:type="dxa" w:w="60"/>
+              <w:left w:type="dxa" w:w="95"/>
+              <w:bottom w:type="dxa" w:w="60"/>
+              <w:right w:type="dxa" w:w="95"/>
+            </w:tcMar>
+            <w:vAlign w:val="center"/>
+          </w:tcPr>
+          <w:p>
+            <w:pPr>
+              <w:spacing w:after="0" w:line="265"/>
+            </w:pPr>
+            <w:r>
+              <w:rPr>
+                <w:rFonts w:ascii="Arial" w:cs="Arial" w:eastAsia="Arial" w:hAnsi="Arial"/>
+                <w:b w:val="false"/>
+                <w:bCs w:val="false"/>
+                <w:color w:val="1B1B1B"/>
+                <w:sz w:val="18"/>
+                <w:szCs w:val="18"/>
+              </w:rPr>
+              <w:t xml:space="preserve">Khung rộng thì sai vị trí, khoảng cách</w:t>
+            </w:r>
+          </w:p>
+        </w:tc>
+      </w:tr>
+      <w:tr>
+        <w:trPr>
+          <w:cantSplit/>
+          <w:tblHeader w:val="false"/>
+        </w:trPr>
+        <w:tc>
+          <w:tcPr>
+            <w:tcW w:type="dxa" w:w="2900"/>
+            <w:tcMar>
+              <w:top w:type="dxa" w:w="60"/>
+              <w:left w:type="dxa" w:w="95"/>
+              <w:bottom w:type="dxa" w:w="60"/>
+              <w:right w:type="dxa" w:w="95"/>
+            </w:tcMar>
+            <w:vAlign w:val="center"/>
+          </w:tcPr>
+          <w:p>
+            <w:pPr>
+              <w:spacing w:after="0" w:line="265"/>
+            </w:pPr>
+            <w:r>
+              <w:rPr>
+                <w:rFonts w:ascii="Arial" w:cs="Arial" w:eastAsia="Arial" w:hAnsi="Arial"/>
+                <w:b w:val="false"/>
+                <w:bCs w:val="false"/>
+                <w:color w:val="1B1B1B"/>
+                <w:sz w:val="18"/>
+                <w:szCs w:val="18"/>
+              </w:rPr>
+              <w:t xml:space="preserve">Gồm cả tay chân</w:t>
+            </w:r>
+          </w:p>
+        </w:tc>
+        <w:tc>
+          <w:tcPr>
+            <w:tcW w:type="dxa" w:w="3600"/>
+            <w:tcMar>
+              <w:top w:type="dxa" w:w="60"/>
+              <w:left w:type="dxa" w:w="95"/>
+              <w:bottom w:type="dxa" w:w="60"/>
+              <w:right w:type="dxa" w:w="95"/>
+            </w:tcMar>
+            <w:vAlign w:val="center"/>
+          </w:tcPr>
+          <w:p>
+            <w:pPr>
+              <w:spacing w:after="0" w:line="265"/>
+            </w:pPr>
+            <w:r>
+              <w:rPr>
+                <w:rFonts w:ascii="Arial" w:cs="Arial" w:eastAsia="Arial" w:hAnsi="Arial"/>
+                <w:b w:val="false"/>
+                <w:bCs w:val="false"/>
+                <w:color w:val="1B1B1B"/>
+                <w:sz w:val="18"/>
+                <w:szCs w:val="18"/>
+              </w:rPr>
+              <w:t xml:space="preserve">…should include the extremities.</w:t>
+            </w:r>
+          </w:p>
+        </w:tc>
+        <w:tc>
+          <w:tcPr>
+            <w:tcW w:type="dxa" w:w="2860"/>
+            <w:tcMar>
+              <w:top w:type="dxa" w:w="60"/>
+              <w:left w:type="dxa" w:w="95"/>
+              <w:bottom w:type="dxa" w:w="60"/>
+              <w:right w:type="dxa" w:w="95"/>
+            </w:tcMar>
+            <w:vAlign w:val="center"/>
+          </w:tcPr>
+          <w:p>
+            <w:pPr>
+              <w:spacing w:after="0" w:line="265"/>
+            </w:pPr>
+            <w:r>
+              <w:rPr>
+                <w:rFonts w:ascii="Arial" w:cs="Arial" w:eastAsia="Arial" w:hAnsi="Arial"/>
+                <w:b w:val="false"/>
+                <w:bCs w:val="false"/>
+                <w:color w:val="1B1B1B"/>
+                <w:sz w:val="18"/>
+                <w:szCs w:val="18"/>
+              </w:rPr>
+              <w:t xml:space="preserve">Tay giơ ra cũng có thể bị đụng</w:t>
+            </w:r>
+          </w:p>
+        </w:tc>
+      </w:tr>
+      <w:tr>
+        <w:trPr>
+          <w:cantSplit/>
+          <w:tblHeader w:val="false"/>
+        </w:trPr>
+        <w:tc>
+          <w:tcPr>
+            <w:tcW w:type="dxa" w:w="2900"/>
+            <w:tcMar>
+              <w:top w:type="dxa" w:w="60"/>
+              <w:left w:type="dxa" w:w="95"/>
+              <w:bottom w:type="dxa" w:w="60"/>
+              <w:right w:type="dxa" w:w="95"/>
+            </w:tcMar>
+            <w:vAlign w:val="center"/>
+          </w:tcPr>
+          <w:p>
+            <w:pPr>
+              <w:spacing w:after="0" w:line="265"/>
+            </w:pPr>
+            <w:r>
+              <w:rPr>
+                <w:rFonts w:ascii="Arial" w:cs="Arial" w:eastAsia="Arial" w:hAnsi="Arial"/>
+                <w:b w:val="false"/>
+                <w:bCs w:val="false"/>
+                <w:color w:val="1B1B1B"/>
+                <w:sz w:val="18"/>
+                <w:szCs w:val="18"/>
+              </w:rPr>
+              <w:t xml:space="preserve">Có người lái: chung khung với xe</w:t>
+            </w:r>
+          </w:p>
+        </w:tc>
+        <w:tc>
+          <w:tcPr>
+            <w:tcW w:type="dxa" w:w="3600"/>
+            <w:tcMar>
+              <w:top w:type="dxa" w:w="60"/>
+              <w:left w:type="dxa" w:w="95"/>
+              <w:bottom w:type="dxa" w:w="60"/>
+              <w:right w:type="dxa" w:w="95"/>
+            </w:tcMar>
+            <w:vAlign w:val="center"/>
+          </w:tcPr>
+          <w:p>
+            <w:pPr>
+              <w:spacing w:after="0" w:line="265"/>
+            </w:pPr>
+            <w:r>
+              <w:rPr>
+                <w:rFonts w:ascii="Arial" w:cs="Arial" w:eastAsia="Arial" w:hAnsi="Arial"/>
+                <w:b w:val="false"/>
+                <w:bCs w:val="false"/>
+                <w:color w:val="1B1B1B"/>
+                <w:sz w:val="18"/>
+                <w:szCs w:val="18"/>
+              </w:rPr>
+              <w:t xml:space="preserve">If there is a rider, include the rider in the box.</w:t>
+            </w:r>
+          </w:p>
+        </w:tc>
+        <w:tc>
+          <w:tcPr>
+            <w:tcW w:type="dxa" w:w="2860"/>
+            <w:tcMar>
+              <w:top w:type="dxa" w:w="60"/>
+              <w:left w:type="dxa" w:w="95"/>
+              <w:bottom w:type="dxa" w:w="60"/>
+              <w:right w:type="dxa" w:w="95"/>
+            </w:tcMar>
+            <w:vAlign w:val="center"/>
+          </w:tcPr>
+          <w:p>
+            <w:pPr>
+              <w:spacing w:after="0" w:line="265"/>
+            </w:pPr>
+            <w:r>
+              <w:rPr>
+                <w:rFonts w:ascii="Arial" w:cs="Arial" w:eastAsia="Arial" w:hAnsi="Arial"/>
+                <w:b w:val="false"/>
+                <w:bCs w:val="false"/>
+                <w:color w:val="1B1B1B"/>
+                <w:sz w:val="18"/>
+                <w:szCs w:val="18"/>
+              </w:rPr>
+              <w:t xml:space="preserve">Người và xe đi cùng nhau</w:t>
+            </w:r>
+          </w:p>
+        </w:tc>
+      </w:tr>
+      <w:tr>
+        <w:trPr>
+          <w:cantSplit/>
+          <w:tblHeader w:val="false"/>
+        </w:trPr>
+        <w:tc>
+          <w:tcPr>
+            <w:tcW w:type="dxa" w:w="2900"/>
+            <w:tcMar>
+              <w:top w:type="dxa" w:w="60"/>
+              <w:left w:type="dxa" w:w="95"/>
+              <w:bottom w:type="dxa" w:w="60"/>
+              <w:right w:type="dxa" w:w="95"/>
+            </w:tcMar>
+            <w:vAlign w:val="center"/>
+          </w:tcPr>
+          <w:p>
+            <w:pPr>
+              <w:spacing w:after="0" w:line="265"/>
+            </w:pPr>
+            <w:r>
+              <w:rPr>
+                <w:rFonts w:ascii="Arial" w:cs="Arial" w:eastAsia="Arial" w:hAnsi="Arial"/>
+                <w:b w:val="false"/>
+                <w:bCs w:val="false"/>
+                <w:color w:val="1B1B1B"/>
+                <w:sz w:val="18"/>
+                <w:szCs w:val="18"/>
+              </w:rPr>
+              <w:t xml:space="preserve">Người đứng cạnh: khoanh riêng</w:t>
+            </w:r>
+          </w:p>
+        </w:tc>
+        <w:tc>
+          <w:tcPr>
+            <w:tcW w:type="dxa" w:w="3600"/>
+            <w:tcMar>
+              <w:top w:type="dxa" w:w="60"/>
+              <w:left w:type="dxa" w:w="95"/>
+              <w:bottom w:type="dxa" w:w="60"/>
+              <w:right w:type="dxa" w:w="95"/>
+            </w:tcMar>
+            <w:vAlign w:val="center"/>
+          </w:tcPr>
+          <w:p>
+            <w:pPr>
+              <w:spacing w:after="0" w:line="265"/>
+            </w:pPr>
+            <w:r>
+              <w:rPr>
+                <w:rFonts w:ascii="Arial" w:cs="Arial" w:eastAsia="Arial" w:hAnsi="Arial"/>
+                <w:b w:val="false"/>
+                <w:bCs w:val="false"/>
+                <w:color w:val="1B1B1B"/>
+                <w:sz w:val="18"/>
+                <w:szCs w:val="18"/>
+              </w:rPr>
+              <w:t xml:space="preserve">…standing next to the motorcycle, do NOT include…</w:t>
+            </w:r>
+          </w:p>
+        </w:tc>
+        <w:tc>
+          <w:tcPr>
+            <w:tcW w:type="dxa" w:w="2860"/>
+            <w:tcMar>
+              <w:top w:type="dxa" w:w="60"/>
+              <w:left w:type="dxa" w:w="95"/>
+              <w:bottom w:type="dxa" w:w="60"/>
+              <w:right w:type="dxa" w:w="95"/>
+            </w:tcMar>
+            <w:vAlign w:val="center"/>
+          </w:tcPr>
+          <w:p>
+            <w:pPr>
+              <w:spacing w:after="0" w:line="265"/>
+            </w:pPr>
+            <w:r>
+              <w:rPr>
+                <w:rFonts w:ascii="Arial" w:cs="Arial" w:eastAsia="Arial" w:hAnsi="Arial"/>
+                <w:b w:val="false"/>
+                <w:bCs w:val="false"/>
+                <w:color w:val="1B1B1B"/>
+                <w:sz w:val="18"/>
+                <w:szCs w:val="18"/>
+              </w:rPr>
+              <w:t xml:space="preserve">Người đó có thể đi chỗ khác</w:t>
+            </w:r>
+          </w:p>
+        </w:tc>
+      </w:tr>
+      <w:tr>
+        <w:trPr>
+          <w:cantSplit/>
+          <w:tblHeader w:val="false"/>
+        </w:trPr>
+        <w:tc>
+          <w:tcPr>
+            <w:tcW w:type="dxa" w:w="2900"/>
+            <w:tcMar>
+              <w:top w:type="dxa" w:w="60"/>
+              <w:left w:type="dxa" w:w="95"/>
+              <w:bottom w:type="dxa" w:w="60"/>
+              <w:right w:type="dxa" w:w="95"/>
+            </w:tcMar>
+            <w:vAlign w:val="center"/>
+          </w:tcPr>
+          <w:p>
+            <w:pPr>
+              <w:spacing w:after="0" w:line="265"/>
+            </w:pPr>
+            <w:r>
+              <w:rPr>
+                <w:rFonts w:ascii="Arial" w:cs="Arial" w:eastAsia="Arial" w:hAnsi="Arial"/>
+                <w:b w:val="false"/>
+                <w:bCs w:val="false"/>
+                <w:color w:val="1B1B1B"/>
+                <w:sz w:val="18"/>
+                <w:szCs w:val="18"/>
+              </w:rPr>
+              <w:t xml:space="preserve">Độ thấy được 4 mức</w:t>
+            </w:r>
+          </w:p>
+        </w:tc>
+        <w:tc>
+          <w:tcPr>
+            <w:tcW w:type="dxa" w:w="3600"/>
+            <w:tcMar>
+              <w:top w:type="dxa" w:w="60"/>
+              <w:left w:type="dxa" w:w="95"/>
+              <w:bottom w:type="dxa" w:w="60"/>
+              <w:right w:type="dxa" w:w="95"/>
+            </w:tcMar>
+            <w:vAlign w:val="center"/>
+          </w:tcPr>
+          <w:p>
+            <w:pPr>
+              <w:spacing w:after="0" w:line="265"/>
+            </w:pPr>
+            <w:r>
+              <w:rPr>
+                <w:rFonts w:ascii="Arial" w:cs="Arial" w:eastAsia="Arial" w:hAnsi="Arial"/>
+                <w:b w:val="false"/>
+                <w:bCs w:val="false"/>
+                <w:color w:val="1B1B1B"/>
+                <w:sz w:val="18"/>
+                <w:szCs w:val="18"/>
+              </w:rPr>
+              <w:t xml:space="preserve">0–40%, 41–60%, 61–80%, 81–100%</w:t>
+            </w:r>
+          </w:p>
+        </w:tc>
+        <w:tc>
+          <w:tcPr>
+            <w:tcW w:type="dxa" w:w="2860"/>
+            <w:tcMar>
+              <w:top w:type="dxa" w:w="60"/>
+              <w:left w:type="dxa" w:w="95"/>
+              <w:bottom w:type="dxa" w:w="60"/>
+              <w:right w:type="dxa" w:w="95"/>
+            </w:tcMar>
+            <w:vAlign w:val="center"/>
+          </w:tcPr>
+          <w:p>
+            <w:pPr>
+              <w:spacing w:after="0" w:line="265"/>
+            </w:pPr>
+            <w:r>
+              <w:rPr>
+                <w:rFonts w:ascii="Arial" w:cs="Arial" w:eastAsia="Arial" w:hAnsi="Arial"/>
+                <w:b w:val="false"/>
+                <w:bCs w:val="false"/>
+                <w:color w:val="1B1B1B"/>
+                <w:sz w:val="18"/>
+                <w:szCs w:val="18"/>
+              </w:rPr>
+              <w:t xml:space="preserve">Biết vật nào bị che nhiều</w:t>
+            </w:r>
+          </w:p>
+        </w:tc>
+      </w:tr>
+    </w:tbl>
+    <w:p>
+      <w:pPr>
+        <w:spacing w:after="0"/>
+      </w:pPr>
       <w:r>
         <w:rPr>
           <w:rFonts w:ascii="Arial" w:cs="Arial" w:eastAsia="Arial" w:hAnsi="Arial"/>
@@ -6434,45 +6491,7 @@
           <w:sz w:val="22"/>
           <w:szCs w:val="22"/>
         </w:rPr>
-        <w:t xml:space="preserve">, loại xe máy. Đổi sang quy tắc khoanh riêng từng người cũng được, quan trọng là </w:t>
-      </w:r>
-      <w:r>
-        <w:rPr>
-          <w:rFonts w:ascii="Arial" w:cs="Arial" w:eastAsia="Arial" w:hAnsi="Arial"/>
-          <w:b/>
-          <w:bCs/>
-          <w:color w:val="24405C"/>
-          <w:sz w:val="22"/>
-          <w:szCs w:val="22"/>
-        </w:rPr>
-        <w:t xml:space="preserve">cả bộ dữ liệu dùng cùng một quy tắc</w:t>
-      </w:r>
-      <w:r>
-        <w:rPr>
-          <w:rFonts w:ascii="Arial" w:cs="Arial" w:eastAsia="Arial" w:hAnsi="Arial"/>
-          <w:color w:val="1B1B1B"/>
-          <w:sz w:val="22"/>
-          <w:szCs w:val="22"/>
-        </w:rPr>
-        <w:t xml:space="preserve">.</w:t>
-      </w:r>
-    </w:p>
-    <w:p>
-      <w:pPr>
-        <w:pStyle w:val="Heading2"/>
-        <w:keepNext/>
-        <w:spacing w:after="130" w:before="300"/>
-      </w:pPr>
-      <w:r>
-        <w:rPr>
-          <w:rFonts w:ascii="Arial" w:cs="Arial" w:eastAsia="Arial" w:hAnsi="Arial"/>
-          <w:b/>
-          <w:bCs/>
-          <w:color w:val="24405C"/>
-          <w:sz w:val="24"/>
-          <w:szCs w:val="24"/>
-        </w:rPr>
-        <w:t xml:space="preserve">IoU: hai khung giống nhau bao nhiêu</w:t>
+        <w:t xml:space="preserve"/>
       </w:r>
     </w:p>
     <w:p>
@@ -6484,7 +6503,7 @@
       <w:r>
         <w:drawing>
           <wp:inline distT="0" distB="0" distL="0" distR="0">
-            <wp:extent cx="5334000" cy="2038350"/>
+            <wp:extent cx="5334000" cy="1990725"/>
             <wp:effectExtent t="0" r="0" b="0" l="0"/>
             <wp:docPr id="1" name="" descr="" title=""/>
             <wp:cNvGraphicFramePr>
@@ -6509,6 +6528,144 @@
                   <pic:spPr bwMode="auto">
                     <a:xfrm>
                       <a:off x="0" y="0"/>
+                      <a:ext cx="5334000" cy="1990725"/>
+                    </a:xfrm>
+                    <a:prstGeom prst="rect">
+                      <a:avLst/>
+                    </a:prstGeom>
+                  </pic:spPr>
+                </pic:pic>
+              </a:graphicData>
+            </a:graphic>
+          </wp:inline>
+        </w:drawing>
+      </w:r>
+    </w:p>
+    <w:p>
+      <w:pPr>
+        <w:keepNext w:val="false"/>
+        <w:spacing w:after="70" w:before="190"/>
+      </w:pPr>
+      <w:r>
+        <w:rPr>
+          <w:rFonts w:ascii="Arial" w:cs="Arial" w:eastAsia="Arial" w:hAnsi="Arial"/>
+          <w:b/>
+          <w:bCs/>
+          <w:color w:val="24405C"/>
+          <w:sz w:val="19"/>
+          <w:szCs w:val="19"/>
+        </w:rPr>
+        <w:t xml:space="preserve">Người lái nằm trong khung của xe: trái xe đạp scene-0103, phải xe máy scene-1100 (khung chính thức). Dữ liệu: nuScenes (Motional), CC BY-NC-SA 4.0</w:t>
+      </w:r>
+    </w:p>
+    <w:p>
+      <w:pPr>
+        <w:widowControl/>
+        <w:spacing w:after="100" w:before="0" w:line="312"/>
+        <w:ind w:left="0" w:firstLine="0"/>
+      </w:pPr>
+      <w:r>
+        <w:rPr>
+          <w:rFonts w:ascii="Arial" w:cs="Arial" w:eastAsia="Arial" w:hAnsi="Arial"/>
+          <w:color w:val="1B1B1B"/>
+          <w:sz w:val="22"/>
+          <w:szCs w:val="22"/>
+        </w:rPr>
+        <w:t xml:space="preserve">Ở Hà Nội, một xe máy chở ba người, theo quy tắc nuScenes là </w:t>
+      </w:r>
+      <w:r>
+        <w:rPr>
+          <w:rFonts w:ascii="Arial" w:cs="Arial" w:eastAsia="Arial" w:hAnsi="Arial"/>
+          <w:b/>
+          <w:bCs/>
+          <w:color w:val="24405C"/>
+          <w:sz w:val="22"/>
+          <w:szCs w:val="22"/>
+        </w:rPr>
+        <w:t xml:space="preserve">một khung</w:t>
+      </w:r>
+      <w:r>
+        <w:rPr>
+          <w:rFonts w:ascii="Arial" w:cs="Arial" w:eastAsia="Arial" w:hAnsi="Arial"/>
+          <w:color w:val="1B1B1B"/>
+          <w:sz w:val="22"/>
+          <w:szCs w:val="22"/>
+        </w:rPr>
+        <w:t xml:space="preserve">, loại xe máy. Đổi sang quy tắc khoanh riêng từng người cũng được, quan trọng là </w:t>
+      </w:r>
+      <w:r>
+        <w:rPr>
+          <w:rFonts w:ascii="Arial" w:cs="Arial" w:eastAsia="Arial" w:hAnsi="Arial"/>
+          <w:b/>
+          <w:bCs/>
+          <w:color w:val="24405C"/>
+          <w:sz w:val="22"/>
+          <w:szCs w:val="22"/>
+        </w:rPr>
+        <w:t xml:space="preserve">cả bộ dữ liệu dùng cùng một quy tắc</w:t>
+      </w:r>
+      <w:r>
+        <w:rPr>
+          <w:rFonts w:ascii="Arial" w:cs="Arial" w:eastAsia="Arial" w:hAnsi="Arial"/>
+          <w:color w:val="1B1B1B"/>
+          <w:sz w:val="22"/>
+          <w:szCs w:val="22"/>
+        </w:rPr>
+        <w:t xml:space="preserve">.</w:t>
+      </w:r>
+    </w:p>
+    <w:p>
+      <w:pPr>
+        <w:pStyle w:val="Heading2"/>
+        <w:keepNext/>
+        <w:spacing w:after="130" w:before="300"/>
+      </w:pPr>
+      <w:r>
+        <w:rPr>
+          <w:rFonts w:ascii="Arial" w:cs="Arial" w:eastAsia="Arial" w:hAnsi="Arial"/>
+          <w:b/>
+          <w:bCs/>
+          <w:color w:val="24405C"/>
+          <w:sz w:val="24"/>
+          <w:szCs w:val="24"/>
+        </w:rPr>
+        <w:t xml:space="preserve">IoU: hai khung giống nhau bao nhiêu</w:t>
+      </w:r>
+    </w:p>
+    <w:p>
+      <w:pPr>
+        <w:keepNext/>
+        <w:spacing w:after="60" w:before="60"/>
+        <w:jc w:val="center"/>
+      </w:pPr>
+      <w:r>
+        <w:drawing>
+          <wp:inline distT="0" distB="0" distL="0" distR="0">
+            <wp:extent cx="5334000" cy="2038350"/>
+            <wp:effectExtent t="0" r="0" b="0" l="0"/>
+            <wp:docPr id="1" name="" descr="" title=""/>
+            <wp:cNvGraphicFramePr>
+              <a:graphicFrameLocks xmlns:a="http://schemas.openxmlformats.org/drawingml/2006/main" noChangeAspect="1"/>
+            </wp:cNvGraphicFramePr>
+            <a:graphic xmlns:a="http://schemas.openxmlformats.org/drawingml/2006/main">
+              <a:graphicData uri="http://schemas.openxmlformats.org/drawingml/2006/picture">
+                <pic:pic xmlns:pic="http://schemas.openxmlformats.org/drawingml/2006/picture">
+                  <pic:nvPicPr>
+                    <pic:cNvPr id="0" name="" descr=""/>
+                    <pic:cNvPicPr>
+                      <a:picLocks noChangeAspect="1" noChangeArrowheads="1"/>
+                    </pic:cNvPicPr>
+                  </pic:nvPicPr>
+                  <pic:blipFill>
+                    <a:blip r:embed="rId25" cstate="none"/>
+                    <a:srcRect/>
+                    <a:stretch>
+                      <a:fillRect/>
+                    </a:stretch>
+                  </pic:blipFill>
+                  <pic:spPr bwMode="auto">
+                    <a:xfrm>
+                      <a:off x="0" y="0"/>
                       <a:ext cx="5334000" cy="2038350"/>
                     </a:xfrm>
                     <a:prstGeom prst="rect">
@@ -6635,7 +6792,7 @@
                     </pic:cNvPicPr>
                   </pic:nvPicPr>
                   <pic:blipFill>
-                    <a:blip r:embed="rId25" cstate="none"/>
+                    <a:blip r:embed="rId26" cstate="none"/>
                     <a:srcRect/>
                     <a:stretch>
                       <a:fillRect/>

</xml_diff>

<commit_message>
Week 8: learning-rate animation on slide 11; add 10 watched-and-transcribed video clips to L1/L2 slides and handouts
Co-Authored-By: Claude Opus 5.5 <noreply@anthropic.com>
</commit_message>
<xml_diff>
--- a/第八週(10-29)/Nguyên lý xe tự lái_Tuần 8_Tài liệu học tập.docx
+++ b/第八週(10-29)/Nguyên lý xe tự lái_Tuần 8_Tài liệu học tập.docx
@@ -5293,6 +5293,153 @@
         <w:t xml:space="preserve">. Hàng rơi trên đường, chướng ngại lạ, bộ phát hiện không nhận ra nhưng lưới vẫn tô đỏ. Cẩn thận: «chưa biết» không phải «trống».</w:t>
       </w:r>
     </w:p>
+    <w:tbl>
+      <w:tblPr>
+        <w:tblW w:type="dxa" w:w="9360"/>
+        <w:tblBorders>
+          <w:top w:val="single" w:color="A8B2BA" w:sz="6"/>
+          <w:left w:val="none"/>
+          <w:bottom w:val="single" w:color="A8B2BA" w:sz="6"/>
+          <w:right w:val="none"/>
+          <w:insideH w:val="none"/>
+          <w:insideV w:val="none"/>
+        </w:tblBorders>
+      </w:tblPr>
+      <w:tblGrid>
+        <w:gridCol w:w="9360"/>
+      </w:tblGrid>
+      <w:tr>
+        <w:trPr>
+          <w:cantSplit/>
+        </w:trPr>
+        <w:tc>
+          <w:tcPr>
+            <w:tcW w:type="dxa" w:w="9360"/>
+            <w:shd w:fill="F6F8F9" w:color="auto" w:val="clear"/>
+            <w:tcMar>
+              <w:top w:type="dxa" w:w="140"/>
+              <w:left w:type="dxa" w:w="200"/>
+              <w:bottom w:type="dxa" w:w="140"/>
+              <w:right w:type="dxa" w:w="180"/>
+            </w:tcMar>
+          </w:tcPr>
+          <w:p>
+            <w:pPr>
+              <w:spacing w:after="90" w:line="300"/>
+            </w:pPr>
+            <w:r>
+              <w:rPr>
+                <w:rFonts w:ascii="Arial" w:cs="Arial" w:eastAsia="Arial" w:hAnsi="Arial"/>
+                <w:b/>
+                <w:bCs/>
+                <w:color w:val="24405C"/>
+                <w:sz w:val="20"/>
+                <w:szCs w:val="20"/>
+              </w:rPr>
+              <w:t xml:space="preserve">Xem thêm (video tiếng Anh, có thể bật phụ đề tự dịch)</w:t>
+            </w:r>
+          </w:p>
+          <w:p>
+            <w:pPr>
+              <w:spacing w:after="80" w:line="310"/>
+            </w:pPr>
+            <w:r>
+              <w:rPr>
+                <w:rFonts w:ascii="Arial" w:cs="Arial" w:eastAsia="Arial" w:hAnsi="Arial"/>
+                <w:color w:val="1B1B1B"/>
+                <w:sz w:val="20"/>
+                <w:szCs w:val="20"/>
+              </w:rPr>
+              <w:t xml:space="preserve">Bộ lọc Bayer và bù màu (Computerphile): youtu.be/LWxu4rkZBLw, 0:17–5:46</w:t>
+            </w:r>
+          </w:p>
+          <w:p>
+            <w:pPr>
+              <w:spacing w:after="80" w:line="310"/>
+            </w:pPr>
+            <w:r>
+              <w:rPr>
+                <w:rFonts w:ascii="Arial" w:cs="Arial" w:eastAsia="Arial" w:hAnsi="Arial"/>
+                <w:color w:val="1B1B1B"/>
+                <w:sz w:val="20"/>
+                <w:szCs w:val="20"/>
+              </w:rPr>
+              <w:t xml:space="preserve">Mạng nơ-ron từng lớp (3Blue1Brown tập 1): youtu.be/aircAruvnKk, 5:32–8:39</w:t>
+            </w:r>
+          </w:p>
+          <w:p>
+            <w:pPr>
+              <w:spacing w:after="80" w:line="310"/>
+            </w:pPr>
+            <w:r>
+              <w:rPr>
+                <w:rFonts w:ascii="Arial" w:cs="Arial" w:eastAsia="Arial" w:hAnsi="Arial"/>
+                <w:color w:val="1B1B1B"/>
+                <w:sz w:val="20"/>
+                <w:szCs w:val="20"/>
+              </w:rPr>
+              <w:t xml:space="preserve">Hạ gradient: bóng lăn xuống dốc (3Blue1Brown tập 2): youtu.be/IHZwWFHWa-w, 5:12–6:54</w:t>
+            </w:r>
+          </w:p>
+          <w:p>
+            <w:pPr>
+              <w:spacing w:after="80" w:line="310"/>
+            </w:pPr>
+            <w:r>
+              <w:rPr>
+                <w:rFonts w:ascii="Arial" w:cs="Arial" w:eastAsia="Arial" w:hAnsi="Arial"/>
+                <w:color w:val="1B1B1B"/>
+                <w:sz w:val="20"/>
+                <w:szCs w:val="20"/>
+              </w:rPr>
+              <w:t xml:space="preserve">YOLO phát hiện vật thể thời gian thực (TED): youtu.be/Cgxsv1riJhI, 0:12–5:48</w:t>
+            </w:r>
+          </w:p>
+          <w:p>
+            <w:pPr>
+              <w:spacing w:after="80" w:line="310"/>
+            </w:pPr>
+            <w:r>
+              <w:rPr>
+                <w:rFonts w:ascii="Arial" w:cs="Arial" w:eastAsia="Arial" w:hAnsi="Arial"/>
+                <w:color w:val="1B1B1B"/>
+                <w:sz w:val="20"/>
+                <w:szCs w:val="20"/>
+              </w:rPr>
+              <w:t xml:space="preserve">Phân vùng từng điểm ảnh (NVIDIA DRIVE Labs 14): youtu.be/HS1wV9NMLr8, 1:27</w:t>
+            </w:r>
+          </w:p>
+          <w:p>
+            <w:pPr>
+              <w:spacing w:after="80" w:line="310"/>
+            </w:pPr>
+            <w:r>
+              <w:rPr>
+                <w:rFonts w:ascii="Arial" w:cs="Arial" w:eastAsia="Arial" w:hAnsi="Arial"/>
+                <w:color w:val="1B1B1B"/>
+                <w:sz w:val="20"/>
+                <w:szCs w:val="20"/>
+              </w:rPr>
+              <w:t xml:space="preserve">Phát hiện người đi bộ ban đêm và học chủ động (NVIDIA DRIVE Labs 19): youtu.be/4aq13pB9s7c, 1:51</w:t>
+            </w:r>
+          </w:p>
+          <w:p>
+            <w:pPr>
+              <w:spacing w:after="0" w:line="310"/>
+            </w:pPr>
+            <w:r>
+              <w:rPr>
+                <w:rFonts w:ascii="Arial" w:cs="Arial" w:eastAsia="Arial" w:hAnsi="Arial"/>
+                <w:color w:val="1B1B1B"/>
+                <w:sz w:val="20"/>
+                <w:szCs w:val="20"/>
+              </w:rPr>
+              <w:t xml:space="preserve">Lưới chiếm chỗ trong 5 phút (Cyrill Stachniss): youtu.be/8ckhPViqneg, 0:04–2:21</w:t>
+            </w:r>
+          </w:p>
+        </w:tc>
+      </w:tr>
+    </w:tbl>
     <w:p>
       <w:pPr>
         <w:pStyle w:val="Heading1"/>
@@ -6614,6 +6761,69 @@
         <w:t xml:space="preserve">.</w:t>
       </w:r>
     </w:p>
+    <w:tbl>
+      <w:tblPr>
+        <w:tblW w:type="dxa" w:w="9360"/>
+        <w:tblBorders>
+          <w:top w:val="single" w:color="A8B2BA" w:sz="6"/>
+          <w:left w:val="none"/>
+          <w:bottom w:val="single" w:color="A8B2BA" w:sz="6"/>
+          <w:right w:val="none"/>
+          <w:insideH w:val="none"/>
+          <w:insideV w:val="none"/>
+        </w:tblBorders>
+      </w:tblPr>
+      <w:tblGrid>
+        <w:gridCol w:w="9360"/>
+      </w:tblGrid>
+      <w:tr>
+        <w:trPr>
+          <w:cantSplit/>
+        </w:trPr>
+        <w:tc>
+          <w:tcPr>
+            <w:tcW w:type="dxa" w:w="9360"/>
+            <w:shd w:fill="F6F8F9" w:color="auto" w:val="clear"/>
+            <w:tcMar>
+              <w:top w:type="dxa" w:w="140"/>
+              <w:left w:type="dxa" w:w="200"/>
+              <w:bottom w:type="dxa" w:w="140"/>
+              <w:right w:type="dxa" w:w="180"/>
+            </w:tcMar>
+          </w:tcPr>
+          <w:p>
+            <w:pPr>
+              <w:spacing w:after="90" w:line="300"/>
+            </w:pPr>
+            <w:r>
+              <w:rPr>
+                <w:rFonts w:ascii="Arial" w:cs="Arial" w:eastAsia="Arial" w:hAnsi="Arial"/>
+                <w:b/>
+                <w:bCs/>
+                <w:color w:val="24405C"/>
+                <w:sz w:val="20"/>
+                <w:szCs w:val="20"/>
+              </w:rPr>
+              <w:t xml:space="preserve">Xem thêm</w:t>
+            </w:r>
+          </w:p>
+          <w:p>
+            <w:pPr>
+              <w:spacing w:after="0" w:line="310"/>
+            </w:pPr>
+            <w:r>
+              <w:rPr>
+                <w:rFonts w:ascii="Arial" w:cs="Arial" w:eastAsia="Arial" w:hAnsi="Arial"/>
+                <w:color w:val="1B1B1B"/>
+                <w:sz w:val="20"/>
+                <w:szCs w:val="20"/>
+              </w:rPr>
+              <w:t xml:space="preserve">Vẽ khung bằng công cụ gán nhãn CVAT (hướng dẫn chính thức, tiếng Anh): youtu.be/TDae8RkGbKk, 0:16–2:47.</w:t>
+            </w:r>
+          </w:p>
+        </w:tc>
+      </w:tr>
+    </w:tbl>
     <w:p>
       <w:pPr>
         <w:pStyle w:val="Heading2"/>

</xml_diff>

<commit_message>
Week 8 L1: explain what first-layer filters are for (strokes analogy) and add a slide showing three real filter responses
Co-Authored-By: Claude Opus 5.5 <noreply@anthropic.com>
</commit_message>
<xml_diff>
--- a/第八週(10-29)/Nguyên lý xe tự lái_Tuần 8_Tài liệu học tập.docx
+++ b/第八週(10-29)/Nguyên lý xe tự lái_Tuần 8_Tài liệu học tập.docx
@@ -2363,7 +2363,7 @@
       <w:r>
         <w:drawing>
           <wp:inline distT="0" distB="0" distL="0" distR="0">
-            <wp:extent cx="4000500" cy="2038350"/>
+            <wp:extent cx="4000500" cy="2057400"/>
             <wp:effectExtent t="0" r="0" b="0" l="0"/>
             <wp:docPr id="1" name="" descr="" title=""/>
             <wp:cNvGraphicFramePr>
@@ -2388,7 +2388,7 @@
                   <pic:spPr bwMode="auto">
                     <a:xfrm>
                       <a:off x="0" y="0"/>
-                      <a:ext cx="4000500" cy="2038350"/>
+                      <a:ext cx="4000500" cy="2057400"/>
                     </a:xfrm>
                     <a:prstGeom prst="rect">
                       <a:avLst/>
@@ -2420,6 +2420,42 @@
     </w:p>
     <w:p>
       <w:pPr>
+        <w:widowControl/>
+        <w:spacing w:after="100" w:before="0" w:line="312"/>
+        <w:ind w:left="0" w:firstLine="0"/>
+      </w:pPr>
+      <w:r>
+        <w:rPr>
+          <w:rFonts w:ascii="Arial" w:cs="Arial" w:eastAsia="Arial" w:hAnsi="Arial"/>
+          <w:color w:val="1B1B1B"/>
+          <w:sz w:val="22"/>
+          <w:szCs w:val="22"/>
+        </w:rPr>
+        <w:t xml:space="preserve">32 kính lọc này không giống xe vì chúng vốn không phải mảnh của xe, mà là </w:t>
+      </w:r>
+      <w:r>
+        <w:rPr>
+          <w:rFonts w:ascii="Arial" w:cs="Arial" w:eastAsia="Arial" w:hAnsi="Arial"/>
+          <w:b/>
+          <w:bCs/>
+          <w:color w:val="24405C"/>
+          <w:sz w:val="22"/>
+          <w:szCs w:val="22"/>
+        </w:rPr>
+        <w:t xml:space="preserve">nét</w:t>
+      </w:r>
+      <w:r>
+        <w:rPr>
+          <w:rFonts w:ascii="Arial" w:cs="Arial" w:eastAsia="Arial" w:hAnsi="Arial"/>
+          <w:color w:val="1B1B1B"/>
+          <w:sz w:val="22"/>
+          <w:szCs w:val="22"/>
+        </w:rPr>
+        <w:t xml:space="preserve"> nhỏ nhất của ảnh: như chữ được ghép từ nét ngang, nét dọc, nét chấm, bản thân nét không giống chữ, ghép lại mới thành chữ. Mỗi kính lọc trượt khắp ảnh, mỗi chỗ hỏi: «chỗ này có giống tôi không?» Giống thì sáng, không giống thì tối, được một bản đồ «chỗ nào có nét này». Hình dưới là ba ví dụ thật.</w:t>
+      </w:r>
+    </w:p>
+    <w:p>
+      <w:pPr>
         <w:keepNext/>
         <w:spacing w:after="60" w:before="60"/>
         <w:jc w:val="center"/>
@@ -2427,7 +2463,7 @@
       <w:r>
         <w:drawing>
           <wp:inline distT="0" distB="0" distL="0" distR="0">
-            <wp:extent cx="6096000" cy="1114425"/>
+            <wp:extent cx="6096000" cy="2371725"/>
             <wp:effectExtent t="0" r="0" b="0" l="0"/>
             <wp:docPr id="1" name="" descr="" title=""/>
             <wp:cNvGraphicFramePr>
@@ -2452,7 +2488,7 @@
                   <pic:spPr bwMode="auto">
                     <a:xfrm>
                       <a:off x="0" y="0"/>
-                      <a:ext cx="6096000" cy="1114425"/>
+                      <a:ext cx="6096000" cy="2371725"/>
                     </a:xfrm>
                     <a:prstGeom prst="rect">
                       <a:avLst/>
@@ -2479,182 +2515,7 @@
           <w:sz w:val="19"/>
           <w:szCs w:val="19"/>
         </w:rPr>
-        <w:t xml:space="preserve">Cùng ảnh đưa vào YOLOX-s, kết quả thật ở ba độ sâu (sáng = có phản ứng): lớp 1 là đường nét, đoạn 2 là hoa văn, đoạn sau chỉ còn vị trí năm người sáng lên. Ảnh: nuScenes (Motional), CC BY-NC-SA 4.0</w:t>
-      </w:r>
-    </w:p>
-    <w:p>
-      <w:pPr>
-        <w:pStyle w:val="Heading2"/>
-        <w:keepNext/>
-        <w:spacing w:after="130" w:before="300"/>
-      </w:pPr>
-      <w:r>
-        <w:rPr>
-          <w:rFonts w:ascii="Arial" w:cs="Arial" w:eastAsia="Arial" w:hAnsi="Arial"/>
-          <w:b/>
-          <w:bCs/>
-          <w:color w:val="24405C"/>
-          <w:sz w:val="24"/>
-          <w:szCs w:val="24"/>
-        </w:rPr>
-        <w:t xml:space="preserve">«Học» là gì: đoán, so đáp án, sửa một chút</w:t>
-      </w:r>
-    </w:p>
-    <w:p>
-      <w:pPr>
-        <w:pStyle w:val="ListParagraph"/>
-        <w:widowControl/>
-        <w:numPr>
-          <w:ilvl w:val="0"/>
-          <w:numId w:val="2"/>
-        </w:numPr>
-        <w:spacing w:after="80" w:line="320"/>
-      </w:pPr>
-      <w:r>
-        <w:rPr>
-          <w:rFonts w:ascii="Arial" w:cs="Arial" w:eastAsia="Arial" w:hAnsi="Arial"/>
-          <w:b/>
-          <w:bCs/>
-          <w:color w:val="24405C"/>
-          <w:sz w:val="22"/>
-          <w:szCs w:val="22"/>
-        </w:rPr>
-        <w:t xml:space="preserve">Đoán</w:t>
-      </w:r>
-      <w:r>
-        <w:rPr>
-          <w:rFonts w:ascii="Arial" w:cs="Arial" w:eastAsia="Arial" w:hAnsi="Arial"/>
-          <w:color w:val="1B1B1B"/>
-          <w:sz w:val="22"/>
-          <w:szCs w:val="22"/>
-        </w:rPr>
-        <w:t xml:space="preserve">: đưa một ảnh vào, mô hình đoán «ở đây có một người, khung ở đây».</w:t>
-      </w:r>
-    </w:p>
-    <w:p>
-      <w:pPr>
-        <w:pStyle w:val="ListParagraph"/>
-        <w:widowControl/>
-        <w:numPr>
-          <w:ilvl w:val="0"/>
-          <w:numId w:val="2"/>
-        </w:numPr>
-        <w:spacing w:after="80" w:line="320"/>
-      </w:pPr>
-      <w:r>
-        <w:rPr>
-          <w:rFonts w:ascii="Arial" w:cs="Arial" w:eastAsia="Arial" w:hAnsi="Arial"/>
-          <w:b/>
-          <w:bCs/>
-          <w:color w:val="24405C"/>
-          <w:sz w:val="22"/>
-          <w:szCs w:val="22"/>
-        </w:rPr>
-        <w:t xml:space="preserve">So đáp án</w:t>
-      </w:r>
-      <w:r>
-        <w:rPr>
-          <w:rFonts w:ascii="Arial" w:cs="Arial" w:eastAsia="Arial" w:hAnsi="Arial"/>
-          <w:color w:val="1B1B1B"/>
-          <w:sz w:val="22"/>
-          <w:szCs w:val="22"/>
-        </w:rPr>
-        <w:t xml:space="preserve">: so với đáp án con người gán nhãn, lệch bao nhiêu.</w:t>
-      </w:r>
-    </w:p>
-    <w:p>
-      <w:pPr>
-        <w:pStyle w:val="ListParagraph"/>
-        <w:widowControl/>
-        <w:numPr>
-          <w:ilvl w:val="0"/>
-          <w:numId w:val="2"/>
-        </w:numPr>
-        <w:spacing w:after="80" w:line="320"/>
-      </w:pPr>
-      <w:r>
-        <w:rPr>
-          <w:rFonts w:ascii="Arial" w:cs="Arial" w:eastAsia="Arial" w:hAnsi="Arial"/>
-          <w:b/>
-          <w:bCs/>
-          <w:color w:val="24405C"/>
-          <w:sz w:val="22"/>
-          <w:szCs w:val="22"/>
-        </w:rPr>
-        <w:t xml:space="preserve">Sửa một chút</w:t>
-      </w:r>
-      <w:r>
-        <w:rPr>
-          <w:rFonts w:ascii="Arial" w:cs="Arial" w:eastAsia="Arial" w:hAnsi="Arial"/>
-          <w:color w:val="1B1B1B"/>
-          <w:sz w:val="22"/>
-          <w:szCs w:val="22"/>
-        </w:rPr>
-        <w:t xml:space="preserve">: chỉnh các con số bên trong (ngưỡng ở trên chỉ 1 số; YOLOX khoảng 9 triệu số) để lần sau lệch ít hơn.</w:t>
-      </w:r>
-    </w:p>
-    <w:p>
-      <w:pPr>
-        <w:pStyle w:val="ListParagraph"/>
-        <w:widowControl/>
-        <w:numPr>
-          <w:ilvl w:val="0"/>
-          <w:numId w:val="2"/>
-        </w:numPr>
-        <w:spacing w:after="80" w:line="320"/>
-      </w:pPr>
-      <w:r>
-        <w:rPr>
-          <w:rFonts w:ascii="Arial" w:cs="Arial" w:eastAsia="Arial" w:hAnsi="Arial"/>
-          <w:b/>
-          <w:bCs/>
-          <w:color w:val="24405C"/>
-          <w:sz w:val="22"/>
-          <w:szCs w:val="22"/>
-        </w:rPr>
-        <w:t xml:space="preserve">Lặp lại</w:t>
-      </w:r>
-      <w:r>
-        <w:rPr>
-          <w:rFonts w:ascii="Arial" w:cs="Arial" w:eastAsia="Arial" w:hAnsi="Arial"/>
-          <w:color w:val="1B1B1B"/>
-          <w:sz w:val="22"/>
-          <w:szCs w:val="22"/>
-        </w:rPr>
-        <w:t xml:space="preserve">: hàng chục nghìn ảnh, nhiều vòng.</w:t>
-      </w:r>
-    </w:p>
-    <w:p>
-      <w:pPr>
-        <w:widowControl/>
-        <w:spacing w:after="100" w:before="0" w:line="312"/>
-        <w:ind w:left="0" w:firstLine="0"/>
-      </w:pPr>
-      <w:r>
-        <w:rPr>
-          <w:rFonts w:ascii="Arial" w:cs="Arial" w:eastAsia="Arial" w:hAnsi="Arial"/>
-          <w:color w:val="1B1B1B"/>
-          <w:sz w:val="22"/>
-          <w:szCs w:val="22"/>
-        </w:rPr>
-        <w:t xml:space="preserve">Giống luyện đề cũ có đáp án: làm xong so đáp án, ghi lại chỗ sai, làm đủ nhiều thì gặp đề lạ cũng làm được. Đáp án ở bước 2 do con người gán, đó là «gán nhãn dữ liệu» ở phần 3. Bên trong mô hình có từng lớp: lớp đầu tìm cạnh và màu, lớp giữa ghép thành bánh xe, chân, lớp cuối nói «đây là người». Không ai bảo nó «cạnh nào là chân», nó tự chỉnh ra khi so đáp án.</w:t>
-      </w:r>
-    </w:p>
-    <w:p>
-      <w:pPr>
-        <w:keepNext/>
-        <w:spacing w:after="90" w:before="210"/>
-      </w:pPr>
-      <w:r>
-        <w:rPr>
-          <w:rFonts w:ascii="Arial" w:cs="Arial" w:eastAsia="Arial" w:hAnsi="Arial"/>
-          <w:b/>
-          <w:bCs/>
-          <w:color w:val="1B1B1B"/>
-          <w:sz w:val="22"/>
-          <w:szCs w:val="22"/>
-        </w:rPr>
-        <w:t xml:space="preserve">Vì sao chỉ sửa một chút</w:t>
+        <w:t xml:space="preserve">Kính lọc dùng thế nào: phản ứng thật của ba kính lọc trên cùng một ảnh (sáng = giống). Ảnh: nuScenes (Motional), CC BY-NC-SA 4.0</w:t>
       </w:r>
     </w:p>
     <w:p>
@@ -2666,7 +2527,7 @@
       <w:r>
         <w:drawing>
           <wp:inline distT="0" distB="0" distL="0" distR="0">
-            <wp:extent cx="5715000" cy="2933700"/>
+            <wp:extent cx="6096000" cy="1114425"/>
             <wp:effectExtent t="0" r="0" b="0" l="0"/>
             <wp:docPr id="1" name="" descr="" title=""/>
             <wp:cNvGraphicFramePr>
@@ -2691,7 +2552,7 @@
                   <pic:spPr bwMode="auto">
                     <a:xfrm>
                       <a:off x="0" y="0"/>
-                      <a:ext cx="5715000" cy="2933700"/>
+                      <a:ext cx="6096000" cy="1114425"/>
                     </a:xfrm>
                     <a:prstGeom prst="rect">
                       <a:avLst/>
@@ -2718,83 +2579,7 @@
           <w:sz w:val="19"/>
           <w:szCs w:val="19"/>
         </w:rPr>
-        <w:t xml:space="preserve">Dùng 627 ví dụ ở trên, cho máy học ngưỡng kiểu «xem dốc, bước xuống một bước», so sánh ba độ dài bước (tốc độ học). Dải xanh nhạt là khoảng phân loại đúng.</w:t>
-      </w:r>
-    </w:p>
-    <w:p>
-      <w:pPr>
-        <w:widowControl/>
-        <w:spacing w:after="100" w:before="0" w:line="312"/>
-        <w:ind w:left="0" w:firstLine="0"/>
-      </w:pPr>
-      <w:r>
-        <w:rPr>
-          <w:rFonts w:ascii="Arial" w:cs="Arial" w:eastAsia="Arial" w:hAnsi="Arial"/>
-          <w:color w:val="1B1B1B"/>
-          <w:sz w:val="22"/>
-          <w:szCs w:val="22"/>
-        </w:rPr>
-        <w:t xml:space="preserve">Hai lý do. Một, so đáp án xong máy chỉ tính được </w:t>
-      </w:r>
-      <w:r>
-        <w:rPr>
-          <w:rFonts w:ascii="Arial" w:cs="Arial" w:eastAsia="Arial" w:hAnsi="Arial"/>
-          <w:b/>
-          <w:bCs/>
-          <w:color w:val="24405C"/>
-          <w:sz w:val="22"/>
-          <w:szCs w:val="22"/>
-        </w:rPr>
-        <w:t xml:space="preserve">nên sửa theo hướng nào</w:t>
-      </w:r>
-      <w:r>
-        <w:rPr>
-          <w:rFonts w:ascii="Arial" w:cs="Arial" w:eastAsia="Arial" w:hAnsi="Arial"/>
-          <w:color w:val="1B1B1B"/>
-          <w:sz w:val="22"/>
-          <w:szCs w:val="22"/>
-        </w:rPr>
-        <w:t xml:space="preserve">, không tính được </w:t>
-      </w:r>
-      <w:r>
-        <w:rPr>
-          <w:rFonts w:ascii="Arial" w:cs="Arial" w:eastAsia="Arial" w:hAnsi="Arial"/>
-          <w:b/>
-          <w:bCs/>
-          <w:color w:val="24405C"/>
-          <w:sz w:val="22"/>
-          <w:szCs w:val="22"/>
-        </w:rPr>
-        <w:t xml:space="preserve">sửa bao nhiêu</w:t>
-      </w:r>
-      <w:r>
-        <w:rPr>
-          <w:rFonts w:ascii="Arial" w:cs="Arial" w:eastAsia="Arial" w:hAnsi="Arial"/>
-          <w:color w:val="1B1B1B"/>
-          <w:sz w:val="22"/>
-          <w:szCs w:val="22"/>
-        </w:rPr>
-        <w:t xml:space="preserve">, như xuống núi trong sương mù chỉ biết dưới chân dốc về phía nào. Mỗi bước dài bao nhiêu do người đặt, gọi là «</w:t>
-      </w:r>
-      <w:r>
-        <w:rPr>
-          <w:rFonts w:ascii="Arial" w:cs="Arial" w:eastAsia="Arial" w:hAnsi="Arial"/>
-          <w:b/>
-          <w:bCs/>
-          <w:color w:val="24405C"/>
-          <w:sz w:val="22"/>
-          <w:szCs w:val="22"/>
-        </w:rPr>
-        <w:t xml:space="preserve">tốc độ học</w:t>
-      </w:r>
-      <w:r>
-        <w:rPr>
-          <w:rFonts w:ascii="Arial" w:cs="Arial" w:eastAsia="Arial" w:hAnsi="Arial"/>
-          <w:color w:val="1B1B1B"/>
-          <w:sz w:val="22"/>
-          <w:szCs w:val="22"/>
-        </w:rPr>
-        <w:t xml:space="preserve">»: quá nhỏ thì đi chậm (0,05 sửa 30 lần ngưỡng mới tới 1,32); quá lớn thì nhảy quá đà, nhảy qua lại (2,5 nhảy giữa −2,5 và 3,3, chỉ đúng một nửa); vừa phải (0,3) thì bước sau ngắn hơn bước trước (2,6→1,99→1,60→1,41…, càng gần đáy càng thoải nên bước tự nhỏ lại), lần thứ sáu vào khoảng đúng. Hai, khi huấn luyện thật mỗi lần chỉ xem vài đến vài chục ảnh; mỗi lần sửa nhiều thì những gì học từ ảnh khác bị xoá mất; mỗi lần chỉ sửa một chút, xem đủ nhiều ảnh mới dùng tốt cho mọi ảnh.</w:t>
+        <w:t xml:space="preserve">Cùng ảnh đưa vào YOLOX-s, kết quả thật ở ba độ sâu (sáng = có phản ứng): lớp 1 là đường nét, đoạn 2 là hoa văn, đoạn sau chỉ còn vị trí năm người sáng lên. Ảnh: nuScenes (Motional), CC BY-NC-SA 4.0</w:t>
       </w:r>
     </w:p>
     <w:p>
@@ -2812,7 +2597,164 @@
           <w:sz w:val="24"/>
           <w:szCs w:val="24"/>
         </w:rPr>
-        <w:t xml:space="preserve">Phát hiện vật thể cho ba thứ: khung, loại, điểm</w:t>
+        <w:t xml:space="preserve">«Học» là gì: đoán, so đáp án, sửa một chút</w:t>
+      </w:r>
+    </w:p>
+    <w:p>
+      <w:pPr>
+        <w:pStyle w:val="ListParagraph"/>
+        <w:widowControl/>
+        <w:numPr>
+          <w:ilvl w:val="0"/>
+          <w:numId w:val="2"/>
+        </w:numPr>
+        <w:spacing w:after="80" w:line="320"/>
+      </w:pPr>
+      <w:r>
+        <w:rPr>
+          <w:rFonts w:ascii="Arial" w:cs="Arial" w:eastAsia="Arial" w:hAnsi="Arial"/>
+          <w:b/>
+          <w:bCs/>
+          <w:color w:val="24405C"/>
+          <w:sz w:val="22"/>
+          <w:szCs w:val="22"/>
+        </w:rPr>
+        <w:t xml:space="preserve">Đoán</w:t>
+      </w:r>
+      <w:r>
+        <w:rPr>
+          <w:rFonts w:ascii="Arial" w:cs="Arial" w:eastAsia="Arial" w:hAnsi="Arial"/>
+          <w:color w:val="1B1B1B"/>
+          <w:sz w:val="22"/>
+          <w:szCs w:val="22"/>
+        </w:rPr>
+        <w:t xml:space="preserve">: đưa một ảnh vào, mô hình đoán «ở đây có một người, khung ở đây».</w:t>
+      </w:r>
+    </w:p>
+    <w:p>
+      <w:pPr>
+        <w:pStyle w:val="ListParagraph"/>
+        <w:widowControl/>
+        <w:numPr>
+          <w:ilvl w:val="0"/>
+          <w:numId w:val="2"/>
+        </w:numPr>
+        <w:spacing w:after="80" w:line="320"/>
+      </w:pPr>
+      <w:r>
+        <w:rPr>
+          <w:rFonts w:ascii="Arial" w:cs="Arial" w:eastAsia="Arial" w:hAnsi="Arial"/>
+          <w:b/>
+          <w:bCs/>
+          <w:color w:val="24405C"/>
+          <w:sz w:val="22"/>
+          <w:szCs w:val="22"/>
+        </w:rPr>
+        <w:t xml:space="preserve">So đáp án</w:t>
+      </w:r>
+      <w:r>
+        <w:rPr>
+          <w:rFonts w:ascii="Arial" w:cs="Arial" w:eastAsia="Arial" w:hAnsi="Arial"/>
+          <w:color w:val="1B1B1B"/>
+          <w:sz w:val="22"/>
+          <w:szCs w:val="22"/>
+        </w:rPr>
+        <w:t xml:space="preserve">: so với đáp án con người gán nhãn, lệch bao nhiêu.</w:t>
+      </w:r>
+    </w:p>
+    <w:p>
+      <w:pPr>
+        <w:pStyle w:val="ListParagraph"/>
+        <w:widowControl/>
+        <w:numPr>
+          <w:ilvl w:val="0"/>
+          <w:numId w:val="2"/>
+        </w:numPr>
+        <w:spacing w:after="80" w:line="320"/>
+      </w:pPr>
+      <w:r>
+        <w:rPr>
+          <w:rFonts w:ascii="Arial" w:cs="Arial" w:eastAsia="Arial" w:hAnsi="Arial"/>
+          <w:b/>
+          <w:bCs/>
+          <w:color w:val="24405C"/>
+          <w:sz w:val="22"/>
+          <w:szCs w:val="22"/>
+        </w:rPr>
+        <w:t xml:space="preserve">Sửa một chút</w:t>
+      </w:r>
+      <w:r>
+        <w:rPr>
+          <w:rFonts w:ascii="Arial" w:cs="Arial" w:eastAsia="Arial" w:hAnsi="Arial"/>
+          <w:color w:val="1B1B1B"/>
+          <w:sz w:val="22"/>
+          <w:szCs w:val="22"/>
+        </w:rPr>
+        <w:t xml:space="preserve">: chỉnh các con số bên trong (ngưỡng ở trên chỉ 1 số; YOLOX khoảng 9 triệu số) để lần sau lệch ít hơn.</w:t>
+      </w:r>
+    </w:p>
+    <w:p>
+      <w:pPr>
+        <w:pStyle w:val="ListParagraph"/>
+        <w:widowControl/>
+        <w:numPr>
+          <w:ilvl w:val="0"/>
+          <w:numId w:val="2"/>
+        </w:numPr>
+        <w:spacing w:after="80" w:line="320"/>
+      </w:pPr>
+      <w:r>
+        <w:rPr>
+          <w:rFonts w:ascii="Arial" w:cs="Arial" w:eastAsia="Arial" w:hAnsi="Arial"/>
+          <w:b/>
+          <w:bCs/>
+          <w:color w:val="24405C"/>
+          <w:sz w:val="22"/>
+          <w:szCs w:val="22"/>
+        </w:rPr>
+        <w:t xml:space="preserve">Lặp lại</w:t>
+      </w:r>
+      <w:r>
+        <w:rPr>
+          <w:rFonts w:ascii="Arial" w:cs="Arial" w:eastAsia="Arial" w:hAnsi="Arial"/>
+          <w:color w:val="1B1B1B"/>
+          <w:sz w:val="22"/>
+          <w:szCs w:val="22"/>
+        </w:rPr>
+        <w:t xml:space="preserve">: hàng chục nghìn ảnh, nhiều vòng.</w:t>
+      </w:r>
+    </w:p>
+    <w:p>
+      <w:pPr>
+        <w:widowControl/>
+        <w:spacing w:after="100" w:before="0" w:line="312"/>
+        <w:ind w:left="0" w:firstLine="0"/>
+      </w:pPr>
+      <w:r>
+        <w:rPr>
+          <w:rFonts w:ascii="Arial" w:cs="Arial" w:eastAsia="Arial" w:hAnsi="Arial"/>
+          <w:color w:val="1B1B1B"/>
+          <w:sz w:val="22"/>
+          <w:szCs w:val="22"/>
+        </w:rPr>
+        <w:t xml:space="preserve">Giống luyện đề cũ có đáp án: làm xong so đáp án, ghi lại chỗ sai, làm đủ nhiều thì gặp đề lạ cũng làm được. Đáp án ở bước 2 do con người gán, đó là «gán nhãn dữ liệu» ở phần 3. Bên trong mô hình có từng lớp: lớp đầu tìm cạnh và màu, lớp giữa ghép thành bánh xe, chân, lớp cuối nói «đây là người». Không ai bảo nó «cạnh nào là chân», nó tự chỉnh ra khi so đáp án.</w:t>
+      </w:r>
+    </w:p>
+    <w:p>
+      <w:pPr>
+        <w:keepNext/>
+        <w:spacing w:after="90" w:before="210"/>
+      </w:pPr>
+      <w:r>
+        <w:rPr>
+          <w:rFonts w:ascii="Arial" w:cs="Arial" w:eastAsia="Arial" w:hAnsi="Arial"/>
+          <w:b/>
+          <w:bCs/>
+          <w:color w:val="1B1B1B"/>
+          <w:sz w:val="22"/>
+          <w:szCs w:val="22"/>
+        </w:rPr>
+        <w:t xml:space="preserve">Vì sao chỉ sửa một chút</w:t>
       </w:r>
     </w:p>
     <w:p>
@@ -2824,7 +2766,7 @@
       <w:r>
         <w:drawing>
           <wp:inline distT="0" distB="0" distL="0" distR="0">
-            <wp:extent cx="5905500" cy="2057400"/>
+            <wp:extent cx="5715000" cy="2933700"/>
             <wp:effectExtent t="0" r="0" b="0" l="0"/>
             <wp:docPr id="1" name="" descr="" title=""/>
             <wp:cNvGraphicFramePr>
@@ -2849,6 +2791,164 @@
                   <pic:spPr bwMode="auto">
                     <a:xfrm>
                       <a:off x="0" y="0"/>
+                      <a:ext cx="5715000" cy="2933700"/>
+                    </a:xfrm>
+                    <a:prstGeom prst="rect">
+                      <a:avLst/>
+                    </a:prstGeom>
+                  </pic:spPr>
+                </pic:pic>
+              </a:graphicData>
+            </a:graphic>
+          </wp:inline>
+        </w:drawing>
+      </w:r>
+    </w:p>
+    <w:p>
+      <w:pPr>
+        <w:keepNext w:val="false"/>
+        <w:spacing w:after="70" w:before="190"/>
+      </w:pPr>
+      <w:r>
+        <w:rPr>
+          <w:rFonts w:ascii="Arial" w:cs="Arial" w:eastAsia="Arial" w:hAnsi="Arial"/>
+          <w:b/>
+          <w:bCs/>
+          <w:color w:val="24405C"/>
+          <w:sz w:val="19"/>
+          <w:szCs w:val="19"/>
+        </w:rPr>
+        <w:t xml:space="preserve">Dùng 627 ví dụ ở trên, cho máy học ngưỡng kiểu «xem dốc, bước xuống một bước», so sánh ba độ dài bước (tốc độ học). Dải xanh nhạt là khoảng phân loại đúng.</w:t>
+      </w:r>
+    </w:p>
+    <w:p>
+      <w:pPr>
+        <w:widowControl/>
+        <w:spacing w:after="100" w:before="0" w:line="312"/>
+        <w:ind w:left="0" w:firstLine="0"/>
+      </w:pPr>
+      <w:r>
+        <w:rPr>
+          <w:rFonts w:ascii="Arial" w:cs="Arial" w:eastAsia="Arial" w:hAnsi="Arial"/>
+          <w:color w:val="1B1B1B"/>
+          <w:sz w:val="22"/>
+          <w:szCs w:val="22"/>
+        </w:rPr>
+        <w:t xml:space="preserve">Hai lý do. Một, so đáp án xong máy chỉ tính được </w:t>
+      </w:r>
+      <w:r>
+        <w:rPr>
+          <w:rFonts w:ascii="Arial" w:cs="Arial" w:eastAsia="Arial" w:hAnsi="Arial"/>
+          <w:b/>
+          <w:bCs/>
+          <w:color w:val="24405C"/>
+          <w:sz w:val="22"/>
+          <w:szCs w:val="22"/>
+        </w:rPr>
+        <w:t xml:space="preserve">nên sửa theo hướng nào</w:t>
+      </w:r>
+      <w:r>
+        <w:rPr>
+          <w:rFonts w:ascii="Arial" w:cs="Arial" w:eastAsia="Arial" w:hAnsi="Arial"/>
+          <w:color w:val="1B1B1B"/>
+          <w:sz w:val="22"/>
+          <w:szCs w:val="22"/>
+        </w:rPr>
+        <w:t xml:space="preserve">, không tính được </w:t>
+      </w:r>
+      <w:r>
+        <w:rPr>
+          <w:rFonts w:ascii="Arial" w:cs="Arial" w:eastAsia="Arial" w:hAnsi="Arial"/>
+          <w:b/>
+          <w:bCs/>
+          <w:color w:val="24405C"/>
+          <w:sz w:val="22"/>
+          <w:szCs w:val="22"/>
+        </w:rPr>
+        <w:t xml:space="preserve">sửa bao nhiêu</w:t>
+      </w:r>
+      <w:r>
+        <w:rPr>
+          <w:rFonts w:ascii="Arial" w:cs="Arial" w:eastAsia="Arial" w:hAnsi="Arial"/>
+          <w:color w:val="1B1B1B"/>
+          <w:sz w:val="22"/>
+          <w:szCs w:val="22"/>
+        </w:rPr>
+        <w:t xml:space="preserve">, như xuống núi trong sương mù chỉ biết dưới chân dốc về phía nào. Mỗi bước dài bao nhiêu do người đặt, gọi là «</w:t>
+      </w:r>
+      <w:r>
+        <w:rPr>
+          <w:rFonts w:ascii="Arial" w:cs="Arial" w:eastAsia="Arial" w:hAnsi="Arial"/>
+          <w:b/>
+          <w:bCs/>
+          <w:color w:val="24405C"/>
+          <w:sz w:val="22"/>
+          <w:szCs w:val="22"/>
+        </w:rPr>
+        <w:t xml:space="preserve">tốc độ học</w:t>
+      </w:r>
+      <w:r>
+        <w:rPr>
+          <w:rFonts w:ascii="Arial" w:cs="Arial" w:eastAsia="Arial" w:hAnsi="Arial"/>
+          <w:color w:val="1B1B1B"/>
+          <w:sz w:val="22"/>
+          <w:szCs w:val="22"/>
+        </w:rPr>
+        <w:t xml:space="preserve">»: quá nhỏ thì đi chậm (0,05 sửa 30 lần ngưỡng mới tới 1,32); quá lớn thì nhảy quá đà, nhảy qua lại (2,5 nhảy giữa −2,5 và 3,3, chỉ đúng một nửa); vừa phải (0,3) thì bước sau ngắn hơn bước trước (2,6→1,99→1,60→1,41…, càng gần đáy càng thoải nên bước tự nhỏ lại), lần thứ sáu vào khoảng đúng. Hai, khi huấn luyện thật mỗi lần chỉ xem vài đến vài chục ảnh; mỗi lần sửa nhiều thì những gì học từ ảnh khác bị xoá mất; mỗi lần chỉ sửa một chút, xem đủ nhiều ảnh mới dùng tốt cho mọi ảnh.</w:t>
+      </w:r>
+    </w:p>
+    <w:p>
+      <w:pPr>
+        <w:pStyle w:val="Heading2"/>
+        <w:keepNext/>
+        <w:spacing w:after="130" w:before="300"/>
+      </w:pPr>
+      <w:r>
+        <w:rPr>
+          <w:rFonts w:ascii="Arial" w:cs="Arial" w:eastAsia="Arial" w:hAnsi="Arial"/>
+          <w:b/>
+          <w:bCs/>
+          <w:color w:val="24405C"/>
+          <w:sz w:val="24"/>
+          <w:szCs w:val="24"/>
+        </w:rPr>
+        <w:t xml:space="preserve">Phát hiện vật thể cho ba thứ: khung, loại, điểm</w:t>
+      </w:r>
+    </w:p>
+    <w:p>
+      <w:pPr>
+        <w:keepNext/>
+        <w:spacing w:after="60" w:before="60"/>
+        <w:jc w:val="center"/>
+      </w:pPr>
+      <w:r>
+        <w:drawing>
+          <wp:inline distT="0" distB="0" distL="0" distR="0">
+            <wp:extent cx="5905500" cy="2057400"/>
+            <wp:effectExtent t="0" r="0" b="0" l="0"/>
+            <wp:docPr id="1" name="" descr="" title=""/>
+            <wp:cNvGraphicFramePr>
+              <a:graphicFrameLocks xmlns:a="http://schemas.openxmlformats.org/drawingml/2006/main" noChangeAspect="1"/>
+            </wp:cNvGraphicFramePr>
+            <a:graphic xmlns:a="http://schemas.openxmlformats.org/drawingml/2006/main">
+              <a:graphicData uri="http://schemas.openxmlformats.org/drawingml/2006/picture">
+                <pic:pic xmlns:pic="http://schemas.openxmlformats.org/drawingml/2006/picture">
+                  <pic:nvPicPr>
+                    <pic:cNvPr id="0" name="" descr=""/>
+                    <pic:cNvPicPr>
+                      <a:picLocks noChangeAspect="1" noChangeArrowheads="1"/>
+                    </pic:cNvPicPr>
+                  </pic:nvPicPr>
+                  <pic:blipFill>
+                    <a:blip r:embed="rId19" cstate="none"/>
+                    <a:srcRect/>
+                    <a:stretch>
+                      <a:fillRect/>
+                    </a:stretch>
+                  </pic:blipFill>
+                  <pic:spPr bwMode="auto">
+                    <a:xfrm>
+                      <a:off x="0" y="0"/>
                       <a:ext cx="5905500" cy="2057400"/>
                     </a:xfrm>
                     <a:prstGeom prst="rect">
@@ -3581,7 +3681,7 @@
                     </pic:cNvPicPr>
                   </pic:nvPicPr>
                   <pic:blipFill>
-                    <a:blip r:embed="rId19" cstate="none"/>
+                    <a:blip r:embed="rId20" cstate="none"/>
                     <a:srcRect/>
                     <a:stretch>
                       <a:fillRect/>
@@ -4821,7 +4921,7 @@
                     </pic:cNvPicPr>
                   </pic:nvPicPr>
                   <pic:blipFill>
-                    <a:blip r:embed="rId20" cstate="none"/>
+                    <a:blip r:embed="rId21" cstate="none"/>
                     <a:srcRect/>
                     <a:stretch>
                       <a:fillRect/>
@@ -4921,124 +5021,6 @@
         <w:drawing>
           <wp:inline distT="0" distB="0" distL="0" distR="0">
             <wp:extent cx="5715000" cy="1990725"/>
-            <wp:effectExtent t="0" r="0" b="0" l="0"/>
-            <wp:docPr id="1" name="" descr="" title=""/>
-            <wp:cNvGraphicFramePr>
-              <a:graphicFrameLocks xmlns:a="http://schemas.openxmlformats.org/drawingml/2006/main" noChangeAspect="1"/>
-            </wp:cNvGraphicFramePr>
-            <a:graphic xmlns:a="http://schemas.openxmlformats.org/drawingml/2006/main">
-              <a:graphicData uri="http://schemas.openxmlformats.org/drawingml/2006/picture">
-                <pic:pic xmlns:pic="http://schemas.openxmlformats.org/drawingml/2006/picture">
-                  <pic:nvPicPr>
-                    <pic:cNvPr id="0" name="" descr=""/>
-                    <pic:cNvPicPr>
-                      <a:picLocks noChangeAspect="1" noChangeArrowheads="1"/>
-                    </pic:cNvPicPr>
-                  </pic:nvPicPr>
-                  <pic:blipFill>
-                    <a:blip r:embed="rId21" cstate="none"/>
-                    <a:srcRect/>
-                    <a:stretch>
-                      <a:fillRect/>
-                    </a:stretch>
-                  </pic:blipFill>
-                  <pic:spPr bwMode="auto">
-                    <a:xfrm>
-                      <a:off x="0" y="0"/>
-                      <a:ext cx="5715000" cy="1990725"/>
-                    </a:xfrm>
-                    <a:prstGeom prst="rect">
-                      <a:avLst/>
-                    </a:prstGeom>
-                  </pic:spPr>
-                </pic:pic>
-              </a:graphicData>
-            </a:graphic>
-          </wp:inline>
-        </w:drawing>
-      </w:r>
-    </w:p>
-    <w:p>
-      <w:pPr>
-        <w:keepNext w:val="false"/>
-        <w:spacing w:after="70" w:before="190"/>
-      </w:pPr>
-      <w:r>
-        <w:rPr>
-          <w:rFonts w:ascii="Arial" w:cs="Arial" w:eastAsia="Arial" w:hAnsi="Arial"/>
-          <w:b/>
-          <w:bCs/>
-          <w:color w:val="24405C"/>
-          <w:sz w:val="19"/>
-          <w:szCs w:val="19"/>
-        </w:rPr>
-        <w:t xml:space="preserve">Khung phát hiện + điểm lidar (vàng). Lấy trung vị 1 m dày điểm nhất trong khung: người 8,9 m (chính thức 9,0 m), xe 21,4 m (22,0 m). Dữ liệu: nuScenes (Motional), CC BY-NC-SA 4.0</w:t>
-      </w:r>
-    </w:p>
-    <w:p>
-      <w:pPr>
-        <w:widowControl/>
-        <w:spacing w:after="100" w:before="0" w:line="312"/>
-        <w:ind w:left="0" w:firstLine="0"/>
-      </w:pPr>
-      <w:r>
-        <w:rPr>
-          <w:rFonts w:ascii="Arial" w:cs="Arial" w:eastAsia="Arial" w:hAnsi="Arial"/>
-          <w:color w:val="1B1B1B"/>
-          <w:sz w:val="22"/>
-          <w:szCs w:val="22"/>
-        </w:rPr>
-        <w:t xml:space="preserve">Camera nói «đây là người», lidar nói «bao xa» — cặp camera + lidar của tuần 7. Khung là hình chữ nhật, góc khung có cả điểm của mặt đường, nhà phía sau, nên phải chọn cụm điểm dày nhất. Xe tự lái cần </w:t>
-      </w:r>
-      <w:r>
-        <w:rPr>
-          <w:rFonts w:ascii="Arial" w:cs="Arial" w:eastAsia="Arial" w:hAnsi="Arial"/>
-          <w:b/>
-          <w:bCs/>
-          <w:color w:val="24405C"/>
-          <w:sz w:val="22"/>
-          <w:szCs w:val="22"/>
-        </w:rPr>
-        <w:t xml:space="preserve">khung 3D</w:t>
-      </w:r>
-      <w:r>
-        <w:rPr>
-          <w:rFonts w:ascii="Arial" w:cs="Arial" w:eastAsia="Arial" w:hAnsi="Arial"/>
-          <w:color w:val="1B1B1B"/>
-          <w:sz w:val="22"/>
-          <w:szCs w:val="22"/>
-        </w:rPr>
-        <w:t xml:space="preserve">: ba số vị trí, ba số kích thước, thêm hướng — bảy con số (tuần 7).</w:t>
-      </w:r>
-    </w:p>
-    <w:p>
-      <w:pPr>
-        <w:pStyle w:val="Heading2"/>
-        <w:keepNext/>
-        <w:spacing w:after="130" w:before="300"/>
-      </w:pPr>
-      <w:r>
-        <w:rPr>
-          <w:rFonts w:ascii="Arial" w:cs="Arial" w:eastAsia="Arial" w:hAnsi="Arial"/>
-          <w:b/>
-          <w:bCs/>
-          <w:color w:val="24405C"/>
-          <w:sz w:val="24"/>
-          <w:szCs w:val="24"/>
-        </w:rPr>
-        <w:t xml:space="preserve">Nhìn từ trên xuống: bản đồ từ trên và lưới chiếm chỗ</w:t>
-      </w:r>
-    </w:p>
-    <w:p>
-      <w:pPr>
-        <w:keepNext/>
-        <w:spacing w:after="60" w:before="60"/>
-        <w:jc w:val="center"/>
-      </w:pPr>
-      <w:r>
-        <w:drawing>
-          <wp:inline distT="0" distB="0" distL="0" distR="0">
-            <wp:extent cx="5905500" cy="3333750"/>
             <wp:effectExtent t="0" r="0" b="0" l="0"/>
             <wp:docPr id="1" name="" descr="" title=""/>
             <wp:cNvGraphicFramePr>
@@ -5063,7 +5045,7 @@
                   <pic:spPr bwMode="auto">
                     <a:xfrm>
                       <a:off x="0" y="0"/>
-                      <a:ext cx="5905500" cy="3333750"/>
+                      <a:ext cx="5715000" cy="1990725"/>
                     </a:xfrm>
                     <a:prstGeom prst="rect">
                       <a:avLst/>
@@ -5090,18 +5072,14 @@
           <w:sz w:val="19"/>
           <w:szCs w:val="19"/>
         </w:rPr>
-        <w:t xml:space="preserve">Trái: bản đồ từ trên, điểm lidar + khung 3D; phải: lưới chiếm chỗ tính từ cùng khung lidar (ô 0,5 m). scene-0103 (Boston). Dữ liệu: nuScenes (Motional), CC BY-NC-SA 4.0</w:t>
+        <w:t xml:space="preserve">Khung phát hiện + điểm lidar (vàng). Lấy trung vị 1 m dày điểm nhất trong khung: người 8,9 m (chính thức 9,0 m), xe 21,4 m (22,0 m). Dữ liệu: nuScenes (Motional), CC BY-NC-SA 4.0</w:t>
       </w:r>
     </w:p>
     <w:p>
       <w:pPr>
-        <w:pStyle w:val="ListParagraph"/>
         <w:widowControl/>
-        <w:numPr>
-          <w:ilvl w:val="0"/>
-          <w:numId w:val="3"/>
-        </w:numPr>
-        <w:spacing w:after="80" w:line="320"/>
+        <w:spacing w:after="100" w:before="0" w:line="312"/>
+        <w:ind w:left="0" w:firstLine="0"/>
       </w:pPr>
       <w:r>
         <w:rPr>
@@ -5110,7 +5088,7 @@
           <w:sz w:val="22"/>
           <w:szCs w:val="22"/>
         </w:rPr>
-        <w:t xml:space="preserve">Ba cái lợi của bản đồ từ trên: các vật </w:t>
+        <w:t xml:space="preserve">Camera nói «đây là người», lidar nói «bao xa» — cặp camera + lidar của tuần 7. Khung là hình chữ nhật, góc khung có cả điểm của mặt đường, nhà phía sau, nên phải chọn cụm điểm dày nhất. Xe tự lái cần </w:t>
       </w:r>
       <w:r>
         <w:rPr>
@@ -5121,7 +5099,7 @@
           <w:sz w:val="22"/>
           <w:szCs w:val="22"/>
         </w:rPr>
-        <w:t xml:space="preserve">không che nhau</w:t>
+        <w:t xml:space="preserve">khung 3D</w:t>
       </w:r>
       <w:r>
         <w:rPr>
@@ -5130,769 +5108,25 @@
           <w:sz w:val="22"/>
           <w:szCs w:val="22"/>
         </w:rPr>
-        <w:t xml:space="preserve">; </w:t>
-      </w:r>
+        <w:t xml:space="preserve">: ba số vị trí, ba số kích thước, thêm hướng — bảy con số (tuần 7).</w:t>
+      </w:r>
+    </w:p>
+    <w:p>
+      <w:pPr>
+        <w:pStyle w:val="Heading2"/>
+        <w:keepNext/>
+        <w:spacing w:after="130" w:before="300"/>
+      </w:pPr>
       <w:r>
         <w:rPr>
           <w:rFonts w:ascii="Arial" w:cs="Arial" w:eastAsia="Arial" w:hAnsi="Arial"/>
           <w:b/>
           <w:bCs/>
           <w:color w:val="24405C"/>
-          <w:sz w:val="22"/>
-          <w:szCs w:val="22"/>
-        </w:rPr>
-        <w:t xml:space="preserve">khoảng cách không méo</w:t>
-      </w:r>
-      <w:r>
-        <w:rPr>
-          <w:rFonts w:ascii="Arial" w:cs="Arial" w:eastAsia="Arial" w:hAnsi="Arial"/>
-          <w:color w:val="1B1B1B"/>
-          <w:sz w:val="22"/>
-          <w:szCs w:val="22"/>
-        </w:rPr>
-        <w:t xml:space="preserve">; lái xe vốn là quyết định </w:t>
-      </w:r>
-      <w:r>
-        <w:rPr>
-          <w:rFonts w:ascii="Arial" w:cs="Arial" w:eastAsia="Arial" w:hAnsi="Arial"/>
-          <w:b/>
-          <w:bCs/>
-          <w:color w:val="24405C"/>
-          <w:sz w:val="22"/>
-          <w:szCs w:val="22"/>
-        </w:rPr>
-        <w:t xml:space="preserve">trên mặt đất</w:t>
-      </w:r>
-      <w:r>
-        <w:rPr>
-          <w:rFonts w:ascii="Arial" w:cs="Arial" w:eastAsia="Arial" w:hAnsi="Arial"/>
-          <w:color w:val="1B1B1B"/>
-          <w:sz w:val="22"/>
-          <w:szCs w:val="22"/>
-        </w:rPr>
-        <w:t xml:space="preserve">. Ghép giữa ở tuần 7 là cùng vẽ thành một bản đồ từ trên.</w:t>
-      </w:r>
-    </w:p>
-    <w:p>
-      <w:pPr>
-        <w:pStyle w:val="ListParagraph"/>
-        <w:widowControl/>
-        <w:numPr>
-          <w:ilvl w:val="0"/>
-          <w:numId w:val="3"/>
-        </w:numPr>
-        <w:spacing w:after="80" w:line="320"/>
-      </w:pPr>
-      <w:r>
-        <w:rPr>
-          <w:rFonts w:ascii="Arial" w:cs="Arial" w:eastAsia="Arial" w:hAnsi="Arial"/>
-          <w:color w:val="1B1B1B"/>
-          <w:sz w:val="22"/>
-          <w:szCs w:val="22"/>
-        </w:rPr>
-        <w:t xml:space="preserve">Lưới chiếm chỗ: mỗi ô chỉ hỏi một việc. </w:t>
-      </w:r>
-      <w:r>
-        <w:rPr>
-          <w:rFonts w:ascii="Arial" w:cs="Arial" w:eastAsia="Arial" w:hAnsi="Arial"/>
-          <w:b/>
-          <w:bCs/>
-          <w:color w:val="24405C"/>
-          <w:sz w:val="22"/>
-          <w:szCs w:val="22"/>
-        </w:rPr>
-        <w:t xml:space="preserve">Đỏ = có vật</w:t>
-      </w:r>
-      <w:r>
-        <w:rPr>
-          <w:rFonts w:ascii="Arial" w:cs="Arial" w:eastAsia="Arial" w:hAnsi="Arial"/>
-          <w:color w:val="1B1B1B"/>
-          <w:sz w:val="22"/>
-          <w:szCs w:val="22"/>
-        </w:rPr>
-        <w:t xml:space="preserve">, </w:t>
-      </w:r>
-      <w:r>
-        <w:rPr>
-          <w:rFonts w:ascii="Arial" w:cs="Arial" w:eastAsia="Arial" w:hAnsi="Arial"/>
-          <w:b/>
-          <w:bCs/>
-          <w:color w:val="24405C"/>
-          <w:sz w:val="22"/>
-          <w:szCs w:val="22"/>
-        </w:rPr>
-        <w:t xml:space="preserve">trắng = trống</w:t>
-      </w:r>
-      <w:r>
-        <w:rPr>
-          <w:rFonts w:ascii="Arial" w:cs="Arial" w:eastAsia="Arial" w:hAnsi="Arial"/>
-          <w:color w:val="1B1B1B"/>
-          <w:sz w:val="22"/>
-          <w:szCs w:val="22"/>
-        </w:rPr>
-        <w:t xml:space="preserve"> (tia laser đi qua không chạm gì), </w:t>
-      </w:r>
-      <w:r>
-        <w:rPr>
-          <w:rFonts w:ascii="Arial" w:cs="Arial" w:eastAsia="Arial" w:hAnsi="Arial"/>
-          <w:b/>
-          <w:bCs/>
-          <w:color w:val="24405C"/>
-          <w:sz w:val="22"/>
-          <w:szCs w:val="22"/>
-        </w:rPr>
-        <w:t xml:space="preserve">xám = chưa biết</w:t>
-      </w:r>
-      <w:r>
-        <w:rPr>
-          <w:rFonts w:ascii="Arial" w:cs="Arial" w:eastAsia="Arial" w:hAnsi="Arial"/>
-          <w:color w:val="1B1B1B"/>
-          <w:sz w:val="22"/>
-          <w:szCs w:val="22"/>
-        </w:rPr>
-        <w:t xml:space="preserve"> (bị che, không bắn tới).</w:t>
-      </w:r>
-    </w:p>
-    <w:p>
-      <w:pPr>
-        <w:pStyle w:val="ListParagraph"/>
-        <w:widowControl/>
-        <w:numPr>
-          <w:ilvl w:val="0"/>
-          <w:numId w:val="3"/>
-        </w:numPr>
-        <w:spacing w:after="80" w:line="320"/>
-      </w:pPr>
-      <w:r>
-        <w:rPr>
-          <w:rFonts w:ascii="Arial" w:cs="Arial" w:eastAsia="Arial" w:hAnsi="Arial"/>
-          <w:color w:val="1B1B1B"/>
-          <w:sz w:val="22"/>
-          <w:szCs w:val="22"/>
-        </w:rPr>
-        <w:t xml:space="preserve">Lợi lớn nhất: </w:t>
-      </w:r>
-      <w:r>
-        <w:rPr>
-          <w:rFonts w:ascii="Arial" w:cs="Arial" w:eastAsia="Arial" w:hAnsi="Arial"/>
-          <w:b/>
-          <w:bCs/>
-          <w:color w:val="24405C"/>
-          <w:sz w:val="22"/>
-          <w:szCs w:val="22"/>
-        </w:rPr>
-        <w:t xml:space="preserve">không cần biết là gì</w:t>
-      </w:r>
-      <w:r>
-        <w:rPr>
-          <w:rFonts w:ascii="Arial" w:cs="Arial" w:eastAsia="Arial" w:hAnsi="Arial"/>
-          <w:color w:val="1B1B1B"/>
-          <w:sz w:val="22"/>
-          <w:szCs w:val="22"/>
-        </w:rPr>
-        <w:t xml:space="preserve">. Hàng rơi trên đường, chướng ngại lạ, bộ phát hiện không nhận ra nhưng lưới vẫn tô đỏ. Cẩn thận: «chưa biết» không phải «trống».</w:t>
-      </w:r>
-    </w:p>
-    <w:tbl>
-      <w:tblPr>
-        <w:tblW w:type="dxa" w:w="9360"/>
-        <w:tblBorders>
-          <w:top w:val="single" w:color="A8B2BA" w:sz="6"/>
-          <w:left w:val="none"/>
-          <w:bottom w:val="single" w:color="A8B2BA" w:sz="6"/>
-          <w:right w:val="none"/>
-          <w:insideH w:val="none"/>
-          <w:insideV w:val="none"/>
-        </w:tblBorders>
-      </w:tblPr>
-      <w:tblGrid>
-        <w:gridCol w:w="9360"/>
-      </w:tblGrid>
-      <w:tr>
-        <w:trPr>
-          <w:cantSplit/>
-        </w:trPr>
-        <w:tc>
-          <w:tcPr>
-            <w:tcW w:type="dxa" w:w="9360"/>
-            <w:shd w:fill="F6F8F9" w:color="auto" w:val="clear"/>
-            <w:tcMar>
-              <w:top w:type="dxa" w:w="140"/>
-              <w:left w:type="dxa" w:w="200"/>
-              <w:bottom w:type="dxa" w:w="140"/>
-              <w:right w:type="dxa" w:w="180"/>
-            </w:tcMar>
-          </w:tcPr>
-          <w:p>
-            <w:pPr>
-              <w:spacing w:after="90" w:line="300"/>
-            </w:pPr>
-            <w:r>
-              <w:rPr>
-                <w:rFonts w:ascii="Arial" w:cs="Arial" w:eastAsia="Arial" w:hAnsi="Arial"/>
-                <w:b/>
-                <w:bCs/>
-                <w:color w:val="24405C"/>
-                <w:sz w:val="20"/>
-                <w:szCs w:val="20"/>
-              </w:rPr>
-              <w:t xml:space="preserve">Xem thêm (video tiếng Anh, có thể bật phụ đề tự dịch)</w:t>
-            </w:r>
-          </w:p>
-          <w:p>
-            <w:pPr>
-              <w:spacing w:after="80" w:line="310"/>
-            </w:pPr>
-            <w:r>
-              <w:rPr>
-                <w:rFonts w:ascii="Arial" w:cs="Arial" w:eastAsia="Arial" w:hAnsi="Arial"/>
-                <w:color w:val="1B1B1B"/>
-                <w:sz w:val="20"/>
-                <w:szCs w:val="20"/>
-              </w:rPr>
-              <w:t xml:space="preserve">Bộ lọc Bayer và bù màu (Computerphile): youtu.be/LWxu4rkZBLw, 0:17–5:46</w:t>
-            </w:r>
-          </w:p>
-          <w:p>
-            <w:pPr>
-              <w:spacing w:after="80" w:line="310"/>
-            </w:pPr>
-            <w:r>
-              <w:rPr>
-                <w:rFonts w:ascii="Arial" w:cs="Arial" w:eastAsia="Arial" w:hAnsi="Arial"/>
-                <w:color w:val="1B1B1B"/>
-                <w:sz w:val="20"/>
-                <w:szCs w:val="20"/>
-              </w:rPr>
-              <w:t xml:space="preserve">Mạng nơ-ron từng lớp (3Blue1Brown tập 1): youtu.be/aircAruvnKk, 5:32–8:39</w:t>
-            </w:r>
-          </w:p>
-          <w:p>
-            <w:pPr>
-              <w:spacing w:after="80" w:line="310"/>
-            </w:pPr>
-            <w:r>
-              <w:rPr>
-                <w:rFonts w:ascii="Arial" w:cs="Arial" w:eastAsia="Arial" w:hAnsi="Arial"/>
-                <w:color w:val="1B1B1B"/>
-                <w:sz w:val="20"/>
-                <w:szCs w:val="20"/>
-              </w:rPr>
-              <w:t xml:space="preserve">Hạ gradient: bóng lăn xuống dốc (3Blue1Brown tập 2): youtu.be/IHZwWFHWa-w, 5:12–6:54</w:t>
-            </w:r>
-          </w:p>
-          <w:p>
-            <w:pPr>
-              <w:spacing w:after="80" w:line="310"/>
-            </w:pPr>
-            <w:r>
-              <w:rPr>
-                <w:rFonts w:ascii="Arial" w:cs="Arial" w:eastAsia="Arial" w:hAnsi="Arial"/>
-                <w:color w:val="1B1B1B"/>
-                <w:sz w:val="20"/>
-                <w:szCs w:val="20"/>
-              </w:rPr>
-              <w:t xml:space="preserve">YOLO phát hiện vật thể thời gian thực (TED): youtu.be/Cgxsv1riJhI, 0:12–5:48</w:t>
-            </w:r>
-          </w:p>
-          <w:p>
-            <w:pPr>
-              <w:spacing w:after="80" w:line="310"/>
-            </w:pPr>
-            <w:r>
-              <w:rPr>
-                <w:rFonts w:ascii="Arial" w:cs="Arial" w:eastAsia="Arial" w:hAnsi="Arial"/>
-                <w:color w:val="1B1B1B"/>
-                <w:sz w:val="20"/>
-                <w:szCs w:val="20"/>
-              </w:rPr>
-              <w:t xml:space="preserve">Phân vùng từng điểm ảnh (NVIDIA DRIVE Labs 14): youtu.be/HS1wV9NMLr8, 1:27</w:t>
-            </w:r>
-          </w:p>
-          <w:p>
-            <w:pPr>
-              <w:spacing w:after="80" w:line="310"/>
-            </w:pPr>
-            <w:r>
-              <w:rPr>
-                <w:rFonts w:ascii="Arial" w:cs="Arial" w:eastAsia="Arial" w:hAnsi="Arial"/>
-                <w:color w:val="1B1B1B"/>
-                <w:sz w:val="20"/>
-                <w:szCs w:val="20"/>
-              </w:rPr>
-              <w:t xml:space="preserve">Phát hiện người đi bộ ban đêm và học chủ động (NVIDIA DRIVE Labs 19): youtu.be/4aq13pB9s7c, 1:51</w:t>
-            </w:r>
-          </w:p>
-          <w:p>
-            <w:pPr>
-              <w:spacing w:after="0" w:line="310"/>
-            </w:pPr>
-            <w:r>
-              <w:rPr>
-                <w:rFonts w:ascii="Arial" w:cs="Arial" w:eastAsia="Arial" w:hAnsi="Arial"/>
-                <w:color w:val="1B1B1B"/>
-                <w:sz w:val="20"/>
-                <w:szCs w:val="20"/>
-              </w:rPr>
-              <w:t xml:space="preserve">Lưới chiếm chỗ trong 5 phút (Cyrill Stachniss): youtu.be/8ckhPViqneg, 0:04–2:21</w:t>
-            </w:r>
-          </w:p>
-        </w:tc>
-      </w:tr>
-    </w:tbl>
-    <w:p>
-      <w:pPr>
-        <w:pStyle w:val="Heading1"/>
-        <w:keepNext/>
-        <w:pageBreakBefore/>
-        <w:spacing w:after="240" w:before="160"/>
-      </w:pPr>
-      <w:r>
-        <w:rPr>
-          <w:rFonts w:ascii="Arial" w:cs="Arial" w:eastAsia="Arial" w:hAnsi="Arial"/>
-          <w:b/>
-          <w:bCs/>
-          <w:color w:val="24405C"/>
-          <w:sz w:val="30"/>
-          <w:szCs w:val="30"/>
-        </w:rPr>
-        <w:t xml:space="preserve">3. Gán nhãn dữ liệu: chuẩn bị đáp án cho máy tính</w:t>
-      </w:r>
-    </w:p>
-    <w:p>
-      <w:pPr>
-        <w:widowControl/>
-        <w:spacing w:after="100" w:before="0" w:line="312"/>
-        <w:ind w:left="0" w:firstLine="0"/>
-      </w:pPr>
-      <w:r>
-        <w:rPr>
-          <w:rFonts w:ascii="Arial" w:cs="Arial" w:eastAsia="Arial" w:hAnsi="Arial"/>
-          <w:color w:val="1B1B1B"/>
-          <w:sz w:val="22"/>
-          <w:szCs w:val="22"/>
-        </w:rPr>
-        <w:t xml:space="preserve">Dữ liệu gán nhãn là sách giáo khoa của mô hình. Ba tình huống làm mô hình học sai: </w:t>
-      </w:r>
-      <w:r>
-        <w:rPr>
-          <w:rFonts w:ascii="Arial" w:cs="Arial" w:eastAsia="Arial" w:hAnsi="Arial"/>
-          <w:b/>
-          <w:bCs/>
-          <w:color w:val="24405C"/>
-          <w:sz w:val="22"/>
-          <w:szCs w:val="22"/>
-        </w:rPr>
-        <w:t xml:space="preserve">thiếu nhãn</w:t>
-      </w:r>
-      <w:r>
-        <w:rPr>
-          <w:rFonts w:ascii="Arial" w:cs="Arial" w:eastAsia="Arial" w:hAnsi="Arial"/>
-          <w:color w:val="1B1B1B"/>
-          <w:sz w:val="22"/>
-          <w:szCs w:val="22"/>
-        </w:rPr>
-        <w:t xml:space="preserve"> (có người mà không khoanh, mô hình học «trông thế này không phải người»), </w:t>
-      </w:r>
-      <w:r>
-        <w:rPr>
-          <w:rFonts w:ascii="Arial" w:cs="Arial" w:eastAsia="Arial" w:hAnsi="Arial"/>
-          <w:b/>
-          <w:bCs/>
-          <w:color w:val="24405C"/>
-          <w:sz w:val="22"/>
-          <w:szCs w:val="22"/>
-        </w:rPr>
-        <w:t xml:space="preserve">sai loại</w:t>
-      </w:r>
-      <w:r>
-        <w:rPr>
-          <w:rFonts w:ascii="Arial" w:cs="Arial" w:eastAsia="Arial" w:hAnsi="Arial"/>
-          <w:color w:val="1B1B1B"/>
-          <w:sz w:val="22"/>
-          <w:szCs w:val="22"/>
-        </w:rPr>
-        <w:t xml:space="preserve"> (xe máy thành xe đạp), </w:t>
-      </w:r>
-      <w:r>
-        <w:rPr>
-          <w:rFonts w:ascii="Arial" w:cs="Arial" w:eastAsia="Arial" w:hAnsi="Arial"/>
-          <w:b/>
-          <w:bCs/>
-          <w:color w:val="24405C"/>
-          <w:sz w:val="22"/>
-          <w:szCs w:val="22"/>
-        </w:rPr>
-        <w:t xml:space="preserve">mỗi người một kiểu</w:t>
-      </w:r>
-      <w:r>
-        <w:rPr>
-          <w:rFonts w:ascii="Arial" w:cs="Arial" w:eastAsia="Arial" w:hAnsi="Arial"/>
-          <w:color w:val="1B1B1B"/>
-          <w:sz w:val="22"/>
-          <w:szCs w:val="22"/>
-        </w:rPr>
-        <w:t xml:space="preserve"> (người khoanh chung người lái với xe máy, người khoanh riêng). Vì vậy gán nhãn chính thức luôn có bộ quy tắc, mọi người theo cùng một bộ, và có kiểm tra.</w:t>
-      </w:r>
-    </w:p>
-    <w:p>
-      <w:pPr>
-        <w:keepNext/>
-        <w:spacing w:after="70" w:before="190"/>
-      </w:pPr>
-      <w:r>
-        <w:rPr>
-          <w:rFonts w:ascii="Arial" w:cs="Arial" w:eastAsia="Arial" w:hAnsi="Arial"/>
-          <w:b/>
-          <w:bCs/>
-          <w:color w:val="24405C"/>
-          <w:sz w:val="19"/>
-          <w:szCs w:val="19"/>
-        </w:rPr>
-        <w:t xml:space="preserve">Bảng 4. nuScenes đã gán nhãn bao nhiêu</w:t>
-      </w:r>
-    </w:p>
-    <w:tbl>
-      <w:tblPr>
-        <w:tblW w:type="dxa" w:w="9360"/>
-        <w:tblBorders>
-          <w:top w:val="single" w:color="8A949C" w:sz="8"/>
-          <w:left w:val="none"/>
-          <w:bottom w:val="single" w:color="8A949C" w:sz="8"/>
-          <w:right w:val="none"/>
-          <w:insideH w:val="single" w:color="BFC7CE" w:sz="2"/>
-          <w:insideV w:val="none"/>
-        </w:tblBorders>
-      </w:tblPr>
-      <w:tblGrid>
-        <w:gridCol w:w="3000"/>
-        <w:gridCol w:w="6360"/>
-      </w:tblGrid>
-      <w:tr>
-        <w:trPr>
-          <w:cantSplit/>
-          <w:tblHeader/>
-        </w:trPr>
-        <w:tc>
-          <w:tcPr>
-            <w:tcW w:type="dxa" w:w="3000"/>
-            <w:shd w:fill="EDF0F3" w:color="auto" w:val="clear"/>
-            <w:tcMar>
-              <w:top w:type="dxa" w:w="60"/>
-              <w:left w:type="dxa" w:w="95"/>
-              <w:bottom w:type="dxa" w:w="60"/>
-              <w:right w:type="dxa" w:w="95"/>
-            </w:tcMar>
-            <w:vAlign w:val="center"/>
-          </w:tcPr>
-          <w:p>
-            <w:pPr>
-              <w:spacing w:after="0" w:line="265"/>
-            </w:pPr>
-            <w:r>
-              <w:rPr>
-                <w:rFonts w:ascii="Arial" w:cs="Arial" w:eastAsia="Arial" w:hAnsi="Arial"/>
-                <w:b/>
-                <w:bCs/>
-                <w:color w:val="1B1B1B"/>
-                <w:sz w:val="18"/>
-                <w:szCs w:val="18"/>
-              </w:rPr>
-              <w:t xml:space="preserve">Hạng mục</w:t>
-            </w:r>
-          </w:p>
-        </w:tc>
-        <w:tc>
-          <w:tcPr>
-            <w:tcW w:type="dxa" w:w="6360"/>
-            <w:shd w:fill="EDF0F3" w:color="auto" w:val="clear"/>
-            <w:tcMar>
-              <w:top w:type="dxa" w:w="60"/>
-              <w:left w:type="dxa" w:w="95"/>
-              <w:bottom w:type="dxa" w:w="60"/>
-              <w:right w:type="dxa" w:w="95"/>
-            </w:tcMar>
-            <w:vAlign w:val="center"/>
-          </w:tcPr>
-          <w:p>
-            <w:pPr>
-              <w:spacing w:after="0" w:line="265"/>
-            </w:pPr>
-            <w:r>
-              <w:rPr>
-                <w:rFonts w:ascii="Arial" w:cs="Arial" w:eastAsia="Arial" w:hAnsi="Arial"/>
-                <w:b/>
-                <w:bCs/>
-                <w:color w:val="1B1B1B"/>
-                <w:sz w:val="18"/>
-                <w:szCs w:val="18"/>
-              </w:rPr>
-              <w:t xml:space="preserve">Con số</w:t>
-            </w:r>
-          </w:p>
-        </w:tc>
-      </w:tr>
-      <w:tr>
-        <w:trPr>
-          <w:cantSplit/>
-          <w:tblHeader w:val="false"/>
-        </w:trPr>
-        <w:tc>
-          <w:tcPr>
-            <w:tcW w:type="dxa" w:w="3000"/>
-            <w:tcMar>
-              <w:top w:type="dxa" w:w="60"/>
-              <w:left w:type="dxa" w:w="95"/>
-              <w:bottom w:type="dxa" w:w="60"/>
-              <w:right w:type="dxa" w:w="95"/>
-            </w:tcMar>
-            <w:vAlign w:val="center"/>
-          </w:tcPr>
-          <w:p>
-            <w:pPr>
-              <w:spacing w:after="0" w:line="265"/>
-            </w:pPr>
-            <w:r>
-              <w:rPr>
-                <w:rFonts w:ascii="Arial" w:cs="Arial" w:eastAsia="Arial" w:hAnsi="Arial"/>
-                <w:b w:val="false"/>
-                <w:bCs w:val="false"/>
-                <w:color w:val="1B1B1B"/>
-                <w:sz w:val="18"/>
-                <w:szCs w:val="18"/>
-              </w:rPr>
-              <w:t xml:space="preserve">Khung hình chính</w:t>
-            </w:r>
-          </w:p>
-        </w:tc>
-        <w:tc>
-          <w:tcPr>
-            <w:tcW w:type="dxa" w:w="6360"/>
-            <w:tcMar>
-              <w:top w:type="dxa" w:w="60"/>
-              <w:left w:type="dxa" w:w="95"/>
-              <w:bottom w:type="dxa" w:w="60"/>
-              <w:right w:type="dxa" w:w="95"/>
-            </w:tcMar>
-            <w:vAlign w:val="center"/>
-          </w:tcPr>
-          <w:p>
-            <w:pPr>
-              <w:spacing w:after="0" w:line="265"/>
-            </w:pPr>
-            <w:r>
-              <w:rPr>
-                <w:rFonts w:ascii="Arial" w:cs="Arial" w:eastAsia="Arial" w:hAnsi="Arial"/>
-                <w:b w:val="false"/>
-                <w:bCs w:val="false"/>
-                <w:color w:val="1B1B1B"/>
-                <w:sz w:val="18"/>
-                <w:szCs w:val="18"/>
-              </w:rPr>
-              <w:t xml:space="preserve">40.000 (1000 cảnh × 20 giây, mỗi 0,5 giây một lần)</w:t>
-            </w:r>
-          </w:p>
-        </w:tc>
-      </w:tr>
-      <w:tr>
-        <w:trPr>
-          <w:cantSplit/>
-          <w:tblHeader w:val="false"/>
-        </w:trPr>
-        <w:tc>
-          <w:tcPr>
-            <w:tcW w:type="dxa" w:w="3000"/>
-            <w:tcMar>
-              <w:top w:type="dxa" w:w="60"/>
-              <w:left w:type="dxa" w:w="95"/>
-              <w:bottom w:type="dxa" w:w="60"/>
-              <w:right w:type="dxa" w:w="95"/>
-            </w:tcMar>
-            <w:vAlign w:val="center"/>
-          </w:tcPr>
-          <w:p>
-            <w:pPr>
-              <w:spacing w:after="0" w:line="265"/>
-            </w:pPr>
-            <w:r>
-              <w:rPr>
-                <w:rFonts w:ascii="Arial" w:cs="Arial" w:eastAsia="Arial" w:hAnsi="Arial"/>
-                <w:b w:val="false"/>
-                <w:bCs w:val="false"/>
-                <w:color w:val="1B1B1B"/>
-                <w:sz w:val="18"/>
-                <w:szCs w:val="18"/>
-              </w:rPr>
-              <w:t xml:space="preserve">Khung 3D</w:t>
-            </w:r>
-          </w:p>
-        </w:tc>
-        <w:tc>
-          <w:tcPr>
-            <w:tcW w:type="dxa" w:w="6360"/>
-            <w:tcMar>
-              <w:top w:type="dxa" w:w="60"/>
-              <w:left w:type="dxa" w:w="95"/>
-              <w:bottom w:type="dxa" w:w="60"/>
-              <w:right w:type="dxa" w:w="95"/>
-            </w:tcMar>
-            <w:vAlign w:val="center"/>
-          </w:tcPr>
-          <w:p>
-            <w:pPr>
-              <w:spacing w:after="0" w:line="265"/>
-            </w:pPr>
-            <w:r>
-              <w:rPr>
-                <w:rFonts w:ascii="Arial" w:cs="Arial" w:eastAsia="Arial" w:hAnsi="Arial"/>
-                <w:b w:val="false"/>
-                <w:bCs w:val="false"/>
-                <w:color w:val="1B1B1B"/>
-                <w:sz w:val="18"/>
-                <w:szCs w:val="18"/>
-              </w:rPr>
-              <w:t xml:space="preserve">1,4 triệu, người gán từng cái</w:t>
-            </w:r>
-          </w:p>
-        </w:tc>
-      </w:tr>
-      <w:tr>
-        <w:trPr>
-          <w:cantSplit/>
-          <w:tblHeader w:val="false"/>
-        </w:trPr>
-        <w:tc>
-          <w:tcPr>
-            <w:tcW w:type="dxa" w:w="3000"/>
-            <w:tcMar>
-              <w:top w:type="dxa" w:w="60"/>
-              <w:left w:type="dxa" w:w="95"/>
-              <w:bottom w:type="dxa" w:w="60"/>
-              <w:right w:type="dxa" w:w="95"/>
-            </w:tcMar>
-            <w:vAlign w:val="center"/>
-          </w:tcPr>
-          <w:p>
-            <w:pPr>
-              <w:spacing w:after="0" w:line="265"/>
-            </w:pPr>
-            <w:r>
-              <w:rPr>
-                <w:rFonts w:ascii="Arial" w:cs="Arial" w:eastAsia="Arial" w:hAnsi="Arial"/>
-                <w:b w:val="false"/>
-                <w:bCs w:val="false"/>
-                <w:color w:val="1B1B1B"/>
-                <w:sz w:val="18"/>
-                <w:szCs w:val="18"/>
-              </w:rPr>
-              <w:t xml:space="preserve">Loại</w:t>
-            </w:r>
-          </w:p>
-        </w:tc>
-        <w:tc>
-          <w:tcPr>
-            <w:tcW w:type="dxa" w:w="6360"/>
-            <w:tcMar>
-              <w:top w:type="dxa" w:w="60"/>
-              <w:left w:type="dxa" w:w="95"/>
-              <w:bottom w:type="dxa" w:w="60"/>
-              <w:right w:type="dxa" w:w="95"/>
-            </w:tcMar>
-            <w:vAlign w:val="center"/>
-          </w:tcPr>
-          <w:p>
-            <w:pPr>
-              <w:spacing w:after="0" w:line="265"/>
-            </w:pPr>
-            <w:r>
-              <w:rPr>
-                <w:rFonts w:ascii="Arial" w:cs="Arial" w:eastAsia="Arial" w:hAnsi="Arial"/>
-                <w:b w:val="false"/>
-                <w:bCs w:val="false"/>
-                <w:color w:val="1B1B1B"/>
-                <w:sz w:val="18"/>
-                <w:szCs w:val="18"/>
-              </w:rPr>
-              <w:t xml:space="preserve">23 loại (người lớn, trẻ em, ô tô, xe buýt, xe máy, cọc tiêu…)</w:t>
-            </w:r>
-          </w:p>
-        </w:tc>
-      </w:tr>
-      <w:tr>
-        <w:trPr>
-          <w:cantSplit/>
-          <w:tblHeader w:val="false"/>
-        </w:trPr>
-        <w:tc>
-          <w:tcPr>
-            <w:tcW w:type="dxa" w:w="3000"/>
-            <w:tcMar>
-              <w:top w:type="dxa" w:w="60"/>
-              <w:left w:type="dxa" w:w="95"/>
-              <w:bottom w:type="dxa" w:w="60"/>
-              <w:right w:type="dxa" w:w="95"/>
-            </w:tcMar>
-            <w:vAlign w:val="center"/>
-          </w:tcPr>
-          <w:p>
-            <w:pPr>
-              <w:spacing w:after="0" w:line="265"/>
-            </w:pPr>
-            <w:r>
-              <w:rPr>
-                <w:rFonts w:ascii="Arial" w:cs="Arial" w:eastAsia="Arial" w:hAnsi="Arial"/>
-                <w:b w:val="false"/>
-                <w:bCs w:val="false"/>
-                <w:color w:val="1B1B1B"/>
-                <w:sz w:val="18"/>
-                <w:szCs w:val="18"/>
-              </w:rPr>
-              <w:t xml:space="preserve">Bản mini: ô tô và xe máy</w:t>
-            </w:r>
-          </w:p>
-        </w:tc>
-        <w:tc>
-          <w:tcPr>
-            <w:tcW w:type="dxa" w:w="6360"/>
-            <w:tcMar>
-              <w:top w:type="dxa" w:w="60"/>
-              <w:left w:type="dxa" w:w="95"/>
-              <w:bottom w:type="dxa" w:w="60"/>
-              <w:right w:type="dxa" w:w="95"/>
-            </w:tcMar>
-            <w:vAlign w:val="center"/>
-          </w:tcPr>
-          <w:p>
-            <w:pPr>
-              <w:spacing w:after="0" w:line="265"/>
-            </w:pPr>
-            <w:r>
-              <w:rPr>
-                <w:rFonts w:ascii="Arial" w:cs="Arial" w:eastAsia="Arial" w:hAnsi="Arial"/>
-                <w:b w:val="false"/>
-                <w:bCs w:val="false"/>
-                <w:color w:val="1B1B1B"/>
-                <w:sz w:val="18"/>
-                <w:szCs w:val="18"/>
-              </w:rPr>
-              <w:t xml:space="preserve">7.619 khung và 471 khung: xe máy ít hơn 16 lần</w:t>
-            </w:r>
-          </w:p>
-        </w:tc>
-      </w:tr>
-    </w:tbl>
-    <w:p>
-      <w:pPr>
-        <w:spacing w:after="0"/>
-      </w:pPr>
-      <w:r>
-        <w:rPr>
-          <w:rFonts w:ascii="Arial" w:cs="Arial" w:eastAsia="Arial" w:hAnsi="Arial"/>
-          <w:color w:val="1B1B1B"/>
-          <w:sz w:val="22"/>
-          <w:szCs w:val="22"/>
-        </w:rPr>
-        <w:t xml:space="preserve"/>
+          <w:sz w:val="24"/>
+          <w:szCs w:val="24"/>
+        </w:rPr>
+        <w:t xml:space="preserve">Nhìn từ trên xuống: bản đồ từ trên và lưới chiếm chỗ</w:t>
       </w:r>
     </w:p>
     <w:p>
@@ -5904,7 +5138,7 @@
       <w:r>
         <w:drawing>
           <wp:inline distT="0" distB="0" distL="0" distR="0">
-            <wp:extent cx="4572000" cy="2638425"/>
+            <wp:extent cx="5905500" cy="3333750"/>
             <wp:effectExtent t="0" r="0" b="0" l="0"/>
             <wp:docPr id="1" name="" descr="" title=""/>
             <wp:cNvGraphicFramePr>
@@ -5929,7 +5163,7 @@
                   <pic:spPr bwMode="auto">
                     <a:xfrm>
                       <a:off x="0" y="0"/>
-                      <a:ext cx="4572000" cy="2638425"/>
+                      <a:ext cx="5905500" cy="3333750"/>
                     </a:xfrm>
                     <a:prstGeom prst="rect">
                       <a:avLst/>
@@ -5956,7 +5190,449 @@
           <w:sz w:val="19"/>
           <w:szCs w:val="19"/>
         </w:rPr>
-        <w:t xml:space="preserve">Số khung mỗi loại trong nuScenes mini (tuần 7). Đường Boston, Singapore ít xe máy nên sách này dạy rất ít về xe máy. Dữ liệu: nuScenes (Motional), CC BY-NC-SA 4.0</w:t>
+        <w:t xml:space="preserve">Trái: bản đồ từ trên, điểm lidar + khung 3D; phải: lưới chiếm chỗ tính từ cùng khung lidar (ô 0,5 m). scene-0103 (Boston). Dữ liệu: nuScenes (Motional), CC BY-NC-SA 4.0</w:t>
+      </w:r>
+    </w:p>
+    <w:p>
+      <w:pPr>
+        <w:pStyle w:val="ListParagraph"/>
+        <w:widowControl/>
+        <w:numPr>
+          <w:ilvl w:val="0"/>
+          <w:numId w:val="3"/>
+        </w:numPr>
+        <w:spacing w:after="80" w:line="320"/>
+      </w:pPr>
+      <w:r>
+        <w:rPr>
+          <w:rFonts w:ascii="Arial" w:cs="Arial" w:eastAsia="Arial" w:hAnsi="Arial"/>
+          <w:color w:val="1B1B1B"/>
+          <w:sz w:val="22"/>
+          <w:szCs w:val="22"/>
+        </w:rPr>
+        <w:t xml:space="preserve">Ba cái lợi của bản đồ từ trên: các vật </w:t>
+      </w:r>
+      <w:r>
+        <w:rPr>
+          <w:rFonts w:ascii="Arial" w:cs="Arial" w:eastAsia="Arial" w:hAnsi="Arial"/>
+          <w:b/>
+          <w:bCs/>
+          <w:color w:val="24405C"/>
+          <w:sz w:val="22"/>
+          <w:szCs w:val="22"/>
+        </w:rPr>
+        <w:t xml:space="preserve">không che nhau</w:t>
+      </w:r>
+      <w:r>
+        <w:rPr>
+          <w:rFonts w:ascii="Arial" w:cs="Arial" w:eastAsia="Arial" w:hAnsi="Arial"/>
+          <w:color w:val="1B1B1B"/>
+          <w:sz w:val="22"/>
+          <w:szCs w:val="22"/>
+        </w:rPr>
+        <w:t xml:space="preserve">; </w:t>
+      </w:r>
+      <w:r>
+        <w:rPr>
+          <w:rFonts w:ascii="Arial" w:cs="Arial" w:eastAsia="Arial" w:hAnsi="Arial"/>
+          <w:b/>
+          <w:bCs/>
+          <w:color w:val="24405C"/>
+          <w:sz w:val="22"/>
+          <w:szCs w:val="22"/>
+        </w:rPr>
+        <w:t xml:space="preserve">khoảng cách không méo</w:t>
+      </w:r>
+      <w:r>
+        <w:rPr>
+          <w:rFonts w:ascii="Arial" w:cs="Arial" w:eastAsia="Arial" w:hAnsi="Arial"/>
+          <w:color w:val="1B1B1B"/>
+          <w:sz w:val="22"/>
+          <w:szCs w:val="22"/>
+        </w:rPr>
+        <w:t xml:space="preserve">; lái xe vốn là quyết định </w:t>
+      </w:r>
+      <w:r>
+        <w:rPr>
+          <w:rFonts w:ascii="Arial" w:cs="Arial" w:eastAsia="Arial" w:hAnsi="Arial"/>
+          <w:b/>
+          <w:bCs/>
+          <w:color w:val="24405C"/>
+          <w:sz w:val="22"/>
+          <w:szCs w:val="22"/>
+        </w:rPr>
+        <w:t xml:space="preserve">trên mặt đất</w:t>
+      </w:r>
+      <w:r>
+        <w:rPr>
+          <w:rFonts w:ascii="Arial" w:cs="Arial" w:eastAsia="Arial" w:hAnsi="Arial"/>
+          <w:color w:val="1B1B1B"/>
+          <w:sz w:val="22"/>
+          <w:szCs w:val="22"/>
+        </w:rPr>
+        <w:t xml:space="preserve">. Ghép giữa ở tuần 7 là cùng vẽ thành một bản đồ từ trên.</w:t>
+      </w:r>
+    </w:p>
+    <w:p>
+      <w:pPr>
+        <w:pStyle w:val="ListParagraph"/>
+        <w:widowControl/>
+        <w:numPr>
+          <w:ilvl w:val="0"/>
+          <w:numId w:val="3"/>
+        </w:numPr>
+        <w:spacing w:after="80" w:line="320"/>
+      </w:pPr>
+      <w:r>
+        <w:rPr>
+          <w:rFonts w:ascii="Arial" w:cs="Arial" w:eastAsia="Arial" w:hAnsi="Arial"/>
+          <w:color w:val="1B1B1B"/>
+          <w:sz w:val="22"/>
+          <w:szCs w:val="22"/>
+        </w:rPr>
+        <w:t xml:space="preserve">Lưới chiếm chỗ: mỗi ô chỉ hỏi một việc. </w:t>
+      </w:r>
+      <w:r>
+        <w:rPr>
+          <w:rFonts w:ascii="Arial" w:cs="Arial" w:eastAsia="Arial" w:hAnsi="Arial"/>
+          <w:b/>
+          <w:bCs/>
+          <w:color w:val="24405C"/>
+          <w:sz w:val="22"/>
+          <w:szCs w:val="22"/>
+        </w:rPr>
+        <w:t xml:space="preserve">Đỏ = có vật</w:t>
+      </w:r>
+      <w:r>
+        <w:rPr>
+          <w:rFonts w:ascii="Arial" w:cs="Arial" w:eastAsia="Arial" w:hAnsi="Arial"/>
+          <w:color w:val="1B1B1B"/>
+          <w:sz w:val="22"/>
+          <w:szCs w:val="22"/>
+        </w:rPr>
+        <w:t xml:space="preserve">, </w:t>
+      </w:r>
+      <w:r>
+        <w:rPr>
+          <w:rFonts w:ascii="Arial" w:cs="Arial" w:eastAsia="Arial" w:hAnsi="Arial"/>
+          <w:b/>
+          <w:bCs/>
+          <w:color w:val="24405C"/>
+          <w:sz w:val="22"/>
+          <w:szCs w:val="22"/>
+        </w:rPr>
+        <w:t xml:space="preserve">trắng = trống</w:t>
+      </w:r>
+      <w:r>
+        <w:rPr>
+          <w:rFonts w:ascii="Arial" w:cs="Arial" w:eastAsia="Arial" w:hAnsi="Arial"/>
+          <w:color w:val="1B1B1B"/>
+          <w:sz w:val="22"/>
+          <w:szCs w:val="22"/>
+        </w:rPr>
+        <w:t xml:space="preserve"> (tia laser đi qua không chạm gì), </w:t>
+      </w:r>
+      <w:r>
+        <w:rPr>
+          <w:rFonts w:ascii="Arial" w:cs="Arial" w:eastAsia="Arial" w:hAnsi="Arial"/>
+          <w:b/>
+          <w:bCs/>
+          <w:color w:val="24405C"/>
+          <w:sz w:val="22"/>
+          <w:szCs w:val="22"/>
+        </w:rPr>
+        <w:t xml:space="preserve">xám = chưa biết</w:t>
+      </w:r>
+      <w:r>
+        <w:rPr>
+          <w:rFonts w:ascii="Arial" w:cs="Arial" w:eastAsia="Arial" w:hAnsi="Arial"/>
+          <w:color w:val="1B1B1B"/>
+          <w:sz w:val="22"/>
+          <w:szCs w:val="22"/>
+        </w:rPr>
+        <w:t xml:space="preserve"> (bị che, không bắn tới).</w:t>
+      </w:r>
+    </w:p>
+    <w:p>
+      <w:pPr>
+        <w:pStyle w:val="ListParagraph"/>
+        <w:widowControl/>
+        <w:numPr>
+          <w:ilvl w:val="0"/>
+          <w:numId w:val="3"/>
+        </w:numPr>
+        <w:spacing w:after="80" w:line="320"/>
+      </w:pPr>
+      <w:r>
+        <w:rPr>
+          <w:rFonts w:ascii="Arial" w:cs="Arial" w:eastAsia="Arial" w:hAnsi="Arial"/>
+          <w:color w:val="1B1B1B"/>
+          <w:sz w:val="22"/>
+          <w:szCs w:val="22"/>
+        </w:rPr>
+        <w:t xml:space="preserve">Lợi lớn nhất: </w:t>
+      </w:r>
+      <w:r>
+        <w:rPr>
+          <w:rFonts w:ascii="Arial" w:cs="Arial" w:eastAsia="Arial" w:hAnsi="Arial"/>
+          <w:b/>
+          <w:bCs/>
+          <w:color w:val="24405C"/>
+          <w:sz w:val="22"/>
+          <w:szCs w:val="22"/>
+        </w:rPr>
+        <w:t xml:space="preserve">không cần biết là gì</w:t>
+      </w:r>
+      <w:r>
+        <w:rPr>
+          <w:rFonts w:ascii="Arial" w:cs="Arial" w:eastAsia="Arial" w:hAnsi="Arial"/>
+          <w:color w:val="1B1B1B"/>
+          <w:sz w:val="22"/>
+          <w:szCs w:val="22"/>
+        </w:rPr>
+        <w:t xml:space="preserve">. Hàng rơi trên đường, chướng ngại lạ, bộ phát hiện không nhận ra nhưng lưới vẫn tô đỏ. Cẩn thận: «chưa biết» không phải «trống».</w:t>
+      </w:r>
+    </w:p>
+    <w:tbl>
+      <w:tblPr>
+        <w:tblW w:type="dxa" w:w="9360"/>
+        <w:tblBorders>
+          <w:top w:val="single" w:color="A8B2BA" w:sz="6"/>
+          <w:left w:val="none"/>
+          <w:bottom w:val="single" w:color="A8B2BA" w:sz="6"/>
+          <w:right w:val="none"/>
+          <w:insideH w:val="none"/>
+          <w:insideV w:val="none"/>
+        </w:tblBorders>
+      </w:tblPr>
+      <w:tblGrid>
+        <w:gridCol w:w="9360"/>
+      </w:tblGrid>
+      <w:tr>
+        <w:trPr>
+          <w:cantSplit/>
+        </w:trPr>
+        <w:tc>
+          <w:tcPr>
+            <w:tcW w:type="dxa" w:w="9360"/>
+            <w:shd w:fill="F6F8F9" w:color="auto" w:val="clear"/>
+            <w:tcMar>
+              <w:top w:type="dxa" w:w="140"/>
+              <w:left w:type="dxa" w:w="200"/>
+              <w:bottom w:type="dxa" w:w="140"/>
+              <w:right w:type="dxa" w:w="180"/>
+            </w:tcMar>
+          </w:tcPr>
+          <w:p>
+            <w:pPr>
+              <w:spacing w:after="90" w:line="300"/>
+            </w:pPr>
+            <w:r>
+              <w:rPr>
+                <w:rFonts w:ascii="Arial" w:cs="Arial" w:eastAsia="Arial" w:hAnsi="Arial"/>
+                <w:b/>
+                <w:bCs/>
+                <w:color w:val="24405C"/>
+                <w:sz w:val="20"/>
+                <w:szCs w:val="20"/>
+              </w:rPr>
+              <w:t xml:space="preserve">Xem thêm (video tiếng Anh, có thể bật phụ đề tự dịch)</w:t>
+            </w:r>
+          </w:p>
+          <w:p>
+            <w:pPr>
+              <w:spacing w:after="80" w:line="310"/>
+            </w:pPr>
+            <w:r>
+              <w:rPr>
+                <w:rFonts w:ascii="Arial" w:cs="Arial" w:eastAsia="Arial" w:hAnsi="Arial"/>
+                <w:color w:val="1B1B1B"/>
+                <w:sz w:val="20"/>
+                <w:szCs w:val="20"/>
+              </w:rPr>
+              <w:t xml:space="preserve">Bộ lọc Bayer và bù màu (Computerphile): youtu.be/LWxu4rkZBLw, 0:17–5:46</w:t>
+            </w:r>
+          </w:p>
+          <w:p>
+            <w:pPr>
+              <w:spacing w:after="80" w:line="310"/>
+            </w:pPr>
+            <w:r>
+              <w:rPr>
+                <w:rFonts w:ascii="Arial" w:cs="Arial" w:eastAsia="Arial" w:hAnsi="Arial"/>
+                <w:color w:val="1B1B1B"/>
+                <w:sz w:val="20"/>
+                <w:szCs w:val="20"/>
+              </w:rPr>
+              <w:t xml:space="preserve">Mạng nơ-ron từng lớp (3Blue1Brown tập 1): youtu.be/aircAruvnKk, 5:32–8:39</w:t>
+            </w:r>
+          </w:p>
+          <w:p>
+            <w:pPr>
+              <w:spacing w:after="80" w:line="310"/>
+            </w:pPr>
+            <w:r>
+              <w:rPr>
+                <w:rFonts w:ascii="Arial" w:cs="Arial" w:eastAsia="Arial" w:hAnsi="Arial"/>
+                <w:color w:val="1B1B1B"/>
+                <w:sz w:val="20"/>
+                <w:szCs w:val="20"/>
+              </w:rPr>
+              <w:t xml:space="preserve">Hạ gradient: bóng lăn xuống dốc (3Blue1Brown tập 2): youtu.be/IHZwWFHWa-w, 5:12–6:54</w:t>
+            </w:r>
+          </w:p>
+          <w:p>
+            <w:pPr>
+              <w:spacing w:after="80" w:line="310"/>
+            </w:pPr>
+            <w:r>
+              <w:rPr>
+                <w:rFonts w:ascii="Arial" w:cs="Arial" w:eastAsia="Arial" w:hAnsi="Arial"/>
+                <w:color w:val="1B1B1B"/>
+                <w:sz w:val="20"/>
+                <w:szCs w:val="20"/>
+              </w:rPr>
+              <w:t xml:space="preserve">YOLO phát hiện vật thể thời gian thực (TED): youtu.be/Cgxsv1riJhI, 0:12–5:48</w:t>
+            </w:r>
+          </w:p>
+          <w:p>
+            <w:pPr>
+              <w:spacing w:after="80" w:line="310"/>
+            </w:pPr>
+            <w:r>
+              <w:rPr>
+                <w:rFonts w:ascii="Arial" w:cs="Arial" w:eastAsia="Arial" w:hAnsi="Arial"/>
+                <w:color w:val="1B1B1B"/>
+                <w:sz w:val="20"/>
+                <w:szCs w:val="20"/>
+              </w:rPr>
+              <w:t xml:space="preserve">Phân vùng từng điểm ảnh (NVIDIA DRIVE Labs 14): youtu.be/HS1wV9NMLr8, 1:27</w:t>
+            </w:r>
+          </w:p>
+          <w:p>
+            <w:pPr>
+              <w:spacing w:after="80" w:line="310"/>
+            </w:pPr>
+            <w:r>
+              <w:rPr>
+                <w:rFonts w:ascii="Arial" w:cs="Arial" w:eastAsia="Arial" w:hAnsi="Arial"/>
+                <w:color w:val="1B1B1B"/>
+                <w:sz w:val="20"/>
+                <w:szCs w:val="20"/>
+              </w:rPr>
+              <w:t xml:space="preserve">Phát hiện người đi bộ ban đêm và học chủ động (NVIDIA DRIVE Labs 19): youtu.be/4aq13pB9s7c, 1:51</w:t>
+            </w:r>
+          </w:p>
+          <w:p>
+            <w:pPr>
+              <w:spacing w:after="0" w:line="310"/>
+            </w:pPr>
+            <w:r>
+              <w:rPr>
+                <w:rFonts w:ascii="Arial" w:cs="Arial" w:eastAsia="Arial" w:hAnsi="Arial"/>
+                <w:color w:val="1B1B1B"/>
+                <w:sz w:val="20"/>
+                <w:szCs w:val="20"/>
+              </w:rPr>
+              <w:t xml:space="preserve">Lưới chiếm chỗ trong 5 phút (Cyrill Stachniss): youtu.be/8ckhPViqneg, 0:04–2:21</w:t>
+            </w:r>
+          </w:p>
+        </w:tc>
+      </w:tr>
+    </w:tbl>
+    <w:p>
+      <w:pPr>
+        <w:pStyle w:val="Heading1"/>
+        <w:keepNext/>
+        <w:pageBreakBefore/>
+        <w:spacing w:after="240" w:before="160"/>
+      </w:pPr>
+      <w:r>
+        <w:rPr>
+          <w:rFonts w:ascii="Arial" w:cs="Arial" w:eastAsia="Arial" w:hAnsi="Arial"/>
+          <w:b/>
+          <w:bCs/>
+          <w:color w:val="24405C"/>
+          <w:sz w:val="30"/>
+          <w:szCs w:val="30"/>
+        </w:rPr>
+        <w:t xml:space="preserve">3. Gán nhãn dữ liệu: chuẩn bị đáp án cho máy tính</w:t>
+      </w:r>
+    </w:p>
+    <w:p>
+      <w:pPr>
+        <w:widowControl/>
+        <w:spacing w:after="100" w:before="0" w:line="312"/>
+        <w:ind w:left="0" w:firstLine="0"/>
+      </w:pPr>
+      <w:r>
+        <w:rPr>
+          <w:rFonts w:ascii="Arial" w:cs="Arial" w:eastAsia="Arial" w:hAnsi="Arial"/>
+          <w:color w:val="1B1B1B"/>
+          <w:sz w:val="22"/>
+          <w:szCs w:val="22"/>
+        </w:rPr>
+        <w:t xml:space="preserve">Dữ liệu gán nhãn là sách giáo khoa của mô hình. Ba tình huống làm mô hình học sai: </w:t>
+      </w:r>
+      <w:r>
+        <w:rPr>
+          <w:rFonts w:ascii="Arial" w:cs="Arial" w:eastAsia="Arial" w:hAnsi="Arial"/>
+          <w:b/>
+          <w:bCs/>
+          <w:color w:val="24405C"/>
+          <w:sz w:val="22"/>
+          <w:szCs w:val="22"/>
+        </w:rPr>
+        <w:t xml:space="preserve">thiếu nhãn</w:t>
+      </w:r>
+      <w:r>
+        <w:rPr>
+          <w:rFonts w:ascii="Arial" w:cs="Arial" w:eastAsia="Arial" w:hAnsi="Arial"/>
+          <w:color w:val="1B1B1B"/>
+          <w:sz w:val="22"/>
+          <w:szCs w:val="22"/>
+        </w:rPr>
+        <w:t xml:space="preserve"> (có người mà không khoanh, mô hình học «trông thế này không phải người»), </w:t>
+      </w:r>
+      <w:r>
+        <w:rPr>
+          <w:rFonts w:ascii="Arial" w:cs="Arial" w:eastAsia="Arial" w:hAnsi="Arial"/>
+          <w:b/>
+          <w:bCs/>
+          <w:color w:val="24405C"/>
+          <w:sz w:val="22"/>
+          <w:szCs w:val="22"/>
+        </w:rPr>
+        <w:t xml:space="preserve">sai loại</w:t>
+      </w:r>
+      <w:r>
+        <w:rPr>
+          <w:rFonts w:ascii="Arial" w:cs="Arial" w:eastAsia="Arial" w:hAnsi="Arial"/>
+          <w:color w:val="1B1B1B"/>
+          <w:sz w:val="22"/>
+          <w:szCs w:val="22"/>
+        </w:rPr>
+        <w:t xml:space="preserve"> (xe máy thành xe đạp), </w:t>
+      </w:r>
+      <w:r>
+        <w:rPr>
+          <w:rFonts w:ascii="Arial" w:cs="Arial" w:eastAsia="Arial" w:hAnsi="Arial"/>
+          <w:b/>
+          <w:bCs/>
+          <w:color w:val="24405C"/>
+          <w:sz w:val="22"/>
+          <w:szCs w:val="22"/>
+        </w:rPr>
+        <w:t xml:space="preserve">mỗi người một kiểu</w:t>
+      </w:r>
+      <w:r>
+        <w:rPr>
+          <w:rFonts w:ascii="Arial" w:cs="Arial" w:eastAsia="Arial" w:hAnsi="Arial"/>
+          <w:color w:val="1B1B1B"/>
+          <w:sz w:val="22"/>
+          <w:szCs w:val="22"/>
+        </w:rPr>
+        <w:t xml:space="preserve"> (người khoanh chung người lái với xe máy, người khoanh riêng). Vì vậy gán nhãn chính thức luôn có bộ quy tắc, mọi người theo cùng một bộ, và có kiểm tra.</w:t>
       </w:r>
     </w:p>
     <w:p>
@@ -5973,7 +5649,7 @@
           <w:sz w:val="19"/>
           <w:szCs w:val="19"/>
         </w:rPr>
-        <w:t xml:space="preserve">Bảng 5. Quy tắc gán nhãn chính thức của nuScenes (trích, nguyên văn từ instructions_nuscenes.md)</w:t>
+        <w:t xml:space="preserve">Bảng 4. nuScenes đã gán nhãn bao nhiêu</w:t>
       </w:r>
     </w:p>
     <w:tbl>
@@ -5989,9 +5665,8 @@
         </w:tblBorders>
       </w:tblPr>
       <w:tblGrid>
-        <w:gridCol w:w="2900"/>
-        <w:gridCol w:w="3600"/>
-        <w:gridCol w:w="2860"/>
+        <w:gridCol w:w="3000"/>
+        <w:gridCol w:w="6360"/>
       </w:tblGrid>
       <w:tr>
         <w:trPr>
@@ -6000,7 +5675,7 @@
         </w:trPr>
         <w:tc>
           <w:tcPr>
-            <w:tcW w:type="dxa" w:w="2900"/>
+            <w:tcW w:type="dxa" w:w="3000"/>
             <w:shd w:fill="EDF0F3" w:color="auto" w:val="clear"/>
             <w:tcMar>
               <w:top w:type="dxa" w:w="60"/>
@@ -6023,13 +5698,13 @@
                 <w:sz w:val="18"/>
                 <w:szCs w:val="18"/>
               </w:rPr>
-              <w:t xml:space="preserve">Quy tắc</w:t>
-            </w:r>
-          </w:p>
-        </w:tc>
-        <w:tc>
-          <w:tcPr>
-            <w:tcW w:type="dxa" w:w="3600"/>
+              <w:t xml:space="preserve">Hạng mục</w:t>
+            </w:r>
+          </w:p>
+        </w:tc>
+        <w:tc>
+          <w:tcPr>
+            <w:tcW w:type="dxa" w:w="6360"/>
             <w:shd w:fill="EDF0F3" w:color="auto" w:val="clear"/>
             <w:tcMar>
               <w:top w:type="dxa" w:w="60"/>
@@ -6052,36 +5727,7 @@
                 <w:sz w:val="18"/>
                 <w:szCs w:val="18"/>
               </w:rPr>
-              <w:t xml:space="preserve">Nguyên văn</w:t>
-            </w:r>
-          </w:p>
-        </w:tc>
-        <w:tc>
-          <w:tcPr>
-            <w:tcW w:type="dxa" w:w="2860"/>
-            <w:shd w:fill="EDF0F3" w:color="auto" w:val="clear"/>
-            <w:tcMar>
-              <w:top w:type="dxa" w:w="60"/>
-              <w:left w:type="dxa" w:w="95"/>
-              <w:bottom w:type="dxa" w:w="60"/>
-              <w:right w:type="dxa" w:w="95"/>
-            </w:tcMar>
-            <w:vAlign w:val="center"/>
-          </w:tcPr>
-          <w:p>
-            <w:pPr>
-              <w:spacing w:after="0" w:line="265"/>
-            </w:pPr>
-            <w:r>
-              <w:rPr>
-                <w:rFonts w:ascii="Arial" w:cs="Arial" w:eastAsia="Arial" w:hAnsi="Arial"/>
-                <w:b/>
-                <w:bCs/>
-                <w:color w:val="1B1B1B"/>
-                <w:sz w:val="18"/>
-                <w:szCs w:val="18"/>
-              </w:rPr>
-              <w:t xml:space="preserve">Vì sao</w:t>
+              <w:t xml:space="preserve">Con số</w:t>
             </w:r>
           </w:p>
         </w:tc>
@@ -6093,85 +5739,57 @@
         </w:trPr>
         <w:tc>
           <w:tcPr>
-            <w:tcW w:type="dxa" w:w="2900"/>
-            <w:tcMar>
-              <w:top w:type="dxa" w:w="60"/>
-              <w:left w:type="dxa" w:w="95"/>
-              <w:bottom w:type="dxa" w:w="60"/>
-              <w:right w:type="dxa" w:w="95"/>
-            </w:tcMar>
-            <w:vAlign w:val="center"/>
-          </w:tcPr>
-          <w:p>
-            <w:pPr>
-              <w:spacing w:after="0" w:line="265"/>
-            </w:pPr>
-            <w:r>
-              <w:rPr>
-                <w:rFonts w:ascii="Arial" w:cs="Arial" w:eastAsia="Arial" w:hAnsi="Arial"/>
-                <w:b w:val="false"/>
-                <w:bCs w:val="false"/>
-                <w:color w:val="1B1B1B"/>
-                <w:sz w:val="18"/>
-                <w:szCs w:val="18"/>
-              </w:rPr>
-              <w:t xml:space="preserve">Có ≥ 1 điểm lidar/radar là phải gán</w:t>
-            </w:r>
-          </w:p>
-        </w:tc>
-        <w:tc>
-          <w:tcPr>
-            <w:tcW w:type="dxa" w:w="3600"/>
-            <w:tcMar>
-              <w:top w:type="dxa" w:w="60"/>
-              <w:left w:type="dxa" w:w="95"/>
-              <w:bottom w:type="dxa" w:w="60"/>
-              <w:right w:type="dxa" w:w="95"/>
-            </w:tcMar>
-            <w:vAlign w:val="center"/>
-          </w:tcPr>
-          <w:p>
-            <w:pPr>
-              <w:spacing w:after="0" w:line="265"/>
-            </w:pPr>
-            <w:r>
-              <w:rPr>
-                <w:rFonts w:ascii="Arial" w:cs="Arial" w:eastAsia="Arial" w:hAnsi="Arial"/>
-                <w:b w:val="false"/>
-                <w:bCs w:val="false"/>
-                <w:color w:val="1B1B1B"/>
-                <w:sz w:val="18"/>
-                <w:szCs w:val="18"/>
-              </w:rPr>
-              <w:t xml:space="preserve">Label any target object containing at least 1 LIDAR or RADAR point</w:t>
-            </w:r>
-          </w:p>
-        </w:tc>
-        <w:tc>
-          <w:tcPr>
-            <w:tcW w:type="dxa" w:w="2860"/>
-            <w:tcMar>
-              <w:top w:type="dxa" w:w="60"/>
-              <w:left w:type="dxa" w:w="95"/>
-              <w:bottom w:type="dxa" w:w="60"/>
-              <w:right w:type="dxa" w:w="95"/>
-            </w:tcMar>
-            <w:vAlign w:val="center"/>
-          </w:tcPr>
-          <w:p>
-            <w:pPr>
-              <w:spacing w:after="0" w:line="265"/>
-            </w:pPr>
-            <w:r>
-              <w:rPr>
-                <w:rFonts w:ascii="Arial" w:cs="Arial" w:eastAsia="Arial" w:hAnsi="Arial"/>
-                <w:b w:val="false"/>
-                <w:bCs w:val="false"/>
-                <w:color w:val="1B1B1B"/>
-                <w:sz w:val="18"/>
-                <w:szCs w:val="18"/>
-              </w:rPr>
-              <w:t xml:space="preserve">Cảm biến thấy thì mô hình phải học</w:t>
+            <w:tcW w:type="dxa" w:w="3000"/>
+            <w:tcMar>
+              <w:top w:type="dxa" w:w="60"/>
+              <w:left w:type="dxa" w:w="95"/>
+              <w:bottom w:type="dxa" w:w="60"/>
+              <w:right w:type="dxa" w:w="95"/>
+            </w:tcMar>
+            <w:vAlign w:val="center"/>
+          </w:tcPr>
+          <w:p>
+            <w:pPr>
+              <w:spacing w:after="0" w:line="265"/>
+            </w:pPr>
+            <w:r>
+              <w:rPr>
+                <w:rFonts w:ascii="Arial" w:cs="Arial" w:eastAsia="Arial" w:hAnsi="Arial"/>
+                <w:b w:val="false"/>
+                <w:bCs w:val="false"/>
+                <w:color w:val="1B1B1B"/>
+                <w:sz w:val="18"/>
+                <w:szCs w:val="18"/>
+              </w:rPr>
+              <w:t xml:space="preserve">Khung hình chính</w:t>
+            </w:r>
+          </w:p>
+        </w:tc>
+        <w:tc>
+          <w:tcPr>
+            <w:tcW w:type="dxa" w:w="6360"/>
+            <w:tcMar>
+              <w:top w:type="dxa" w:w="60"/>
+              <w:left w:type="dxa" w:w="95"/>
+              <w:bottom w:type="dxa" w:w="60"/>
+              <w:right w:type="dxa" w:w="95"/>
+            </w:tcMar>
+            <w:vAlign w:val="center"/>
+          </w:tcPr>
+          <w:p>
+            <w:pPr>
+              <w:spacing w:after="0" w:line="265"/>
+            </w:pPr>
+            <w:r>
+              <w:rPr>
+                <w:rFonts w:ascii="Arial" w:cs="Arial" w:eastAsia="Arial" w:hAnsi="Arial"/>
+                <w:b w:val="false"/>
+                <w:bCs w:val="false"/>
+                <w:color w:val="1B1B1B"/>
+                <w:sz w:val="18"/>
+                <w:szCs w:val="18"/>
+              </w:rPr>
+              <w:t xml:space="preserve">40.000 (1000 cảnh × 20 giây, mỗi 0,5 giây một lần)</w:t>
             </w:r>
           </w:p>
         </w:tc>
@@ -6183,85 +5801,57 @@
         </w:trPr>
         <w:tc>
           <w:tcPr>
-            <w:tcW w:type="dxa" w:w="2900"/>
-            <w:tcMar>
-              <w:top w:type="dxa" w:w="60"/>
-              <w:left w:type="dxa" w:w="95"/>
-              <w:bottom w:type="dxa" w:w="60"/>
-              <w:right w:type="dxa" w:w="95"/>
-            </w:tcMar>
-            <w:vAlign w:val="center"/>
-          </w:tcPr>
-          <w:p>
-            <w:pPr>
-              <w:spacing w:after="0" w:line="265"/>
-            </w:pPr>
-            <w:r>
-              <w:rPr>
-                <w:rFonts w:ascii="Arial" w:cs="Arial" w:eastAsia="Arial" w:hAnsi="Arial"/>
-                <w:b w:val="false"/>
-                <w:bCs w:val="false"/>
-                <w:color w:val="1B1B1B"/>
-                <w:sz w:val="18"/>
-                <w:szCs w:val="18"/>
-              </w:rPr>
-              <w:t xml:space="preserve">Khung rất sát</w:t>
-            </w:r>
-          </w:p>
-        </w:tc>
-        <w:tc>
-          <w:tcPr>
-            <w:tcW w:type="dxa" w:w="3600"/>
-            <w:tcMar>
-              <w:top w:type="dxa" w:w="60"/>
-              <w:left w:type="dxa" w:w="95"/>
-              <w:bottom w:type="dxa" w:w="60"/>
-              <w:right w:type="dxa" w:w="95"/>
-            </w:tcMar>
-            <w:vAlign w:val="center"/>
-          </w:tcPr>
-          <w:p>
-            <w:pPr>
-              <w:spacing w:after="0" w:line="265"/>
-            </w:pPr>
-            <w:r>
-              <w:rPr>
-                <w:rFonts w:ascii="Arial" w:cs="Arial" w:eastAsia="Arial" w:hAnsi="Arial"/>
-                <w:b w:val="false"/>
-                <w:bCs w:val="false"/>
-                <w:color w:val="1B1B1B"/>
-                <w:sz w:val="18"/>
-                <w:szCs w:val="18"/>
-              </w:rPr>
-              <w:t xml:space="preserve">Cuboids must be very tight.</w:t>
-            </w:r>
-          </w:p>
-        </w:tc>
-        <w:tc>
-          <w:tcPr>
-            <w:tcW w:type="dxa" w:w="2860"/>
-            <w:tcMar>
-              <w:top w:type="dxa" w:w="60"/>
-              <w:left w:type="dxa" w:w="95"/>
-              <w:bottom w:type="dxa" w:w="60"/>
-              <w:right w:type="dxa" w:w="95"/>
-            </w:tcMar>
-            <w:vAlign w:val="center"/>
-          </w:tcPr>
-          <w:p>
-            <w:pPr>
-              <w:spacing w:after="0" w:line="265"/>
-            </w:pPr>
-            <w:r>
-              <w:rPr>
-                <w:rFonts w:ascii="Arial" w:cs="Arial" w:eastAsia="Arial" w:hAnsi="Arial"/>
-                <w:b w:val="false"/>
-                <w:bCs w:val="false"/>
-                <w:color w:val="1B1B1B"/>
-                <w:sz w:val="18"/>
-                <w:szCs w:val="18"/>
-              </w:rPr>
-              <w:t xml:space="preserve">Khung rộng thì sai vị trí, khoảng cách</w:t>
+            <w:tcW w:type="dxa" w:w="3000"/>
+            <w:tcMar>
+              <w:top w:type="dxa" w:w="60"/>
+              <w:left w:type="dxa" w:w="95"/>
+              <w:bottom w:type="dxa" w:w="60"/>
+              <w:right w:type="dxa" w:w="95"/>
+            </w:tcMar>
+            <w:vAlign w:val="center"/>
+          </w:tcPr>
+          <w:p>
+            <w:pPr>
+              <w:spacing w:after="0" w:line="265"/>
+            </w:pPr>
+            <w:r>
+              <w:rPr>
+                <w:rFonts w:ascii="Arial" w:cs="Arial" w:eastAsia="Arial" w:hAnsi="Arial"/>
+                <w:b w:val="false"/>
+                <w:bCs w:val="false"/>
+                <w:color w:val="1B1B1B"/>
+                <w:sz w:val="18"/>
+                <w:szCs w:val="18"/>
+              </w:rPr>
+              <w:t xml:space="preserve">Khung 3D</w:t>
+            </w:r>
+          </w:p>
+        </w:tc>
+        <w:tc>
+          <w:tcPr>
+            <w:tcW w:type="dxa" w:w="6360"/>
+            <w:tcMar>
+              <w:top w:type="dxa" w:w="60"/>
+              <w:left w:type="dxa" w:w="95"/>
+              <w:bottom w:type="dxa" w:w="60"/>
+              <w:right w:type="dxa" w:w="95"/>
+            </w:tcMar>
+            <w:vAlign w:val="center"/>
+          </w:tcPr>
+          <w:p>
+            <w:pPr>
+              <w:spacing w:after="0" w:line="265"/>
+            </w:pPr>
+            <w:r>
+              <w:rPr>
+                <w:rFonts w:ascii="Arial" w:cs="Arial" w:eastAsia="Arial" w:hAnsi="Arial"/>
+                <w:b w:val="false"/>
+                <w:bCs w:val="false"/>
+                <w:color w:val="1B1B1B"/>
+                <w:sz w:val="18"/>
+                <w:szCs w:val="18"/>
+              </w:rPr>
+              <w:t xml:space="preserve">1,4 triệu, người gán từng cái</w:t>
             </w:r>
           </w:p>
         </w:tc>
@@ -6273,85 +5863,57 @@
         </w:trPr>
         <w:tc>
           <w:tcPr>
-            <w:tcW w:type="dxa" w:w="2900"/>
-            <w:tcMar>
-              <w:top w:type="dxa" w:w="60"/>
-              <w:left w:type="dxa" w:w="95"/>
-              <w:bottom w:type="dxa" w:w="60"/>
-              <w:right w:type="dxa" w:w="95"/>
-            </w:tcMar>
-            <w:vAlign w:val="center"/>
-          </w:tcPr>
-          <w:p>
-            <w:pPr>
-              <w:spacing w:after="0" w:line="265"/>
-            </w:pPr>
-            <w:r>
-              <w:rPr>
-                <w:rFonts w:ascii="Arial" w:cs="Arial" w:eastAsia="Arial" w:hAnsi="Arial"/>
-                <w:b w:val="false"/>
-                <w:bCs w:val="false"/>
-                <w:color w:val="1B1B1B"/>
-                <w:sz w:val="18"/>
-                <w:szCs w:val="18"/>
-              </w:rPr>
-              <w:t xml:space="preserve">Gồm cả tay chân</w:t>
-            </w:r>
-          </w:p>
-        </w:tc>
-        <w:tc>
-          <w:tcPr>
-            <w:tcW w:type="dxa" w:w="3600"/>
-            <w:tcMar>
-              <w:top w:type="dxa" w:w="60"/>
-              <w:left w:type="dxa" w:w="95"/>
-              <w:bottom w:type="dxa" w:w="60"/>
-              <w:right w:type="dxa" w:w="95"/>
-            </w:tcMar>
-            <w:vAlign w:val="center"/>
-          </w:tcPr>
-          <w:p>
-            <w:pPr>
-              <w:spacing w:after="0" w:line="265"/>
-            </w:pPr>
-            <w:r>
-              <w:rPr>
-                <w:rFonts w:ascii="Arial" w:cs="Arial" w:eastAsia="Arial" w:hAnsi="Arial"/>
-                <w:b w:val="false"/>
-                <w:bCs w:val="false"/>
-                <w:color w:val="1B1B1B"/>
-                <w:sz w:val="18"/>
-                <w:szCs w:val="18"/>
-              </w:rPr>
-              <w:t xml:space="preserve">…should include the extremities.</w:t>
-            </w:r>
-          </w:p>
-        </w:tc>
-        <w:tc>
-          <w:tcPr>
-            <w:tcW w:type="dxa" w:w="2860"/>
-            <w:tcMar>
-              <w:top w:type="dxa" w:w="60"/>
-              <w:left w:type="dxa" w:w="95"/>
-              <w:bottom w:type="dxa" w:w="60"/>
-              <w:right w:type="dxa" w:w="95"/>
-            </w:tcMar>
-            <w:vAlign w:val="center"/>
-          </w:tcPr>
-          <w:p>
-            <w:pPr>
-              <w:spacing w:after="0" w:line="265"/>
-            </w:pPr>
-            <w:r>
-              <w:rPr>
-                <w:rFonts w:ascii="Arial" w:cs="Arial" w:eastAsia="Arial" w:hAnsi="Arial"/>
-                <w:b w:val="false"/>
-                <w:bCs w:val="false"/>
-                <w:color w:val="1B1B1B"/>
-                <w:sz w:val="18"/>
-                <w:szCs w:val="18"/>
-              </w:rPr>
-              <w:t xml:space="preserve">Tay giơ ra cũng có thể bị đụng</w:t>
+            <w:tcW w:type="dxa" w:w="3000"/>
+            <w:tcMar>
+              <w:top w:type="dxa" w:w="60"/>
+              <w:left w:type="dxa" w:w="95"/>
+              <w:bottom w:type="dxa" w:w="60"/>
+              <w:right w:type="dxa" w:w="95"/>
+            </w:tcMar>
+            <w:vAlign w:val="center"/>
+          </w:tcPr>
+          <w:p>
+            <w:pPr>
+              <w:spacing w:after="0" w:line="265"/>
+            </w:pPr>
+            <w:r>
+              <w:rPr>
+                <w:rFonts w:ascii="Arial" w:cs="Arial" w:eastAsia="Arial" w:hAnsi="Arial"/>
+                <w:b w:val="false"/>
+                <w:bCs w:val="false"/>
+                <w:color w:val="1B1B1B"/>
+                <w:sz w:val="18"/>
+                <w:szCs w:val="18"/>
+              </w:rPr>
+              <w:t xml:space="preserve">Loại</w:t>
+            </w:r>
+          </w:p>
+        </w:tc>
+        <w:tc>
+          <w:tcPr>
+            <w:tcW w:type="dxa" w:w="6360"/>
+            <w:tcMar>
+              <w:top w:type="dxa" w:w="60"/>
+              <w:left w:type="dxa" w:w="95"/>
+              <w:bottom w:type="dxa" w:w="60"/>
+              <w:right w:type="dxa" w:w="95"/>
+            </w:tcMar>
+            <w:vAlign w:val="center"/>
+          </w:tcPr>
+          <w:p>
+            <w:pPr>
+              <w:spacing w:after="0" w:line="265"/>
+            </w:pPr>
+            <w:r>
+              <w:rPr>
+                <w:rFonts w:ascii="Arial" w:cs="Arial" w:eastAsia="Arial" w:hAnsi="Arial"/>
+                <w:b w:val="false"/>
+                <w:bCs w:val="false"/>
+                <w:color w:val="1B1B1B"/>
+                <w:sz w:val="18"/>
+                <w:szCs w:val="18"/>
+              </w:rPr>
+              <w:t xml:space="preserve">23 loại (người lớn, trẻ em, ô tô, xe buýt, xe máy, cọc tiêu…)</w:t>
             </w:r>
           </w:p>
         </w:tc>
@@ -6363,265 +5925,57 @@
         </w:trPr>
         <w:tc>
           <w:tcPr>
-            <w:tcW w:type="dxa" w:w="2900"/>
-            <w:tcMar>
-              <w:top w:type="dxa" w:w="60"/>
-              <w:left w:type="dxa" w:w="95"/>
-              <w:bottom w:type="dxa" w:w="60"/>
-              <w:right w:type="dxa" w:w="95"/>
-            </w:tcMar>
-            <w:vAlign w:val="center"/>
-          </w:tcPr>
-          <w:p>
-            <w:pPr>
-              <w:spacing w:after="0" w:line="265"/>
-            </w:pPr>
-            <w:r>
-              <w:rPr>
-                <w:rFonts w:ascii="Arial" w:cs="Arial" w:eastAsia="Arial" w:hAnsi="Arial"/>
-                <w:b w:val="false"/>
-                <w:bCs w:val="false"/>
-                <w:color w:val="1B1B1B"/>
-                <w:sz w:val="18"/>
-                <w:szCs w:val="18"/>
-              </w:rPr>
-              <w:t xml:space="preserve">Có người lái: chung khung với xe</w:t>
-            </w:r>
-          </w:p>
-        </w:tc>
-        <w:tc>
-          <w:tcPr>
-            <w:tcW w:type="dxa" w:w="3600"/>
-            <w:tcMar>
-              <w:top w:type="dxa" w:w="60"/>
-              <w:left w:type="dxa" w:w="95"/>
-              <w:bottom w:type="dxa" w:w="60"/>
-              <w:right w:type="dxa" w:w="95"/>
-            </w:tcMar>
-            <w:vAlign w:val="center"/>
-          </w:tcPr>
-          <w:p>
-            <w:pPr>
-              <w:spacing w:after="0" w:line="265"/>
-            </w:pPr>
-            <w:r>
-              <w:rPr>
-                <w:rFonts w:ascii="Arial" w:cs="Arial" w:eastAsia="Arial" w:hAnsi="Arial"/>
-                <w:b w:val="false"/>
-                <w:bCs w:val="false"/>
-                <w:color w:val="1B1B1B"/>
-                <w:sz w:val="18"/>
-                <w:szCs w:val="18"/>
-              </w:rPr>
-              <w:t xml:space="preserve">If there is a rider, include the rider in the box.</w:t>
-            </w:r>
-          </w:p>
-        </w:tc>
-        <w:tc>
-          <w:tcPr>
-            <w:tcW w:type="dxa" w:w="2860"/>
-            <w:tcMar>
-              <w:top w:type="dxa" w:w="60"/>
-              <w:left w:type="dxa" w:w="95"/>
-              <w:bottom w:type="dxa" w:w="60"/>
-              <w:right w:type="dxa" w:w="95"/>
-            </w:tcMar>
-            <w:vAlign w:val="center"/>
-          </w:tcPr>
-          <w:p>
-            <w:pPr>
-              <w:spacing w:after="0" w:line="265"/>
-            </w:pPr>
-            <w:r>
-              <w:rPr>
-                <w:rFonts w:ascii="Arial" w:cs="Arial" w:eastAsia="Arial" w:hAnsi="Arial"/>
-                <w:b w:val="false"/>
-                <w:bCs w:val="false"/>
-                <w:color w:val="1B1B1B"/>
-                <w:sz w:val="18"/>
-                <w:szCs w:val="18"/>
-              </w:rPr>
-              <w:t xml:space="preserve">Người và xe đi cùng nhau</w:t>
-            </w:r>
-          </w:p>
-        </w:tc>
-      </w:tr>
-      <w:tr>
-        <w:trPr>
-          <w:cantSplit/>
-          <w:tblHeader w:val="false"/>
-        </w:trPr>
-        <w:tc>
-          <w:tcPr>
-            <w:tcW w:type="dxa" w:w="2900"/>
-            <w:tcMar>
-              <w:top w:type="dxa" w:w="60"/>
-              <w:left w:type="dxa" w:w="95"/>
-              <w:bottom w:type="dxa" w:w="60"/>
-              <w:right w:type="dxa" w:w="95"/>
-            </w:tcMar>
-            <w:vAlign w:val="center"/>
-          </w:tcPr>
-          <w:p>
-            <w:pPr>
-              <w:spacing w:after="0" w:line="265"/>
-            </w:pPr>
-            <w:r>
-              <w:rPr>
-                <w:rFonts w:ascii="Arial" w:cs="Arial" w:eastAsia="Arial" w:hAnsi="Arial"/>
-                <w:b w:val="false"/>
-                <w:bCs w:val="false"/>
-                <w:color w:val="1B1B1B"/>
-                <w:sz w:val="18"/>
-                <w:szCs w:val="18"/>
-              </w:rPr>
-              <w:t xml:space="preserve">Người đứng cạnh: khoanh riêng</w:t>
-            </w:r>
-          </w:p>
-        </w:tc>
-        <w:tc>
-          <w:tcPr>
-            <w:tcW w:type="dxa" w:w="3600"/>
-            <w:tcMar>
-              <w:top w:type="dxa" w:w="60"/>
-              <w:left w:type="dxa" w:w="95"/>
-              <w:bottom w:type="dxa" w:w="60"/>
-              <w:right w:type="dxa" w:w="95"/>
-            </w:tcMar>
-            <w:vAlign w:val="center"/>
-          </w:tcPr>
-          <w:p>
-            <w:pPr>
-              <w:spacing w:after="0" w:line="265"/>
-            </w:pPr>
-            <w:r>
-              <w:rPr>
-                <w:rFonts w:ascii="Arial" w:cs="Arial" w:eastAsia="Arial" w:hAnsi="Arial"/>
-                <w:b w:val="false"/>
-                <w:bCs w:val="false"/>
-                <w:color w:val="1B1B1B"/>
-                <w:sz w:val="18"/>
-                <w:szCs w:val="18"/>
-              </w:rPr>
-              <w:t xml:space="preserve">…standing next to the motorcycle, do NOT include…</w:t>
-            </w:r>
-          </w:p>
-        </w:tc>
-        <w:tc>
-          <w:tcPr>
-            <w:tcW w:type="dxa" w:w="2860"/>
-            <w:tcMar>
-              <w:top w:type="dxa" w:w="60"/>
-              <w:left w:type="dxa" w:w="95"/>
-              <w:bottom w:type="dxa" w:w="60"/>
-              <w:right w:type="dxa" w:w="95"/>
-            </w:tcMar>
-            <w:vAlign w:val="center"/>
-          </w:tcPr>
-          <w:p>
-            <w:pPr>
-              <w:spacing w:after="0" w:line="265"/>
-            </w:pPr>
-            <w:r>
-              <w:rPr>
-                <w:rFonts w:ascii="Arial" w:cs="Arial" w:eastAsia="Arial" w:hAnsi="Arial"/>
-                <w:b w:val="false"/>
-                <w:bCs w:val="false"/>
-                <w:color w:val="1B1B1B"/>
-                <w:sz w:val="18"/>
-                <w:szCs w:val="18"/>
-              </w:rPr>
-              <w:t xml:space="preserve">Người đó có thể đi chỗ khác</w:t>
-            </w:r>
-          </w:p>
-        </w:tc>
-      </w:tr>
-      <w:tr>
-        <w:trPr>
-          <w:cantSplit/>
-          <w:tblHeader w:val="false"/>
-        </w:trPr>
-        <w:tc>
-          <w:tcPr>
-            <w:tcW w:type="dxa" w:w="2900"/>
-            <w:tcMar>
-              <w:top w:type="dxa" w:w="60"/>
-              <w:left w:type="dxa" w:w="95"/>
-              <w:bottom w:type="dxa" w:w="60"/>
-              <w:right w:type="dxa" w:w="95"/>
-            </w:tcMar>
-            <w:vAlign w:val="center"/>
-          </w:tcPr>
-          <w:p>
-            <w:pPr>
-              <w:spacing w:after="0" w:line="265"/>
-            </w:pPr>
-            <w:r>
-              <w:rPr>
-                <w:rFonts w:ascii="Arial" w:cs="Arial" w:eastAsia="Arial" w:hAnsi="Arial"/>
-                <w:b w:val="false"/>
-                <w:bCs w:val="false"/>
-                <w:color w:val="1B1B1B"/>
-                <w:sz w:val="18"/>
-                <w:szCs w:val="18"/>
-              </w:rPr>
-              <w:t xml:space="preserve">Độ thấy được 4 mức</w:t>
-            </w:r>
-          </w:p>
-        </w:tc>
-        <w:tc>
-          <w:tcPr>
-            <w:tcW w:type="dxa" w:w="3600"/>
-            <w:tcMar>
-              <w:top w:type="dxa" w:w="60"/>
-              <w:left w:type="dxa" w:w="95"/>
-              <w:bottom w:type="dxa" w:w="60"/>
-              <w:right w:type="dxa" w:w="95"/>
-            </w:tcMar>
-            <w:vAlign w:val="center"/>
-          </w:tcPr>
-          <w:p>
-            <w:pPr>
-              <w:spacing w:after="0" w:line="265"/>
-            </w:pPr>
-            <w:r>
-              <w:rPr>
-                <w:rFonts w:ascii="Arial" w:cs="Arial" w:eastAsia="Arial" w:hAnsi="Arial"/>
-                <w:b w:val="false"/>
-                <w:bCs w:val="false"/>
-                <w:color w:val="1B1B1B"/>
-                <w:sz w:val="18"/>
-                <w:szCs w:val="18"/>
-              </w:rPr>
-              <w:t xml:space="preserve">0–40%, 41–60%, 61–80%, 81–100%</w:t>
-            </w:r>
-          </w:p>
-        </w:tc>
-        <w:tc>
-          <w:tcPr>
-            <w:tcW w:type="dxa" w:w="2860"/>
-            <w:tcMar>
-              <w:top w:type="dxa" w:w="60"/>
-              <w:left w:type="dxa" w:w="95"/>
-              <w:bottom w:type="dxa" w:w="60"/>
-              <w:right w:type="dxa" w:w="95"/>
-            </w:tcMar>
-            <w:vAlign w:val="center"/>
-          </w:tcPr>
-          <w:p>
-            <w:pPr>
-              <w:spacing w:after="0" w:line="265"/>
-            </w:pPr>
-            <w:r>
-              <w:rPr>
-                <w:rFonts w:ascii="Arial" w:cs="Arial" w:eastAsia="Arial" w:hAnsi="Arial"/>
-                <w:b w:val="false"/>
-                <w:bCs w:val="false"/>
-                <w:color w:val="1B1B1B"/>
-                <w:sz w:val="18"/>
-                <w:szCs w:val="18"/>
-              </w:rPr>
-              <w:t xml:space="preserve">Biết vật nào bị che nhiều</w:t>
+            <w:tcW w:type="dxa" w:w="3000"/>
+            <w:tcMar>
+              <w:top w:type="dxa" w:w="60"/>
+              <w:left w:type="dxa" w:w="95"/>
+              <w:bottom w:type="dxa" w:w="60"/>
+              <w:right w:type="dxa" w:w="95"/>
+            </w:tcMar>
+            <w:vAlign w:val="center"/>
+          </w:tcPr>
+          <w:p>
+            <w:pPr>
+              <w:spacing w:after="0" w:line="265"/>
+            </w:pPr>
+            <w:r>
+              <w:rPr>
+                <w:rFonts w:ascii="Arial" w:cs="Arial" w:eastAsia="Arial" w:hAnsi="Arial"/>
+                <w:b w:val="false"/>
+                <w:bCs w:val="false"/>
+                <w:color w:val="1B1B1B"/>
+                <w:sz w:val="18"/>
+                <w:szCs w:val="18"/>
+              </w:rPr>
+              <w:t xml:space="preserve">Bản mini: ô tô và xe máy</w:t>
+            </w:r>
+          </w:p>
+        </w:tc>
+        <w:tc>
+          <w:tcPr>
+            <w:tcW w:type="dxa" w:w="6360"/>
+            <w:tcMar>
+              <w:top w:type="dxa" w:w="60"/>
+              <w:left w:type="dxa" w:w="95"/>
+              <w:bottom w:type="dxa" w:w="60"/>
+              <w:right w:type="dxa" w:w="95"/>
+            </w:tcMar>
+            <w:vAlign w:val="center"/>
+          </w:tcPr>
+          <w:p>
+            <w:pPr>
+              <w:spacing w:after="0" w:line="265"/>
+            </w:pPr>
+            <w:r>
+              <w:rPr>
+                <w:rFonts w:ascii="Arial" w:cs="Arial" w:eastAsia="Arial" w:hAnsi="Arial"/>
+                <w:b w:val="false"/>
+                <w:bCs w:val="false"/>
+                <w:color w:val="1B1B1B"/>
+                <w:sz w:val="18"/>
+                <w:szCs w:val="18"/>
+              </w:rPr>
+              <w:t xml:space="preserve">7.619 khung và 471 khung: xe máy ít hơn 16 lần</w:t>
             </w:r>
           </w:p>
         </w:tc>
@@ -6650,7 +6004,7 @@
       <w:r>
         <w:drawing>
           <wp:inline distT="0" distB="0" distL="0" distR="0">
-            <wp:extent cx="5334000" cy="1990725"/>
+            <wp:extent cx="4572000" cy="2638425"/>
             <wp:effectExtent t="0" r="0" b="0" l="0"/>
             <wp:docPr id="1" name="" descr="" title=""/>
             <wp:cNvGraphicFramePr>
@@ -6675,7 +6029,7 @@
                   <pic:spPr bwMode="auto">
                     <a:xfrm>
                       <a:off x="0" y="0"/>
-                      <a:ext cx="5334000" cy="1990725"/>
+                      <a:ext cx="4572000" cy="2638425"/>
                     </a:xfrm>
                     <a:prstGeom prst="rect">
                       <a:avLst/>
@@ -6702,123 +6056,672 @@
           <w:sz w:val="19"/>
           <w:szCs w:val="19"/>
         </w:rPr>
-        <w:t xml:space="preserve">Người lái nằm trong khung của xe: trái xe đạp scene-0103, phải xe máy scene-1100 (khung chính thức). Dữ liệu: nuScenes (Motional), CC BY-NC-SA 4.0</w:t>
+        <w:t xml:space="preserve">Số khung mỗi loại trong nuScenes mini (tuần 7). Đường Boston, Singapore ít xe máy nên sách này dạy rất ít về xe máy. Dữ liệu: nuScenes (Motional), CC BY-NC-SA 4.0</w:t>
       </w:r>
     </w:p>
     <w:p>
       <w:pPr>
-        <w:widowControl/>
-        <w:spacing w:after="100" w:before="0" w:line="312"/>
-        <w:ind w:left="0" w:firstLine="0"/>
-      </w:pPr>
-      <w:r>
-        <w:rPr>
-          <w:rFonts w:ascii="Arial" w:cs="Arial" w:eastAsia="Arial" w:hAnsi="Arial"/>
-          <w:color w:val="1B1B1B"/>
-          <w:sz w:val="22"/>
-          <w:szCs w:val="22"/>
-        </w:rPr>
-        <w:t xml:space="preserve">Ở Hà Nội, một xe máy chở ba người, theo quy tắc nuScenes là </w:t>
-      </w:r>
+        <w:keepNext/>
+        <w:spacing w:after="70" w:before="190"/>
+      </w:pPr>
       <w:r>
         <w:rPr>
           <w:rFonts w:ascii="Arial" w:cs="Arial" w:eastAsia="Arial" w:hAnsi="Arial"/>
           <w:b/>
           <w:bCs/>
           <w:color w:val="24405C"/>
-          <w:sz w:val="22"/>
-          <w:szCs w:val="22"/>
-        </w:rPr>
-        <w:t xml:space="preserve">một khung</w:t>
-      </w:r>
-      <w:r>
-        <w:rPr>
-          <w:rFonts w:ascii="Arial" w:cs="Arial" w:eastAsia="Arial" w:hAnsi="Arial"/>
-          <w:color w:val="1B1B1B"/>
-          <w:sz w:val="22"/>
-          <w:szCs w:val="22"/>
-        </w:rPr>
-        <w:t xml:space="preserve">, loại xe máy. Đổi sang quy tắc khoanh riêng từng người cũng được, quan trọng là </w:t>
-      </w:r>
-      <w:r>
-        <w:rPr>
-          <w:rFonts w:ascii="Arial" w:cs="Arial" w:eastAsia="Arial" w:hAnsi="Arial"/>
-          <w:b/>
-          <w:bCs/>
-          <w:color w:val="24405C"/>
-          <w:sz w:val="22"/>
-          <w:szCs w:val="22"/>
-        </w:rPr>
-        <w:t xml:space="preserve">cả bộ dữ liệu dùng cùng một quy tắc</w:t>
-      </w:r>
-      <w:r>
-        <w:rPr>
-          <w:rFonts w:ascii="Arial" w:cs="Arial" w:eastAsia="Arial" w:hAnsi="Arial"/>
-          <w:color w:val="1B1B1B"/>
-          <w:sz w:val="22"/>
-          <w:szCs w:val="22"/>
-        </w:rPr>
-        <w:t xml:space="preserve">.</w:t>
+          <w:sz w:val="19"/>
+          <w:szCs w:val="19"/>
+        </w:rPr>
+        <w:t xml:space="preserve">Bảng 5. Quy tắc gán nhãn chính thức của nuScenes (trích, nguyên văn từ instructions_nuscenes.md)</w:t>
       </w:r>
     </w:p>
     <w:tbl>
       <w:tblPr>
         <w:tblW w:type="dxa" w:w="9360"/>
         <w:tblBorders>
-          <w:top w:val="single" w:color="A8B2BA" w:sz="6"/>
+          <w:top w:val="single" w:color="8A949C" w:sz="8"/>
           <w:left w:val="none"/>
-          <w:bottom w:val="single" w:color="A8B2BA" w:sz="6"/>
+          <w:bottom w:val="single" w:color="8A949C" w:sz="8"/>
           <w:right w:val="none"/>
-          <w:insideH w:val="none"/>
+          <w:insideH w:val="single" w:color="BFC7CE" w:sz="2"/>
           <w:insideV w:val="none"/>
         </w:tblBorders>
       </w:tblPr>
       <w:tblGrid>
-        <w:gridCol w:w="9360"/>
+        <w:gridCol w:w="2900"/>
+        <w:gridCol w:w="3600"/>
+        <w:gridCol w:w="2860"/>
       </w:tblGrid>
       <w:tr>
         <w:trPr>
           <w:cantSplit/>
+          <w:tblHeader/>
         </w:trPr>
         <w:tc>
           <w:tcPr>
-            <w:tcW w:type="dxa" w:w="9360"/>
-            <w:shd w:fill="F6F8F9" w:color="auto" w:val="clear"/>
-            <w:tcMar>
-              <w:top w:type="dxa" w:w="140"/>
-              <w:left w:type="dxa" w:w="200"/>
-              <w:bottom w:type="dxa" w:w="140"/>
-              <w:right w:type="dxa" w:w="180"/>
-            </w:tcMar>
-          </w:tcPr>
-          <w:p>
-            <w:pPr>
-              <w:spacing w:after="90" w:line="300"/>
+            <w:tcW w:type="dxa" w:w="2900"/>
+            <w:shd w:fill="EDF0F3" w:color="auto" w:val="clear"/>
+            <w:tcMar>
+              <w:top w:type="dxa" w:w="60"/>
+              <w:left w:type="dxa" w:w="95"/>
+              <w:bottom w:type="dxa" w:w="60"/>
+              <w:right w:type="dxa" w:w="95"/>
+            </w:tcMar>
+            <w:vAlign w:val="center"/>
+          </w:tcPr>
+          <w:p>
+            <w:pPr>
+              <w:spacing w:after="0" w:line="265"/>
             </w:pPr>
             <w:r>
               <w:rPr>
                 <w:rFonts w:ascii="Arial" w:cs="Arial" w:eastAsia="Arial" w:hAnsi="Arial"/>
                 <w:b/>
                 <w:bCs/>
-                <w:color w:val="24405C"/>
-                <w:sz w:val="20"/>
-                <w:szCs w:val="20"/>
-              </w:rPr>
-              <w:t xml:space="preserve">Xem thêm</w:t>
-            </w:r>
-          </w:p>
-          <w:p>
-            <w:pPr>
-              <w:spacing w:after="0" w:line="310"/>
-            </w:pPr>
-            <w:r>
-              <w:rPr>
-                <w:rFonts w:ascii="Arial" w:cs="Arial" w:eastAsia="Arial" w:hAnsi="Arial"/>
-                <w:color w:val="1B1B1B"/>
-                <w:sz w:val="20"/>
-                <w:szCs w:val="20"/>
-              </w:rPr>
-              <w:t xml:space="preserve">Vẽ khung bằng công cụ gán nhãn CVAT (hướng dẫn chính thức, tiếng Anh): youtu.be/TDae8RkGbKk, 0:16–2:47.</w:t>
+                <w:color w:val="1B1B1B"/>
+                <w:sz w:val="18"/>
+                <w:szCs w:val="18"/>
+              </w:rPr>
+              <w:t xml:space="preserve">Quy tắc</w:t>
+            </w:r>
+          </w:p>
+        </w:tc>
+        <w:tc>
+          <w:tcPr>
+            <w:tcW w:type="dxa" w:w="3600"/>
+            <w:shd w:fill="EDF0F3" w:color="auto" w:val="clear"/>
+            <w:tcMar>
+              <w:top w:type="dxa" w:w="60"/>
+              <w:left w:type="dxa" w:w="95"/>
+              <w:bottom w:type="dxa" w:w="60"/>
+              <w:right w:type="dxa" w:w="95"/>
+            </w:tcMar>
+            <w:vAlign w:val="center"/>
+          </w:tcPr>
+          <w:p>
+            <w:pPr>
+              <w:spacing w:after="0" w:line="265"/>
+            </w:pPr>
+            <w:r>
+              <w:rPr>
+                <w:rFonts w:ascii="Arial" w:cs="Arial" w:eastAsia="Arial" w:hAnsi="Arial"/>
+                <w:b/>
+                <w:bCs/>
+                <w:color w:val="1B1B1B"/>
+                <w:sz w:val="18"/>
+                <w:szCs w:val="18"/>
+              </w:rPr>
+              <w:t xml:space="preserve">Nguyên văn</w:t>
+            </w:r>
+          </w:p>
+        </w:tc>
+        <w:tc>
+          <w:tcPr>
+            <w:tcW w:type="dxa" w:w="2860"/>
+            <w:shd w:fill="EDF0F3" w:color="auto" w:val="clear"/>
+            <w:tcMar>
+              <w:top w:type="dxa" w:w="60"/>
+              <w:left w:type="dxa" w:w="95"/>
+              <w:bottom w:type="dxa" w:w="60"/>
+              <w:right w:type="dxa" w:w="95"/>
+            </w:tcMar>
+            <w:vAlign w:val="center"/>
+          </w:tcPr>
+          <w:p>
+            <w:pPr>
+              <w:spacing w:after="0" w:line="265"/>
+            </w:pPr>
+            <w:r>
+              <w:rPr>
+                <w:rFonts w:ascii="Arial" w:cs="Arial" w:eastAsia="Arial" w:hAnsi="Arial"/>
+                <w:b/>
+                <w:bCs/>
+                <w:color w:val="1B1B1B"/>
+                <w:sz w:val="18"/>
+                <w:szCs w:val="18"/>
+              </w:rPr>
+              <w:t xml:space="preserve">Vì sao</w:t>
+            </w:r>
+          </w:p>
+        </w:tc>
+      </w:tr>
+      <w:tr>
+        <w:trPr>
+          <w:cantSplit/>
+          <w:tblHeader w:val="false"/>
+        </w:trPr>
+        <w:tc>
+          <w:tcPr>
+            <w:tcW w:type="dxa" w:w="2900"/>
+            <w:tcMar>
+              <w:top w:type="dxa" w:w="60"/>
+              <w:left w:type="dxa" w:w="95"/>
+              <w:bottom w:type="dxa" w:w="60"/>
+              <w:right w:type="dxa" w:w="95"/>
+            </w:tcMar>
+            <w:vAlign w:val="center"/>
+          </w:tcPr>
+          <w:p>
+            <w:pPr>
+              <w:spacing w:after="0" w:line="265"/>
+            </w:pPr>
+            <w:r>
+              <w:rPr>
+                <w:rFonts w:ascii="Arial" w:cs="Arial" w:eastAsia="Arial" w:hAnsi="Arial"/>
+                <w:b w:val="false"/>
+                <w:bCs w:val="false"/>
+                <w:color w:val="1B1B1B"/>
+                <w:sz w:val="18"/>
+                <w:szCs w:val="18"/>
+              </w:rPr>
+              <w:t xml:space="preserve">Có ≥ 1 điểm lidar/radar là phải gán</w:t>
+            </w:r>
+          </w:p>
+        </w:tc>
+        <w:tc>
+          <w:tcPr>
+            <w:tcW w:type="dxa" w:w="3600"/>
+            <w:tcMar>
+              <w:top w:type="dxa" w:w="60"/>
+              <w:left w:type="dxa" w:w="95"/>
+              <w:bottom w:type="dxa" w:w="60"/>
+              <w:right w:type="dxa" w:w="95"/>
+            </w:tcMar>
+            <w:vAlign w:val="center"/>
+          </w:tcPr>
+          <w:p>
+            <w:pPr>
+              <w:spacing w:after="0" w:line="265"/>
+            </w:pPr>
+            <w:r>
+              <w:rPr>
+                <w:rFonts w:ascii="Arial" w:cs="Arial" w:eastAsia="Arial" w:hAnsi="Arial"/>
+                <w:b w:val="false"/>
+                <w:bCs w:val="false"/>
+                <w:color w:val="1B1B1B"/>
+                <w:sz w:val="18"/>
+                <w:szCs w:val="18"/>
+              </w:rPr>
+              <w:t xml:space="preserve">Label any target object containing at least 1 LIDAR or RADAR point</w:t>
+            </w:r>
+          </w:p>
+        </w:tc>
+        <w:tc>
+          <w:tcPr>
+            <w:tcW w:type="dxa" w:w="2860"/>
+            <w:tcMar>
+              <w:top w:type="dxa" w:w="60"/>
+              <w:left w:type="dxa" w:w="95"/>
+              <w:bottom w:type="dxa" w:w="60"/>
+              <w:right w:type="dxa" w:w="95"/>
+            </w:tcMar>
+            <w:vAlign w:val="center"/>
+          </w:tcPr>
+          <w:p>
+            <w:pPr>
+              <w:spacing w:after="0" w:line="265"/>
+            </w:pPr>
+            <w:r>
+              <w:rPr>
+                <w:rFonts w:ascii="Arial" w:cs="Arial" w:eastAsia="Arial" w:hAnsi="Arial"/>
+                <w:b w:val="false"/>
+                <w:bCs w:val="false"/>
+                <w:color w:val="1B1B1B"/>
+                <w:sz w:val="18"/>
+                <w:szCs w:val="18"/>
+              </w:rPr>
+              <w:t xml:space="preserve">Cảm biến thấy thì mô hình phải học</w:t>
+            </w:r>
+          </w:p>
+        </w:tc>
+      </w:tr>
+      <w:tr>
+        <w:trPr>
+          <w:cantSplit/>
+          <w:tblHeader w:val="false"/>
+        </w:trPr>
+        <w:tc>
+          <w:tcPr>
+            <w:tcW w:type="dxa" w:w="2900"/>
+            <w:tcMar>
+              <w:top w:type="dxa" w:w="60"/>
+              <w:left w:type="dxa" w:w="95"/>
+              <w:bottom w:type="dxa" w:w="60"/>
+              <w:right w:type="dxa" w:w="95"/>
+            </w:tcMar>
+            <w:vAlign w:val="center"/>
+          </w:tcPr>
+          <w:p>
+            <w:pPr>
+              <w:spacing w:after="0" w:line="265"/>
+            </w:pPr>
+            <w:r>
+              <w:rPr>
+                <w:rFonts w:ascii="Arial" w:cs="Arial" w:eastAsia="Arial" w:hAnsi="Arial"/>
+                <w:b w:val="false"/>
+                <w:bCs w:val="false"/>
+                <w:color w:val="1B1B1B"/>
+                <w:sz w:val="18"/>
+                <w:szCs w:val="18"/>
+              </w:rPr>
+              <w:t xml:space="preserve">Khung rất sát</w:t>
+            </w:r>
+          </w:p>
+        </w:tc>
+        <w:tc>
+          <w:tcPr>
+            <w:tcW w:type="dxa" w:w="3600"/>
+            <w:tcMar>
+              <w:top w:type="dxa" w:w="60"/>
+              <w:left w:type="dxa" w:w="95"/>
+              <w:bottom w:type="dxa" w:w="60"/>
+              <w:right w:type="dxa" w:w="95"/>
+            </w:tcMar>
+            <w:vAlign w:val="center"/>
+          </w:tcPr>
+          <w:p>
+            <w:pPr>
+              <w:spacing w:after="0" w:line="265"/>
+            </w:pPr>
+            <w:r>
+              <w:rPr>
+                <w:rFonts w:ascii="Arial" w:cs="Arial" w:eastAsia="Arial" w:hAnsi="Arial"/>
+                <w:b w:val="false"/>
+                <w:bCs w:val="false"/>
+                <w:color w:val="1B1B1B"/>
+                <w:sz w:val="18"/>
+                <w:szCs w:val="18"/>
+              </w:rPr>
+              <w:t xml:space="preserve">Cuboids must be very tight.</w:t>
+            </w:r>
+          </w:p>
+        </w:tc>
+        <w:tc>
+          <w:tcPr>
+            <w:tcW w:type="dxa" w:w="2860"/>
+            <w:tcMar>
+              <w:top w:type="dxa" w:w="60"/>
+              <w:left w:type="dxa" w:w="95"/>
+              <w:bottom w:type="dxa" w:w="60"/>
+              <w:right w:type="dxa" w:w="95"/>
+            </w:tcMar>
+            <w:vAlign w:val="center"/>
+          </w:tcPr>
+          <w:p>
+            <w:pPr>
+              <w:spacing w:after="0" w:line="265"/>
+            </w:pPr>
+            <w:r>
+              <w:rPr>
+                <w:rFonts w:ascii="Arial" w:cs="Arial" w:eastAsia="Arial" w:hAnsi="Arial"/>
+                <w:b w:val="false"/>
+                <w:bCs w:val="false"/>
+                <w:color w:val="1B1B1B"/>
+                <w:sz w:val="18"/>
+                <w:szCs w:val="18"/>
+              </w:rPr>
+              <w:t xml:space="preserve">Khung rộng thì sai vị trí, khoảng cách</w:t>
+            </w:r>
+          </w:p>
+        </w:tc>
+      </w:tr>
+      <w:tr>
+        <w:trPr>
+          <w:cantSplit/>
+          <w:tblHeader w:val="false"/>
+        </w:trPr>
+        <w:tc>
+          <w:tcPr>
+            <w:tcW w:type="dxa" w:w="2900"/>
+            <w:tcMar>
+              <w:top w:type="dxa" w:w="60"/>
+              <w:left w:type="dxa" w:w="95"/>
+              <w:bottom w:type="dxa" w:w="60"/>
+              <w:right w:type="dxa" w:w="95"/>
+            </w:tcMar>
+            <w:vAlign w:val="center"/>
+          </w:tcPr>
+          <w:p>
+            <w:pPr>
+              <w:spacing w:after="0" w:line="265"/>
+            </w:pPr>
+            <w:r>
+              <w:rPr>
+                <w:rFonts w:ascii="Arial" w:cs="Arial" w:eastAsia="Arial" w:hAnsi="Arial"/>
+                <w:b w:val="false"/>
+                <w:bCs w:val="false"/>
+                <w:color w:val="1B1B1B"/>
+                <w:sz w:val="18"/>
+                <w:szCs w:val="18"/>
+              </w:rPr>
+              <w:t xml:space="preserve">Gồm cả tay chân</w:t>
+            </w:r>
+          </w:p>
+        </w:tc>
+        <w:tc>
+          <w:tcPr>
+            <w:tcW w:type="dxa" w:w="3600"/>
+            <w:tcMar>
+              <w:top w:type="dxa" w:w="60"/>
+              <w:left w:type="dxa" w:w="95"/>
+              <w:bottom w:type="dxa" w:w="60"/>
+              <w:right w:type="dxa" w:w="95"/>
+            </w:tcMar>
+            <w:vAlign w:val="center"/>
+          </w:tcPr>
+          <w:p>
+            <w:pPr>
+              <w:spacing w:after="0" w:line="265"/>
+            </w:pPr>
+            <w:r>
+              <w:rPr>
+                <w:rFonts w:ascii="Arial" w:cs="Arial" w:eastAsia="Arial" w:hAnsi="Arial"/>
+                <w:b w:val="false"/>
+                <w:bCs w:val="false"/>
+                <w:color w:val="1B1B1B"/>
+                <w:sz w:val="18"/>
+                <w:szCs w:val="18"/>
+              </w:rPr>
+              <w:t xml:space="preserve">…should include the extremities.</w:t>
+            </w:r>
+          </w:p>
+        </w:tc>
+        <w:tc>
+          <w:tcPr>
+            <w:tcW w:type="dxa" w:w="2860"/>
+            <w:tcMar>
+              <w:top w:type="dxa" w:w="60"/>
+              <w:left w:type="dxa" w:w="95"/>
+              <w:bottom w:type="dxa" w:w="60"/>
+              <w:right w:type="dxa" w:w="95"/>
+            </w:tcMar>
+            <w:vAlign w:val="center"/>
+          </w:tcPr>
+          <w:p>
+            <w:pPr>
+              <w:spacing w:after="0" w:line="265"/>
+            </w:pPr>
+            <w:r>
+              <w:rPr>
+                <w:rFonts w:ascii="Arial" w:cs="Arial" w:eastAsia="Arial" w:hAnsi="Arial"/>
+                <w:b w:val="false"/>
+                <w:bCs w:val="false"/>
+                <w:color w:val="1B1B1B"/>
+                <w:sz w:val="18"/>
+                <w:szCs w:val="18"/>
+              </w:rPr>
+              <w:t xml:space="preserve">Tay giơ ra cũng có thể bị đụng</w:t>
+            </w:r>
+          </w:p>
+        </w:tc>
+      </w:tr>
+      <w:tr>
+        <w:trPr>
+          <w:cantSplit/>
+          <w:tblHeader w:val="false"/>
+        </w:trPr>
+        <w:tc>
+          <w:tcPr>
+            <w:tcW w:type="dxa" w:w="2900"/>
+            <w:tcMar>
+              <w:top w:type="dxa" w:w="60"/>
+              <w:left w:type="dxa" w:w="95"/>
+              <w:bottom w:type="dxa" w:w="60"/>
+              <w:right w:type="dxa" w:w="95"/>
+            </w:tcMar>
+            <w:vAlign w:val="center"/>
+          </w:tcPr>
+          <w:p>
+            <w:pPr>
+              <w:spacing w:after="0" w:line="265"/>
+            </w:pPr>
+            <w:r>
+              <w:rPr>
+                <w:rFonts w:ascii="Arial" w:cs="Arial" w:eastAsia="Arial" w:hAnsi="Arial"/>
+                <w:b w:val="false"/>
+                <w:bCs w:val="false"/>
+                <w:color w:val="1B1B1B"/>
+                <w:sz w:val="18"/>
+                <w:szCs w:val="18"/>
+              </w:rPr>
+              <w:t xml:space="preserve">Có người lái: chung khung với xe</w:t>
+            </w:r>
+          </w:p>
+        </w:tc>
+        <w:tc>
+          <w:tcPr>
+            <w:tcW w:type="dxa" w:w="3600"/>
+            <w:tcMar>
+              <w:top w:type="dxa" w:w="60"/>
+              <w:left w:type="dxa" w:w="95"/>
+              <w:bottom w:type="dxa" w:w="60"/>
+              <w:right w:type="dxa" w:w="95"/>
+            </w:tcMar>
+            <w:vAlign w:val="center"/>
+          </w:tcPr>
+          <w:p>
+            <w:pPr>
+              <w:spacing w:after="0" w:line="265"/>
+            </w:pPr>
+            <w:r>
+              <w:rPr>
+                <w:rFonts w:ascii="Arial" w:cs="Arial" w:eastAsia="Arial" w:hAnsi="Arial"/>
+                <w:b w:val="false"/>
+                <w:bCs w:val="false"/>
+                <w:color w:val="1B1B1B"/>
+                <w:sz w:val="18"/>
+                <w:szCs w:val="18"/>
+              </w:rPr>
+              <w:t xml:space="preserve">If there is a rider, include the rider in the box.</w:t>
+            </w:r>
+          </w:p>
+        </w:tc>
+        <w:tc>
+          <w:tcPr>
+            <w:tcW w:type="dxa" w:w="2860"/>
+            <w:tcMar>
+              <w:top w:type="dxa" w:w="60"/>
+              <w:left w:type="dxa" w:w="95"/>
+              <w:bottom w:type="dxa" w:w="60"/>
+              <w:right w:type="dxa" w:w="95"/>
+            </w:tcMar>
+            <w:vAlign w:val="center"/>
+          </w:tcPr>
+          <w:p>
+            <w:pPr>
+              <w:spacing w:after="0" w:line="265"/>
+            </w:pPr>
+            <w:r>
+              <w:rPr>
+                <w:rFonts w:ascii="Arial" w:cs="Arial" w:eastAsia="Arial" w:hAnsi="Arial"/>
+                <w:b w:val="false"/>
+                <w:bCs w:val="false"/>
+                <w:color w:val="1B1B1B"/>
+                <w:sz w:val="18"/>
+                <w:szCs w:val="18"/>
+              </w:rPr>
+              <w:t xml:space="preserve">Người và xe đi cùng nhau</w:t>
+            </w:r>
+          </w:p>
+        </w:tc>
+      </w:tr>
+      <w:tr>
+        <w:trPr>
+          <w:cantSplit/>
+          <w:tblHeader w:val="false"/>
+        </w:trPr>
+        <w:tc>
+          <w:tcPr>
+            <w:tcW w:type="dxa" w:w="2900"/>
+            <w:tcMar>
+              <w:top w:type="dxa" w:w="60"/>
+              <w:left w:type="dxa" w:w="95"/>
+              <w:bottom w:type="dxa" w:w="60"/>
+              <w:right w:type="dxa" w:w="95"/>
+            </w:tcMar>
+            <w:vAlign w:val="center"/>
+          </w:tcPr>
+          <w:p>
+            <w:pPr>
+              <w:spacing w:after="0" w:line="265"/>
+            </w:pPr>
+            <w:r>
+              <w:rPr>
+                <w:rFonts w:ascii="Arial" w:cs="Arial" w:eastAsia="Arial" w:hAnsi="Arial"/>
+                <w:b w:val="false"/>
+                <w:bCs w:val="false"/>
+                <w:color w:val="1B1B1B"/>
+                <w:sz w:val="18"/>
+                <w:szCs w:val="18"/>
+              </w:rPr>
+              <w:t xml:space="preserve">Người đứng cạnh: khoanh riêng</w:t>
+            </w:r>
+          </w:p>
+        </w:tc>
+        <w:tc>
+          <w:tcPr>
+            <w:tcW w:type="dxa" w:w="3600"/>
+            <w:tcMar>
+              <w:top w:type="dxa" w:w="60"/>
+              <w:left w:type="dxa" w:w="95"/>
+              <w:bottom w:type="dxa" w:w="60"/>
+              <w:right w:type="dxa" w:w="95"/>
+            </w:tcMar>
+            <w:vAlign w:val="center"/>
+          </w:tcPr>
+          <w:p>
+            <w:pPr>
+              <w:spacing w:after="0" w:line="265"/>
+            </w:pPr>
+            <w:r>
+              <w:rPr>
+                <w:rFonts w:ascii="Arial" w:cs="Arial" w:eastAsia="Arial" w:hAnsi="Arial"/>
+                <w:b w:val="false"/>
+                <w:bCs w:val="false"/>
+                <w:color w:val="1B1B1B"/>
+                <w:sz w:val="18"/>
+                <w:szCs w:val="18"/>
+              </w:rPr>
+              <w:t xml:space="preserve">…standing next to the motorcycle, do NOT include…</w:t>
+            </w:r>
+          </w:p>
+        </w:tc>
+        <w:tc>
+          <w:tcPr>
+            <w:tcW w:type="dxa" w:w="2860"/>
+            <w:tcMar>
+              <w:top w:type="dxa" w:w="60"/>
+              <w:left w:type="dxa" w:w="95"/>
+              <w:bottom w:type="dxa" w:w="60"/>
+              <w:right w:type="dxa" w:w="95"/>
+            </w:tcMar>
+            <w:vAlign w:val="center"/>
+          </w:tcPr>
+          <w:p>
+            <w:pPr>
+              <w:spacing w:after="0" w:line="265"/>
+            </w:pPr>
+            <w:r>
+              <w:rPr>
+                <w:rFonts w:ascii="Arial" w:cs="Arial" w:eastAsia="Arial" w:hAnsi="Arial"/>
+                <w:b w:val="false"/>
+                <w:bCs w:val="false"/>
+                <w:color w:val="1B1B1B"/>
+                <w:sz w:val="18"/>
+                <w:szCs w:val="18"/>
+              </w:rPr>
+              <w:t xml:space="preserve">Người đó có thể đi chỗ khác</w:t>
+            </w:r>
+          </w:p>
+        </w:tc>
+      </w:tr>
+      <w:tr>
+        <w:trPr>
+          <w:cantSplit/>
+          <w:tblHeader w:val="false"/>
+        </w:trPr>
+        <w:tc>
+          <w:tcPr>
+            <w:tcW w:type="dxa" w:w="2900"/>
+            <w:tcMar>
+              <w:top w:type="dxa" w:w="60"/>
+              <w:left w:type="dxa" w:w="95"/>
+              <w:bottom w:type="dxa" w:w="60"/>
+              <w:right w:type="dxa" w:w="95"/>
+            </w:tcMar>
+            <w:vAlign w:val="center"/>
+          </w:tcPr>
+          <w:p>
+            <w:pPr>
+              <w:spacing w:after="0" w:line="265"/>
+            </w:pPr>
+            <w:r>
+              <w:rPr>
+                <w:rFonts w:ascii="Arial" w:cs="Arial" w:eastAsia="Arial" w:hAnsi="Arial"/>
+                <w:b w:val="false"/>
+                <w:bCs w:val="false"/>
+                <w:color w:val="1B1B1B"/>
+                <w:sz w:val="18"/>
+                <w:szCs w:val="18"/>
+              </w:rPr>
+              <w:t xml:space="preserve">Độ thấy được 4 mức</w:t>
+            </w:r>
+          </w:p>
+        </w:tc>
+        <w:tc>
+          <w:tcPr>
+            <w:tcW w:type="dxa" w:w="3600"/>
+            <w:tcMar>
+              <w:top w:type="dxa" w:w="60"/>
+              <w:left w:type="dxa" w:w="95"/>
+              <w:bottom w:type="dxa" w:w="60"/>
+              <w:right w:type="dxa" w:w="95"/>
+            </w:tcMar>
+            <w:vAlign w:val="center"/>
+          </w:tcPr>
+          <w:p>
+            <w:pPr>
+              <w:spacing w:after="0" w:line="265"/>
+            </w:pPr>
+            <w:r>
+              <w:rPr>
+                <w:rFonts w:ascii="Arial" w:cs="Arial" w:eastAsia="Arial" w:hAnsi="Arial"/>
+                <w:b w:val="false"/>
+                <w:bCs w:val="false"/>
+                <w:color w:val="1B1B1B"/>
+                <w:sz w:val="18"/>
+                <w:szCs w:val="18"/>
+              </w:rPr>
+              <w:t xml:space="preserve">0–40%, 41–60%, 61–80%, 81–100%</w:t>
+            </w:r>
+          </w:p>
+        </w:tc>
+        <w:tc>
+          <w:tcPr>
+            <w:tcW w:type="dxa" w:w="2860"/>
+            <w:tcMar>
+              <w:top w:type="dxa" w:w="60"/>
+              <w:left w:type="dxa" w:w="95"/>
+              <w:bottom w:type="dxa" w:w="60"/>
+              <w:right w:type="dxa" w:w="95"/>
+            </w:tcMar>
+            <w:vAlign w:val="center"/>
+          </w:tcPr>
+          <w:p>
+            <w:pPr>
+              <w:spacing w:after="0" w:line="265"/>
+            </w:pPr>
+            <w:r>
+              <w:rPr>
+                <w:rFonts w:ascii="Arial" w:cs="Arial" w:eastAsia="Arial" w:hAnsi="Arial"/>
+                <w:b w:val="false"/>
+                <w:bCs w:val="false"/>
+                <w:color w:val="1B1B1B"/>
+                <w:sz w:val="18"/>
+                <w:szCs w:val="18"/>
+              </w:rPr>
+              <w:t xml:space="preserve">Biết vật nào bị che nhiều</w:t>
             </w:r>
           </w:p>
         </w:tc>
@@ -6826,20 +6729,16 @@
     </w:tbl>
     <w:p>
       <w:pPr>
-        <w:pStyle w:val="Heading2"/>
-        <w:keepNext/>
-        <w:spacing w:after="130" w:before="300"/>
-      </w:pPr>
-      <w:r>
-        <w:rPr>
-          <w:rFonts w:ascii="Arial" w:cs="Arial" w:eastAsia="Arial" w:hAnsi="Arial"/>
-          <w:b/>
-          <w:bCs/>
-          <w:color w:val="24405C"/>
-          <w:sz w:val="24"/>
-          <w:szCs w:val="24"/>
-        </w:rPr>
-        <w:t xml:space="preserve">IoU: hai khung giống nhau bao nhiêu</w:t>
+        <w:spacing w:after="0"/>
+      </w:pPr>
+      <w:r>
+        <w:rPr>
+          <w:rFonts w:ascii="Arial" w:cs="Arial" w:eastAsia="Arial" w:hAnsi="Arial"/>
+          <w:color w:val="1B1B1B"/>
+          <w:sz w:val="22"/>
+          <w:szCs w:val="22"/>
+        </w:rPr>
+        <w:t xml:space="preserve"/>
       </w:r>
     </w:p>
     <w:p>
@@ -6851,7 +6750,7 @@
       <w:r>
         <w:drawing>
           <wp:inline distT="0" distB="0" distL="0" distR="0">
-            <wp:extent cx="5334000" cy="2038350"/>
+            <wp:extent cx="5334000" cy="1990725"/>
             <wp:effectExtent t="0" r="0" b="0" l="0"/>
             <wp:docPr id="1" name="" descr="" title=""/>
             <wp:cNvGraphicFramePr>
@@ -6876,6 +6775,207 @@
                   <pic:spPr bwMode="auto">
                     <a:xfrm>
                       <a:off x="0" y="0"/>
+                      <a:ext cx="5334000" cy="1990725"/>
+                    </a:xfrm>
+                    <a:prstGeom prst="rect">
+                      <a:avLst/>
+                    </a:prstGeom>
+                  </pic:spPr>
+                </pic:pic>
+              </a:graphicData>
+            </a:graphic>
+          </wp:inline>
+        </w:drawing>
+      </w:r>
+    </w:p>
+    <w:p>
+      <w:pPr>
+        <w:keepNext w:val="false"/>
+        <w:spacing w:after="70" w:before="190"/>
+      </w:pPr>
+      <w:r>
+        <w:rPr>
+          <w:rFonts w:ascii="Arial" w:cs="Arial" w:eastAsia="Arial" w:hAnsi="Arial"/>
+          <w:b/>
+          <w:bCs/>
+          <w:color w:val="24405C"/>
+          <w:sz w:val="19"/>
+          <w:szCs w:val="19"/>
+        </w:rPr>
+        <w:t xml:space="preserve">Người lái nằm trong khung của xe: trái xe đạp scene-0103, phải xe máy scene-1100 (khung chính thức). Dữ liệu: nuScenes (Motional), CC BY-NC-SA 4.0</w:t>
+      </w:r>
+    </w:p>
+    <w:p>
+      <w:pPr>
+        <w:widowControl/>
+        <w:spacing w:after="100" w:before="0" w:line="312"/>
+        <w:ind w:left="0" w:firstLine="0"/>
+      </w:pPr>
+      <w:r>
+        <w:rPr>
+          <w:rFonts w:ascii="Arial" w:cs="Arial" w:eastAsia="Arial" w:hAnsi="Arial"/>
+          <w:color w:val="1B1B1B"/>
+          <w:sz w:val="22"/>
+          <w:szCs w:val="22"/>
+        </w:rPr>
+        <w:t xml:space="preserve">Ở Hà Nội, một xe máy chở ba người, theo quy tắc nuScenes là </w:t>
+      </w:r>
+      <w:r>
+        <w:rPr>
+          <w:rFonts w:ascii="Arial" w:cs="Arial" w:eastAsia="Arial" w:hAnsi="Arial"/>
+          <w:b/>
+          <w:bCs/>
+          <w:color w:val="24405C"/>
+          <w:sz w:val="22"/>
+          <w:szCs w:val="22"/>
+        </w:rPr>
+        <w:t xml:space="preserve">một khung</w:t>
+      </w:r>
+      <w:r>
+        <w:rPr>
+          <w:rFonts w:ascii="Arial" w:cs="Arial" w:eastAsia="Arial" w:hAnsi="Arial"/>
+          <w:color w:val="1B1B1B"/>
+          <w:sz w:val="22"/>
+          <w:szCs w:val="22"/>
+        </w:rPr>
+        <w:t xml:space="preserve">, loại xe máy. Đổi sang quy tắc khoanh riêng từng người cũng được, quan trọng là </w:t>
+      </w:r>
+      <w:r>
+        <w:rPr>
+          <w:rFonts w:ascii="Arial" w:cs="Arial" w:eastAsia="Arial" w:hAnsi="Arial"/>
+          <w:b/>
+          <w:bCs/>
+          <w:color w:val="24405C"/>
+          <w:sz w:val="22"/>
+          <w:szCs w:val="22"/>
+        </w:rPr>
+        <w:t xml:space="preserve">cả bộ dữ liệu dùng cùng một quy tắc</w:t>
+      </w:r>
+      <w:r>
+        <w:rPr>
+          <w:rFonts w:ascii="Arial" w:cs="Arial" w:eastAsia="Arial" w:hAnsi="Arial"/>
+          <w:color w:val="1B1B1B"/>
+          <w:sz w:val="22"/>
+          <w:szCs w:val="22"/>
+        </w:rPr>
+        <w:t xml:space="preserve">.</w:t>
+      </w:r>
+    </w:p>
+    <w:tbl>
+      <w:tblPr>
+        <w:tblW w:type="dxa" w:w="9360"/>
+        <w:tblBorders>
+          <w:top w:val="single" w:color="A8B2BA" w:sz="6"/>
+          <w:left w:val="none"/>
+          <w:bottom w:val="single" w:color="A8B2BA" w:sz="6"/>
+          <w:right w:val="none"/>
+          <w:insideH w:val="none"/>
+          <w:insideV w:val="none"/>
+        </w:tblBorders>
+      </w:tblPr>
+      <w:tblGrid>
+        <w:gridCol w:w="9360"/>
+      </w:tblGrid>
+      <w:tr>
+        <w:trPr>
+          <w:cantSplit/>
+        </w:trPr>
+        <w:tc>
+          <w:tcPr>
+            <w:tcW w:type="dxa" w:w="9360"/>
+            <w:shd w:fill="F6F8F9" w:color="auto" w:val="clear"/>
+            <w:tcMar>
+              <w:top w:type="dxa" w:w="140"/>
+              <w:left w:type="dxa" w:w="200"/>
+              <w:bottom w:type="dxa" w:w="140"/>
+              <w:right w:type="dxa" w:w="180"/>
+            </w:tcMar>
+          </w:tcPr>
+          <w:p>
+            <w:pPr>
+              <w:spacing w:after="90" w:line="300"/>
+            </w:pPr>
+            <w:r>
+              <w:rPr>
+                <w:rFonts w:ascii="Arial" w:cs="Arial" w:eastAsia="Arial" w:hAnsi="Arial"/>
+                <w:b/>
+                <w:bCs/>
+                <w:color w:val="24405C"/>
+                <w:sz w:val="20"/>
+                <w:szCs w:val="20"/>
+              </w:rPr>
+              <w:t xml:space="preserve">Xem thêm</w:t>
+            </w:r>
+          </w:p>
+          <w:p>
+            <w:pPr>
+              <w:spacing w:after="0" w:line="310"/>
+            </w:pPr>
+            <w:r>
+              <w:rPr>
+                <w:rFonts w:ascii="Arial" w:cs="Arial" w:eastAsia="Arial" w:hAnsi="Arial"/>
+                <w:color w:val="1B1B1B"/>
+                <w:sz w:val="20"/>
+                <w:szCs w:val="20"/>
+              </w:rPr>
+              <w:t xml:space="preserve">Vẽ khung bằng công cụ gán nhãn CVAT (hướng dẫn chính thức, tiếng Anh): youtu.be/TDae8RkGbKk, 0:16–2:47.</w:t>
+            </w:r>
+          </w:p>
+        </w:tc>
+      </w:tr>
+    </w:tbl>
+    <w:p>
+      <w:pPr>
+        <w:pStyle w:val="Heading2"/>
+        <w:keepNext/>
+        <w:spacing w:after="130" w:before="300"/>
+      </w:pPr>
+      <w:r>
+        <w:rPr>
+          <w:rFonts w:ascii="Arial" w:cs="Arial" w:eastAsia="Arial" w:hAnsi="Arial"/>
+          <w:b/>
+          <w:bCs/>
+          <w:color w:val="24405C"/>
+          <w:sz w:val="24"/>
+          <w:szCs w:val="24"/>
+        </w:rPr>
+        <w:t xml:space="preserve">IoU: hai khung giống nhau bao nhiêu</w:t>
+      </w:r>
+    </w:p>
+    <w:p>
+      <w:pPr>
+        <w:keepNext/>
+        <w:spacing w:after="60" w:before="60"/>
+        <w:jc w:val="center"/>
+      </w:pPr>
+      <w:r>
+        <w:drawing>
+          <wp:inline distT="0" distB="0" distL="0" distR="0">
+            <wp:extent cx="5334000" cy="2038350"/>
+            <wp:effectExtent t="0" r="0" b="0" l="0"/>
+            <wp:docPr id="1" name="" descr="" title=""/>
+            <wp:cNvGraphicFramePr>
+              <a:graphicFrameLocks xmlns:a="http://schemas.openxmlformats.org/drawingml/2006/main" noChangeAspect="1"/>
+            </wp:cNvGraphicFramePr>
+            <a:graphic xmlns:a="http://schemas.openxmlformats.org/drawingml/2006/main">
+              <a:graphicData uri="http://schemas.openxmlformats.org/drawingml/2006/picture">
+                <pic:pic xmlns:pic="http://schemas.openxmlformats.org/drawingml/2006/picture">
+                  <pic:nvPicPr>
+                    <pic:cNvPr id="0" name="" descr=""/>
+                    <pic:cNvPicPr>
+                      <a:picLocks noChangeAspect="1" noChangeArrowheads="1"/>
+                    </pic:cNvPicPr>
+                  </pic:nvPicPr>
+                  <pic:blipFill>
+                    <a:blip r:embed="rId26" cstate="none"/>
+                    <a:srcRect/>
+                    <a:stretch>
+                      <a:fillRect/>
+                    </a:stretch>
+                  </pic:blipFill>
+                  <pic:spPr bwMode="auto">
+                    <a:xfrm>
+                      <a:off x="0" y="0"/>
                       <a:ext cx="5334000" cy="2038350"/>
                     </a:xfrm>
                     <a:prstGeom prst="rect">
@@ -7002,7 +7102,7 @@
                     </pic:cNvPicPr>
                   </pic:nvPicPr>
                   <pic:blipFill>
-                    <a:blip r:embed="rId26" cstate="none"/>
+                    <a:blip r:embed="rId27" cstate="none"/>
                     <a:srcRect/>
                     <a:stretch>
                       <a:fillRect/>

</xml_diff>

<commit_message>
Week 8: midterm format is Vietnamese-first with Chinese alongside; mock exam, L3 slides and handouts updated
Co-Authored-By: Claude Opus 5.5 <noreply@anthropic.com>
</commit_message>
<xml_diff>
--- a/第八週(10-29)/Nguyên lý xe tự lái_Tuần 8_Tài liệu học tập.docx
+++ b/第八週(10-29)/Nguyên lý xe tự lái_Tuần 8_Tài liệu học tập.docx
@@ -452,7 +452,7 @@
                 <w:sz w:val="18"/>
                 <w:szCs w:val="18"/>
               </w:rPr>
-              <w:t xml:space="preserve">Thi thứ Năm 5/11 trong giờ học; câu khái niệm và đọc biểu đồ, song ngữ Trung–Anh.</w:t>
+              <w:t xml:space="preserve">Thi thứ Năm 5/11 trong giờ học; câu khái niệm và đọc biểu đồ, đề tiếng Việt là chính, có tiếng Trung đối chiếu.</w:t>
             </w:r>
           </w:p>
         </w:tc>
@@ -7911,7 +7911,7 @@
           <w:sz w:val="22"/>
           <w:szCs w:val="22"/>
         </w:rPr>
-        <w:t xml:space="preserve">song ngữ Trung–Anh</w:t>
+        <w:t xml:space="preserve">tiếng Việt là chính, có tiếng Trung đối chiếu</w:t>
       </w:r>
       <w:r>
         <w:rPr>
@@ -7920,7 +7920,7 @@
           <w:sz w:val="22"/>
           <w:szCs w:val="22"/>
         </w:rPr>
-        <w:t xml:space="preserve">, không có tiếng Việt.</w:t>
+        <w:t xml:space="preserve">.</w:t>
       </w:r>
     </w:p>
     <w:p>

</xml_diff>

<commit_message>
Week 8 L3 slide 6 + handout: add IMU (week 6) to the what-each-sensor-measures table
Co-Authored-By: Claude Opus 5.5 <noreply@anthropic.com>
</commit_message>
<xml_diff>
--- a/第八週(10-29)/Nguyên lý xe tự lái_Tuần 8_Tài liệu học tập.docx
+++ b/第八週(10-29)/Nguyên lý xe tự lái_Tuần 8_Tài liệu học tập.docx
@@ -9735,7 +9735,7 @@
           <w:sz w:val="19"/>
           <w:szCs w:val="19"/>
         </w:rPr>
-        <w:t xml:space="preserve">Bảng 9. Tuần 3: sáu cảm biến đo trực tiếp cái gì (tầm là giá trị lớp học, trời nắng)</w:t>
+        <w:t xml:space="preserve">Bảng 9. Sáu cảm biến tuần 3 + IMU tuần 6: đo trực tiếp cái gì (tầm là giá trị lớp học, trời nắng)</w:t>
       </w:r>
     </w:p>
     <w:tbl>
@@ -10582,6 +10582,124 @@
                 <w:szCs w:val="18"/>
               </w:rPr>
               <w:t xml:space="preserve">Độ phân giải thấp</w:t>
+            </w:r>
+          </w:p>
+        </w:tc>
+      </w:tr>
+      <w:tr>
+        <w:trPr>
+          <w:cantSplit/>
+          <w:tblHeader w:val="false"/>
+        </w:trPr>
+        <w:tc>
+          <w:tcPr>
+            <w:tcW w:type="dxa" w:w="1500"/>
+            <w:tcMar>
+              <w:top w:type="dxa" w:w="60"/>
+              <w:left w:type="dxa" w:w="95"/>
+              <w:bottom w:type="dxa" w:w="60"/>
+              <w:right w:type="dxa" w:w="95"/>
+            </w:tcMar>
+            <w:vAlign w:val="center"/>
+          </w:tcPr>
+          <w:p>
+            <w:pPr>
+              <w:spacing w:after="0" w:line="265"/>
+            </w:pPr>
+            <w:r>
+              <w:rPr>
+                <w:rFonts w:ascii="Arial" w:cs="Arial" w:eastAsia="Arial" w:hAnsi="Arial"/>
+                <w:b w:val="false"/>
+                <w:bCs w:val="false"/>
+                <w:color w:val="1B1B1B"/>
+                <w:sz w:val="18"/>
+                <w:szCs w:val="18"/>
+              </w:rPr>
+              <w:t xml:space="preserve">IMU (tuần 6)</w:t>
+            </w:r>
+          </w:p>
+        </w:tc>
+        <w:tc>
+          <w:tcPr>
+            <w:tcW w:type="dxa" w:w="2900"/>
+            <w:tcMar>
+              <w:top w:type="dxa" w:w="60"/>
+              <w:left w:type="dxa" w:w="95"/>
+              <w:bottom w:type="dxa" w:w="60"/>
+              <w:right w:type="dxa" w:w="95"/>
+            </w:tcMar>
+            <w:vAlign w:val="center"/>
+          </w:tcPr>
+          <w:p>
+            <w:pPr>
+              <w:spacing w:after="0" w:line="265"/>
+            </w:pPr>
+            <w:r>
+              <w:rPr>
+                <w:rFonts w:ascii="Arial" w:cs="Arial" w:eastAsia="Arial" w:hAnsi="Arial"/>
+                <w:b w:val="false"/>
+                <w:bCs w:val="false"/>
+                <w:color w:val="1B1B1B"/>
+                <w:sz w:val="18"/>
+                <w:szCs w:val="18"/>
+              </w:rPr>
+              <w:t xml:space="preserve">Gia tốc, tốc độ quay của chính xe</w:t>
+            </w:r>
+          </w:p>
+        </w:tc>
+        <w:tc>
+          <w:tcPr>
+            <w:tcW w:type="dxa" w:w="1500"/>
+            <w:tcMar>
+              <w:top w:type="dxa" w:w="60"/>
+              <w:left w:type="dxa" w:w="95"/>
+              <w:bottom w:type="dxa" w:w="60"/>
+              <w:right w:type="dxa" w:w="95"/>
+            </w:tcMar>
+            <w:vAlign w:val="center"/>
+          </w:tcPr>
+          <w:p>
+            <w:pPr>
+              <w:spacing w:after="0" w:line="265"/>
+            </w:pPr>
+            <w:r>
+              <w:rPr>
+                <w:rFonts w:ascii="Arial" w:cs="Arial" w:eastAsia="Arial" w:hAnsi="Arial"/>
+                <w:b w:val="false"/>
+                <w:bCs w:val="false"/>
+                <w:color w:val="1B1B1B"/>
+                <w:sz w:val="18"/>
+                <w:szCs w:val="18"/>
+              </w:rPr>
+              <w:t xml:space="preserve">—</w:t>
+            </w:r>
+          </w:p>
+        </w:tc>
+        <w:tc>
+          <w:tcPr>
+            <w:tcW w:type="dxa" w:w="3460"/>
+            <w:tcMar>
+              <w:top w:type="dxa" w:w="60"/>
+              <w:left w:type="dxa" w:w="95"/>
+              <w:bottom w:type="dxa" w:w="60"/>
+              <w:right w:type="dxa" w:w="95"/>
+            </w:tcMar>
+            <w:vAlign w:val="center"/>
+          </w:tcPr>
+          <w:p>
+            <w:pPr>
+              <w:spacing w:after="0" w:line="265"/>
+            </w:pPr>
+            <w:r>
+              <w:rPr>
+                <w:rFonts w:ascii="Arial" w:cs="Arial" w:eastAsia="Arial" w:hAnsi="Arial"/>
+                <w:b w:val="false"/>
+                <w:bCs w:val="false"/>
+                <w:color w:val="1B1B1B"/>
+                <w:sz w:val="18"/>
+                <w:szCs w:val="18"/>
+              </w:rPr>
+              <w:t xml:space="preserve">Trôi: sai số tăng theo t², không dùng một mình</w:t>
             </w:r>
           </w:p>
         </w:tc>

</xml_diff>